<commit_message>
Documentação 0.3: módulo objetivo
Seções novas sobre o contrato de saída, a geração da explicação, o prompt
objetiva_v1 e as páginas de questões; testes, decisões, limitações,
glossário e histórico atualizados.

Co-Authored-By: Claude Opus 5.5 <noreply@anthropic.com>
Claude-Session: https://claude.ai/code/session_01W2sxSqc4ZdmAUWH2L8vsV2
</commit_message>
<xml_diff>
--- a/docs/Documentacao_Tecnica.docx
+++ b/docs/Documentacao_Tecnica.docx
@@ -114,7 +114,7 @@
         <w:t xml:space="preserve">Versão: </w:t>
       </w:r>
       <w:r>
-        <w:t xml:space="preserve">0.2, de 19/10/2026</w:t>
+        <w:t xml:space="preserve">0.3, de 19/10/2026</w:t>
       </w:r>
     </w:p>
     <w:p>
@@ -1039,7 +1039,7 @@
                 <w:sz w:val="20"/>
                 <w:szCs w:val="20"/>
               </w:rPr>
-              <w:t xml:space="preserve">Em andamento: importador de questões do ENEM pronto</w:t>
+              <w:t xml:space="preserve">Implementada em 19/10/2026; falta o teste com a chave real</w:t>
             </w:r>
           </w:p>
         </w:tc>
@@ -2793,7 +2793,7 @@
                 <w:sz w:val="20"/>
                 <w:szCs w:val="20"/>
               </w:rPr>
-              <w:t xml:space="preserve">) e carregamento de prompts (</w:t>
+              <w:t xml:space="preserve">), prompts (</w:t>
             </w:r>
             <w:r>
               <w:rPr>
@@ -2808,6 +2808,36 @@
                 <w:sz w:val="20"/>
                 <w:szCs w:val="20"/>
               </w:rPr>
+              <w:t xml:space="preserve">), contratos de saída (</w:t>
+            </w:r>
+            <w:r>
+              <w:rPr>
+                <w:rFonts w:ascii="Consolas" w:cs="Consolas" w:eastAsia="Consolas" w:hAnsi="Consolas"/>
+                <w:sz w:val="20"/>
+                <w:szCs w:val="20"/>
+              </w:rPr>
+              <w:t xml:space="preserve">contratos.py</w:t>
+            </w:r>
+            <w:r>
+              <w:rPr>
+                <w:sz w:val="20"/>
+                <w:szCs w:val="20"/>
+              </w:rPr>
+              <w:t xml:space="preserve">) e explicação de objetivas (</w:t>
+            </w:r>
+            <w:r>
+              <w:rPr>
+                <w:rFonts w:ascii="Consolas" w:cs="Consolas" w:eastAsia="Consolas" w:hAnsi="Consolas"/>
+                <w:sz w:val="20"/>
+                <w:szCs w:val="20"/>
+              </w:rPr>
+              <w:t xml:space="preserve">objetiva.py</w:t>
+            </w:r>
+            <w:r>
+              <w:rPr>
+                <w:sz w:val="20"/>
+                <w:szCs w:val="20"/>
+              </w:rPr>
               <w:t xml:space="preserve">)</w:t>
             </w:r>
           </w:p>
@@ -2930,13 +2960,56 @@
               </w:rPr>
               <w:t xml:space="preserve">app/questoes/</w:t>
             </w:r>
-            <w:r>
-              <w:rPr>
-                <w:sz w:val="20"/>
-                <w:szCs w:val="20"/>
-              </w:rPr>
-              <w:t xml:space="preserve">, </w:t>
-            </w:r>
+          </w:p>
+        </w:tc>
+        <w:tc>
+          <w:tcPr>
+            <w:tcW w:type="dxa" w:w="6350"/>
+            <w:tcBorders>
+              <w:top w:val="single" w:color="BFBFBF" w:sz="4"/>
+              <w:left w:val="single" w:color="BFBFBF" w:sz="4"/>
+              <w:bottom w:val="single" w:color="BFBFBF" w:sz="4"/>
+              <w:right w:val="single" w:color="BFBFBF" w:sz="4"/>
+            </w:tcBorders>
+            <w:tcMar>
+              <w:top w:type="dxa" w:w="60"/>
+              <w:left w:type="dxa" w:w="100"/>
+              <w:bottom w:type="dxa" w:w="60"/>
+              <w:right w:type="dxa" w:w="100"/>
+            </w:tcMar>
+          </w:tcPr>
+          <w:p>
+            <w:r>
+              <w:rPr>
+                <w:sz w:val="20"/>
+                <w:szCs w:val="20"/>
+              </w:rPr>
+              <w:t xml:space="preserve">Páginas de questões: lista, cadastro, detalhe e geração da explicação</w:t>
+            </w:r>
+          </w:p>
+        </w:tc>
+      </w:tr>
+      <w:tr>
+        <w:trPr>
+          <w:cantSplit/>
+        </w:trPr>
+        <w:tc>
+          <w:tcPr>
+            <w:tcW w:type="dxa" w:w="2721"/>
+            <w:tcBorders>
+              <w:top w:val="single" w:color="BFBFBF" w:sz="4"/>
+              <w:left w:val="single" w:color="BFBFBF" w:sz="4"/>
+              <w:bottom w:val="single" w:color="BFBFBF" w:sz="4"/>
+              <w:right w:val="single" w:color="BFBFBF" w:sz="4"/>
+            </w:tcBorders>
+            <w:tcMar>
+              <w:top w:type="dxa" w:w="60"/>
+              <w:left w:type="dxa" w:w="100"/>
+              <w:bottom w:type="dxa" w:w="60"/>
+              <w:right w:type="dxa" w:w="100"/>
+            </w:tcMar>
+          </w:tcPr>
+          <w:p>
             <w:r>
               <w:rPr>
                 <w:rFonts w:ascii="Consolas" w:cs="Consolas" w:eastAsia="Consolas" w:hAnsi="Consolas"/>
@@ -2969,7 +3042,7 @@
                 <w:sz w:val="20"/>
                 <w:szCs w:val="20"/>
               </w:rPr>
-              <w:t xml:space="preserve">Reservadas para as etapas 2 a 4</w:t>
+              <w:t xml:space="preserve">Reservada para a tela de aceite (etapa 4)</w:t>
             </w:r>
           </w:p>
         </w:tc>
@@ -12194,7 +12267,15 @@
         <w:pStyle w:val="Heading2"/>
       </w:pPr>
       <w:r>
-        <w:t xml:space="preserve">4.5 Custo: app/metricas/precos.py</w:t>
+        <w:t xml:space="preserve">4.5 Contrato de saída objetivo: app/correcao/contratos.py</w:t>
+      </w:r>
+    </w:p>
+    <w:p>
+      <w:pPr>
+        <w:spacing w:after="120" w:line="300"/>
+      </w:pPr>
+      <w:r>
+        <w:t xml:space="preserve">Define, em Pydantic, o formato que a API é obrigada a seguir na resposta, conforme a seção "Contrato de saída da IA" da especificação. As descrições dos campos são enviadas junto com o formato e orientam o modelo.</w:t>
       </w:r>
     </w:p>
     <w:tbl>
@@ -12303,7 +12384,7 @@
                 <w:sz w:val="20"/>
                 <w:szCs w:val="20"/>
               </w:rPr>
-              <w:t xml:space="preserve">Preco</w:t>
+              <w:t xml:space="preserve">ExplicacaoAlternativa</w:t>
             </w:r>
           </w:p>
         </w:tc>
@@ -12329,7 +12410,60 @@
                 <w:sz w:val="20"/>
                 <w:szCs w:val="20"/>
               </w:rPr>
-              <w:t xml:space="preserve">Preços de um modelo: entrada, entrada em cache, gravação em cache e saída</w:t>
+              <w:t xml:space="preserve">Uma alternativa: </w:t>
+            </w:r>
+            <w:r>
+              <w:rPr>
+                <w:rFonts w:ascii="Consolas" w:cs="Consolas" w:eastAsia="Consolas" w:hAnsi="Consolas"/>
+                <w:sz w:val="20"/>
+                <w:szCs w:val="20"/>
+              </w:rPr>
+              <w:t xml:space="preserve">letra</w:t>
+            </w:r>
+            <w:r>
+              <w:rPr>
+                <w:sz w:val="20"/>
+                <w:szCs w:val="20"/>
+              </w:rPr>
+              <w:t xml:space="preserve">, </w:t>
+            </w:r>
+            <w:r>
+              <w:rPr>
+                <w:rFonts w:ascii="Consolas" w:cs="Consolas" w:eastAsia="Consolas" w:hAnsi="Consolas"/>
+                <w:sz w:val="20"/>
+                <w:szCs w:val="20"/>
+              </w:rPr>
+              <w:t xml:space="preserve">correta</w:t>
+            </w:r>
+            <w:r>
+              <w:rPr>
+                <w:sz w:val="20"/>
+                <w:szCs w:val="20"/>
+              </w:rPr>
+              <w:t xml:space="preserve">, </w:t>
+            </w:r>
+            <w:r>
+              <w:rPr>
+                <w:rFonts w:ascii="Consolas" w:cs="Consolas" w:eastAsia="Consolas" w:hAnsi="Consolas"/>
+                <w:sz w:val="20"/>
+                <w:szCs w:val="20"/>
+              </w:rPr>
+              <w:t xml:space="preserve">por_que</w:t>
+            </w:r>
+            <w:r>
+              <w:rPr>
+                <w:sz w:val="20"/>
+                <w:szCs w:val="20"/>
+              </w:rPr>
+              <w:t xml:space="preserve"> e </w:t>
+            </w:r>
+            <w:r>
+              <w:rPr>
+                <w:rFonts w:ascii="Consolas" w:cs="Consolas" w:eastAsia="Consolas" w:hAnsi="Consolas"/>
+                <w:sz w:val="20"/>
+                <w:szCs w:val="20"/>
+              </w:rPr>
+              <w:t xml:space="preserve">conceito_envolvido</w:t>
             </w:r>
           </w:p>
         </w:tc>
@@ -12361,7 +12495,7 @@
                 <w:sz w:val="20"/>
                 <w:szCs w:val="20"/>
               </w:rPr>
-              <w:t xml:space="preserve">carregar_tabela()</w:t>
+              <w:t xml:space="preserve">CorrecaoObjetiva</w:t>
             </w:r>
           </w:p>
         </w:tc>
@@ -12387,7 +12521,7 @@
                 <w:sz w:val="20"/>
                 <w:szCs w:val="20"/>
               </w:rPr>
-              <w:t xml:space="preserve">Lê </w:t>
+              <w:t xml:space="preserve">A resposta completa: </w:t>
             </w:r>
             <w:r>
               <w:rPr>
@@ -12395,14 +12529,74 @@
                 <w:sz w:val="20"/>
                 <w:szCs w:val="20"/>
               </w:rPr>
-              <w:t xml:space="preserve">config/precos.toml</w:t>
-            </w:r>
-            <w:r>
-              <w:rPr>
-                <w:sz w:val="20"/>
-                <w:szCs w:val="20"/>
-              </w:rPr>
-              <w:t xml:space="preserve"> uma vez e guarda em memória</w:t>
+              <w:t xml:space="preserve">questao_id</w:t>
+            </w:r>
+            <w:r>
+              <w:rPr>
+                <w:sz w:val="20"/>
+                <w:szCs w:val="20"/>
+              </w:rPr>
+              <w:t xml:space="preserve">, </w:t>
+            </w:r>
+            <w:r>
+              <w:rPr>
+                <w:rFonts w:ascii="Consolas" w:cs="Consolas" w:eastAsia="Consolas" w:hAnsi="Consolas"/>
+                <w:sz w:val="20"/>
+                <w:szCs w:val="20"/>
+              </w:rPr>
+              <w:t xml:space="preserve">alternativa_correta</w:t>
+            </w:r>
+            <w:r>
+              <w:rPr>
+                <w:sz w:val="20"/>
+                <w:szCs w:val="20"/>
+              </w:rPr>
+              <w:t xml:space="preserve">, lista de </w:t>
+            </w:r>
+            <w:r>
+              <w:rPr>
+                <w:rFonts w:ascii="Consolas" w:cs="Consolas" w:eastAsia="Consolas" w:hAnsi="Consolas"/>
+                <w:sz w:val="20"/>
+                <w:szCs w:val="20"/>
+              </w:rPr>
+              <w:t xml:space="preserve">explicacoes</w:t>
+            </w:r>
+            <w:r>
+              <w:rPr>
+                <w:sz w:val="20"/>
+                <w:szCs w:val="20"/>
+              </w:rPr>
+              <w:t xml:space="preserve">, </w:t>
+            </w:r>
+            <w:r>
+              <w:rPr>
+                <w:rFonts w:ascii="Consolas" w:cs="Consolas" w:eastAsia="Consolas" w:hAnsi="Consolas"/>
+                <w:sz w:val="20"/>
+                <w:szCs w:val="20"/>
+              </w:rPr>
+              <w:t xml:space="preserve">explicacao_correta</w:t>
+            </w:r>
+            <w:r>
+              <w:rPr>
+                <w:sz w:val="20"/>
+                <w:szCs w:val="20"/>
+              </w:rPr>
+              <w:t xml:space="preserve"> e </w:t>
+            </w:r>
+            <w:r>
+              <w:rPr>
+                <w:rFonts w:ascii="Consolas" w:cs="Consolas" w:eastAsia="Consolas" w:hAnsi="Consolas"/>
+                <w:sz w:val="20"/>
+                <w:szCs w:val="20"/>
+              </w:rPr>
+              <w:t xml:space="preserve">nivel_dificuldade_estimado</w:t>
+            </w:r>
+            <w:r>
+              <w:rPr>
+                <w:sz w:val="20"/>
+                <w:szCs w:val="20"/>
+              </w:rPr>
+              <w:t xml:space="preserve"> (baixo, medio ou alto)</w:t>
             </w:r>
           </w:p>
         </w:tc>
@@ -12434,7 +12628,7 @@
                 <w:sz w:val="20"/>
                 <w:szCs w:val="20"/>
               </w:rPr>
-              <w:t xml:space="preserve">preco_do_modelo(modelo)</w:t>
+              <w:t xml:space="preserve">problemas_de_consistencia(...)</w:t>
             </w:r>
           </w:p>
         </w:tc>
@@ -12460,65 +12654,7 @@
                 <w:sz w:val="20"/>
                 <w:szCs w:val="20"/>
               </w:rPr>
-              <w:t xml:space="preserve">Procura pelo nome exato e, se não achar, pelo nome base (aceita sufixos de versão)</w:t>
-            </w:r>
-          </w:p>
-        </w:tc>
-      </w:tr>
-      <w:tr>
-        <w:trPr>
-          <w:cantSplit/>
-        </w:trPr>
-        <w:tc>
-          <w:tcPr>
-            <w:tcW w:type="dxa" w:w="3628"/>
-            <w:tcBorders>
-              <w:top w:val="single" w:color="BFBFBF" w:sz="4"/>
-              <w:left w:val="single" w:color="BFBFBF" w:sz="4"/>
-              <w:bottom w:val="single" w:color="BFBFBF" w:sz="4"/>
-              <w:right w:val="single" w:color="BFBFBF" w:sz="4"/>
-            </w:tcBorders>
-            <w:tcMar>
-              <w:top w:type="dxa" w:w="60"/>
-              <w:left w:type="dxa" w:w="100"/>
-              <w:bottom w:type="dxa" w:w="60"/>
-              <w:right w:type="dxa" w:w="100"/>
-            </w:tcMar>
-          </w:tcPr>
-          <w:p>
-            <w:r>
-              <w:rPr>
-                <w:rFonts w:ascii="Consolas" w:cs="Consolas" w:eastAsia="Consolas" w:hAnsi="Consolas"/>
-                <w:sz w:val="20"/>
-                <w:szCs w:val="20"/>
-              </w:rPr>
-              <w:t xml:space="preserve">calcular_custo(...)</w:t>
-            </w:r>
-          </w:p>
-        </w:tc>
-        <w:tc>
-          <w:tcPr>
-            <w:tcW w:type="dxa" w:w="5443"/>
-            <w:tcBorders>
-              <w:top w:val="single" w:color="BFBFBF" w:sz="4"/>
-              <w:left w:val="single" w:color="BFBFBF" w:sz="4"/>
-              <w:bottom w:val="single" w:color="BFBFBF" w:sz="4"/>
-              <w:right w:val="single" w:color="BFBFBF" w:sz="4"/>
-            </w:tcBorders>
-            <w:tcMar>
-              <w:top w:type="dxa" w:w="60"/>
-              <w:left w:type="dxa" w:w="100"/>
-              <w:bottom w:type="dxa" w:w="60"/>
-              <w:right w:type="dxa" w:w="100"/>
-            </w:tcMar>
-          </w:tcPr>
-          <w:p>
-            <w:r>
-              <w:rPr>
-                <w:sz w:val="20"/>
-                <w:szCs w:val="20"/>
-              </w:rPr>
-              <w:t xml:space="preserve">Aplica a fórmula da seção 5.2; devolve vazio para modelo sem preço, em vez de inventar um valor</w:t>
+              <w:t xml:space="preserve">Confere a resposta com a questão cadastrada e devolve a lista de problemas; lista vazia significa resposta consistente</w:t>
             </w:r>
           </w:p>
         </w:tc>
@@ -12531,10 +12667,37 @@
     </w:p>
     <w:p>
       <w:pPr>
+        <w:spacing w:after="120" w:line="300"/>
+      </w:pPr>
+      <w:r>
+        <w:t xml:space="preserve">O formato já é garantido pela API. A conferência verifica o conteúdo: a resposta precisa repetir o identificador da questão, concordar com o gabarito do professor, explicar cada alternativa exatamente uma vez e marcar como correta apenas a alternativa do gabarito.</w:t>
+      </w:r>
+    </w:p>
+    <w:p>
+      <w:pPr>
+        <w:spacing w:after="120" w:line="300"/>
+      </w:pPr>
+      <w:r>
+        <w:t xml:space="preserve">O campo </w:t>
+      </w:r>
+      <w:r>
+        <w:rPr>
+          <w:rFonts w:ascii="Consolas" w:cs="Consolas" w:eastAsia="Consolas" w:hAnsi="Consolas"/>
+          <w:sz w:val="20"/>
+          <w:szCs w:val="20"/>
+        </w:rPr>
+        <w:t xml:space="preserve">conceito_envolvido</w:t>
+      </w:r>
+      <w:r>
+        <w:t xml:space="preserve"> existe por razão metodológica: permite agrupar os erros por conceito na análise dos resultados.</w:t>
+      </w:r>
+    </w:p>
+    <w:p>
+      <w:pPr>
         <w:pStyle w:val="Heading2"/>
       </w:pPr>
       <w:r>
-        <w:t xml:space="preserve">4.6 Métricas na web: app/metricas/router.py</w:t>
+        <w:t xml:space="preserve">4.6 Explicação de questões objetivas: app/correcao/objetiva.py</w:t>
       </w:r>
     </w:p>
     <w:tbl>
@@ -12582,7 +12745,7 @@
                 <w:sz w:val="20"/>
                 <w:szCs w:val="20"/>
               </w:rPr>
-              <w:t xml:space="preserve">Rota</w:t>
+              <w:t xml:space="preserve">Elemento</w:t>
             </w:r>
           </w:p>
         </w:tc>
@@ -12643,7 +12806,7 @@
                 <w:sz w:val="20"/>
                 <w:szCs w:val="20"/>
               </w:rPr>
-              <w:t xml:space="preserve">GET /metricas</w:t>
+              <w:t xml:space="preserve">PROMPT_OBJETIVA</w:t>
             </w:r>
           </w:p>
         </w:tc>
@@ -12669,7 +12832,22 @@
                 <w:sz w:val="20"/>
                 <w:szCs w:val="20"/>
               </w:rPr>
-              <w:t xml:space="preserve">Página com as 200 requisições mais recentes</w:t>
+              <w:t xml:space="preserve">Prompt usado: </w:t>
+            </w:r>
+            <w:r>
+              <w:rPr>
+                <w:rFonts w:ascii="Consolas" w:cs="Consolas" w:eastAsia="Consolas" w:hAnsi="Consolas"/>
+                <w:sz w:val="20"/>
+                <w:szCs w:val="20"/>
+              </w:rPr>
+              <w:t xml:space="preserve">objetiva</w:t>
+            </w:r>
+            <w:r>
+              <w:rPr>
+                <w:sz w:val="20"/>
+                <w:szCs w:val="20"/>
+              </w:rPr>
+              <w:t xml:space="preserve">, versão 1</w:t>
             </w:r>
           </w:p>
         </w:tc>
@@ -12701,7 +12879,7 @@
                 <w:sz w:val="20"/>
                 <w:szCs w:val="20"/>
               </w:rPr>
-              <w:t xml:space="preserve">GET /metricas/exportar.csv</w:t>
+              <w:t xml:space="preserve">gabarito_da(questao)</w:t>
             </w:r>
           </w:p>
         </w:tc>
@@ -12727,7 +12905,196 @@
                 <w:sz w:val="20"/>
                 <w:szCs w:val="20"/>
               </w:rPr>
-              <w:t xml:space="preserve">Arquivo CSV com todas as requisições e todos os campos, para análise (RF14)</w:t>
+              <w:t xml:space="preserve">Devolve a letra correta; recusa questão sem gabarito ou com mais de um</w:t>
+            </w:r>
+          </w:p>
+        </w:tc>
+      </w:tr>
+      <w:tr>
+        <w:trPr>
+          <w:cantSplit/>
+        </w:trPr>
+        <w:tc>
+          <w:tcPr>
+            <w:tcW w:type="dxa" w:w="3628"/>
+            <w:tcBorders>
+              <w:top w:val="single" w:color="BFBFBF" w:sz="4"/>
+              <w:left w:val="single" w:color="BFBFBF" w:sz="4"/>
+              <w:bottom w:val="single" w:color="BFBFBF" w:sz="4"/>
+              <w:right w:val="single" w:color="BFBFBF" w:sz="4"/>
+            </w:tcBorders>
+            <w:tcMar>
+              <w:top w:type="dxa" w:w="60"/>
+              <w:left w:type="dxa" w:w="100"/>
+              <w:bottom w:type="dxa" w:w="60"/>
+              <w:right w:type="dxa" w:w="100"/>
+            </w:tcMar>
+          </w:tcPr>
+          <w:p>
+            <w:r>
+              <w:rPr>
+                <w:rFonts w:ascii="Consolas" w:cs="Consolas" w:eastAsia="Consolas" w:hAnsi="Consolas"/>
+                <w:sz w:val="20"/>
+                <w:szCs w:val="20"/>
+              </w:rPr>
+              <w:t xml:space="preserve">campos_do_prompt(questao)</w:t>
+            </w:r>
+          </w:p>
+        </w:tc>
+        <w:tc>
+          <w:tcPr>
+            <w:tcW w:type="dxa" w:w="5443"/>
+            <w:tcBorders>
+              <w:top w:val="single" w:color="BFBFBF" w:sz="4"/>
+              <w:left w:val="single" w:color="BFBFBF" w:sz="4"/>
+              <w:bottom w:val="single" w:color="BFBFBF" w:sz="4"/>
+              <w:right w:val="single" w:color="BFBFBF" w:sz="4"/>
+            </w:tcBorders>
+            <w:tcMar>
+              <w:top w:type="dxa" w:w="60"/>
+              <w:left w:type="dxa" w:w="100"/>
+              <w:bottom w:type="dxa" w:w="60"/>
+              <w:right w:type="dxa" w:w="100"/>
+            </w:tcMar>
+          </w:tcPr>
+          <w:p>
+            <w:r>
+              <w:rPr>
+                <w:sz w:val="20"/>
+                <w:szCs w:val="20"/>
+              </w:rPr>
+              <w:t xml:space="preserve">Prepara identificador, enunciado, alternativas no formato </w:t>
+            </w:r>
+            <w:r>
+              <w:rPr>
+                <w:rFonts w:ascii="Consolas" w:cs="Consolas" w:eastAsia="Consolas" w:hAnsi="Consolas"/>
+                <w:sz w:val="20"/>
+                <w:szCs w:val="20"/>
+              </w:rPr>
+              <w:t xml:space="preserve">A) texto</w:t>
+            </w:r>
+            <w:r>
+              <w:rPr>
+                <w:sz w:val="20"/>
+                <w:szCs w:val="20"/>
+              </w:rPr>
+              <w:t xml:space="preserve"> e gabarito</w:t>
+            </w:r>
+          </w:p>
+        </w:tc>
+      </w:tr>
+      <w:tr>
+        <w:trPr>
+          <w:cantSplit/>
+        </w:trPr>
+        <w:tc>
+          <w:tcPr>
+            <w:tcW w:type="dxa" w:w="3628"/>
+            <w:tcBorders>
+              <w:top w:val="single" w:color="BFBFBF" w:sz="4"/>
+              <w:left w:val="single" w:color="BFBFBF" w:sz="4"/>
+              <w:bottom w:val="single" w:color="BFBFBF" w:sz="4"/>
+              <w:right w:val="single" w:color="BFBFBF" w:sz="4"/>
+            </w:tcBorders>
+            <w:tcMar>
+              <w:top w:type="dxa" w:w="60"/>
+              <w:left w:type="dxa" w:w="100"/>
+              <w:bottom w:type="dxa" w:w="60"/>
+              <w:right w:type="dxa" w:w="100"/>
+            </w:tcMar>
+          </w:tcPr>
+          <w:p>
+            <w:r>
+              <w:rPr>
+                <w:rFonts w:ascii="Consolas" w:cs="Consolas" w:eastAsia="Consolas" w:hAnsi="Consolas"/>
+                <w:sz w:val="20"/>
+                <w:szCs w:val="20"/>
+              </w:rPr>
+              <w:t xml:space="preserve">gerar_explicacao(sessao, questao)</w:t>
+            </w:r>
+          </w:p>
+        </w:tc>
+        <w:tc>
+          <w:tcPr>
+            <w:tcW w:type="dxa" w:w="5443"/>
+            <w:tcBorders>
+              <w:top w:val="single" w:color="BFBFBF" w:sz="4"/>
+              <w:left w:val="single" w:color="BFBFBF" w:sz="4"/>
+              <w:bottom w:val="single" w:color="BFBFBF" w:sz="4"/>
+              <w:right w:val="single" w:color="BFBFBF" w:sz="4"/>
+            </w:tcBorders>
+            <w:tcMar>
+              <w:top w:type="dxa" w:w="60"/>
+              <w:left w:type="dxa" w:w="100"/>
+              <w:bottom w:type="dxa" w:w="60"/>
+              <w:right w:type="dxa" w:w="100"/>
+            </w:tcMar>
+          </w:tcPr>
+          <w:p>
+            <w:r>
+              <w:rPr>
+                <w:sz w:val="20"/>
+                <w:szCs w:val="20"/>
+              </w:rPr>
+              <w:t xml:space="preserve">Chama o modelo, confere a resposta e grava a correção</w:t>
+            </w:r>
+          </w:p>
+        </w:tc>
+      </w:tr>
+      <w:tr>
+        <w:trPr>
+          <w:cantSplit/>
+        </w:trPr>
+        <w:tc>
+          <w:tcPr>
+            <w:tcW w:type="dxa" w:w="3628"/>
+            <w:tcBorders>
+              <w:top w:val="single" w:color="BFBFBF" w:sz="4"/>
+              <w:left w:val="single" w:color="BFBFBF" w:sz="4"/>
+              <w:bottom w:val="single" w:color="BFBFBF" w:sz="4"/>
+              <w:right w:val="single" w:color="BFBFBF" w:sz="4"/>
+            </w:tcBorders>
+            <w:tcMar>
+              <w:top w:type="dxa" w:w="60"/>
+              <w:left w:type="dxa" w:w="100"/>
+              <w:bottom w:type="dxa" w:w="60"/>
+              <w:right w:type="dxa" w:w="100"/>
+            </w:tcMar>
+          </w:tcPr>
+          <w:p>
+            <w:r>
+              <w:rPr>
+                <w:rFonts w:ascii="Consolas" w:cs="Consolas" w:eastAsia="Consolas" w:hAnsi="Consolas"/>
+                <w:sz w:val="20"/>
+                <w:szCs w:val="20"/>
+              </w:rPr>
+              <w:t xml:space="preserve">ResultadoExplicacao</w:t>
+            </w:r>
+          </w:p>
+        </w:tc>
+        <w:tc>
+          <w:tcPr>
+            <w:tcW w:type="dxa" w:w="5443"/>
+            <w:tcBorders>
+              <w:top w:val="single" w:color="BFBFBF" w:sz="4"/>
+              <w:left w:val="single" w:color="BFBFBF" w:sz="4"/>
+              <w:bottom w:val="single" w:color="BFBFBF" w:sz="4"/>
+              <w:right w:val="single" w:color="BFBFBF" w:sz="4"/>
+            </w:tcBorders>
+            <w:tcMar>
+              <w:top w:type="dxa" w:w="60"/>
+              <w:left w:type="dxa" w:w="100"/>
+              <w:bottom w:type="dxa" w:w="60"/>
+              <w:right w:type="dxa" w:w="100"/>
+            </w:tcMar>
+          </w:tcPr>
+          <w:p>
+            <w:r>
+              <w:rPr>
+                <w:sz w:val="20"/>
+                <w:szCs w:val="20"/>
+              </w:rPr>
+              <w:t xml:space="preserve">Agrupa a correção gravada (ou nada, na falha) e a métrica da chamada</w:t>
             </w:r>
           </w:p>
         </w:tc>
@@ -12740,10 +13107,271 @@
     </w:p>
     <w:p>
       <w:pPr>
+        <w:pStyle w:val="Heading3"/>
+      </w:pPr>
+      <w:r>
+        <w:t xml:space="preserve">Passos de gerar_explicacao</w:t>
+      </w:r>
+    </w:p>
+    <w:p>
+      <w:pPr>
+        <w:pStyle w:val="ListParagraph"/>
+        <w:numPr>
+          <w:ilvl w:val="0"/>
+          <w:numId w:val="4"/>
+        </w:numPr>
+        <w:spacing w:after="80" w:line="290"/>
+      </w:pPr>
+      <w:r>
+        <w:t xml:space="preserve">Carrega o prompt </w:t>
+      </w:r>
+      <w:r>
+        <w:rPr>
+          <w:rFonts w:ascii="Consolas" w:cs="Consolas" w:eastAsia="Consolas" w:hAnsi="Consolas"/>
+          <w:sz w:val="20"/>
+          <w:szCs w:val="20"/>
+        </w:rPr>
+        <w:t xml:space="preserve">objetiva_v1</w:t>
+      </w:r>
+      <w:r>
+        <w:t xml:space="preserve"> e chama </w:t>
+      </w:r>
+      <w:r>
+        <w:rPr>
+          <w:rFonts w:ascii="Consolas" w:cs="Consolas" w:eastAsia="Consolas" w:hAnsi="Consolas"/>
+          <w:sz w:val="20"/>
+          <w:szCs w:val="20"/>
+        </w:rPr>
+        <w:t xml:space="preserve">chamar_modelo</w:t>
+      </w:r>
+      <w:r>
+        <w:t xml:space="preserve"> com o formato </w:t>
+      </w:r>
+      <w:r>
+        <w:rPr>
+          <w:rFonts w:ascii="Consolas" w:cs="Consolas" w:eastAsia="Consolas" w:hAnsi="Consolas"/>
+          <w:sz w:val="20"/>
+          <w:szCs w:val="20"/>
+        </w:rPr>
+        <w:t xml:space="preserve">CorrecaoObjetiva</w:t>
+      </w:r>
+      <w:r>
+        <w:t xml:space="preserve">.</w:t>
+      </w:r>
+    </w:p>
+    <w:p>
+      <w:pPr>
+        <w:pStyle w:val="ListParagraph"/>
+        <w:numPr>
+          <w:ilvl w:val="0"/>
+          <w:numId w:val="4"/>
+        </w:numPr>
+        <w:spacing w:after="80" w:line="290"/>
+      </w:pPr>
+      <w:r>
+        <w:t xml:space="preserve">Se a chamada falhou, devolve a falha; a métrica já foi gravada por </w:t>
+      </w:r>
+      <w:r>
+        <w:rPr>
+          <w:rFonts w:ascii="Consolas" w:cs="Consolas" w:eastAsia="Consolas" w:hAnsi="Consolas"/>
+          <w:sz w:val="20"/>
+          <w:szCs w:val="20"/>
+        </w:rPr>
+        <w:t xml:space="preserve">chamar_modelo</w:t>
+      </w:r>
+      <w:r>
+        <w:t xml:space="preserve">.</w:t>
+      </w:r>
+    </w:p>
+    <w:p>
+      <w:pPr>
+        <w:pStyle w:val="ListParagraph"/>
+        <w:numPr>
+          <w:ilvl w:val="0"/>
+          <w:numId w:val="4"/>
+        </w:numPr>
+        <w:spacing w:after="80" w:line="290"/>
+      </w:pPr>
+      <w:r>
+        <w:t xml:space="preserve">Se a resposta veio, confere a consistência com a questão.</w:t>
+      </w:r>
+    </w:p>
+    <w:p>
+      <w:pPr>
+        <w:pStyle w:val="ListParagraph"/>
+        <w:numPr>
+          <w:ilvl w:val="0"/>
+          <w:numId w:val="4"/>
+        </w:numPr>
+        <w:spacing w:after="80" w:line="290"/>
+      </w:pPr>
+      <w:r>
+        <w:t xml:space="preserve">Se houver problema, não grava a correção, marca a métrica como falha e registra o motivo, por exemplo </w:t>
+      </w:r>
+      <w:r>
+        <w:rPr>
+          <w:rFonts w:ascii="Consolas" w:cs="Consolas" w:eastAsia="Consolas" w:hAnsi="Consolas"/>
+          <w:sz w:val="20"/>
+          <w:szCs w:val="20"/>
+        </w:rPr>
+        <w:t xml:space="preserve">saida inconsistente: alternativa_correta B diferente do gabarito D</w:t>
+      </w:r>
+      <w:r>
+        <w:t xml:space="preserve">.</w:t>
+      </w:r>
+    </w:p>
+    <w:p>
+      <w:pPr>
+        <w:pStyle w:val="ListParagraph"/>
+        <w:numPr>
+          <w:ilvl w:val="0"/>
+          <w:numId w:val="4"/>
+        </w:numPr>
+        <w:spacing w:after="80" w:line="290"/>
+      </w:pPr>
+      <w:r>
+        <w:t xml:space="preserve">Se estiver tudo certo, grava a correção em </w:t>
+      </w:r>
+      <w:r>
+        <w:rPr>
+          <w:rFonts w:ascii="Consolas" w:cs="Consolas" w:eastAsia="Consolas" w:hAnsi="Consolas"/>
+          <w:sz w:val="20"/>
+          <w:szCs w:val="20"/>
+        </w:rPr>
+        <w:t xml:space="preserve">correcao</w:t>
+      </w:r>
+      <w:r>
+        <w:t xml:space="preserve"> e liga a métrica a ela pelo campo </w:t>
+      </w:r>
+      <w:r>
+        <w:rPr>
+          <w:rFonts w:ascii="Consolas" w:cs="Consolas" w:eastAsia="Consolas" w:hAnsi="Consolas"/>
+          <w:sz w:val="20"/>
+          <w:szCs w:val="20"/>
+        </w:rPr>
+        <w:t xml:space="preserve">correcao_id</w:t>
+      </w:r>
+      <w:r>
+        <w:t xml:space="preserve">.</w:t>
+      </w:r>
+    </w:p>
+    <w:p>
+      <w:pPr>
+        <w:spacing w:after="120" w:line="300"/>
+      </w:pPr>
+      <w:r>
+        <w:t xml:space="preserve">A explicação de uma objetiva pertence à questão, e não à resposta de um aluno. Por isso, nessas correções, o campo </w:t>
+      </w:r>
+      <w:r>
+        <w:rPr>
+          <w:rFonts w:ascii="Consolas" w:cs="Consolas" w:eastAsia="Consolas" w:hAnsi="Consolas"/>
+          <w:sz w:val="20"/>
+          <w:szCs w:val="20"/>
+        </w:rPr>
+        <w:t xml:space="preserve">submissao_id</w:t>
+      </w:r>
+      <w:r>
+        <w:t xml:space="preserve"> fica vazio.</w:t>
+      </w:r>
+    </w:p>
+    <w:p>
+      <w:pPr>
+        <w:pStyle w:val="Heading3"/>
+      </w:pPr>
+      <w:r>
+        <w:t xml:space="preserve">Prompt objetiva_v1</w:t>
+      </w:r>
+    </w:p>
+    <w:p>
+      <w:pPr>
+        <w:spacing w:after="120" w:line="300"/>
+      </w:pPr>
+      <w:r>
+        <w:t xml:space="preserve">O texto fica em </w:t>
+      </w:r>
+      <w:r>
+        <w:rPr>
+          <w:rFonts w:ascii="Consolas" w:cs="Consolas" w:eastAsia="Consolas" w:hAnsi="Consolas"/>
+          <w:sz w:val="20"/>
+          <w:szCs w:val="20"/>
+        </w:rPr>
+        <w:t xml:space="preserve">prompts/objetiva/v1.md</w:t>
+      </w:r>
+      <w:r>
+        <w:t xml:space="preserve">. Em resumo, ele instrui o modelo a:</w:t>
+      </w:r>
+    </w:p>
+    <w:p>
+      <w:pPr>
+        <w:pStyle w:val="ListParagraph"/>
+        <w:numPr>
+          <w:ilvl w:val="0"/>
+          <w:numId w:val="5"/>
+        </w:numPr>
+        <w:spacing w:after="80" w:line="290"/>
+      </w:pPr>
+      <w:r>
+        <w:t xml:space="preserve">nunca questionar ou alterar o gabarito informado pelo professor;</w:t>
+      </w:r>
+    </w:p>
+    <w:p>
+      <w:pPr>
+        <w:pStyle w:val="ListParagraph"/>
+        <w:numPr>
+          <w:ilvl w:val="0"/>
+          <w:numId w:val="5"/>
+        </w:numPr>
+        <w:spacing w:after="80" w:line="290"/>
+      </w:pPr>
+      <w:r>
+        <w:t xml:space="preserve">para cada alternativa incorreta, identificar o erro de raciocínio plausível que levaria um estudante a escolhê-la e explicar por que ele não se sustenta (RF02 e RF03);</w:t>
+      </w:r>
+    </w:p>
+    <w:p>
+      <w:pPr>
+        <w:pStyle w:val="ListParagraph"/>
+        <w:numPr>
+          <w:ilvl w:val="0"/>
+          <w:numId w:val="5"/>
+        </w:numPr>
+        <w:spacing w:after="80" w:line="290"/>
+      </w:pPr>
+      <w:r>
+        <w:t xml:space="preserve">para a correta, apontar os elementos do enunciado que a sustentam, e descrever em passos o caminho até a resposta;</w:t>
+      </w:r>
+    </w:p>
+    <w:p>
+      <w:pPr>
+        <w:pStyle w:val="ListParagraph"/>
+        <w:numPr>
+          <w:ilvl w:val="0"/>
+          <w:numId w:val="5"/>
+        </w:numPr>
+        <w:spacing w:after="80" w:line="290"/>
+      </w:pPr>
+      <w:r>
+        <w:t xml:space="preserve">não inventar dados, autores ou citações fora do enunciado;</w:t>
+      </w:r>
+    </w:p>
+    <w:p>
+      <w:pPr>
+        <w:pStyle w:val="ListParagraph"/>
+        <w:numPr>
+          <w:ilvl w:val="0"/>
+          <w:numId w:val="5"/>
+        </w:numPr>
+        <w:spacing w:after="80" w:line="290"/>
+      </w:pPr>
+      <w:r>
+        <w:t xml:space="preserve">escrever em português do Brasil, dirigido ao estudante, sem expressões como "obviamente".</w:t>
+      </w:r>
+    </w:p>
+    <w:p>
+      <w:pPr>
         <w:pStyle w:val="Heading2"/>
       </w:pPr>
       <w:r>
-        <w:t xml:space="preserve">4.7 Aplicação: app/main.py</w:t>
+        <w:t xml:space="preserve">4.7 Páginas de questões: app/questoes/router.py</w:t>
       </w:r>
     </w:p>
     <w:tbl>
@@ -12852,7 +13480,7 @@
                 <w:sz w:val="20"/>
                 <w:szCs w:val="20"/>
               </w:rPr>
-              <w:t xml:space="preserve">GET /</w:t>
+              <w:t xml:space="preserve">GET /questoes</w:t>
             </w:r>
           </w:p>
         </w:tc>
@@ -12878,7 +13506,7 @@
                 <w:sz w:val="20"/>
                 <w:szCs w:val="20"/>
               </w:rPr>
-              <w:t xml:space="preserve">Página inicial, com o modelo configurado</w:t>
+              <w:t xml:space="preserve">Lista as questões objetivas, com origem, área, início do enunciado e número de explicações geradas</w:t>
             </w:r>
           </w:p>
         </w:tc>
@@ -12910,7 +13538,7 @@
                 <w:sz w:val="20"/>
                 <w:szCs w:val="20"/>
               </w:rPr>
-              <w:t xml:space="preserve">GET /saude</w:t>
+              <w:t xml:space="preserve">GET /questoes/nova</w:t>
             </w:r>
           </w:p>
         </w:tc>
@@ -12936,7 +13564,540 @@
                 <w:sz w:val="20"/>
                 <w:szCs w:val="20"/>
               </w:rPr>
-              <w:t xml:space="preserve">Verificação rápida de que o servidor está no ar</w:t>
+              <w:t xml:space="preserve">Formulário de cadastro manual (RF01)</w:t>
+            </w:r>
+          </w:p>
+        </w:tc>
+      </w:tr>
+      <w:tr>
+        <w:trPr>
+          <w:cantSplit/>
+        </w:trPr>
+        <w:tc>
+          <w:tcPr>
+            <w:tcW w:type="dxa" w:w="3628"/>
+            <w:tcBorders>
+              <w:top w:val="single" w:color="BFBFBF" w:sz="4"/>
+              <w:left w:val="single" w:color="BFBFBF" w:sz="4"/>
+              <w:bottom w:val="single" w:color="BFBFBF" w:sz="4"/>
+              <w:right w:val="single" w:color="BFBFBF" w:sz="4"/>
+            </w:tcBorders>
+            <w:tcMar>
+              <w:top w:type="dxa" w:w="60"/>
+              <w:left w:type="dxa" w:w="100"/>
+              <w:bottom w:type="dxa" w:w="60"/>
+              <w:right w:type="dxa" w:w="100"/>
+            </w:tcMar>
+          </w:tcPr>
+          <w:p>
+            <w:r>
+              <w:rPr>
+                <w:rFonts w:ascii="Consolas" w:cs="Consolas" w:eastAsia="Consolas" w:hAnsi="Consolas"/>
+                <w:sz w:val="20"/>
+                <w:szCs w:val="20"/>
+              </w:rPr>
+              <w:t xml:space="preserve">POST /questoes</w:t>
+            </w:r>
+          </w:p>
+        </w:tc>
+        <w:tc>
+          <w:tcPr>
+            <w:tcW w:type="dxa" w:w="5443"/>
+            <w:tcBorders>
+              <w:top w:val="single" w:color="BFBFBF" w:sz="4"/>
+              <w:left w:val="single" w:color="BFBFBF" w:sz="4"/>
+              <w:bottom w:val="single" w:color="BFBFBF" w:sz="4"/>
+              <w:right w:val="single" w:color="BFBFBF" w:sz="4"/>
+            </w:tcBorders>
+            <w:tcMar>
+              <w:top w:type="dxa" w:w="60"/>
+              <w:left w:type="dxa" w:w="100"/>
+              <w:bottom w:type="dxa" w:w="60"/>
+              <w:right w:type="dxa" w:w="100"/>
+            </w:tcMar>
+          </w:tcPr>
+          <w:p>
+            <w:r>
+              <w:rPr>
+                <w:sz w:val="20"/>
+                <w:szCs w:val="20"/>
+              </w:rPr>
+              <w:t xml:space="preserve">Valida e grava a questão: enunciado, as cinco alternativas e exatamente uma correta. Com erro, devolve o formulário preenchido e a lista de problemas</w:t>
+            </w:r>
+          </w:p>
+        </w:tc>
+      </w:tr>
+      <w:tr>
+        <w:trPr>
+          <w:cantSplit/>
+        </w:trPr>
+        <w:tc>
+          <w:tcPr>
+            <w:tcW w:type="dxa" w:w="3628"/>
+            <w:tcBorders>
+              <w:top w:val="single" w:color="BFBFBF" w:sz="4"/>
+              <w:left w:val="single" w:color="BFBFBF" w:sz="4"/>
+              <w:bottom w:val="single" w:color="BFBFBF" w:sz="4"/>
+              <w:right w:val="single" w:color="BFBFBF" w:sz="4"/>
+            </w:tcBorders>
+            <w:tcMar>
+              <w:top w:type="dxa" w:w="60"/>
+              <w:left w:type="dxa" w:w="100"/>
+              <w:bottom w:type="dxa" w:w="60"/>
+              <w:right w:type="dxa" w:w="100"/>
+            </w:tcMar>
+          </w:tcPr>
+          <w:p>
+            <w:r>
+              <w:rPr>
+                <w:rFonts w:ascii="Consolas" w:cs="Consolas" w:eastAsia="Consolas" w:hAnsi="Consolas"/>
+                <w:sz w:val="20"/>
+                <w:szCs w:val="20"/>
+              </w:rPr>
+              <w:t xml:space="preserve">GET /questoes/{id}</w:t>
+            </w:r>
+          </w:p>
+        </w:tc>
+        <w:tc>
+          <w:tcPr>
+            <w:tcW w:type="dxa" w:w="5443"/>
+            <w:tcBorders>
+              <w:top w:val="single" w:color="BFBFBF" w:sz="4"/>
+              <w:left w:val="single" w:color="BFBFBF" w:sz="4"/>
+              <w:bottom w:val="single" w:color="BFBFBF" w:sz="4"/>
+              <w:right w:val="single" w:color="BFBFBF" w:sz="4"/>
+            </w:tcBorders>
+            <w:tcMar>
+              <w:top w:type="dxa" w:w="60"/>
+              <w:left w:type="dxa" w:w="100"/>
+              <w:bottom w:type="dxa" w:w="60"/>
+              <w:right w:type="dxa" w:w="100"/>
+            </w:tcMar>
+          </w:tcPr>
+          <w:p>
+            <w:r>
+              <w:rPr>
+                <w:sz w:val="20"/>
+                <w:szCs w:val="20"/>
+              </w:rPr>
+              <w:t xml:space="preserve">Enunciado, alternativas com o gabarito destacado e, se existir, a explicação mais recente com modelo, prompt, tempo e custo</w:t>
+            </w:r>
+          </w:p>
+        </w:tc>
+      </w:tr>
+      <w:tr>
+        <w:trPr>
+          <w:cantSplit/>
+        </w:trPr>
+        <w:tc>
+          <w:tcPr>
+            <w:tcW w:type="dxa" w:w="3628"/>
+            <w:tcBorders>
+              <w:top w:val="single" w:color="BFBFBF" w:sz="4"/>
+              <w:left w:val="single" w:color="BFBFBF" w:sz="4"/>
+              <w:bottom w:val="single" w:color="BFBFBF" w:sz="4"/>
+              <w:right w:val="single" w:color="BFBFBF" w:sz="4"/>
+            </w:tcBorders>
+            <w:tcMar>
+              <w:top w:type="dxa" w:w="60"/>
+              <w:left w:type="dxa" w:w="100"/>
+              <w:bottom w:type="dxa" w:w="60"/>
+              <w:right w:type="dxa" w:w="100"/>
+            </w:tcMar>
+          </w:tcPr>
+          <w:p>
+            <w:r>
+              <w:rPr>
+                <w:rFonts w:ascii="Consolas" w:cs="Consolas" w:eastAsia="Consolas" w:hAnsi="Consolas"/>
+                <w:sz w:val="20"/>
+                <w:szCs w:val="20"/>
+              </w:rPr>
+              <w:t xml:space="preserve">POST /questoes/{id}/explicar</w:t>
+            </w:r>
+          </w:p>
+        </w:tc>
+        <w:tc>
+          <w:tcPr>
+            <w:tcW w:type="dxa" w:w="5443"/>
+            <w:tcBorders>
+              <w:top w:val="single" w:color="BFBFBF" w:sz="4"/>
+              <w:left w:val="single" w:color="BFBFBF" w:sz="4"/>
+              <w:bottom w:val="single" w:color="BFBFBF" w:sz="4"/>
+              <w:right w:val="single" w:color="BFBFBF" w:sz="4"/>
+            </w:tcBorders>
+            <w:tcMar>
+              <w:top w:type="dxa" w:w="60"/>
+              <w:left w:type="dxa" w:w="100"/>
+              <w:bottom w:type="dxa" w:w="60"/>
+              <w:right w:type="dxa" w:w="100"/>
+            </w:tcMar>
+          </w:tcPr>
+          <w:p>
+            <w:r>
+              <w:rPr>
+                <w:sz w:val="20"/>
+                <w:szCs w:val="20"/>
+              </w:rPr>
+              <w:t xml:space="preserve">Gera uma nova explicação e volta para a página da questão; na falha, a página mostra o motivo e o número da métrica</w:t>
+            </w:r>
+          </w:p>
+        </w:tc>
+      </w:tr>
+    </w:tbl>
+    <w:p>
+      <w:pPr>
+        <w:spacing w:after="120"/>
+      </w:pPr>
+    </w:p>
+    <w:p>
+      <w:pPr>
+        <w:spacing w:after="120" w:line="300"/>
+      </w:pPr>
+      <w:r>
+        <w:t xml:space="preserve">A função </w:t>
+      </w:r>
+      <w:r>
+        <w:rPr>
+          <w:rFonts w:ascii="Consolas" w:cs="Consolas" w:eastAsia="Consolas" w:hAnsi="Consolas"/>
+          <w:sz w:val="20"/>
+          <w:szCs w:val="20"/>
+        </w:rPr>
+        <w:t xml:space="preserve">obter_cliente_llm</w:t>
+      </w:r>
+      <w:r>
+        <w:t xml:space="preserve"> fornece o cliente do modelo às rotas. Nos testes, ela é trocada por um cliente falso, o que permite testar as páginas sem gastar crédito.</w:t>
+      </w:r>
+    </w:p>
+    <w:p>
+      <w:pPr>
+        <w:pStyle w:val="Heading2"/>
+      </w:pPr>
+      <w:r>
+        <w:t xml:space="preserve">4.8 Custo: app/metricas/precos.py</w:t>
+      </w:r>
+    </w:p>
+    <w:tbl>
+      <w:tblPr>
+        <w:tblW w:type="dxa" w:w="9071"/>
+        <w:tblBorders>
+          <w:top w:val="single" w:color="auto" w:sz="4"/>
+          <w:left w:val="single" w:color="auto" w:sz="4"/>
+          <w:bottom w:val="single" w:color="auto" w:sz="4"/>
+          <w:right w:val="single" w:color="auto" w:sz="4"/>
+          <w:insideH w:val="single" w:color="auto" w:sz="4"/>
+          <w:insideV w:val="single" w:color="auto" w:sz="4"/>
+        </w:tblBorders>
+      </w:tblPr>
+      <w:tblGrid>
+        <w:gridCol w:w="3628"/>
+        <w:gridCol w:w="5443"/>
+      </w:tblGrid>
+      <w:tr>
+        <w:trPr>
+          <w:tblHeader/>
+        </w:trPr>
+        <w:tc>
+          <w:tcPr>
+            <w:tcW w:type="dxa" w:w="3628"/>
+            <w:tcBorders>
+              <w:top w:val="single" w:color="BFBFBF" w:sz="4"/>
+              <w:left w:val="single" w:color="BFBFBF" w:sz="4"/>
+              <w:bottom w:val="single" w:color="BFBFBF" w:sz="4"/>
+              <w:right w:val="single" w:color="BFBFBF" w:sz="4"/>
+            </w:tcBorders>
+            <w:shd w:fill="D9E2F3" w:color="auto" w:val="clear"/>
+            <w:tcMar>
+              <w:top w:type="dxa" w:w="60"/>
+              <w:left w:type="dxa" w:w="100"/>
+              <w:bottom w:type="dxa" w:w="60"/>
+              <w:right w:type="dxa" w:w="100"/>
+            </w:tcMar>
+          </w:tcPr>
+          <w:p>
+            <w:r>
+              <w:rPr>
+                <w:b/>
+                <w:bCs/>
+                <w:sz w:val="20"/>
+                <w:szCs w:val="20"/>
+              </w:rPr>
+              <w:t xml:space="preserve">Elemento</w:t>
+            </w:r>
+          </w:p>
+        </w:tc>
+        <w:tc>
+          <w:tcPr>
+            <w:tcW w:type="dxa" w:w="5443"/>
+            <w:tcBorders>
+              <w:top w:val="single" w:color="BFBFBF" w:sz="4"/>
+              <w:left w:val="single" w:color="BFBFBF" w:sz="4"/>
+              <w:bottom w:val="single" w:color="BFBFBF" w:sz="4"/>
+              <w:right w:val="single" w:color="BFBFBF" w:sz="4"/>
+            </w:tcBorders>
+            <w:shd w:fill="D9E2F3" w:color="auto" w:val="clear"/>
+            <w:tcMar>
+              <w:top w:type="dxa" w:w="60"/>
+              <w:left w:type="dxa" w:w="100"/>
+              <w:bottom w:type="dxa" w:w="60"/>
+              <w:right w:type="dxa" w:w="100"/>
+            </w:tcMar>
+          </w:tcPr>
+          <w:p>
+            <w:r>
+              <w:rPr>
+                <w:b/>
+                <w:bCs/>
+                <w:sz w:val="20"/>
+                <w:szCs w:val="20"/>
+              </w:rPr>
+              <w:t xml:space="preserve">O que faz</w:t>
+            </w:r>
+          </w:p>
+        </w:tc>
+      </w:tr>
+      <w:tr>
+        <w:trPr>
+          <w:cantSplit/>
+        </w:trPr>
+        <w:tc>
+          <w:tcPr>
+            <w:tcW w:type="dxa" w:w="3628"/>
+            <w:tcBorders>
+              <w:top w:val="single" w:color="BFBFBF" w:sz="4"/>
+              <w:left w:val="single" w:color="BFBFBF" w:sz="4"/>
+              <w:bottom w:val="single" w:color="BFBFBF" w:sz="4"/>
+              <w:right w:val="single" w:color="BFBFBF" w:sz="4"/>
+            </w:tcBorders>
+            <w:tcMar>
+              <w:top w:type="dxa" w:w="60"/>
+              <w:left w:type="dxa" w:w="100"/>
+              <w:bottom w:type="dxa" w:w="60"/>
+              <w:right w:type="dxa" w:w="100"/>
+            </w:tcMar>
+          </w:tcPr>
+          <w:p>
+            <w:r>
+              <w:rPr>
+                <w:rFonts w:ascii="Consolas" w:cs="Consolas" w:eastAsia="Consolas" w:hAnsi="Consolas"/>
+                <w:sz w:val="20"/>
+                <w:szCs w:val="20"/>
+              </w:rPr>
+              <w:t xml:space="preserve">Preco</w:t>
+            </w:r>
+          </w:p>
+        </w:tc>
+        <w:tc>
+          <w:tcPr>
+            <w:tcW w:type="dxa" w:w="5443"/>
+            <w:tcBorders>
+              <w:top w:val="single" w:color="BFBFBF" w:sz="4"/>
+              <w:left w:val="single" w:color="BFBFBF" w:sz="4"/>
+              <w:bottom w:val="single" w:color="BFBFBF" w:sz="4"/>
+              <w:right w:val="single" w:color="BFBFBF" w:sz="4"/>
+            </w:tcBorders>
+            <w:tcMar>
+              <w:top w:type="dxa" w:w="60"/>
+              <w:left w:type="dxa" w:w="100"/>
+              <w:bottom w:type="dxa" w:w="60"/>
+              <w:right w:type="dxa" w:w="100"/>
+            </w:tcMar>
+          </w:tcPr>
+          <w:p>
+            <w:r>
+              <w:rPr>
+                <w:sz w:val="20"/>
+                <w:szCs w:val="20"/>
+              </w:rPr>
+              <w:t xml:space="preserve">Preços de um modelo: entrada, entrada em cache, gravação em cache e saída</w:t>
+            </w:r>
+          </w:p>
+        </w:tc>
+      </w:tr>
+      <w:tr>
+        <w:trPr>
+          <w:cantSplit/>
+        </w:trPr>
+        <w:tc>
+          <w:tcPr>
+            <w:tcW w:type="dxa" w:w="3628"/>
+            <w:tcBorders>
+              <w:top w:val="single" w:color="BFBFBF" w:sz="4"/>
+              <w:left w:val="single" w:color="BFBFBF" w:sz="4"/>
+              <w:bottom w:val="single" w:color="BFBFBF" w:sz="4"/>
+              <w:right w:val="single" w:color="BFBFBF" w:sz="4"/>
+            </w:tcBorders>
+            <w:tcMar>
+              <w:top w:type="dxa" w:w="60"/>
+              <w:left w:type="dxa" w:w="100"/>
+              <w:bottom w:type="dxa" w:w="60"/>
+              <w:right w:type="dxa" w:w="100"/>
+            </w:tcMar>
+          </w:tcPr>
+          <w:p>
+            <w:r>
+              <w:rPr>
+                <w:rFonts w:ascii="Consolas" w:cs="Consolas" w:eastAsia="Consolas" w:hAnsi="Consolas"/>
+                <w:sz w:val="20"/>
+                <w:szCs w:val="20"/>
+              </w:rPr>
+              <w:t xml:space="preserve">carregar_tabela()</w:t>
+            </w:r>
+          </w:p>
+        </w:tc>
+        <w:tc>
+          <w:tcPr>
+            <w:tcW w:type="dxa" w:w="5443"/>
+            <w:tcBorders>
+              <w:top w:val="single" w:color="BFBFBF" w:sz="4"/>
+              <w:left w:val="single" w:color="BFBFBF" w:sz="4"/>
+              <w:bottom w:val="single" w:color="BFBFBF" w:sz="4"/>
+              <w:right w:val="single" w:color="BFBFBF" w:sz="4"/>
+            </w:tcBorders>
+            <w:tcMar>
+              <w:top w:type="dxa" w:w="60"/>
+              <w:left w:type="dxa" w:w="100"/>
+              <w:bottom w:type="dxa" w:w="60"/>
+              <w:right w:type="dxa" w:w="100"/>
+            </w:tcMar>
+          </w:tcPr>
+          <w:p>
+            <w:r>
+              <w:rPr>
+                <w:sz w:val="20"/>
+                <w:szCs w:val="20"/>
+              </w:rPr>
+              <w:t xml:space="preserve">Lê </w:t>
+            </w:r>
+            <w:r>
+              <w:rPr>
+                <w:rFonts w:ascii="Consolas" w:cs="Consolas" w:eastAsia="Consolas" w:hAnsi="Consolas"/>
+                <w:sz w:val="20"/>
+                <w:szCs w:val="20"/>
+              </w:rPr>
+              <w:t xml:space="preserve">config/precos.toml</w:t>
+            </w:r>
+            <w:r>
+              <w:rPr>
+                <w:sz w:val="20"/>
+                <w:szCs w:val="20"/>
+              </w:rPr>
+              <w:t xml:space="preserve"> uma vez e guarda em memória</w:t>
+            </w:r>
+          </w:p>
+        </w:tc>
+      </w:tr>
+      <w:tr>
+        <w:trPr>
+          <w:cantSplit/>
+        </w:trPr>
+        <w:tc>
+          <w:tcPr>
+            <w:tcW w:type="dxa" w:w="3628"/>
+            <w:tcBorders>
+              <w:top w:val="single" w:color="BFBFBF" w:sz="4"/>
+              <w:left w:val="single" w:color="BFBFBF" w:sz="4"/>
+              <w:bottom w:val="single" w:color="BFBFBF" w:sz="4"/>
+              <w:right w:val="single" w:color="BFBFBF" w:sz="4"/>
+            </w:tcBorders>
+            <w:tcMar>
+              <w:top w:type="dxa" w:w="60"/>
+              <w:left w:type="dxa" w:w="100"/>
+              <w:bottom w:type="dxa" w:w="60"/>
+              <w:right w:type="dxa" w:w="100"/>
+            </w:tcMar>
+          </w:tcPr>
+          <w:p>
+            <w:r>
+              <w:rPr>
+                <w:rFonts w:ascii="Consolas" w:cs="Consolas" w:eastAsia="Consolas" w:hAnsi="Consolas"/>
+                <w:sz w:val="20"/>
+                <w:szCs w:val="20"/>
+              </w:rPr>
+              <w:t xml:space="preserve">preco_do_modelo(modelo)</w:t>
+            </w:r>
+          </w:p>
+        </w:tc>
+        <w:tc>
+          <w:tcPr>
+            <w:tcW w:type="dxa" w:w="5443"/>
+            <w:tcBorders>
+              <w:top w:val="single" w:color="BFBFBF" w:sz="4"/>
+              <w:left w:val="single" w:color="BFBFBF" w:sz="4"/>
+              <w:bottom w:val="single" w:color="BFBFBF" w:sz="4"/>
+              <w:right w:val="single" w:color="BFBFBF" w:sz="4"/>
+            </w:tcBorders>
+            <w:tcMar>
+              <w:top w:type="dxa" w:w="60"/>
+              <w:left w:type="dxa" w:w="100"/>
+              <w:bottom w:type="dxa" w:w="60"/>
+              <w:right w:type="dxa" w:w="100"/>
+            </w:tcMar>
+          </w:tcPr>
+          <w:p>
+            <w:r>
+              <w:rPr>
+                <w:sz w:val="20"/>
+                <w:szCs w:val="20"/>
+              </w:rPr>
+              <w:t xml:space="preserve">Procura pelo nome exato e, se não achar, pelo nome base (aceita sufixos de versão)</w:t>
+            </w:r>
+          </w:p>
+        </w:tc>
+      </w:tr>
+      <w:tr>
+        <w:trPr>
+          <w:cantSplit/>
+        </w:trPr>
+        <w:tc>
+          <w:tcPr>
+            <w:tcW w:type="dxa" w:w="3628"/>
+            <w:tcBorders>
+              <w:top w:val="single" w:color="BFBFBF" w:sz="4"/>
+              <w:left w:val="single" w:color="BFBFBF" w:sz="4"/>
+              <w:bottom w:val="single" w:color="BFBFBF" w:sz="4"/>
+              <w:right w:val="single" w:color="BFBFBF" w:sz="4"/>
+            </w:tcBorders>
+            <w:tcMar>
+              <w:top w:type="dxa" w:w="60"/>
+              <w:left w:type="dxa" w:w="100"/>
+              <w:bottom w:type="dxa" w:w="60"/>
+              <w:right w:type="dxa" w:w="100"/>
+            </w:tcMar>
+          </w:tcPr>
+          <w:p>
+            <w:r>
+              <w:rPr>
+                <w:rFonts w:ascii="Consolas" w:cs="Consolas" w:eastAsia="Consolas" w:hAnsi="Consolas"/>
+                <w:sz w:val="20"/>
+                <w:szCs w:val="20"/>
+              </w:rPr>
+              <w:t xml:space="preserve">calcular_custo(...)</w:t>
+            </w:r>
+          </w:p>
+        </w:tc>
+        <w:tc>
+          <w:tcPr>
+            <w:tcW w:type="dxa" w:w="5443"/>
+            <w:tcBorders>
+              <w:top w:val="single" w:color="BFBFBF" w:sz="4"/>
+              <w:left w:val="single" w:color="BFBFBF" w:sz="4"/>
+              <w:bottom w:val="single" w:color="BFBFBF" w:sz="4"/>
+              <w:right w:val="single" w:color="BFBFBF" w:sz="4"/>
+            </w:tcBorders>
+            <w:tcMar>
+              <w:top w:type="dxa" w:w="60"/>
+              <w:left w:type="dxa" w:w="100"/>
+              <w:bottom w:type="dxa" w:w="60"/>
+              <w:right w:type="dxa" w:w="100"/>
+            </w:tcMar>
+          </w:tcPr>
+          <w:p>
+            <w:r>
+              <w:rPr>
+                <w:sz w:val="20"/>
+                <w:szCs w:val="20"/>
+              </w:rPr>
+              <w:t xml:space="preserve">Aplica a fórmula da seção 5.2; devolve vazio para modelo sem preço, em vez de inventar um valor</w:t>
             </w:r>
           </w:p>
         </w:tc>
@@ -12952,7 +14113,425 @@
         <w:pStyle w:val="Heading2"/>
       </w:pPr>
       <w:r>
-        <w:t xml:space="preserve">4.8 Requisição de teste: scripts/teste_requisicao.py</w:t>
+        <w:t xml:space="preserve">4.9 Métricas na web: app/metricas/router.py</w:t>
+      </w:r>
+    </w:p>
+    <w:tbl>
+      <w:tblPr>
+        <w:tblW w:type="dxa" w:w="9071"/>
+        <w:tblBorders>
+          <w:top w:val="single" w:color="auto" w:sz="4"/>
+          <w:left w:val="single" w:color="auto" w:sz="4"/>
+          <w:bottom w:val="single" w:color="auto" w:sz="4"/>
+          <w:right w:val="single" w:color="auto" w:sz="4"/>
+          <w:insideH w:val="single" w:color="auto" w:sz="4"/>
+          <w:insideV w:val="single" w:color="auto" w:sz="4"/>
+        </w:tblBorders>
+      </w:tblPr>
+      <w:tblGrid>
+        <w:gridCol w:w="3628"/>
+        <w:gridCol w:w="5443"/>
+      </w:tblGrid>
+      <w:tr>
+        <w:trPr>
+          <w:tblHeader/>
+        </w:trPr>
+        <w:tc>
+          <w:tcPr>
+            <w:tcW w:type="dxa" w:w="3628"/>
+            <w:tcBorders>
+              <w:top w:val="single" w:color="BFBFBF" w:sz="4"/>
+              <w:left w:val="single" w:color="BFBFBF" w:sz="4"/>
+              <w:bottom w:val="single" w:color="BFBFBF" w:sz="4"/>
+              <w:right w:val="single" w:color="BFBFBF" w:sz="4"/>
+            </w:tcBorders>
+            <w:shd w:fill="D9E2F3" w:color="auto" w:val="clear"/>
+            <w:tcMar>
+              <w:top w:type="dxa" w:w="60"/>
+              <w:left w:type="dxa" w:w="100"/>
+              <w:bottom w:type="dxa" w:w="60"/>
+              <w:right w:type="dxa" w:w="100"/>
+            </w:tcMar>
+          </w:tcPr>
+          <w:p>
+            <w:r>
+              <w:rPr>
+                <w:b/>
+                <w:bCs/>
+                <w:sz w:val="20"/>
+                <w:szCs w:val="20"/>
+              </w:rPr>
+              <w:t xml:space="preserve">Rota</w:t>
+            </w:r>
+          </w:p>
+        </w:tc>
+        <w:tc>
+          <w:tcPr>
+            <w:tcW w:type="dxa" w:w="5443"/>
+            <w:tcBorders>
+              <w:top w:val="single" w:color="BFBFBF" w:sz="4"/>
+              <w:left w:val="single" w:color="BFBFBF" w:sz="4"/>
+              <w:bottom w:val="single" w:color="BFBFBF" w:sz="4"/>
+              <w:right w:val="single" w:color="BFBFBF" w:sz="4"/>
+            </w:tcBorders>
+            <w:shd w:fill="D9E2F3" w:color="auto" w:val="clear"/>
+            <w:tcMar>
+              <w:top w:type="dxa" w:w="60"/>
+              <w:left w:type="dxa" w:w="100"/>
+              <w:bottom w:type="dxa" w:w="60"/>
+              <w:right w:type="dxa" w:w="100"/>
+            </w:tcMar>
+          </w:tcPr>
+          <w:p>
+            <w:r>
+              <w:rPr>
+                <w:b/>
+                <w:bCs/>
+                <w:sz w:val="20"/>
+                <w:szCs w:val="20"/>
+              </w:rPr>
+              <w:t xml:space="preserve">O que faz</w:t>
+            </w:r>
+          </w:p>
+        </w:tc>
+      </w:tr>
+      <w:tr>
+        <w:trPr>
+          <w:cantSplit/>
+        </w:trPr>
+        <w:tc>
+          <w:tcPr>
+            <w:tcW w:type="dxa" w:w="3628"/>
+            <w:tcBorders>
+              <w:top w:val="single" w:color="BFBFBF" w:sz="4"/>
+              <w:left w:val="single" w:color="BFBFBF" w:sz="4"/>
+              <w:bottom w:val="single" w:color="BFBFBF" w:sz="4"/>
+              <w:right w:val="single" w:color="BFBFBF" w:sz="4"/>
+            </w:tcBorders>
+            <w:tcMar>
+              <w:top w:type="dxa" w:w="60"/>
+              <w:left w:type="dxa" w:w="100"/>
+              <w:bottom w:type="dxa" w:w="60"/>
+              <w:right w:type="dxa" w:w="100"/>
+            </w:tcMar>
+          </w:tcPr>
+          <w:p>
+            <w:r>
+              <w:rPr>
+                <w:rFonts w:ascii="Consolas" w:cs="Consolas" w:eastAsia="Consolas" w:hAnsi="Consolas"/>
+                <w:sz w:val="20"/>
+                <w:szCs w:val="20"/>
+              </w:rPr>
+              <w:t xml:space="preserve">GET /metricas</w:t>
+            </w:r>
+          </w:p>
+        </w:tc>
+        <w:tc>
+          <w:tcPr>
+            <w:tcW w:type="dxa" w:w="5443"/>
+            <w:tcBorders>
+              <w:top w:val="single" w:color="BFBFBF" w:sz="4"/>
+              <w:left w:val="single" w:color="BFBFBF" w:sz="4"/>
+              <w:bottom w:val="single" w:color="BFBFBF" w:sz="4"/>
+              <w:right w:val="single" w:color="BFBFBF" w:sz="4"/>
+            </w:tcBorders>
+            <w:tcMar>
+              <w:top w:type="dxa" w:w="60"/>
+              <w:left w:type="dxa" w:w="100"/>
+              <w:bottom w:type="dxa" w:w="60"/>
+              <w:right w:type="dxa" w:w="100"/>
+            </w:tcMar>
+          </w:tcPr>
+          <w:p>
+            <w:r>
+              <w:rPr>
+                <w:sz w:val="20"/>
+                <w:szCs w:val="20"/>
+              </w:rPr>
+              <w:t xml:space="preserve">Página com as 200 requisições mais recentes</w:t>
+            </w:r>
+          </w:p>
+        </w:tc>
+      </w:tr>
+      <w:tr>
+        <w:trPr>
+          <w:cantSplit/>
+        </w:trPr>
+        <w:tc>
+          <w:tcPr>
+            <w:tcW w:type="dxa" w:w="3628"/>
+            <w:tcBorders>
+              <w:top w:val="single" w:color="BFBFBF" w:sz="4"/>
+              <w:left w:val="single" w:color="BFBFBF" w:sz="4"/>
+              <w:bottom w:val="single" w:color="BFBFBF" w:sz="4"/>
+              <w:right w:val="single" w:color="BFBFBF" w:sz="4"/>
+            </w:tcBorders>
+            <w:tcMar>
+              <w:top w:type="dxa" w:w="60"/>
+              <w:left w:type="dxa" w:w="100"/>
+              <w:bottom w:type="dxa" w:w="60"/>
+              <w:right w:type="dxa" w:w="100"/>
+            </w:tcMar>
+          </w:tcPr>
+          <w:p>
+            <w:r>
+              <w:rPr>
+                <w:rFonts w:ascii="Consolas" w:cs="Consolas" w:eastAsia="Consolas" w:hAnsi="Consolas"/>
+                <w:sz w:val="20"/>
+                <w:szCs w:val="20"/>
+              </w:rPr>
+              <w:t xml:space="preserve">GET /metricas/exportar.csv</w:t>
+            </w:r>
+          </w:p>
+        </w:tc>
+        <w:tc>
+          <w:tcPr>
+            <w:tcW w:type="dxa" w:w="5443"/>
+            <w:tcBorders>
+              <w:top w:val="single" w:color="BFBFBF" w:sz="4"/>
+              <w:left w:val="single" w:color="BFBFBF" w:sz="4"/>
+              <w:bottom w:val="single" w:color="BFBFBF" w:sz="4"/>
+              <w:right w:val="single" w:color="BFBFBF" w:sz="4"/>
+            </w:tcBorders>
+            <w:tcMar>
+              <w:top w:type="dxa" w:w="60"/>
+              <w:left w:type="dxa" w:w="100"/>
+              <w:bottom w:type="dxa" w:w="60"/>
+              <w:right w:type="dxa" w:w="100"/>
+            </w:tcMar>
+          </w:tcPr>
+          <w:p>
+            <w:r>
+              <w:rPr>
+                <w:sz w:val="20"/>
+                <w:szCs w:val="20"/>
+              </w:rPr>
+              <w:t xml:space="preserve">Arquivo CSV com todas as requisições e todos os campos, para análise (RF14)</w:t>
+            </w:r>
+          </w:p>
+        </w:tc>
+      </w:tr>
+    </w:tbl>
+    <w:p>
+      <w:pPr>
+        <w:spacing w:after="120"/>
+      </w:pPr>
+    </w:p>
+    <w:p>
+      <w:pPr>
+        <w:pStyle w:val="Heading2"/>
+      </w:pPr>
+      <w:r>
+        <w:t xml:space="preserve">4.10 Aplicação: app/main.py</w:t>
+      </w:r>
+    </w:p>
+    <w:tbl>
+      <w:tblPr>
+        <w:tblW w:type="dxa" w:w="9071"/>
+        <w:tblBorders>
+          <w:top w:val="single" w:color="auto" w:sz="4"/>
+          <w:left w:val="single" w:color="auto" w:sz="4"/>
+          <w:bottom w:val="single" w:color="auto" w:sz="4"/>
+          <w:right w:val="single" w:color="auto" w:sz="4"/>
+          <w:insideH w:val="single" w:color="auto" w:sz="4"/>
+          <w:insideV w:val="single" w:color="auto" w:sz="4"/>
+        </w:tblBorders>
+      </w:tblPr>
+      <w:tblGrid>
+        <w:gridCol w:w="3628"/>
+        <w:gridCol w:w="5443"/>
+      </w:tblGrid>
+      <w:tr>
+        <w:trPr>
+          <w:tblHeader/>
+        </w:trPr>
+        <w:tc>
+          <w:tcPr>
+            <w:tcW w:type="dxa" w:w="3628"/>
+            <w:tcBorders>
+              <w:top w:val="single" w:color="BFBFBF" w:sz="4"/>
+              <w:left w:val="single" w:color="BFBFBF" w:sz="4"/>
+              <w:bottom w:val="single" w:color="BFBFBF" w:sz="4"/>
+              <w:right w:val="single" w:color="BFBFBF" w:sz="4"/>
+            </w:tcBorders>
+            <w:shd w:fill="D9E2F3" w:color="auto" w:val="clear"/>
+            <w:tcMar>
+              <w:top w:type="dxa" w:w="60"/>
+              <w:left w:type="dxa" w:w="100"/>
+              <w:bottom w:type="dxa" w:w="60"/>
+              <w:right w:type="dxa" w:w="100"/>
+            </w:tcMar>
+          </w:tcPr>
+          <w:p>
+            <w:r>
+              <w:rPr>
+                <w:b/>
+                <w:bCs/>
+                <w:sz w:val="20"/>
+                <w:szCs w:val="20"/>
+              </w:rPr>
+              <w:t xml:space="preserve">Rota</w:t>
+            </w:r>
+          </w:p>
+        </w:tc>
+        <w:tc>
+          <w:tcPr>
+            <w:tcW w:type="dxa" w:w="5443"/>
+            <w:tcBorders>
+              <w:top w:val="single" w:color="BFBFBF" w:sz="4"/>
+              <w:left w:val="single" w:color="BFBFBF" w:sz="4"/>
+              <w:bottom w:val="single" w:color="BFBFBF" w:sz="4"/>
+              <w:right w:val="single" w:color="BFBFBF" w:sz="4"/>
+            </w:tcBorders>
+            <w:shd w:fill="D9E2F3" w:color="auto" w:val="clear"/>
+            <w:tcMar>
+              <w:top w:type="dxa" w:w="60"/>
+              <w:left w:type="dxa" w:w="100"/>
+              <w:bottom w:type="dxa" w:w="60"/>
+              <w:right w:type="dxa" w:w="100"/>
+            </w:tcMar>
+          </w:tcPr>
+          <w:p>
+            <w:r>
+              <w:rPr>
+                <w:b/>
+                <w:bCs/>
+                <w:sz w:val="20"/>
+                <w:szCs w:val="20"/>
+              </w:rPr>
+              <w:t xml:space="preserve">O que faz</w:t>
+            </w:r>
+          </w:p>
+        </w:tc>
+      </w:tr>
+      <w:tr>
+        <w:trPr>
+          <w:cantSplit/>
+        </w:trPr>
+        <w:tc>
+          <w:tcPr>
+            <w:tcW w:type="dxa" w:w="3628"/>
+            <w:tcBorders>
+              <w:top w:val="single" w:color="BFBFBF" w:sz="4"/>
+              <w:left w:val="single" w:color="BFBFBF" w:sz="4"/>
+              <w:bottom w:val="single" w:color="BFBFBF" w:sz="4"/>
+              <w:right w:val="single" w:color="BFBFBF" w:sz="4"/>
+            </w:tcBorders>
+            <w:tcMar>
+              <w:top w:type="dxa" w:w="60"/>
+              <w:left w:type="dxa" w:w="100"/>
+              <w:bottom w:type="dxa" w:w="60"/>
+              <w:right w:type="dxa" w:w="100"/>
+            </w:tcMar>
+          </w:tcPr>
+          <w:p>
+            <w:r>
+              <w:rPr>
+                <w:rFonts w:ascii="Consolas" w:cs="Consolas" w:eastAsia="Consolas" w:hAnsi="Consolas"/>
+                <w:sz w:val="20"/>
+                <w:szCs w:val="20"/>
+              </w:rPr>
+              <w:t xml:space="preserve">GET /</w:t>
+            </w:r>
+          </w:p>
+        </w:tc>
+        <w:tc>
+          <w:tcPr>
+            <w:tcW w:type="dxa" w:w="5443"/>
+            <w:tcBorders>
+              <w:top w:val="single" w:color="BFBFBF" w:sz="4"/>
+              <w:left w:val="single" w:color="BFBFBF" w:sz="4"/>
+              <w:bottom w:val="single" w:color="BFBFBF" w:sz="4"/>
+              <w:right w:val="single" w:color="BFBFBF" w:sz="4"/>
+            </w:tcBorders>
+            <w:tcMar>
+              <w:top w:type="dxa" w:w="60"/>
+              <w:left w:type="dxa" w:w="100"/>
+              <w:bottom w:type="dxa" w:w="60"/>
+              <w:right w:type="dxa" w:w="100"/>
+            </w:tcMar>
+          </w:tcPr>
+          <w:p>
+            <w:r>
+              <w:rPr>
+                <w:sz w:val="20"/>
+                <w:szCs w:val="20"/>
+              </w:rPr>
+              <w:t xml:space="preserve">Página inicial, com o modelo configurado</w:t>
+            </w:r>
+          </w:p>
+        </w:tc>
+      </w:tr>
+      <w:tr>
+        <w:trPr>
+          <w:cantSplit/>
+        </w:trPr>
+        <w:tc>
+          <w:tcPr>
+            <w:tcW w:type="dxa" w:w="3628"/>
+            <w:tcBorders>
+              <w:top w:val="single" w:color="BFBFBF" w:sz="4"/>
+              <w:left w:val="single" w:color="BFBFBF" w:sz="4"/>
+              <w:bottom w:val="single" w:color="BFBFBF" w:sz="4"/>
+              <w:right w:val="single" w:color="BFBFBF" w:sz="4"/>
+            </w:tcBorders>
+            <w:tcMar>
+              <w:top w:type="dxa" w:w="60"/>
+              <w:left w:type="dxa" w:w="100"/>
+              <w:bottom w:type="dxa" w:w="60"/>
+              <w:right w:type="dxa" w:w="100"/>
+            </w:tcMar>
+          </w:tcPr>
+          <w:p>
+            <w:r>
+              <w:rPr>
+                <w:rFonts w:ascii="Consolas" w:cs="Consolas" w:eastAsia="Consolas" w:hAnsi="Consolas"/>
+                <w:sz w:val="20"/>
+                <w:szCs w:val="20"/>
+              </w:rPr>
+              <w:t xml:space="preserve">GET /saude</w:t>
+            </w:r>
+          </w:p>
+        </w:tc>
+        <w:tc>
+          <w:tcPr>
+            <w:tcW w:type="dxa" w:w="5443"/>
+            <w:tcBorders>
+              <w:top w:val="single" w:color="BFBFBF" w:sz="4"/>
+              <w:left w:val="single" w:color="BFBFBF" w:sz="4"/>
+              <w:bottom w:val="single" w:color="BFBFBF" w:sz="4"/>
+              <w:right w:val="single" w:color="BFBFBF" w:sz="4"/>
+            </w:tcBorders>
+            <w:tcMar>
+              <w:top w:type="dxa" w:w="60"/>
+              <w:left w:type="dxa" w:w="100"/>
+              <w:bottom w:type="dxa" w:w="60"/>
+              <w:right w:type="dxa" w:w="100"/>
+            </w:tcMar>
+          </w:tcPr>
+          <w:p>
+            <w:r>
+              <w:rPr>
+                <w:sz w:val="20"/>
+                <w:szCs w:val="20"/>
+              </w:rPr>
+              <w:t xml:space="preserve">Verificação rápida de que o servidor está no ar</w:t>
+            </w:r>
+          </w:p>
+        </w:tc>
+      </w:tr>
+    </w:tbl>
+    <w:p>
+      <w:pPr>
+        <w:spacing w:after="120"/>
+      </w:pPr>
+    </w:p>
+    <w:p>
+      <w:pPr>
+        <w:pStyle w:val="Heading2"/>
+      </w:pPr>
+      <w:r>
+        <w:t xml:space="preserve">4.11 Requisição de teste: scripts/teste_requisicao.py</w:t>
       </w:r>
     </w:p>
     <w:p>
@@ -12979,7 +14558,7 @@
         <w:pStyle w:val="Heading2"/>
       </w:pPr>
       <w:r>
-        <w:t xml:space="preserve">4.9 Importador do ENEM: scripts/importar_enem.py</w:t>
+        <w:t xml:space="preserve">4.12 Importador do ENEM: scripts/importar_enem.py</w:t>
       </w:r>
     </w:p>
     <w:p>
@@ -14677,7 +16256,7 @@
         <w:pStyle w:val="ListParagraph"/>
         <w:numPr>
           <w:ilvl w:val="0"/>
-          <w:numId w:val="4"/>
+          <w:numId w:val="6"/>
         </w:numPr>
         <w:spacing w:after="80" w:line="290"/>
       </w:pPr>
@@ -14701,7 +16280,7 @@
         <w:pStyle w:val="ListParagraph"/>
         <w:numPr>
           <w:ilvl w:val="0"/>
-          <w:numId w:val="4"/>
+          <w:numId w:val="6"/>
         </w:numPr>
         <w:spacing w:after="80" w:line="290"/>
       </w:pPr>
@@ -14725,7 +16304,7 @@
         <w:pStyle w:val="ListParagraph"/>
         <w:numPr>
           <w:ilvl w:val="0"/>
-          <w:numId w:val="4"/>
+          <w:numId w:val="6"/>
         </w:numPr>
         <w:spacing w:after="80" w:line="290"/>
       </w:pPr>
@@ -14760,7 +16339,7 @@
         <w:pStyle w:val="ListParagraph"/>
         <w:numPr>
           <w:ilvl w:val="0"/>
-          <w:numId w:val="4"/>
+          <w:numId w:val="6"/>
         </w:numPr>
         <w:spacing w:after="80" w:line="290"/>
       </w:pPr>
@@ -14784,7 +16363,7 @@
         <w:pStyle w:val="ListParagraph"/>
         <w:numPr>
           <w:ilvl w:val="0"/>
-          <w:numId w:val="4"/>
+          <w:numId w:val="6"/>
         </w:numPr>
         <w:spacing w:after="80" w:line="290"/>
       </w:pPr>
@@ -14819,7 +16398,7 @@
         <w:pStyle w:val="ListParagraph"/>
         <w:numPr>
           <w:ilvl w:val="0"/>
-          <w:numId w:val="4"/>
+          <w:numId w:val="6"/>
         </w:numPr>
         <w:spacing w:after="80" w:line="290"/>
       </w:pPr>
@@ -14843,7 +16422,7 @@
         <w:pStyle w:val="ListParagraph"/>
         <w:numPr>
           <w:ilvl w:val="0"/>
-          <w:numId w:val="4"/>
+          <w:numId w:val="6"/>
         </w:numPr>
         <w:spacing w:after="80" w:line="290"/>
       </w:pPr>
@@ -15195,7 +16774,7 @@
                 <w:sz w:val="20"/>
                 <w:szCs w:val="20"/>
               </w:rPr>
-              <w:t xml:space="preserve">Subir o sistema em http://localhost:8000</w:t>
+              <w:t xml:space="preserve">Subir o sistema em http://localhost:8000; as questões ficam em /questoes</w:t>
             </w:r>
           </w:p>
         </w:tc>
@@ -15418,7 +16997,7 @@
         <w:t xml:space="preserve">pytest</w:t>
       </w:r>
       <w:r>
-        <w:t xml:space="preserve"> e não acessam a internet nem gastam crédito: a API da OpenAI e a API do ENEM são substituídas por versões falsas que devolvem respostas controladas. Total nesta versão: 15 testes.</w:t>
+        <w:t xml:space="preserve"> e não acessam a internet nem gastam crédito: a API da OpenAI e a API do ENEM são substituídas por versões falsas que devolvem respostas controladas. Total nesta versão: 28 testes.</w:t>
       </w:r>
     </w:p>
     <w:tbl>
@@ -15701,6 +17280,64 @@
                 <w:sz w:val="20"/>
                 <w:szCs w:val="20"/>
               </w:rPr>
+              <w:t xml:space="preserve">tests/test_objetiva.py</w:t>
+            </w:r>
+          </w:p>
+        </w:tc>
+        <w:tc>
+          <w:tcPr>
+            <w:tcW w:type="dxa" w:w="6350"/>
+            <w:tcBorders>
+              <w:top w:val="single" w:color="BFBFBF" w:sz="4"/>
+              <w:left w:val="single" w:color="BFBFBF" w:sz="4"/>
+              <w:bottom w:val="single" w:color="BFBFBF" w:sz="4"/>
+              <w:right w:val="single" w:color="BFBFBF" w:sz="4"/>
+            </w:tcBorders>
+            <w:tcMar>
+              <w:top w:type="dxa" w:w="60"/>
+              <w:left w:type="dxa" w:w="100"/>
+              <w:bottom w:type="dxa" w:w="60"/>
+              <w:right w:type="dxa" w:w="100"/>
+            </w:tcMar>
+          </w:tcPr>
+          <w:p>
+            <w:r>
+              <w:rPr>
+                <w:sz w:val="20"/>
+                <w:szCs w:val="20"/>
+              </w:rPr>
+              <w:t xml:space="preserve">Prompt montado com enunciado, alternativas e gabarito; correção gravada e ligada à métrica; quatro tipos de resposta inconsistente viram falha sem correção; resposta malformada; lista, detalhe e página inexistente; cadastro válido e inválido; geração pela página; falha exibida com o motivo</w:t>
+            </w:r>
+          </w:p>
+        </w:tc>
+      </w:tr>
+      <w:tr>
+        <w:trPr>
+          <w:cantSplit/>
+        </w:trPr>
+        <w:tc>
+          <w:tcPr>
+            <w:tcW w:type="dxa" w:w="2721"/>
+            <w:tcBorders>
+              <w:top w:val="single" w:color="BFBFBF" w:sz="4"/>
+              <w:left w:val="single" w:color="BFBFBF" w:sz="4"/>
+              <w:bottom w:val="single" w:color="BFBFBF" w:sz="4"/>
+              <w:right w:val="single" w:color="BFBFBF" w:sz="4"/>
+            </w:tcBorders>
+            <w:tcMar>
+              <w:top w:type="dxa" w:w="60"/>
+              <w:left w:type="dxa" w:w="100"/>
+              <w:bottom w:type="dxa" w:w="60"/>
+              <w:right w:type="dxa" w:w="100"/>
+            </w:tcMar>
+          </w:tcPr>
+          <w:p>
+            <w:r>
+              <w:rPr>
+                <w:rFonts w:ascii="Consolas" w:cs="Consolas" w:eastAsia="Consolas" w:hAnsi="Consolas"/>
+                <w:sz w:val="20"/>
+                <w:szCs w:val="20"/>
+              </w:rPr>
               <w:t xml:space="preserve">tests/test_importar_enem.py</w:t>
             </w:r>
           </w:p>
@@ -15778,7 +17415,7 @@
         <w:pStyle w:val="ListParagraph"/>
         <w:numPr>
           <w:ilvl w:val="0"/>
-          <w:numId w:val="5"/>
+          <w:numId w:val="7"/>
         </w:numPr>
         <w:spacing w:after="80" w:line="290"/>
       </w:pPr>
@@ -15802,7 +17439,7 @@
         <w:pStyle w:val="ListParagraph"/>
         <w:numPr>
           <w:ilvl w:val="0"/>
-          <w:numId w:val="5"/>
+          <w:numId w:val="7"/>
         </w:numPr>
         <w:spacing w:after="80" w:line="290"/>
       </w:pPr>
@@ -15815,7 +17452,7 @@
         <w:pStyle w:val="ListParagraph"/>
         <w:numPr>
           <w:ilvl w:val="0"/>
-          <w:numId w:val="5"/>
+          <w:numId w:val="7"/>
         </w:numPr>
         <w:spacing w:after="80" w:line="290"/>
       </w:pPr>
@@ -15828,7 +17465,7 @@
         <w:pStyle w:val="ListParagraph"/>
         <w:numPr>
           <w:ilvl w:val="0"/>
-          <w:numId w:val="5"/>
+          <w:numId w:val="7"/>
         </w:numPr>
         <w:spacing w:after="80" w:line="290"/>
       </w:pPr>
@@ -15841,7 +17478,7 @@
         <w:pStyle w:val="ListParagraph"/>
         <w:numPr>
           <w:ilvl w:val="0"/>
-          <w:numId w:val="5"/>
+          <w:numId w:val="7"/>
         </w:numPr>
         <w:spacing w:after="80" w:line="290"/>
       </w:pPr>
@@ -15865,7 +17502,7 @@
         <w:pStyle w:val="ListParagraph"/>
         <w:numPr>
           <w:ilvl w:val="0"/>
-          <w:numId w:val="5"/>
+          <w:numId w:val="7"/>
         </w:numPr>
         <w:spacing w:after="80" w:line="290"/>
       </w:pPr>
@@ -16516,6 +18153,120 @@
           </w:p>
         </w:tc>
       </w:tr>
+      <w:tr>
+        <w:trPr>
+          <w:cantSplit/>
+        </w:trPr>
+        <w:tc>
+          <w:tcPr>
+            <w:tcW w:type="dxa" w:w="3628"/>
+            <w:tcBorders>
+              <w:top w:val="single" w:color="BFBFBF" w:sz="4"/>
+              <w:left w:val="single" w:color="BFBFBF" w:sz="4"/>
+              <w:bottom w:val="single" w:color="BFBFBF" w:sz="4"/>
+              <w:right w:val="single" w:color="BFBFBF" w:sz="4"/>
+            </w:tcBorders>
+            <w:tcMar>
+              <w:top w:type="dxa" w:w="60"/>
+              <w:left w:type="dxa" w:w="100"/>
+              <w:bottom w:type="dxa" w:w="60"/>
+              <w:right w:type="dxa" w:w="100"/>
+            </w:tcMar>
+          </w:tcPr>
+          <w:p>
+            <w:r>
+              <w:rPr>
+                <w:sz w:val="20"/>
+                <w:szCs w:val="20"/>
+              </w:rPr>
+              <w:t xml:space="preserve">Resposta que contradiz o gabarito conta como falha</w:t>
+            </w:r>
+          </w:p>
+        </w:tc>
+        <w:tc>
+          <w:tcPr>
+            <w:tcW w:type="dxa" w:w="5443"/>
+            <w:tcBorders>
+              <w:top w:val="single" w:color="BFBFBF" w:sz="4"/>
+              <w:left w:val="single" w:color="BFBFBF" w:sz="4"/>
+              <w:bottom w:val="single" w:color="BFBFBF" w:sz="4"/>
+              <w:right w:val="single" w:color="BFBFBF" w:sz="4"/>
+            </w:tcBorders>
+            <w:tcMar>
+              <w:top w:type="dxa" w:w="60"/>
+              <w:left w:type="dxa" w:w="100"/>
+              <w:bottom w:type="dxa" w:w="60"/>
+              <w:right w:type="dxa" w:w="100"/>
+            </w:tcMar>
+          </w:tcPr>
+          <w:p>
+            <w:r>
+              <w:rPr>
+                <w:sz w:val="20"/>
+                <w:szCs w:val="20"/>
+              </w:rPr>
+              <w:t xml:space="preserve">Uma explicação incompatível com a decisão do professor é inutilizável, e a taxa de falha precisa refletir isso</w:t>
+            </w:r>
+          </w:p>
+        </w:tc>
+      </w:tr>
+      <w:tr>
+        <w:trPr>
+          <w:cantSplit/>
+        </w:trPr>
+        <w:tc>
+          <w:tcPr>
+            <w:tcW w:type="dxa" w:w="3628"/>
+            <w:tcBorders>
+              <w:top w:val="single" w:color="BFBFBF" w:sz="4"/>
+              <w:left w:val="single" w:color="BFBFBF" w:sz="4"/>
+              <w:bottom w:val="single" w:color="BFBFBF" w:sz="4"/>
+              <w:right w:val="single" w:color="BFBFBF" w:sz="4"/>
+            </w:tcBorders>
+            <w:tcMar>
+              <w:top w:type="dxa" w:w="60"/>
+              <w:left w:type="dxa" w:w="100"/>
+              <w:bottom w:type="dxa" w:w="60"/>
+              <w:right w:type="dxa" w:w="100"/>
+            </w:tcMar>
+          </w:tcPr>
+          <w:p>
+            <w:r>
+              <w:rPr>
+                <w:sz w:val="20"/>
+                <w:szCs w:val="20"/>
+              </w:rPr>
+              <w:t xml:space="preserve">Explicação de objetiva ligada à questão, não a um aluno</w:t>
+            </w:r>
+          </w:p>
+        </w:tc>
+        <w:tc>
+          <w:tcPr>
+            <w:tcW w:type="dxa" w:w="5443"/>
+            <w:tcBorders>
+              <w:top w:val="single" w:color="BFBFBF" w:sz="4"/>
+              <w:left w:val="single" w:color="BFBFBF" w:sz="4"/>
+              <w:bottom w:val="single" w:color="BFBFBF" w:sz="4"/>
+              <w:right w:val="single" w:color="BFBFBF" w:sz="4"/>
+            </w:tcBorders>
+            <w:tcMar>
+              <w:top w:type="dxa" w:w="60"/>
+              <w:left w:type="dxa" w:w="100"/>
+              <w:bottom w:type="dxa" w:w="60"/>
+              <w:right w:type="dxa" w:w="100"/>
+            </w:tcMar>
+          </w:tcPr>
+          <w:p>
+            <w:r>
+              <w:rPr>
+                <w:sz w:val="20"/>
+                <w:szCs w:val="20"/>
+              </w:rPr>
+              <w:t xml:space="preserve">O RF02 pede a explicação de cada alternativa, que não depende de quem respondeu</w:t>
+            </w:r>
+          </w:p>
+        </w:tc>
+      </w:tr>
     </w:tbl>
     <w:p>
       <w:pPr>
@@ -16535,7 +18286,7 @@
         <w:pStyle w:val="ListParagraph"/>
         <w:numPr>
           <w:ilvl w:val="0"/>
-          <w:numId w:val="6"/>
+          <w:numId w:val="5"/>
         </w:numPr>
         <w:spacing w:after="80" w:line="290"/>
       </w:pPr>
@@ -16577,7 +18328,7 @@
         <w:pStyle w:val="ListParagraph"/>
         <w:numPr>
           <w:ilvl w:val="0"/>
-          <w:numId w:val="6"/>
+          <w:numId w:val="5"/>
         </w:numPr>
         <w:spacing w:after="80" w:line="290"/>
       </w:pPr>
@@ -16597,7 +18348,7 @@
         <w:pStyle w:val="ListParagraph"/>
         <w:numPr>
           <w:ilvl w:val="0"/>
-          <w:numId w:val="6"/>
+          <w:numId w:val="5"/>
         </w:numPr>
         <w:spacing w:after="80" w:line="290"/>
       </w:pPr>
@@ -16617,7 +18368,7 @@
         <w:pStyle w:val="ListParagraph"/>
         <w:numPr>
           <w:ilvl w:val="0"/>
-          <w:numId w:val="6"/>
+          <w:numId w:val="5"/>
         </w:numPr>
         <w:spacing w:after="80" w:line="290"/>
       </w:pPr>
@@ -16637,7 +18388,7 @@
         <w:pStyle w:val="ListParagraph"/>
         <w:numPr>
           <w:ilvl w:val="0"/>
-          <w:numId w:val="6"/>
+          <w:numId w:val="5"/>
         </w:numPr>
         <w:spacing w:after="80" w:line="290"/>
       </w:pPr>
@@ -16668,7 +18419,47 @@
         <w:pStyle w:val="ListParagraph"/>
         <w:numPr>
           <w:ilvl w:val="0"/>
-          <w:numId w:val="6"/>
+          <w:numId w:val="5"/>
+        </w:numPr>
+        <w:spacing w:after="80" w:line="290"/>
+      </w:pPr>
+      <w:r>
+        <w:rPr>
+          <w:b/>
+          <w:bCs/>
+        </w:rPr>
+        <w:t xml:space="preserve">Geração na própria requisição da página:</w:t>
+      </w:r>
+      <w:r>
+        <w:t xml:space="preserve"> o navegador espera a resposta do modelo, o que leva alguns segundos. É adequado para um usuário por vez; a execução em lote da etapa 5 roda por linha de comando.</w:t>
+      </w:r>
+    </w:p>
+    <w:p>
+      <w:pPr>
+        <w:pStyle w:val="ListParagraph"/>
+        <w:numPr>
+          <w:ilvl w:val="0"/>
+          <w:numId w:val="5"/>
+        </w:numPr>
+        <w:spacing w:after="80" w:line="290"/>
+      </w:pPr>
+      <w:r>
+        <w:rPr>
+          <w:b/>
+          <w:bCs/>
+        </w:rPr>
+        <w:t xml:space="preserve">Explicações anteriores:</w:t>
+      </w:r>
+      <w:r>
+        <w:t xml:space="preserve"> a página mostra só a explicação mais recente. As anteriores continuam no banco e entram na análise.</w:t>
+      </w:r>
+    </w:p>
+    <w:p>
+      <w:pPr>
+        <w:pStyle w:val="ListParagraph"/>
+        <w:numPr>
+          <w:ilvl w:val="0"/>
+          <w:numId w:val="5"/>
         </w:numPr>
         <w:spacing w:after="80" w:line="290"/>
       </w:pPr>
@@ -17564,6 +19355,78 @@
                 <w:szCs w:val="20"/>
               </w:rPr>
               <w:t xml:space="preserve">Texto de instrução enviado ao modelo de linguagem</w:t>
+            </w:r>
+          </w:p>
+        </w:tc>
+      </w:tr>
+      <w:tr>
+        <w:trPr>
+          <w:cantSplit/>
+        </w:trPr>
+        <w:tc>
+          <w:tcPr>
+            <w:tcW w:type="dxa" w:w="2721"/>
+            <w:tcBorders>
+              <w:top w:val="single" w:color="BFBFBF" w:sz="4"/>
+              <w:left w:val="single" w:color="BFBFBF" w:sz="4"/>
+              <w:bottom w:val="single" w:color="BFBFBF" w:sz="4"/>
+              <w:right w:val="single" w:color="BFBFBF" w:sz="4"/>
+            </w:tcBorders>
+            <w:tcMar>
+              <w:top w:type="dxa" w:w="60"/>
+              <w:left w:type="dxa" w:w="100"/>
+              <w:bottom w:type="dxa" w:w="60"/>
+              <w:right w:type="dxa" w:w="100"/>
+            </w:tcMar>
+          </w:tcPr>
+          <w:p>
+            <w:r>
+              <w:rPr>
+                <w:sz w:val="20"/>
+                <w:szCs w:val="20"/>
+              </w:rPr>
+              <w:t xml:space="preserve">Rota</w:t>
+            </w:r>
+          </w:p>
+        </w:tc>
+        <w:tc>
+          <w:tcPr>
+            <w:tcW w:type="dxa" w:w="6350"/>
+            <w:tcBorders>
+              <w:top w:val="single" w:color="BFBFBF" w:sz="4"/>
+              <w:left w:val="single" w:color="BFBFBF" w:sz="4"/>
+              <w:bottom w:val="single" w:color="BFBFBF" w:sz="4"/>
+              <w:right w:val="single" w:color="BFBFBF" w:sz="4"/>
+            </w:tcBorders>
+            <w:tcMar>
+              <w:top w:type="dxa" w:w="60"/>
+              <w:left w:type="dxa" w:w="100"/>
+              <w:bottom w:type="dxa" w:w="60"/>
+              <w:right w:type="dxa" w:w="100"/>
+            </w:tcMar>
+          </w:tcPr>
+          <w:p>
+            <w:r>
+              <w:rPr>
+                <w:sz w:val="20"/>
+                <w:szCs w:val="20"/>
+              </w:rPr>
+              <w:t xml:space="preserve">Endereço da aplicação web associado a uma ação, como </w:t>
+            </w:r>
+            <w:r>
+              <w:rPr>
+                <w:rFonts w:ascii="Consolas" w:cs="Consolas" w:eastAsia="Consolas" w:hAnsi="Consolas"/>
+                <w:sz w:val="20"/>
+                <w:szCs w:val="20"/>
+              </w:rPr>
+              <w:t xml:space="preserve">GET /questoes</w:t>
+            </w:r>
+            <w:r>
+              <w:rPr>
+                <w:sz w:val="20"/>
+                <w:szCs w:val="20"/>
+              </w:rPr>
+              <w:t xml:space="preserve">, que lista as questões</w:t>
             </w:r>
           </w:p>
         </w:tc>
@@ -18115,6 +19978,115 @@
                 <w:sz w:val="20"/>
                 <w:szCs w:val="20"/>
               </w:rPr>
+              <w:t xml:space="preserve">0.3</w:t>
+            </w:r>
+          </w:p>
+        </w:tc>
+        <w:tc>
+          <w:tcPr>
+            <w:tcW w:type="dxa" w:w="2267"/>
+            <w:tcBorders>
+              <w:top w:val="single" w:color="BFBFBF" w:sz="4"/>
+              <w:left w:val="single" w:color="BFBFBF" w:sz="4"/>
+              <w:bottom w:val="single" w:color="BFBFBF" w:sz="4"/>
+              <w:right w:val="single" w:color="BFBFBF" w:sz="4"/>
+            </w:tcBorders>
+            <w:tcMar>
+              <w:top w:type="dxa" w:w="60"/>
+              <w:left w:type="dxa" w:w="100"/>
+              <w:bottom w:type="dxa" w:w="60"/>
+              <w:right w:type="dxa" w:w="100"/>
+            </w:tcMar>
+          </w:tcPr>
+          <w:p>
+            <w:r>
+              <w:rPr>
+                <w:sz w:val="20"/>
+                <w:szCs w:val="20"/>
+              </w:rPr>
+              <w:t xml:space="preserve">pull request da etapa 2</w:t>
+            </w:r>
+          </w:p>
+        </w:tc>
+        <w:tc>
+          <w:tcPr>
+            <w:tcW w:type="dxa" w:w="4084"/>
+            <w:tcBorders>
+              <w:top w:val="single" w:color="BFBFBF" w:sz="4"/>
+              <w:left w:val="single" w:color="BFBFBF" w:sz="4"/>
+              <w:bottom w:val="single" w:color="BFBFBF" w:sz="4"/>
+              <w:right w:val="single" w:color="BFBFBF" w:sz="4"/>
+            </w:tcBorders>
+            <w:tcMar>
+              <w:top w:type="dxa" w:w="60"/>
+              <w:left w:type="dxa" w:w="100"/>
+              <w:bottom w:type="dxa" w:w="60"/>
+              <w:right w:type="dxa" w:w="100"/>
+            </w:tcMar>
+          </w:tcPr>
+          <w:p>
+            <w:r>
+              <w:rPr>
+                <w:sz w:val="20"/>
+                <w:szCs w:val="20"/>
+              </w:rPr>
+              <w:t xml:space="preserve">Módulo objetivo: contrato de saída, conferência com o gabarito, prompt objetiva_v1, páginas de lista, cadastro, detalhe e geração da explicação</w:t>
+            </w:r>
+          </w:p>
+        </w:tc>
+      </w:tr>
+      <w:tr>
+        <w:trPr>
+          <w:cantSplit/>
+        </w:trPr>
+        <w:tc>
+          <w:tcPr>
+            <w:tcW w:type="dxa" w:w="1511"/>
+            <w:tcBorders>
+              <w:top w:val="single" w:color="BFBFBF" w:sz="4"/>
+              <w:left w:val="single" w:color="BFBFBF" w:sz="4"/>
+              <w:bottom w:val="single" w:color="BFBFBF" w:sz="4"/>
+              <w:right w:val="single" w:color="BFBFBF" w:sz="4"/>
+            </w:tcBorders>
+            <w:tcMar>
+              <w:top w:type="dxa" w:w="60"/>
+              <w:left w:type="dxa" w:w="100"/>
+              <w:bottom w:type="dxa" w:w="60"/>
+              <w:right w:type="dxa" w:w="100"/>
+            </w:tcMar>
+          </w:tcPr>
+          <w:p>
+            <w:r>
+              <w:rPr>
+                <w:sz w:val="20"/>
+                <w:szCs w:val="20"/>
+              </w:rPr>
+              <w:t xml:space="preserve">19/10/2026</w:t>
+            </w:r>
+          </w:p>
+        </w:tc>
+        <w:tc>
+          <w:tcPr>
+            <w:tcW w:type="dxa" w:w="1209"/>
+            <w:tcBorders>
+              <w:top w:val="single" w:color="BFBFBF" w:sz="4"/>
+              <w:left w:val="single" w:color="BFBFBF" w:sz="4"/>
+              <w:bottom w:val="single" w:color="BFBFBF" w:sz="4"/>
+              <w:right w:val="single" w:color="BFBFBF" w:sz="4"/>
+            </w:tcBorders>
+            <w:tcMar>
+              <w:top w:type="dxa" w:w="60"/>
+              <w:left w:type="dxa" w:w="100"/>
+              <w:bottom w:type="dxa" w:w="60"/>
+              <w:right w:type="dxa" w:w="100"/>
+            </w:tcMar>
+          </w:tcPr>
+          <w:p>
+            <w:r>
+              <w:rPr>
+                <w:sz w:val="20"/>
+                <w:szCs w:val="20"/>
+              </w:rPr>
               <w:t xml:space="preserve">0.2</w:t>
             </w:r>
           </w:p>
@@ -18409,7 +20381,7 @@
         <w:pStyle w:val="ListParagraph"/>
         <w:numPr>
           <w:ilvl w:val="0"/>
-          <w:numId w:val="6"/>
+          <w:numId w:val="5"/>
         </w:numPr>
         <w:spacing w:after="80" w:line="290"/>
       </w:pPr>
@@ -18422,7 +20394,7 @@
         <w:pStyle w:val="ListParagraph"/>
         <w:numPr>
           <w:ilvl w:val="0"/>
-          <w:numId w:val="6"/>
+          <w:numId w:val="5"/>
         </w:numPr>
         <w:spacing w:after="80" w:line="290"/>
       </w:pPr>
@@ -18435,7 +20407,7 @@
         <w:pStyle w:val="ListParagraph"/>
         <w:numPr>
           <w:ilvl w:val="0"/>
-          <w:numId w:val="6"/>
+          <w:numId w:val="5"/>
         </w:numPr>
         <w:spacing w:after="80" w:line="290"/>
       </w:pPr>
@@ -18448,7 +20420,7 @@
         <w:pStyle w:val="ListParagraph"/>
         <w:numPr>
           <w:ilvl w:val="0"/>
-          <w:numId w:val="6"/>
+          <w:numId w:val="5"/>
         </w:numPr>
         <w:spacing w:after="80" w:line="290"/>
       </w:pPr>
@@ -18607,7 +20579,7 @@
         <w:sz w:val="18"/>
         <w:szCs w:val="18"/>
       </w:rPr>
-      <w:t xml:space="preserve">Documentação Técnica do Protótipo, versão 0.2</w:t>
+      <w:t xml:space="preserve">Documentação Técnica do Protótipo, versão 0.3</w:t>
     </w:r>
   </w:p>
 </w:hdr>
@@ -18759,6 +20731,18 @@
       </w:pPr>
     </w:lvl>
   </w:abstractNum>
+  <w:abstractNum w:abstractNumId="7" w15:restartNumberingAfterBreak="0">
+    <w:multiLevelType w:val="hybridMultilevel"/>
+    <w:lvl w:ilvl="0" w15:tentative="1">
+      <w:start w:val="1"/>
+      <w:numFmt w:val="decimal"/>
+      <w:lvlText w:val="%1."/>
+      <w:lvlJc w:val="left"/>
+      <w:pPr>
+        <w:ind w:left="540" w:hanging="360"/>
+      </w:pPr>
+    </w:lvl>
+  </w:abstractNum>
   <w:num w:numId="1">
     <w:abstractNumId w:val="1"/>
     <w:lvlOverride w:ilvl="0">
@@ -18784,13 +20768,19 @@
     </w:lvlOverride>
   </w:num>
   <w:num w:numId="5">
+    <w:abstractNumId w:val="2"/>
+    <w:lvlOverride w:ilvl="0">
+      <w:startOverride w:val="1"/>
+    </w:lvlOverride>
+  </w:num>
+  <w:num w:numId="6">
     <w:abstractNumId w:val="6"/>
     <w:lvlOverride w:ilvl="0">
       <w:startOverride w:val="1"/>
     </w:lvlOverride>
   </w:num>
-  <w:num w:numId="6">
-    <w:abstractNumId w:val="2"/>
+  <w:num w:numId="7">
+    <w:abstractNumId w:val="7"/>
     <w:lvlOverride w:ilvl="0">
       <w:startOverride w:val="1"/>
     </w:lvlOverride>

</xml_diff>

<commit_message>
Documentação 0.4: explicação v2 e conferência do importador
Co-Authored-By: Claude Opus 5.5 <noreply@anthropic.com>
Claude-Session: https://claude.ai/code/session_01W2sxSqc4ZdmAUWH2L8vsV2
</commit_message>
<xml_diff>
--- a/docs/Documentacao_Tecnica.docx
+++ b/docs/Documentacao_Tecnica.docx
@@ -114,7 +114,7 @@
         <w:t xml:space="preserve">Versão: </w:t>
       </w:r>
       <w:r>
-        <w:t xml:space="preserve">0.3, de 19/10/2026</w:t>
+        <w:t xml:space="preserve">0.4, de 20/10/2026</w:t>
       </w:r>
     </w:p>
     <w:p>
@@ -1039,7 +1039,7 @@
                 <w:sz w:val="20"/>
                 <w:szCs w:val="20"/>
               </w:rPr>
-              <w:t xml:space="preserve">Implementada em 19/10/2026; falta o teste com a chave real</w:t>
+              <w:t xml:space="preserve">Concluída em 19/10/2026; explicação v2 (tipo de erro) em revisão em 20/10/2026</w:t>
             </w:r>
           </w:p>
         </w:tc>
@@ -12275,7 +12275,18 @@
         <w:spacing w:after="120" w:line="300"/>
       </w:pPr>
       <w:r>
-        <w:t xml:space="preserve">Define, em Pydantic, o formato que a API é obrigada a seguir na resposta, conforme a seção "Contrato de saída da IA" da especificação. As descrições dos campos são enviadas junto com o formato e orientam o modelo.</w:t>
+        <w:t xml:space="preserve">Define, em Pydantic, o formato que a API é obrigada a seguir na resposta, conforme a seção "Contrato de saída da IA" da especificação. As descrições dos campos são enviadas junto com o formato e orientam o modelo. Cada versão de prompt tem o seu contrato, registrado em </w:t>
+      </w:r>
+      <w:r>
+        <w:rPr>
+          <w:rFonts w:ascii="Consolas" w:cs="Consolas" w:eastAsia="Consolas" w:hAnsi="Consolas"/>
+          <w:sz w:val="20"/>
+          <w:szCs w:val="20"/>
+        </w:rPr>
+        <w:t xml:space="preserve">CONTRATO_POR_PROMPT</w:t>
+      </w:r>
+      <w:r>
+        <w:t xml:space="preserve">; as versões antigas permanecem no código para que as correções já gravadas continuem legíveis.</w:t>
       </w:r>
     </w:p>
     <w:tbl>
@@ -12386,6 +12397,21 @@
               </w:rPr>
               <w:t xml:space="preserve">ExplicacaoAlternativa</w:t>
             </w:r>
+            <w:r>
+              <w:rPr>
+                <w:sz w:val="20"/>
+                <w:szCs w:val="20"/>
+              </w:rPr>
+              <w:t xml:space="preserve">, </w:t>
+            </w:r>
+            <w:r>
+              <w:rPr>
+                <w:rFonts w:ascii="Consolas" w:cs="Consolas" w:eastAsia="Consolas" w:hAnsi="Consolas"/>
+                <w:sz w:val="20"/>
+                <w:szCs w:val="20"/>
+              </w:rPr>
+              <w:t xml:space="preserve">CorrecaoObjetiva</w:t>
+            </w:r>
           </w:p>
         </w:tc>
         <w:tc>
@@ -12410,7 +12436,7 @@
                 <w:sz w:val="20"/>
                 <w:szCs w:val="20"/>
               </w:rPr>
-              <w:t xml:space="preserve">Uma alternativa: </w:t>
+              <w:t xml:space="preserve">Versão 1 (prompt </w:t>
             </w:r>
             <w:r>
               <w:rPr>
@@ -12418,6 +12444,21 @@
                 <w:sz w:val="20"/>
                 <w:szCs w:val="20"/>
               </w:rPr>
+              <w:t xml:space="preserve">objetiva_v1</w:t>
+            </w:r>
+            <w:r>
+              <w:rPr>
+                <w:sz w:val="20"/>
+                <w:szCs w:val="20"/>
+              </w:rPr>
+              <w:t xml:space="preserve">): por alternativa, </w:t>
+            </w:r>
+            <w:r>
+              <w:rPr>
+                <w:rFonts w:ascii="Consolas" w:cs="Consolas" w:eastAsia="Consolas" w:hAnsi="Consolas"/>
+                <w:sz w:val="20"/>
+                <w:szCs w:val="20"/>
+              </w:rPr>
               <w:t xml:space="preserve">letra</w:t>
             </w:r>
             <w:r>
@@ -12495,7 +12536,22 @@
                 <w:sz w:val="20"/>
                 <w:szCs w:val="20"/>
               </w:rPr>
-              <w:t xml:space="preserve">CorrecaoObjetiva</w:t>
+              <w:t xml:space="preserve">ExplicacaoAlternativaV2</w:t>
+            </w:r>
+            <w:r>
+              <w:rPr>
+                <w:sz w:val="20"/>
+                <w:szCs w:val="20"/>
+              </w:rPr>
+              <w:t xml:space="preserve">, </w:t>
+            </w:r>
+            <w:r>
+              <w:rPr>
+                <w:rFonts w:ascii="Consolas" w:cs="Consolas" w:eastAsia="Consolas" w:hAnsi="Consolas"/>
+                <w:sz w:val="20"/>
+                <w:szCs w:val="20"/>
+              </w:rPr>
+              <w:t xml:space="preserve">CorrecaoObjetivaV2</w:t>
             </w:r>
           </w:p>
         </w:tc>
@@ -12521,7 +12577,7 @@
                 <w:sz w:val="20"/>
                 <w:szCs w:val="20"/>
               </w:rPr>
-              <w:t xml:space="preserve">A resposta completa: </w:t>
+              <w:t xml:space="preserve">Versão 2 (prompt </w:t>
             </w:r>
             <w:r>
               <w:rPr>
@@ -12529,6 +12585,116 @@
                 <w:sz w:val="20"/>
                 <w:szCs w:val="20"/>
               </w:rPr>
+              <w:t xml:space="preserve">objetiva_v2</w:t>
+            </w:r>
+            <w:r>
+              <w:rPr>
+                <w:sz w:val="20"/>
+                <w:szCs w:val="20"/>
+              </w:rPr>
+              <w:t xml:space="preserve">, em uso): acrescenta </w:t>
+            </w:r>
+            <w:r>
+              <w:rPr>
+                <w:rFonts w:ascii="Consolas" w:cs="Consolas" w:eastAsia="Consolas" w:hAnsi="Consolas"/>
+                <w:sz w:val="20"/>
+                <w:szCs w:val="20"/>
+              </w:rPr>
+              <w:t xml:space="preserve">tipo_de_erro</w:t>
+            </w:r>
+            <w:r>
+              <w:rPr>
+                <w:sz w:val="20"/>
+                <w:szCs w:val="20"/>
+              </w:rPr>
+              <w:t xml:space="preserve">, </w:t>
+            </w:r>
+            <w:r>
+              <w:rPr>
+                <w:rFonts w:ascii="Consolas" w:cs="Consolas" w:eastAsia="Consolas" w:hAnsi="Consolas"/>
+                <w:sz w:val="20"/>
+                <w:szCs w:val="20"/>
+              </w:rPr>
+              <w:t xml:space="preserve">elemento_incorreto</w:t>
+            </w:r>
+            <w:r>
+              <w:rPr>
+                <w:sz w:val="20"/>
+                <w:szCs w:val="20"/>
+              </w:rPr>
+              <w:t xml:space="preserve"> e </w:t>
+            </w:r>
+            <w:r>
+              <w:rPr>
+                <w:rFonts w:ascii="Consolas" w:cs="Consolas" w:eastAsia="Consolas" w:hAnsi="Consolas"/>
+                <w:sz w:val="20"/>
+                <w:szCs w:val="20"/>
+              </w:rPr>
+              <w:t xml:space="preserve">como_verificar</w:t>
+            </w:r>
+            <w:r>
+              <w:rPr>
+                <w:sz w:val="20"/>
+                <w:szCs w:val="20"/>
+              </w:rPr>
+              <w:t xml:space="preserve"> a cada alternativa</w:t>
+            </w:r>
+          </w:p>
+        </w:tc>
+      </w:tr>
+      <w:tr>
+        <w:trPr>
+          <w:cantSplit/>
+        </w:trPr>
+        <w:tc>
+          <w:tcPr>
+            <w:tcW w:type="dxa" w:w="3628"/>
+            <w:tcBorders>
+              <w:top w:val="single" w:color="BFBFBF" w:sz="4"/>
+              <w:left w:val="single" w:color="BFBFBF" w:sz="4"/>
+              <w:bottom w:val="single" w:color="BFBFBF" w:sz="4"/>
+              <w:right w:val="single" w:color="BFBFBF" w:sz="4"/>
+            </w:tcBorders>
+            <w:tcMar>
+              <w:top w:type="dxa" w:w="60"/>
+              <w:left w:type="dxa" w:w="100"/>
+              <w:bottom w:type="dxa" w:w="60"/>
+              <w:right w:type="dxa" w:w="100"/>
+            </w:tcMar>
+          </w:tcPr>
+          <w:p>
+            <w:r>
+              <w:rPr>
+                <w:sz w:val="20"/>
+                <w:szCs w:val="20"/>
+              </w:rPr>
+              <w:t xml:space="preserve">Campos comuns da resposta</w:t>
+            </w:r>
+          </w:p>
+        </w:tc>
+        <w:tc>
+          <w:tcPr>
+            <w:tcW w:type="dxa" w:w="5443"/>
+            <w:tcBorders>
+              <w:top w:val="single" w:color="BFBFBF" w:sz="4"/>
+              <w:left w:val="single" w:color="BFBFBF" w:sz="4"/>
+              <w:bottom w:val="single" w:color="BFBFBF" w:sz="4"/>
+              <w:right w:val="single" w:color="BFBFBF" w:sz="4"/>
+            </w:tcBorders>
+            <w:tcMar>
+              <w:top w:type="dxa" w:w="60"/>
+              <w:left w:type="dxa" w:w="100"/>
+              <w:bottom w:type="dxa" w:w="60"/>
+              <w:right w:type="dxa" w:w="100"/>
+            </w:tcMar>
+          </w:tcPr>
+          <w:p>
+            <w:r>
+              <w:rPr>
+                <w:rFonts w:ascii="Consolas" w:cs="Consolas" w:eastAsia="Consolas" w:hAnsi="Consolas"/>
+                <w:sz w:val="20"/>
+                <w:szCs w:val="20"/>
+              </w:rPr>
               <w:t xml:space="preserve">questao_id</w:t>
             </w:r>
             <w:r>
@@ -12597,6 +12763,122 @@
                 <w:szCs w:val="20"/>
               </w:rPr>
               <w:t xml:space="preserve"> (baixo, medio ou alto)</w:t>
+            </w:r>
+          </w:p>
+        </w:tc>
+      </w:tr>
+      <w:tr>
+        <w:trPr>
+          <w:cantSplit/>
+        </w:trPr>
+        <w:tc>
+          <w:tcPr>
+            <w:tcW w:type="dxa" w:w="3628"/>
+            <w:tcBorders>
+              <w:top w:val="single" w:color="BFBFBF" w:sz="4"/>
+              <w:left w:val="single" w:color="BFBFBF" w:sz="4"/>
+              <w:bottom w:val="single" w:color="BFBFBF" w:sz="4"/>
+              <w:right w:val="single" w:color="BFBFBF" w:sz="4"/>
+            </w:tcBorders>
+            <w:tcMar>
+              <w:top w:type="dxa" w:w="60"/>
+              <w:left w:type="dxa" w:w="100"/>
+              <w:bottom w:type="dxa" w:w="60"/>
+              <w:right w:type="dxa" w:w="100"/>
+            </w:tcMar>
+          </w:tcPr>
+          <w:p>
+            <w:r>
+              <w:rPr>
+                <w:rFonts w:ascii="Consolas" w:cs="Consolas" w:eastAsia="Consolas" w:hAnsi="Consolas"/>
+                <w:sz w:val="20"/>
+                <w:szCs w:val="20"/>
+              </w:rPr>
+              <w:t xml:space="preserve">ROTULOS_TIPO_DE_ERRO</w:t>
+            </w:r>
+          </w:p>
+        </w:tc>
+        <w:tc>
+          <w:tcPr>
+            <w:tcW w:type="dxa" w:w="5443"/>
+            <w:tcBorders>
+              <w:top w:val="single" w:color="BFBFBF" w:sz="4"/>
+              <w:left w:val="single" w:color="BFBFBF" w:sz="4"/>
+              <w:bottom w:val="single" w:color="BFBFBF" w:sz="4"/>
+              <w:right w:val="single" w:color="BFBFBF" w:sz="4"/>
+            </w:tcBorders>
+            <w:tcMar>
+              <w:top w:type="dxa" w:w="60"/>
+              <w:left w:type="dxa" w:w="100"/>
+              <w:bottom w:type="dxa" w:w="60"/>
+              <w:right w:type="dxa" w:w="100"/>
+            </w:tcMar>
+          </w:tcPr>
+          <w:p>
+            <w:r>
+              <w:rPr>
+                <w:sz w:val="20"/>
+                <w:szCs w:val="20"/>
+              </w:rPr>
+              <w:t xml:space="preserve">Texto exibido na página para cada tipo de erro</w:t>
+            </w:r>
+          </w:p>
+        </w:tc>
+      </w:tr>
+      <w:tr>
+        <w:trPr>
+          <w:cantSplit/>
+        </w:trPr>
+        <w:tc>
+          <w:tcPr>
+            <w:tcW w:type="dxa" w:w="3628"/>
+            <w:tcBorders>
+              <w:top w:val="single" w:color="BFBFBF" w:sz="4"/>
+              <w:left w:val="single" w:color="BFBFBF" w:sz="4"/>
+              <w:bottom w:val="single" w:color="BFBFBF" w:sz="4"/>
+              <w:right w:val="single" w:color="BFBFBF" w:sz="4"/>
+            </w:tcBorders>
+            <w:tcMar>
+              <w:top w:type="dxa" w:w="60"/>
+              <w:left w:type="dxa" w:w="100"/>
+              <w:bottom w:type="dxa" w:w="60"/>
+              <w:right w:type="dxa" w:w="100"/>
+            </w:tcMar>
+          </w:tcPr>
+          <w:p>
+            <w:r>
+              <w:rPr>
+                <w:rFonts w:ascii="Consolas" w:cs="Consolas" w:eastAsia="Consolas" w:hAnsi="Consolas"/>
+                <w:sz w:val="20"/>
+                <w:szCs w:val="20"/>
+              </w:rPr>
+              <w:t xml:space="preserve">CONTRATO_POR_PROMPT</w:t>
+            </w:r>
+          </w:p>
+        </w:tc>
+        <w:tc>
+          <w:tcPr>
+            <w:tcW w:type="dxa" w:w="5443"/>
+            <w:tcBorders>
+              <w:top w:val="single" w:color="BFBFBF" w:sz="4"/>
+              <w:left w:val="single" w:color="BFBFBF" w:sz="4"/>
+              <w:bottom w:val="single" w:color="BFBFBF" w:sz="4"/>
+              <w:right w:val="single" w:color="BFBFBF" w:sz="4"/>
+            </w:tcBorders>
+            <w:tcMar>
+              <w:top w:type="dxa" w:w="60"/>
+              <w:left w:type="dxa" w:w="100"/>
+              <w:bottom w:type="dxa" w:w="60"/>
+              <w:right w:type="dxa" w:w="100"/>
+            </w:tcMar>
+          </w:tcPr>
+          <w:p>
+            <w:r>
+              <w:rPr>
+                <w:sz w:val="20"/>
+                <w:szCs w:val="20"/>
+              </w:rPr>
+              <w:t xml:space="preserve">Associa cada versão de prompt ao seu contrato</w:t>
             </w:r>
           </w:p>
         </w:tc>
@@ -12678,7 +12960,1184 @@
         <w:spacing w:after="120" w:line="300"/>
       </w:pPr>
       <w:r>
-        <w:t xml:space="preserve">O campo </w:t>
+        <w:t xml:space="preserve">Na versão 2, a conferência também exige que só as alternativas incorretas tenham </w:t>
+      </w:r>
+      <w:r>
+        <w:rPr>
+          <w:rFonts w:ascii="Consolas" w:cs="Consolas" w:eastAsia="Consolas" w:hAnsi="Consolas"/>
+          <w:sz w:val="20"/>
+          <w:szCs w:val="20"/>
+        </w:rPr>
+        <w:t xml:space="preserve">tipo_de_erro</w:t>
+      </w:r>
+      <w:r>
+        <w:t xml:space="preserve">; a correta deve vir com esse campo vazio.</w:t>
+      </w:r>
+    </w:p>
+    <w:p>
+      <w:pPr>
+        <w:pStyle w:val="Heading3"/>
+      </w:pPr>
+      <w:r>
+        <w:t xml:space="preserve">Campos da versão 2 por alternativa</w:t>
+      </w:r>
+    </w:p>
+    <w:tbl>
+      <w:tblPr>
+        <w:tblW w:type="dxa" w:w="9071"/>
+        <w:tblBorders>
+          <w:top w:val="single" w:color="auto" w:sz="4"/>
+          <w:left w:val="single" w:color="auto" w:sz="4"/>
+          <w:bottom w:val="single" w:color="auto" w:sz="4"/>
+          <w:right w:val="single" w:color="auto" w:sz="4"/>
+          <w:insideH w:val="single" w:color="auto" w:sz="4"/>
+          <w:insideV w:val="single" w:color="auto" w:sz="4"/>
+        </w:tblBorders>
+      </w:tblPr>
+      <w:tblGrid>
+        <w:gridCol w:w="2473"/>
+        <w:gridCol w:w="4123"/>
+        <w:gridCol w:w="2475"/>
+      </w:tblGrid>
+      <w:tr>
+        <w:trPr>
+          <w:tblHeader/>
+        </w:trPr>
+        <w:tc>
+          <w:tcPr>
+            <w:tcW w:type="dxa" w:w="2473"/>
+            <w:tcBorders>
+              <w:top w:val="single" w:color="BFBFBF" w:sz="4"/>
+              <w:left w:val="single" w:color="BFBFBF" w:sz="4"/>
+              <w:bottom w:val="single" w:color="BFBFBF" w:sz="4"/>
+              <w:right w:val="single" w:color="BFBFBF" w:sz="4"/>
+            </w:tcBorders>
+            <w:shd w:fill="D9E2F3" w:color="auto" w:val="clear"/>
+            <w:tcMar>
+              <w:top w:type="dxa" w:w="60"/>
+              <w:left w:type="dxa" w:w="100"/>
+              <w:bottom w:type="dxa" w:w="60"/>
+              <w:right w:type="dxa" w:w="100"/>
+            </w:tcMar>
+          </w:tcPr>
+          <w:p>
+            <w:r>
+              <w:rPr>
+                <w:b/>
+                <w:bCs/>
+                <w:sz w:val="20"/>
+                <w:szCs w:val="20"/>
+              </w:rPr>
+              <w:t xml:space="preserve">Campo</w:t>
+            </w:r>
+          </w:p>
+        </w:tc>
+        <w:tc>
+          <w:tcPr>
+            <w:tcW w:type="dxa" w:w="4123"/>
+            <w:tcBorders>
+              <w:top w:val="single" w:color="BFBFBF" w:sz="4"/>
+              <w:left w:val="single" w:color="BFBFBF" w:sz="4"/>
+              <w:bottom w:val="single" w:color="BFBFBF" w:sz="4"/>
+              <w:right w:val="single" w:color="BFBFBF" w:sz="4"/>
+            </w:tcBorders>
+            <w:shd w:fill="D9E2F3" w:color="auto" w:val="clear"/>
+            <w:tcMar>
+              <w:top w:type="dxa" w:w="60"/>
+              <w:left w:type="dxa" w:w="100"/>
+              <w:bottom w:type="dxa" w:w="60"/>
+              <w:right w:type="dxa" w:w="100"/>
+            </w:tcMar>
+          </w:tcPr>
+          <w:p>
+            <w:r>
+              <w:rPr>
+                <w:b/>
+                <w:bCs/>
+                <w:sz w:val="20"/>
+                <w:szCs w:val="20"/>
+              </w:rPr>
+              <w:t xml:space="preserve">Na alternativa incorreta</w:t>
+            </w:r>
+          </w:p>
+        </w:tc>
+        <w:tc>
+          <w:tcPr>
+            <w:tcW w:type="dxa" w:w="2475"/>
+            <w:tcBorders>
+              <w:top w:val="single" w:color="BFBFBF" w:sz="4"/>
+              <w:left w:val="single" w:color="BFBFBF" w:sz="4"/>
+              <w:bottom w:val="single" w:color="BFBFBF" w:sz="4"/>
+              <w:right w:val="single" w:color="BFBFBF" w:sz="4"/>
+            </w:tcBorders>
+            <w:shd w:fill="D9E2F3" w:color="auto" w:val="clear"/>
+            <w:tcMar>
+              <w:top w:type="dxa" w:w="60"/>
+              <w:left w:type="dxa" w:w="100"/>
+              <w:bottom w:type="dxa" w:w="60"/>
+              <w:right w:type="dxa" w:w="100"/>
+            </w:tcMar>
+          </w:tcPr>
+          <w:p>
+            <w:r>
+              <w:rPr>
+                <w:b/>
+                <w:bCs/>
+                <w:sz w:val="20"/>
+                <w:szCs w:val="20"/>
+              </w:rPr>
+              <w:t xml:space="preserve">Na alternativa correta</w:t>
+            </w:r>
+          </w:p>
+        </w:tc>
+      </w:tr>
+      <w:tr>
+        <w:trPr>
+          <w:cantSplit/>
+        </w:trPr>
+        <w:tc>
+          <w:tcPr>
+            <w:tcW w:type="dxa" w:w="2473"/>
+            <w:tcBorders>
+              <w:top w:val="single" w:color="BFBFBF" w:sz="4"/>
+              <w:left w:val="single" w:color="BFBFBF" w:sz="4"/>
+              <w:bottom w:val="single" w:color="BFBFBF" w:sz="4"/>
+              <w:right w:val="single" w:color="BFBFBF" w:sz="4"/>
+            </w:tcBorders>
+            <w:tcMar>
+              <w:top w:type="dxa" w:w="60"/>
+              <w:left w:type="dxa" w:w="100"/>
+              <w:bottom w:type="dxa" w:w="60"/>
+              <w:right w:type="dxa" w:w="100"/>
+            </w:tcMar>
+          </w:tcPr>
+          <w:p>
+            <w:r>
+              <w:rPr>
+                <w:rFonts w:ascii="Consolas" w:cs="Consolas" w:eastAsia="Consolas" w:hAnsi="Consolas"/>
+                <w:sz w:val="20"/>
+                <w:szCs w:val="20"/>
+              </w:rPr>
+              <w:t xml:space="preserve">tipo_de_erro</w:t>
+            </w:r>
+          </w:p>
+        </w:tc>
+        <w:tc>
+          <w:tcPr>
+            <w:tcW w:type="dxa" w:w="4123"/>
+            <w:tcBorders>
+              <w:top w:val="single" w:color="BFBFBF" w:sz="4"/>
+              <w:left w:val="single" w:color="BFBFBF" w:sz="4"/>
+              <w:bottom w:val="single" w:color="BFBFBF" w:sz="4"/>
+              <w:right w:val="single" w:color="BFBFBF" w:sz="4"/>
+            </w:tcBorders>
+            <w:tcMar>
+              <w:top w:type="dxa" w:w="60"/>
+              <w:left w:type="dxa" w:w="100"/>
+              <w:bottom w:type="dxa" w:w="60"/>
+              <w:right w:type="dxa" w:w="100"/>
+            </w:tcMar>
+          </w:tcPr>
+          <w:p>
+            <w:r>
+              <w:rPr>
+                <w:sz w:val="20"/>
+                <w:szCs w:val="20"/>
+              </w:rPr>
+              <w:t xml:space="preserve">A natureza do erro, escolhida na lista abaixo</w:t>
+            </w:r>
+          </w:p>
+        </w:tc>
+        <w:tc>
+          <w:tcPr>
+            <w:tcW w:type="dxa" w:w="2475"/>
+            <w:tcBorders>
+              <w:top w:val="single" w:color="BFBFBF" w:sz="4"/>
+              <w:left w:val="single" w:color="BFBFBF" w:sz="4"/>
+              <w:bottom w:val="single" w:color="BFBFBF" w:sz="4"/>
+              <w:right w:val="single" w:color="BFBFBF" w:sz="4"/>
+            </w:tcBorders>
+            <w:tcMar>
+              <w:top w:type="dxa" w:w="60"/>
+              <w:left w:type="dxa" w:w="100"/>
+              <w:bottom w:type="dxa" w:w="60"/>
+              <w:right w:type="dxa" w:w="100"/>
+            </w:tcMar>
+          </w:tcPr>
+          <w:p>
+            <w:r>
+              <w:rPr>
+                <w:sz w:val="20"/>
+                <w:szCs w:val="20"/>
+              </w:rPr>
+              <w:t xml:space="preserve">Vazio</w:t>
+            </w:r>
+          </w:p>
+        </w:tc>
+      </w:tr>
+      <w:tr>
+        <w:trPr>
+          <w:cantSplit/>
+        </w:trPr>
+        <w:tc>
+          <w:tcPr>
+            <w:tcW w:type="dxa" w:w="2473"/>
+            <w:tcBorders>
+              <w:top w:val="single" w:color="BFBFBF" w:sz="4"/>
+              <w:left w:val="single" w:color="BFBFBF" w:sz="4"/>
+              <w:bottom w:val="single" w:color="BFBFBF" w:sz="4"/>
+              <w:right w:val="single" w:color="BFBFBF" w:sz="4"/>
+            </w:tcBorders>
+            <w:tcMar>
+              <w:top w:type="dxa" w:w="60"/>
+              <w:left w:type="dxa" w:w="100"/>
+              <w:bottom w:type="dxa" w:w="60"/>
+              <w:right w:type="dxa" w:w="100"/>
+            </w:tcMar>
+          </w:tcPr>
+          <w:p>
+            <w:r>
+              <w:rPr>
+                <w:rFonts w:ascii="Consolas" w:cs="Consolas" w:eastAsia="Consolas" w:hAnsi="Consolas"/>
+                <w:sz w:val="20"/>
+                <w:szCs w:val="20"/>
+              </w:rPr>
+              <w:t xml:space="preserve">elemento_incorreto</w:t>
+            </w:r>
+          </w:p>
+        </w:tc>
+        <w:tc>
+          <w:tcPr>
+            <w:tcW w:type="dxa" w:w="4123"/>
+            <w:tcBorders>
+              <w:top w:val="single" w:color="BFBFBF" w:sz="4"/>
+              <w:left w:val="single" w:color="BFBFBF" w:sz="4"/>
+              <w:bottom w:val="single" w:color="BFBFBF" w:sz="4"/>
+              <w:right w:val="single" w:color="BFBFBF" w:sz="4"/>
+            </w:tcBorders>
+            <w:tcMar>
+              <w:top w:type="dxa" w:w="60"/>
+              <w:left w:type="dxa" w:w="100"/>
+              <w:bottom w:type="dxa" w:w="60"/>
+              <w:right w:type="dxa" w:w="100"/>
+            </w:tcMar>
+          </w:tcPr>
+          <w:p>
+            <w:r>
+              <w:rPr>
+                <w:sz w:val="20"/>
+                <w:szCs w:val="20"/>
+              </w:rPr>
+              <w:t xml:space="preserve">O ponto exato que está errado: data, período, autor, lugar, conceito ou relação</w:t>
+            </w:r>
+          </w:p>
+        </w:tc>
+        <w:tc>
+          <w:tcPr>
+            <w:tcW w:type="dxa" w:w="2475"/>
+            <w:tcBorders>
+              <w:top w:val="single" w:color="BFBFBF" w:sz="4"/>
+              <w:left w:val="single" w:color="BFBFBF" w:sz="4"/>
+              <w:bottom w:val="single" w:color="BFBFBF" w:sz="4"/>
+              <w:right w:val="single" w:color="BFBFBF" w:sz="4"/>
+            </w:tcBorders>
+            <w:tcMar>
+              <w:top w:type="dxa" w:w="60"/>
+              <w:left w:type="dxa" w:w="100"/>
+              <w:bottom w:type="dxa" w:w="60"/>
+              <w:right w:type="dxa" w:w="100"/>
+            </w:tcMar>
+          </w:tcPr>
+          <w:p>
+            <w:r>
+              <w:rPr>
+                <w:sz w:val="20"/>
+                <w:szCs w:val="20"/>
+              </w:rPr>
+              <w:t xml:space="preserve">Vazio</w:t>
+            </w:r>
+          </w:p>
+        </w:tc>
+      </w:tr>
+      <w:tr>
+        <w:trPr>
+          <w:cantSplit/>
+        </w:trPr>
+        <w:tc>
+          <w:tcPr>
+            <w:tcW w:type="dxa" w:w="2473"/>
+            <w:tcBorders>
+              <w:top w:val="single" w:color="BFBFBF" w:sz="4"/>
+              <w:left w:val="single" w:color="BFBFBF" w:sz="4"/>
+              <w:bottom w:val="single" w:color="BFBFBF" w:sz="4"/>
+              <w:right w:val="single" w:color="BFBFBF" w:sz="4"/>
+            </w:tcBorders>
+            <w:tcMar>
+              <w:top w:type="dxa" w:w="60"/>
+              <w:left w:type="dxa" w:w="100"/>
+              <w:bottom w:type="dxa" w:w="60"/>
+              <w:right w:type="dxa" w:w="100"/>
+            </w:tcMar>
+          </w:tcPr>
+          <w:p>
+            <w:r>
+              <w:rPr>
+                <w:rFonts w:ascii="Consolas" w:cs="Consolas" w:eastAsia="Consolas" w:hAnsi="Consolas"/>
+                <w:sz w:val="20"/>
+                <w:szCs w:val="20"/>
+              </w:rPr>
+              <w:t xml:space="preserve">por_que</w:t>
+            </w:r>
+          </w:p>
+        </w:tc>
+        <w:tc>
+          <w:tcPr>
+            <w:tcW w:type="dxa" w:w="4123"/>
+            <w:tcBorders>
+              <w:top w:val="single" w:color="BFBFBF" w:sz="4"/>
+              <w:left w:val="single" w:color="BFBFBF" w:sz="4"/>
+              <w:bottom w:val="single" w:color="BFBFBF" w:sz="4"/>
+              <w:right w:val="single" w:color="BFBFBF" w:sz="4"/>
+            </w:tcBorders>
+            <w:tcMar>
+              <w:top w:type="dxa" w:w="60"/>
+              <w:left w:type="dxa" w:w="100"/>
+              <w:bottom w:type="dxa" w:w="60"/>
+              <w:right w:type="dxa" w:w="100"/>
+            </w:tcMar>
+          </w:tcPr>
+          <w:p>
+            <w:r>
+              <w:rPr>
+                <w:sz w:val="20"/>
+                <w:szCs w:val="20"/>
+              </w:rPr>
+              <w:t xml:space="preserve">O raciocínio que leva o estudante a escolhê-la e por que ele não se sustenta</w:t>
+            </w:r>
+          </w:p>
+        </w:tc>
+        <w:tc>
+          <w:tcPr>
+            <w:tcW w:type="dxa" w:w="2475"/>
+            <w:tcBorders>
+              <w:top w:val="single" w:color="BFBFBF" w:sz="4"/>
+              <w:left w:val="single" w:color="BFBFBF" w:sz="4"/>
+              <w:bottom w:val="single" w:color="BFBFBF" w:sz="4"/>
+              <w:right w:val="single" w:color="BFBFBF" w:sz="4"/>
+            </w:tcBorders>
+            <w:tcMar>
+              <w:top w:type="dxa" w:w="60"/>
+              <w:left w:type="dxa" w:w="100"/>
+              <w:bottom w:type="dxa" w:w="60"/>
+              <w:right w:type="dxa" w:w="100"/>
+            </w:tcMar>
+          </w:tcPr>
+          <w:p>
+            <w:r>
+              <w:rPr>
+                <w:sz w:val="20"/>
+                <w:szCs w:val="20"/>
+              </w:rPr>
+              <w:t xml:space="preserve">Por que ela é a mais adequada</w:t>
+            </w:r>
+          </w:p>
+        </w:tc>
+      </w:tr>
+      <w:tr>
+        <w:trPr>
+          <w:cantSplit/>
+        </w:trPr>
+        <w:tc>
+          <w:tcPr>
+            <w:tcW w:type="dxa" w:w="2473"/>
+            <w:tcBorders>
+              <w:top w:val="single" w:color="BFBFBF" w:sz="4"/>
+              <w:left w:val="single" w:color="BFBFBF" w:sz="4"/>
+              <w:bottom w:val="single" w:color="BFBFBF" w:sz="4"/>
+              <w:right w:val="single" w:color="BFBFBF" w:sz="4"/>
+            </w:tcBorders>
+            <w:tcMar>
+              <w:top w:type="dxa" w:w="60"/>
+              <w:left w:type="dxa" w:w="100"/>
+              <w:bottom w:type="dxa" w:w="60"/>
+              <w:right w:type="dxa" w:w="100"/>
+            </w:tcMar>
+          </w:tcPr>
+          <w:p>
+            <w:r>
+              <w:rPr>
+                <w:rFonts w:ascii="Consolas" w:cs="Consolas" w:eastAsia="Consolas" w:hAnsi="Consolas"/>
+                <w:sz w:val="20"/>
+                <w:szCs w:val="20"/>
+              </w:rPr>
+              <w:t xml:space="preserve">como_verificar</w:t>
+            </w:r>
+          </w:p>
+        </w:tc>
+        <w:tc>
+          <w:tcPr>
+            <w:tcW w:type="dxa" w:w="4123"/>
+            <w:tcBorders>
+              <w:top w:val="single" w:color="BFBFBF" w:sz="4"/>
+              <w:left w:val="single" w:color="BFBFBF" w:sz="4"/>
+              <w:bottom w:val="single" w:color="BFBFBF" w:sz="4"/>
+              <w:right w:val="single" w:color="BFBFBF" w:sz="4"/>
+            </w:tcBorders>
+            <w:tcMar>
+              <w:top w:type="dxa" w:w="60"/>
+              <w:left w:type="dxa" w:w="100"/>
+              <w:bottom w:type="dxa" w:w="60"/>
+              <w:right w:type="dxa" w:w="100"/>
+            </w:tcMar>
+          </w:tcPr>
+          <w:p>
+            <w:r>
+              <w:rPr>
+                <w:sz w:val="20"/>
+                <w:szCs w:val="20"/>
+              </w:rPr>
+              <w:t xml:space="preserve">Como perceber o erro com outros conhecimentos, sem depender do gabarito</w:t>
+            </w:r>
+          </w:p>
+        </w:tc>
+        <w:tc>
+          <w:tcPr>
+            <w:tcW w:type="dxa" w:w="2475"/>
+            <w:tcBorders>
+              <w:top w:val="single" w:color="BFBFBF" w:sz="4"/>
+              <w:left w:val="single" w:color="BFBFBF" w:sz="4"/>
+              <w:bottom w:val="single" w:color="BFBFBF" w:sz="4"/>
+              <w:right w:val="single" w:color="BFBFBF" w:sz="4"/>
+            </w:tcBorders>
+            <w:tcMar>
+              <w:top w:type="dxa" w:w="60"/>
+              <w:left w:type="dxa" w:w="100"/>
+              <w:bottom w:type="dxa" w:w="60"/>
+              <w:right w:type="dxa" w:w="100"/>
+            </w:tcMar>
+          </w:tcPr>
+          <w:p>
+            <w:r>
+              <w:rPr>
+                <w:sz w:val="20"/>
+                <w:szCs w:val="20"/>
+              </w:rPr>
+              <w:t xml:space="preserve">Como confirmá-la com outros conhecimentos</w:t>
+            </w:r>
+          </w:p>
+        </w:tc>
+      </w:tr>
+      <w:tr>
+        <w:trPr>
+          <w:cantSplit/>
+        </w:trPr>
+        <w:tc>
+          <w:tcPr>
+            <w:tcW w:type="dxa" w:w="2473"/>
+            <w:tcBorders>
+              <w:top w:val="single" w:color="BFBFBF" w:sz="4"/>
+              <w:left w:val="single" w:color="BFBFBF" w:sz="4"/>
+              <w:bottom w:val="single" w:color="BFBFBF" w:sz="4"/>
+              <w:right w:val="single" w:color="BFBFBF" w:sz="4"/>
+            </w:tcBorders>
+            <w:tcMar>
+              <w:top w:type="dxa" w:w="60"/>
+              <w:left w:type="dxa" w:w="100"/>
+              <w:bottom w:type="dxa" w:w="60"/>
+              <w:right w:type="dxa" w:w="100"/>
+            </w:tcMar>
+          </w:tcPr>
+          <w:p>
+            <w:r>
+              <w:rPr>
+                <w:rFonts w:ascii="Consolas" w:cs="Consolas" w:eastAsia="Consolas" w:hAnsi="Consolas"/>
+                <w:sz w:val="20"/>
+                <w:szCs w:val="20"/>
+              </w:rPr>
+              <w:t xml:space="preserve">conceito_envolvido</w:t>
+            </w:r>
+          </w:p>
+        </w:tc>
+        <w:tc>
+          <w:tcPr>
+            <w:tcW w:type="dxa" w:w="4123"/>
+            <w:tcBorders>
+              <w:top w:val="single" w:color="BFBFBF" w:sz="4"/>
+              <w:left w:val="single" w:color="BFBFBF" w:sz="4"/>
+              <w:bottom w:val="single" w:color="BFBFBF" w:sz="4"/>
+              <w:right w:val="single" w:color="BFBFBF" w:sz="4"/>
+            </w:tcBorders>
+            <w:tcMar>
+              <w:top w:type="dxa" w:w="60"/>
+              <w:left w:type="dxa" w:w="100"/>
+              <w:bottom w:type="dxa" w:w="60"/>
+              <w:right w:type="dxa" w:w="100"/>
+            </w:tcMar>
+          </w:tcPr>
+          <w:p>
+            <w:r>
+              <w:rPr>
+                <w:sz w:val="20"/>
+                <w:szCs w:val="20"/>
+              </w:rPr>
+              <w:t xml:space="preserve">Conceito central, em 2 a 6 palavras</w:t>
+            </w:r>
+          </w:p>
+        </w:tc>
+        <w:tc>
+          <w:tcPr>
+            <w:tcW w:type="dxa" w:w="2475"/>
+            <w:tcBorders>
+              <w:top w:val="single" w:color="BFBFBF" w:sz="4"/>
+              <w:left w:val="single" w:color="BFBFBF" w:sz="4"/>
+              <w:bottom w:val="single" w:color="BFBFBF" w:sz="4"/>
+              <w:right w:val="single" w:color="BFBFBF" w:sz="4"/>
+            </w:tcBorders>
+            <w:tcMar>
+              <w:top w:type="dxa" w:w="60"/>
+              <w:left w:type="dxa" w:w="100"/>
+              <w:bottom w:type="dxa" w:w="60"/>
+              <w:right w:type="dxa" w:w="100"/>
+            </w:tcMar>
+          </w:tcPr>
+          <w:p>
+            <w:r>
+              <w:rPr>
+                <w:sz w:val="20"/>
+                <w:szCs w:val="20"/>
+              </w:rPr>
+              <w:t xml:space="preserve">Idem</w:t>
+            </w:r>
+          </w:p>
+        </w:tc>
+      </w:tr>
+    </w:tbl>
+    <w:p>
+      <w:pPr>
+        <w:spacing w:after="120"/>
+      </w:pPr>
+    </w:p>
+    <w:p>
+      <w:pPr>
+        <w:pStyle w:val="Heading3"/>
+      </w:pPr>
+      <w:r>
+        <w:t xml:space="preserve">Tipos de erro</w:t>
+      </w:r>
+    </w:p>
+    <w:tbl>
+      <w:tblPr>
+        <w:tblW w:type="dxa" w:w="9071"/>
+        <w:tblBorders>
+          <w:top w:val="single" w:color="auto" w:sz="4"/>
+          <w:left w:val="single" w:color="auto" w:sz="4"/>
+          <w:bottom w:val="single" w:color="auto" w:sz="4"/>
+          <w:right w:val="single" w:color="auto" w:sz="4"/>
+          <w:insideH w:val="single" w:color="auto" w:sz="4"/>
+          <w:insideV w:val="single" w:color="auto" w:sz="4"/>
+        </w:tblBorders>
+      </w:tblPr>
+      <w:tblGrid>
+        <w:gridCol w:w="2721"/>
+        <w:gridCol w:w="6350"/>
+      </w:tblGrid>
+      <w:tr>
+        <w:trPr>
+          <w:tblHeader/>
+        </w:trPr>
+        <w:tc>
+          <w:tcPr>
+            <w:tcW w:type="dxa" w:w="2721"/>
+            <w:tcBorders>
+              <w:top w:val="single" w:color="BFBFBF" w:sz="4"/>
+              <w:left w:val="single" w:color="BFBFBF" w:sz="4"/>
+              <w:bottom w:val="single" w:color="BFBFBF" w:sz="4"/>
+              <w:right w:val="single" w:color="BFBFBF" w:sz="4"/>
+            </w:tcBorders>
+            <w:shd w:fill="D9E2F3" w:color="auto" w:val="clear"/>
+            <w:tcMar>
+              <w:top w:type="dxa" w:w="60"/>
+              <w:left w:type="dxa" w:w="100"/>
+              <w:bottom w:type="dxa" w:w="60"/>
+              <w:right w:type="dxa" w:w="100"/>
+            </w:tcMar>
+          </w:tcPr>
+          <w:p>
+            <w:r>
+              <w:rPr>
+                <w:b/>
+                <w:bCs/>
+                <w:sz w:val="20"/>
+                <w:szCs w:val="20"/>
+              </w:rPr>
+              <w:t xml:space="preserve">Valor</w:t>
+            </w:r>
+          </w:p>
+        </w:tc>
+        <w:tc>
+          <w:tcPr>
+            <w:tcW w:type="dxa" w:w="6350"/>
+            <w:tcBorders>
+              <w:top w:val="single" w:color="BFBFBF" w:sz="4"/>
+              <w:left w:val="single" w:color="BFBFBF" w:sz="4"/>
+              <w:bottom w:val="single" w:color="BFBFBF" w:sz="4"/>
+              <w:right w:val="single" w:color="BFBFBF" w:sz="4"/>
+            </w:tcBorders>
+            <w:shd w:fill="D9E2F3" w:color="auto" w:val="clear"/>
+            <w:tcMar>
+              <w:top w:type="dxa" w:w="60"/>
+              <w:left w:type="dxa" w:w="100"/>
+              <w:bottom w:type="dxa" w:w="60"/>
+              <w:right w:type="dxa" w:w="100"/>
+            </w:tcMar>
+          </w:tcPr>
+          <w:p>
+            <w:r>
+              <w:rPr>
+                <w:b/>
+                <w:bCs/>
+                <w:sz w:val="20"/>
+                <w:szCs w:val="20"/>
+              </w:rPr>
+              <w:t xml:space="preserve">Significado</w:t>
+            </w:r>
+          </w:p>
+        </w:tc>
+      </w:tr>
+      <w:tr>
+        <w:trPr>
+          <w:cantSplit/>
+        </w:trPr>
+        <w:tc>
+          <w:tcPr>
+            <w:tcW w:type="dxa" w:w="2721"/>
+            <w:tcBorders>
+              <w:top w:val="single" w:color="BFBFBF" w:sz="4"/>
+              <w:left w:val="single" w:color="BFBFBF" w:sz="4"/>
+              <w:bottom w:val="single" w:color="BFBFBF" w:sz="4"/>
+              <w:right w:val="single" w:color="BFBFBF" w:sz="4"/>
+            </w:tcBorders>
+            <w:tcMar>
+              <w:top w:type="dxa" w:w="60"/>
+              <w:left w:type="dxa" w:w="100"/>
+              <w:bottom w:type="dxa" w:w="60"/>
+              <w:right w:type="dxa" w:w="100"/>
+            </w:tcMar>
+          </w:tcPr>
+          <w:p>
+            <w:r>
+              <w:rPr>
+                <w:rFonts w:ascii="Consolas" w:cs="Consolas" w:eastAsia="Consolas" w:hAnsi="Consolas"/>
+                <w:sz w:val="20"/>
+                <w:szCs w:val="20"/>
+              </w:rPr>
+              <w:t xml:space="preserve">anacronismo</w:t>
+            </w:r>
+          </w:p>
+        </w:tc>
+        <w:tc>
+          <w:tcPr>
+            <w:tcW w:type="dxa" w:w="6350"/>
+            <w:tcBorders>
+              <w:top w:val="single" w:color="BFBFBF" w:sz="4"/>
+              <w:left w:val="single" w:color="BFBFBF" w:sz="4"/>
+              <w:bottom w:val="single" w:color="BFBFBF" w:sz="4"/>
+              <w:right w:val="single" w:color="BFBFBF" w:sz="4"/>
+            </w:tcBorders>
+            <w:tcMar>
+              <w:top w:type="dxa" w:w="60"/>
+              <w:left w:type="dxa" w:w="100"/>
+              <w:bottom w:type="dxa" w:w="60"/>
+              <w:right w:type="dxa" w:w="100"/>
+            </w:tcMar>
+          </w:tcPr>
+          <w:p>
+            <w:r>
+              <w:rPr>
+                <w:sz w:val="20"/>
+                <w:szCs w:val="20"/>
+              </w:rPr>
+              <w:t xml:space="preserve">Atribui algo a uma época ou data que não é a sua, como características da arte contemporânea ao Modernismo de 1922</w:t>
+            </w:r>
+          </w:p>
+        </w:tc>
+      </w:tr>
+      <w:tr>
+        <w:trPr>
+          <w:cantSplit/>
+        </w:trPr>
+        <w:tc>
+          <w:tcPr>
+            <w:tcW w:type="dxa" w:w="2721"/>
+            <w:tcBorders>
+              <w:top w:val="single" w:color="BFBFBF" w:sz="4"/>
+              <w:left w:val="single" w:color="BFBFBF" w:sz="4"/>
+              <w:bottom w:val="single" w:color="BFBFBF" w:sz="4"/>
+              <w:right w:val="single" w:color="BFBFBF" w:sz="4"/>
+            </w:tcBorders>
+            <w:tcMar>
+              <w:top w:type="dxa" w:w="60"/>
+              <w:left w:type="dxa" w:w="100"/>
+              <w:bottom w:type="dxa" w:w="60"/>
+              <w:right w:type="dxa" w:w="100"/>
+            </w:tcMar>
+          </w:tcPr>
+          <w:p>
+            <w:r>
+              <w:rPr>
+                <w:rFonts w:ascii="Consolas" w:cs="Consolas" w:eastAsia="Consolas" w:hAnsi="Consolas"/>
+                <w:sz w:val="20"/>
+                <w:szCs w:val="20"/>
+              </w:rPr>
+              <w:t xml:space="preserve">contexto_historico</w:t>
+            </w:r>
+          </w:p>
+        </w:tc>
+        <w:tc>
+          <w:tcPr>
+            <w:tcW w:type="dxa" w:w="6350"/>
+            <w:tcBorders>
+              <w:top w:val="single" w:color="BFBFBF" w:sz="4"/>
+              <w:left w:val="single" w:color="BFBFBF" w:sz="4"/>
+              <w:bottom w:val="single" w:color="BFBFBF" w:sz="4"/>
+              <w:right w:val="single" w:color="BFBFBF" w:sz="4"/>
+            </w:tcBorders>
+            <w:tcMar>
+              <w:top w:type="dxa" w:w="60"/>
+              <w:left w:type="dxa" w:w="100"/>
+              <w:bottom w:type="dxa" w:w="60"/>
+              <w:right w:type="dxa" w:w="100"/>
+            </w:tcMar>
+          </w:tcPr>
+          <w:p>
+            <w:r>
+              <w:rPr>
+                <w:sz w:val="20"/>
+                <w:szCs w:val="20"/>
+              </w:rPr>
+              <w:t xml:space="preserve">Situa o fato em um contexto social, político ou geográfico errado</w:t>
+            </w:r>
+          </w:p>
+        </w:tc>
+      </w:tr>
+      <w:tr>
+        <w:trPr>
+          <w:cantSplit/>
+        </w:trPr>
+        <w:tc>
+          <w:tcPr>
+            <w:tcW w:type="dxa" w:w="2721"/>
+            <w:tcBorders>
+              <w:top w:val="single" w:color="BFBFBF" w:sz="4"/>
+              <w:left w:val="single" w:color="BFBFBF" w:sz="4"/>
+              <w:bottom w:val="single" w:color="BFBFBF" w:sz="4"/>
+              <w:right w:val="single" w:color="BFBFBF" w:sz="4"/>
+            </w:tcBorders>
+            <w:tcMar>
+              <w:top w:type="dxa" w:w="60"/>
+              <w:left w:type="dxa" w:w="100"/>
+              <w:bottom w:type="dxa" w:w="60"/>
+              <w:right w:type="dxa" w:w="100"/>
+            </w:tcMar>
+          </w:tcPr>
+          <w:p>
+            <w:r>
+              <w:rPr>
+                <w:rFonts w:ascii="Consolas" w:cs="Consolas" w:eastAsia="Consolas" w:hAnsi="Consolas"/>
+                <w:sz w:val="20"/>
+                <w:szCs w:val="20"/>
+              </w:rPr>
+              <w:t xml:space="preserve">conceito_trocado</w:t>
+            </w:r>
+          </w:p>
+        </w:tc>
+        <w:tc>
+          <w:tcPr>
+            <w:tcW w:type="dxa" w:w="6350"/>
+            <w:tcBorders>
+              <w:top w:val="single" w:color="BFBFBF" w:sz="4"/>
+              <w:left w:val="single" w:color="BFBFBF" w:sz="4"/>
+              <w:bottom w:val="single" w:color="BFBFBF" w:sz="4"/>
+              <w:right w:val="single" w:color="BFBFBF" w:sz="4"/>
+            </w:tcBorders>
+            <w:tcMar>
+              <w:top w:type="dxa" w:w="60"/>
+              <w:left w:type="dxa" w:w="100"/>
+              <w:bottom w:type="dxa" w:w="60"/>
+              <w:right w:type="dxa" w:w="100"/>
+            </w:tcMar>
+          </w:tcPr>
+          <w:p>
+            <w:r>
+              <w:rPr>
+                <w:sz w:val="20"/>
+                <w:szCs w:val="20"/>
+              </w:rPr>
+              <w:t xml:space="preserve">Confunde conceitos próximos, como indianismo romântico e antropofagia modernista</w:t>
+            </w:r>
+          </w:p>
+        </w:tc>
+      </w:tr>
+      <w:tr>
+        <w:trPr>
+          <w:cantSplit/>
+        </w:trPr>
+        <w:tc>
+          <w:tcPr>
+            <w:tcW w:type="dxa" w:w="2721"/>
+            <w:tcBorders>
+              <w:top w:val="single" w:color="BFBFBF" w:sz="4"/>
+              <w:left w:val="single" w:color="BFBFBF" w:sz="4"/>
+              <w:bottom w:val="single" w:color="BFBFBF" w:sz="4"/>
+              <w:right w:val="single" w:color="BFBFBF" w:sz="4"/>
+            </w:tcBorders>
+            <w:tcMar>
+              <w:top w:type="dxa" w:w="60"/>
+              <w:left w:type="dxa" w:w="100"/>
+              <w:bottom w:type="dxa" w:w="60"/>
+              <w:right w:type="dxa" w:w="100"/>
+            </w:tcMar>
+          </w:tcPr>
+          <w:p>
+            <w:r>
+              <w:rPr>
+                <w:rFonts w:ascii="Consolas" w:cs="Consolas" w:eastAsia="Consolas" w:hAnsi="Consolas"/>
+                <w:sz w:val="20"/>
+                <w:szCs w:val="20"/>
+              </w:rPr>
+              <w:t xml:space="preserve">leitura_parcial</w:t>
+            </w:r>
+          </w:p>
+        </w:tc>
+        <w:tc>
+          <w:tcPr>
+            <w:tcW w:type="dxa" w:w="6350"/>
+            <w:tcBorders>
+              <w:top w:val="single" w:color="BFBFBF" w:sz="4"/>
+              <w:left w:val="single" w:color="BFBFBF" w:sz="4"/>
+              <w:bottom w:val="single" w:color="BFBFBF" w:sz="4"/>
+              <w:right w:val="single" w:color="BFBFBF" w:sz="4"/>
+            </w:tcBorders>
+            <w:tcMar>
+              <w:top w:type="dxa" w:w="60"/>
+              <w:left w:type="dxa" w:w="100"/>
+              <w:bottom w:type="dxa" w:w="60"/>
+              <w:right w:type="dxa" w:w="100"/>
+            </w:tcMar>
+          </w:tcPr>
+          <w:p>
+            <w:r>
+              <w:rPr>
+                <w:sz w:val="20"/>
+                <w:szCs w:val="20"/>
+              </w:rPr>
+              <w:t xml:space="preserve">Apoia-se em parte do texto e ignora outra</w:t>
+            </w:r>
+          </w:p>
+        </w:tc>
+      </w:tr>
+      <w:tr>
+        <w:trPr>
+          <w:cantSplit/>
+        </w:trPr>
+        <w:tc>
+          <w:tcPr>
+            <w:tcW w:type="dxa" w:w="2721"/>
+            <w:tcBorders>
+              <w:top w:val="single" w:color="BFBFBF" w:sz="4"/>
+              <w:left w:val="single" w:color="BFBFBF" w:sz="4"/>
+              <w:bottom w:val="single" w:color="BFBFBF" w:sz="4"/>
+              <w:right w:val="single" w:color="BFBFBF" w:sz="4"/>
+            </w:tcBorders>
+            <w:tcMar>
+              <w:top w:type="dxa" w:w="60"/>
+              <w:left w:type="dxa" w:w="100"/>
+              <w:bottom w:type="dxa" w:w="60"/>
+              <w:right w:type="dxa" w:w="100"/>
+            </w:tcMar>
+          </w:tcPr>
+          <w:p>
+            <w:r>
+              <w:rPr>
+                <w:rFonts w:ascii="Consolas" w:cs="Consolas" w:eastAsia="Consolas" w:hAnsi="Consolas"/>
+                <w:sz w:val="20"/>
+                <w:szCs w:val="20"/>
+              </w:rPr>
+              <w:t xml:space="preserve">extrapolacao</w:t>
+            </w:r>
+          </w:p>
+        </w:tc>
+        <w:tc>
+          <w:tcPr>
+            <w:tcW w:type="dxa" w:w="6350"/>
+            <w:tcBorders>
+              <w:top w:val="single" w:color="BFBFBF" w:sz="4"/>
+              <w:left w:val="single" w:color="BFBFBF" w:sz="4"/>
+              <w:bottom w:val="single" w:color="BFBFBF" w:sz="4"/>
+              <w:right w:val="single" w:color="BFBFBF" w:sz="4"/>
+            </w:tcBorders>
+            <w:tcMar>
+              <w:top w:type="dxa" w:w="60"/>
+              <w:left w:type="dxa" w:w="100"/>
+              <w:bottom w:type="dxa" w:w="60"/>
+              <w:right w:type="dxa" w:w="100"/>
+            </w:tcMar>
+          </w:tcPr>
+          <w:p>
+            <w:r>
+              <w:rPr>
+                <w:sz w:val="20"/>
+                <w:szCs w:val="20"/>
+              </w:rPr>
+              <w:t xml:space="preserve">Afirma mais do que o texto permite</w:t>
+            </w:r>
+          </w:p>
+        </w:tc>
+      </w:tr>
+      <w:tr>
+        <w:trPr>
+          <w:cantSplit/>
+        </w:trPr>
+        <w:tc>
+          <w:tcPr>
+            <w:tcW w:type="dxa" w:w="2721"/>
+            <w:tcBorders>
+              <w:top w:val="single" w:color="BFBFBF" w:sz="4"/>
+              <w:left w:val="single" w:color="BFBFBF" w:sz="4"/>
+              <w:bottom w:val="single" w:color="BFBFBF" w:sz="4"/>
+              <w:right w:val="single" w:color="BFBFBF" w:sz="4"/>
+            </w:tcBorders>
+            <w:tcMar>
+              <w:top w:type="dxa" w:w="60"/>
+              <w:left w:type="dxa" w:w="100"/>
+              <w:bottom w:type="dxa" w:w="60"/>
+              <w:right w:type="dxa" w:w="100"/>
+            </w:tcMar>
+          </w:tcPr>
+          <w:p>
+            <w:r>
+              <w:rPr>
+                <w:rFonts w:ascii="Consolas" w:cs="Consolas" w:eastAsia="Consolas" w:hAnsi="Consolas"/>
+                <w:sz w:val="20"/>
+                <w:szCs w:val="20"/>
+              </w:rPr>
+              <w:t xml:space="preserve">causa_efeito</w:t>
+            </w:r>
+          </w:p>
+        </w:tc>
+        <w:tc>
+          <w:tcPr>
+            <w:tcW w:type="dxa" w:w="6350"/>
+            <w:tcBorders>
+              <w:top w:val="single" w:color="BFBFBF" w:sz="4"/>
+              <w:left w:val="single" w:color="BFBFBF" w:sz="4"/>
+              <w:bottom w:val="single" w:color="BFBFBF" w:sz="4"/>
+              <w:right w:val="single" w:color="BFBFBF" w:sz="4"/>
+            </w:tcBorders>
+            <w:tcMar>
+              <w:top w:type="dxa" w:w="60"/>
+              <w:left w:type="dxa" w:w="100"/>
+              <w:bottom w:type="dxa" w:w="60"/>
+              <w:right w:type="dxa" w:w="100"/>
+            </w:tcMar>
+          </w:tcPr>
+          <w:p>
+            <w:r>
+              <w:rPr>
+                <w:sz w:val="20"/>
+                <w:szCs w:val="20"/>
+              </w:rPr>
+              <w:t xml:space="preserve">Inverte ou inventa uma relação de causa e consequência</w:t>
+            </w:r>
+          </w:p>
+        </w:tc>
+      </w:tr>
+      <w:tr>
+        <w:trPr>
+          <w:cantSplit/>
+        </w:trPr>
+        <w:tc>
+          <w:tcPr>
+            <w:tcW w:type="dxa" w:w="2721"/>
+            <w:tcBorders>
+              <w:top w:val="single" w:color="BFBFBF" w:sz="4"/>
+              <w:left w:val="single" w:color="BFBFBF" w:sz="4"/>
+              <w:bottom w:val="single" w:color="BFBFBF" w:sz="4"/>
+              <w:right w:val="single" w:color="BFBFBF" w:sz="4"/>
+            </w:tcBorders>
+            <w:tcMar>
+              <w:top w:type="dxa" w:w="60"/>
+              <w:left w:type="dxa" w:w="100"/>
+              <w:bottom w:type="dxa" w:w="60"/>
+              <w:right w:type="dxa" w:w="100"/>
+            </w:tcMar>
+          </w:tcPr>
+          <w:p>
+            <w:r>
+              <w:rPr>
+                <w:rFonts w:ascii="Consolas" w:cs="Consolas" w:eastAsia="Consolas" w:hAnsi="Consolas"/>
+                <w:sz w:val="20"/>
+                <w:szCs w:val="20"/>
+              </w:rPr>
+              <w:t xml:space="preserve">fato_incorreto</w:t>
+            </w:r>
+          </w:p>
+        </w:tc>
+        <w:tc>
+          <w:tcPr>
+            <w:tcW w:type="dxa" w:w="6350"/>
+            <w:tcBorders>
+              <w:top w:val="single" w:color="BFBFBF" w:sz="4"/>
+              <w:left w:val="single" w:color="BFBFBF" w:sz="4"/>
+              <w:bottom w:val="single" w:color="BFBFBF" w:sz="4"/>
+              <w:right w:val="single" w:color="BFBFBF" w:sz="4"/>
+            </w:tcBorders>
+            <w:tcMar>
+              <w:top w:type="dxa" w:w="60"/>
+              <w:left w:type="dxa" w:w="100"/>
+              <w:bottom w:type="dxa" w:w="60"/>
+              <w:right w:type="dxa" w:w="100"/>
+            </w:tcMar>
+          </w:tcPr>
+          <w:p>
+            <w:r>
+              <w:rPr>
+                <w:sz w:val="20"/>
+                <w:szCs w:val="20"/>
+              </w:rPr>
+              <w:t xml:space="preserve">Afirma dado, autor ou evento falso</w:t>
+            </w:r>
+          </w:p>
+        </w:tc>
+      </w:tr>
+      <w:tr>
+        <w:trPr>
+          <w:cantSplit/>
+        </w:trPr>
+        <w:tc>
+          <w:tcPr>
+            <w:tcW w:type="dxa" w:w="2721"/>
+            <w:tcBorders>
+              <w:top w:val="single" w:color="BFBFBF" w:sz="4"/>
+              <w:left w:val="single" w:color="BFBFBF" w:sz="4"/>
+              <w:bottom w:val="single" w:color="BFBFBF" w:sz="4"/>
+              <w:right w:val="single" w:color="BFBFBF" w:sz="4"/>
+            </w:tcBorders>
+            <w:tcMar>
+              <w:top w:type="dxa" w:w="60"/>
+              <w:left w:type="dxa" w:w="100"/>
+              <w:bottom w:type="dxa" w:w="60"/>
+              <w:right w:type="dxa" w:w="100"/>
+            </w:tcMar>
+          </w:tcPr>
+          <w:p>
+            <w:r>
+              <w:rPr>
+                <w:rFonts w:ascii="Consolas" w:cs="Consolas" w:eastAsia="Consolas" w:hAnsi="Consolas"/>
+                <w:sz w:val="20"/>
+                <w:szCs w:val="20"/>
+              </w:rPr>
+              <w:t xml:space="preserve">nao_responde</w:t>
+            </w:r>
+          </w:p>
+        </w:tc>
+        <w:tc>
+          <w:tcPr>
+            <w:tcW w:type="dxa" w:w="6350"/>
+            <w:tcBorders>
+              <w:top w:val="single" w:color="BFBFBF" w:sz="4"/>
+              <w:left w:val="single" w:color="BFBFBF" w:sz="4"/>
+              <w:bottom w:val="single" w:color="BFBFBF" w:sz="4"/>
+              <w:right w:val="single" w:color="BFBFBF" w:sz="4"/>
+            </w:tcBorders>
+            <w:tcMar>
+              <w:top w:type="dxa" w:w="60"/>
+              <w:left w:type="dxa" w:w="100"/>
+              <w:bottom w:type="dxa" w:w="60"/>
+              <w:right w:type="dxa" w:w="100"/>
+            </w:tcMar>
+          </w:tcPr>
+          <w:p>
+            <w:r>
+              <w:rPr>
+                <w:sz w:val="20"/>
+                <w:szCs w:val="20"/>
+              </w:rPr>
+              <w:t xml:space="preserve">É verdadeira em si, mas não responde ao que foi perguntado</w:t>
+            </w:r>
+          </w:p>
+        </w:tc>
+      </w:tr>
+      <w:tr>
+        <w:trPr>
+          <w:cantSplit/>
+        </w:trPr>
+        <w:tc>
+          <w:tcPr>
+            <w:tcW w:type="dxa" w:w="2721"/>
+            <w:tcBorders>
+              <w:top w:val="single" w:color="BFBFBF" w:sz="4"/>
+              <w:left w:val="single" w:color="BFBFBF" w:sz="4"/>
+              <w:bottom w:val="single" w:color="BFBFBF" w:sz="4"/>
+              <w:right w:val="single" w:color="BFBFBF" w:sz="4"/>
+            </w:tcBorders>
+            <w:tcMar>
+              <w:top w:type="dxa" w:w="60"/>
+              <w:left w:type="dxa" w:w="100"/>
+              <w:bottom w:type="dxa" w:w="60"/>
+              <w:right w:type="dxa" w:w="100"/>
+            </w:tcMar>
+          </w:tcPr>
+          <w:p>
+            <w:r>
+              <w:rPr>
+                <w:rFonts w:ascii="Consolas" w:cs="Consolas" w:eastAsia="Consolas" w:hAnsi="Consolas"/>
+                <w:sz w:val="20"/>
+                <w:szCs w:val="20"/>
+              </w:rPr>
+              <w:t xml:space="preserve">outro</w:t>
+            </w:r>
+          </w:p>
+        </w:tc>
+        <w:tc>
+          <w:tcPr>
+            <w:tcW w:type="dxa" w:w="6350"/>
+            <w:tcBorders>
+              <w:top w:val="single" w:color="BFBFBF" w:sz="4"/>
+              <w:left w:val="single" w:color="BFBFBF" w:sz="4"/>
+              <w:bottom w:val="single" w:color="BFBFBF" w:sz="4"/>
+              <w:right w:val="single" w:color="BFBFBF" w:sz="4"/>
+            </w:tcBorders>
+            <w:tcMar>
+              <w:top w:type="dxa" w:w="60"/>
+              <w:left w:type="dxa" w:w="100"/>
+              <w:bottom w:type="dxa" w:w="60"/>
+              <w:right w:type="dxa" w:w="100"/>
+            </w:tcMar>
+          </w:tcPr>
+          <w:p>
+            <w:r>
+              <w:rPr>
+                <w:sz w:val="20"/>
+                <w:szCs w:val="20"/>
+              </w:rPr>
+              <w:t xml:space="preserve">Nenhuma das categorias anteriores</w:t>
+            </w:r>
+          </w:p>
+        </w:tc>
+      </w:tr>
+    </w:tbl>
+    <w:p>
+      <w:pPr>
+        <w:spacing w:after="120"/>
+      </w:pPr>
+    </w:p>
+    <w:p>
+      <w:pPr>
+        <w:spacing w:after="120" w:line="300"/>
+      </w:pPr>
+      <w:r>
+        <w:t xml:space="preserve">Os campos </w:t>
       </w:r>
       <w:r>
         <w:rPr>
@@ -12689,7 +14148,18 @@
         <w:t xml:space="preserve">conceito_envolvido</w:t>
       </w:r>
       <w:r>
-        <w:t xml:space="preserve"> existe por razão metodológica: permite agrupar os erros por conceito na análise dos resultados.</w:t>
+        <w:t xml:space="preserve"> e </w:t>
+      </w:r>
+      <w:r>
+        <w:rPr>
+          <w:rFonts w:ascii="Consolas" w:cs="Consolas" w:eastAsia="Consolas" w:hAnsi="Consolas"/>
+          <w:sz w:val="20"/>
+          <w:szCs w:val="20"/>
+        </w:rPr>
+        <w:t xml:space="preserve">tipo_de_erro</w:t>
+      </w:r>
+      <w:r>
+        <w:t xml:space="preserve"> existem por razão metodológica: permitem agrupar os erros por conceito e contar quais tipos de erro os distratores exploram, o que alimenta a análise dos resultados.</w:t>
       </w:r>
     </w:p>
     <w:p>
@@ -12832,7 +14302,7 @@
                 <w:sz w:val="20"/>
                 <w:szCs w:val="20"/>
               </w:rPr>
-              <w:t xml:space="preserve">Prompt usado: </w:t>
+              <w:t xml:space="preserve">Prompt em uso: </w:t>
             </w:r>
             <w:r>
               <w:rPr>
@@ -12847,7 +14317,7 @@
                 <w:sz w:val="20"/>
                 <w:szCs w:val="20"/>
               </w:rPr>
-              <w:t xml:space="preserve">, versão 1</w:t>
+              <w:t xml:space="preserve">, versão 2. O contrato é escolhido pela versão</w:t>
             </w:r>
           </w:p>
         </w:tc>
@@ -13123,7 +14593,7 @@
         <w:spacing w:after="80" w:line="290"/>
       </w:pPr>
       <w:r>
-        <w:t xml:space="preserve">Carrega o prompt </w:t>
+        <w:t xml:space="preserve">Carrega o prompt em uso (</w:t>
       </w:r>
       <w:r>
         <w:rPr>
@@ -13131,10 +14601,10 @@
           <w:sz w:val="20"/>
           <w:szCs w:val="20"/>
         </w:rPr>
-        <w:t xml:space="preserve">objetiva_v1</w:t>
-      </w:r>
-      <w:r>
-        <w:t xml:space="preserve"> e chama </w:t>
+        <w:t xml:space="preserve">objetiva_v2</w:t>
+      </w:r>
+      <w:r>
+        <w:t xml:space="preserve">) e chama </w:t>
       </w:r>
       <w:r>
         <w:rPr>
@@ -13145,7 +14615,7 @@
         <w:t xml:space="preserve">chamar_modelo</w:t>
       </w:r>
       <w:r>
-        <w:t xml:space="preserve"> com o formato </w:t>
+        <w:t xml:space="preserve"> com o contrato da mesma versão (</w:t>
       </w:r>
       <w:r>
         <w:rPr>
@@ -13153,10 +14623,10 @@
           <w:sz w:val="20"/>
           <w:szCs w:val="20"/>
         </w:rPr>
-        <w:t xml:space="preserve">CorrecaoObjetiva</w:t>
-      </w:r>
-      <w:r>
-        <w:t xml:space="preserve">.</w:t>
+        <w:t xml:space="preserve">CorrecaoObjetivaV2</w:t>
+      </w:r>
+      <w:r>
+        <w:t xml:space="preserve">).</w:t>
       </w:r>
     </w:p>
     <w:p>
@@ -13279,7 +14749,7 @@
         <w:pStyle w:val="Heading3"/>
       </w:pPr>
       <w:r>
-        <w:t xml:space="preserve">Prompt objetiva_v1</w:t>
+        <w:t xml:space="preserve">Prompt objetiva_v2</w:t>
       </w:r>
     </w:p>
     <w:p>
@@ -13288,6 +14758,17 @@
       </w:pPr>
       <w:r>
         <w:t xml:space="preserve">O texto fica em </w:t>
+      </w:r>
+      <w:r>
+        <w:rPr>
+          <w:rFonts w:ascii="Consolas" w:cs="Consolas" w:eastAsia="Consolas" w:hAnsi="Consolas"/>
+          <w:sz w:val="20"/>
+          <w:szCs w:val="20"/>
+        </w:rPr>
+        <w:t xml:space="preserve">prompts/objetiva/v2.md</w:t>
+      </w:r>
+      <w:r>
+        <w:t xml:space="preserve">. A versão 1 continua em </w:t>
       </w:r>
       <w:r>
         <w:rPr>
@@ -13298,7 +14779,7 @@
         <w:t xml:space="preserve">prompts/objetiva/v1.md</w:t>
       </w:r>
       <w:r>
-        <w:t xml:space="preserve">. Em resumo, ele instrui o modelo a:</w:t>
+        <w:t xml:space="preserve"> e não é mais alterada. Em resumo, a versão 2 instrui o modelo a:</w:t>
       </w:r>
     </w:p>
     <w:p>
@@ -13324,7 +14805,33 @@
         <w:spacing w:after="80" w:line="290"/>
       </w:pPr>
       <w:r>
-        <w:t xml:space="preserve">para cada alternativa incorreta, identificar o erro de raciocínio plausível que levaria um estudante a escolhê-la e explicar por que ele não se sustenta (RF02 e RF03);</w:t>
+        <w:t xml:space="preserve">para cada alternativa incorreta, classificar o tipo de erro, apontar o elemento exato que está errado e explicar o raciocínio plausível que levaria um estudante a escolhê-la (RF02 e RF03);</w:t>
+      </w:r>
+    </w:p>
+    <w:p>
+      <w:pPr>
+        <w:pStyle w:val="ListParagraph"/>
+        <w:numPr>
+          <w:ilvl w:val="0"/>
+          <w:numId w:val="5"/>
+        </w:numPr>
+        <w:spacing w:after="80" w:line="290"/>
+      </w:pPr>
+      <w:r>
+        <w:t xml:space="preserve">mostrar como o estudante poderia perceber o erro por outros conhecimentos: o período ou contexto correto e suas características, o significado preciso dos conceitos confundidos ou o trecho do enunciado que contradiz a alternativa;</w:t>
+      </w:r>
+    </w:p>
+    <w:p>
+      <w:pPr>
+        <w:pStyle w:val="ListParagraph"/>
+        <w:numPr>
+          <w:ilvl w:val="0"/>
+          <w:numId w:val="5"/>
+        </w:numPr>
+        <w:spacing w:after="80" w:line="290"/>
+      </w:pPr>
+      <w:r>
+        <w:t xml:space="preserve">usar o período (década, século, movimento) em vez de um ano quando não houver segurança sobre a data;</w:t>
       </w:r>
     </w:p>
     <w:p>
@@ -13680,7 +15187,7 @@
                 <w:sz w:val="20"/>
                 <w:szCs w:val="20"/>
               </w:rPr>
-              <w:t xml:space="preserve">Enunciado, alternativas com o gabarito destacado e, se existir, a explicação mais recente com modelo, prompt, tempo e custo</w:t>
+              <w:t xml:space="preserve">Enunciado, alternativas com o gabarito destacado e, se existir, a explicação mais recente: tipo de erro, o que está errado, por quê, como perceber sem o gabarito, além de modelo, prompt, tempo e custo. Cada explicação é lida com o contrato da versão que a gerou</w:t>
             </w:r>
           </w:p>
         </w:tc>
@@ -14802,6 +16309,180 @@
                 <w:sz w:val="20"/>
                 <w:szCs w:val="20"/>
               </w:rPr>
+              <w:t xml:space="preserve">FAIXAS</w:t>
+            </w:r>
+          </w:p>
+        </w:tc>
+        <w:tc>
+          <w:tcPr>
+            <w:tcW w:type="dxa" w:w="5443"/>
+            <w:tcBorders>
+              <w:top w:val="single" w:color="BFBFBF" w:sz="4"/>
+              <w:left w:val="single" w:color="BFBFBF" w:sz="4"/>
+              <w:bottom w:val="single" w:color="BFBFBF" w:sz="4"/>
+              <w:right w:val="single" w:color="BFBFBF" w:sz="4"/>
+            </w:tcBorders>
+            <w:tcMar>
+              <w:top w:type="dxa" w:w="60"/>
+              <w:left w:type="dxa" w:w="100"/>
+              <w:bottom w:type="dxa" w:w="60"/>
+              <w:right w:type="dxa" w:w="100"/>
+            </w:tcMar>
+          </w:tcPr>
+          <w:p>
+            <w:r>
+              <w:rPr>
+                <w:sz w:val="20"/>
+                <w:szCs w:val="20"/>
+              </w:rPr>
+              <w:t xml:space="preserve">Numeração de cada área na prova regular: 1 a 45 (linguagens), 46 a 90 (humanas), 91 a 135 (natureza) e 136 a 180 (matemática)</w:t>
+            </w:r>
+          </w:p>
+        </w:tc>
+      </w:tr>
+      <w:tr>
+        <w:trPr>
+          <w:cantSplit/>
+        </w:trPr>
+        <w:tc>
+          <w:tcPr>
+            <w:tcW w:type="dxa" w:w="3628"/>
+            <w:tcBorders>
+              <w:top w:val="single" w:color="BFBFBF" w:sz="4"/>
+              <w:left w:val="single" w:color="BFBFBF" w:sz="4"/>
+              <w:bottom w:val="single" w:color="BFBFBF" w:sz="4"/>
+              <w:right w:val="single" w:color="BFBFBF" w:sz="4"/>
+            </w:tcBorders>
+            <w:tcMar>
+              <w:top w:type="dxa" w:w="60"/>
+              <w:left w:type="dxa" w:w="100"/>
+              <w:bottom w:type="dxa" w:w="60"/>
+              <w:right w:type="dxa" w:w="100"/>
+            </w:tcMar>
+          </w:tcPr>
+          <w:p>
+            <w:r>
+              <w:rPr>
+                <w:rFonts w:ascii="Consolas" w:cs="Consolas" w:eastAsia="Consolas" w:hAnsi="Consolas"/>
+                <w:sz w:val="20"/>
+                <w:szCs w:val="20"/>
+              </w:rPr>
+              <w:t xml:space="preserve">fora_da_faixa(questoes, area)</w:t>
+            </w:r>
+          </w:p>
+        </w:tc>
+        <w:tc>
+          <w:tcPr>
+            <w:tcW w:type="dxa" w:w="5443"/>
+            <w:tcBorders>
+              <w:top w:val="single" w:color="BFBFBF" w:sz="4"/>
+              <w:left w:val="single" w:color="BFBFBF" w:sz="4"/>
+              <w:bottom w:val="single" w:color="BFBFBF" w:sz="4"/>
+              <w:right w:val="single" w:color="BFBFBF" w:sz="4"/>
+            </w:tcBorders>
+            <w:tcMar>
+              <w:top w:type="dxa" w:w="60"/>
+              <w:left w:type="dxa" w:w="100"/>
+              <w:bottom w:type="dxa" w:w="60"/>
+              <w:right w:type="dxa" w:w="100"/>
+            </w:tcMar>
+          </w:tcPr>
+          <w:p>
+            <w:r>
+              <w:rPr>
+                <w:sz w:val="20"/>
+                <w:szCs w:val="20"/>
+              </w:rPr>
+              <w:t xml:space="preserve">Lista as questões cuja numeração não corresponde à área informada pela API</w:t>
+            </w:r>
+          </w:p>
+        </w:tc>
+      </w:tr>
+      <w:tr>
+        <w:trPr>
+          <w:cantSplit/>
+        </w:trPr>
+        <w:tc>
+          <w:tcPr>
+            <w:tcW w:type="dxa" w:w="3628"/>
+            <w:tcBorders>
+              <w:top w:val="single" w:color="BFBFBF" w:sz="4"/>
+              <w:left w:val="single" w:color="BFBFBF" w:sz="4"/>
+              <w:bottom w:val="single" w:color="BFBFBF" w:sz="4"/>
+              <w:right w:val="single" w:color="BFBFBF" w:sz="4"/>
+            </w:tcBorders>
+            <w:tcMar>
+              <w:top w:type="dxa" w:w="60"/>
+              <w:left w:type="dxa" w:w="100"/>
+              <w:bottom w:type="dxa" w:w="60"/>
+              <w:right w:type="dxa" w:w="100"/>
+            </w:tcMar>
+          </w:tcPr>
+          <w:p>
+            <w:r>
+              <w:rPr>
+                <w:rFonts w:ascii="Consolas" w:cs="Consolas" w:eastAsia="Consolas" w:hAnsi="Consolas"/>
+                <w:sz w:val="20"/>
+                <w:szCs w:val="20"/>
+              </w:rPr>
+              <w:t xml:space="preserve">sem_duplicatas(questoes)</w:t>
+            </w:r>
+          </w:p>
+        </w:tc>
+        <w:tc>
+          <w:tcPr>
+            <w:tcW w:type="dxa" w:w="5443"/>
+            <w:tcBorders>
+              <w:top w:val="single" w:color="BFBFBF" w:sz="4"/>
+              <w:left w:val="single" w:color="BFBFBF" w:sz="4"/>
+              <w:bottom w:val="single" w:color="BFBFBF" w:sz="4"/>
+              <w:right w:val="single" w:color="BFBFBF" w:sz="4"/>
+            </w:tcBorders>
+            <w:tcMar>
+              <w:top w:type="dxa" w:w="60"/>
+              <w:left w:type="dxa" w:w="100"/>
+              <w:bottom w:type="dxa" w:w="60"/>
+              <w:right w:type="dxa" w:w="100"/>
+            </w:tcMar>
+          </w:tcPr>
+          <w:p>
+            <w:r>
+              <w:rPr>
+                <w:sz w:val="20"/>
+                <w:szCs w:val="20"/>
+              </w:rPr>
+              <w:t xml:space="preserve">Mantém uma única cópia de cada número de questão e idioma</w:t>
+            </w:r>
+          </w:p>
+        </w:tc>
+      </w:tr>
+      <w:tr>
+        <w:trPr>
+          <w:cantSplit/>
+        </w:trPr>
+        <w:tc>
+          <w:tcPr>
+            <w:tcW w:type="dxa" w:w="3628"/>
+            <w:tcBorders>
+              <w:top w:val="single" w:color="BFBFBF" w:sz="4"/>
+              <w:left w:val="single" w:color="BFBFBF" w:sz="4"/>
+              <w:bottom w:val="single" w:color="BFBFBF" w:sz="4"/>
+              <w:right w:val="single" w:color="BFBFBF" w:sz="4"/>
+            </w:tcBorders>
+            <w:tcMar>
+              <w:top w:type="dxa" w:w="60"/>
+              <w:left w:type="dxa" w:w="100"/>
+              <w:bottom w:type="dxa" w:w="60"/>
+              <w:right w:type="dxa" w:w="100"/>
+            </w:tcMar>
+          </w:tcPr>
+          <w:p>
+            <w:r>
+              <w:rPr>
+                <w:rFonts w:ascii="Consolas" w:cs="Consolas" w:eastAsia="Consolas" w:hAnsi="Consolas"/>
+                <w:sz w:val="20"/>
+                <w:szCs w:val="20"/>
+              </w:rPr>
               <w:t xml:space="preserve">filtrar(questoes, area)</w:t>
             </w:r>
           </w:p>
@@ -14828,7 +16509,7 @@
                 <w:sz w:val="20"/>
                 <w:szCs w:val="20"/>
               </w:rPr>
-              <w:t xml:space="preserve">Mantém só a área pedida e, por padrão, só questões em texto</w:t>
+              <w:t xml:space="preserve">Mantém a área pedida, dentro da faixa de numeração, sem repetidas e, por padrão, só questões em texto</w:t>
             </w:r>
           </w:p>
         </w:tc>
@@ -15070,6 +16751,25 @@
       <w:pPr>
         <w:spacing w:after="120"/>
       </w:pPr>
+    </w:p>
+    <w:p>
+      <w:pPr>
+        <w:spacing w:after="120" w:line="300"/>
+      </w:pPr>
+      <w:r>
+        <w:t xml:space="preserve">A conferência pela numeração foi incluída depois que a primeira importação, em 19/10/2026, trouxe como Ciências Humanas seis questões de outras áreas (30, 93, 96, 97, 98 e 153) e uma cópia repetida da questão 50. O arquivo congelado foi corrigido em 20/10/2026, mantendo a data de acesso original e registrando a correção no campo </w:t>
+      </w:r>
+      <w:r>
+        <w:rPr>
+          <w:rFonts w:ascii="Consolas" w:cs="Consolas" w:eastAsia="Consolas" w:hAnsi="Consolas"/>
+          <w:sz w:val="20"/>
+          <w:szCs w:val="20"/>
+        </w:rPr>
+        <w:t xml:space="preserve">correcoes</w:t>
+      </w:r>
+      <w:r>
+        <w:t xml:space="preserve"> do próprio arquivo. Restaram 38 questões, numeradas de 47 a 90.</w:t>
+      </w:r>
     </w:p>
     <w:p>
       <w:pPr>
@@ -16997,7 +18697,7 @@
         <w:t xml:space="preserve">pytest</w:t>
       </w:r>
       <w:r>
-        <w:t xml:space="preserve"> e não acessam a internet nem gastam crédito: a API da OpenAI e a API do ENEM são substituídas por versões falsas que devolvem respostas controladas. Total nesta versão: 28 testes.</w:t>
+        <w:t xml:space="preserve"> e não acessam a internet nem gastam crédito: a API da OpenAI e a API do ENEM são substituídas por versões falsas que devolvem respostas controladas. Total nesta versão: 32 testes.</w:t>
       </w:r>
     </w:p>
     <w:tbl>
@@ -17306,7 +19006,7 @@
                 <w:sz w:val="20"/>
                 <w:szCs w:val="20"/>
               </w:rPr>
-              <w:t xml:space="preserve">Prompt montado com enunciado, alternativas e gabarito; correção gravada e ligada à métrica; quatro tipos de resposta inconsistente viram falha sem correção; resposta malformada; lista, detalhe e página inexistente; cadastro válido e inválido; geração pela página; falha exibida com o motivo</w:t>
+              <w:t xml:space="preserve">Prompt montado com enunciado, alternativas e gabarito; correção v2 gravada e ligada à métrica; seis tipos de resposta inconsistente viram falha sem correção, incluindo tipo de erro na alternativa correta ou ausente nas incorretas; explicação antiga da v1 continua legível; resposta malformada; lista, detalhe e página inexistente; cadastro válido e inválido; geração pela página; falha exibida com o motivo</w:t>
             </w:r>
           </w:p>
         </w:tc>
@@ -17364,7 +19064,7 @@
                 <w:sz w:val="20"/>
                 <w:szCs w:val="20"/>
               </w:rPr>
-              <w:t xml:space="preserve">Paginação; parada após recusas seguidas; filtro de área e de imagens; montagem do enunciado; importação com gabarito e sem duplicar</w:t>
+              <w:t xml:space="preserve">Paginação; parada após recusas seguidas; exclusão de numeração fora da área e de repetidas; filtro de área e de imagens; montagem do enunciado; importação com gabarito e sem duplicar</w:t>
             </w:r>
           </w:p>
         </w:tc>
@@ -18236,6 +19936,177 @@
                 <w:sz w:val="20"/>
                 <w:szCs w:val="20"/>
               </w:rPr>
+              <w:t xml:space="preserve">Um contrato por versão de prompt</w:t>
+            </w:r>
+          </w:p>
+        </w:tc>
+        <w:tc>
+          <w:tcPr>
+            <w:tcW w:type="dxa" w:w="5443"/>
+            <w:tcBorders>
+              <w:top w:val="single" w:color="BFBFBF" w:sz="4"/>
+              <w:left w:val="single" w:color="BFBFBF" w:sz="4"/>
+              <w:bottom w:val="single" w:color="BFBFBF" w:sz="4"/>
+              <w:right w:val="single" w:color="BFBFBF" w:sz="4"/>
+            </w:tcBorders>
+            <w:tcMar>
+              <w:top w:type="dxa" w:w="60"/>
+              <w:left w:type="dxa" w:w="100"/>
+              <w:bottom w:type="dxa" w:w="60"/>
+              <w:right w:type="dxa" w:w="100"/>
+            </w:tcMar>
+          </w:tcPr>
+          <w:p>
+            <w:r>
+              <w:rPr>
+                <w:sz w:val="20"/>
+                <w:szCs w:val="20"/>
+              </w:rPr>
+              <w:t xml:space="preserve">Explicações antigas continuam legíveis e comparáveis com as novas</w:t>
+            </w:r>
+          </w:p>
+        </w:tc>
+      </w:tr>
+      <w:tr>
+        <w:trPr>
+          <w:cantSplit/>
+        </w:trPr>
+        <w:tc>
+          <w:tcPr>
+            <w:tcW w:type="dxa" w:w="3628"/>
+            <w:tcBorders>
+              <w:top w:val="single" w:color="BFBFBF" w:sz="4"/>
+              <w:left w:val="single" w:color="BFBFBF" w:sz="4"/>
+              <w:bottom w:val="single" w:color="BFBFBF" w:sz="4"/>
+              <w:right w:val="single" w:color="BFBFBF" w:sz="4"/>
+            </w:tcBorders>
+            <w:tcMar>
+              <w:top w:type="dxa" w:w="60"/>
+              <w:left w:type="dxa" w:w="100"/>
+              <w:bottom w:type="dxa" w:w="60"/>
+              <w:right w:type="dxa" w:w="100"/>
+            </w:tcMar>
+          </w:tcPr>
+          <w:p>
+            <w:r>
+              <w:rPr>
+                <w:sz w:val="20"/>
+                <w:szCs w:val="20"/>
+              </w:rPr>
+              <w:t xml:space="preserve">Tipo de erro em categoria fechada</w:t>
+            </w:r>
+          </w:p>
+        </w:tc>
+        <w:tc>
+          <w:tcPr>
+            <w:tcW w:type="dxa" w:w="5443"/>
+            <w:tcBorders>
+              <w:top w:val="single" w:color="BFBFBF" w:sz="4"/>
+              <w:left w:val="single" w:color="BFBFBF" w:sz="4"/>
+              <w:bottom w:val="single" w:color="BFBFBF" w:sz="4"/>
+              <w:right w:val="single" w:color="BFBFBF" w:sz="4"/>
+            </w:tcBorders>
+            <w:tcMar>
+              <w:top w:type="dxa" w:w="60"/>
+              <w:left w:type="dxa" w:w="100"/>
+              <w:bottom w:type="dxa" w:w="60"/>
+              <w:right w:type="dxa" w:w="100"/>
+            </w:tcMar>
+          </w:tcPr>
+          <w:p>
+            <w:r>
+              <w:rPr>
+                <w:sz w:val="20"/>
+                <w:szCs w:val="20"/>
+              </w:rPr>
+              <w:t xml:space="preserve">Permite contar e comparar os tipos de erro na análise, o que um texto livre não permitiria</w:t>
+            </w:r>
+          </w:p>
+        </w:tc>
+      </w:tr>
+      <w:tr>
+        <w:trPr>
+          <w:cantSplit/>
+        </w:trPr>
+        <w:tc>
+          <w:tcPr>
+            <w:tcW w:type="dxa" w:w="3628"/>
+            <w:tcBorders>
+              <w:top w:val="single" w:color="BFBFBF" w:sz="4"/>
+              <w:left w:val="single" w:color="BFBFBF" w:sz="4"/>
+              <w:bottom w:val="single" w:color="BFBFBF" w:sz="4"/>
+              <w:right w:val="single" w:color="BFBFBF" w:sz="4"/>
+            </w:tcBorders>
+            <w:tcMar>
+              <w:top w:type="dxa" w:w="60"/>
+              <w:left w:type="dxa" w:w="100"/>
+              <w:bottom w:type="dxa" w:w="60"/>
+              <w:right w:type="dxa" w:w="100"/>
+            </w:tcMar>
+          </w:tcPr>
+          <w:p>
+            <w:r>
+              <w:rPr>
+                <w:sz w:val="20"/>
+                <w:szCs w:val="20"/>
+              </w:rPr>
+              <w:t xml:space="preserve">Conferência da área pela numeração da prova</w:t>
+            </w:r>
+          </w:p>
+        </w:tc>
+        <w:tc>
+          <w:tcPr>
+            <w:tcW w:type="dxa" w:w="5443"/>
+            <w:tcBorders>
+              <w:top w:val="single" w:color="BFBFBF" w:sz="4"/>
+              <w:left w:val="single" w:color="BFBFBF" w:sz="4"/>
+              <w:bottom w:val="single" w:color="BFBFBF" w:sz="4"/>
+              <w:right w:val="single" w:color="BFBFBF" w:sz="4"/>
+            </w:tcBorders>
+            <w:tcMar>
+              <w:top w:type="dxa" w:w="60"/>
+              <w:left w:type="dxa" w:w="100"/>
+              <w:bottom w:type="dxa" w:w="60"/>
+              <w:right w:type="dxa" w:w="100"/>
+            </w:tcMar>
+          </w:tcPr>
+          <w:p>
+            <w:r>
+              <w:rPr>
+                <w:sz w:val="20"/>
+                <w:szCs w:val="20"/>
+              </w:rPr>
+              <w:t xml:space="preserve">A fonte comunitária classificou questões na área errada</w:t>
+            </w:r>
+          </w:p>
+        </w:tc>
+      </w:tr>
+      <w:tr>
+        <w:trPr>
+          <w:cantSplit/>
+        </w:trPr>
+        <w:tc>
+          <w:tcPr>
+            <w:tcW w:type="dxa" w:w="3628"/>
+            <w:tcBorders>
+              <w:top w:val="single" w:color="BFBFBF" w:sz="4"/>
+              <w:left w:val="single" w:color="BFBFBF" w:sz="4"/>
+              <w:bottom w:val="single" w:color="BFBFBF" w:sz="4"/>
+              <w:right w:val="single" w:color="BFBFBF" w:sz="4"/>
+            </w:tcBorders>
+            <w:tcMar>
+              <w:top w:type="dxa" w:w="60"/>
+              <w:left w:type="dxa" w:w="100"/>
+              <w:bottom w:type="dxa" w:w="60"/>
+              <w:right w:type="dxa" w:w="100"/>
+            </w:tcMar>
+          </w:tcPr>
+          <w:p>
+            <w:r>
+              <w:rPr>
+                <w:sz w:val="20"/>
+                <w:szCs w:val="20"/>
+              </w:rPr>
               <w:t xml:space="preserve">Explicação de objetiva ligada à questão, não a um aluno</w:t>
             </w:r>
           </w:p>
@@ -18357,10 +20228,30 @@
           <w:b/>
           <w:bCs/>
         </w:rPr>
-        <w:t xml:space="preserve">Gabarito de fonte comunitária:</w:t>
-      </w:r>
-      <w:r>
-        <w:t xml:space="preserve"> o gabarito das questões escolhidas deve ser conferido com o gabarito oficial do INEP, que é a fonte primária citada no artigo.</w:t>
+        <w:t xml:space="preserve">Dados de fonte comunitária:</w:t>
+      </w:r>
+      <w:r>
+        <w:t xml:space="preserve"> a API classificou questões na área errada e repetiu uma questão, o que mostra que os dados precisam de conferência. O gabarito e o enunciado das questões escolhidas devem ser conferidos com a prova e o gabarito oficiais do INEP, que são a fonte primária citada no artigo.</w:t>
+      </w:r>
+    </w:p>
+    <w:p>
+      <w:pPr>
+        <w:pStyle w:val="ListParagraph"/>
+        <w:numPr>
+          <w:ilvl w:val="0"/>
+          <w:numId w:val="5"/>
+        </w:numPr>
+        <w:spacing w:after="80" w:line="290"/>
+      </w:pPr>
+      <w:r>
+        <w:rPr>
+          <w:b/>
+          <w:bCs/>
+        </w:rPr>
+        <w:t xml:space="preserve">Categorias de tipo de erro:</w:t>
+      </w:r>
+      <w:r>
+        <w:t xml:space="preserve"> foram definidas pelo autor do protótipo a partir dos erros comuns em questões de Ciências Humanas. No artigo, devem ser apresentadas como categorização própria ou fundamentadas em literatura sobre análise de distratores.</w:t>
       </w:r>
     </w:p>
     <w:p>
@@ -18644,6 +20535,63 @@
                 <w:sz w:val="20"/>
                 <w:szCs w:val="20"/>
               </w:rPr>
+              <w:t xml:space="preserve">Anacronismo</w:t>
+            </w:r>
+          </w:p>
+        </w:tc>
+        <w:tc>
+          <w:tcPr>
+            <w:tcW w:type="dxa" w:w="6350"/>
+            <w:tcBorders>
+              <w:top w:val="single" w:color="BFBFBF" w:sz="4"/>
+              <w:left w:val="single" w:color="BFBFBF" w:sz="4"/>
+              <w:bottom w:val="single" w:color="BFBFBF" w:sz="4"/>
+              <w:right w:val="single" w:color="BFBFBF" w:sz="4"/>
+            </w:tcBorders>
+            <w:tcMar>
+              <w:top w:type="dxa" w:w="60"/>
+              <w:left w:type="dxa" w:w="100"/>
+              <w:bottom w:type="dxa" w:w="60"/>
+              <w:right w:type="dxa" w:w="100"/>
+            </w:tcMar>
+          </w:tcPr>
+          <w:p>
+            <w:r>
+              <w:rPr>
+                <w:sz w:val="20"/>
+                <w:szCs w:val="20"/>
+              </w:rPr>
+              <w:t xml:space="preserve">Atribuir a uma época algo que pertence a outra</w:t>
+            </w:r>
+          </w:p>
+        </w:tc>
+      </w:tr>
+      <w:tr>
+        <w:trPr>
+          <w:cantSplit/>
+        </w:trPr>
+        <w:tc>
+          <w:tcPr>
+            <w:tcW w:type="dxa" w:w="2721"/>
+            <w:tcBorders>
+              <w:top w:val="single" w:color="BFBFBF" w:sz="4"/>
+              <w:left w:val="single" w:color="BFBFBF" w:sz="4"/>
+              <w:bottom w:val="single" w:color="BFBFBF" w:sz="4"/>
+              <w:right w:val="single" w:color="BFBFBF" w:sz="4"/>
+            </w:tcBorders>
+            <w:tcMar>
+              <w:top w:type="dxa" w:w="60"/>
+              <w:left w:type="dxa" w:w="100"/>
+              <w:bottom w:type="dxa" w:w="60"/>
+              <w:right w:type="dxa" w:w="100"/>
+            </w:tcMar>
+          </w:tcPr>
+          <w:p>
+            <w:r>
+              <w:rPr>
+                <w:sz w:val="20"/>
+                <w:szCs w:val="20"/>
+              </w:rPr>
               <w:t xml:space="preserve">API</w:t>
             </w:r>
           </w:p>
@@ -18956,6 +20904,63 @@
                 <w:szCs w:val="20"/>
               </w:rPr>
               <w:t xml:space="preserve">Arquivo de texto com valores separados por vírgula, aberto por planilhas e pelo pandas</w:t>
+            </w:r>
+          </w:p>
+        </w:tc>
+      </w:tr>
+      <w:tr>
+        <w:trPr>
+          <w:cantSplit/>
+        </w:trPr>
+        <w:tc>
+          <w:tcPr>
+            <w:tcW w:type="dxa" w:w="2721"/>
+            <w:tcBorders>
+              <w:top w:val="single" w:color="BFBFBF" w:sz="4"/>
+              <w:left w:val="single" w:color="BFBFBF" w:sz="4"/>
+              <w:bottom w:val="single" w:color="BFBFBF" w:sz="4"/>
+              <w:right w:val="single" w:color="BFBFBF" w:sz="4"/>
+            </w:tcBorders>
+            <w:tcMar>
+              <w:top w:type="dxa" w:w="60"/>
+              <w:left w:type="dxa" w:w="100"/>
+              <w:bottom w:type="dxa" w:w="60"/>
+              <w:right w:type="dxa" w:w="100"/>
+            </w:tcMar>
+          </w:tcPr>
+          <w:p>
+            <w:r>
+              <w:rPr>
+                <w:sz w:val="20"/>
+                <w:szCs w:val="20"/>
+              </w:rPr>
+              <w:t xml:space="preserve">Distrator</w:t>
+            </w:r>
+          </w:p>
+        </w:tc>
+        <w:tc>
+          <w:tcPr>
+            <w:tcW w:type="dxa" w:w="6350"/>
+            <w:tcBorders>
+              <w:top w:val="single" w:color="BFBFBF" w:sz="4"/>
+              <w:left w:val="single" w:color="BFBFBF" w:sz="4"/>
+              <w:bottom w:val="single" w:color="BFBFBF" w:sz="4"/>
+              <w:right w:val="single" w:color="BFBFBF" w:sz="4"/>
+            </w:tcBorders>
+            <w:tcMar>
+              <w:top w:type="dxa" w:w="60"/>
+              <w:left w:type="dxa" w:w="100"/>
+              <w:bottom w:type="dxa" w:w="60"/>
+              <w:right w:type="dxa" w:w="100"/>
+            </w:tcMar>
+          </w:tcPr>
+          <w:p>
+            <w:r>
+              <w:rPr>
+                <w:sz w:val="20"/>
+                <w:szCs w:val="20"/>
+              </w:rPr>
+              <w:t xml:space="preserve">Alternativa incorreta de uma questão objetiva, construída para parecer plausível</w:t>
             </w:r>
           </w:p>
         </w:tc>
@@ -19922,6 +21927,115 @@
                 <w:szCs w:val="20"/>
               </w:rPr>
               <w:t xml:space="preserve">Mudança</w:t>
+            </w:r>
+          </w:p>
+        </w:tc>
+      </w:tr>
+      <w:tr>
+        <w:trPr>
+          <w:cantSplit/>
+        </w:trPr>
+        <w:tc>
+          <w:tcPr>
+            <w:tcW w:type="dxa" w:w="1511"/>
+            <w:tcBorders>
+              <w:top w:val="single" w:color="BFBFBF" w:sz="4"/>
+              <w:left w:val="single" w:color="BFBFBF" w:sz="4"/>
+              <w:bottom w:val="single" w:color="BFBFBF" w:sz="4"/>
+              <w:right w:val="single" w:color="BFBFBF" w:sz="4"/>
+            </w:tcBorders>
+            <w:tcMar>
+              <w:top w:type="dxa" w:w="60"/>
+              <w:left w:type="dxa" w:w="100"/>
+              <w:bottom w:type="dxa" w:w="60"/>
+              <w:right w:type="dxa" w:w="100"/>
+            </w:tcMar>
+          </w:tcPr>
+          <w:p>
+            <w:r>
+              <w:rPr>
+                <w:sz w:val="20"/>
+                <w:szCs w:val="20"/>
+              </w:rPr>
+              <w:t xml:space="preserve">20/10/2026</w:t>
+            </w:r>
+          </w:p>
+        </w:tc>
+        <w:tc>
+          <w:tcPr>
+            <w:tcW w:type="dxa" w:w="1209"/>
+            <w:tcBorders>
+              <w:top w:val="single" w:color="BFBFBF" w:sz="4"/>
+              <w:left w:val="single" w:color="BFBFBF" w:sz="4"/>
+              <w:bottom w:val="single" w:color="BFBFBF" w:sz="4"/>
+              <w:right w:val="single" w:color="BFBFBF" w:sz="4"/>
+            </w:tcBorders>
+            <w:tcMar>
+              <w:top w:type="dxa" w:w="60"/>
+              <w:left w:type="dxa" w:w="100"/>
+              <w:bottom w:type="dxa" w:w="60"/>
+              <w:right w:type="dxa" w:w="100"/>
+            </w:tcMar>
+          </w:tcPr>
+          <w:p>
+            <w:r>
+              <w:rPr>
+                <w:sz w:val="20"/>
+                <w:szCs w:val="20"/>
+              </w:rPr>
+              <w:t xml:space="preserve">0.4</w:t>
+            </w:r>
+          </w:p>
+        </w:tc>
+        <w:tc>
+          <w:tcPr>
+            <w:tcW w:type="dxa" w:w="2267"/>
+            <w:tcBorders>
+              <w:top w:val="single" w:color="BFBFBF" w:sz="4"/>
+              <w:left w:val="single" w:color="BFBFBF" w:sz="4"/>
+              <w:bottom w:val="single" w:color="BFBFBF" w:sz="4"/>
+              <w:right w:val="single" w:color="BFBFBF" w:sz="4"/>
+            </w:tcBorders>
+            <w:tcMar>
+              <w:top w:type="dxa" w:w="60"/>
+              <w:left w:type="dxa" w:w="100"/>
+              <w:bottom w:type="dxa" w:w="60"/>
+              <w:right w:type="dxa" w:w="100"/>
+            </w:tcMar>
+          </w:tcPr>
+          <w:p>
+            <w:r>
+              <w:rPr>
+                <w:sz w:val="20"/>
+                <w:szCs w:val="20"/>
+              </w:rPr>
+              <w:t xml:space="preserve">pull request da explicação v2</w:t>
+            </w:r>
+          </w:p>
+        </w:tc>
+        <w:tc>
+          <w:tcPr>
+            <w:tcW w:type="dxa" w:w="4084"/>
+            <w:tcBorders>
+              <w:top w:val="single" w:color="BFBFBF" w:sz="4"/>
+              <w:left w:val="single" w:color="BFBFBF" w:sz="4"/>
+              <w:bottom w:val="single" w:color="BFBFBF" w:sz="4"/>
+              <w:right w:val="single" w:color="BFBFBF" w:sz="4"/>
+            </w:tcBorders>
+            <w:tcMar>
+              <w:top w:type="dxa" w:w="60"/>
+              <w:left w:type="dxa" w:w="100"/>
+              <w:bottom w:type="dxa" w:w="60"/>
+              <w:right w:type="dxa" w:w="100"/>
+            </w:tcMar>
+          </w:tcPr>
+          <w:p>
+            <w:r>
+              <w:rPr>
+                <w:sz w:val="20"/>
+                <w:szCs w:val="20"/>
+              </w:rPr>
+              <w:t xml:space="preserve">Explicação com tipo de erro, elemento errado e como perceber sem o gabarito (prompt objetiva_v2); importador confere a numeração da área e remove repetidas; arquivo congelado corrigido para 38 questões</w:t>
             </w:r>
           </w:p>
         </w:tc>
@@ -20579,7 +22693,7 @@
         <w:sz w:val="18"/>
         <w:szCs w:val="18"/>
       </w:rPr>
-      <w:t xml:space="preserve">Documentação Técnica do Protótipo, versão 0.3</w:t>
+      <w:t xml:space="preserve">Documentação Técnica do Protótipo, versão 0.4</w:t>
     </w:r>
   </w:p>
 </w:hdr>

</xml_diff>

<commit_message>
Documentação 0.5: módulo discursivo
Co-Authored-By: Claude Opus 5.5 <noreply@anthropic.com>
Claude-Session: https://claude.ai/code/session_01W2sxSqc4ZdmAUWH2L8vsV2
</commit_message>
<xml_diff>
--- a/docs/Documentacao_Tecnica.docx
+++ b/docs/Documentacao_Tecnica.docx
@@ -114,7 +114,7 @@
         <w:t xml:space="preserve">Versão: </w:t>
       </w:r>
       <w:r>
-        <w:t xml:space="preserve">0.4, de 20/10/2026</w:t>
+        <w:t xml:space="preserve">0.5, de 21/10/2026</w:t>
       </w:r>
     </w:p>
     <w:p>
@@ -1039,7 +1039,7 @@
                 <w:sz w:val="20"/>
                 <w:szCs w:val="20"/>
               </w:rPr>
-              <w:t xml:space="preserve">Concluída em 19/10/2026; explicação v2 (tipo de erro) em revisão em 20/10/2026</w:t>
+              <w:t xml:space="preserve">Concluída em 19/10/2026; explicação v2 (tipo de erro) em 21/10/2026</w:t>
             </w:r>
           </w:p>
         </w:tc>
@@ -1122,7 +1122,7 @@
                 <w:sz w:val="20"/>
                 <w:szCs w:val="20"/>
               </w:rPr>
-              <w:t xml:space="preserve">Pendente</w:t>
+              <w:t xml:space="preserve">Implementada em 21/10/2026; aguardando revisão</w:t>
             </w:r>
           </w:p>
         </w:tc>
@@ -2823,7 +2823,7 @@
                 <w:sz w:val="20"/>
                 <w:szCs w:val="20"/>
               </w:rPr>
-              <w:t xml:space="preserve">) e explicação de objetivas (</w:t>
+              <w:t xml:space="preserve">), explicação de objetivas (</w:t>
             </w:r>
             <w:r>
               <w:rPr>
@@ -2838,6 +2838,21 @@
                 <w:sz w:val="20"/>
                 <w:szCs w:val="20"/>
               </w:rPr>
+              <w:t xml:space="preserve">) e correção de discursivas (</w:t>
+            </w:r>
+            <w:r>
+              <w:rPr>
+                <w:rFonts w:ascii="Consolas" w:cs="Consolas" w:eastAsia="Consolas" w:hAnsi="Consolas"/>
+                <w:sz w:val="20"/>
+                <w:szCs w:val="20"/>
+              </w:rPr>
+              <w:t xml:space="preserve">discursiva.py</w:t>
+            </w:r>
+            <w:r>
+              <w:rPr>
+                <w:sz w:val="20"/>
+                <w:szCs w:val="20"/>
+              </w:rPr>
               <w:t xml:space="preserve">)</w:t>
             </w:r>
           </w:p>
@@ -2984,7 +2999,52 @@
                 <w:sz w:val="20"/>
                 <w:szCs w:val="20"/>
               </w:rPr>
-              <w:t xml:space="preserve">Páginas de questões: lista, cadastro, detalhe e geração da explicação</w:t>
+              <w:t xml:space="preserve">Páginas de questões: lista dos dois tipos e objetivas (</w:t>
+            </w:r>
+            <w:r>
+              <w:rPr>
+                <w:rFonts w:ascii="Consolas" w:cs="Consolas" w:eastAsia="Consolas" w:hAnsi="Consolas"/>
+                <w:sz w:val="20"/>
+                <w:szCs w:val="20"/>
+              </w:rPr>
+              <w:t xml:space="preserve">router.py</w:t>
+            </w:r>
+            <w:r>
+              <w:rPr>
+                <w:sz w:val="20"/>
+                <w:szCs w:val="20"/>
+              </w:rPr>
+              <w:t xml:space="preserve">), discursivas e respostas (</w:t>
+            </w:r>
+            <w:r>
+              <w:rPr>
+                <w:rFonts w:ascii="Consolas" w:cs="Consolas" w:eastAsia="Consolas" w:hAnsi="Consolas"/>
+                <w:sz w:val="20"/>
+                <w:szCs w:val="20"/>
+              </w:rPr>
+              <w:t xml:space="preserve">discursivas.py</w:t>
+            </w:r>
+            <w:r>
+              <w:rPr>
+                <w:sz w:val="20"/>
+                <w:szCs w:val="20"/>
+              </w:rPr>
+              <w:t xml:space="preserve">), cliente do modelo para as rotas (</w:t>
+            </w:r>
+            <w:r>
+              <w:rPr>
+                <w:rFonts w:ascii="Consolas" w:cs="Consolas" w:eastAsia="Consolas" w:hAnsi="Consolas"/>
+                <w:sz w:val="20"/>
+                <w:szCs w:val="20"/>
+              </w:rPr>
+              <w:t xml:space="preserve">cliente.py</w:t>
+            </w:r>
+            <w:r>
+              <w:rPr>
+                <w:sz w:val="20"/>
+                <w:szCs w:val="20"/>
+              </w:rPr>
+              <w:t xml:space="preserve">)</w:t>
             </w:r>
           </w:p>
         </w:tc>
@@ -10903,7 +10963,7 @@
         <w:t xml:space="preserve">{enunciado}</w:t>
       </w:r>
       <w:r>
-        <w:t xml:space="preserve">, são preenchidos na hora da chamada.</w:t>
+        <w:t xml:space="preserve">, são preenchidos na hora da chamada, nas duas partes. Por isso, o texto de um prompt não pode ter chaves que não sejam campos.</w:t>
       </w:r>
     </w:p>
     <w:tbl>
@@ -15280,7 +15340,696 @@
         <w:pStyle w:val="Heading2"/>
       </w:pPr>
       <w:r>
-        <w:t xml:space="preserve">4.8 Custo: app/metricas/precos.py</w:t>
+        <w:t xml:space="preserve">4.8 Contrato de saída discursivo</w:t>
+      </w:r>
+    </w:p>
+    <w:p>
+      <w:pPr>
+        <w:spacing w:after="120" w:line="300"/>
+      </w:pPr>
+      <w:r>
+        <w:t xml:space="preserve">Também em </w:t>
+      </w:r>
+      <w:r>
+        <w:rPr>
+          <w:rFonts w:ascii="Consolas" w:cs="Consolas" w:eastAsia="Consolas" w:hAnsi="Consolas"/>
+          <w:sz w:val="20"/>
+          <w:szCs w:val="20"/>
+        </w:rPr>
+        <w:t xml:space="preserve">app/correcao/contratos.py</w:t>
+      </w:r>
+      <w:r>
+        <w:t xml:space="preserve">, segue o formato da especificação. Os campos </w:t>
+      </w:r>
+      <w:r>
+        <w:rPr>
+          <w:rFonts w:ascii="Consolas" w:cs="Consolas" w:eastAsia="Consolas" w:hAnsi="Consolas"/>
+          <w:sz w:val="20"/>
+          <w:szCs w:val="20"/>
+        </w:rPr>
+        <w:t xml:space="preserve">trecho_citado</w:t>
+      </w:r>
+      <w:r>
+        <w:t xml:space="preserve"> e </w:t>
+      </w:r>
+      <w:r>
+        <w:rPr>
+          <w:rFonts w:ascii="Consolas" w:cs="Consolas" w:eastAsia="Consolas" w:hAnsi="Consolas"/>
+          <w:sz w:val="20"/>
+          <w:szCs w:val="20"/>
+        </w:rPr>
+        <w:t xml:space="preserve">usou_resposta_esperada</w:t>
+      </w:r>
+      <w:r>
+        <w:t xml:space="preserve"> existem por razão metodológica: o primeiro distingue feedback específico de feedback genérico, e a proporção de critérios com trecho citado é métrica de qualidade; o segundo separa as duas condições experimentais na análise.</w:t>
+      </w:r>
+    </w:p>
+    <w:tbl>
+      <w:tblPr>
+        <w:tblW w:type="dxa" w:w="9071"/>
+        <w:tblBorders>
+          <w:top w:val="single" w:color="auto" w:sz="4"/>
+          <w:left w:val="single" w:color="auto" w:sz="4"/>
+          <w:bottom w:val="single" w:color="auto" w:sz="4"/>
+          <w:right w:val="single" w:color="auto" w:sz="4"/>
+          <w:insideH w:val="single" w:color="auto" w:sz="4"/>
+          <w:insideV w:val="single" w:color="auto" w:sz="4"/>
+        </w:tblBorders>
+      </w:tblPr>
+      <w:tblGrid>
+        <w:gridCol w:w="2721"/>
+        <w:gridCol w:w="6350"/>
+      </w:tblGrid>
+      <w:tr>
+        <w:trPr>
+          <w:tblHeader/>
+        </w:trPr>
+        <w:tc>
+          <w:tcPr>
+            <w:tcW w:type="dxa" w:w="2721"/>
+            <w:tcBorders>
+              <w:top w:val="single" w:color="BFBFBF" w:sz="4"/>
+              <w:left w:val="single" w:color="BFBFBF" w:sz="4"/>
+              <w:bottom w:val="single" w:color="BFBFBF" w:sz="4"/>
+              <w:right w:val="single" w:color="BFBFBF" w:sz="4"/>
+            </w:tcBorders>
+            <w:shd w:fill="D9E2F3" w:color="auto" w:val="clear"/>
+            <w:tcMar>
+              <w:top w:type="dxa" w:w="60"/>
+              <w:left w:type="dxa" w:w="100"/>
+              <w:bottom w:type="dxa" w:w="60"/>
+              <w:right w:type="dxa" w:w="100"/>
+            </w:tcMar>
+          </w:tcPr>
+          <w:p>
+            <w:r>
+              <w:rPr>
+                <w:b/>
+                <w:bCs/>
+                <w:sz w:val="20"/>
+                <w:szCs w:val="20"/>
+              </w:rPr>
+              <w:t xml:space="preserve">Campo</w:t>
+            </w:r>
+          </w:p>
+        </w:tc>
+        <w:tc>
+          <w:tcPr>
+            <w:tcW w:type="dxa" w:w="6350"/>
+            <w:tcBorders>
+              <w:top w:val="single" w:color="BFBFBF" w:sz="4"/>
+              <w:left w:val="single" w:color="BFBFBF" w:sz="4"/>
+              <w:bottom w:val="single" w:color="BFBFBF" w:sz="4"/>
+              <w:right w:val="single" w:color="BFBFBF" w:sz="4"/>
+            </w:tcBorders>
+            <w:shd w:fill="D9E2F3" w:color="auto" w:val="clear"/>
+            <w:tcMar>
+              <w:top w:type="dxa" w:w="60"/>
+              <w:left w:type="dxa" w:w="100"/>
+              <w:bottom w:type="dxa" w:w="60"/>
+              <w:right w:type="dxa" w:w="100"/>
+            </w:tcMar>
+          </w:tcPr>
+          <w:p>
+            <w:r>
+              <w:rPr>
+                <w:b/>
+                <w:bCs/>
+                <w:sz w:val="20"/>
+                <w:szCs w:val="20"/>
+              </w:rPr>
+              <w:t xml:space="preserve">Conteúdo</w:t>
+            </w:r>
+          </w:p>
+        </w:tc>
+      </w:tr>
+      <w:tr>
+        <w:trPr>
+          <w:cantSplit/>
+        </w:trPr>
+        <w:tc>
+          <w:tcPr>
+            <w:tcW w:type="dxa" w:w="2721"/>
+            <w:tcBorders>
+              <w:top w:val="single" w:color="BFBFBF" w:sz="4"/>
+              <w:left w:val="single" w:color="BFBFBF" w:sz="4"/>
+              <w:bottom w:val="single" w:color="BFBFBF" w:sz="4"/>
+              <w:right w:val="single" w:color="BFBFBF" w:sz="4"/>
+            </w:tcBorders>
+            <w:tcMar>
+              <w:top w:type="dxa" w:w="60"/>
+              <w:left w:type="dxa" w:w="100"/>
+              <w:bottom w:type="dxa" w:w="60"/>
+              <w:right w:type="dxa" w:w="100"/>
+            </w:tcMar>
+          </w:tcPr>
+          <w:p>
+            <w:r>
+              <w:rPr>
+                <w:rFonts w:ascii="Consolas" w:cs="Consolas" w:eastAsia="Consolas" w:hAnsi="Consolas"/>
+                <w:sz w:val="20"/>
+                <w:szCs w:val="20"/>
+              </w:rPr>
+              <w:t xml:space="preserve">questao_id</w:t>
+            </w:r>
+          </w:p>
+        </w:tc>
+        <w:tc>
+          <w:tcPr>
+            <w:tcW w:type="dxa" w:w="6350"/>
+            <w:tcBorders>
+              <w:top w:val="single" w:color="BFBFBF" w:sz="4"/>
+              <w:left w:val="single" w:color="BFBFBF" w:sz="4"/>
+              <w:bottom w:val="single" w:color="BFBFBF" w:sz="4"/>
+              <w:right w:val="single" w:color="BFBFBF" w:sz="4"/>
+            </w:tcBorders>
+            <w:tcMar>
+              <w:top w:type="dxa" w:w="60"/>
+              <w:left w:type="dxa" w:w="100"/>
+              <w:bottom w:type="dxa" w:w="60"/>
+              <w:right w:type="dxa" w:w="100"/>
+            </w:tcMar>
+          </w:tcPr>
+          <w:p>
+            <w:r>
+              <w:rPr>
+                <w:sz w:val="20"/>
+                <w:szCs w:val="20"/>
+              </w:rPr>
+              <w:t xml:space="preserve">Identificador da questão</w:t>
+            </w:r>
+          </w:p>
+        </w:tc>
+      </w:tr>
+      <w:tr>
+        <w:trPr>
+          <w:cantSplit/>
+        </w:trPr>
+        <w:tc>
+          <w:tcPr>
+            <w:tcW w:type="dxa" w:w="2721"/>
+            <w:tcBorders>
+              <w:top w:val="single" w:color="BFBFBF" w:sz="4"/>
+              <w:left w:val="single" w:color="BFBFBF" w:sz="4"/>
+              <w:bottom w:val="single" w:color="BFBFBF" w:sz="4"/>
+              <w:right w:val="single" w:color="BFBFBF" w:sz="4"/>
+            </w:tcBorders>
+            <w:tcMar>
+              <w:top w:type="dxa" w:w="60"/>
+              <w:left w:type="dxa" w:w="100"/>
+              <w:bottom w:type="dxa" w:w="60"/>
+              <w:right w:type="dxa" w:w="100"/>
+            </w:tcMar>
+          </w:tcPr>
+          <w:p>
+            <w:r>
+              <w:rPr>
+                <w:rFonts w:ascii="Consolas" w:cs="Consolas" w:eastAsia="Consolas" w:hAnsi="Consolas"/>
+                <w:sz w:val="20"/>
+                <w:szCs w:val="20"/>
+              </w:rPr>
+              <w:t xml:space="preserve">usou_resposta_esperada</w:t>
+            </w:r>
+          </w:p>
+        </w:tc>
+        <w:tc>
+          <w:tcPr>
+            <w:tcW w:type="dxa" w:w="6350"/>
+            <w:tcBorders>
+              <w:top w:val="single" w:color="BFBFBF" w:sz="4"/>
+              <w:left w:val="single" w:color="BFBFBF" w:sz="4"/>
+              <w:bottom w:val="single" w:color="BFBFBF" w:sz="4"/>
+              <w:right w:val="single" w:color="BFBFBF" w:sz="4"/>
+            </w:tcBorders>
+            <w:tcMar>
+              <w:top w:type="dxa" w:w="60"/>
+              <w:left w:type="dxa" w:w="100"/>
+              <w:bottom w:type="dxa" w:w="60"/>
+              <w:right w:type="dxa" w:w="100"/>
+            </w:tcMar>
+          </w:tcPr>
+          <w:p>
+            <w:r>
+              <w:rPr>
+                <w:sz w:val="20"/>
+                <w:szCs w:val="20"/>
+              </w:rPr>
+              <w:t xml:space="preserve">Condição em que a correção rodou</w:t>
+            </w:r>
+          </w:p>
+        </w:tc>
+      </w:tr>
+      <w:tr>
+        <w:trPr>
+          <w:cantSplit/>
+        </w:trPr>
+        <w:tc>
+          <w:tcPr>
+            <w:tcW w:type="dxa" w:w="2721"/>
+            <w:tcBorders>
+              <w:top w:val="single" w:color="BFBFBF" w:sz="4"/>
+              <w:left w:val="single" w:color="BFBFBF" w:sz="4"/>
+              <w:bottom w:val="single" w:color="BFBFBF" w:sz="4"/>
+              <w:right w:val="single" w:color="BFBFBF" w:sz="4"/>
+            </w:tcBorders>
+            <w:tcMar>
+              <w:top w:type="dxa" w:w="60"/>
+              <w:left w:type="dxa" w:w="100"/>
+              <w:bottom w:type="dxa" w:w="60"/>
+              <w:right w:type="dxa" w:w="100"/>
+            </w:tcMar>
+          </w:tcPr>
+          <w:p>
+            <w:r>
+              <w:rPr>
+                <w:rFonts w:ascii="Consolas" w:cs="Consolas" w:eastAsia="Consolas" w:hAnsi="Consolas"/>
+                <w:sz w:val="20"/>
+                <w:szCs w:val="20"/>
+              </w:rPr>
+              <w:t xml:space="preserve">analise_criterios</w:t>
+            </w:r>
+          </w:p>
+        </w:tc>
+        <w:tc>
+          <w:tcPr>
+            <w:tcW w:type="dxa" w:w="6350"/>
+            <w:tcBorders>
+              <w:top w:val="single" w:color="BFBFBF" w:sz="4"/>
+              <w:left w:val="single" w:color="BFBFBF" w:sz="4"/>
+              <w:bottom w:val="single" w:color="BFBFBF" w:sz="4"/>
+              <w:right w:val="single" w:color="BFBFBF" w:sz="4"/>
+            </w:tcBorders>
+            <w:tcMar>
+              <w:top w:type="dxa" w:w="60"/>
+              <w:left w:type="dxa" w:w="100"/>
+              <w:bottom w:type="dxa" w:w="60"/>
+              <w:right w:type="dxa" w:w="100"/>
+            </w:tcMar>
+          </w:tcPr>
+          <w:p>
+            <w:r>
+              <w:rPr>
+                <w:sz w:val="20"/>
+                <w:szCs w:val="20"/>
+              </w:rPr>
+              <w:t xml:space="preserve">Lista com </w:t>
+            </w:r>
+            <w:r>
+              <w:rPr>
+                <w:rFonts w:ascii="Consolas" w:cs="Consolas" w:eastAsia="Consolas" w:hAnsi="Consolas"/>
+                <w:sz w:val="20"/>
+                <w:szCs w:val="20"/>
+              </w:rPr>
+              <w:t xml:space="preserve">criterio</w:t>
+            </w:r>
+            <w:r>
+              <w:rPr>
+                <w:sz w:val="20"/>
+                <w:szCs w:val="20"/>
+              </w:rPr>
+              <w:t xml:space="preserve">, </w:t>
+            </w:r>
+            <w:r>
+              <w:rPr>
+                <w:rFonts w:ascii="Consolas" w:cs="Consolas" w:eastAsia="Consolas" w:hAnsi="Consolas"/>
+                <w:sz w:val="20"/>
+                <w:szCs w:val="20"/>
+              </w:rPr>
+              <w:t xml:space="preserve">peso</w:t>
+            </w:r>
+            <w:r>
+              <w:rPr>
+                <w:sz w:val="20"/>
+                <w:szCs w:val="20"/>
+              </w:rPr>
+              <w:t xml:space="preserve">, </w:t>
+            </w:r>
+            <w:r>
+              <w:rPr>
+                <w:rFonts w:ascii="Consolas" w:cs="Consolas" w:eastAsia="Consolas" w:hAnsi="Consolas"/>
+                <w:sz w:val="20"/>
+                <w:szCs w:val="20"/>
+              </w:rPr>
+              <w:t xml:space="preserve">status</w:t>
+            </w:r>
+            <w:r>
+              <w:rPr>
+                <w:sz w:val="20"/>
+                <w:szCs w:val="20"/>
+              </w:rPr>
+              <w:t xml:space="preserve"> (atendido, parcial ou nao_atendido), </w:t>
+            </w:r>
+            <w:r>
+              <w:rPr>
+                <w:rFonts w:ascii="Consolas" w:cs="Consolas" w:eastAsia="Consolas" w:hAnsi="Consolas"/>
+                <w:sz w:val="20"/>
+                <w:szCs w:val="20"/>
+              </w:rPr>
+              <w:t xml:space="preserve">justificativa</w:t>
+            </w:r>
+            <w:r>
+              <w:rPr>
+                <w:sz w:val="20"/>
+                <w:szCs w:val="20"/>
+              </w:rPr>
+              <w:t xml:space="preserve"> e </w:t>
+            </w:r>
+            <w:r>
+              <w:rPr>
+                <w:rFonts w:ascii="Consolas" w:cs="Consolas" w:eastAsia="Consolas" w:hAnsi="Consolas"/>
+                <w:sz w:val="20"/>
+                <w:szCs w:val="20"/>
+              </w:rPr>
+              <w:t xml:space="preserve">trecho_citado</w:t>
+            </w:r>
+          </w:p>
+        </w:tc>
+      </w:tr>
+      <w:tr>
+        <w:trPr>
+          <w:cantSplit/>
+        </w:trPr>
+        <w:tc>
+          <w:tcPr>
+            <w:tcW w:type="dxa" w:w="2721"/>
+            <w:tcBorders>
+              <w:top w:val="single" w:color="BFBFBF" w:sz="4"/>
+              <w:left w:val="single" w:color="BFBFBF" w:sz="4"/>
+              <w:bottom w:val="single" w:color="BFBFBF" w:sz="4"/>
+              <w:right w:val="single" w:color="BFBFBF" w:sz="4"/>
+            </w:tcBorders>
+            <w:tcMar>
+              <w:top w:type="dxa" w:w="60"/>
+              <w:left w:type="dxa" w:w="100"/>
+              <w:bottom w:type="dxa" w:w="60"/>
+              <w:right w:type="dxa" w:w="100"/>
+            </w:tcMar>
+          </w:tcPr>
+          <w:p>
+            <w:r>
+              <w:rPr>
+                <w:rFonts w:ascii="Consolas" w:cs="Consolas" w:eastAsia="Consolas" w:hAnsi="Consolas"/>
+                <w:sz w:val="20"/>
+                <w:szCs w:val="20"/>
+              </w:rPr>
+              <w:t xml:space="preserve">feedback_elaborado</w:t>
+            </w:r>
+          </w:p>
+        </w:tc>
+        <w:tc>
+          <w:tcPr>
+            <w:tcW w:type="dxa" w:w="6350"/>
+            <w:tcBorders>
+              <w:top w:val="single" w:color="BFBFBF" w:sz="4"/>
+              <w:left w:val="single" w:color="BFBFBF" w:sz="4"/>
+              <w:bottom w:val="single" w:color="BFBFBF" w:sz="4"/>
+              <w:right w:val="single" w:color="BFBFBF" w:sz="4"/>
+            </w:tcBorders>
+            <w:tcMar>
+              <w:top w:type="dxa" w:w="60"/>
+              <w:left w:type="dxa" w:w="100"/>
+              <w:bottom w:type="dxa" w:w="60"/>
+              <w:right w:type="dxa" w:w="100"/>
+            </w:tcMar>
+          </w:tcPr>
+          <w:p>
+            <w:r>
+              <w:rPr>
+                <w:sz w:val="20"/>
+                <w:szCs w:val="20"/>
+              </w:rPr>
+              <w:t xml:space="preserve">Texto ao aluno: o que faltou e o caminho para a resposta completa</w:t>
+            </w:r>
+          </w:p>
+        </w:tc>
+      </w:tr>
+      <w:tr>
+        <w:trPr>
+          <w:cantSplit/>
+        </w:trPr>
+        <w:tc>
+          <w:tcPr>
+            <w:tcW w:type="dxa" w:w="2721"/>
+            <w:tcBorders>
+              <w:top w:val="single" w:color="BFBFBF" w:sz="4"/>
+              <w:left w:val="single" w:color="BFBFBF" w:sz="4"/>
+              <w:bottom w:val="single" w:color="BFBFBF" w:sz="4"/>
+              <w:right w:val="single" w:color="BFBFBF" w:sz="4"/>
+            </w:tcBorders>
+            <w:tcMar>
+              <w:top w:type="dxa" w:w="60"/>
+              <w:left w:type="dxa" w:w="100"/>
+              <w:bottom w:type="dxa" w:w="60"/>
+              <w:right w:type="dxa" w:w="100"/>
+            </w:tcMar>
+          </w:tcPr>
+          <w:p>
+            <w:r>
+              <w:rPr>
+                <w:rFonts w:ascii="Consolas" w:cs="Consolas" w:eastAsia="Consolas" w:hAnsi="Consolas"/>
+                <w:sz w:val="20"/>
+                <w:szCs w:val="20"/>
+              </w:rPr>
+              <w:t xml:space="preserve">nota_sugerida</w:t>
+            </w:r>
+            <w:r>
+              <w:rPr>
+                <w:sz w:val="20"/>
+                <w:szCs w:val="20"/>
+              </w:rPr>
+              <w:t xml:space="preserve">, </w:t>
+            </w:r>
+            <w:r>
+              <w:rPr>
+                <w:rFonts w:ascii="Consolas" w:cs="Consolas" w:eastAsia="Consolas" w:hAnsi="Consolas"/>
+                <w:sz w:val="20"/>
+                <w:szCs w:val="20"/>
+              </w:rPr>
+              <w:t xml:space="preserve">nota_maxima</w:t>
+            </w:r>
+          </w:p>
+        </w:tc>
+        <w:tc>
+          <w:tcPr>
+            <w:tcW w:type="dxa" w:w="6350"/>
+            <w:tcBorders>
+              <w:top w:val="single" w:color="BFBFBF" w:sz="4"/>
+              <w:left w:val="single" w:color="BFBFBF" w:sz="4"/>
+              <w:bottom w:val="single" w:color="BFBFBF" w:sz="4"/>
+              <w:right w:val="single" w:color="BFBFBF" w:sz="4"/>
+            </w:tcBorders>
+            <w:tcMar>
+              <w:top w:type="dxa" w:w="60"/>
+              <w:left w:type="dxa" w:w="100"/>
+              <w:bottom w:type="dxa" w:w="60"/>
+              <w:right w:type="dxa" w:w="100"/>
+            </w:tcMar>
+          </w:tcPr>
+          <w:p>
+            <w:r>
+              <w:rPr>
+                <w:sz w:val="20"/>
+                <w:szCs w:val="20"/>
+              </w:rPr>
+              <w:t xml:space="preserve">Nota proposta e nota máxima da questão</w:t>
+            </w:r>
+          </w:p>
+        </w:tc>
+      </w:tr>
+      <w:tr>
+        <w:trPr>
+          <w:cantSplit/>
+        </w:trPr>
+        <w:tc>
+          <w:tcPr>
+            <w:tcW w:type="dxa" w:w="2721"/>
+            <w:tcBorders>
+              <w:top w:val="single" w:color="BFBFBF" w:sz="4"/>
+              <w:left w:val="single" w:color="BFBFBF" w:sz="4"/>
+              <w:bottom w:val="single" w:color="BFBFBF" w:sz="4"/>
+              <w:right w:val="single" w:color="BFBFBF" w:sz="4"/>
+            </w:tcBorders>
+            <w:tcMar>
+              <w:top w:type="dxa" w:w="60"/>
+              <w:left w:type="dxa" w:w="100"/>
+              <w:bottom w:type="dxa" w:w="60"/>
+              <w:right w:type="dxa" w:w="100"/>
+            </w:tcMar>
+          </w:tcPr>
+          <w:p>
+            <w:r>
+              <w:rPr>
+                <w:rFonts w:ascii="Consolas" w:cs="Consolas" w:eastAsia="Consolas" w:hAnsi="Consolas"/>
+                <w:sz w:val="20"/>
+                <w:szCs w:val="20"/>
+              </w:rPr>
+              <w:t xml:space="preserve">confianca</w:t>
+            </w:r>
+          </w:p>
+        </w:tc>
+        <w:tc>
+          <w:tcPr>
+            <w:tcW w:type="dxa" w:w="6350"/>
+            <w:tcBorders>
+              <w:top w:val="single" w:color="BFBFBF" w:sz="4"/>
+              <w:left w:val="single" w:color="BFBFBF" w:sz="4"/>
+              <w:bottom w:val="single" w:color="BFBFBF" w:sz="4"/>
+              <w:right w:val="single" w:color="BFBFBF" w:sz="4"/>
+            </w:tcBorders>
+            <w:tcMar>
+              <w:top w:type="dxa" w:w="60"/>
+              <w:left w:type="dxa" w:w="100"/>
+              <w:bottom w:type="dxa" w:w="60"/>
+              <w:right w:type="dxa" w:w="100"/>
+            </w:tcMar>
+          </w:tcPr>
+          <w:p>
+            <w:r>
+              <w:rPr>
+                <w:sz w:val="20"/>
+                <w:szCs w:val="20"/>
+              </w:rPr>
+              <w:t xml:space="preserve">baixa, media ou alta</w:t>
+            </w:r>
+          </w:p>
+        </w:tc>
+      </w:tr>
+    </w:tbl>
+    <w:p>
+      <w:pPr>
+        <w:spacing w:after="120"/>
+      </w:pPr>
+    </w:p>
+    <w:p>
+      <w:pPr>
+        <w:pStyle w:val="Heading3"/>
+      </w:pPr>
+      <w:r>
+        <w:t xml:space="preserve">Conferência da correção discursiva</w:t>
+      </w:r>
+    </w:p>
+    <w:p>
+      <w:pPr>
+        <w:spacing w:after="120" w:line="300"/>
+      </w:pPr>
+      <w:r>
+        <w:t xml:space="preserve">A função </w:t>
+      </w:r>
+      <w:r>
+        <w:rPr>
+          <w:rFonts w:ascii="Consolas" w:cs="Consolas" w:eastAsia="Consolas" w:hAnsi="Consolas"/>
+          <w:sz w:val="20"/>
+          <w:szCs w:val="20"/>
+        </w:rPr>
+        <w:t xml:space="preserve">problemas_da_discursiva</w:t>
+      </w:r>
+      <w:r>
+        <w:t xml:space="preserve"> recusa a correção, que então conta como falha, quando:</w:t>
+      </w:r>
+    </w:p>
+    <w:p>
+      <w:pPr>
+        <w:pStyle w:val="ListParagraph"/>
+        <w:numPr>
+          <w:ilvl w:val="0"/>
+          <w:numId w:val="5"/>
+        </w:numPr>
+        <w:spacing w:after="80" w:line="290"/>
+      </w:pPr>
+      <w:r>
+        <w:t xml:space="preserve">o identificador da questão é diferente;</w:t>
+      </w:r>
+    </w:p>
+    <w:p>
+      <w:pPr>
+        <w:pStyle w:val="ListParagraph"/>
+        <w:numPr>
+          <w:ilvl w:val="0"/>
+          <w:numId w:val="5"/>
+        </w:numPr>
+        <w:spacing w:after="80" w:line="290"/>
+      </w:pPr>
+      <w:r>
+        <w:t xml:space="preserve">a condição informada pelo modelo não é a condição executada;</w:t>
+      </w:r>
+    </w:p>
+    <w:p>
+      <w:pPr>
+        <w:pStyle w:val="ListParagraph"/>
+        <w:numPr>
+          <w:ilvl w:val="0"/>
+          <w:numId w:val="5"/>
+        </w:numPr>
+        <w:spacing w:after="80" w:line="290"/>
+      </w:pPr>
+      <w:r>
+        <w:t xml:space="preserve">a nota máxima é diferente da cadastrada, ou a nota sugerida fica fora do intervalo de zero à nota máxima;</w:t>
+      </w:r>
+    </w:p>
+    <w:p>
+      <w:pPr>
+        <w:pStyle w:val="ListParagraph"/>
+        <w:numPr>
+          <w:ilvl w:val="0"/>
+          <w:numId w:val="5"/>
+        </w:numPr>
+        <w:spacing w:after="80" w:line="290"/>
+      </w:pPr>
+      <w:r>
+        <w:t xml:space="preserve">nenhum critério é analisado;</w:t>
+      </w:r>
+    </w:p>
+    <w:p>
+      <w:pPr>
+        <w:pStyle w:val="ListParagraph"/>
+        <w:numPr>
+          <w:ilvl w:val="0"/>
+          <w:numId w:val="5"/>
+        </w:numPr>
+        <w:spacing w:after="80" w:line="290"/>
+      </w:pPr>
+      <w:r>
+        <w:t xml:space="preserve">há rubrica e o número de critérios ou os pesos são diferentes dos do professor;</w:t>
+      </w:r>
+    </w:p>
+    <w:p>
+      <w:pPr>
+        <w:pStyle w:val="ListParagraph"/>
+        <w:numPr>
+          <w:ilvl w:val="0"/>
+          <w:numId w:val="5"/>
+        </w:numPr>
+        <w:spacing w:after="80" w:line="290"/>
+      </w:pPr>
+      <w:r>
+        <w:t xml:space="preserve">algum trecho citado não existe na resposta do aluno.</w:t>
+      </w:r>
+    </w:p>
+    <w:p>
+      <w:pPr>
+        <w:spacing w:after="120" w:line="300"/>
+      </w:pPr>
+      <w:r>
+        <w:t xml:space="preserve">A função </w:t>
+      </w:r>
+      <w:r>
+        <w:rPr>
+          <w:rFonts w:ascii="Consolas" w:cs="Consolas" w:eastAsia="Consolas" w:hAnsi="Consolas"/>
+          <w:sz w:val="20"/>
+          <w:szCs w:val="20"/>
+        </w:rPr>
+        <w:t xml:space="preserve">trecho_existe</w:t>
+      </w:r>
+      <w:r>
+        <w:t xml:space="preserve"> faz a última verificação. Ela ignora diferenças de maiúsculas, aspas e espaços e aceita trechos com reticências no meio, desde que cada parte exista na resposta e na mesma ordem. Uma paráfrase, ou um trecho inventado, é recusada.</w:t>
+      </w:r>
+    </w:p>
+    <w:p>
+      <w:pPr>
+        <w:pStyle w:val="Heading2"/>
+      </w:pPr>
+      <w:r>
+        <w:t xml:space="preserve">4.9 Correção discursiva: app/correcao/discursiva.py</w:t>
       </w:r>
     </w:p>
     <w:tbl>
@@ -15389,7 +16138,7 @@
                 <w:sz w:val="20"/>
                 <w:szCs w:val="20"/>
               </w:rPr>
-              <w:t xml:space="preserve">Preco</w:t>
+              <w:t xml:space="preserve">PROMPT_DISCURSIVA</w:t>
             </w:r>
           </w:p>
         </w:tc>
@@ -15415,7 +16164,22 @@
                 <w:sz w:val="20"/>
                 <w:szCs w:val="20"/>
               </w:rPr>
-              <w:t xml:space="preserve">Preços de um modelo: entrada, entrada em cache, gravação em cache e saída</w:t>
+              <w:t xml:space="preserve">Prompt em uso: </w:t>
+            </w:r>
+            <w:r>
+              <w:rPr>
+                <w:rFonts w:ascii="Consolas" w:cs="Consolas" w:eastAsia="Consolas" w:hAnsi="Consolas"/>
+                <w:sz w:val="20"/>
+                <w:szCs w:val="20"/>
+              </w:rPr>
+              <w:t xml:space="preserve">discursiva</w:t>
+            </w:r>
+            <w:r>
+              <w:rPr>
+                <w:sz w:val="20"/>
+                <w:szCs w:val="20"/>
+              </w:rPr>
+              <w:t xml:space="preserve">, versão 1</w:t>
             </w:r>
           </w:p>
         </w:tc>
@@ -15447,7 +16211,7 @@
                 <w:sz w:val="20"/>
                 <w:szCs w:val="20"/>
               </w:rPr>
-              <w:t xml:space="preserve">carregar_tabela()</w:t>
+              <w:t xml:space="preserve">campos_do_prompt(questao, submissao, usar)</w:t>
             </w:r>
           </w:p>
         </w:tc>
@@ -15473,22 +16237,65 @@
                 <w:sz w:val="20"/>
                 <w:szCs w:val="20"/>
               </w:rPr>
-              <w:t xml:space="preserve">Lê </w:t>
-            </w:r>
+              <w:t xml:space="preserve">Prepara enunciado, nota máxima, rubrica numerada com pesos, resposta esperada ou o aviso de que não há, resposta do aluno e a condição</w:t>
+            </w:r>
+          </w:p>
+        </w:tc>
+      </w:tr>
+      <w:tr>
+        <w:trPr>
+          <w:cantSplit/>
+        </w:trPr>
+        <w:tc>
+          <w:tcPr>
+            <w:tcW w:type="dxa" w:w="3628"/>
+            <w:tcBorders>
+              <w:top w:val="single" w:color="BFBFBF" w:sz="4"/>
+              <w:left w:val="single" w:color="BFBFBF" w:sz="4"/>
+              <w:bottom w:val="single" w:color="BFBFBF" w:sz="4"/>
+              <w:right w:val="single" w:color="BFBFBF" w:sz="4"/>
+            </w:tcBorders>
+            <w:tcMar>
+              <w:top w:type="dxa" w:w="60"/>
+              <w:left w:type="dxa" w:w="100"/>
+              <w:bottom w:type="dxa" w:w="60"/>
+              <w:right w:type="dxa" w:w="100"/>
+            </w:tcMar>
+          </w:tcPr>
+          <w:p>
             <w:r>
               <w:rPr>
                 <w:rFonts w:ascii="Consolas" w:cs="Consolas" w:eastAsia="Consolas" w:hAnsi="Consolas"/>
                 <w:sz w:val="20"/>
                 <w:szCs w:val="20"/>
               </w:rPr>
-              <w:t xml:space="preserve">config/precos.toml</w:t>
-            </w:r>
-            <w:r>
-              <w:rPr>
-                <w:sz w:val="20"/>
-                <w:szCs w:val="20"/>
-              </w:rPr>
-              <w:t xml:space="preserve"> uma vez e guarda em memória</w:t>
+              <w:t xml:space="preserve">gerar_correcao(sessao, submissao, usar)</w:t>
+            </w:r>
+          </w:p>
+        </w:tc>
+        <w:tc>
+          <w:tcPr>
+            <w:tcW w:type="dxa" w:w="5443"/>
+            <w:tcBorders>
+              <w:top w:val="single" w:color="BFBFBF" w:sz="4"/>
+              <w:left w:val="single" w:color="BFBFBF" w:sz="4"/>
+              <w:bottom w:val="single" w:color="BFBFBF" w:sz="4"/>
+              <w:right w:val="single" w:color="BFBFBF" w:sz="4"/>
+            </w:tcBorders>
+            <w:tcMar>
+              <w:top w:type="dxa" w:w="60"/>
+              <w:left w:type="dxa" w:w="100"/>
+              <w:bottom w:type="dxa" w:w="60"/>
+              <w:right w:type="dxa" w:w="100"/>
+            </w:tcMar>
+          </w:tcPr>
+          <w:p>
+            <w:r>
+              <w:rPr>
+                <w:sz w:val="20"/>
+                <w:szCs w:val="20"/>
+              </w:rPr>
+              <w:t xml:space="preserve">Corrige a resposta em uma das duas condições, confere e grava a correção ligada à resposta e à métrica</w:t>
             </w:r>
           </w:p>
         </w:tc>
@@ -15520,7 +16327,7 @@
                 <w:sz w:val="20"/>
                 <w:szCs w:val="20"/>
               </w:rPr>
-              <w:t xml:space="preserve">preco_do_modelo(modelo)</w:t>
+              <w:t xml:space="preserve">CondicaoIndisponivel</w:t>
             </w:r>
           </w:p>
         </w:tc>
@@ -15546,65 +16353,7 @@
                 <w:sz w:val="20"/>
                 <w:szCs w:val="20"/>
               </w:rPr>
-              <w:t xml:space="preserve">Procura pelo nome exato e, se não achar, pelo nome base (aceita sufixos de versão)</w:t>
-            </w:r>
-          </w:p>
-        </w:tc>
-      </w:tr>
-      <w:tr>
-        <w:trPr>
-          <w:cantSplit/>
-        </w:trPr>
-        <w:tc>
-          <w:tcPr>
-            <w:tcW w:type="dxa" w:w="3628"/>
-            <w:tcBorders>
-              <w:top w:val="single" w:color="BFBFBF" w:sz="4"/>
-              <w:left w:val="single" w:color="BFBFBF" w:sz="4"/>
-              <w:bottom w:val="single" w:color="BFBFBF" w:sz="4"/>
-              <w:right w:val="single" w:color="BFBFBF" w:sz="4"/>
-            </w:tcBorders>
-            <w:tcMar>
-              <w:top w:type="dxa" w:w="60"/>
-              <w:left w:type="dxa" w:w="100"/>
-              <w:bottom w:type="dxa" w:w="60"/>
-              <w:right w:type="dxa" w:w="100"/>
-            </w:tcMar>
-          </w:tcPr>
-          <w:p>
-            <w:r>
-              <w:rPr>
-                <w:rFonts w:ascii="Consolas" w:cs="Consolas" w:eastAsia="Consolas" w:hAnsi="Consolas"/>
-                <w:sz w:val="20"/>
-                <w:szCs w:val="20"/>
-              </w:rPr>
-              <w:t xml:space="preserve">calcular_custo(...)</w:t>
-            </w:r>
-          </w:p>
-        </w:tc>
-        <w:tc>
-          <w:tcPr>
-            <w:tcW w:type="dxa" w:w="5443"/>
-            <w:tcBorders>
-              <w:top w:val="single" w:color="BFBFBF" w:sz="4"/>
-              <w:left w:val="single" w:color="BFBFBF" w:sz="4"/>
-              <w:bottom w:val="single" w:color="BFBFBF" w:sz="4"/>
-              <w:right w:val="single" w:color="BFBFBF" w:sz="4"/>
-            </w:tcBorders>
-            <w:tcMar>
-              <w:top w:type="dxa" w:w="60"/>
-              <w:left w:type="dxa" w:w="100"/>
-              <w:bottom w:type="dxa" w:w="60"/>
-              <w:right w:type="dxa" w:w="100"/>
-            </w:tcMar>
-          </w:tcPr>
-          <w:p>
-            <w:r>
-              <w:rPr>
-                <w:sz w:val="20"/>
-                <w:szCs w:val="20"/>
-              </w:rPr>
-              <w:t xml:space="preserve">Aplica a fórmula da seção 5.2; devolve vazio para modelo sem preço, em vez de inventar um valor</w:t>
+              <w:t xml:space="preserve">Erro quando se pede a condição com resposta esperada para questão que não tem uma; nada é enviado ao modelo</w:t>
             </w:r>
           </w:p>
         </w:tc>
@@ -15617,10 +16366,110 @@
     </w:p>
     <w:p>
       <w:pPr>
+        <w:spacing w:after="120" w:line="300"/>
+      </w:pPr>
+      <w:r>
+        <w:t xml:space="preserve">Na condição sem resposta esperada, o texto da resposta esperada não é enviado de forma alguma; o campo recebe apenas o aviso de que ela não foi informada. As duas condições usam o mesmo prompt, e só o conteúdo dos campos muda, o que torna a comparação justa.</w:t>
+      </w:r>
+    </w:p>
+    <w:p>
+      <w:pPr>
+        <w:pStyle w:val="Heading3"/>
+      </w:pPr>
+      <w:r>
+        <w:t xml:space="preserve">Prompt discursiva_v1</w:t>
+      </w:r>
+    </w:p>
+    <w:p>
+      <w:pPr>
+        <w:spacing w:after="120" w:line="300"/>
+      </w:pPr>
+      <w:r>
+        <w:t xml:space="preserve">O texto fica em </w:t>
+      </w:r>
+      <w:r>
+        <w:rPr>
+          <w:rFonts w:ascii="Consolas" w:cs="Consolas" w:eastAsia="Consolas" w:hAnsi="Consolas"/>
+          <w:sz w:val="20"/>
+          <w:szCs w:val="20"/>
+        </w:rPr>
+        <w:t xml:space="preserve">prompts/discursiva/v1.md</w:t>
+      </w:r>
+      <w:r>
+        <w:t xml:space="preserve">. Em resumo, ele instrui o modelo a:</w:t>
+      </w:r>
+    </w:p>
+    <w:p>
+      <w:pPr>
+        <w:pStyle w:val="ListParagraph"/>
+        <w:numPr>
+          <w:ilvl w:val="0"/>
+          <w:numId w:val="5"/>
+        </w:numPr>
+        <w:spacing w:after="80" w:line="290"/>
+      </w:pPr>
+      <w:r>
+        <w:t xml:space="preserve">com rubrica, avaliar exatamente os critérios e pesos do professor, na mesma ordem; sem rubrica, definir de 3 a 5 critérios;</w:t>
+      </w:r>
+    </w:p>
+    <w:p>
+      <w:pPr>
+        <w:pStyle w:val="ListParagraph"/>
+        <w:numPr>
+          <w:ilvl w:val="0"/>
+          <w:numId w:val="5"/>
+        </w:numPr>
+        <w:spacing w:after="80" w:line="290"/>
+      </w:pPr>
+      <w:r>
+        <w:t xml:space="preserve">copiar literalmente o trecho da resposta do aluno que sustenta cada avaliação (RF06);</w:t>
+      </w:r>
+    </w:p>
+    <w:p>
+      <w:pPr>
+        <w:pStyle w:val="ListParagraph"/>
+        <w:numPr>
+          <w:ilvl w:val="0"/>
+          <w:numId w:val="5"/>
+        </w:numPr>
+        <w:spacing w:after="80" w:line="290"/>
+      </w:pPr>
+      <w:r>
+        <w:t xml:space="preserve">calcular a nota pelos pesos: critério atendido vale o peso inteiro, parcial vale metade e não atendido vale zero, arredondando para múltiplo de 0,5 (RF07);</w:t>
+      </w:r>
+    </w:p>
+    <w:p>
+      <w:pPr>
+        <w:pStyle w:val="ListParagraph"/>
+        <w:numPr>
+          <w:ilvl w:val="0"/>
+          <w:numId w:val="5"/>
+        </w:numPr>
+        <w:spacing w:after="80" w:line="290"/>
+      </w:pPr>
+      <w:r>
+        <w:t xml:space="preserve">escrever o feedback ao aluno reconhecendo o que ele acertou e mostrando o caminho para a resposta completa, sem entregá-la pronta;</w:t>
+      </w:r>
+    </w:p>
+    <w:p>
+      <w:pPr>
+        <w:pStyle w:val="ListParagraph"/>
+        <w:numPr>
+          <w:ilvl w:val="0"/>
+          <w:numId w:val="5"/>
+        </w:numPr>
+        <w:spacing w:after="80" w:line="290"/>
+      </w:pPr>
+      <w:r>
+        <w:t xml:space="preserve">não inventar dados, datas, autores ou citações.</w:t>
+      </w:r>
+    </w:p>
+    <w:p>
+      <w:pPr>
         <w:pStyle w:val="Heading2"/>
       </w:pPr>
       <w:r>
-        <w:t xml:space="preserve">4.9 Métricas na web: app/metricas/router.py</w:t>
+        <w:t xml:space="preserve">4.10 Páginas de discursivas: app/questoes/discursivas.py</w:t>
       </w:r>
     </w:p>
     <w:tbl>
@@ -15729,7 +16578,7 @@
                 <w:sz w:val="20"/>
                 <w:szCs w:val="20"/>
               </w:rPr>
-              <w:t xml:space="preserve">GET /metricas</w:t>
+              <w:t xml:space="preserve">GET /questoes/nova-discursiva</w:t>
             </w:r>
           </w:p>
         </w:tc>
@@ -15755,7 +16604,7 @@
                 <w:sz w:val="20"/>
                 <w:szCs w:val="20"/>
               </w:rPr>
-              <w:t xml:space="preserve">Página com as 200 requisições mais recentes</w:t>
+              <w:t xml:space="preserve">Formulário de cadastro: enunciado, nota máxima, resposta esperada e rubrica opcionais (RF04)</w:t>
             </w:r>
           </w:p>
         </w:tc>
@@ -15787,7 +16636,7 @@
                 <w:sz w:val="20"/>
                 <w:szCs w:val="20"/>
               </w:rPr>
-              <w:t xml:space="preserve">GET /metricas/exportar.csv</w:t>
+              <w:t xml:space="preserve">POST /questoes/discursivas</w:t>
             </w:r>
           </w:p>
         </w:tc>
@@ -15813,7 +16662,269 @@
                 <w:sz w:val="20"/>
                 <w:szCs w:val="20"/>
               </w:rPr>
-              <w:t xml:space="preserve">Arquivo CSV com todas as requisições e todos os campos, para análise (RF14)</w:t>
+              <w:t xml:space="preserve">Valida e grava. Linhas de rubrica vazias são ignoradas; linha só com critério ou só com peso é erro</w:t>
+            </w:r>
+          </w:p>
+        </w:tc>
+      </w:tr>
+      <w:tr>
+        <w:trPr>
+          <w:cantSplit/>
+        </w:trPr>
+        <w:tc>
+          <w:tcPr>
+            <w:tcW w:type="dxa" w:w="3628"/>
+            <w:tcBorders>
+              <w:top w:val="single" w:color="BFBFBF" w:sz="4"/>
+              <w:left w:val="single" w:color="BFBFBF" w:sz="4"/>
+              <w:bottom w:val="single" w:color="BFBFBF" w:sz="4"/>
+              <w:right w:val="single" w:color="BFBFBF" w:sz="4"/>
+            </w:tcBorders>
+            <w:tcMar>
+              <w:top w:type="dxa" w:w="60"/>
+              <w:left w:type="dxa" w:w="100"/>
+              <w:bottom w:type="dxa" w:w="60"/>
+              <w:right w:type="dxa" w:w="100"/>
+            </w:tcMar>
+          </w:tcPr>
+          <w:p>
+            <w:r>
+              <w:rPr>
+                <w:rFonts w:ascii="Consolas" w:cs="Consolas" w:eastAsia="Consolas" w:hAnsi="Consolas"/>
+                <w:sz w:val="20"/>
+                <w:szCs w:val="20"/>
+              </w:rPr>
+              <w:t xml:space="preserve">GET /questoes/{id}</w:t>
+            </w:r>
+          </w:p>
+        </w:tc>
+        <w:tc>
+          <w:tcPr>
+            <w:tcW w:type="dxa" w:w="5443"/>
+            <w:tcBorders>
+              <w:top w:val="single" w:color="BFBFBF" w:sz="4"/>
+              <w:left w:val="single" w:color="BFBFBF" w:sz="4"/>
+              <w:bottom w:val="single" w:color="BFBFBF" w:sz="4"/>
+              <w:right w:val="single" w:color="BFBFBF" w:sz="4"/>
+            </w:tcBorders>
+            <w:tcMar>
+              <w:top w:type="dxa" w:w="60"/>
+              <w:left w:type="dxa" w:w="100"/>
+              <w:bottom w:type="dxa" w:w="60"/>
+              <w:right w:type="dxa" w:w="100"/>
+            </w:tcMar>
+          </w:tcPr>
+          <w:p>
+            <w:r>
+              <w:rPr>
+                <w:sz w:val="20"/>
+                <w:szCs w:val="20"/>
+              </w:rPr>
+              <w:t xml:space="preserve">Para questão discursiva: resposta esperada, rubrica, lista de respostas e formulário de nova resposta</w:t>
+            </w:r>
+          </w:p>
+        </w:tc>
+      </w:tr>
+      <w:tr>
+        <w:trPr>
+          <w:cantSplit/>
+        </w:trPr>
+        <w:tc>
+          <w:tcPr>
+            <w:tcW w:type="dxa" w:w="3628"/>
+            <w:tcBorders>
+              <w:top w:val="single" w:color="BFBFBF" w:sz="4"/>
+              <w:left w:val="single" w:color="BFBFBF" w:sz="4"/>
+              <w:bottom w:val="single" w:color="BFBFBF" w:sz="4"/>
+              <w:right w:val="single" w:color="BFBFBF" w:sz="4"/>
+            </w:tcBorders>
+            <w:tcMar>
+              <w:top w:type="dxa" w:w="60"/>
+              <w:left w:type="dxa" w:w="100"/>
+              <w:bottom w:type="dxa" w:w="60"/>
+              <w:right w:type="dxa" w:w="100"/>
+            </w:tcMar>
+          </w:tcPr>
+          <w:p>
+            <w:r>
+              <w:rPr>
+                <w:rFonts w:ascii="Consolas" w:cs="Consolas" w:eastAsia="Consolas" w:hAnsi="Consolas"/>
+                <w:sz w:val="20"/>
+                <w:szCs w:val="20"/>
+              </w:rPr>
+              <w:t xml:space="preserve">POST /questoes/{id}/respostas</w:t>
+            </w:r>
+          </w:p>
+        </w:tc>
+        <w:tc>
+          <w:tcPr>
+            <w:tcW w:type="dxa" w:w="5443"/>
+            <w:tcBorders>
+              <w:top w:val="single" w:color="BFBFBF" w:sz="4"/>
+              <w:left w:val="single" w:color="BFBFBF" w:sz="4"/>
+              <w:bottom w:val="single" w:color="BFBFBF" w:sz="4"/>
+              <w:right w:val="single" w:color="BFBFBF" w:sz="4"/>
+            </w:tcBorders>
+            <w:tcMar>
+              <w:top w:type="dxa" w:w="60"/>
+              <w:left w:type="dxa" w:w="100"/>
+              <w:bottom w:type="dxa" w:w="60"/>
+              <w:right w:type="dxa" w:w="100"/>
+            </w:tcMar>
+          </w:tcPr>
+          <w:p>
+            <w:r>
+              <w:rPr>
+                <w:sz w:val="20"/>
+                <w:szCs w:val="20"/>
+              </w:rPr>
+              <w:t xml:space="preserve">Registra a resposta de um aluno com código anônimo e origem (RF05)</w:t>
+            </w:r>
+          </w:p>
+        </w:tc>
+      </w:tr>
+      <w:tr>
+        <w:trPr>
+          <w:cantSplit/>
+        </w:trPr>
+        <w:tc>
+          <w:tcPr>
+            <w:tcW w:type="dxa" w:w="3628"/>
+            <w:tcBorders>
+              <w:top w:val="single" w:color="BFBFBF" w:sz="4"/>
+              <w:left w:val="single" w:color="BFBFBF" w:sz="4"/>
+              <w:bottom w:val="single" w:color="BFBFBF" w:sz="4"/>
+              <w:right w:val="single" w:color="BFBFBF" w:sz="4"/>
+            </w:tcBorders>
+            <w:tcMar>
+              <w:top w:type="dxa" w:w="60"/>
+              <w:left w:type="dxa" w:w="100"/>
+              <w:bottom w:type="dxa" w:w="60"/>
+              <w:right w:type="dxa" w:w="100"/>
+            </w:tcMar>
+          </w:tcPr>
+          <w:p>
+            <w:r>
+              <w:rPr>
+                <w:rFonts w:ascii="Consolas" w:cs="Consolas" w:eastAsia="Consolas" w:hAnsi="Consolas"/>
+                <w:sz w:val="20"/>
+                <w:szCs w:val="20"/>
+              </w:rPr>
+              <w:t xml:space="preserve">GET /respostas/{id}</w:t>
+            </w:r>
+          </w:p>
+        </w:tc>
+        <w:tc>
+          <w:tcPr>
+            <w:tcW w:type="dxa" w:w="5443"/>
+            <w:tcBorders>
+              <w:top w:val="single" w:color="BFBFBF" w:sz="4"/>
+              <w:left w:val="single" w:color="BFBFBF" w:sz="4"/>
+              <w:bottom w:val="single" w:color="BFBFBF" w:sz="4"/>
+              <w:right w:val="single" w:color="BFBFBF" w:sz="4"/>
+            </w:tcBorders>
+            <w:tcMar>
+              <w:top w:type="dxa" w:w="60"/>
+              <w:left w:type="dxa" w:w="100"/>
+              <w:bottom w:type="dxa" w:w="60"/>
+              <w:right w:type="dxa" w:w="100"/>
+            </w:tcMar>
+          </w:tcPr>
+          <w:p>
+            <w:r>
+              <w:rPr>
+                <w:sz w:val="20"/>
+                <w:szCs w:val="20"/>
+              </w:rPr>
+              <w:t xml:space="preserve">Resposta do aluno, botões de correção nas duas condições e todas as correções já feitas, da mais recente para a mais antiga</w:t>
+            </w:r>
+          </w:p>
+        </w:tc>
+      </w:tr>
+      <w:tr>
+        <w:trPr>
+          <w:cantSplit/>
+        </w:trPr>
+        <w:tc>
+          <w:tcPr>
+            <w:tcW w:type="dxa" w:w="3628"/>
+            <w:tcBorders>
+              <w:top w:val="single" w:color="BFBFBF" w:sz="4"/>
+              <w:left w:val="single" w:color="BFBFBF" w:sz="4"/>
+              <w:bottom w:val="single" w:color="BFBFBF" w:sz="4"/>
+              <w:right w:val="single" w:color="BFBFBF" w:sz="4"/>
+            </w:tcBorders>
+            <w:tcMar>
+              <w:top w:type="dxa" w:w="60"/>
+              <w:left w:type="dxa" w:w="100"/>
+              <w:bottom w:type="dxa" w:w="60"/>
+              <w:right w:type="dxa" w:w="100"/>
+            </w:tcMar>
+          </w:tcPr>
+          <w:p>
+            <w:r>
+              <w:rPr>
+                <w:rFonts w:ascii="Consolas" w:cs="Consolas" w:eastAsia="Consolas" w:hAnsi="Consolas"/>
+                <w:sz w:val="20"/>
+                <w:szCs w:val="20"/>
+              </w:rPr>
+              <w:t xml:space="preserve">POST /respostas/{id}/corrigir</w:t>
+            </w:r>
+          </w:p>
+        </w:tc>
+        <w:tc>
+          <w:tcPr>
+            <w:tcW w:type="dxa" w:w="5443"/>
+            <w:tcBorders>
+              <w:top w:val="single" w:color="BFBFBF" w:sz="4"/>
+              <w:left w:val="single" w:color="BFBFBF" w:sz="4"/>
+              <w:bottom w:val="single" w:color="BFBFBF" w:sz="4"/>
+              <w:right w:val="single" w:color="BFBFBF" w:sz="4"/>
+            </w:tcBorders>
+            <w:tcMar>
+              <w:top w:type="dxa" w:w="60"/>
+              <w:left w:type="dxa" w:w="100"/>
+              <w:bottom w:type="dxa" w:w="60"/>
+              <w:right w:type="dxa" w:w="100"/>
+            </w:tcMar>
+          </w:tcPr>
+          <w:p>
+            <w:r>
+              <w:rPr>
+                <w:sz w:val="20"/>
+                <w:szCs w:val="20"/>
+              </w:rPr>
+              <w:t xml:space="preserve">Corrige na condição escolhida (</w:t>
+            </w:r>
+            <w:r>
+              <w:rPr>
+                <w:rFonts w:ascii="Consolas" w:cs="Consolas" w:eastAsia="Consolas" w:hAnsi="Consolas"/>
+                <w:sz w:val="20"/>
+                <w:szCs w:val="20"/>
+              </w:rPr>
+              <w:t xml:space="preserve">com</w:t>
+            </w:r>
+            <w:r>
+              <w:rPr>
+                <w:sz w:val="20"/>
+                <w:szCs w:val="20"/>
+              </w:rPr>
+              <w:t xml:space="preserve"> ou </w:t>
+            </w:r>
+            <w:r>
+              <w:rPr>
+                <w:rFonts w:ascii="Consolas" w:cs="Consolas" w:eastAsia="Consolas" w:hAnsi="Consolas"/>
+                <w:sz w:val="20"/>
+                <w:szCs w:val="20"/>
+              </w:rPr>
+              <w:t xml:space="preserve">sem</w:t>
+            </w:r>
+            <w:r>
+              <w:rPr>
+                <w:sz w:val="20"/>
+                <w:szCs w:val="20"/>
+              </w:rPr>
+              <w:t xml:space="preserve">) e volta para a página da resposta</w:t>
             </w:r>
           </w:p>
         </w:tc>
@@ -15826,10 +16937,18 @@
     </w:p>
     <w:p>
       <w:pPr>
+        <w:spacing w:after="120" w:line="300"/>
+      </w:pPr>
+      <w:r>
+        <w:t xml:space="preserve">Na página da resposta, a nota aparece com o rótulo "Nota sugerida pelo modelo" e o aviso de que a nota final é do professor (RF07). Cada critério mostra o status, a justificativa e o trecho citado. Aceitar ou ajustar a nota é a etapa 4.</w:t>
+      </w:r>
+    </w:p>
+    <w:p>
+      <w:pPr>
         <w:pStyle w:val="Heading2"/>
       </w:pPr>
       <w:r>
-        <w:t xml:space="preserve">4.10 Aplicação: app/main.py</w:t>
+        <w:t xml:space="preserve">4.11 Custo: app/metricas/precos.py</w:t>
       </w:r>
     </w:p>
     <w:tbl>
@@ -15877,7 +16996,7 @@
                 <w:sz w:val="20"/>
                 <w:szCs w:val="20"/>
               </w:rPr>
-              <w:t xml:space="preserve">Rota</w:t>
+              <w:t xml:space="preserve">Elemento</w:t>
             </w:r>
           </w:p>
         </w:tc>
@@ -15938,7 +17057,7 @@
                 <w:sz w:val="20"/>
                 <w:szCs w:val="20"/>
               </w:rPr>
-              <w:t xml:space="preserve">GET /</w:t>
+              <w:t xml:space="preserve">Preco</w:t>
             </w:r>
           </w:p>
         </w:tc>
@@ -15964,7 +17083,7 @@
                 <w:sz w:val="20"/>
                 <w:szCs w:val="20"/>
               </w:rPr>
-              <w:t xml:space="preserve">Página inicial, com o modelo configurado</w:t>
+              <w:t xml:space="preserve">Preços de um modelo: entrada, entrada em cache, gravação em cache e saída</w:t>
             </w:r>
           </w:p>
         </w:tc>
@@ -15996,7 +17115,7 @@
                 <w:sz w:val="20"/>
                 <w:szCs w:val="20"/>
               </w:rPr>
-              <w:t xml:space="preserve">GET /saude</w:t>
+              <w:t xml:space="preserve">carregar_tabela()</w:t>
             </w:r>
           </w:p>
         </w:tc>
@@ -16022,7 +17141,138 @@
                 <w:sz w:val="20"/>
                 <w:szCs w:val="20"/>
               </w:rPr>
-              <w:t xml:space="preserve">Verificação rápida de que o servidor está no ar</w:t>
+              <w:t xml:space="preserve">Lê </w:t>
+            </w:r>
+            <w:r>
+              <w:rPr>
+                <w:rFonts w:ascii="Consolas" w:cs="Consolas" w:eastAsia="Consolas" w:hAnsi="Consolas"/>
+                <w:sz w:val="20"/>
+                <w:szCs w:val="20"/>
+              </w:rPr>
+              <w:t xml:space="preserve">config/precos.toml</w:t>
+            </w:r>
+            <w:r>
+              <w:rPr>
+                <w:sz w:val="20"/>
+                <w:szCs w:val="20"/>
+              </w:rPr>
+              <w:t xml:space="preserve"> uma vez e guarda em memória</w:t>
+            </w:r>
+          </w:p>
+        </w:tc>
+      </w:tr>
+      <w:tr>
+        <w:trPr>
+          <w:cantSplit/>
+        </w:trPr>
+        <w:tc>
+          <w:tcPr>
+            <w:tcW w:type="dxa" w:w="3628"/>
+            <w:tcBorders>
+              <w:top w:val="single" w:color="BFBFBF" w:sz="4"/>
+              <w:left w:val="single" w:color="BFBFBF" w:sz="4"/>
+              <w:bottom w:val="single" w:color="BFBFBF" w:sz="4"/>
+              <w:right w:val="single" w:color="BFBFBF" w:sz="4"/>
+            </w:tcBorders>
+            <w:tcMar>
+              <w:top w:type="dxa" w:w="60"/>
+              <w:left w:type="dxa" w:w="100"/>
+              <w:bottom w:type="dxa" w:w="60"/>
+              <w:right w:type="dxa" w:w="100"/>
+            </w:tcMar>
+          </w:tcPr>
+          <w:p>
+            <w:r>
+              <w:rPr>
+                <w:rFonts w:ascii="Consolas" w:cs="Consolas" w:eastAsia="Consolas" w:hAnsi="Consolas"/>
+                <w:sz w:val="20"/>
+                <w:szCs w:val="20"/>
+              </w:rPr>
+              <w:t xml:space="preserve">preco_do_modelo(modelo)</w:t>
+            </w:r>
+          </w:p>
+        </w:tc>
+        <w:tc>
+          <w:tcPr>
+            <w:tcW w:type="dxa" w:w="5443"/>
+            <w:tcBorders>
+              <w:top w:val="single" w:color="BFBFBF" w:sz="4"/>
+              <w:left w:val="single" w:color="BFBFBF" w:sz="4"/>
+              <w:bottom w:val="single" w:color="BFBFBF" w:sz="4"/>
+              <w:right w:val="single" w:color="BFBFBF" w:sz="4"/>
+            </w:tcBorders>
+            <w:tcMar>
+              <w:top w:type="dxa" w:w="60"/>
+              <w:left w:type="dxa" w:w="100"/>
+              <w:bottom w:type="dxa" w:w="60"/>
+              <w:right w:type="dxa" w:w="100"/>
+            </w:tcMar>
+          </w:tcPr>
+          <w:p>
+            <w:r>
+              <w:rPr>
+                <w:sz w:val="20"/>
+                <w:szCs w:val="20"/>
+              </w:rPr>
+              <w:t xml:space="preserve">Procura pelo nome exato e, se não achar, pelo nome base (aceita sufixos de versão)</w:t>
+            </w:r>
+          </w:p>
+        </w:tc>
+      </w:tr>
+      <w:tr>
+        <w:trPr>
+          <w:cantSplit/>
+        </w:trPr>
+        <w:tc>
+          <w:tcPr>
+            <w:tcW w:type="dxa" w:w="3628"/>
+            <w:tcBorders>
+              <w:top w:val="single" w:color="BFBFBF" w:sz="4"/>
+              <w:left w:val="single" w:color="BFBFBF" w:sz="4"/>
+              <w:bottom w:val="single" w:color="BFBFBF" w:sz="4"/>
+              <w:right w:val="single" w:color="BFBFBF" w:sz="4"/>
+            </w:tcBorders>
+            <w:tcMar>
+              <w:top w:type="dxa" w:w="60"/>
+              <w:left w:type="dxa" w:w="100"/>
+              <w:bottom w:type="dxa" w:w="60"/>
+              <w:right w:type="dxa" w:w="100"/>
+            </w:tcMar>
+          </w:tcPr>
+          <w:p>
+            <w:r>
+              <w:rPr>
+                <w:rFonts w:ascii="Consolas" w:cs="Consolas" w:eastAsia="Consolas" w:hAnsi="Consolas"/>
+                <w:sz w:val="20"/>
+                <w:szCs w:val="20"/>
+              </w:rPr>
+              <w:t xml:space="preserve">calcular_custo(...)</w:t>
+            </w:r>
+          </w:p>
+        </w:tc>
+        <w:tc>
+          <w:tcPr>
+            <w:tcW w:type="dxa" w:w="5443"/>
+            <w:tcBorders>
+              <w:top w:val="single" w:color="BFBFBF" w:sz="4"/>
+              <w:left w:val="single" w:color="BFBFBF" w:sz="4"/>
+              <w:bottom w:val="single" w:color="BFBFBF" w:sz="4"/>
+              <w:right w:val="single" w:color="BFBFBF" w:sz="4"/>
+            </w:tcBorders>
+            <w:tcMar>
+              <w:top w:type="dxa" w:w="60"/>
+              <w:left w:type="dxa" w:w="100"/>
+              <w:bottom w:type="dxa" w:w="60"/>
+              <w:right w:type="dxa" w:w="100"/>
+            </w:tcMar>
+          </w:tcPr>
+          <w:p>
+            <w:r>
+              <w:rPr>
+                <w:sz w:val="20"/>
+                <w:szCs w:val="20"/>
+              </w:rPr>
+              <w:t xml:space="preserve">Aplica a fórmula da seção 5.2; devolve vazio para modelo sem preço, em vez de inventar um valor</w:t>
             </w:r>
           </w:p>
         </w:tc>
@@ -16038,7 +17288,425 @@
         <w:pStyle w:val="Heading2"/>
       </w:pPr>
       <w:r>
-        <w:t xml:space="preserve">4.11 Requisição de teste: scripts/teste_requisicao.py</w:t>
+        <w:t xml:space="preserve">4.12 Métricas na web: app/metricas/router.py</w:t>
+      </w:r>
+    </w:p>
+    <w:tbl>
+      <w:tblPr>
+        <w:tblW w:type="dxa" w:w="9071"/>
+        <w:tblBorders>
+          <w:top w:val="single" w:color="auto" w:sz="4"/>
+          <w:left w:val="single" w:color="auto" w:sz="4"/>
+          <w:bottom w:val="single" w:color="auto" w:sz="4"/>
+          <w:right w:val="single" w:color="auto" w:sz="4"/>
+          <w:insideH w:val="single" w:color="auto" w:sz="4"/>
+          <w:insideV w:val="single" w:color="auto" w:sz="4"/>
+        </w:tblBorders>
+      </w:tblPr>
+      <w:tblGrid>
+        <w:gridCol w:w="3628"/>
+        <w:gridCol w:w="5443"/>
+      </w:tblGrid>
+      <w:tr>
+        <w:trPr>
+          <w:tblHeader/>
+        </w:trPr>
+        <w:tc>
+          <w:tcPr>
+            <w:tcW w:type="dxa" w:w="3628"/>
+            <w:tcBorders>
+              <w:top w:val="single" w:color="BFBFBF" w:sz="4"/>
+              <w:left w:val="single" w:color="BFBFBF" w:sz="4"/>
+              <w:bottom w:val="single" w:color="BFBFBF" w:sz="4"/>
+              <w:right w:val="single" w:color="BFBFBF" w:sz="4"/>
+            </w:tcBorders>
+            <w:shd w:fill="D9E2F3" w:color="auto" w:val="clear"/>
+            <w:tcMar>
+              <w:top w:type="dxa" w:w="60"/>
+              <w:left w:type="dxa" w:w="100"/>
+              <w:bottom w:type="dxa" w:w="60"/>
+              <w:right w:type="dxa" w:w="100"/>
+            </w:tcMar>
+          </w:tcPr>
+          <w:p>
+            <w:r>
+              <w:rPr>
+                <w:b/>
+                <w:bCs/>
+                <w:sz w:val="20"/>
+                <w:szCs w:val="20"/>
+              </w:rPr>
+              <w:t xml:space="preserve">Rota</w:t>
+            </w:r>
+          </w:p>
+        </w:tc>
+        <w:tc>
+          <w:tcPr>
+            <w:tcW w:type="dxa" w:w="5443"/>
+            <w:tcBorders>
+              <w:top w:val="single" w:color="BFBFBF" w:sz="4"/>
+              <w:left w:val="single" w:color="BFBFBF" w:sz="4"/>
+              <w:bottom w:val="single" w:color="BFBFBF" w:sz="4"/>
+              <w:right w:val="single" w:color="BFBFBF" w:sz="4"/>
+            </w:tcBorders>
+            <w:shd w:fill="D9E2F3" w:color="auto" w:val="clear"/>
+            <w:tcMar>
+              <w:top w:type="dxa" w:w="60"/>
+              <w:left w:type="dxa" w:w="100"/>
+              <w:bottom w:type="dxa" w:w="60"/>
+              <w:right w:type="dxa" w:w="100"/>
+            </w:tcMar>
+          </w:tcPr>
+          <w:p>
+            <w:r>
+              <w:rPr>
+                <w:b/>
+                <w:bCs/>
+                <w:sz w:val="20"/>
+                <w:szCs w:val="20"/>
+              </w:rPr>
+              <w:t xml:space="preserve">O que faz</w:t>
+            </w:r>
+          </w:p>
+        </w:tc>
+      </w:tr>
+      <w:tr>
+        <w:trPr>
+          <w:cantSplit/>
+        </w:trPr>
+        <w:tc>
+          <w:tcPr>
+            <w:tcW w:type="dxa" w:w="3628"/>
+            <w:tcBorders>
+              <w:top w:val="single" w:color="BFBFBF" w:sz="4"/>
+              <w:left w:val="single" w:color="BFBFBF" w:sz="4"/>
+              <w:bottom w:val="single" w:color="BFBFBF" w:sz="4"/>
+              <w:right w:val="single" w:color="BFBFBF" w:sz="4"/>
+            </w:tcBorders>
+            <w:tcMar>
+              <w:top w:type="dxa" w:w="60"/>
+              <w:left w:type="dxa" w:w="100"/>
+              <w:bottom w:type="dxa" w:w="60"/>
+              <w:right w:type="dxa" w:w="100"/>
+            </w:tcMar>
+          </w:tcPr>
+          <w:p>
+            <w:r>
+              <w:rPr>
+                <w:rFonts w:ascii="Consolas" w:cs="Consolas" w:eastAsia="Consolas" w:hAnsi="Consolas"/>
+                <w:sz w:val="20"/>
+                <w:szCs w:val="20"/>
+              </w:rPr>
+              <w:t xml:space="preserve">GET /metricas</w:t>
+            </w:r>
+          </w:p>
+        </w:tc>
+        <w:tc>
+          <w:tcPr>
+            <w:tcW w:type="dxa" w:w="5443"/>
+            <w:tcBorders>
+              <w:top w:val="single" w:color="BFBFBF" w:sz="4"/>
+              <w:left w:val="single" w:color="BFBFBF" w:sz="4"/>
+              <w:bottom w:val="single" w:color="BFBFBF" w:sz="4"/>
+              <w:right w:val="single" w:color="BFBFBF" w:sz="4"/>
+            </w:tcBorders>
+            <w:tcMar>
+              <w:top w:type="dxa" w:w="60"/>
+              <w:left w:type="dxa" w:w="100"/>
+              <w:bottom w:type="dxa" w:w="60"/>
+              <w:right w:type="dxa" w:w="100"/>
+            </w:tcMar>
+          </w:tcPr>
+          <w:p>
+            <w:r>
+              <w:rPr>
+                <w:sz w:val="20"/>
+                <w:szCs w:val="20"/>
+              </w:rPr>
+              <w:t xml:space="preserve">Página com as 200 requisições mais recentes</w:t>
+            </w:r>
+          </w:p>
+        </w:tc>
+      </w:tr>
+      <w:tr>
+        <w:trPr>
+          <w:cantSplit/>
+        </w:trPr>
+        <w:tc>
+          <w:tcPr>
+            <w:tcW w:type="dxa" w:w="3628"/>
+            <w:tcBorders>
+              <w:top w:val="single" w:color="BFBFBF" w:sz="4"/>
+              <w:left w:val="single" w:color="BFBFBF" w:sz="4"/>
+              <w:bottom w:val="single" w:color="BFBFBF" w:sz="4"/>
+              <w:right w:val="single" w:color="BFBFBF" w:sz="4"/>
+            </w:tcBorders>
+            <w:tcMar>
+              <w:top w:type="dxa" w:w="60"/>
+              <w:left w:type="dxa" w:w="100"/>
+              <w:bottom w:type="dxa" w:w="60"/>
+              <w:right w:type="dxa" w:w="100"/>
+            </w:tcMar>
+          </w:tcPr>
+          <w:p>
+            <w:r>
+              <w:rPr>
+                <w:rFonts w:ascii="Consolas" w:cs="Consolas" w:eastAsia="Consolas" w:hAnsi="Consolas"/>
+                <w:sz w:val="20"/>
+                <w:szCs w:val="20"/>
+              </w:rPr>
+              <w:t xml:space="preserve">GET /metricas/exportar.csv</w:t>
+            </w:r>
+          </w:p>
+        </w:tc>
+        <w:tc>
+          <w:tcPr>
+            <w:tcW w:type="dxa" w:w="5443"/>
+            <w:tcBorders>
+              <w:top w:val="single" w:color="BFBFBF" w:sz="4"/>
+              <w:left w:val="single" w:color="BFBFBF" w:sz="4"/>
+              <w:bottom w:val="single" w:color="BFBFBF" w:sz="4"/>
+              <w:right w:val="single" w:color="BFBFBF" w:sz="4"/>
+            </w:tcBorders>
+            <w:tcMar>
+              <w:top w:type="dxa" w:w="60"/>
+              <w:left w:type="dxa" w:w="100"/>
+              <w:bottom w:type="dxa" w:w="60"/>
+              <w:right w:type="dxa" w:w="100"/>
+            </w:tcMar>
+          </w:tcPr>
+          <w:p>
+            <w:r>
+              <w:rPr>
+                <w:sz w:val="20"/>
+                <w:szCs w:val="20"/>
+              </w:rPr>
+              <w:t xml:space="preserve">Arquivo CSV com todas as requisições e todos os campos, para análise (RF14)</w:t>
+            </w:r>
+          </w:p>
+        </w:tc>
+      </w:tr>
+    </w:tbl>
+    <w:p>
+      <w:pPr>
+        <w:spacing w:after="120"/>
+      </w:pPr>
+    </w:p>
+    <w:p>
+      <w:pPr>
+        <w:pStyle w:val="Heading2"/>
+      </w:pPr>
+      <w:r>
+        <w:t xml:space="preserve">4.13 Aplicação: app/main.py</w:t>
+      </w:r>
+    </w:p>
+    <w:tbl>
+      <w:tblPr>
+        <w:tblW w:type="dxa" w:w="9071"/>
+        <w:tblBorders>
+          <w:top w:val="single" w:color="auto" w:sz="4"/>
+          <w:left w:val="single" w:color="auto" w:sz="4"/>
+          <w:bottom w:val="single" w:color="auto" w:sz="4"/>
+          <w:right w:val="single" w:color="auto" w:sz="4"/>
+          <w:insideH w:val="single" w:color="auto" w:sz="4"/>
+          <w:insideV w:val="single" w:color="auto" w:sz="4"/>
+        </w:tblBorders>
+      </w:tblPr>
+      <w:tblGrid>
+        <w:gridCol w:w="3628"/>
+        <w:gridCol w:w="5443"/>
+      </w:tblGrid>
+      <w:tr>
+        <w:trPr>
+          <w:tblHeader/>
+        </w:trPr>
+        <w:tc>
+          <w:tcPr>
+            <w:tcW w:type="dxa" w:w="3628"/>
+            <w:tcBorders>
+              <w:top w:val="single" w:color="BFBFBF" w:sz="4"/>
+              <w:left w:val="single" w:color="BFBFBF" w:sz="4"/>
+              <w:bottom w:val="single" w:color="BFBFBF" w:sz="4"/>
+              <w:right w:val="single" w:color="BFBFBF" w:sz="4"/>
+            </w:tcBorders>
+            <w:shd w:fill="D9E2F3" w:color="auto" w:val="clear"/>
+            <w:tcMar>
+              <w:top w:type="dxa" w:w="60"/>
+              <w:left w:type="dxa" w:w="100"/>
+              <w:bottom w:type="dxa" w:w="60"/>
+              <w:right w:type="dxa" w:w="100"/>
+            </w:tcMar>
+          </w:tcPr>
+          <w:p>
+            <w:r>
+              <w:rPr>
+                <w:b/>
+                <w:bCs/>
+                <w:sz w:val="20"/>
+                <w:szCs w:val="20"/>
+              </w:rPr>
+              <w:t xml:space="preserve">Rota</w:t>
+            </w:r>
+          </w:p>
+        </w:tc>
+        <w:tc>
+          <w:tcPr>
+            <w:tcW w:type="dxa" w:w="5443"/>
+            <w:tcBorders>
+              <w:top w:val="single" w:color="BFBFBF" w:sz="4"/>
+              <w:left w:val="single" w:color="BFBFBF" w:sz="4"/>
+              <w:bottom w:val="single" w:color="BFBFBF" w:sz="4"/>
+              <w:right w:val="single" w:color="BFBFBF" w:sz="4"/>
+            </w:tcBorders>
+            <w:shd w:fill="D9E2F3" w:color="auto" w:val="clear"/>
+            <w:tcMar>
+              <w:top w:type="dxa" w:w="60"/>
+              <w:left w:type="dxa" w:w="100"/>
+              <w:bottom w:type="dxa" w:w="60"/>
+              <w:right w:type="dxa" w:w="100"/>
+            </w:tcMar>
+          </w:tcPr>
+          <w:p>
+            <w:r>
+              <w:rPr>
+                <w:b/>
+                <w:bCs/>
+                <w:sz w:val="20"/>
+                <w:szCs w:val="20"/>
+              </w:rPr>
+              <w:t xml:space="preserve">O que faz</w:t>
+            </w:r>
+          </w:p>
+        </w:tc>
+      </w:tr>
+      <w:tr>
+        <w:trPr>
+          <w:cantSplit/>
+        </w:trPr>
+        <w:tc>
+          <w:tcPr>
+            <w:tcW w:type="dxa" w:w="3628"/>
+            <w:tcBorders>
+              <w:top w:val="single" w:color="BFBFBF" w:sz="4"/>
+              <w:left w:val="single" w:color="BFBFBF" w:sz="4"/>
+              <w:bottom w:val="single" w:color="BFBFBF" w:sz="4"/>
+              <w:right w:val="single" w:color="BFBFBF" w:sz="4"/>
+            </w:tcBorders>
+            <w:tcMar>
+              <w:top w:type="dxa" w:w="60"/>
+              <w:left w:type="dxa" w:w="100"/>
+              <w:bottom w:type="dxa" w:w="60"/>
+              <w:right w:type="dxa" w:w="100"/>
+            </w:tcMar>
+          </w:tcPr>
+          <w:p>
+            <w:r>
+              <w:rPr>
+                <w:rFonts w:ascii="Consolas" w:cs="Consolas" w:eastAsia="Consolas" w:hAnsi="Consolas"/>
+                <w:sz w:val="20"/>
+                <w:szCs w:val="20"/>
+              </w:rPr>
+              <w:t xml:space="preserve">GET /</w:t>
+            </w:r>
+          </w:p>
+        </w:tc>
+        <w:tc>
+          <w:tcPr>
+            <w:tcW w:type="dxa" w:w="5443"/>
+            <w:tcBorders>
+              <w:top w:val="single" w:color="BFBFBF" w:sz="4"/>
+              <w:left w:val="single" w:color="BFBFBF" w:sz="4"/>
+              <w:bottom w:val="single" w:color="BFBFBF" w:sz="4"/>
+              <w:right w:val="single" w:color="BFBFBF" w:sz="4"/>
+            </w:tcBorders>
+            <w:tcMar>
+              <w:top w:type="dxa" w:w="60"/>
+              <w:left w:type="dxa" w:w="100"/>
+              <w:bottom w:type="dxa" w:w="60"/>
+              <w:right w:type="dxa" w:w="100"/>
+            </w:tcMar>
+          </w:tcPr>
+          <w:p>
+            <w:r>
+              <w:rPr>
+                <w:sz w:val="20"/>
+                <w:szCs w:val="20"/>
+              </w:rPr>
+              <w:t xml:space="preserve">Página inicial, com o modelo configurado</w:t>
+            </w:r>
+          </w:p>
+        </w:tc>
+      </w:tr>
+      <w:tr>
+        <w:trPr>
+          <w:cantSplit/>
+        </w:trPr>
+        <w:tc>
+          <w:tcPr>
+            <w:tcW w:type="dxa" w:w="3628"/>
+            <w:tcBorders>
+              <w:top w:val="single" w:color="BFBFBF" w:sz="4"/>
+              <w:left w:val="single" w:color="BFBFBF" w:sz="4"/>
+              <w:bottom w:val="single" w:color="BFBFBF" w:sz="4"/>
+              <w:right w:val="single" w:color="BFBFBF" w:sz="4"/>
+            </w:tcBorders>
+            <w:tcMar>
+              <w:top w:type="dxa" w:w="60"/>
+              <w:left w:type="dxa" w:w="100"/>
+              <w:bottom w:type="dxa" w:w="60"/>
+              <w:right w:type="dxa" w:w="100"/>
+            </w:tcMar>
+          </w:tcPr>
+          <w:p>
+            <w:r>
+              <w:rPr>
+                <w:rFonts w:ascii="Consolas" w:cs="Consolas" w:eastAsia="Consolas" w:hAnsi="Consolas"/>
+                <w:sz w:val="20"/>
+                <w:szCs w:val="20"/>
+              </w:rPr>
+              <w:t xml:space="preserve">GET /saude</w:t>
+            </w:r>
+          </w:p>
+        </w:tc>
+        <w:tc>
+          <w:tcPr>
+            <w:tcW w:type="dxa" w:w="5443"/>
+            <w:tcBorders>
+              <w:top w:val="single" w:color="BFBFBF" w:sz="4"/>
+              <w:left w:val="single" w:color="BFBFBF" w:sz="4"/>
+              <w:bottom w:val="single" w:color="BFBFBF" w:sz="4"/>
+              <w:right w:val="single" w:color="BFBFBF" w:sz="4"/>
+            </w:tcBorders>
+            <w:tcMar>
+              <w:top w:type="dxa" w:w="60"/>
+              <w:left w:type="dxa" w:w="100"/>
+              <w:bottom w:type="dxa" w:w="60"/>
+              <w:right w:type="dxa" w:w="100"/>
+            </w:tcMar>
+          </w:tcPr>
+          <w:p>
+            <w:r>
+              <w:rPr>
+                <w:sz w:val="20"/>
+                <w:szCs w:val="20"/>
+              </w:rPr>
+              <w:t xml:space="preserve">Verificação rápida de que o servidor está no ar</w:t>
+            </w:r>
+          </w:p>
+        </w:tc>
+      </w:tr>
+    </w:tbl>
+    <w:p>
+      <w:pPr>
+        <w:spacing w:after="120"/>
+      </w:pPr>
+    </w:p>
+    <w:p>
+      <w:pPr>
+        <w:pStyle w:val="Heading2"/>
+      </w:pPr>
+      <w:r>
+        <w:t xml:space="preserve">4.14 Requisição de teste: scripts/teste_requisicao.py</w:t>
       </w:r>
     </w:p>
     <w:p>
@@ -16065,7 +17733,7 @@
         <w:pStyle w:val="Heading2"/>
       </w:pPr>
       <w:r>
-        <w:t xml:space="preserve">4.12 Importador do ENEM: scripts/importar_enem.py</w:t>
+        <w:t xml:space="preserve">4.15 Importador do ENEM: scripts/importar_enem.py</w:t>
       </w:r>
     </w:p>
     <w:p>
@@ -18697,7 +20365,7 @@
         <w:t xml:space="preserve">pytest</w:t>
       </w:r>
       <w:r>
-        <w:t xml:space="preserve"> e não acessam a internet nem gastam crédito: a API da OpenAI e a API do ENEM são substituídas por versões falsas que devolvem respostas controladas. Total nesta versão: 32 testes.</w:t>
+        <w:t xml:space="preserve"> e não acessam a internet nem gastam crédito: a API da OpenAI e a API do ENEM são substituídas por versões falsas que devolvem respostas controladas. Total nesta versão: 62 testes.</w:t>
       </w:r>
     </w:p>
     <w:tbl>
@@ -19038,6 +20706,64 @@
                 <w:sz w:val="20"/>
                 <w:szCs w:val="20"/>
               </w:rPr>
+              <w:t xml:space="preserve">tests/test_discursiva.py</w:t>
+            </w:r>
+          </w:p>
+        </w:tc>
+        <w:tc>
+          <w:tcPr>
+            <w:tcW w:type="dxa" w:w="6350"/>
+            <w:tcBorders>
+              <w:top w:val="single" w:color="BFBFBF" w:sz="4"/>
+              <w:left w:val="single" w:color="BFBFBF" w:sz="4"/>
+              <w:bottom w:val="single" w:color="BFBFBF" w:sz="4"/>
+              <w:right w:val="single" w:color="BFBFBF" w:sz="4"/>
+            </w:tcBorders>
+            <w:tcMar>
+              <w:top w:type="dxa" w:w="60"/>
+              <w:left w:type="dxa" w:w="100"/>
+              <w:bottom w:type="dxa" w:w="60"/>
+              <w:right w:type="dxa" w:w="100"/>
+            </w:tcMar>
+          </w:tcPr>
+          <w:p>
+            <w:r>
+              <w:rPr>
+                <w:sz w:val="20"/>
+                <w:szCs w:val="20"/>
+              </w:rPr>
+              <w:t xml:space="preserve">Trecho citado (seis casos, incluindo paráfrase e ordem invertida); prompt nas duas condições, sem vazar a resposta esperada; condição gravada na correção e na métrica; condição indisponível; sete tipos de saída inconsistente; critérios livres sem rubrica; cadastro válido e inválido; registro de resposta; correção pela página com nota como sugestão; falhas exibidas</w:t>
+            </w:r>
+          </w:p>
+        </w:tc>
+      </w:tr>
+      <w:tr>
+        <w:trPr>
+          <w:cantSplit/>
+        </w:trPr>
+        <w:tc>
+          <w:tcPr>
+            <w:tcW w:type="dxa" w:w="2721"/>
+            <w:tcBorders>
+              <w:top w:val="single" w:color="BFBFBF" w:sz="4"/>
+              <w:left w:val="single" w:color="BFBFBF" w:sz="4"/>
+              <w:bottom w:val="single" w:color="BFBFBF" w:sz="4"/>
+              <w:right w:val="single" w:color="BFBFBF" w:sz="4"/>
+            </w:tcBorders>
+            <w:tcMar>
+              <w:top w:type="dxa" w:w="60"/>
+              <w:left w:type="dxa" w:w="100"/>
+              <w:bottom w:type="dxa" w:w="60"/>
+              <w:right w:type="dxa" w:w="100"/>
+            </w:tcMar>
+          </w:tcPr>
+          <w:p>
+            <w:r>
+              <w:rPr>
+                <w:rFonts w:ascii="Consolas" w:cs="Consolas" w:eastAsia="Consolas" w:hAnsi="Consolas"/>
+                <w:sz w:val="20"/>
+                <w:szCs w:val="20"/>
+              </w:rPr>
               <w:t xml:space="preserve">tests/test_importar_enem.py</w:t>
             </w:r>
           </w:p>
@@ -19993,6 +21719,177 @@
                 <w:sz w:val="20"/>
                 <w:szCs w:val="20"/>
               </w:rPr>
+              <w:t xml:space="preserve">Mesmo prompt nas duas condições, mudando só o campo da resposta esperada</w:t>
+            </w:r>
+          </w:p>
+        </w:tc>
+        <w:tc>
+          <w:tcPr>
+            <w:tcW w:type="dxa" w:w="5443"/>
+            <w:tcBorders>
+              <w:top w:val="single" w:color="BFBFBF" w:sz="4"/>
+              <w:left w:val="single" w:color="BFBFBF" w:sz="4"/>
+              <w:bottom w:val="single" w:color="BFBFBF" w:sz="4"/>
+              <w:right w:val="single" w:color="BFBFBF" w:sz="4"/>
+            </w:tcBorders>
+            <w:tcMar>
+              <w:top w:type="dxa" w:w="60"/>
+              <w:left w:type="dxa" w:w="100"/>
+              <w:bottom w:type="dxa" w:w="60"/>
+              <w:right w:type="dxa" w:w="100"/>
+            </w:tcMar>
+          </w:tcPr>
+          <w:p>
+            <w:r>
+              <w:rPr>
+                <w:sz w:val="20"/>
+                <w:szCs w:val="20"/>
+              </w:rPr>
+              <w:t xml:space="preserve">A diferença entre as condições fica restrita ao insumo do professor, o que torna a comparação válida</w:t>
+            </w:r>
+          </w:p>
+        </w:tc>
+      </w:tr>
+      <w:tr>
+        <w:trPr>
+          <w:cantSplit/>
+        </w:trPr>
+        <w:tc>
+          <w:tcPr>
+            <w:tcW w:type="dxa" w:w="3628"/>
+            <w:tcBorders>
+              <w:top w:val="single" w:color="BFBFBF" w:sz="4"/>
+              <w:left w:val="single" w:color="BFBFBF" w:sz="4"/>
+              <w:bottom w:val="single" w:color="BFBFBF" w:sz="4"/>
+              <w:right w:val="single" w:color="BFBFBF" w:sz="4"/>
+            </w:tcBorders>
+            <w:tcMar>
+              <w:top w:type="dxa" w:w="60"/>
+              <w:left w:type="dxa" w:w="100"/>
+              <w:bottom w:type="dxa" w:w="60"/>
+              <w:right w:type="dxa" w:w="100"/>
+            </w:tcMar>
+          </w:tcPr>
+          <w:p>
+            <w:r>
+              <w:rPr>
+                <w:sz w:val="20"/>
+                <w:szCs w:val="20"/>
+              </w:rPr>
+              <w:t xml:space="preserve">Trecho citado conferido na resposta do aluno</w:t>
+            </w:r>
+          </w:p>
+        </w:tc>
+        <w:tc>
+          <w:tcPr>
+            <w:tcW w:type="dxa" w:w="5443"/>
+            <w:tcBorders>
+              <w:top w:val="single" w:color="BFBFBF" w:sz="4"/>
+              <w:left w:val="single" w:color="BFBFBF" w:sz="4"/>
+              <w:bottom w:val="single" w:color="BFBFBF" w:sz="4"/>
+              <w:right w:val="single" w:color="BFBFBF" w:sz="4"/>
+            </w:tcBorders>
+            <w:tcMar>
+              <w:top w:type="dxa" w:w="60"/>
+              <w:left w:type="dxa" w:w="100"/>
+              <w:bottom w:type="dxa" w:w="60"/>
+              <w:right w:type="dxa" w:w="100"/>
+            </w:tcMar>
+          </w:tcPr>
+          <w:p>
+            <w:r>
+              <w:rPr>
+                <w:sz w:val="20"/>
+                <w:szCs w:val="20"/>
+              </w:rPr>
+              <w:t xml:space="preserve">Um trecho inventado é uma alucinação e tornaria o feedback enganoso</w:t>
+            </w:r>
+          </w:p>
+        </w:tc>
+      </w:tr>
+      <w:tr>
+        <w:trPr>
+          <w:cantSplit/>
+        </w:trPr>
+        <w:tc>
+          <w:tcPr>
+            <w:tcW w:type="dxa" w:w="3628"/>
+            <w:tcBorders>
+              <w:top w:val="single" w:color="BFBFBF" w:sz="4"/>
+              <w:left w:val="single" w:color="BFBFBF" w:sz="4"/>
+              <w:bottom w:val="single" w:color="BFBFBF" w:sz="4"/>
+              <w:right w:val="single" w:color="BFBFBF" w:sz="4"/>
+            </w:tcBorders>
+            <w:tcMar>
+              <w:top w:type="dxa" w:w="60"/>
+              <w:left w:type="dxa" w:w="100"/>
+              <w:bottom w:type="dxa" w:w="60"/>
+              <w:right w:type="dxa" w:w="100"/>
+            </w:tcMar>
+          </w:tcPr>
+          <w:p>
+            <w:r>
+              <w:rPr>
+                <w:sz w:val="20"/>
+                <w:szCs w:val="20"/>
+              </w:rPr>
+              <w:t xml:space="preserve">Nota calculada pelos pesos da rubrica</w:t>
+            </w:r>
+          </w:p>
+        </w:tc>
+        <w:tc>
+          <w:tcPr>
+            <w:tcW w:type="dxa" w:w="5443"/>
+            <w:tcBorders>
+              <w:top w:val="single" w:color="BFBFBF" w:sz="4"/>
+              <w:left w:val="single" w:color="BFBFBF" w:sz="4"/>
+              <w:bottom w:val="single" w:color="BFBFBF" w:sz="4"/>
+              <w:right w:val="single" w:color="BFBFBF" w:sz="4"/>
+            </w:tcBorders>
+            <w:tcMar>
+              <w:top w:type="dxa" w:w="60"/>
+              <w:left w:type="dxa" w:w="100"/>
+              <w:bottom w:type="dxa" w:w="60"/>
+              <w:right w:type="dxa" w:w="100"/>
+            </w:tcMar>
+          </w:tcPr>
+          <w:p>
+            <w:r>
+              <w:rPr>
+                <w:sz w:val="20"/>
+                <w:szCs w:val="20"/>
+              </w:rPr>
+              <w:t xml:space="preserve">Torna a nota sugerida explicável e verificável pelo professor a partir da análise por critério</w:t>
+            </w:r>
+          </w:p>
+        </w:tc>
+      </w:tr>
+      <w:tr>
+        <w:trPr>
+          <w:cantSplit/>
+        </w:trPr>
+        <w:tc>
+          <w:tcPr>
+            <w:tcW w:type="dxa" w:w="3628"/>
+            <w:tcBorders>
+              <w:top w:val="single" w:color="BFBFBF" w:sz="4"/>
+              <w:left w:val="single" w:color="BFBFBF" w:sz="4"/>
+              <w:bottom w:val="single" w:color="BFBFBF" w:sz="4"/>
+              <w:right w:val="single" w:color="BFBFBF" w:sz="4"/>
+            </w:tcBorders>
+            <w:tcMar>
+              <w:top w:type="dxa" w:w="60"/>
+              <w:left w:type="dxa" w:w="100"/>
+              <w:bottom w:type="dxa" w:w="60"/>
+              <w:right w:type="dxa" w:w="100"/>
+            </w:tcMar>
+          </w:tcPr>
+          <w:p>
+            <w:r>
+              <w:rPr>
+                <w:sz w:val="20"/>
+                <w:szCs w:val="20"/>
+              </w:rPr>
               <w:t xml:space="preserve">Tipo de erro em categoria fechada</w:t>
             </w:r>
           </w:p>
@@ -20303,6 +22200,26 @@
       </w:r>
       <w:r>
         <w:t xml:space="preserve"> ainda permite mais de uma revisão para a mesma correção. A restrição será incluída na etapa 4.</w:t>
+      </w:r>
+    </w:p>
+    <w:p>
+      <w:pPr>
+        <w:pStyle w:val="ListParagraph"/>
+        <w:numPr>
+          <w:ilvl w:val="0"/>
+          <w:numId w:val="5"/>
+        </w:numPr>
+        <w:spacing w:after="80" w:line="290"/>
+      </w:pPr>
+      <w:r>
+        <w:rPr>
+          <w:b/>
+          <w:bCs/>
+        </w:rPr>
+        <w:t xml:space="preserve">Critérios sem rubrica:</w:t>
+      </w:r>
+      <w:r>
+        <w:t xml:space="preserve"> quando o professor não informa rubrica, o modelo define os critérios a cada correção, e eles podem variar entre correções da mesma questão. Para comparar condições, o corpus deve usar questões com rubrica.</w:t>
       </w:r>
     </w:p>
     <w:p>
@@ -20934,6 +22851,63 @@
                 <w:sz w:val="20"/>
                 <w:szCs w:val="20"/>
               </w:rPr>
+              <w:t xml:space="preserve">Condição experimental</w:t>
+            </w:r>
+          </w:p>
+        </w:tc>
+        <w:tc>
+          <w:tcPr>
+            <w:tcW w:type="dxa" w:w="6350"/>
+            <w:tcBorders>
+              <w:top w:val="single" w:color="BFBFBF" w:sz="4"/>
+              <w:left w:val="single" w:color="BFBFBF" w:sz="4"/>
+              <w:bottom w:val="single" w:color="BFBFBF" w:sz="4"/>
+              <w:right w:val="single" w:color="BFBFBF" w:sz="4"/>
+            </w:tcBorders>
+            <w:tcMar>
+              <w:top w:type="dxa" w:w="60"/>
+              <w:left w:type="dxa" w:w="100"/>
+              <w:bottom w:type="dxa" w:w="60"/>
+              <w:right w:type="dxa" w:w="100"/>
+            </w:tcMar>
+          </w:tcPr>
+          <w:p>
+            <w:r>
+              <w:rPr>
+                <w:sz w:val="20"/>
+                <w:szCs w:val="20"/>
+              </w:rPr>
+              <w:t xml:space="preserve">Cada uma das formas de rodar a correção comparadas na pesquisa: com e sem resposta esperada</w:t>
+            </w:r>
+          </w:p>
+        </w:tc>
+      </w:tr>
+      <w:tr>
+        <w:trPr>
+          <w:cantSplit/>
+        </w:trPr>
+        <w:tc>
+          <w:tcPr>
+            <w:tcW w:type="dxa" w:w="2721"/>
+            <w:tcBorders>
+              <w:top w:val="single" w:color="BFBFBF" w:sz="4"/>
+              <w:left w:val="single" w:color="BFBFBF" w:sz="4"/>
+              <w:bottom w:val="single" w:color="BFBFBF" w:sz="4"/>
+              <w:right w:val="single" w:color="BFBFBF" w:sz="4"/>
+            </w:tcBorders>
+            <w:tcMar>
+              <w:top w:type="dxa" w:w="60"/>
+              <w:left w:type="dxa" w:w="100"/>
+              <w:bottom w:type="dxa" w:w="60"/>
+              <w:right w:type="dxa" w:w="100"/>
+            </w:tcMar>
+          </w:tcPr>
+          <w:p>
+            <w:r>
+              <w:rPr>
+                <w:sz w:val="20"/>
+                <w:szCs w:val="20"/>
+              </w:rPr>
               <w:t xml:space="preserve">Distrator</w:t>
             </w:r>
           </w:p>
@@ -21360,6 +23334,63 @@
                 <w:szCs w:val="20"/>
               </w:rPr>
               <w:t xml:space="preserve">Texto de instrução enviado ao modelo de linguagem</w:t>
+            </w:r>
+          </w:p>
+        </w:tc>
+      </w:tr>
+      <w:tr>
+        <w:trPr>
+          <w:cantSplit/>
+        </w:trPr>
+        <w:tc>
+          <w:tcPr>
+            <w:tcW w:type="dxa" w:w="2721"/>
+            <w:tcBorders>
+              <w:top w:val="single" w:color="BFBFBF" w:sz="4"/>
+              <w:left w:val="single" w:color="BFBFBF" w:sz="4"/>
+              <w:bottom w:val="single" w:color="BFBFBF" w:sz="4"/>
+              <w:right w:val="single" w:color="BFBFBF" w:sz="4"/>
+            </w:tcBorders>
+            <w:tcMar>
+              <w:top w:type="dxa" w:w="60"/>
+              <w:left w:type="dxa" w:w="100"/>
+              <w:bottom w:type="dxa" w:w="60"/>
+              <w:right w:type="dxa" w:w="100"/>
+            </w:tcMar>
+          </w:tcPr>
+          <w:p>
+            <w:r>
+              <w:rPr>
+                <w:sz w:val="20"/>
+                <w:szCs w:val="20"/>
+              </w:rPr>
+              <w:t xml:space="preserve">Rubrica</w:t>
+            </w:r>
+          </w:p>
+        </w:tc>
+        <w:tc>
+          <w:tcPr>
+            <w:tcW w:type="dxa" w:w="6350"/>
+            <w:tcBorders>
+              <w:top w:val="single" w:color="BFBFBF" w:sz="4"/>
+              <w:left w:val="single" w:color="BFBFBF" w:sz="4"/>
+              <w:bottom w:val="single" w:color="BFBFBF" w:sz="4"/>
+              <w:right w:val="single" w:color="BFBFBF" w:sz="4"/>
+            </w:tcBorders>
+            <w:tcMar>
+              <w:top w:type="dxa" w:w="60"/>
+              <w:left w:type="dxa" w:w="100"/>
+              <w:bottom w:type="dxa" w:w="60"/>
+              <w:right w:type="dxa" w:w="100"/>
+            </w:tcMar>
+          </w:tcPr>
+          <w:p>
+            <w:r>
+              <w:rPr>
+                <w:sz w:val="20"/>
+                <w:szCs w:val="20"/>
+              </w:rPr>
+              <w:t xml:space="preserve">Lista de critérios de correção de uma questão discursiva, cada um com seu peso na nota</w:t>
             </w:r>
           </w:p>
         </w:tc>
@@ -21927,6 +23958,115 @@
                 <w:szCs w:val="20"/>
               </w:rPr>
               <w:t xml:space="preserve">Mudança</w:t>
+            </w:r>
+          </w:p>
+        </w:tc>
+      </w:tr>
+      <w:tr>
+        <w:trPr>
+          <w:cantSplit/>
+        </w:trPr>
+        <w:tc>
+          <w:tcPr>
+            <w:tcW w:type="dxa" w:w="1511"/>
+            <w:tcBorders>
+              <w:top w:val="single" w:color="BFBFBF" w:sz="4"/>
+              <w:left w:val="single" w:color="BFBFBF" w:sz="4"/>
+              <w:bottom w:val="single" w:color="BFBFBF" w:sz="4"/>
+              <w:right w:val="single" w:color="BFBFBF" w:sz="4"/>
+            </w:tcBorders>
+            <w:tcMar>
+              <w:top w:type="dxa" w:w="60"/>
+              <w:left w:type="dxa" w:w="100"/>
+              <w:bottom w:type="dxa" w:w="60"/>
+              <w:right w:type="dxa" w:w="100"/>
+            </w:tcMar>
+          </w:tcPr>
+          <w:p>
+            <w:r>
+              <w:rPr>
+                <w:sz w:val="20"/>
+                <w:szCs w:val="20"/>
+              </w:rPr>
+              <w:t xml:space="preserve">21/10/2026</w:t>
+            </w:r>
+          </w:p>
+        </w:tc>
+        <w:tc>
+          <w:tcPr>
+            <w:tcW w:type="dxa" w:w="1209"/>
+            <w:tcBorders>
+              <w:top w:val="single" w:color="BFBFBF" w:sz="4"/>
+              <w:left w:val="single" w:color="BFBFBF" w:sz="4"/>
+              <w:bottom w:val="single" w:color="BFBFBF" w:sz="4"/>
+              <w:right w:val="single" w:color="BFBFBF" w:sz="4"/>
+            </w:tcBorders>
+            <w:tcMar>
+              <w:top w:type="dxa" w:w="60"/>
+              <w:left w:type="dxa" w:w="100"/>
+              <w:bottom w:type="dxa" w:w="60"/>
+              <w:right w:type="dxa" w:w="100"/>
+            </w:tcMar>
+          </w:tcPr>
+          <w:p>
+            <w:r>
+              <w:rPr>
+                <w:sz w:val="20"/>
+                <w:szCs w:val="20"/>
+              </w:rPr>
+              <w:t xml:space="preserve">0.5</w:t>
+            </w:r>
+          </w:p>
+        </w:tc>
+        <w:tc>
+          <w:tcPr>
+            <w:tcW w:type="dxa" w:w="2267"/>
+            <w:tcBorders>
+              <w:top w:val="single" w:color="BFBFBF" w:sz="4"/>
+              <w:left w:val="single" w:color="BFBFBF" w:sz="4"/>
+              <w:bottom w:val="single" w:color="BFBFBF" w:sz="4"/>
+              <w:right w:val="single" w:color="BFBFBF" w:sz="4"/>
+            </w:tcBorders>
+            <w:tcMar>
+              <w:top w:type="dxa" w:w="60"/>
+              <w:left w:type="dxa" w:w="100"/>
+              <w:bottom w:type="dxa" w:w="60"/>
+              <w:right w:type="dxa" w:w="100"/>
+            </w:tcMar>
+          </w:tcPr>
+          <w:p>
+            <w:r>
+              <w:rPr>
+                <w:sz w:val="20"/>
+                <w:szCs w:val="20"/>
+              </w:rPr>
+              <w:t xml:space="preserve">pull request da etapa 3</w:t>
+            </w:r>
+          </w:p>
+        </w:tc>
+        <w:tc>
+          <w:tcPr>
+            <w:tcW w:type="dxa" w:w="4084"/>
+            <w:tcBorders>
+              <w:top w:val="single" w:color="BFBFBF" w:sz="4"/>
+              <w:left w:val="single" w:color="BFBFBF" w:sz="4"/>
+              <w:bottom w:val="single" w:color="BFBFBF" w:sz="4"/>
+              <w:right w:val="single" w:color="BFBFBF" w:sz="4"/>
+            </w:tcBorders>
+            <w:tcMar>
+              <w:top w:type="dxa" w:w="60"/>
+              <w:left w:type="dxa" w:w="100"/>
+              <w:bottom w:type="dxa" w:w="60"/>
+              <w:right w:type="dxa" w:w="100"/>
+            </w:tcMar>
+          </w:tcPr>
+          <w:p>
+            <w:r>
+              <w:rPr>
+                <w:sz w:val="20"/>
+                <w:szCs w:val="20"/>
+              </w:rPr>
+              <w:t xml:space="preserve">Módulo discursivo: contrato e conferência (incluindo trecho citado), prompt discursiva_v1, cadastro com rubrica e resposta esperada opcionais, respostas de alunos e correção nas duas condições</w:t>
             </w:r>
           </w:p>
         </w:tc>
@@ -22693,7 +24833,7 @@
         <w:sz w:val="18"/>
         <w:szCs w:val="18"/>
       </w:rPr>
-      <w:t xml:space="preserve">Documentação Técnica do Protótipo, versão 0.4</w:t>
+      <w:t xml:space="preserve">Documentação Técnica do Protótipo, versão 0.5</w:t>
     </w:r>
   </w:p>
 </w:hdr>

</xml_diff>

<commit_message>
Documentação 0.6: tela de aceite e concordância
Co-Authored-By: Claude Opus 5.5 <noreply@anthropic.com>
Claude-Session: https://claude.ai/code/session_01W2sxSqc4ZdmAUWH2L8vsV2
</commit_message>
<xml_diff>
--- a/docs/Documentacao_Tecnica.docx
+++ b/docs/Documentacao_Tecnica.docx
@@ -114,7 +114,7 @@
         <w:t xml:space="preserve">Versão: </w:t>
       </w:r>
       <w:r>
-        <w:t xml:space="preserve">0.5, de 21/10/2026</w:t>
+        <w:t xml:space="preserve">0.6, de 22/10/2026</w:t>
       </w:r>
     </w:p>
     <w:p>
@@ -1122,7 +1122,7 @@
                 <w:sz w:val="20"/>
                 <w:szCs w:val="20"/>
               </w:rPr>
-              <w:t xml:space="preserve">Implementada em 21/10/2026; aguardando revisão</w:t>
+              <w:t xml:space="preserve">Implementada em 21/10/2026; em teste pelo autor</w:t>
             </w:r>
           </w:p>
         </w:tc>
@@ -1205,7 +1205,7 @@
                 <w:sz w:val="20"/>
                 <w:szCs w:val="20"/>
               </w:rPr>
-              <w:t xml:space="preserve">Pendente</w:t>
+              <w:t xml:space="preserve">Implementada em 22/10/2026; aguardando revisão</w:t>
             </w:r>
           </w:p>
         </w:tc>
@@ -2926,7 +2926,7 @@
                 <w:sz w:val="20"/>
                 <w:szCs w:val="20"/>
               </w:rPr>
-              <w:t xml:space="preserve">), página e exportação de métricas (</w:t>
+              <w:t xml:space="preserve">), números do artigo (</w:t>
             </w:r>
             <w:r>
               <w:rPr>
@@ -2934,6 +2934,21 @@
                 <w:sz w:val="20"/>
                 <w:szCs w:val="20"/>
               </w:rPr>
+              <w:t xml:space="preserve">resumo.py</w:t>
+            </w:r>
+            <w:r>
+              <w:rPr>
+                <w:sz w:val="20"/>
+                <w:szCs w:val="20"/>
+              </w:rPr>
+              <w:t xml:space="preserve">), página e exportações (</w:t>
+            </w:r>
+            <w:r>
+              <w:rPr>
+                <w:rFonts w:ascii="Consolas" w:cs="Consolas" w:eastAsia="Consolas" w:hAnsi="Consolas"/>
+                <w:sz w:val="20"/>
+                <w:szCs w:val="20"/>
+              </w:rPr>
               <w:t xml:space="preserve">router.py</w:t>
             </w:r>
             <w:r>
@@ -3102,7 +3117,37 @@
                 <w:sz w:val="20"/>
                 <w:szCs w:val="20"/>
               </w:rPr>
-              <w:t xml:space="preserve">Reservada para a tela de aceite (etapa 4)</w:t>
+              <w:t xml:space="preserve">Aceite ou ajuste da nota pelo professor: regra (</w:t>
+            </w:r>
+            <w:r>
+              <w:rPr>
+                <w:rFonts w:ascii="Consolas" w:cs="Consolas" w:eastAsia="Consolas" w:hAnsi="Consolas"/>
+                <w:sz w:val="20"/>
+                <w:szCs w:val="20"/>
+              </w:rPr>
+              <w:t xml:space="preserve">servico.py</w:t>
+            </w:r>
+            <w:r>
+              <w:rPr>
+                <w:sz w:val="20"/>
+                <w:szCs w:val="20"/>
+              </w:rPr>
+              <w:t xml:space="preserve">) e rota (</w:t>
+            </w:r>
+            <w:r>
+              <w:rPr>
+                <w:rFonts w:ascii="Consolas" w:cs="Consolas" w:eastAsia="Consolas" w:hAnsi="Consolas"/>
+                <w:sz w:val="20"/>
+                <w:szCs w:val="20"/>
+              </w:rPr>
+              <w:t xml:space="preserve">router.py</w:t>
+            </w:r>
+            <w:r>
+              <w:rPr>
+                <w:sz w:val="20"/>
+                <w:szCs w:val="20"/>
+              </w:rPr>
+              <w:t xml:space="preserve">)</w:t>
             </w:r>
           </w:p>
         </w:tc>
@@ -8258,7 +8303,7 @@
                 <w:sz w:val="20"/>
                 <w:szCs w:val="20"/>
               </w:rPr>
-              <w:t xml:space="preserve">Correção revisada</w:t>
+              <w:t xml:space="preserve">Correção revisada; única, pois cada correção recebe no máximo uma revisão</w:t>
             </w:r>
           </w:p>
         </w:tc>
@@ -16948,7 +16993,15 @@
         <w:pStyle w:val="Heading2"/>
       </w:pPr>
       <w:r>
-        <w:t xml:space="preserve">4.11 Custo: app/metricas/precos.py</w:t>
+        <w:t xml:space="preserve">4.11 Revisão do professor: app/revisao/</w:t>
+      </w:r>
+    </w:p>
+    <w:p>
+      <w:pPr>
+        <w:spacing w:after="120" w:line="300"/>
+      </w:pPr>
+      <w:r>
+        <w:t xml:space="preserve">Materializa os requisitos RF09 a RF11: a nota sugerida só vira nota final quando o professor a aceita ou informa outra, e as duas ficam gravadas lado a lado.</w:t>
       </w:r>
     </w:p>
     <w:tbl>
@@ -17057,7 +17110,7 @@
                 <w:sz w:val="20"/>
                 <w:szCs w:val="20"/>
               </w:rPr>
-              <w:t xml:space="preserve">Preco</w:t>
+              <w:t xml:space="preserve">registrar_revisao(sessao, correcao, nota_final, comentario)</w:t>
             </w:r>
           </w:p>
         </w:tc>
@@ -17083,7 +17136,7 @@
                 <w:sz w:val="20"/>
                 <w:szCs w:val="20"/>
               </w:rPr>
-              <w:t xml:space="preserve">Preços de um modelo: entrada, entrada em cache, gravação em cache e saída</w:t>
+              <w:t xml:space="preserve">Grava a decisão. Recusa correção sem nota sugerida, correção já revisada e nota fora do intervalo de zero à nota máxima</w:t>
             </w:r>
           </w:p>
         </w:tc>
@@ -17115,7 +17168,7 @@
                 <w:sz w:val="20"/>
                 <w:szCs w:val="20"/>
               </w:rPr>
-              <w:t xml:space="preserve">carregar_tabela()</w:t>
+              <w:t xml:space="preserve">revisao_da(sessao, correcao_id)</w:t>
             </w:r>
           </w:p>
         </w:tc>
@@ -17141,22 +17194,65 @@
                 <w:sz w:val="20"/>
                 <w:szCs w:val="20"/>
               </w:rPr>
-              <w:t xml:space="preserve">Lê </w:t>
-            </w:r>
+              <w:t xml:space="preserve">Devolve a revisão de uma correção, se houver</w:t>
+            </w:r>
+          </w:p>
+        </w:tc>
+      </w:tr>
+      <w:tr>
+        <w:trPr>
+          <w:cantSplit/>
+        </w:trPr>
+        <w:tc>
+          <w:tcPr>
+            <w:tcW w:type="dxa" w:w="3628"/>
+            <w:tcBorders>
+              <w:top w:val="single" w:color="BFBFBF" w:sz="4"/>
+              <w:left w:val="single" w:color="BFBFBF" w:sz="4"/>
+              <w:bottom w:val="single" w:color="BFBFBF" w:sz="4"/>
+              <w:right w:val="single" w:color="BFBFBF" w:sz="4"/>
+            </w:tcBorders>
+            <w:tcMar>
+              <w:top w:type="dxa" w:w="60"/>
+              <w:left w:type="dxa" w:w="100"/>
+              <w:bottom w:type="dxa" w:w="60"/>
+              <w:right w:type="dxa" w:w="100"/>
+            </w:tcMar>
+          </w:tcPr>
+          <w:p>
             <w:r>
               <w:rPr>
                 <w:rFonts w:ascii="Consolas" w:cs="Consolas" w:eastAsia="Consolas" w:hAnsi="Consolas"/>
                 <w:sz w:val="20"/>
                 <w:szCs w:val="20"/>
               </w:rPr>
-              <w:t xml:space="preserve">config/precos.toml</w:t>
-            </w:r>
-            <w:r>
-              <w:rPr>
-                <w:sz w:val="20"/>
-                <w:szCs w:val="20"/>
-              </w:rPr>
-              <w:t xml:space="preserve"> uma vez e guarda em memória</w:t>
+              <w:t xml:space="preserve">RevisaoInvalida</w:t>
+            </w:r>
+          </w:p>
+        </w:tc>
+        <w:tc>
+          <w:tcPr>
+            <w:tcW w:type="dxa" w:w="5443"/>
+            <w:tcBorders>
+              <w:top w:val="single" w:color="BFBFBF" w:sz="4"/>
+              <w:left w:val="single" w:color="BFBFBF" w:sz="4"/>
+              <w:bottom w:val="single" w:color="BFBFBF" w:sz="4"/>
+              <w:right w:val="single" w:color="BFBFBF" w:sz="4"/>
+            </w:tcBorders>
+            <w:tcMar>
+              <w:top w:type="dxa" w:w="60"/>
+              <w:left w:type="dxa" w:w="100"/>
+              <w:bottom w:type="dxa" w:w="60"/>
+              <w:right w:type="dxa" w:w="100"/>
+            </w:tcMar>
+          </w:tcPr>
+          <w:p>
+            <w:r>
+              <w:rPr>
+                <w:sz w:val="20"/>
+                <w:szCs w:val="20"/>
+              </w:rPr>
+              <w:t xml:space="preserve">Erro com a mensagem exibida ao professor</w:t>
             </w:r>
           </w:p>
         </w:tc>
@@ -17188,7 +17284,7 @@
                 <w:sz w:val="20"/>
                 <w:szCs w:val="20"/>
               </w:rPr>
-              <w:t xml:space="preserve">preco_do_modelo(modelo)</w:t>
+              <w:t xml:space="preserve">POST /correcoes/{id}/revisao</w:t>
             </w:r>
           </w:p>
         </w:tc>
@@ -17214,65 +17310,37 @@
                 <w:sz w:val="20"/>
                 <w:szCs w:val="20"/>
               </w:rPr>
-              <w:t xml:space="preserve">Procura pelo nome exato e, se não achar, pelo nome base (aceita sufixos de versão)</w:t>
-            </w:r>
-          </w:p>
-        </w:tc>
-      </w:tr>
-      <w:tr>
-        <w:trPr>
-          <w:cantSplit/>
-        </w:trPr>
-        <w:tc>
-          <w:tcPr>
-            <w:tcW w:type="dxa" w:w="3628"/>
-            <w:tcBorders>
-              <w:top w:val="single" w:color="BFBFBF" w:sz="4"/>
-              <w:left w:val="single" w:color="BFBFBF" w:sz="4"/>
-              <w:bottom w:val="single" w:color="BFBFBF" w:sz="4"/>
-              <w:right w:val="single" w:color="BFBFBF" w:sz="4"/>
-            </w:tcBorders>
-            <w:tcMar>
-              <w:top w:type="dxa" w:w="60"/>
-              <w:left w:type="dxa" w:w="100"/>
-              <w:bottom w:type="dxa" w:w="60"/>
-              <w:right w:type="dxa" w:w="100"/>
-            </w:tcMar>
-          </w:tcPr>
-          <w:p>
+              <w:t xml:space="preserve">Recebe a ação </w:t>
+            </w:r>
             <w:r>
               <w:rPr>
                 <w:rFonts w:ascii="Consolas" w:cs="Consolas" w:eastAsia="Consolas" w:hAnsi="Consolas"/>
                 <w:sz w:val="20"/>
                 <w:szCs w:val="20"/>
               </w:rPr>
-              <w:t xml:space="preserve">calcular_custo(...)</w:t>
-            </w:r>
-          </w:p>
-        </w:tc>
-        <w:tc>
-          <w:tcPr>
-            <w:tcW w:type="dxa" w:w="5443"/>
-            <w:tcBorders>
-              <w:top w:val="single" w:color="BFBFBF" w:sz="4"/>
-              <w:left w:val="single" w:color="BFBFBF" w:sz="4"/>
-              <w:bottom w:val="single" w:color="BFBFBF" w:sz="4"/>
-              <w:right w:val="single" w:color="BFBFBF" w:sz="4"/>
-            </w:tcBorders>
-            <w:tcMar>
-              <w:top w:type="dxa" w:w="60"/>
-              <w:left w:type="dxa" w:w="100"/>
-              <w:bottom w:type="dxa" w:w="60"/>
-              <w:right w:type="dxa" w:w="100"/>
-            </w:tcMar>
-          </w:tcPr>
-          <w:p>
-            <w:r>
-              <w:rPr>
-                <w:sz w:val="20"/>
-                <w:szCs w:val="20"/>
-              </w:rPr>
-              <w:t xml:space="preserve">Aplica a fórmula da seção 5.2; devolve vazio para modelo sem preço, em vez de inventar um valor</w:t>
+              <w:t xml:space="preserve">aceitar</w:t>
+            </w:r>
+            <w:r>
+              <w:rPr>
+                <w:sz w:val="20"/>
+                <w:szCs w:val="20"/>
+              </w:rPr>
+              <w:t xml:space="preserve"> ou </w:t>
+            </w:r>
+            <w:r>
+              <w:rPr>
+                <w:rFonts w:ascii="Consolas" w:cs="Consolas" w:eastAsia="Consolas" w:hAnsi="Consolas"/>
+                <w:sz w:val="20"/>
+                <w:szCs w:val="20"/>
+              </w:rPr>
+              <w:t xml:space="preserve">ajustar</w:t>
+            </w:r>
+            <w:r>
+              <w:rPr>
+                <w:sz w:val="20"/>
+                <w:szCs w:val="20"/>
+              </w:rPr>
+              <w:t xml:space="preserve">, a nota e o comentário, e volta para a página da resposta</w:t>
             </w:r>
           </w:p>
         </w:tc>
@@ -17285,10 +17353,125 @@
     </w:p>
     <w:p>
       <w:pPr>
+        <w:pStyle w:val="Heading3"/>
+      </w:pPr>
+      <w:r>
+        <w:t xml:space="preserve">Regras</w:t>
+      </w:r>
+    </w:p>
+    <w:p>
+      <w:pPr>
+        <w:pStyle w:val="ListParagraph"/>
+        <w:numPr>
+          <w:ilvl w:val="0"/>
+          <w:numId w:val="5"/>
+        </w:numPr>
+        <w:spacing w:after="80" w:line="290"/>
+      </w:pPr>
+      <w:r>
+        <w:rPr>
+          <w:b/>
+          <w:bCs/>
+        </w:rPr>
+        <w:t xml:space="preserve">Uma revisão por correção:</w:t>
+      </w:r>
+      <w:r>
+        <w:t xml:space="preserve"> garantida pela regra e também pelo banco, com uma restrição de unicidade. Assim, nem um clique duplo grava duas decisões.</w:t>
+      </w:r>
+    </w:p>
+    <w:p>
+      <w:pPr>
+        <w:pStyle w:val="ListParagraph"/>
+        <w:numPr>
+          <w:ilvl w:val="0"/>
+          <w:numId w:val="5"/>
+        </w:numPr>
+        <w:spacing w:after="80" w:line="290"/>
+      </w:pPr>
+      <w:r>
+        <w:rPr>
+          <w:b/>
+          <w:bCs/>
+        </w:rPr>
+        <w:t xml:space="preserve">Decisão definitiva:</w:t>
+      </w:r>
+      <w:r>
+        <w:t xml:space="preserve"> a revisão não é alterada depois. A decisão registrada é o dado da pesquisa.</w:t>
+      </w:r>
+    </w:p>
+    <w:p>
+      <w:pPr>
+        <w:pStyle w:val="ListParagraph"/>
+        <w:numPr>
+          <w:ilvl w:val="0"/>
+          <w:numId w:val="5"/>
+        </w:numPr>
+        <w:spacing w:after="80" w:line="290"/>
+      </w:pPr>
+      <w:r>
+        <w:rPr>
+          <w:b/>
+          <w:bCs/>
+        </w:rPr>
+        <w:t xml:space="preserve">Aceite calculado:</w:t>
+      </w:r>
+      <w:r>
+        <w:t xml:space="preserve"> </w:t>
+      </w:r>
+      <w:r>
+        <w:rPr>
+          <w:rFonts w:ascii="Consolas" w:cs="Consolas" w:eastAsia="Consolas" w:hAnsi="Consolas"/>
+          <w:sz w:val="20"/>
+          <w:szCs w:val="20"/>
+        </w:rPr>
+        <w:t xml:space="preserve">aceitou_sugestao</w:t>
+      </w:r>
+      <w:r>
+        <w:t xml:space="preserve"> é calculado comparando as duas notas, e não informado pela tela. Digitar a mesma nota sugerida também conta como aceite.</w:t>
+      </w:r>
+    </w:p>
+    <w:p>
+      <w:pPr>
+        <w:pStyle w:val="ListParagraph"/>
+        <w:numPr>
+          <w:ilvl w:val="0"/>
+          <w:numId w:val="5"/>
+        </w:numPr>
+        <w:spacing w:after="80" w:line="290"/>
+      </w:pPr>
+      <w:r>
+        <w:rPr>
+          <w:b/>
+          <w:bCs/>
+        </w:rPr>
+        <w:t xml:space="preserve">Proteção contra aceite por engano:</w:t>
+      </w:r>
+      <w:r>
+        <w:t xml:space="preserve"> na tela, o botão acionado pela tecla Enter é o de registrar outra nota. Clicar em aceitar com outra nota digitada é recusado, com uma mensagem que explica o que fazer.</w:t>
+      </w:r>
+    </w:p>
+    <w:p>
+      <w:pPr>
+        <w:pStyle w:val="Heading3"/>
+      </w:pPr>
+      <w:r>
+        <w:t xml:space="preserve">Na página da resposta</w:t>
+      </w:r>
+    </w:p>
+    <w:p>
+      <w:pPr>
+        <w:spacing w:after="120" w:line="300"/>
+      </w:pPr>
+      <w:r>
+        <w:t xml:space="preserve">Cada correção mostra a nota sugerida e, ao lado, a nota final: "Pendente" até a decisão, depois a nota do professor, indicando se a sugestão foi aceita ou ajustada (por exemplo, "Ajustada de 6,5 para 7,5 (+1)"). O formulário de decisão fica no fim da correção, depois da análise por critério e do feedback, para que o professor leia a justificativa antes de decidir.</w:t>
+      </w:r>
+    </w:p>
+    <w:p>
+      <w:pPr>
         <w:pStyle w:val="Heading2"/>
       </w:pPr>
       <w:r>
-        <w:t xml:space="preserve">4.12 Métricas na web: app/metricas/router.py</w:t>
+        <w:t xml:space="preserve">4.12 Custo: app/metricas/precos.py</w:t>
       </w:r>
     </w:p>
     <w:tbl>
@@ -17336,7 +17519,7 @@
                 <w:sz w:val="20"/>
                 <w:szCs w:val="20"/>
               </w:rPr>
-              <w:t xml:space="preserve">Rota</w:t>
+              <w:t xml:space="preserve">Elemento</w:t>
             </w:r>
           </w:p>
         </w:tc>
@@ -17397,7 +17580,7 @@
                 <w:sz w:val="20"/>
                 <w:szCs w:val="20"/>
               </w:rPr>
-              <w:t xml:space="preserve">GET /metricas</w:t>
+              <w:t xml:space="preserve">Preco</w:t>
             </w:r>
           </w:p>
         </w:tc>
@@ -17423,7 +17606,7 @@
                 <w:sz w:val="20"/>
                 <w:szCs w:val="20"/>
               </w:rPr>
-              <w:t xml:space="preserve">Página com as 200 requisições mais recentes</w:t>
+              <w:t xml:space="preserve">Preços de um modelo: entrada, entrada em cache, gravação em cache e saída</w:t>
             </w:r>
           </w:p>
         </w:tc>
@@ -17455,7 +17638,7 @@
                 <w:sz w:val="20"/>
                 <w:szCs w:val="20"/>
               </w:rPr>
-              <w:t xml:space="preserve">GET /metricas/exportar.csv</w:t>
+              <w:t xml:space="preserve">carregar_tabela()</w:t>
             </w:r>
           </w:p>
         </w:tc>
@@ -17481,7 +17664,138 @@
                 <w:sz w:val="20"/>
                 <w:szCs w:val="20"/>
               </w:rPr>
-              <w:t xml:space="preserve">Arquivo CSV com todas as requisições e todos os campos, para análise (RF14)</w:t>
+              <w:t xml:space="preserve">Lê </w:t>
+            </w:r>
+            <w:r>
+              <w:rPr>
+                <w:rFonts w:ascii="Consolas" w:cs="Consolas" w:eastAsia="Consolas" w:hAnsi="Consolas"/>
+                <w:sz w:val="20"/>
+                <w:szCs w:val="20"/>
+              </w:rPr>
+              <w:t xml:space="preserve">config/precos.toml</w:t>
+            </w:r>
+            <w:r>
+              <w:rPr>
+                <w:sz w:val="20"/>
+                <w:szCs w:val="20"/>
+              </w:rPr>
+              <w:t xml:space="preserve"> uma vez e guarda em memória</w:t>
+            </w:r>
+          </w:p>
+        </w:tc>
+      </w:tr>
+      <w:tr>
+        <w:trPr>
+          <w:cantSplit/>
+        </w:trPr>
+        <w:tc>
+          <w:tcPr>
+            <w:tcW w:type="dxa" w:w="3628"/>
+            <w:tcBorders>
+              <w:top w:val="single" w:color="BFBFBF" w:sz="4"/>
+              <w:left w:val="single" w:color="BFBFBF" w:sz="4"/>
+              <w:bottom w:val="single" w:color="BFBFBF" w:sz="4"/>
+              <w:right w:val="single" w:color="BFBFBF" w:sz="4"/>
+            </w:tcBorders>
+            <w:tcMar>
+              <w:top w:type="dxa" w:w="60"/>
+              <w:left w:type="dxa" w:w="100"/>
+              <w:bottom w:type="dxa" w:w="60"/>
+              <w:right w:type="dxa" w:w="100"/>
+            </w:tcMar>
+          </w:tcPr>
+          <w:p>
+            <w:r>
+              <w:rPr>
+                <w:rFonts w:ascii="Consolas" w:cs="Consolas" w:eastAsia="Consolas" w:hAnsi="Consolas"/>
+                <w:sz w:val="20"/>
+                <w:szCs w:val="20"/>
+              </w:rPr>
+              <w:t xml:space="preserve">preco_do_modelo(modelo)</w:t>
+            </w:r>
+          </w:p>
+        </w:tc>
+        <w:tc>
+          <w:tcPr>
+            <w:tcW w:type="dxa" w:w="5443"/>
+            <w:tcBorders>
+              <w:top w:val="single" w:color="BFBFBF" w:sz="4"/>
+              <w:left w:val="single" w:color="BFBFBF" w:sz="4"/>
+              <w:bottom w:val="single" w:color="BFBFBF" w:sz="4"/>
+              <w:right w:val="single" w:color="BFBFBF" w:sz="4"/>
+            </w:tcBorders>
+            <w:tcMar>
+              <w:top w:type="dxa" w:w="60"/>
+              <w:left w:type="dxa" w:w="100"/>
+              <w:bottom w:type="dxa" w:w="60"/>
+              <w:right w:type="dxa" w:w="100"/>
+            </w:tcMar>
+          </w:tcPr>
+          <w:p>
+            <w:r>
+              <w:rPr>
+                <w:sz w:val="20"/>
+                <w:szCs w:val="20"/>
+              </w:rPr>
+              <w:t xml:space="preserve">Procura pelo nome exato e, se não achar, pelo nome base (aceita sufixos de versão)</w:t>
+            </w:r>
+          </w:p>
+        </w:tc>
+      </w:tr>
+      <w:tr>
+        <w:trPr>
+          <w:cantSplit/>
+        </w:trPr>
+        <w:tc>
+          <w:tcPr>
+            <w:tcW w:type="dxa" w:w="3628"/>
+            <w:tcBorders>
+              <w:top w:val="single" w:color="BFBFBF" w:sz="4"/>
+              <w:left w:val="single" w:color="BFBFBF" w:sz="4"/>
+              <w:bottom w:val="single" w:color="BFBFBF" w:sz="4"/>
+              <w:right w:val="single" w:color="BFBFBF" w:sz="4"/>
+            </w:tcBorders>
+            <w:tcMar>
+              <w:top w:type="dxa" w:w="60"/>
+              <w:left w:type="dxa" w:w="100"/>
+              <w:bottom w:type="dxa" w:w="60"/>
+              <w:right w:type="dxa" w:w="100"/>
+            </w:tcMar>
+          </w:tcPr>
+          <w:p>
+            <w:r>
+              <w:rPr>
+                <w:rFonts w:ascii="Consolas" w:cs="Consolas" w:eastAsia="Consolas" w:hAnsi="Consolas"/>
+                <w:sz w:val="20"/>
+                <w:szCs w:val="20"/>
+              </w:rPr>
+              <w:t xml:space="preserve">calcular_custo(...)</w:t>
+            </w:r>
+          </w:p>
+        </w:tc>
+        <w:tc>
+          <w:tcPr>
+            <w:tcW w:type="dxa" w:w="5443"/>
+            <w:tcBorders>
+              <w:top w:val="single" w:color="BFBFBF" w:sz="4"/>
+              <w:left w:val="single" w:color="BFBFBF" w:sz="4"/>
+              <w:bottom w:val="single" w:color="BFBFBF" w:sz="4"/>
+              <w:right w:val="single" w:color="BFBFBF" w:sz="4"/>
+            </w:tcBorders>
+            <w:tcMar>
+              <w:top w:type="dxa" w:w="60"/>
+              <w:left w:type="dxa" w:w="100"/>
+              <w:bottom w:type="dxa" w:w="60"/>
+              <w:right w:type="dxa" w:w="100"/>
+            </w:tcMar>
+          </w:tcPr>
+          <w:p>
+            <w:r>
+              <w:rPr>
+                <w:sz w:val="20"/>
+                <w:szCs w:val="20"/>
+              </w:rPr>
+              <w:t xml:space="preserve">Aplica a fórmula da seção 5.2; devolve vazio para modelo sem preço, em vez de inventar um valor</w:t>
             </w:r>
           </w:p>
         </w:tc>
@@ -17497,8 +17811,499 @@
         <w:pStyle w:val="Heading2"/>
       </w:pPr>
       <w:r>
-        <w:t xml:space="preserve">4.13 Aplicação: app/main.py</w:t>
-      </w:r>
+        <w:t xml:space="preserve">4.13 Métricas na web: app/metricas/router.py e resumo.py</w:t>
+      </w:r>
+    </w:p>
+    <w:p>
+      <w:pPr>
+        <w:spacing w:after="120" w:line="300"/>
+      </w:pPr>
+      <w:r>
+        <w:t xml:space="preserve">O módulo </w:t>
+      </w:r>
+      <w:r>
+        <w:rPr>
+          <w:rFonts w:ascii="Consolas" w:cs="Consolas" w:eastAsia="Consolas" w:hAnsi="Consolas"/>
+          <w:sz w:val="20"/>
+          <w:szCs w:val="20"/>
+        </w:rPr>
+        <w:t xml:space="preserve">resumo.py</w:t>
+      </w:r>
+      <w:r>
+        <w:t xml:space="preserve"> calcula, direto do banco, os números previstos na especificação para a seção de Resultados.</w:t>
+      </w:r>
+    </w:p>
+    <w:tbl>
+      <w:tblPr>
+        <w:tblW w:type="dxa" w:w="9071"/>
+        <w:tblBorders>
+          <w:top w:val="single" w:color="auto" w:sz="4"/>
+          <w:left w:val="single" w:color="auto" w:sz="4"/>
+          <w:bottom w:val="single" w:color="auto" w:sz="4"/>
+          <w:right w:val="single" w:color="auto" w:sz="4"/>
+          <w:insideH w:val="single" w:color="auto" w:sz="4"/>
+          <w:insideV w:val="single" w:color="auto" w:sz="4"/>
+        </w:tblBorders>
+      </w:tblPr>
+      <w:tblGrid>
+        <w:gridCol w:w="2721"/>
+        <w:gridCol w:w="6350"/>
+      </w:tblGrid>
+      <w:tr>
+        <w:trPr>
+          <w:tblHeader/>
+        </w:trPr>
+        <w:tc>
+          <w:tcPr>
+            <w:tcW w:type="dxa" w:w="2721"/>
+            <w:tcBorders>
+              <w:top w:val="single" w:color="BFBFBF" w:sz="4"/>
+              <w:left w:val="single" w:color="BFBFBF" w:sz="4"/>
+              <w:bottom w:val="single" w:color="BFBFBF" w:sz="4"/>
+              <w:right w:val="single" w:color="BFBFBF" w:sz="4"/>
+            </w:tcBorders>
+            <w:shd w:fill="D9E2F3" w:color="auto" w:val="clear"/>
+            <w:tcMar>
+              <w:top w:type="dxa" w:w="60"/>
+              <w:left w:type="dxa" w:w="100"/>
+              <w:bottom w:type="dxa" w:w="60"/>
+              <w:right w:type="dxa" w:w="100"/>
+            </w:tcMar>
+          </w:tcPr>
+          <w:p>
+            <w:r>
+              <w:rPr>
+                <w:b/>
+                <w:bCs/>
+                <w:sz w:val="20"/>
+                <w:szCs w:val="20"/>
+              </w:rPr>
+              <w:t xml:space="preserve">Número</w:t>
+            </w:r>
+          </w:p>
+        </w:tc>
+        <w:tc>
+          <w:tcPr>
+            <w:tcW w:type="dxa" w:w="6350"/>
+            <w:tcBorders>
+              <w:top w:val="single" w:color="BFBFBF" w:sz="4"/>
+              <w:left w:val="single" w:color="BFBFBF" w:sz="4"/>
+              <w:bottom w:val="single" w:color="BFBFBF" w:sz="4"/>
+              <w:right w:val="single" w:color="BFBFBF" w:sz="4"/>
+            </w:tcBorders>
+            <w:shd w:fill="D9E2F3" w:color="auto" w:val="clear"/>
+            <w:tcMar>
+              <w:top w:type="dxa" w:w="60"/>
+              <w:left w:type="dxa" w:w="100"/>
+              <w:bottom w:type="dxa" w:w="60"/>
+              <w:right w:type="dxa" w:w="100"/>
+            </w:tcMar>
+          </w:tcPr>
+          <w:p>
+            <w:r>
+              <w:rPr>
+                <w:b/>
+                <w:bCs/>
+                <w:sz w:val="20"/>
+                <w:szCs w:val="20"/>
+              </w:rPr>
+              <w:t xml:space="preserve">Como é calculado</w:t>
+            </w:r>
+          </w:p>
+        </w:tc>
+      </w:tr>
+      <w:tr>
+        <w:trPr>
+          <w:cantSplit/>
+        </w:trPr>
+        <w:tc>
+          <w:tcPr>
+            <w:tcW w:type="dxa" w:w="2721"/>
+            <w:tcBorders>
+              <w:top w:val="single" w:color="BFBFBF" w:sz="4"/>
+              <w:left w:val="single" w:color="BFBFBF" w:sz="4"/>
+              <w:bottom w:val="single" w:color="BFBFBF" w:sz="4"/>
+              <w:right w:val="single" w:color="BFBFBF" w:sz="4"/>
+            </w:tcBorders>
+            <w:tcMar>
+              <w:top w:type="dxa" w:w="60"/>
+              <w:left w:type="dxa" w:w="100"/>
+              <w:bottom w:type="dxa" w:w="60"/>
+              <w:right w:type="dxa" w:w="100"/>
+            </w:tcMar>
+          </w:tcPr>
+          <w:p>
+            <w:r>
+              <w:rPr>
+                <w:sz w:val="20"/>
+                <w:szCs w:val="20"/>
+              </w:rPr>
+              <w:t xml:space="preserve">Taxa de falha por tipo</w:t>
+            </w:r>
+          </w:p>
+        </w:tc>
+        <w:tc>
+          <w:tcPr>
+            <w:tcW w:type="dxa" w:w="6350"/>
+            <w:tcBorders>
+              <w:top w:val="single" w:color="BFBFBF" w:sz="4"/>
+              <w:left w:val="single" w:color="BFBFBF" w:sz="4"/>
+              <w:bottom w:val="single" w:color="BFBFBF" w:sz="4"/>
+              <w:right w:val="single" w:color="BFBFBF" w:sz="4"/>
+            </w:tcBorders>
+            <w:tcMar>
+              <w:top w:type="dxa" w:w="60"/>
+              <w:left w:type="dxa" w:w="100"/>
+              <w:bottom w:type="dxa" w:w="60"/>
+              <w:right w:type="dxa" w:w="100"/>
+            </w:tcMar>
+          </w:tcPr>
+          <w:p>
+            <w:r>
+              <w:rPr>
+                <w:sz w:val="20"/>
+                <w:szCs w:val="20"/>
+              </w:rPr>
+              <w:t xml:space="preserve">Chamadas com falha divididas pelo total de chamadas do tipo</w:t>
+            </w:r>
+          </w:p>
+        </w:tc>
+      </w:tr>
+      <w:tr>
+        <w:trPr>
+          <w:cantSplit/>
+        </w:trPr>
+        <w:tc>
+          <w:tcPr>
+            <w:tcW w:type="dxa" w:w="2721"/>
+            <w:tcBorders>
+              <w:top w:val="single" w:color="BFBFBF" w:sz="4"/>
+              <w:left w:val="single" w:color="BFBFBF" w:sz="4"/>
+              <w:bottom w:val="single" w:color="BFBFBF" w:sz="4"/>
+              <w:right w:val="single" w:color="BFBFBF" w:sz="4"/>
+            </w:tcBorders>
+            <w:tcMar>
+              <w:top w:type="dxa" w:w="60"/>
+              <w:left w:type="dxa" w:w="100"/>
+              <w:bottom w:type="dxa" w:w="60"/>
+              <w:right w:type="dxa" w:w="100"/>
+            </w:tcMar>
+          </w:tcPr>
+          <w:p>
+            <w:r>
+              <w:rPr>
+                <w:sz w:val="20"/>
+                <w:szCs w:val="20"/>
+              </w:rPr>
+              <w:t xml:space="preserve">Custo médio por tipo</w:t>
+            </w:r>
+          </w:p>
+        </w:tc>
+        <w:tc>
+          <w:tcPr>
+            <w:tcW w:type="dxa" w:w="6350"/>
+            <w:tcBorders>
+              <w:top w:val="single" w:color="BFBFBF" w:sz="4"/>
+              <w:left w:val="single" w:color="BFBFBF" w:sz="4"/>
+              <w:bottom w:val="single" w:color="BFBFBF" w:sz="4"/>
+              <w:right w:val="single" w:color="BFBFBF" w:sz="4"/>
+            </w:tcBorders>
+            <w:tcMar>
+              <w:top w:type="dxa" w:w="60"/>
+              <w:left w:type="dxa" w:w="100"/>
+              <w:bottom w:type="dxa" w:w="60"/>
+              <w:right w:type="dxa" w:w="100"/>
+            </w:tcMar>
+          </w:tcPr>
+          <w:p>
+            <w:r>
+              <w:rPr>
+                <w:sz w:val="20"/>
+                <w:szCs w:val="20"/>
+              </w:rPr>
+              <w:t xml:space="preserve">Média de </w:t>
+            </w:r>
+            <w:r>
+              <w:rPr>
+                <w:rFonts w:ascii="Consolas" w:cs="Consolas" w:eastAsia="Consolas" w:hAnsi="Consolas"/>
+                <w:sz w:val="20"/>
+                <w:szCs w:val="20"/>
+              </w:rPr>
+              <w:t xml:space="preserve">custo_usd</w:t>
+            </w:r>
+            <w:r>
+              <w:rPr>
+                <w:sz w:val="20"/>
+                <w:szCs w:val="20"/>
+              </w:rPr>
+              <w:t xml:space="preserve"> das chamadas que consumiram tokens, inclusive as que falharam, porque também foram cobradas</w:t>
+            </w:r>
+          </w:p>
+        </w:tc>
+      </w:tr>
+      <w:tr>
+        <w:trPr>
+          <w:cantSplit/>
+        </w:trPr>
+        <w:tc>
+          <w:tcPr>
+            <w:tcW w:type="dxa" w:w="2721"/>
+            <w:tcBorders>
+              <w:top w:val="single" w:color="BFBFBF" w:sz="4"/>
+              <w:left w:val="single" w:color="BFBFBF" w:sz="4"/>
+              <w:bottom w:val="single" w:color="BFBFBF" w:sz="4"/>
+              <w:right w:val="single" w:color="BFBFBF" w:sz="4"/>
+            </w:tcBorders>
+            <w:tcMar>
+              <w:top w:type="dxa" w:w="60"/>
+              <w:left w:type="dxa" w:w="100"/>
+              <w:bottom w:type="dxa" w:w="60"/>
+              <w:right w:type="dxa" w:w="100"/>
+            </w:tcMar>
+          </w:tcPr>
+          <w:p>
+            <w:r>
+              <w:rPr>
+                <w:sz w:val="20"/>
+                <w:szCs w:val="20"/>
+              </w:rPr>
+              <w:t xml:space="preserve">Tempo médio por tipo</w:t>
+            </w:r>
+          </w:p>
+        </w:tc>
+        <w:tc>
+          <w:tcPr>
+            <w:tcW w:type="dxa" w:w="6350"/>
+            <w:tcBorders>
+              <w:top w:val="single" w:color="BFBFBF" w:sz="4"/>
+              <w:left w:val="single" w:color="BFBFBF" w:sz="4"/>
+              <w:bottom w:val="single" w:color="BFBFBF" w:sz="4"/>
+              <w:right w:val="single" w:color="BFBFBF" w:sz="4"/>
+            </w:tcBorders>
+            <w:tcMar>
+              <w:top w:type="dxa" w:w="60"/>
+              <w:left w:type="dxa" w:w="100"/>
+              <w:bottom w:type="dxa" w:w="60"/>
+              <w:right w:type="dxa" w:w="100"/>
+            </w:tcMar>
+          </w:tcPr>
+          <w:p>
+            <w:r>
+              <w:rPr>
+                <w:sz w:val="20"/>
+                <w:szCs w:val="20"/>
+              </w:rPr>
+              <w:t xml:space="preserve">Média de </w:t>
+            </w:r>
+            <w:r>
+              <w:rPr>
+                <w:rFonts w:ascii="Consolas" w:cs="Consolas" w:eastAsia="Consolas" w:hAnsi="Consolas"/>
+                <w:sz w:val="20"/>
+                <w:szCs w:val="20"/>
+              </w:rPr>
+              <w:t xml:space="preserve">latencia_ms</w:t>
+            </w:r>
+            <w:r>
+              <w:rPr>
+                <w:sz w:val="20"/>
+                <w:szCs w:val="20"/>
+              </w:rPr>
+              <w:t xml:space="preserve"> das chamadas com sucesso</w:t>
+            </w:r>
+          </w:p>
+        </w:tc>
+      </w:tr>
+      <w:tr>
+        <w:trPr>
+          <w:cantSplit/>
+        </w:trPr>
+        <w:tc>
+          <w:tcPr>
+            <w:tcW w:type="dxa" w:w="2721"/>
+            <w:tcBorders>
+              <w:top w:val="single" w:color="BFBFBF" w:sz="4"/>
+              <w:left w:val="single" w:color="BFBFBF" w:sz="4"/>
+              <w:bottom w:val="single" w:color="BFBFBF" w:sz="4"/>
+              <w:right w:val="single" w:color="BFBFBF" w:sz="4"/>
+            </w:tcBorders>
+            <w:tcMar>
+              <w:top w:type="dxa" w:w="60"/>
+              <w:left w:type="dxa" w:w="100"/>
+              <w:bottom w:type="dxa" w:w="60"/>
+              <w:right w:type="dxa" w:w="100"/>
+            </w:tcMar>
+          </w:tcPr>
+          <w:p>
+            <w:r>
+              <w:rPr>
+                <w:sz w:val="20"/>
+                <w:szCs w:val="20"/>
+              </w:rPr>
+              <w:t xml:space="preserve">Taxa de concordância</w:t>
+            </w:r>
+          </w:p>
+        </w:tc>
+        <w:tc>
+          <w:tcPr>
+            <w:tcW w:type="dxa" w:w="6350"/>
+            <w:tcBorders>
+              <w:top w:val="single" w:color="BFBFBF" w:sz="4"/>
+              <w:left w:val="single" w:color="BFBFBF" w:sz="4"/>
+              <w:bottom w:val="single" w:color="BFBFBF" w:sz="4"/>
+              <w:right w:val="single" w:color="BFBFBF" w:sz="4"/>
+            </w:tcBorders>
+            <w:tcMar>
+              <w:top w:type="dxa" w:w="60"/>
+              <w:left w:type="dxa" w:w="100"/>
+              <w:bottom w:type="dxa" w:w="60"/>
+              <w:right w:type="dxa" w:w="100"/>
+            </w:tcMar>
+          </w:tcPr>
+          <w:p>
+            <w:r>
+              <w:rPr>
+                <w:sz w:val="20"/>
+                <w:szCs w:val="20"/>
+              </w:rPr>
+              <w:t xml:space="preserve">Revisões com </w:t>
+            </w:r>
+            <w:r>
+              <w:rPr>
+                <w:rFonts w:ascii="Consolas" w:cs="Consolas" w:eastAsia="Consolas" w:hAnsi="Consolas"/>
+                <w:sz w:val="20"/>
+                <w:szCs w:val="20"/>
+              </w:rPr>
+              <w:t xml:space="preserve">aceitou_sugestao</w:t>
+            </w:r>
+            <w:r>
+              <w:rPr>
+                <w:sz w:val="20"/>
+                <w:szCs w:val="20"/>
+              </w:rPr>
+              <w:t xml:space="preserve"> verdadeiro divididas pelo total de revisões, no geral e por condição</w:t>
+            </w:r>
+          </w:p>
+        </w:tc>
+      </w:tr>
+      <w:tr>
+        <w:trPr>
+          <w:cantSplit/>
+        </w:trPr>
+        <w:tc>
+          <w:tcPr>
+            <w:tcW w:type="dxa" w:w="2721"/>
+            <w:tcBorders>
+              <w:top w:val="single" w:color="BFBFBF" w:sz="4"/>
+              <w:left w:val="single" w:color="BFBFBF" w:sz="4"/>
+              <w:bottom w:val="single" w:color="BFBFBF" w:sz="4"/>
+              <w:right w:val="single" w:color="BFBFBF" w:sz="4"/>
+            </w:tcBorders>
+            <w:tcMar>
+              <w:top w:type="dxa" w:w="60"/>
+              <w:left w:type="dxa" w:w="100"/>
+              <w:bottom w:type="dxa" w:w="60"/>
+              <w:right w:type="dxa" w:w="100"/>
+            </w:tcMar>
+          </w:tcPr>
+          <w:p>
+            <w:r>
+              <w:rPr>
+                <w:sz w:val="20"/>
+                <w:szCs w:val="20"/>
+              </w:rPr>
+              <w:t xml:space="preserve">Desvio médio</w:t>
+            </w:r>
+          </w:p>
+        </w:tc>
+        <w:tc>
+          <w:tcPr>
+            <w:tcW w:type="dxa" w:w="6350"/>
+            <w:tcBorders>
+              <w:top w:val="single" w:color="BFBFBF" w:sz="4"/>
+              <w:left w:val="single" w:color="BFBFBF" w:sz="4"/>
+              <w:bottom w:val="single" w:color="BFBFBF" w:sz="4"/>
+              <w:right w:val="single" w:color="BFBFBF" w:sz="4"/>
+            </w:tcBorders>
+            <w:tcMar>
+              <w:top w:type="dxa" w:w="60"/>
+              <w:left w:type="dxa" w:w="100"/>
+              <w:bottom w:type="dxa" w:w="60"/>
+              <w:right w:type="dxa" w:w="100"/>
+            </w:tcMar>
+          </w:tcPr>
+          <w:p>
+            <w:r>
+              <w:rPr>
+                <w:sz w:val="20"/>
+                <w:szCs w:val="20"/>
+              </w:rPr>
+              <w:t xml:space="preserve">Média de nota final menos nota sugerida; positivo indica que o professor deu mais que o modelo</w:t>
+            </w:r>
+          </w:p>
+        </w:tc>
+      </w:tr>
+      <w:tr>
+        <w:trPr>
+          <w:cantSplit/>
+        </w:trPr>
+        <w:tc>
+          <w:tcPr>
+            <w:tcW w:type="dxa" w:w="2721"/>
+            <w:tcBorders>
+              <w:top w:val="single" w:color="BFBFBF" w:sz="4"/>
+              <w:left w:val="single" w:color="BFBFBF" w:sz="4"/>
+              <w:bottom w:val="single" w:color="BFBFBF" w:sz="4"/>
+              <w:right w:val="single" w:color="BFBFBF" w:sz="4"/>
+            </w:tcBorders>
+            <w:tcMar>
+              <w:top w:type="dxa" w:w="60"/>
+              <w:left w:type="dxa" w:w="100"/>
+              <w:bottom w:type="dxa" w:w="60"/>
+              <w:right w:type="dxa" w:w="100"/>
+            </w:tcMar>
+          </w:tcPr>
+          <w:p>
+            <w:r>
+              <w:rPr>
+                <w:sz w:val="20"/>
+                <w:szCs w:val="20"/>
+              </w:rPr>
+              <w:t xml:space="preserve">Desvio absoluto médio</w:t>
+            </w:r>
+          </w:p>
+        </w:tc>
+        <w:tc>
+          <w:tcPr>
+            <w:tcW w:type="dxa" w:w="6350"/>
+            <w:tcBorders>
+              <w:top w:val="single" w:color="BFBFBF" w:sz="4"/>
+              <w:left w:val="single" w:color="BFBFBF" w:sz="4"/>
+              <w:bottom w:val="single" w:color="BFBFBF" w:sz="4"/>
+              <w:right w:val="single" w:color="BFBFBF" w:sz="4"/>
+            </w:tcBorders>
+            <w:tcMar>
+              <w:top w:type="dxa" w:w="60"/>
+              <w:left w:type="dxa" w:w="100"/>
+              <w:bottom w:type="dxa" w:w="60"/>
+              <w:right w:type="dxa" w:w="100"/>
+            </w:tcMar>
+          </w:tcPr>
+          <w:p>
+            <w:r>
+              <w:rPr>
+                <w:sz w:val="20"/>
+                <w:szCs w:val="20"/>
+              </w:rPr>
+              <w:t xml:space="preserve">Média do valor absoluto da diferença; mostra o tamanho do ajuste, sem que ajustes para cima e para baixo se anulem</w:t>
+            </w:r>
+          </w:p>
+        </w:tc>
+      </w:tr>
+    </w:tbl>
+    <w:p>
+      <w:pPr>
+        <w:spacing w:after="120"/>
+      </w:pPr>
     </w:p>
     <w:tbl>
       <w:tblPr>
@@ -17606,7 +18411,7 @@
                 <w:sz w:val="20"/>
                 <w:szCs w:val="20"/>
               </w:rPr>
-              <w:t xml:space="preserve">GET /</w:t>
+              <w:t xml:space="preserve">GET /metricas</w:t>
             </w:r>
           </w:p>
         </w:tc>
@@ -17632,7 +18437,7 @@
                 <w:sz w:val="20"/>
                 <w:szCs w:val="20"/>
               </w:rPr>
-              <w:t xml:space="preserve">Página inicial, com o modelo configurado</w:t>
+              <w:t xml:space="preserve">Resumo das chamadas por tipo, concordância por condição e as 200 requisições mais recentes</w:t>
             </w:r>
           </w:p>
         </w:tc>
@@ -17664,7 +18469,7 @@
                 <w:sz w:val="20"/>
                 <w:szCs w:val="20"/>
               </w:rPr>
-              <w:t xml:space="preserve">GET /saude</w:t>
+              <w:t xml:space="preserve">GET /metricas/exportar.csv</w:t>
             </w:r>
           </w:p>
         </w:tc>
@@ -17690,7 +18495,65 @@
                 <w:sz w:val="20"/>
                 <w:szCs w:val="20"/>
               </w:rPr>
-              <w:t xml:space="preserve">Verificação rápida de que o servidor está no ar</w:t>
+              <w:t xml:space="preserve">Arquivo CSV com todas as requisições e todos os campos, para análise (RF14)</w:t>
+            </w:r>
+          </w:p>
+        </w:tc>
+      </w:tr>
+      <w:tr>
+        <w:trPr>
+          <w:cantSplit/>
+        </w:trPr>
+        <w:tc>
+          <w:tcPr>
+            <w:tcW w:type="dxa" w:w="3628"/>
+            <w:tcBorders>
+              <w:top w:val="single" w:color="BFBFBF" w:sz="4"/>
+              <w:left w:val="single" w:color="BFBFBF" w:sz="4"/>
+              <w:bottom w:val="single" w:color="BFBFBF" w:sz="4"/>
+              <w:right w:val="single" w:color="BFBFBF" w:sz="4"/>
+            </w:tcBorders>
+            <w:tcMar>
+              <w:top w:type="dxa" w:w="60"/>
+              <w:left w:type="dxa" w:w="100"/>
+              <w:bottom w:type="dxa" w:w="60"/>
+              <w:right w:type="dxa" w:w="100"/>
+            </w:tcMar>
+          </w:tcPr>
+          <w:p>
+            <w:r>
+              <w:rPr>
+                <w:rFonts w:ascii="Consolas" w:cs="Consolas" w:eastAsia="Consolas" w:hAnsi="Consolas"/>
+                <w:sz w:val="20"/>
+                <w:szCs w:val="20"/>
+              </w:rPr>
+              <w:t xml:space="preserve">GET /metricas/revisoes.csv</w:t>
+            </w:r>
+          </w:p>
+        </w:tc>
+        <w:tc>
+          <w:tcPr>
+            <w:tcW w:type="dxa" w:w="5443"/>
+            <w:tcBorders>
+              <w:top w:val="single" w:color="BFBFBF" w:sz="4"/>
+              <w:left w:val="single" w:color="BFBFBF" w:sz="4"/>
+              <w:bottom w:val="single" w:color="BFBFBF" w:sz="4"/>
+              <w:right w:val="single" w:color="BFBFBF" w:sz="4"/>
+            </w:tcBorders>
+            <w:tcMar>
+              <w:top w:type="dxa" w:w="60"/>
+              <w:left w:type="dxa" w:w="100"/>
+              <w:bottom w:type="dxa" w:w="60"/>
+              <w:right w:type="dxa" w:w="100"/>
+            </w:tcMar>
+          </w:tcPr>
+          <w:p>
+            <w:r>
+              <w:rPr>
+                <w:sz w:val="20"/>
+                <w:szCs w:val="20"/>
+              </w:rPr>
+              <w:t xml:space="preserve">Arquivo CSV com uma linha por revisão: resposta, origem, condição, prompt, nota sugerida, nota final, aceite e diferença</w:t>
             </w:r>
           </w:p>
         </w:tc>
@@ -17706,7 +18569,216 @@
         <w:pStyle w:val="Heading2"/>
       </w:pPr>
       <w:r>
-        <w:t xml:space="preserve">4.14 Requisição de teste: scripts/teste_requisicao.py</w:t>
+        <w:t xml:space="preserve">4.14 Aplicação: app/main.py</w:t>
+      </w:r>
+    </w:p>
+    <w:tbl>
+      <w:tblPr>
+        <w:tblW w:type="dxa" w:w="9071"/>
+        <w:tblBorders>
+          <w:top w:val="single" w:color="auto" w:sz="4"/>
+          <w:left w:val="single" w:color="auto" w:sz="4"/>
+          <w:bottom w:val="single" w:color="auto" w:sz="4"/>
+          <w:right w:val="single" w:color="auto" w:sz="4"/>
+          <w:insideH w:val="single" w:color="auto" w:sz="4"/>
+          <w:insideV w:val="single" w:color="auto" w:sz="4"/>
+        </w:tblBorders>
+      </w:tblPr>
+      <w:tblGrid>
+        <w:gridCol w:w="3628"/>
+        <w:gridCol w:w="5443"/>
+      </w:tblGrid>
+      <w:tr>
+        <w:trPr>
+          <w:tblHeader/>
+        </w:trPr>
+        <w:tc>
+          <w:tcPr>
+            <w:tcW w:type="dxa" w:w="3628"/>
+            <w:tcBorders>
+              <w:top w:val="single" w:color="BFBFBF" w:sz="4"/>
+              <w:left w:val="single" w:color="BFBFBF" w:sz="4"/>
+              <w:bottom w:val="single" w:color="BFBFBF" w:sz="4"/>
+              <w:right w:val="single" w:color="BFBFBF" w:sz="4"/>
+            </w:tcBorders>
+            <w:shd w:fill="D9E2F3" w:color="auto" w:val="clear"/>
+            <w:tcMar>
+              <w:top w:type="dxa" w:w="60"/>
+              <w:left w:type="dxa" w:w="100"/>
+              <w:bottom w:type="dxa" w:w="60"/>
+              <w:right w:type="dxa" w:w="100"/>
+            </w:tcMar>
+          </w:tcPr>
+          <w:p>
+            <w:r>
+              <w:rPr>
+                <w:b/>
+                <w:bCs/>
+                <w:sz w:val="20"/>
+                <w:szCs w:val="20"/>
+              </w:rPr>
+              <w:t xml:space="preserve">Rota</w:t>
+            </w:r>
+          </w:p>
+        </w:tc>
+        <w:tc>
+          <w:tcPr>
+            <w:tcW w:type="dxa" w:w="5443"/>
+            <w:tcBorders>
+              <w:top w:val="single" w:color="BFBFBF" w:sz="4"/>
+              <w:left w:val="single" w:color="BFBFBF" w:sz="4"/>
+              <w:bottom w:val="single" w:color="BFBFBF" w:sz="4"/>
+              <w:right w:val="single" w:color="BFBFBF" w:sz="4"/>
+            </w:tcBorders>
+            <w:shd w:fill="D9E2F3" w:color="auto" w:val="clear"/>
+            <w:tcMar>
+              <w:top w:type="dxa" w:w="60"/>
+              <w:left w:type="dxa" w:w="100"/>
+              <w:bottom w:type="dxa" w:w="60"/>
+              <w:right w:type="dxa" w:w="100"/>
+            </w:tcMar>
+          </w:tcPr>
+          <w:p>
+            <w:r>
+              <w:rPr>
+                <w:b/>
+                <w:bCs/>
+                <w:sz w:val="20"/>
+                <w:szCs w:val="20"/>
+              </w:rPr>
+              <w:t xml:space="preserve">O que faz</w:t>
+            </w:r>
+          </w:p>
+        </w:tc>
+      </w:tr>
+      <w:tr>
+        <w:trPr>
+          <w:cantSplit/>
+        </w:trPr>
+        <w:tc>
+          <w:tcPr>
+            <w:tcW w:type="dxa" w:w="3628"/>
+            <w:tcBorders>
+              <w:top w:val="single" w:color="BFBFBF" w:sz="4"/>
+              <w:left w:val="single" w:color="BFBFBF" w:sz="4"/>
+              <w:bottom w:val="single" w:color="BFBFBF" w:sz="4"/>
+              <w:right w:val="single" w:color="BFBFBF" w:sz="4"/>
+            </w:tcBorders>
+            <w:tcMar>
+              <w:top w:type="dxa" w:w="60"/>
+              <w:left w:type="dxa" w:w="100"/>
+              <w:bottom w:type="dxa" w:w="60"/>
+              <w:right w:type="dxa" w:w="100"/>
+            </w:tcMar>
+          </w:tcPr>
+          <w:p>
+            <w:r>
+              <w:rPr>
+                <w:rFonts w:ascii="Consolas" w:cs="Consolas" w:eastAsia="Consolas" w:hAnsi="Consolas"/>
+                <w:sz w:val="20"/>
+                <w:szCs w:val="20"/>
+              </w:rPr>
+              <w:t xml:space="preserve">GET /</w:t>
+            </w:r>
+          </w:p>
+        </w:tc>
+        <w:tc>
+          <w:tcPr>
+            <w:tcW w:type="dxa" w:w="5443"/>
+            <w:tcBorders>
+              <w:top w:val="single" w:color="BFBFBF" w:sz="4"/>
+              <w:left w:val="single" w:color="BFBFBF" w:sz="4"/>
+              <w:bottom w:val="single" w:color="BFBFBF" w:sz="4"/>
+              <w:right w:val="single" w:color="BFBFBF" w:sz="4"/>
+            </w:tcBorders>
+            <w:tcMar>
+              <w:top w:type="dxa" w:w="60"/>
+              <w:left w:type="dxa" w:w="100"/>
+              <w:bottom w:type="dxa" w:w="60"/>
+              <w:right w:type="dxa" w:w="100"/>
+            </w:tcMar>
+          </w:tcPr>
+          <w:p>
+            <w:r>
+              <w:rPr>
+                <w:sz w:val="20"/>
+                <w:szCs w:val="20"/>
+              </w:rPr>
+              <w:t xml:space="preserve">Página inicial, com o modelo configurado</w:t>
+            </w:r>
+          </w:p>
+        </w:tc>
+      </w:tr>
+      <w:tr>
+        <w:trPr>
+          <w:cantSplit/>
+        </w:trPr>
+        <w:tc>
+          <w:tcPr>
+            <w:tcW w:type="dxa" w:w="3628"/>
+            <w:tcBorders>
+              <w:top w:val="single" w:color="BFBFBF" w:sz="4"/>
+              <w:left w:val="single" w:color="BFBFBF" w:sz="4"/>
+              <w:bottom w:val="single" w:color="BFBFBF" w:sz="4"/>
+              <w:right w:val="single" w:color="BFBFBF" w:sz="4"/>
+            </w:tcBorders>
+            <w:tcMar>
+              <w:top w:type="dxa" w:w="60"/>
+              <w:left w:type="dxa" w:w="100"/>
+              <w:bottom w:type="dxa" w:w="60"/>
+              <w:right w:type="dxa" w:w="100"/>
+            </w:tcMar>
+          </w:tcPr>
+          <w:p>
+            <w:r>
+              <w:rPr>
+                <w:rFonts w:ascii="Consolas" w:cs="Consolas" w:eastAsia="Consolas" w:hAnsi="Consolas"/>
+                <w:sz w:val="20"/>
+                <w:szCs w:val="20"/>
+              </w:rPr>
+              <w:t xml:space="preserve">GET /saude</w:t>
+            </w:r>
+          </w:p>
+        </w:tc>
+        <w:tc>
+          <w:tcPr>
+            <w:tcW w:type="dxa" w:w="5443"/>
+            <w:tcBorders>
+              <w:top w:val="single" w:color="BFBFBF" w:sz="4"/>
+              <w:left w:val="single" w:color="BFBFBF" w:sz="4"/>
+              <w:bottom w:val="single" w:color="BFBFBF" w:sz="4"/>
+              <w:right w:val="single" w:color="BFBFBF" w:sz="4"/>
+            </w:tcBorders>
+            <w:tcMar>
+              <w:top w:type="dxa" w:w="60"/>
+              <w:left w:type="dxa" w:w="100"/>
+              <w:bottom w:type="dxa" w:w="60"/>
+              <w:right w:type="dxa" w:w="100"/>
+            </w:tcMar>
+          </w:tcPr>
+          <w:p>
+            <w:r>
+              <w:rPr>
+                <w:sz w:val="20"/>
+                <w:szCs w:val="20"/>
+              </w:rPr>
+              <w:t xml:space="preserve">Verificação rápida de que o servidor está no ar</w:t>
+            </w:r>
+          </w:p>
+        </w:tc>
+      </w:tr>
+    </w:tbl>
+    <w:p>
+      <w:pPr>
+        <w:spacing w:after="120"/>
+      </w:pPr>
+    </w:p>
+    <w:p>
+      <w:pPr>
+        <w:pStyle w:val="Heading2"/>
+      </w:pPr>
+      <w:r>
+        <w:t xml:space="preserve">4.15 Requisição de teste: scripts/teste_requisicao.py</w:t>
       </w:r>
     </w:p>
     <w:p>
@@ -17733,7 +18805,7 @@
         <w:pStyle w:val="Heading2"/>
       </w:pPr>
       <w:r>
-        <w:t xml:space="preserve">4.15 Importador do ENEM: scripts/importar_enem.py</w:t>
+        <w:t xml:space="preserve">4.16 Importador do ENEM: scripts/importar_enem.py</w:t>
       </w:r>
     </w:p>
     <w:p>
@@ -20365,7 +21437,7 @@
         <w:t xml:space="preserve">pytest</w:t>
       </w:r>
       <w:r>
-        <w:t xml:space="preserve"> e não acessam a internet nem gastam crédito: a API da OpenAI e a API do ENEM são substituídas por versões falsas que devolvem respostas controladas. Total nesta versão: 62 testes.</w:t>
+        <w:t xml:space="preserve"> e não acessam a internet nem gastam crédito: a API da OpenAI e a API do ENEM são substituídas por versões falsas que devolvem respostas controladas. Total nesta versão: 81 testes.</w:t>
       </w:r>
     </w:p>
     <w:tbl>
@@ -20764,6 +21836,64 @@
                 <w:sz w:val="20"/>
                 <w:szCs w:val="20"/>
               </w:rPr>
+              <w:t xml:space="preserve">tests/test_revisao.py</w:t>
+            </w:r>
+          </w:p>
+        </w:tc>
+        <w:tc>
+          <w:tcPr>
+            <w:tcW w:type="dxa" w:w="6350"/>
+            <w:tcBorders>
+              <w:top w:val="single" w:color="BFBFBF" w:sz="4"/>
+              <w:left w:val="single" w:color="BFBFBF" w:sz="4"/>
+              <w:bottom w:val="single" w:color="BFBFBF" w:sz="4"/>
+              <w:right w:val="single" w:color="BFBFBF" w:sz="4"/>
+            </w:tcBorders>
+            <w:tcMar>
+              <w:top w:type="dxa" w:w="60"/>
+              <w:left w:type="dxa" w:w="100"/>
+              <w:bottom w:type="dxa" w:w="60"/>
+              <w:right w:type="dxa" w:w="100"/>
+            </w:tcMar>
+          </w:tcPr>
+          <w:p>
+            <w:r>
+              <w:rPr>
+                <w:sz w:val="20"/>
+                <w:szCs w:val="20"/>
+              </w:rPr>
+              <w:t xml:space="preserve">Aceite e ajuste; mesma nota conta como aceite; nota fora do intervalo; segunda revisão recusada pela regra e pelo banco; correção sem nota; concordância e desvios por condição; resumo vazio sem divisão por zero; resumo de chamadas; formulário e ordem dos botões; erros da revisão; exportação das revisões</w:t>
+            </w:r>
+          </w:p>
+        </w:tc>
+      </w:tr>
+      <w:tr>
+        <w:trPr>
+          <w:cantSplit/>
+        </w:trPr>
+        <w:tc>
+          <w:tcPr>
+            <w:tcW w:type="dxa" w:w="2721"/>
+            <w:tcBorders>
+              <w:top w:val="single" w:color="BFBFBF" w:sz="4"/>
+              <w:left w:val="single" w:color="BFBFBF" w:sz="4"/>
+              <w:bottom w:val="single" w:color="BFBFBF" w:sz="4"/>
+              <w:right w:val="single" w:color="BFBFBF" w:sz="4"/>
+            </w:tcBorders>
+            <w:tcMar>
+              <w:top w:type="dxa" w:w="60"/>
+              <w:left w:type="dxa" w:w="100"/>
+              <w:bottom w:type="dxa" w:w="60"/>
+              <w:right w:type="dxa" w:w="100"/>
+            </w:tcMar>
+          </w:tcPr>
+          <w:p>
+            <w:r>
+              <w:rPr>
+                <w:rFonts w:ascii="Consolas" w:cs="Consolas" w:eastAsia="Consolas" w:hAnsi="Consolas"/>
+                <w:sz w:val="20"/>
+                <w:szCs w:val="20"/>
+              </w:rPr>
               <w:t xml:space="preserve">tests/test_importar_enem.py</w:t>
             </w:r>
           </w:p>
@@ -21719,6 +22849,120 @@
                 <w:sz w:val="20"/>
                 <w:szCs w:val="20"/>
               </w:rPr>
+              <w:t xml:space="preserve">Uma revisão por correção, sem edição posterior</w:t>
+            </w:r>
+          </w:p>
+        </w:tc>
+        <w:tc>
+          <w:tcPr>
+            <w:tcW w:type="dxa" w:w="5443"/>
+            <w:tcBorders>
+              <w:top w:val="single" w:color="BFBFBF" w:sz="4"/>
+              <w:left w:val="single" w:color="BFBFBF" w:sz="4"/>
+              <w:bottom w:val="single" w:color="BFBFBF" w:sz="4"/>
+              <w:right w:val="single" w:color="BFBFBF" w:sz="4"/>
+            </w:tcBorders>
+            <w:tcMar>
+              <w:top w:type="dxa" w:w="60"/>
+              <w:left w:type="dxa" w:w="100"/>
+              <w:bottom w:type="dxa" w:w="60"/>
+              <w:right w:type="dxa" w:w="100"/>
+            </w:tcMar>
+          </w:tcPr>
+          <w:p>
+            <w:r>
+              <w:rPr>
+                <w:sz w:val="20"/>
+                <w:szCs w:val="20"/>
+              </w:rPr>
+              <w:t xml:space="preserve">A decisão registrada é o dado da pesquisa; alterá-la depois comprometeria a medida de concordância</w:t>
+            </w:r>
+          </w:p>
+        </w:tc>
+      </w:tr>
+      <w:tr>
+        <w:trPr>
+          <w:cantSplit/>
+        </w:trPr>
+        <w:tc>
+          <w:tcPr>
+            <w:tcW w:type="dxa" w:w="3628"/>
+            <w:tcBorders>
+              <w:top w:val="single" w:color="BFBFBF" w:sz="4"/>
+              <w:left w:val="single" w:color="BFBFBF" w:sz="4"/>
+              <w:bottom w:val="single" w:color="BFBFBF" w:sz="4"/>
+              <w:right w:val="single" w:color="BFBFBF" w:sz="4"/>
+            </w:tcBorders>
+            <w:tcMar>
+              <w:top w:type="dxa" w:w="60"/>
+              <w:left w:type="dxa" w:w="100"/>
+              <w:bottom w:type="dxa" w:w="60"/>
+              <w:right w:type="dxa" w:w="100"/>
+            </w:tcMar>
+          </w:tcPr>
+          <w:p>
+            <w:r>
+              <w:rPr>
+                <w:sz w:val="20"/>
+                <w:szCs w:val="20"/>
+              </w:rPr>
+              <w:t xml:space="preserve">Aceite calculado pela comparação das notas</w:t>
+            </w:r>
+          </w:p>
+        </w:tc>
+        <w:tc>
+          <w:tcPr>
+            <w:tcW w:type="dxa" w:w="5443"/>
+            <w:tcBorders>
+              <w:top w:val="single" w:color="BFBFBF" w:sz="4"/>
+              <w:left w:val="single" w:color="BFBFBF" w:sz="4"/>
+              <w:bottom w:val="single" w:color="BFBFBF" w:sz="4"/>
+              <w:right w:val="single" w:color="BFBFBF" w:sz="4"/>
+            </w:tcBorders>
+            <w:tcMar>
+              <w:top w:type="dxa" w:w="60"/>
+              <w:left w:type="dxa" w:w="100"/>
+              <w:bottom w:type="dxa" w:w="60"/>
+              <w:right w:type="dxa" w:w="100"/>
+            </w:tcMar>
+          </w:tcPr>
+          <w:p>
+            <w:r>
+              <w:rPr>
+                <w:sz w:val="20"/>
+                <w:szCs w:val="20"/>
+              </w:rPr>
+              <w:t xml:space="preserve">Evita inconsistência entre o que a tela informa e as notas gravadas</w:t>
+            </w:r>
+          </w:p>
+        </w:tc>
+      </w:tr>
+      <w:tr>
+        <w:trPr>
+          <w:cantSplit/>
+        </w:trPr>
+        <w:tc>
+          <w:tcPr>
+            <w:tcW w:type="dxa" w:w="3628"/>
+            <w:tcBorders>
+              <w:top w:val="single" w:color="BFBFBF" w:sz="4"/>
+              <w:left w:val="single" w:color="BFBFBF" w:sz="4"/>
+              <w:bottom w:val="single" w:color="BFBFBF" w:sz="4"/>
+              <w:right w:val="single" w:color="BFBFBF" w:sz="4"/>
+            </w:tcBorders>
+            <w:tcMar>
+              <w:top w:type="dxa" w:w="60"/>
+              <w:left w:type="dxa" w:w="100"/>
+              <w:bottom w:type="dxa" w:w="60"/>
+              <w:right w:type="dxa" w:w="100"/>
+            </w:tcMar>
+          </w:tcPr>
+          <w:p>
+            <w:r>
+              <w:rPr>
+                <w:sz w:val="20"/>
+                <w:szCs w:val="20"/>
+              </w:rPr>
               <w:t xml:space="preserve">Mesmo prompt nas duas condições, mudando só o campo da resposta esperada</w:t>
             </w:r>
           </w:p>
@@ -22185,21 +23429,30 @@
           <w:b/>
           <w:bCs/>
         </w:rPr>
-        <w:t xml:space="preserve">Revisão duplicada:</w:t>
-      </w:r>
-      <w:r>
-        <w:t xml:space="preserve"> a tabela </w:t>
-      </w:r>
+        <w:t xml:space="preserve">Ancoragem:</w:t>
+      </w:r>
+      <w:r>
+        <w:t xml:space="preserve"> o professor vê a nota sugerida antes de decidir, o que pode puxar a sua nota em direção à do modelo. A concordância medida é, portanto, a concordância nas condições de uso do sistema, e não uma comparação com uma correção independente. Isso deve ser declarado no artigo.</w:t>
+      </w:r>
+    </w:p>
+    <w:p>
+      <w:pPr>
+        <w:pStyle w:val="ListParagraph"/>
+        <w:numPr>
+          <w:ilvl w:val="0"/>
+          <w:numId w:val="5"/>
+        </w:numPr>
+        <w:spacing w:after="80" w:line="290"/>
+      </w:pPr>
       <w:r>
         <w:rPr>
-          <w:rFonts w:ascii="Consolas" w:cs="Consolas" w:eastAsia="Consolas" w:hAnsi="Consolas"/>
-          <w:sz w:val="20"/>
-          <w:szCs w:val="20"/>
+          <w:b/>
+          <w:bCs/>
         </w:rPr>
-        <w:t xml:space="preserve">revisao_professor</w:t>
-      </w:r>
-      <w:r>
-        <w:t xml:space="preserve"> ainda permite mais de uma revisão para a mesma correção. A restrição será incluída na etapa 4.</w:t>
+        <w:t xml:space="preserve">Duas correções da mesma resposta:</w:t>
+      </w:r>
+      <w:r>
+        <w:t xml:space="preserve"> se o mesmo avaliador revisar as duas condições de uma resposta, a segunda decisão é influenciada pela primeira. O protocolo da coleta com especialistas deve definir quem revisa qual condição.</w:t>
       </w:r>
     </w:p>
     <w:p>
@@ -22821,6 +24074,63 @@
                 <w:szCs w:val="20"/>
               </w:rPr>
               <w:t xml:space="preserve">Arquivo de texto com valores separados por vírgula, aberto por planilhas e pelo pandas</w:t>
+            </w:r>
+          </w:p>
+        </w:tc>
+      </w:tr>
+      <w:tr>
+        <w:trPr>
+          <w:cantSplit/>
+        </w:trPr>
+        <w:tc>
+          <w:tcPr>
+            <w:tcW w:type="dxa" w:w="2721"/>
+            <w:tcBorders>
+              <w:top w:val="single" w:color="BFBFBF" w:sz="4"/>
+              <w:left w:val="single" w:color="BFBFBF" w:sz="4"/>
+              <w:bottom w:val="single" w:color="BFBFBF" w:sz="4"/>
+              <w:right w:val="single" w:color="BFBFBF" w:sz="4"/>
+            </w:tcBorders>
+            <w:tcMar>
+              <w:top w:type="dxa" w:w="60"/>
+              <w:left w:type="dxa" w:w="100"/>
+              <w:bottom w:type="dxa" w:w="60"/>
+              <w:right w:type="dxa" w:w="100"/>
+            </w:tcMar>
+          </w:tcPr>
+          <w:p>
+            <w:r>
+              <w:rPr>
+                <w:sz w:val="20"/>
+                <w:szCs w:val="20"/>
+              </w:rPr>
+              <w:t xml:space="preserve">Concordância</w:t>
+            </w:r>
+          </w:p>
+        </w:tc>
+        <w:tc>
+          <w:tcPr>
+            <w:tcW w:type="dxa" w:w="6350"/>
+            <w:tcBorders>
+              <w:top w:val="single" w:color="BFBFBF" w:sz="4"/>
+              <w:left w:val="single" w:color="BFBFBF" w:sz="4"/>
+              <w:bottom w:val="single" w:color="BFBFBF" w:sz="4"/>
+              <w:right w:val="single" w:color="BFBFBF" w:sz="4"/>
+            </w:tcBorders>
+            <w:tcMar>
+              <w:top w:type="dxa" w:w="60"/>
+              <w:left w:type="dxa" w:w="100"/>
+              <w:bottom w:type="dxa" w:w="60"/>
+              <w:right w:type="dxa" w:w="100"/>
+            </w:tcMar>
+          </w:tcPr>
+          <w:p>
+            <w:r>
+              <w:rPr>
+                <w:sz w:val="20"/>
+                <w:szCs w:val="20"/>
+              </w:rPr>
+              <w:t xml:space="preserve">Proporção de correções em que o professor aceitou a nota sugerida pelo modelo</w:t>
             </w:r>
           </w:p>
         </w:tc>
@@ -23958,6 +25268,115 @@
                 <w:szCs w:val="20"/>
               </w:rPr>
               <w:t xml:space="preserve">Mudança</w:t>
+            </w:r>
+          </w:p>
+        </w:tc>
+      </w:tr>
+      <w:tr>
+        <w:trPr>
+          <w:cantSplit/>
+        </w:trPr>
+        <w:tc>
+          <w:tcPr>
+            <w:tcW w:type="dxa" w:w="1511"/>
+            <w:tcBorders>
+              <w:top w:val="single" w:color="BFBFBF" w:sz="4"/>
+              <w:left w:val="single" w:color="BFBFBF" w:sz="4"/>
+              <w:bottom w:val="single" w:color="BFBFBF" w:sz="4"/>
+              <w:right w:val="single" w:color="BFBFBF" w:sz="4"/>
+            </w:tcBorders>
+            <w:tcMar>
+              <w:top w:type="dxa" w:w="60"/>
+              <w:left w:type="dxa" w:w="100"/>
+              <w:bottom w:type="dxa" w:w="60"/>
+              <w:right w:type="dxa" w:w="100"/>
+            </w:tcMar>
+          </w:tcPr>
+          <w:p>
+            <w:r>
+              <w:rPr>
+                <w:sz w:val="20"/>
+                <w:szCs w:val="20"/>
+              </w:rPr>
+              <w:t xml:space="preserve">22/10/2026</w:t>
+            </w:r>
+          </w:p>
+        </w:tc>
+        <w:tc>
+          <w:tcPr>
+            <w:tcW w:type="dxa" w:w="1209"/>
+            <w:tcBorders>
+              <w:top w:val="single" w:color="BFBFBF" w:sz="4"/>
+              <w:left w:val="single" w:color="BFBFBF" w:sz="4"/>
+              <w:bottom w:val="single" w:color="BFBFBF" w:sz="4"/>
+              <w:right w:val="single" w:color="BFBFBF" w:sz="4"/>
+            </w:tcBorders>
+            <w:tcMar>
+              <w:top w:type="dxa" w:w="60"/>
+              <w:left w:type="dxa" w:w="100"/>
+              <w:bottom w:type="dxa" w:w="60"/>
+              <w:right w:type="dxa" w:w="100"/>
+            </w:tcMar>
+          </w:tcPr>
+          <w:p>
+            <w:r>
+              <w:rPr>
+                <w:sz w:val="20"/>
+                <w:szCs w:val="20"/>
+              </w:rPr>
+              <w:t xml:space="preserve">0.6</w:t>
+            </w:r>
+          </w:p>
+        </w:tc>
+        <w:tc>
+          <w:tcPr>
+            <w:tcW w:type="dxa" w:w="2267"/>
+            <w:tcBorders>
+              <w:top w:val="single" w:color="BFBFBF" w:sz="4"/>
+              <w:left w:val="single" w:color="BFBFBF" w:sz="4"/>
+              <w:bottom w:val="single" w:color="BFBFBF" w:sz="4"/>
+              <w:right w:val="single" w:color="BFBFBF" w:sz="4"/>
+            </w:tcBorders>
+            <w:tcMar>
+              <w:top w:type="dxa" w:w="60"/>
+              <w:left w:type="dxa" w:w="100"/>
+              <w:bottom w:type="dxa" w:w="60"/>
+              <w:right w:type="dxa" w:w="100"/>
+            </w:tcMar>
+          </w:tcPr>
+          <w:p>
+            <w:r>
+              <w:rPr>
+                <w:sz w:val="20"/>
+                <w:szCs w:val="20"/>
+              </w:rPr>
+              <w:t xml:space="preserve">pull request da etapa 4</w:t>
+            </w:r>
+          </w:p>
+        </w:tc>
+        <w:tc>
+          <w:tcPr>
+            <w:tcW w:type="dxa" w:w="4084"/>
+            <w:tcBorders>
+              <w:top w:val="single" w:color="BFBFBF" w:sz="4"/>
+              <w:left w:val="single" w:color="BFBFBF" w:sz="4"/>
+              <w:bottom w:val="single" w:color="BFBFBF" w:sz="4"/>
+              <w:right w:val="single" w:color="BFBFBF" w:sz="4"/>
+            </w:tcBorders>
+            <w:tcMar>
+              <w:top w:type="dxa" w:w="60"/>
+              <w:left w:type="dxa" w:w="100"/>
+              <w:bottom w:type="dxa" w:w="60"/>
+              <w:right w:type="dxa" w:w="100"/>
+            </w:tcMar>
+          </w:tcPr>
+          <w:p>
+            <w:r>
+              <w:rPr>
+                <w:sz w:val="20"/>
+                <w:szCs w:val="20"/>
+              </w:rPr>
+              <w:t xml:space="preserve">Aceite ou ajuste da nota com uma revisão por correção (restrição no banco e migração), proteção contra aceite por engano, concordância e desvios na página de métricas, exportação das revisões</w:t>
             </w:r>
           </w:p>
         </w:tc>
@@ -24833,7 +26252,7 @@
         <w:sz w:val="18"/>
         <w:szCs w:val="18"/>
       </w:rPr>
-      <w:t xml:space="preserve">Documentação Técnica do Protótipo, versão 0.5</w:t>
+      <w:t xml:space="preserve">Documentação Técnica do Protótipo, versão 0.6</w:t>
     </w:r>
   </w:p>
 </w:hdr>

</xml_diff>

<commit_message>
Documentação 0.10: origem das métricas
Co-Authored-By: Claude Opus 5.5 <noreply@anthropic.com>
Claude-Session: https://claude.ai/code/session_01W2sxSqc4ZdmAUWH2L8vsV2
</commit_message>
<xml_diff>
--- a/docs/Documentacao_Tecnica.docx
+++ b/docs/Documentacao_Tecnica.docx
@@ -114,7 +114,7 @@
         <w:t xml:space="preserve">Versão: </w:t>
       </w:r>
       <w:r>
-        <w:t xml:space="preserve">0.9, de 24/10/2026</w:t>
+        <w:t xml:space="preserve">0.10, de 24/10/2026</w:t>
       </w:r>
     </w:p>
     <w:p>
@@ -11014,6 +11014,174 @@
                 <w:sz w:val="20"/>
                 <w:szCs w:val="20"/>
               </w:rPr>
+              <w:t xml:space="preserve">questao_id</w:t>
+            </w:r>
+          </w:p>
+        </w:tc>
+        <w:tc>
+          <w:tcPr>
+            <w:tcW w:type="dxa" w:w="1649"/>
+            <w:tcBorders>
+              <w:top w:val="single" w:color="BFBFBF" w:sz="4"/>
+              <w:left w:val="single" w:color="BFBFBF" w:sz="4"/>
+              <w:bottom w:val="single" w:color="BFBFBF" w:sz="4"/>
+              <w:right w:val="single" w:color="BFBFBF" w:sz="4"/>
+            </w:tcBorders>
+            <w:tcMar>
+              <w:top w:type="dxa" w:w="60"/>
+              <w:left w:type="dxa" w:w="100"/>
+              <w:bottom w:type="dxa" w:w="60"/>
+              <w:right w:type="dxa" w:w="100"/>
+            </w:tcMar>
+          </w:tcPr>
+          <w:p>
+            <w:r>
+              <w:rPr>
+                <w:sz w:val="20"/>
+                <w:szCs w:val="20"/>
+              </w:rPr>
+              <w:t xml:space="preserve">inteiro</w:t>
+            </w:r>
+          </w:p>
+        </w:tc>
+        <w:tc>
+          <w:tcPr>
+            <w:tcW w:type="dxa" w:w="4949"/>
+            <w:tcBorders>
+              <w:top w:val="single" w:color="BFBFBF" w:sz="4"/>
+              <w:left w:val="single" w:color="BFBFBF" w:sz="4"/>
+              <w:bottom w:val="single" w:color="BFBFBF" w:sz="4"/>
+              <w:right w:val="single" w:color="BFBFBF" w:sz="4"/>
+            </w:tcBorders>
+            <w:tcMar>
+              <w:top w:type="dxa" w:w="60"/>
+              <w:left w:type="dxa" w:w="100"/>
+              <w:bottom w:type="dxa" w:w="60"/>
+              <w:right w:type="dxa" w:w="100"/>
+            </w:tcMar>
+          </w:tcPr>
+          <w:p>
+            <w:r>
+              <w:rPr>
+                <w:sz w:val="20"/>
+                <w:szCs w:val="20"/>
+              </w:rPr>
+              <w:t xml:space="preserve">Questão que originou a chamada, gravada também nas falhas. Nas chamadas antigas, preenchida a partir da correção; falhas antigas ficam sem origem</w:t>
+            </w:r>
+          </w:p>
+        </w:tc>
+      </w:tr>
+      <w:tr>
+        <w:trPr>
+          <w:cantSplit/>
+        </w:trPr>
+        <w:tc>
+          <w:tcPr>
+            <w:tcW w:type="dxa" w:w="2473"/>
+            <w:tcBorders>
+              <w:top w:val="single" w:color="BFBFBF" w:sz="4"/>
+              <w:left w:val="single" w:color="BFBFBF" w:sz="4"/>
+              <w:bottom w:val="single" w:color="BFBFBF" w:sz="4"/>
+              <w:right w:val="single" w:color="BFBFBF" w:sz="4"/>
+            </w:tcBorders>
+            <w:tcMar>
+              <w:top w:type="dxa" w:w="60"/>
+              <w:left w:type="dxa" w:w="100"/>
+              <w:bottom w:type="dxa" w:w="60"/>
+              <w:right w:type="dxa" w:w="100"/>
+            </w:tcMar>
+          </w:tcPr>
+          <w:p>
+            <w:r>
+              <w:rPr>
+                <w:rFonts w:ascii="Consolas" w:cs="Consolas" w:eastAsia="Consolas" w:hAnsi="Consolas"/>
+                <w:sz w:val="20"/>
+                <w:szCs w:val="20"/>
+              </w:rPr>
+              <w:t xml:space="preserve">submissao_id</w:t>
+            </w:r>
+          </w:p>
+        </w:tc>
+        <w:tc>
+          <w:tcPr>
+            <w:tcW w:type="dxa" w:w="1649"/>
+            <w:tcBorders>
+              <w:top w:val="single" w:color="BFBFBF" w:sz="4"/>
+              <w:left w:val="single" w:color="BFBFBF" w:sz="4"/>
+              <w:bottom w:val="single" w:color="BFBFBF" w:sz="4"/>
+              <w:right w:val="single" w:color="BFBFBF" w:sz="4"/>
+            </w:tcBorders>
+            <w:tcMar>
+              <w:top w:type="dxa" w:w="60"/>
+              <w:left w:type="dxa" w:w="100"/>
+              <w:bottom w:type="dxa" w:w="60"/>
+              <w:right w:type="dxa" w:w="100"/>
+            </w:tcMar>
+          </w:tcPr>
+          <w:p>
+            <w:r>
+              <w:rPr>
+                <w:sz w:val="20"/>
+                <w:szCs w:val="20"/>
+              </w:rPr>
+              <w:t xml:space="preserve">inteiro</w:t>
+            </w:r>
+          </w:p>
+        </w:tc>
+        <w:tc>
+          <w:tcPr>
+            <w:tcW w:type="dxa" w:w="4949"/>
+            <w:tcBorders>
+              <w:top w:val="single" w:color="BFBFBF" w:sz="4"/>
+              <w:left w:val="single" w:color="BFBFBF" w:sz="4"/>
+              <w:bottom w:val="single" w:color="BFBFBF" w:sz="4"/>
+              <w:right w:val="single" w:color="BFBFBF" w:sz="4"/>
+            </w:tcBorders>
+            <w:tcMar>
+              <w:top w:type="dxa" w:w="60"/>
+              <w:left w:type="dxa" w:w="100"/>
+              <w:bottom w:type="dxa" w:w="60"/>
+              <w:right w:type="dxa" w:w="100"/>
+            </w:tcMar>
+          </w:tcPr>
+          <w:p>
+            <w:r>
+              <w:rPr>
+                <w:sz w:val="20"/>
+                <w:szCs w:val="20"/>
+              </w:rPr>
+              <w:t xml:space="preserve">Resposta do aluno que originou a chamada, nas discursivas</w:t>
+            </w:r>
+          </w:p>
+        </w:tc>
+      </w:tr>
+      <w:tr>
+        <w:trPr>
+          <w:cantSplit/>
+        </w:trPr>
+        <w:tc>
+          <w:tcPr>
+            <w:tcW w:type="dxa" w:w="2473"/>
+            <w:tcBorders>
+              <w:top w:val="single" w:color="BFBFBF" w:sz="4"/>
+              <w:left w:val="single" w:color="BFBFBF" w:sz="4"/>
+              <w:bottom w:val="single" w:color="BFBFBF" w:sz="4"/>
+              <w:right w:val="single" w:color="BFBFBF" w:sz="4"/>
+            </w:tcBorders>
+            <w:tcMar>
+              <w:top w:type="dxa" w:w="60"/>
+              <w:left w:type="dxa" w:w="100"/>
+              <w:bottom w:type="dxa" w:w="60"/>
+              <w:right w:type="dxa" w:w="100"/>
+            </w:tcMar>
+          </w:tcPr>
+          <w:p>
+            <w:r>
+              <w:rPr>
+                <w:rFonts w:ascii="Consolas" w:cs="Consolas" w:eastAsia="Consolas" w:hAnsi="Consolas"/>
+                <w:sz w:val="20"/>
+                <w:szCs w:val="20"/>
+              </w:rPr>
               <w:t xml:space="preserve">usuario_id</w:t>
             </w:r>
           </w:p>
@@ -15360,6 +15528,79 @@
                 <w:szCs w:val="20"/>
               </w:rPr>
               <w:t xml:space="preserve">Quem pediu a chamada, gravado na métrica</w:t>
+            </w:r>
+          </w:p>
+        </w:tc>
+      </w:tr>
+      <w:tr>
+        <w:trPr>
+          <w:cantSplit/>
+        </w:trPr>
+        <w:tc>
+          <w:tcPr>
+            <w:tcW w:type="dxa" w:w="3628"/>
+            <w:tcBorders>
+              <w:top w:val="single" w:color="BFBFBF" w:sz="4"/>
+              <w:left w:val="single" w:color="BFBFBF" w:sz="4"/>
+              <w:bottom w:val="single" w:color="BFBFBF" w:sz="4"/>
+              <w:right w:val="single" w:color="BFBFBF" w:sz="4"/>
+            </w:tcBorders>
+            <w:tcMar>
+              <w:top w:type="dxa" w:w="60"/>
+              <w:left w:type="dxa" w:w="100"/>
+              <w:bottom w:type="dxa" w:w="60"/>
+              <w:right w:type="dxa" w:w="100"/>
+            </w:tcMar>
+          </w:tcPr>
+          <w:p>
+            <w:r>
+              <w:rPr>
+                <w:rFonts w:ascii="Consolas" w:cs="Consolas" w:eastAsia="Consolas" w:hAnsi="Consolas"/>
+                <w:sz w:val="20"/>
+                <w:szCs w:val="20"/>
+              </w:rPr>
+              <w:t xml:space="preserve">questao_id</w:t>
+            </w:r>
+            <w:r>
+              <w:rPr>
+                <w:sz w:val="20"/>
+                <w:szCs w:val="20"/>
+              </w:rPr>
+              <w:t xml:space="preserve">, </w:t>
+            </w:r>
+            <w:r>
+              <w:rPr>
+                <w:rFonts w:ascii="Consolas" w:cs="Consolas" w:eastAsia="Consolas" w:hAnsi="Consolas"/>
+                <w:sz w:val="20"/>
+                <w:szCs w:val="20"/>
+              </w:rPr>
+              <w:t xml:space="preserve">submissao_id</w:t>
+            </w:r>
+          </w:p>
+        </w:tc>
+        <w:tc>
+          <w:tcPr>
+            <w:tcW w:type="dxa" w:w="5443"/>
+            <w:tcBorders>
+              <w:top w:val="single" w:color="BFBFBF" w:sz="4"/>
+              <w:left w:val="single" w:color="BFBFBF" w:sz="4"/>
+              <w:bottom w:val="single" w:color="BFBFBF" w:sz="4"/>
+              <w:right w:val="single" w:color="BFBFBF" w:sz="4"/>
+            </w:tcBorders>
+            <w:tcMar>
+              <w:top w:type="dxa" w:w="60"/>
+              <w:left w:type="dxa" w:w="100"/>
+              <w:bottom w:type="dxa" w:w="60"/>
+              <w:right w:type="dxa" w:w="100"/>
+            </w:tcMar>
+          </w:tcPr>
+          <w:p>
+            <w:r>
+              <w:rPr>
+                <w:sz w:val="20"/>
+                <w:szCs w:val="20"/>
+              </w:rPr>
+              <w:t xml:space="preserve">Origem da chamada, gravada na métrica antes do envio, para que também as falhas fiquem ligadas à questão e à resposta</w:t>
             </w:r>
           </w:p>
         </w:tc>
@@ -22989,7 +23230,37 @@
                 <w:sz w:val="20"/>
                 <w:szCs w:val="20"/>
               </w:rPr>
-              <w:t xml:space="preserve">Resumo das chamadas por tipo, concordância por condição e as 200 requisições mais recentes</w:t>
+              <w:t xml:space="preserve">Resumo das chamadas por tipo, concordância por condição e as 200 requisições mais recentes. Cada chamada mostra a origem, com links para a questão e a resposta, e quem a pediu. Com </w:t>
+            </w:r>
+            <w:r>
+              <w:rPr>
+                <w:rFonts w:ascii="Consolas" w:cs="Consolas" w:eastAsia="Consolas" w:hAnsi="Consolas"/>
+                <w:sz w:val="20"/>
+                <w:szCs w:val="20"/>
+              </w:rPr>
+              <w:t xml:space="preserve">?questao=</w:t>
+            </w:r>
+            <w:r>
+              <w:rPr>
+                <w:sz w:val="20"/>
+                <w:szCs w:val="20"/>
+              </w:rPr>
+              <w:t xml:space="preserve"> ou </w:t>
+            </w:r>
+            <w:r>
+              <w:rPr>
+                <w:rFonts w:ascii="Consolas" w:cs="Consolas" w:eastAsia="Consolas" w:hAnsi="Consolas"/>
+                <w:sz w:val="20"/>
+                <w:szCs w:val="20"/>
+              </w:rPr>
+              <w:t xml:space="preserve">?resposta=</w:t>
+            </w:r>
+            <w:r>
+              <w:rPr>
+                <w:sz w:val="20"/>
+                <w:szCs w:val="20"/>
+              </w:rPr>
+              <w:t xml:space="preserve">, mostra só as chamadas daquela origem e o custo somado</w:t>
             </w:r>
           </w:p>
         </w:tc>
@@ -29294,7 +29565,7 @@
         <w:t xml:space="preserve">pytest</w:t>
       </w:r>
       <w:r>
-        <w:t xml:space="preserve"> e não acessam a internet nem gastam crédito: a API da OpenAI e a API do ENEM são substituídas por versões falsas que devolvem respostas controladas. Total nesta versão: 148 testes. Os testes de páginas entram com uma conta de administrador criada no banco de teste, e o custo do scrypt é reduzido só nos testes, para que rodem em poucos segundos.</w:t>
+        <w:t xml:space="preserve"> e não acessam a internet nem gastam crédito: a API da OpenAI e a API do ENEM são substituídas por versões falsas que devolvem respostas controladas. Total nesta versão: 149 testes. Os testes de páginas entram com uma conta de administrador criada no banco de teste, e o custo do scrypt é reduzido só nos testes, para que rodem em poucos segundos.</w:t>
       </w:r>
     </w:p>
     <w:tbl>
@@ -29545,7 +29816,7 @@
                 <w:sz w:val="20"/>
                 <w:szCs w:val="20"/>
               </w:rPr>
-              <w:t xml:space="preserve">Rota de verificação pública; página de métricas e exportação em CSV</w:t>
+              <w:t xml:space="preserve">Rota de verificação pública; página de métricas e exportação em CSV; origem de cada chamada com links, filtro por questão e por resposta e custo somado</w:t>
             </w:r>
           </w:p>
         </w:tc>
@@ -31761,6 +32032,63 @@
                 <w:szCs w:val="20"/>
               </w:rPr>
               <w:t xml:space="preserve">Uma conta comprometida ou um uso por engano não consegue consumir o orçamento de um mês em um dia</w:t>
+            </w:r>
+          </w:p>
+        </w:tc>
+      </w:tr>
+      <w:tr>
+        <w:trPr>
+          <w:cantSplit/>
+        </w:trPr>
+        <w:tc>
+          <w:tcPr>
+            <w:tcW w:type="dxa" w:w="3628"/>
+            <w:tcBorders>
+              <w:top w:val="single" w:color="BFBFBF" w:sz="4"/>
+              <w:left w:val="single" w:color="BFBFBF" w:sz="4"/>
+              <w:bottom w:val="single" w:color="BFBFBF" w:sz="4"/>
+              <w:right w:val="single" w:color="BFBFBF" w:sz="4"/>
+            </w:tcBorders>
+            <w:tcMar>
+              <w:top w:type="dxa" w:w="60"/>
+              <w:left w:type="dxa" w:w="100"/>
+              <w:bottom w:type="dxa" w:w="60"/>
+              <w:right w:type="dxa" w:w="100"/>
+            </w:tcMar>
+          </w:tcPr>
+          <w:p>
+            <w:r>
+              <w:rPr>
+                <w:sz w:val="20"/>
+                <w:szCs w:val="20"/>
+              </w:rPr>
+              <w:t xml:space="preserve">Origem gravada em toda chamada, inclusive nas falhas</w:t>
+            </w:r>
+          </w:p>
+        </w:tc>
+        <w:tc>
+          <w:tcPr>
+            <w:tcW w:type="dxa" w:w="5443"/>
+            <w:tcBorders>
+              <w:top w:val="single" w:color="BFBFBF" w:sz="4"/>
+              <w:left w:val="single" w:color="BFBFBF" w:sz="4"/>
+              <w:bottom w:val="single" w:color="BFBFBF" w:sz="4"/>
+              <w:right w:val="single" w:color="BFBFBF" w:sz="4"/>
+            </w:tcBorders>
+            <w:tcMar>
+              <w:top w:type="dxa" w:w="60"/>
+              <w:left w:type="dxa" w:w="100"/>
+              <w:bottom w:type="dxa" w:w="60"/>
+              <w:right w:type="dxa" w:w="100"/>
+            </w:tcMar>
+          </w:tcPr>
+          <w:p>
+            <w:r>
+              <w:rPr>
+                <w:sz w:val="20"/>
+                <w:szCs w:val="20"/>
+              </w:rPr>
+              <w:t xml:space="preserve">Permite saber quanto custou cada questão e cada resposta, e onde ocorreram as falhas, sem depender de uma correção gravada</w:t>
             </w:r>
           </w:p>
         </w:tc>
@@ -34637,6 +34965,115 @@
                 <w:szCs w:val="20"/>
               </w:rPr>
               <w:t xml:space="preserve">Mudança</w:t>
+            </w:r>
+          </w:p>
+        </w:tc>
+      </w:tr>
+      <w:tr>
+        <w:trPr>
+          <w:cantSplit/>
+        </w:trPr>
+        <w:tc>
+          <w:tcPr>
+            <w:tcW w:type="dxa" w:w="1511"/>
+            <w:tcBorders>
+              <w:top w:val="single" w:color="BFBFBF" w:sz="4"/>
+              <w:left w:val="single" w:color="BFBFBF" w:sz="4"/>
+              <w:bottom w:val="single" w:color="BFBFBF" w:sz="4"/>
+              <w:right w:val="single" w:color="BFBFBF" w:sz="4"/>
+            </w:tcBorders>
+            <w:tcMar>
+              <w:top w:type="dxa" w:w="60"/>
+              <w:left w:type="dxa" w:w="100"/>
+              <w:bottom w:type="dxa" w:w="60"/>
+              <w:right w:type="dxa" w:w="100"/>
+            </w:tcMar>
+          </w:tcPr>
+          <w:p>
+            <w:r>
+              <w:rPr>
+                <w:sz w:val="20"/>
+                <w:szCs w:val="20"/>
+              </w:rPr>
+              <w:t xml:space="preserve">24/10/2026</w:t>
+            </w:r>
+          </w:p>
+        </w:tc>
+        <w:tc>
+          <w:tcPr>
+            <w:tcW w:type="dxa" w:w="1209"/>
+            <w:tcBorders>
+              <w:top w:val="single" w:color="BFBFBF" w:sz="4"/>
+              <w:left w:val="single" w:color="BFBFBF" w:sz="4"/>
+              <w:bottom w:val="single" w:color="BFBFBF" w:sz="4"/>
+              <w:right w:val="single" w:color="BFBFBF" w:sz="4"/>
+            </w:tcBorders>
+            <w:tcMar>
+              <w:top w:type="dxa" w:w="60"/>
+              <w:left w:type="dxa" w:w="100"/>
+              <w:bottom w:type="dxa" w:w="60"/>
+              <w:right w:type="dxa" w:w="100"/>
+            </w:tcMar>
+          </w:tcPr>
+          <w:p>
+            <w:r>
+              <w:rPr>
+                <w:sz w:val="20"/>
+                <w:szCs w:val="20"/>
+              </w:rPr>
+              <w:t xml:space="preserve">0.10</w:t>
+            </w:r>
+          </w:p>
+        </w:tc>
+        <w:tc>
+          <w:tcPr>
+            <w:tcW w:type="dxa" w:w="2267"/>
+            <w:tcBorders>
+              <w:top w:val="single" w:color="BFBFBF" w:sz="4"/>
+              <w:left w:val="single" w:color="BFBFBF" w:sz="4"/>
+              <w:bottom w:val="single" w:color="BFBFBF" w:sz="4"/>
+              <w:right w:val="single" w:color="BFBFBF" w:sz="4"/>
+            </w:tcBorders>
+            <w:tcMar>
+              <w:top w:type="dxa" w:w="60"/>
+              <w:left w:type="dxa" w:w="100"/>
+              <w:bottom w:type="dxa" w:w="60"/>
+              <w:right w:type="dxa" w:w="100"/>
+            </w:tcMar>
+          </w:tcPr>
+          <w:p>
+            <w:r>
+              <w:rPr>
+                <w:sz w:val="20"/>
+                <w:szCs w:val="20"/>
+              </w:rPr>
+              <w:t xml:space="preserve">pull request das métricas com origem</w:t>
+            </w:r>
+          </w:p>
+        </w:tc>
+        <w:tc>
+          <w:tcPr>
+            <w:tcW w:type="dxa" w:w="4084"/>
+            <w:tcBorders>
+              <w:top w:val="single" w:color="BFBFBF" w:sz="4"/>
+              <w:left w:val="single" w:color="BFBFBF" w:sz="4"/>
+              <w:bottom w:val="single" w:color="BFBFBF" w:sz="4"/>
+              <w:right w:val="single" w:color="BFBFBF" w:sz="4"/>
+            </w:tcBorders>
+            <w:tcMar>
+              <w:top w:type="dxa" w:w="60"/>
+              <w:left w:type="dxa" w:w="100"/>
+              <w:bottom w:type="dxa" w:w="60"/>
+              <w:right w:type="dxa" w:w="100"/>
+            </w:tcMar>
+          </w:tcPr>
+          <w:p>
+            <w:r>
+              <w:rPr>
+                <w:sz w:val="20"/>
+                <w:szCs w:val="20"/>
+              </w:rPr>
+              <w:t xml:space="preserve">Cada chamada ao modelo ligada à questão e à resposta de origem, inclusive nas falhas; links e filtro por questão ou resposta na página de métricas, com custo somado; colunas novas na exportação</w:t>
             </w:r>
           </w:p>
         </w:tc>
@@ -35987,7 +36424,7 @@
         <w:sz w:val="18"/>
         <w:szCs w:val="18"/>
       </w:rPr>
-      <w:t xml:space="preserve">Documentação Técnica do Protótipo, versão 0.9</w:t>
+      <w:t xml:space="preserve">Documentação Técnica do Protótipo, versão 0.10</w:t>
     </w:r>
   </w:p>
 </w:hdr>

</xml_diff>

<commit_message>
Documentação 0.11: lista de questões
Co-Authored-By: Claude Opus 5.5 <noreply@anthropic.com>
Claude-Session: https://claude.ai/code/session_01W2sxSqc4ZdmAUWH2L8vsV2
</commit_message>
<xml_diff>
--- a/docs/Documentacao_Tecnica.docx
+++ b/docs/Documentacao_Tecnica.docx
@@ -114,7 +114,7 @@
         <w:t xml:space="preserve">Versão: </w:t>
       </w:r>
       <w:r>
-        <w:t xml:space="preserve">0.10, de 24/10/2026</w:t>
+        <w:t xml:space="preserve">0.11, de 24/10/2026</w:t>
       </w:r>
     </w:p>
     <w:p>
@@ -19045,7 +19045,157 @@
                 <w:sz w:val="20"/>
                 <w:szCs w:val="20"/>
               </w:rPr>
-              <w:t xml:space="preserve">Lista as questões objetivas, com origem, área, início do enunciado e número de explicações geradas</w:t>
+              <w:t xml:space="preserve">Lista todas as questões, objetivas e discursivas, 50 por página, com origem, área, início do enunciado e número de correções. Aceita os filtros </w:t>
+            </w:r>
+            <w:r>
+              <w:rPr>
+                <w:rFonts w:ascii="Consolas" w:cs="Consolas" w:eastAsia="Consolas" w:hAnsi="Consolas"/>
+                <w:sz w:val="20"/>
+                <w:szCs w:val="20"/>
+              </w:rPr>
+              <w:t xml:space="preserve">busca</w:t>
+            </w:r>
+            <w:r>
+              <w:rPr>
+                <w:sz w:val="20"/>
+                <w:szCs w:val="20"/>
+              </w:rPr>
+              <w:t xml:space="preserve"> (palavra no enunciado), </w:t>
+            </w:r>
+            <w:r>
+              <w:rPr>
+                <w:rFonts w:ascii="Consolas" w:cs="Consolas" w:eastAsia="Consolas" w:hAnsi="Consolas"/>
+                <w:sz w:val="20"/>
+                <w:szCs w:val="20"/>
+              </w:rPr>
+              <w:t xml:space="preserve">numero</w:t>
+            </w:r>
+            <w:r>
+              <w:rPr>
+                <w:sz w:val="20"/>
+                <w:szCs w:val="20"/>
+              </w:rPr>
+              <w:t xml:space="preserve">, </w:t>
+            </w:r>
+            <w:r>
+              <w:rPr>
+                <w:rFonts w:ascii="Consolas" w:cs="Consolas" w:eastAsia="Consolas" w:hAnsi="Consolas"/>
+                <w:sz w:val="20"/>
+                <w:szCs w:val="20"/>
+              </w:rPr>
+              <w:t xml:space="preserve">tipo</w:t>
+            </w:r>
+            <w:r>
+              <w:rPr>
+                <w:sz w:val="20"/>
+                <w:szCs w:val="20"/>
+              </w:rPr>
+              <w:t xml:space="preserve">, </w:t>
+            </w:r>
+            <w:r>
+              <w:rPr>
+                <w:rFonts w:ascii="Consolas" w:cs="Consolas" w:eastAsia="Consolas" w:hAnsi="Consolas"/>
+                <w:sz w:val="20"/>
+                <w:szCs w:val="20"/>
+              </w:rPr>
+              <w:t xml:space="preserve">area</w:t>
+            </w:r>
+            <w:r>
+              <w:rPr>
+                <w:sz w:val="20"/>
+                <w:szCs w:val="20"/>
+              </w:rPr>
+              <w:t xml:space="preserve">, </w:t>
+            </w:r>
+            <w:r>
+              <w:rPr>
+                <w:rFonts w:ascii="Consolas" w:cs="Consolas" w:eastAsia="Consolas" w:hAnsi="Consolas"/>
+                <w:sz w:val="20"/>
+                <w:szCs w:val="20"/>
+              </w:rPr>
+              <w:t xml:space="preserve">fonte</w:t>
+            </w:r>
+            <w:r>
+              <w:rPr>
+                <w:sz w:val="20"/>
+                <w:szCs w:val="20"/>
+              </w:rPr>
+              <w:t xml:space="preserve">, </w:t>
+            </w:r>
+            <w:r>
+              <w:rPr>
+                <w:rFonts w:ascii="Consolas" w:cs="Consolas" w:eastAsia="Consolas" w:hAnsi="Consolas"/>
+                <w:sz w:val="20"/>
+                <w:szCs w:val="20"/>
+              </w:rPr>
+              <w:t xml:space="preserve">ano</w:t>
+            </w:r>
+            <w:r>
+              <w:rPr>
+                <w:sz w:val="20"/>
+                <w:szCs w:val="20"/>
+              </w:rPr>
+              <w:t xml:space="preserve"> e </w:t>
+            </w:r>
+            <w:r>
+              <w:rPr>
+                <w:rFonts w:ascii="Consolas" w:cs="Consolas" w:eastAsia="Consolas" w:hAnsi="Consolas"/>
+                <w:sz w:val="20"/>
+                <w:szCs w:val="20"/>
+              </w:rPr>
+              <w:t xml:space="preserve">situacao</w:t>
+            </w:r>
+            <w:r>
+              <w:rPr>
+                <w:sz w:val="20"/>
+                <w:szCs w:val="20"/>
+              </w:rPr>
+              <w:t xml:space="preserve"> (</w:t>
+            </w:r>
+            <w:r>
+              <w:rPr>
+                <w:rFonts w:ascii="Consolas" w:cs="Consolas" w:eastAsia="Consolas" w:hAnsi="Consolas"/>
+                <w:sz w:val="20"/>
+                <w:szCs w:val="20"/>
+              </w:rPr>
+              <w:t xml:space="preserve">pendente</w:t>
+            </w:r>
+            <w:r>
+              <w:rPr>
+                <w:sz w:val="20"/>
+                <w:szCs w:val="20"/>
+              </w:rPr>
+              <w:t xml:space="preserve">: tem correção esperando revisão; </w:t>
+            </w:r>
+            <w:r>
+              <w:rPr>
+                <w:rFonts w:ascii="Consolas" w:cs="Consolas" w:eastAsia="Consolas" w:hAnsi="Consolas"/>
+                <w:sz w:val="20"/>
+                <w:szCs w:val="20"/>
+              </w:rPr>
+              <w:t xml:space="preserve">sem_correcao</w:t>
+            </w:r>
+            <w:r>
+              <w:rPr>
+                <w:sz w:val="20"/>
+                <w:szCs w:val="20"/>
+              </w:rPr>
+              <w:t xml:space="preserve">: nenhuma correção ainda) e o parâmetro </w:t>
+            </w:r>
+            <w:r>
+              <w:rPr>
+                <w:rFonts w:ascii="Consolas" w:cs="Consolas" w:eastAsia="Consolas" w:hAnsi="Consolas"/>
+                <w:sz w:val="20"/>
+                <w:szCs w:val="20"/>
+              </w:rPr>
+              <w:t xml:space="preserve">pagina</w:t>
+            </w:r>
+            <w:r>
+              <w:rPr>
+                <w:sz w:val="20"/>
+                <w:szCs w:val="20"/>
+              </w:rPr>
+              <w:t xml:space="preserve">. As opções de área, origem e ano vêm do próprio banco, e os filtros se mantêm ao trocar de página</w:t>
             </w:r>
           </w:p>
         </w:tc>
@@ -29565,7 +29715,7 @@
         <w:t xml:space="preserve">pytest</w:t>
       </w:r>
       <w:r>
-        <w:t xml:space="preserve"> e não acessam a internet nem gastam crédito: a API da OpenAI e a API do ENEM são substituídas por versões falsas que devolvem respostas controladas. Total nesta versão: 149 testes. Os testes de páginas entram com uma conta de administrador criada no banco de teste, e o custo do scrypt é reduzido só nos testes, para que rodem em poucos segundos.</w:t>
+        <w:t xml:space="preserve"> e não acessam a internet nem gastam crédito: a API da OpenAI e a API do ENEM são substituídas por versões falsas que devolvem respostas controladas. Total nesta versão: 161 testes. Os testes de páginas entram com uma conta de administrador criada no banco de teste, e o custo do scrypt é reduzido só nos testes, para que rodem em poucos segundos.</w:t>
       </w:r>
     </w:p>
     <w:tbl>
@@ -30138,6 +30288,64 @@
                 <w:sz w:val="20"/>
                 <w:szCs w:val="20"/>
               </w:rPr>
+              <w:t xml:space="preserve">tests/test_lista_questoes.py</w:t>
+            </w:r>
+          </w:p>
+        </w:tc>
+        <w:tc>
+          <w:tcPr>
+            <w:tcW w:type="dxa" w:w="6350"/>
+            <w:tcBorders>
+              <w:top w:val="single" w:color="BFBFBF" w:sz="4"/>
+              <w:left w:val="single" w:color="BFBFBF" w:sz="4"/>
+              <w:bottom w:val="single" w:color="BFBFBF" w:sz="4"/>
+              <w:right w:val="single" w:color="BFBFBF" w:sz="4"/>
+            </w:tcBorders>
+            <w:tcMar>
+              <w:top w:type="dxa" w:w="60"/>
+              <w:left w:type="dxa" w:w="100"/>
+              <w:bottom w:type="dxa" w:w="60"/>
+              <w:right w:type="dxa" w:w="100"/>
+            </w:tcMar>
+          </w:tcPr>
+          <w:p>
+            <w:r>
+              <w:rPr>
+                <w:sz w:val="20"/>
+                <w:szCs w:val="20"/>
+              </w:rPr>
+              <w:t xml:space="preserve">Páginas de 50 e página fora do intervalo; cada filtro, inclusive situação pendente e sem correção; filtros mantidos ao trocar de página; filtro sem resultado; opções dos filtros vindas do banco</w:t>
+            </w:r>
+          </w:p>
+        </w:tc>
+      </w:tr>
+      <w:tr>
+        <w:trPr>
+          <w:cantSplit/>
+        </w:trPr>
+        <w:tc>
+          <w:tcPr>
+            <w:tcW w:type="dxa" w:w="2721"/>
+            <w:tcBorders>
+              <w:top w:val="single" w:color="BFBFBF" w:sz="4"/>
+              <w:left w:val="single" w:color="BFBFBF" w:sz="4"/>
+              <w:bottom w:val="single" w:color="BFBFBF" w:sz="4"/>
+              <w:right w:val="single" w:color="BFBFBF" w:sz="4"/>
+            </w:tcBorders>
+            <w:tcMar>
+              <w:top w:type="dxa" w:w="60"/>
+              <w:left w:type="dxa" w:w="100"/>
+              <w:bottom w:type="dxa" w:w="60"/>
+              <w:right w:type="dxa" w:w="100"/>
+            </w:tcMar>
+          </w:tcPr>
+          <w:p>
+            <w:r>
+              <w:rPr>
+                <w:rFonts w:ascii="Consolas" w:cs="Consolas" w:eastAsia="Consolas" w:hAnsi="Consolas"/>
+                <w:sz w:val="20"/>
+                <w:szCs w:val="20"/>
+              </w:rPr>
               <w:t xml:space="preserve">tests/test_importar_enem.py</w:t>
             </w:r>
           </w:p>
@@ -32578,6 +32786,26 @@
       </w:r>
       <w:r>
         <w:t xml:space="preserve"> a latência inclui o tempo de rede do computador onde o sistema roda. Medições comparadas entre si devem vir da mesma máquina e conexão.</w:t>
+      </w:r>
+    </w:p>
+    <w:p>
+      <w:pPr>
+        <w:pStyle w:val="ListParagraph"/>
+        <w:numPr>
+          <w:ilvl w:val="0"/>
+          <w:numId w:val="5"/>
+        </w:numPr>
+        <w:spacing w:after="80" w:line="290"/>
+      </w:pPr>
+      <w:r>
+        <w:rPr>
+          <w:b/>
+          <w:bCs/>
+        </w:rPr>
+        <w:t xml:space="preserve">Busca no enunciado:</w:t>
+      </w:r>
+      <w:r>
+        <w:t xml:space="preserve"> o SQLite só ignora a diferença entre maiúsculas e minúsculas em letras sem acento. Buscar "REVOLUÇÃO" não encontra "revolução"; buscar em minúsculas, ou por parte da palavra sem acento ("revolu"), encontra.</w:t>
       </w:r>
     </w:p>
     <w:p>
@@ -34965,6 +35193,115 @@
                 <w:szCs w:val="20"/>
               </w:rPr>
               <w:t xml:space="preserve">Mudança</w:t>
+            </w:r>
+          </w:p>
+        </w:tc>
+      </w:tr>
+      <w:tr>
+        <w:trPr>
+          <w:cantSplit/>
+        </w:trPr>
+        <w:tc>
+          <w:tcPr>
+            <w:tcW w:type="dxa" w:w="1511"/>
+            <w:tcBorders>
+              <w:top w:val="single" w:color="BFBFBF" w:sz="4"/>
+              <w:left w:val="single" w:color="BFBFBF" w:sz="4"/>
+              <w:bottom w:val="single" w:color="BFBFBF" w:sz="4"/>
+              <w:right w:val="single" w:color="BFBFBF" w:sz="4"/>
+            </w:tcBorders>
+            <w:tcMar>
+              <w:top w:type="dxa" w:w="60"/>
+              <w:left w:type="dxa" w:w="100"/>
+              <w:bottom w:type="dxa" w:w="60"/>
+              <w:right w:type="dxa" w:w="100"/>
+            </w:tcMar>
+          </w:tcPr>
+          <w:p>
+            <w:r>
+              <w:rPr>
+                <w:sz w:val="20"/>
+                <w:szCs w:val="20"/>
+              </w:rPr>
+              <w:t xml:space="preserve">24/10/2026</w:t>
+            </w:r>
+          </w:p>
+        </w:tc>
+        <w:tc>
+          <w:tcPr>
+            <w:tcW w:type="dxa" w:w="1209"/>
+            <w:tcBorders>
+              <w:top w:val="single" w:color="BFBFBF" w:sz="4"/>
+              <w:left w:val="single" w:color="BFBFBF" w:sz="4"/>
+              <w:bottom w:val="single" w:color="BFBFBF" w:sz="4"/>
+              <w:right w:val="single" w:color="BFBFBF" w:sz="4"/>
+            </w:tcBorders>
+            <w:tcMar>
+              <w:top w:type="dxa" w:w="60"/>
+              <w:left w:type="dxa" w:w="100"/>
+              <w:bottom w:type="dxa" w:w="60"/>
+              <w:right w:type="dxa" w:w="100"/>
+            </w:tcMar>
+          </w:tcPr>
+          <w:p>
+            <w:r>
+              <w:rPr>
+                <w:sz w:val="20"/>
+                <w:szCs w:val="20"/>
+              </w:rPr>
+              <w:t xml:space="preserve">0.11</w:t>
+            </w:r>
+          </w:p>
+        </w:tc>
+        <w:tc>
+          <w:tcPr>
+            <w:tcW w:type="dxa" w:w="2267"/>
+            <w:tcBorders>
+              <w:top w:val="single" w:color="BFBFBF" w:sz="4"/>
+              <w:left w:val="single" w:color="BFBFBF" w:sz="4"/>
+              <w:bottom w:val="single" w:color="BFBFBF" w:sz="4"/>
+              <w:right w:val="single" w:color="BFBFBF" w:sz="4"/>
+            </w:tcBorders>
+            <w:tcMar>
+              <w:top w:type="dxa" w:w="60"/>
+              <w:left w:type="dxa" w:w="100"/>
+              <w:bottom w:type="dxa" w:w="60"/>
+              <w:right w:type="dxa" w:w="100"/>
+            </w:tcMar>
+          </w:tcPr>
+          <w:p>
+            <w:r>
+              <w:rPr>
+                <w:sz w:val="20"/>
+                <w:szCs w:val="20"/>
+              </w:rPr>
+              <w:t xml:space="preserve">pull request da lista de questões</w:t>
+            </w:r>
+          </w:p>
+        </w:tc>
+        <w:tc>
+          <w:tcPr>
+            <w:tcW w:type="dxa" w:w="4084"/>
+            <w:tcBorders>
+              <w:top w:val="single" w:color="BFBFBF" w:sz="4"/>
+              <w:left w:val="single" w:color="BFBFBF" w:sz="4"/>
+              <w:bottom w:val="single" w:color="BFBFBF" w:sz="4"/>
+              <w:right w:val="single" w:color="BFBFBF" w:sz="4"/>
+            </w:tcBorders>
+            <w:tcMar>
+              <w:top w:type="dxa" w:w="60"/>
+              <w:left w:type="dxa" w:w="100"/>
+              <w:bottom w:type="dxa" w:w="60"/>
+              <w:right w:type="dxa" w:w="100"/>
+            </w:tcMar>
+          </w:tcPr>
+          <w:p>
+            <w:r>
+              <w:rPr>
+                <w:sz w:val="20"/>
+                <w:szCs w:val="20"/>
+              </w:rPr>
+              <w:t xml:space="preserve">Lista de questões com 50 por página e filtros por palavra no enunciado, número, tipo, área, origem, ano e situação</w:t>
             </w:r>
           </w:p>
         </w:tc>
@@ -36424,7 +36761,7 @@
         <w:sz w:val="18"/>
         <w:szCs w:val="18"/>
       </w:rPr>
-      <w:t xml:space="preserve">Documentação Técnica do Protótipo, versão 0.10</w:t>
+      <w:t xml:space="preserve">Documentação Técnica do Protótipo, versão 0.11</w:t>
     </w:r>
   </w:p>
 </w:hdr>

</xml_diff>

<commit_message>
Documentação 0.12: atividades e impressão
Co-Authored-By: Claude Opus 5.5 <noreply@anthropic.com>
Claude-Session: https://claude.ai/code/session_01W2sxSqc4ZdmAUWH2L8vsV2
</commit_message>
<xml_diff>
--- a/docs/Documentacao_Tecnica.docx
+++ b/docs/Documentacao_Tecnica.docx
@@ -114,7 +114,7 @@
         <w:t xml:space="preserve">Versão: </w:t>
       </w:r>
       <w:r>
-        <w:t xml:space="preserve">0.11, de 24/10/2026</w:t>
+        <w:t xml:space="preserve">0.12, de 24/10/2026</w:t>
       </w:r>
     </w:p>
     <w:p>
@@ -733,6 +733,55 @@
                 <w:szCs w:val="20"/>
               </w:rPr>
               <w:t xml:space="preserve">Login com contas individuais, papéis e limite diário de chamadas</w:t>
+            </w:r>
+          </w:p>
+        </w:tc>
+        <w:tc>
+          <w:tcPr>
+            <w:tcW w:type="dxa" w:w="4536"/>
+            <w:tcBorders>
+              <w:top w:val="single" w:color="BFBFBF" w:sz="4"/>
+              <w:left w:val="single" w:color="BFBFBF" w:sz="4"/>
+              <w:bottom w:val="single" w:color="BFBFBF" w:sz="4"/>
+              <w:right w:val="single" w:color="BFBFBF" w:sz="4"/>
+            </w:tcBorders>
+            <w:tcMar>
+              <w:top w:type="dxa" w:w="60"/>
+              <w:left w:type="dxa" w:w="100"/>
+              <w:bottom w:type="dxa" w:w="60"/>
+              <w:right w:type="dxa" w:w="100"/>
+            </w:tcMar>
+          </w:tcPr>
+          <w:p/>
+        </w:tc>
+      </w:tr>
+      <w:tr>
+        <w:trPr>
+          <w:cantSplit/>
+        </w:trPr>
+        <w:tc>
+          <w:tcPr>
+            <w:tcW w:type="dxa" w:w="4535"/>
+            <w:tcBorders>
+              <w:top w:val="single" w:color="BFBFBF" w:sz="4"/>
+              <w:left w:val="single" w:color="BFBFBF" w:sz="4"/>
+              <w:bottom w:val="single" w:color="BFBFBF" w:sz="4"/>
+              <w:right w:val="single" w:color="BFBFBF" w:sz="4"/>
+            </w:tcBorders>
+            <w:tcMar>
+              <w:top w:type="dxa" w:w="60"/>
+              <w:left w:type="dxa" w:w="100"/>
+              <w:bottom w:type="dxa" w:w="60"/>
+              <w:right w:type="dxa" w:w="100"/>
+            </w:tcMar>
+          </w:tcPr>
+          <w:p>
+            <w:r>
+              <w:rPr>
+                <w:sz w:val="20"/>
+                <w:szCs w:val="20"/>
+              </w:rPr>
+              <w:t xml:space="preserve">Atividades montadas pelo professor, impressas em folha A4</w:t>
             </w:r>
           </w:p>
         </w:tc>
@@ -3277,7 +3326,7 @@
                 <w:sz w:val="20"/>
                 <w:szCs w:val="20"/>
               </w:rPr>
-              <w:t xml:space="preserve">Definição das onze tabelas do banco</w:t>
+              <w:t xml:space="preserve">Definição das treze tabelas do banco</w:t>
             </w:r>
           </w:p>
         </w:tc>
@@ -3690,6 +3739,79 @@
                 <w:szCs w:val="20"/>
               </w:rPr>
               <w:t xml:space="preserve">) e rota (</w:t>
+            </w:r>
+            <w:r>
+              <w:rPr>
+                <w:rFonts w:ascii="Consolas" w:cs="Consolas" w:eastAsia="Consolas" w:hAnsi="Consolas"/>
+                <w:sz w:val="20"/>
+                <w:szCs w:val="20"/>
+              </w:rPr>
+              <w:t xml:space="preserve">router.py</w:t>
+            </w:r>
+            <w:r>
+              <w:rPr>
+                <w:sz w:val="20"/>
+                <w:szCs w:val="20"/>
+              </w:rPr>
+              <w:t xml:space="preserve">)</w:t>
+            </w:r>
+          </w:p>
+        </w:tc>
+      </w:tr>
+      <w:tr>
+        <w:trPr>
+          <w:cantSplit/>
+        </w:trPr>
+        <w:tc>
+          <w:tcPr>
+            <w:tcW w:type="dxa" w:w="2721"/>
+            <w:tcBorders>
+              <w:top w:val="single" w:color="BFBFBF" w:sz="4"/>
+              <w:left w:val="single" w:color="BFBFBF" w:sz="4"/>
+              <w:bottom w:val="single" w:color="BFBFBF" w:sz="4"/>
+              <w:right w:val="single" w:color="BFBFBF" w:sz="4"/>
+            </w:tcBorders>
+            <w:tcMar>
+              <w:top w:type="dxa" w:w="60"/>
+              <w:left w:type="dxa" w:w="100"/>
+              <w:bottom w:type="dxa" w:w="60"/>
+              <w:right w:type="dxa" w:w="100"/>
+            </w:tcMar>
+          </w:tcPr>
+          <w:p>
+            <w:r>
+              <w:rPr>
+                <w:rFonts w:ascii="Consolas" w:cs="Consolas" w:eastAsia="Consolas" w:hAnsi="Consolas"/>
+                <w:sz w:val="20"/>
+                <w:szCs w:val="20"/>
+              </w:rPr>
+              <w:t xml:space="preserve">app/atividades/</w:t>
+            </w:r>
+          </w:p>
+        </w:tc>
+        <w:tc>
+          <w:tcPr>
+            <w:tcW w:type="dxa" w:w="6350"/>
+            <w:tcBorders>
+              <w:top w:val="single" w:color="BFBFBF" w:sz="4"/>
+              <w:left w:val="single" w:color="BFBFBF" w:sz="4"/>
+              <w:bottom w:val="single" w:color="BFBFBF" w:sz="4"/>
+              <w:right w:val="single" w:color="BFBFBF" w:sz="4"/>
+            </w:tcBorders>
+            <w:tcMar>
+              <w:top w:type="dxa" w:w="60"/>
+              <w:left w:type="dxa" w:w="100"/>
+              <w:bottom w:type="dxa" w:w="60"/>
+              <w:right w:type="dxa" w:w="100"/>
+            </w:tcMar>
+          </w:tcPr>
+          <w:p>
+            <w:r>
+              <w:rPr>
+                <w:sz w:val="20"/>
+                <w:szCs w:val="20"/>
+              </w:rPr>
+              <w:t xml:space="preserve">Atividades: montagem de conjuntos de questões e folha de impressão em A4 (</w:t>
             </w:r>
             <w:r>
               <w:rPr>
@@ -4368,7 +4490,7 @@
         <w:spacing w:after="120" w:line="300"/>
       </w:pPr>
       <w:r>
-        <w:t xml:space="preserve">O banco tem onze tabelas. As oito primeiras foram criadas pela migração inicial do Alembic, a tabela </w:t>
+        <w:t xml:space="preserve">O banco tem treze tabelas. As oito primeiras foram criadas pela migração inicial do Alembic, a tabela </w:t>
       </w:r>
       <w:r>
         <w:rPr>
@@ -4379,7 +4501,7 @@
         <w:t xml:space="preserve">usuario</w:t>
       </w:r>
       <w:r>
-        <w:t xml:space="preserve"> por uma migração própria, que também ligou revisões e chamadas ao usuário que as fez, e as tabelas </w:t>
+        <w:t xml:space="preserve"> por uma migração própria, que também ligou revisões e chamadas ao usuário que as fez, as tabelas </w:t>
       </w:r>
       <w:r>
         <w:rPr>
@@ -4401,7 +4523,29 @@
         <w:t xml:space="preserve">resposta_item</w:t>
       </w:r>
       <w:r>
-        <w:t xml:space="preserve"> pela migração dos itens das discursivas. Duas delas existem por razão metodológica e não devem ser simplificadas: </w:t>
+        <w:t xml:space="preserve"> pela migração dos itens das discursivas, e as tabelas </w:t>
+      </w:r>
+      <w:r>
+        <w:rPr>
+          <w:rFonts w:ascii="Consolas" w:cs="Consolas" w:eastAsia="Consolas" w:hAnsi="Consolas"/>
+          <w:sz w:val="20"/>
+          <w:szCs w:val="20"/>
+        </w:rPr>
+        <w:t xml:space="preserve">atividade</w:t>
+      </w:r>
+      <w:r>
+        <w:t xml:space="preserve"> e </w:t>
+      </w:r>
+      <w:r>
+        <w:rPr>
+          <w:rFonts w:ascii="Consolas" w:cs="Consolas" w:eastAsia="Consolas" w:hAnsi="Consolas"/>
+          <w:sz w:val="20"/>
+          <w:szCs w:val="20"/>
+        </w:rPr>
+        <w:t xml:space="preserve">atividade_questao</w:t>
+      </w:r>
+      <w:r>
+        <w:t xml:space="preserve"> pela migração das atividades. Duas delas existem por razão metodológica e não devem ser simplificadas: </w:t>
       </w:r>
       <w:r>
         <w:rPr>
@@ -4849,6 +4993,122 @@
                 <w:szCs w:val="20"/>
               </w:rPr>
               <w:t xml:space="preserve">Resposta do aluno a cada item, em questão com itens</w:t>
+            </w:r>
+          </w:p>
+        </w:tc>
+      </w:tr>
+      <w:tr>
+        <w:trPr>
+          <w:cantSplit/>
+        </w:trPr>
+        <w:tc>
+          <w:tcPr>
+            <w:tcW w:type="dxa" w:w="2721"/>
+            <w:tcBorders>
+              <w:top w:val="single" w:color="BFBFBF" w:sz="4"/>
+              <w:left w:val="single" w:color="BFBFBF" w:sz="4"/>
+              <w:bottom w:val="single" w:color="BFBFBF" w:sz="4"/>
+              <w:right w:val="single" w:color="BFBFBF" w:sz="4"/>
+            </w:tcBorders>
+            <w:tcMar>
+              <w:top w:type="dxa" w:w="60"/>
+              <w:left w:type="dxa" w:w="100"/>
+              <w:bottom w:type="dxa" w:w="60"/>
+              <w:right w:type="dxa" w:w="100"/>
+            </w:tcMar>
+          </w:tcPr>
+          <w:p>
+            <w:r>
+              <w:rPr>
+                <w:rFonts w:ascii="Consolas" w:cs="Consolas" w:eastAsia="Consolas" w:hAnsi="Consolas"/>
+                <w:sz w:val="20"/>
+                <w:szCs w:val="20"/>
+              </w:rPr>
+              <w:t xml:space="preserve">atividade</w:t>
+            </w:r>
+          </w:p>
+        </w:tc>
+        <w:tc>
+          <w:tcPr>
+            <w:tcW w:type="dxa" w:w="6350"/>
+            <w:tcBorders>
+              <w:top w:val="single" w:color="BFBFBF" w:sz="4"/>
+              <w:left w:val="single" w:color="BFBFBF" w:sz="4"/>
+              <w:bottom w:val="single" w:color="BFBFBF" w:sz="4"/>
+              <w:right w:val="single" w:color="BFBFBF" w:sz="4"/>
+            </w:tcBorders>
+            <w:tcMar>
+              <w:top w:type="dxa" w:w="60"/>
+              <w:left w:type="dxa" w:w="100"/>
+              <w:bottom w:type="dxa" w:w="60"/>
+              <w:right w:type="dxa" w:w="100"/>
+            </w:tcMar>
+          </w:tcPr>
+          <w:p>
+            <w:r>
+              <w:rPr>
+                <w:sz w:val="20"/>
+                <w:szCs w:val="20"/>
+              </w:rPr>
+              <w:t xml:space="preserve">Conjunto de questões montado pelo professor para uma turma</w:t>
+            </w:r>
+          </w:p>
+        </w:tc>
+      </w:tr>
+      <w:tr>
+        <w:trPr>
+          <w:cantSplit/>
+        </w:trPr>
+        <w:tc>
+          <w:tcPr>
+            <w:tcW w:type="dxa" w:w="2721"/>
+            <w:tcBorders>
+              <w:top w:val="single" w:color="BFBFBF" w:sz="4"/>
+              <w:left w:val="single" w:color="BFBFBF" w:sz="4"/>
+              <w:bottom w:val="single" w:color="BFBFBF" w:sz="4"/>
+              <w:right w:val="single" w:color="BFBFBF" w:sz="4"/>
+            </w:tcBorders>
+            <w:tcMar>
+              <w:top w:type="dxa" w:w="60"/>
+              <w:left w:type="dxa" w:w="100"/>
+              <w:bottom w:type="dxa" w:w="60"/>
+              <w:right w:type="dxa" w:w="100"/>
+            </w:tcMar>
+          </w:tcPr>
+          <w:p>
+            <w:r>
+              <w:rPr>
+                <w:rFonts w:ascii="Consolas" w:cs="Consolas" w:eastAsia="Consolas" w:hAnsi="Consolas"/>
+                <w:sz w:val="20"/>
+                <w:szCs w:val="20"/>
+              </w:rPr>
+              <w:t xml:space="preserve">atividade_questao</w:t>
+            </w:r>
+          </w:p>
+        </w:tc>
+        <w:tc>
+          <w:tcPr>
+            <w:tcW w:type="dxa" w:w="6350"/>
+            <w:tcBorders>
+              <w:top w:val="single" w:color="BFBFBF" w:sz="4"/>
+              <w:left w:val="single" w:color="BFBFBF" w:sz="4"/>
+              <w:bottom w:val="single" w:color="BFBFBF" w:sz="4"/>
+              <w:right w:val="single" w:color="BFBFBF" w:sz="4"/>
+            </w:tcBorders>
+            <w:tcMar>
+              <w:top w:type="dxa" w:w="60"/>
+              <w:left w:type="dxa" w:w="100"/>
+              <w:bottom w:type="dxa" w:w="60"/>
+              <w:right w:type="dxa" w:w="100"/>
+            </w:tcMar>
+          </w:tcPr>
+          <w:p>
+            <w:r>
+              <w:rPr>
+                <w:sz w:val="20"/>
+                <w:szCs w:val="20"/>
+              </w:rPr>
+              <w:t xml:space="preserve">Questões de uma atividade, na ordem escolhida</w:t>
             </w:r>
           </w:p>
         </w:tc>
@@ -9018,6 +9278,1092 @@
                 <w:szCs w:val="20"/>
               </w:rPr>
               <w:t xml:space="preserve">Resposta do aluno ao item; vazio quando o item ficou em branco</w:t>
+            </w:r>
+          </w:p>
+        </w:tc>
+      </w:tr>
+    </w:tbl>
+    <w:p>
+      <w:pPr>
+        <w:spacing w:after="120"/>
+      </w:pPr>
+    </w:p>
+    <w:p>
+      <w:pPr>
+        <w:pStyle w:val="Heading3"/>
+      </w:pPr>
+      <w:r>
+        <w:t xml:space="preserve">atividade</w:t>
+      </w:r>
+    </w:p>
+    <w:tbl>
+      <w:tblPr>
+        <w:tblW w:type="dxa" w:w="9071"/>
+        <w:tblBorders>
+          <w:top w:val="single" w:color="auto" w:sz="4"/>
+          <w:left w:val="single" w:color="auto" w:sz="4"/>
+          <w:bottom w:val="single" w:color="auto" w:sz="4"/>
+          <w:right w:val="single" w:color="auto" w:sz="4"/>
+          <w:insideH w:val="single" w:color="auto" w:sz="4"/>
+          <w:insideV w:val="single" w:color="auto" w:sz="4"/>
+        </w:tblBorders>
+      </w:tblPr>
+      <w:tblGrid>
+        <w:gridCol w:w="2473"/>
+        <w:gridCol w:w="1649"/>
+        <w:gridCol w:w="4949"/>
+      </w:tblGrid>
+      <w:tr>
+        <w:trPr>
+          <w:tblHeader/>
+        </w:trPr>
+        <w:tc>
+          <w:tcPr>
+            <w:tcW w:type="dxa" w:w="2473"/>
+            <w:tcBorders>
+              <w:top w:val="single" w:color="BFBFBF" w:sz="4"/>
+              <w:left w:val="single" w:color="BFBFBF" w:sz="4"/>
+              <w:bottom w:val="single" w:color="BFBFBF" w:sz="4"/>
+              <w:right w:val="single" w:color="BFBFBF" w:sz="4"/>
+            </w:tcBorders>
+            <w:shd w:fill="D9E2F3" w:color="auto" w:val="clear"/>
+            <w:tcMar>
+              <w:top w:type="dxa" w:w="60"/>
+              <w:left w:type="dxa" w:w="100"/>
+              <w:bottom w:type="dxa" w:w="60"/>
+              <w:right w:type="dxa" w:w="100"/>
+            </w:tcMar>
+          </w:tcPr>
+          <w:p>
+            <w:r>
+              <w:rPr>
+                <w:b/>
+                <w:bCs/>
+                <w:sz w:val="20"/>
+                <w:szCs w:val="20"/>
+              </w:rPr>
+              <w:t xml:space="preserve">Campo</w:t>
+            </w:r>
+          </w:p>
+        </w:tc>
+        <w:tc>
+          <w:tcPr>
+            <w:tcW w:type="dxa" w:w="1649"/>
+            <w:tcBorders>
+              <w:top w:val="single" w:color="BFBFBF" w:sz="4"/>
+              <w:left w:val="single" w:color="BFBFBF" w:sz="4"/>
+              <w:bottom w:val="single" w:color="BFBFBF" w:sz="4"/>
+              <w:right w:val="single" w:color="BFBFBF" w:sz="4"/>
+            </w:tcBorders>
+            <w:shd w:fill="D9E2F3" w:color="auto" w:val="clear"/>
+            <w:tcMar>
+              <w:top w:type="dxa" w:w="60"/>
+              <w:left w:type="dxa" w:w="100"/>
+              <w:bottom w:type="dxa" w:w="60"/>
+              <w:right w:type="dxa" w:w="100"/>
+            </w:tcMar>
+          </w:tcPr>
+          <w:p>
+            <w:r>
+              <w:rPr>
+                <w:b/>
+                <w:bCs/>
+                <w:sz w:val="20"/>
+                <w:szCs w:val="20"/>
+              </w:rPr>
+              <w:t xml:space="preserve">Tipo</w:t>
+            </w:r>
+          </w:p>
+        </w:tc>
+        <w:tc>
+          <w:tcPr>
+            <w:tcW w:type="dxa" w:w="4949"/>
+            <w:tcBorders>
+              <w:top w:val="single" w:color="BFBFBF" w:sz="4"/>
+              <w:left w:val="single" w:color="BFBFBF" w:sz="4"/>
+              <w:bottom w:val="single" w:color="BFBFBF" w:sz="4"/>
+              <w:right w:val="single" w:color="BFBFBF" w:sz="4"/>
+            </w:tcBorders>
+            <w:shd w:fill="D9E2F3" w:color="auto" w:val="clear"/>
+            <w:tcMar>
+              <w:top w:type="dxa" w:w="60"/>
+              <w:left w:type="dxa" w:w="100"/>
+              <w:bottom w:type="dxa" w:w="60"/>
+              <w:right w:type="dxa" w:w="100"/>
+            </w:tcMar>
+          </w:tcPr>
+          <w:p>
+            <w:r>
+              <w:rPr>
+                <w:b/>
+                <w:bCs/>
+                <w:sz w:val="20"/>
+                <w:szCs w:val="20"/>
+              </w:rPr>
+              <w:t xml:space="preserve">Descrição</w:t>
+            </w:r>
+          </w:p>
+        </w:tc>
+      </w:tr>
+      <w:tr>
+        <w:trPr>
+          <w:cantSplit/>
+        </w:trPr>
+        <w:tc>
+          <w:tcPr>
+            <w:tcW w:type="dxa" w:w="2473"/>
+            <w:tcBorders>
+              <w:top w:val="single" w:color="BFBFBF" w:sz="4"/>
+              <w:left w:val="single" w:color="BFBFBF" w:sz="4"/>
+              <w:bottom w:val="single" w:color="BFBFBF" w:sz="4"/>
+              <w:right w:val="single" w:color="BFBFBF" w:sz="4"/>
+            </w:tcBorders>
+            <w:tcMar>
+              <w:top w:type="dxa" w:w="60"/>
+              <w:left w:type="dxa" w:w="100"/>
+              <w:bottom w:type="dxa" w:w="60"/>
+              <w:right w:type="dxa" w:w="100"/>
+            </w:tcMar>
+          </w:tcPr>
+          <w:p>
+            <w:r>
+              <w:rPr>
+                <w:rFonts w:ascii="Consolas" w:cs="Consolas" w:eastAsia="Consolas" w:hAnsi="Consolas"/>
+                <w:sz w:val="20"/>
+                <w:szCs w:val="20"/>
+              </w:rPr>
+              <w:t xml:space="preserve">id</w:t>
+            </w:r>
+          </w:p>
+        </w:tc>
+        <w:tc>
+          <w:tcPr>
+            <w:tcW w:type="dxa" w:w="1649"/>
+            <w:tcBorders>
+              <w:top w:val="single" w:color="BFBFBF" w:sz="4"/>
+              <w:left w:val="single" w:color="BFBFBF" w:sz="4"/>
+              <w:bottom w:val="single" w:color="BFBFBF" w:sz="4"/>
+              <w:right w:val="single" w:color="BFBFBF" w:sz="4"/>
+            </w:tcBorders>
+            <w:tcMar>
+              <w:top w:type="dxa" w:w="60"/>
+              <w:left w:type="dxa" w:w="100"/>
+              <w:bottom w:type="dxa" w:w="60"/>
+              <w:right w:type="dxa" w:w="100"/>
+            </w:tcMar>
+          </w:tcPr>
+          <w:p>
+            <w:r>
+              <w:rPr>
+                <w:sz w:val="20"/>
+                <w:szCs w:val="20"/>
+              </w:rPr>
+              <w:t xml:space="preserve">inteiro</w:t>
+            </w:r>
+          </w:p>
+        </w:tc>
+        <w:tc>
+          <w:tcPr>
+            <w:tcW w:type="dxa" w:w="4949"/>
+            <w:tcBorders>
+              <w:top w:val="single" w:color="BFBFBF" w:sz="4"/>
+              <w:left w:val="single" w:color="BFBFBF" w:sz="4"/>
+              <w:bottom w:val="single" w:color="BFBFBF" w:sz="4"/>
+              <w:right w:val="single" w:color="BFBFBF" w:sz="4"/>
+            </w:tcBorders>
+            <w:tcMar>
+              <w:top w:type="dxa" w:w="60"/>
+              <w:left w:type="dxa" w:w="100"/>
+              <w:bottom w:type="dxa" w:w="60"/>
+              <w:right w:type="dxa" w:w="100"/>
+            </w:tcMar>
+          </w:tcPr>
+          <w:p>
+            <w:r>
+              <w:rPr>
+                <w:sz w:val="20"/>
+                <w:szCs w:val="20"/>
+              </w:rPr>
+              <w:t xml:space="preserve">Identificador</w:t>
+            </w:r>
+          </w:p>
+        </w:tc>
+      </w:tr>
+      <w:tr>
+        <w:trPr>
+          <w:cantSplit/>
+        </w:trPr>
+        <w:tc>
+          <w:tcPr>
+            <w:tcW w:type="dxa" w:w="2473"/>
+            <w:tcBorders>
+              <w:top w:val="single" w:color="BFBFBF" w:sz="4"/>
+              <w:left w:val="single" w:color="BFBFBF" w:sz="4"/>
+              <w:bottom w:val="single" w:color="BFBFBF" w:sz="4"/>
+              <w:right w:val="single" w:color="BFBFBF" w:sz="4"/>
+            </w:tcBorders>
+            <w:tcMar>
+              <w:top w:type="dxa" w:w="60"/>
+              <w:left w:type="dxa" w:w="100"/>
+              <w:bottom w:type="dxa" w:w="60"/>
+              <w:right w:type="dxa" w:w="100"/>
+            </w:tcMar>
+          </w:tcPr>
+          <w:p>
+            <w:r>
+              <w:rPr>
+                <w:rFonts w:ascii="Consolas" w:cs="Consolas" w:eastAsia="Consolas" w:hAnsi="Consolas"/>
+                <w:sz w:val="20"/>
+                <w:szCs w:val="20"/>
+              </w:rPr>
+              <w:t xml:space="preserve">titulo</w:t>
+            </w:r>
+          </w:p>
+        </w:tc>
+        <w:tc>
+          <w:tcPr>
+            <w:tcW w:type="dxa" w:w="1649"/>
+            <w:tcBorders>
+              <w:top w:val="single" w:color="BFBFBF" w:sz="4"/>
+              <w:left w:val="single" w:color="BFBFBF" w:sz="4"/>
+              <w:bottom w:val="single" w:color="BFBFBF" w:sz="4"/>
+              <w:right w:val="single" w:color="BFBFBF" w:sz="4"/>
+            </w:tcBorders>
+            <w:tcMar>
+              <w:top w:type="dxa" w:w="60"/>
+              <w:left w:type="dxa" w:w="100"/>
+              <w:bottom w:type="dxa" w:w="60"/>
+              <w:right w:type="dxa" w:w="100"/>
+            </w:tcMar>
+          </w:tcPr>
+          <w:p>
+            <w:r>
+              <w:rPr>
+                <w:sz w:val="20"/>
+                <w:szCs w:val="20"/>
+              </w:rPr>
+              <w:t xml:space="preserve">texto</w:t>
+            </w:r>
+          </w:p>
+        </w:tc>
+        <w:tc>
+          <w:tcPr>
+            <w:tcW w:type="dxa" w:w="4949"/>
+            <w:tcBorders>
+              <w:top w:val="single" w:color="BFBFBF" w:sz="4"/>
+              <w:left w:val="single" w:color="BFBFBF" w:sz="4"/>
+              <w:bottom w:val="single" w:color="BFBFBF" w:sz="4"/>
+              <w:right w:val="single" w:color="BFBFBF" w:sz="4"/>
+            </w:tcBorders>
+            <w:tcMar>
+              <w:top w:type="dxa" w:w="60"/>
+              <w:left w:type="dxa" w:w="100"/>
+              <w:bottom w:type="dxa" w:w="60"/>
+              <w:right w:type="dxa" w:w="100"/>
+            </w:tcMar>
+          </w:tcPr>
+          <w:p>
+            <w:r>
+              <w:rPr>
+                <w:sz w:val="20"/>
+                <w:szCs w:val="20"/>
+              </w:rPr>
+              <w:t xml:space="preserve">Nome da atividade, por exemplo "Revisão de Geografia"</w:t>
+            </w:r>
+          </w:p>
+        </w:tc>
+      </w:tr>
+      <w:tr>
+        <w:trPr>
+          <w:cantSplit/>
+        </w:trPr>
+        <w:tc>
+          <w:tcPr>
+            <w:tcW w:type="dxa" w:w="2473"/>
+            <w:tcBorders>
+              <w:top w:val="single" w:color="BFBFBF" w:sz="4"/>
+              <w:left w:val="single" w:color="BFBFBF" w:sz="4"/>
+              <w:bottom w:val="single" w:color="BFBFBF" w:sz="4"/>
+              <w:right w:val="single" w:color="BFBFBF" w:sz="4"/>
+            </w:tcBorders>
+            <w:tcMar>
+              <w:top w:type="dxa" w:w="60"/>
+              <w:left w:type="dxa" w:w="100"/>
+              <w:bottom w:type="dxa" w:w="60"/>
+              <w:right w:type="dxa" w:w="100"/>
+            </w:tcMar>
+          </w:tcPr>
+          <w:p>
+            <w:r>
+              <w:rPr>
+                <w:rFonts w:ascii="Consolas" w:cs="Consolas" w:eastAsia="Consolas" w:hAnsi="Consolas"/>
+                <w:sz w:val="20"/>
+                <w:szCs w:val="20"/>
+              </w:rPr>
+              <w:t xml:space="preserve">turma</w:t>
+            </w:r>
+          </w:p>
+        </w:tc>
+        <w:tc>
+          <w:tcPr>
+            <w:tcW w:type="dxa" w:w="1649"/>
+            <w:tcBorders>
+              <w:top w:val="single" w:color="BFBFBF" w:sz="4"/>
+              <w:left w:val="single" w:color="BFBFBF" w:sz="4"/>
+              <w:bottom w:val="single" w:color="BFBFBF" w:sz="4"/>
+              <w:right w:val="single" w:color="BFBFBF" w:sz="4"/>
+            </w:tcBorders>
+            <w:tcMar>
+              <w:top w:type="dxa" w:w="60"/>
+              <w:left w:type="dxa" w:w="100"/>
+              <w:bottom w:type="dxa" w:w="60"/>
+              <w:right w:type="dxa" w:w="100"/>
+            </w:tcMar>
+          </w:tcPr>
+          <w:p>
+            <w:r>
+              <w:rPr>
+                <w:sz w:val="20"/>
+                <w:szCs w:val="20"/>
+              </w:rPr>
+              <w:t xml:space="preserve">texto</w:t>
+            </w:r>
+          </w:p>
+        </w:tc>
+        <w:tc>
+          <w:tcPr>
+            <w:tcW w:type="dxa" w:w="4949"/>
+            <w:tcBorders>
+              <w:top w:val="single" w:color="BFBFBF" w:sz="4"/>
+              <w:left w:val="single" w:color="BFBFBF" w:sz="4"/>
+              <w:bottom w:val="single" w:color="BFBFBF" w:sz="4"/>
+              <w:right w:val="single" w:color="BFBFBF" w:sz="4"/>
+            </w:tcBorders>
+            <w:tcMar>
+              <w:top w:type="dxa" w:w="60"/>
+              <w:left w:type="dxa" w:w="100"/>
+              <w:bottom w:type="dxa" w:w="60"/>
+              <w:right w:type="dxa" w:w="100"/>
+            </w:tcMar>
+          </w:tcPr>
+          <w:p>
+            <w:r>
+              <w:rPr>
+                <w:sz w:val="20"/>
+                <w:szCs w:val="20"/>
+              </w:rPr>
+              <w:t xml:space="preserve">Turma a que se destina (opcional)</w:t>
+            </w:r>
+          </w:p>
+        </w:tc>
+      </w:tr>
+      <w:tr>
+        <w:trPr>
+          <w:cantSplit/>
+        </w:trPr>
+        <w:tc>
+          <w:tcPr>
+            <w:tcW w:type="dxa" w:w="2473"/>
+            <w:tcBorders>
+              <w:top w:val="single" w:color="BFBFBF" w:sz="4"/>
+              <w:left w:val="single" w:color="BFBFBF" w:sz="4"/>
+              <w:bottom w:val="single" w:color="BFBFBF" w:sz="4"/>
+              <w:right w:val="single" w:color="BFBFBF" w:sz="4"/>
+            </w:tcBorders>
+            <w:tcMar>
+              <w:top w:type="dxa" w:w="60"/>
+              <w:left w:type="dxa" w:w="100"/>
+              <w:bottom w:type="dxa" w:w="60"/>
+              <w:right w:type="dxa" w:w="100"/>
+            </w:tcMar>
+          </w:tcPr>
+          <w:p>
+            <w:r>
+              <w:rPr>
+                <w:rFonts w:ascii="Consolas" w:cs="Consolas" w:eastAsia="Consolas" w:hAnsi="Consolas"/>
+                <w:sz w:val="20"/>
+                <w:szCs w:val="20"/>
+              </w:rPr>
+              <w:t xml:space="preserve">instrucoes</w:t>
+            </w:r>
+          </w:p>
+        </w:tc>
+        <w:tc>
+          <w:tcPr>
+            <w:tcW w:type="dxa" w:w="1649"/>
+            <w:tcBorders>
+              <w:top w:val="single" w:color="BFBFBF" w:sz="4"/>
+              <w:left w:val="single" w:color="BFBFBF" w:sz="4"/>
+              <w:bottom w:val="single" w:color="BFBFBF" w:sz="4"/>
+              <w:right w:val="single" w:color="BFBFBF" w:sz="4"/>
+            </w:tcBorders>
+            <w:tcMar>
+              <w:top w:type="dxa" w:w="60"/>
+              <w:left w:type="dxa" w:w="100"/>
+              <w:bottom w:type="dxa" w:w="60"/>
+              <w:right w:type="dxa" w:w="100"/>
+            </w:tcMar>
+          </w:tcPr>
+          <w:p>
+            <w:r>
+              <w:rPr>
+                <w:sz w:val="20"/>
+                <w:szCs w:val="20"/>
+              </w:rPr>
+              <w:t xml:space="preserve">texto</w:t>
+            </w:r>
+          </w:p>
+        </w:tc>
+        <w:tc>
+          <w:tcPr>
+            <w:tcW w:type="dxa" w:w="4949"/>
+            <w:tcBorders>
+              <w:top w:val="single" w:color="BFBFBF" w:sz="4"/>
+              <w:left w:val="single" w:color="BFBFBF" w:sz="4"/>
+              <w:bottom w:val="single" w:color="BFBFBF" w:sz="4"/>
+              <w:right w:val="single" w:color="BFBFBF" w:sz="4"/>
+            </w:tcBorders>
+            <w:tcMar>
+              <w:top w:type="dxa" w:w="60"/>
+              <w:left w:type="dxa" w:w="100"/>
+              <w:bottom w:type="dxa" w:w="60"/>
+              <w:right w:type="dxa" w:w="100"/>
+            </w:tcMar>
+          </w:tcPr>
+          <w:p>
+            <w:r>
+              <w:rPr>
+                <w:sz w:val="20"/>
+                <w:szCs w:val="20"/>
+              </w:rPr>
+              <w:t xml:space="preserve">Instruções impressas no topo da folha do aluno (opcional)</w:t>
+            </w:r>
+          </w:p>
+        </w:tc>
+      </w:tr>
+      <w:tr>
+        <w:trPr>
+          <w:cantSplit/>
+        </w:trPr>
+        <w:tc>
+          <w:tcPr>
+            <w:tcW w:type="dxa" w:w="2473"/>
+            <w:tcBorders>
+              <w:top w:val="single" w:color="BFBFBF" w:sz="4"/>
+              <w:left w:val="single" w:color="BFBFBF" w:sz="4"/>
+              <w:bottom w:val="single" w:color="BFBFBF" w:sz="4"/>
+              <w:right w:val="single" w:color="BFBFBF" w:sz="4"/>
+            </w:tcBorders>
+            <w:tcMar>
+              <w:top w:type="dxa" w:w="60"/>
+              <w:left w:type="dxa" w:w="100"/>
+              <w:bottom w:type="dxa" w:w="60"/>
+              <w:right w:type="dxa" w:w="100"/>
+            </w:tcMar>
+          </w:tcPr>
+          <w:p>
+            <w:r>
+              <w:rPr>
+                <w:rFonts w:ascii="Consolas" w:cs="Consolas" w:eastAsia="Consolas" w:hAnsi="Consolas"/>
+                <w:sz w:val="20"/>
+                <w:szCs w:val="20"/>
+              </w:rPr>
+              <w:t xml:space="preserve">usuario_id</w:t>
+            </w:r>
+          </w:p>
+        </w:tc>
+        <w:tc>
+          <w:tcPr>
+            <w:tcW w:type="dxa" w:w="1649"/>
+            <w:tcBorders>
+              <w:top w:val="single" w:color="BFBFBF" w:sz="4"/>
+              <w:left w:val="single" w:color="BFBFBF" w:sz="4"/>
+              <w:bottom w:val="single" w:color="BFBFBF" w:sz="4"/>
+              <w:right w:val="single" w:color="BFBFBF" w:sz="4"/>
+            </w:tcBorders>
+            <w:tcMar>
+              <w:top w:type="dxa" w:w="60"/>
+              <w:left w:type="dxa" w:w="100"/>
+              <w:bottom w:type="dxa" w:w="60"/>
+              <w:right w:type="dxa" w:w="100"/>
+            </w:tcMar>
+          </w:tcPr>
+          <w:p>
+            <w:r>
+              <w:rPr>
+                <w:sz w:val="20"/>
+                <w:szCs w:val="20"/>
+              </w:rPr>
+              <w:t xml:space="preserve">inteiro</w:t>
+            </w:r>
+          </w:p>
+        </w:tc>
+        <w:tc>
+          <w:tcPr>
+            <w:tcW w:type="dxa" w:w="4949"/>
+            <w:tcBorders>
+              <w:top w:val="single" w:color="BFBFBF" w:sz="4"/>
+              <w:left w:val="single" w:color="BFBFBF" w:sz="4"/>
+              <w:bottom w:val="single" w:color="BFBFBF" w:sz="4"/>
+              <w:right w:val="single" w:color="BFBFBF" w:sz="4"/>
+            </w:tcBorders>
+            <w:tcMar>
+              <w:top w:type="dxa" w:w="60"/>
+              <w:left w:type="dxa" w:w="100"/>
+              <w:bottom w:type="dxa" w:w="60"/>
+              <w:right w:type="dxa" w:w="100"/>
+            </w:tcMar>
+          </w:tcPr>
+          <w:p>
+            <w:r>
+              <w:rPr>
+                <w:sz w:val="20"/>
+                <w:szCs w:val="20"/>
+              </w:rPr>
+              <w:t xml:space="preserve">Quem criou a atividade</w:t>
+            </w:r>
+          </w:p>
+        </w:tc>
+      </w:tr>
+      <w:tr>
+        <w:trPr>
+          <w:cantSplit/>
+        </w:trPr>
+        <w:tc>
+          <w:tcPr>
+            <w:tcW w:type="dxa" w:w="2473"/>
+            <w:tcBorders>
+              <w:top w:val="single" w:color="BFBFBF" w:sz="4"/>
+              <w:left w:val="single" w:color="BFBFBF" w:sz="4"/>
+              <w:bottom w:val="single" w:color="BFBFBF" w:sz="4"/>
+              <w:right w:val="single" w:color="BFBFBF" w:sz="4"/>
+            </w:tcBorders>
+            <w:tcMar>
+              <w:top w:type="dxa" w:w="60"/>
+              <w:left w:type="dxa" w:w="100"/>
+              <w:bottom w:type="dxa" w:w="60"/>
+              <w:right w:type="dxa" w:w="100"/>
+            </w:tcMar>
+          </w:tcPr>
+          <w:p>
+            <w:r>
+              <w:rPr>
+                <w:rFonts w:ascii="Consolas" w:cs="Consolas" w:eastAsia="Consolas" w:hAnsi="Consolas"/>
+                <w:sz w:val="20"/>
+                <w:szCs w:val="20"/>
+              </w:rPr>
+              <w:t xml:space="preserve">criado_em</w:t>
+            </w:r>
+          </w:p>
+        </w:tc>
+        <w:tc>
+          <w:tcPr>
+            <w:tcW w:type="dxa" w:w="1649"/>
+            <w:tcBorders>
+              <w:top w:val="single" w:color="BFBFBF" w:sz="4"/>
+              <w:left w:val="single" w:color="BFBFBF" w:sz="4"/>
+              <w:bottom w:val="single" w:color="BFBFBF" w:sz="4"/>
+              <w:right w:val="single" w:color="BFBFBF" w:sz="4"/>
+            </w:tcBorders>
+            <w:tcMar>
+              <w:top w:type="dxa" w:w="60"/>
+              <w:left w:type="dxa" w:w="100"/>
+              <w:bottom w:type="dxa" w:w="60"/>
+              <w:right w:type="dxa" w:w="100"/>
+            </w:tcMar>
+          </w:tcPr>
+          <w:p>
+            <w:r>
+              <w:rPr>
+                <w:sz w:val="20"/>
+                <w:szCs w:val="20"/>
+              </w:rPr>
+              <w:t xml:space="preserve">data e hora</w:t>
+            </w:r>
+          </w:p>
+        </w:tc>
+        <w:tc>
+          <w:tcPr>
+            <w:tcW w:type="dxa" w:w="4949"/>
+            <w:tcBorders>
+              <w:top w:val="single" w:color="BFBFBF" w:sz="4"/>
+              <w:left w:val="single" w:color="BFBFBF" w:sz="4"/>
+              <w:bottom w:val="single" w:color="BFBFBF" w:sz="4"/>
+              <w:right w:val="single" w:color="BFBFBF" w:sz="4"/>
+            </w:tcBorders>
+            <w:tcMar>
+              <w:top w:type="dxa" w:w="60"/>
+              <w:left w:type="dxa" w:w="100"/>
+              <w:bottom w:type="dxa" w:w="60"/>
+              <w:right w:type="dxa" w:w="100"/>
+            </w:tcMar>
+          </w:tcPr>
+          <w:p>
+            <w:r>
+              <w:rPr>
+                <w:sz w:val="20"/>
+                <w:szCs w:val="20"/>
+              </w:rPr>
+              <w:t xml:space="preserve">Momento da criação</w:t>
+            </w:r>
+          </w:p>
+        </w:tc>
+      </w:tr>
+    </w:tbl>
+    <w:p>
+      <w:pPr>
+        <w:spacing w:after="120"/>
+      </w:pPr>
+    </w:p>
+    <w:p>
+      <w:pPr>
+        <w:pStyle w:val="Heading3"/>
+      </w:pPr>
+      <w:r>
+        <w:t xml:space="preserve">atividade_questao</w:t>
+      </w:r>
+    </w:p>
+    <w:tbl>
+      <w:tblPr>
+        <w:tblW w:type="dxa" w:w="9071"/>
+        <w:tblBorders>
+          <w:top w:val="single" w:color="auto" w:sz="4"/>
+          <w:left w:val="single" w:color="auto" w:sz="4"/>
+          <w:bottom w:val="single" w:color="auto" w:sz="4"/>
+          <w:right w:val="single" w:color="auto" w:sz="4"/>
+          <w:insideH w:val="single" w:color="auto" w:sz="4"/>
+          <w:insideV w:val="single" w:color="auto" w:sz="4"/>
+        </w:tblBorders>
+      </w:tblPr>
+      <w:tblGrid>
+        <w:gridCol w:w="2473"/>
+        <w:gridCol w:w="1649"/>
+        <w:gridCol w:w="4949"/>
+      </w:tblGrid>
+      <w:tr>
+        <w:trPr>
+          <w:tblHeader/>
+        </w:trPr>
+        <w:tc>
+          <w:tcPr>
+            <w:tcW w:type="dxa" w:w="2473"/>
+            <w:tcBorders>
+              <w:top w:val="single" w:color="BFBFBF" w:sz="4"/>
+              <w:left w:val="single" w:color="BFBFBF" w:sz="4"/>
+              <w:bottom w:val="single" w:color="BFBFBF" w:sz="4"/>
+              <w:right w:val="single" w:color="BFBFBF" w:sz="4"/>
+            </w:tcBorders>
+            <w:shd w:fill="D9E2F3" w:color="auto" w:val="clear"/>
+            <w:tcMar>
+              <w:top w:type="dxa" w:w="60"/>
+              <w:left w:type="dxa" w:w="100"/>
+              <w:bottom w:type="dxa" w:w="60"/>
+              <w:right w:type="dxa" w:w="100"/>
+            </w:tcMar>
+          </w:tcPr>
+          <w:p>
+            <w:r>
+              <w:rPr>
+                <w:b/>
+                <w:bCs/>
+                <w:sz w:val="20"/>
+                <w:szCs w:val="20"/>
+              </w:rPr>
+              <w:t xml:space="preserve">Campo</w:t>
+            </w:r>
+          </w:p>
+        </w:tc>
+        <w:tc>
+          <w:tcPr>
+            <w:tcW w:type="dxa" w:w="1649"/>
+            <w:tcBorders>
+              <w:top w:val="single" w:color="BFBFBF" w:sz="4"/>
+              <w:left w:val="single" w:color="BFBFBF" w:sz="4"/>
+              <w:bottom w:val="single" w:color="BFBFBF" w:sz="4"/>
+              <w:right w:val="single" w:color="BFBFBF" w:sz="4"/>
+            </w:tcBorders>
+            <w:shd w:fill="D9E2F3" w:color="auto" w:val="clear"/>
+            <w:tcMar>
+              <w:top w:type="dxa" w:w="60"/>
+              <w:left w:type="dxa" w:w="100"/>
+              <w:bottom w:type="dxa" w:w="60"/>
+              <w:right w:type="dxa" w:w="100"/>
+            </w:tcMar>
+          </w:tcPr>
+          <w:p>
+            <w:r>
+              <w:rPr>
+                <w:b/>
+                <w:bCs/>
+                <w:sz w:val="20"/>
+                <w:szCs w:val="20"/>
+              </w:rPr>
+              <w:t xml:space="preserve">Tipo</w:t>
+            </w:r>
+          </w:p>
+        </w:tc>
+        <w:tc>
+          <w:tcPr>
+            <w:tcW w:type="dxa" w:w="4949"/>
+            <w:tcBorders>
+              <w:top w:val="single" w:color="BFBFBF" w:sz="4"/>
+              <w:left w:val="single" w:color="BFBFBF" w:sz="4"/>
+              <w:bottom w:val="single" w:color="BFBFBF" w:sz="4"/>
+              <w:right w:val="single" w:color="BFBFBF" w:sz="4"/>
+            </w:tcBorders>
+            <w:shd w:fill="D9E2F3" w:color="auto" w:val="clear"/>
+            <w:tcMar>
+              <w:top w:type="dxa" w:w="60"/>
+              <w:left w:type="dxa" w:w="100"/>
+              <w:bottom w:type="dxa" w:w="60"/>
+              <w:right w:type="dxa" w:w="100"/>
+            </w:tcMar>
+          </w:tcPr>
+          <w:p>
+            <w:r>
+              <w:rPr>
+                <w:b/>
+                <w:bCs/>
+                <w:sz w:val="20"/>
+                <w:szCs w:val="20"/>
+              </w:rPr>
+              <w:t xml:space="preserve">Descrição</w:t>
+            </w:r>
+          </w:p>
+        </w:tc>
+      </w:tr>
+      <w:tr>
+        <w:trPr>
+          <w:cantSplit/>
+        </w:trPr>
+        <w:tc>
+          <w:tcPr>
+            <w:tcW w:type="dxa" w:w="2473"/>
+            <w:tcBorders>
+              <w:top w:val="single" w:color="BFBFBF" w:sz="4"/>
+              <w:left w:val="single" w:color="BFBFBF" w:sz="4"/>
+              <w:bottom w:val="single" w:color="BFBFBF" w:sz="4"/>
+              <w:right w:val="single" w:color="BFBFBF" w:sz="4"/>
+            </w:tcBorders>
+            <w:tcMar>
+              <w:top w:type="dxa" w:w="60"/>
+              <w:left w:type="dxa" w:w="100"/>
+              <w:bottom w:type="dxa" w:w="60"/>
+              <w:right w:type="dxa" w:w="100"/>
+            </w:tcMar>
+          </w:tcPr>
+          <w:p>
+            <w:r>
+              <w:rPr>
+                <w:rFonts w:ascii="Consolas" w:cs="Consolas" w:eastAsia="Consolas" w:hAnsi="Consolas"/>
+                <w:sz w:val="20"/>
+                <w:szCs w:val="20"/>
+              </w:rPr>
+              <w:t xml:space="preserve">id</w:t>
+            </w:r>
+          </w:p>
+        </w:tc>
+        <w:tc>
+          <w:tcPr>
+            <w:tcW w:type="dxa" w:w="1649"/>
+            <w:tcBorders>
+              <w:top w:val="single" w:color="BFBFBF" w:sz="4"/>
+              <w:left w:val="single" w:color="BFBFBF" w:sz="4"/>
+              <w:bottom w:val="single" w:color="BFBFBF" w:sz="4"/>
+              <w:right w:val="single" w:color="BFBFBF" w:sz="4"/>
+            </w:tcBorders>
+            <w:tcMar>
+              <w:top w:type="dxa" w:w="60"/>
+              <w:left w:type="dxa" w:w="100"/>
+              <w:bottom w:type="dxa" w:w="60"/>
+              <w:right w:type="dxa" w:w="100"/>
+            </w:tcMar>
+          </w:tcPr>
+          <w:p>
+            <w:r>
+              <w:rPr>
+                <w:sz w:val="20"/>
+                <w:szCs w:val="20"/>
+              </w:rPr>
+              <w:t xml:space="preserve">inteiro</w:t>
+            </w:r>
+          </w:p>
+        </w:tc>
+        <w:tc>
+          <w:tcPr>
+            <w:tcW w:type="dxa" w:w="4949"/>
+            <w:tcBorders>
+              <w:top w:val="single" w:color="BFBFBF" w:sz="4"/>
+              <w:left w:val="single" w:color="BFBFBF" w:sz="4"/>
+              <w:bottom w:val="single" w:color="BFBFBF" w:sz="4"/>
+              <w:right w:val="single" w:color="BFBFBF" w:sz="4"/>
+            </w:tcBorders>
+            <w:tcMar>
+              <w:top w:type="dxa" w:w="60"/>
+              <w:left w:type="dxa" w:w="100"/>
+              <w:bottom w:type="dxa" w:w="60"/>
+              <w:right w:type="dxa" w:w="100"/>
+            </w:tcMar>
+          </w:tcPr>
+          <w:p>
+            <w:r>
+              <w:rPr>
+                <w:sz w:val="20"/>
+                <w:szCs w:val="20"/>
+              </w:rPr>
+              <w:t xml:space="preserve">Identificador</w:t>
+            </w:r>
+          </w:p>
+        </w:tc>
+      </w:tr>
+      <w:tr>
+        <w:trPr>
+          <w:cantSplit/>
+        </w:trPr>
+        <w:tc>
+          <w:tcPr>
+            <w:tcW w:type="dxa" w:w="2473"/>
+            <w:tcBorders>
+              <w:top w:val="single" w:color="BFBFBF" w:sz="4"/>
+              <w:left w:val="single" w:color="BFBFBF" w:sz="4"/>
+              <w:bottom w:val="single" w:color="BFBFBF" w:sz="4"/>
+              <w:right w:val="single" w:color="BFBFBF" w:sz="4"/>
+            </w:tcBorders>
+            <w:tcMar>
+              <w:top w:type="dxa" w:w="60"/>
+              <w:left w:type="dxa" w:w="100"/>
+              <w:bottom w:type="dxa" w:w="60"/>
+              <w:right w:type="dxa" w:w="100"/>
+            </w:tcMar>
+          </w:tcPr>
+          <w:p>
+            <w:r>
+              <w:rPr>
+                <w:rFonts w:ascii="Consolas" w:cs="Consolas" w:eastAsia="Consolas" w:hAnsi="Consolas"/>
+                <w:sz w:val="20"/>
+                <w:szCs w:val="20"/>
+              </w:rPr>
+              <w:t xml:space="preserve">atividade_id</w:t>
+            </w:r>
+          </w:p>
+        </w:tc>
+        <w:tc>
+          <w:tcPr>
+            <w:tcW w:type="dxa" w:w="1649"/>
+            <w:tcBorders>
+              <w:top w:val="single" w:color="BFBFBF" w:sz="4"/>
+              <w:left w:val="single" w:color="BFBFBF" w:sz="4"/>
+              <w:bottom w:val="single" w:color="BFBFBF" w:sz="4"/>
+              <w:right w:val="single" w:color="BFBFBF" w:sz="4"/>
+            </w:tcBorders>
+            <w:tcMar>
+              <w:top w:type="dxa" w:w="60"/>
+              <w:left w:type="dxa" w:w="100"/>
+              <w:bottom w:type="dxa" w:w="60"/>
+              <w:right w:type="dxa" w:w="100"/>
+            </w:tcMar>
+          </w:tcPr>
+          <w:p>
+            <w:r>
+              <w:rPr>
+                <w:sz w:val="20"/>
+                <w:szCs w:val="20"/>
+              </w:rPr>
+              <w:t xml:space="preserve">inteiro</w:t>
+            </w:r>
+          </w:p>
+        </w:tc>
+        <w:tc>
+          <w:tcPr>
+            <w:tcW w:type="dxa" w:w="4949"/>
+            <w:tcBorders>
+              <w:top w:val="single" w:color="BFBFBF" w:sz="4"/>
+              <w:left w:val="single" w:color="BFBFBF" w:sz="4"/>
+              <w:bottom w:val="single" w:color="BFBFBF" w:sz="4"/>
+              <w:right w:val="single" w:color="BFBFBF" w:sz="4"/>
+            </w:tcBorders>
+            <w:tcMar>
+              <w:top w:type="dxa" w:w="60"/>
+              <w:left w:type="dxa" w:w="100"/>
+              <w:bottom w:type="dxa" w:w="60"/>
+              <w:right w:type="dxa" w:w="100"/>
+            </w:tcMar>
+          </w:tcPr>
+          <w:p>
+            <w:r>
+              <w:rPr>
+                <w:sz w:val="20"/>
+                <w:szCs w:val="20"/>
+              </w:rPr>
+              <w:t xml:space="preserve">Atividade</w:t>
+            </w:r>
+          </w:p>
+        </w:tc>
+      </w:tr>
+      <w:tr>
+        <w:trPr>
+          <w:cantSplit/>
+        </w:trPr>
+        <w:tc>
+          <w:tcPr>
+            <w:tcW w:type="dxa" w:w="2473"/>
+            <w:tcBorders>
+              <w:top w:val="single" w:color="BFBFBF" w:sz="4"/>
+              <w:left w:val="single" w:color="BFBFBF" w:sz="4"/>
+              <w:bottom w:val="single" w:color="BFBFBF" w:sz="4"/>
+              <w:right w:val="single" w:color="BFBFBF" w:sz="4"/>
+            </w:tcBorders>
+            <w:tcMar>
+              <w:top w:type="dxa" w:w="60"/>
+              <w:left w:type="dxa" w:w="100"/>
+              <w:bottom w:type="dxa" w:w="60"/>
+              <w:right w:type="dxa" w:w="100"/>
+            </w:tcMar>
+          </w:tcPr>
+          <w:p>
+            <w:r>
+              <w:rPr>
+                <w:rFonts w:ascii="Consolas" w:cs="Consolas" w:eastAsia="Consolas" w:hAnsi="Consolas"/>
+                <w:sz w:val="20"/>
+                <w:szCs w:val="20"/>
+              </w:rPr>
+              <w:t xml:space="preserve">questao_id</w:t>
+            </w:r>
+          </w:p>
+        </w:tc>
+        <w:tc>
+          <w:tcPr>
+            <w:tcW w:type="dxa" w:w="1649"/>
+            <w:tcBorders>
+              <w:top w:val="single" w:color="BFBFBF" w:sz="4"/>
+              <w:left w:val="single" w:color="BFBFBF" w:sz="4"/>
+              <w:bottom w:val="single" w:color="BFBFBF" w:sz="4"/>
+              <w:right w:val="single" w:color="BFBFBF" w:sz="4"/>
+            </w:tcBorders>
+            <w:tcMar>
+              <w:top w:type="dxa" w:w="60"/>
+              <w:left w:type="dxa" w:w="100"/>
+              <w:bottom w:type="dxa" w:w="60"/>
+              <w:right w:type="dxa" w:w="100"/>
+            </w:tcMar>
+          </w:tcPr>
+          <w:p>
+            <w:r>
+              <w:rPr>
+                <w:sz w:val="20"/>
+                <w:szCs w:val="20"/>
+              </w:rPr>
+              <w:t xml:space="preserve">inteiro</w:t>
+            </w:r>
+          </w:p>
+        </w:tc>
+        <w:tc>
+          <w:tcPr>
+            <w:tcW w:type="dxa" w:w="4949"/>
+            <w:tcBorders>
+              <w:top w:val="single" w:color="BFBFBF" w:sz="4"/>
+              <w:left w:val="single" w:color="BFBFBF" w:sz="4"/>
+              <w:bottom w:val="single" w:color="BFBFBF" w:sz="4"/>
+              <w:right w:val="single" w:color="BFBFBF" w:sz="4"/>
+            </w:tcBorders>
+            <w:tcMar>
+              <w:top w:type="dxa" w:w="60"/>
+              <w:left w:type="dxa" w:w="100"/>
+              <w:bottom w:type="dxa" w:w="60"/>
+              <w:right w:type="dxa" w:w="100"/>
+            </w:tcMar>
+          </w:tcPr>
+          <w:p>
+            <w:r>
+              <w:rPr>
+                <w:sz w:val="20"/>
+                <w:szCs w:val="20"/>
+              </w:rPr>
+              <w:t xml:space="preserve">Questão incluída; a mesma questão aparece no máximo uma vez em cada atividade, mas pode estar em várias atividades</w:t>
+            </w:r>
+          </w:p>
+        </w:tc>
+      </w:tr>
+      <w:tr>
+        <w:trPr>
+          <w:cantSplit/>
+        </w:trPr>
+        <w:tc>
+          <w:tcPr>
+            <w:tcW w:type="dxa" w:w="2473"/>
+            <w:tcBorders>
+              <w:top w:val="single" w:color="BFBFBF" w:sz="4"/>
+              <w:left w:val="single" w:color="BFBFBF" w:sz="4"/>
+              <w:bottom w:val="single" w:color="BFBFBF" w:sz="4"/>
+              <w:right w:val="single" w:color="BFBFBF" w:sz="4"/>
+            </w:tcBorders>
+            <w:tcMar>
+              <w:top w:type="dxa" w:w="60"/>
+              <w:left w:type="dxa" w:w="100"/>
+              <w:bottom w:type="dxa" w:w="60"/>
+              <w:right w:type="dxa" w:w="100"/>
+            </w:tcMar>
+          </w:tcPr>
+          <w:p>
+            <w:r>
+              <w:rPr>
+                <w:rFonts w:ascii="Consolas" w:cs="Consolas" w:eastAsia="Consolas" w:hAnsi="Consolas"/>
+                <w:sz w:val="20"/>
+                <w:szCs w:val="20"/>
+              </w:rPr>
+              <w:t xml:space="preserve">ordem</w:t>
+            </w:r>
+          </w:p>
+        </w:tc>
+        <w:tc>
+          <w:tcPr>
+            <w:tcW w:type="dxa" w:w="1649"/>
+            <w:tcBorders>
+              <w:top w:val="single" w:color="BFBFBF" w:sz="4"/>
+              <w:left w:val="single" w:color="BFBFBF" w:sz="4"/>
+              <w:bottom w:val="single" w:color="BFBFBF" w:sz="4"/>
+              <w:right w:val="single" w:color="BFBFBF" w:sz="4"/>
+            </w:tcBorders>
+            <w:tcMar>
+              <w:top w:type="dxa" w:w="60"/>
+              <w:left w:type="dxa" w:w="100"/>
+              <w:bottom w:type="dxa" w:w="60"/>
+              <w:right w:type="dxa" w:w="100"/>
+            </w:tcMar>
+          </w:tcPr>
+          <w:p>
+            <w:r>
+              <w:rPr>
+                <w:sz w:val="20"/>
+                <w:szCs w:val="20"/>
+              </w:rPr>
+              <w:t xml:space="preserve">inteiro</w:t>
+            </w:r>
+          </w:p>
+        </w:tc>
+        <w:tc>
+          <w:tcPr>
+            <w:tcW w:type="dxa" w:w="4949"/>
+            <w:tcBorders>
+              <w:top w:val="single" w:color="BFBFBF" w:sz="4"/>
+              <w:left w:val="single" w:color="BFBFBF" w:sz="4"/>
+              <w:bottom w:val="single" w:color="BFBFBF" w:sz="4"/>
+              <w:right w:val="single" w:color="BFBFBF" w:sz="4"/>
+            </w:tcBorders>
+            <w:tcMar>
+              <w:top w:type="dxa" w:w="60"/>
+              <w:left w:type="dxa" w:w="100"/>
+              <w:bottom w:type="dxa" w:w="60"/>
+              <w:right w:type="dxa" w:w="100"/>
+            </w:tcMar>
+          </w:tcPr>
+          <w:p>
+            <w:r>
+              <w:rPr>
+                <w:sz w:val="20"/>
+                <w:szCs w:val="20"/>
+              </w:rPr>
+              <w:t xml:space="preserve">Posição da questão na folha</w:t>
             </w:r>
           </w:p>
         </w:tc>
@@ -27376,6 +28722,1181 @@
     </w:p>
     <w:p>
       <w:pPr>
+        <w:pStyle w:val="Heading2"/>
+      </w:pPr>
+      <w:r>
+        <w:t xml:space="preserve">4.21 Atividades e impressão: app/atividades/router.py</w:t>
+      </w:r>
+    </w:p>
+    <w:p>
+      <w:pPr>
+        <w:spacing w:after="120" w:line="300"/>
+      </w:pPr>
+      <w:r>
+        <w:t xml:space="preserve">Permite ao professor montar uma atividade com questões já cadastradas, para uma turma, e imprimi-la numa folha A4 pronta, sem precisar formatar o material num editor de texto. É uma ferramenta de uso do professor: as atividades não entram na correção, nas métricas nem na análise da pesquisa.</w:t>
+      </w:r>
+    </w:p>
+    <w:tbl>
+      <w:tblPr>
+        <w:tblW w:type="dxa" w:w="9071"/>
+        <w:tblBorders>
+          <w:top w:val="single" w:color="auto" w:sz="4"/>
+          <w:left w:val="single" w:color="auto" w:sz="4"/>
+          <w:bottom w:val="single" w:color="auto" w:sz="4"/>
+          <w:right w:val="single" w:color="auto" w:sz="4"/>
+          <w:insideH w:val="single" w:color="auto" w:sz="4"/>
+          <w:insideV w:val="single" w:color="auto" w:sz="4"/>
+        </w:tblBorders>
+      </w:tblPr>
+      <w:tblGrid>
+        <w:gridCol w:w="3628"/>
+        <w:gridCol w:w="5443"/>
+      </w:tblGrid>
+      <w:tr>
+        <w:trPr>
+          <w:tblHeader/>
+        </w:trPr>
+        <w:tc>
+          <w:tcPr>
+            <w:tcW w:type="dxa" w:w="3628"/>
+            <w:tcBorders>
+              <w:top w:val="single" w:color="BFBFBF" w:sz="4"/>
+              <w:left w:val="single" w:color="BFBFBF" w:sz="4"/>
+              <w:bottom w:val="single" w:color="BFBFBF" w:sz="4"/>
+              <w:right w:val="single" w:color="BFBFBF" w:sz="4"/>
+            </w:tcBorders>
+            <w:shd w:fill="D9E2F3" w:color="auto" w:val="clear"/>
+            <w:tcMar>
+              <w:top w:type="dxa" w:w="60"/>
+              <w:left w:type="dxa" w:w="100"/>
+              <w:bottom w:type="dxa" w:w="60"/>
+              <w:right w:type="dxa" w:w="100"/>
+            </w:tcMar>
+          </w:tcPr>
+          <w:p>
+            <w:r>
+              <w:rPr>
+                <w:b/>
+                <w:bCs/>
+                <w:sz w:val="20"/>
+                <w:szCs w:val="20"/>
+              </w:rPr>
+              <w:t xml:space="preserve">Rota</w:t>
+            </w:r>
+          </w:p>
+        </w:tc>
+        <w:tc>
+          <w:tcPr>
+            <w:tcW w:type="dxa" w:w="5443"/>
+            <w:tcBorders>
+              <w:top w:val="single" w:color="BFBFBF" w:sz="4"/>
+              <w:left w:val="single" w:color="BFBFBF" w:sz="4"/>
+              <w:bottom w:val="single" w:color="BFBFBF" w:sz="4"/>
+              <w:right w:val="single" w:color="BFBFBF" w:sz="4"/>
+            </w:tcBorders>
+            <w:shd w:fill="D9E2F3" w:color="auto" w:val="clear"/>
+            <w:tcMar>
+              <w:top w:type="dxa" w:w="60"/>
+              <w:left w:type="dxa" w:w="100"/>
+              <w:bottom w:type="dxa" w:w="60"/>
+              <w:right w:type="dxa" w:w="100"/>
+            </w:tcMar>
+          </w:tcPr>
+          <w:p>
+            <w:r>
+              <w:rPr>
+                <w:b/>
+                <w:bCs/>
+                <w:sz w:val="20"/>
+                <w:szCs w:val="20"/>
+              </w:rPr>
+              <w:t xml:space="preserve">O que faz</w:t>
+            </w:r>
+          </w:p>
+        </w:tc>
+      </w:tr>
+      <w:tr>
+        <w:trPr>
+          <w:cantSplit/>
+        </w:trPr>
+        <w:tc>
+          <w:tcPr>
+            <w:tcW w:type="dxa" w:w="3628"/>
+            <w:tcBorders>
+              <w:top w:val="single" w:color="BFBFBF" w:sz="4"/>
+              <w:left w:val="single" w:color="BFBFBF" w:sz="4"/>
+              <w:bottom w:val="single" w:color="BFBFBF" w:sz="4"/>
+              <w:right w:val="single" w:color="BFBFBF" w:sz="4"/>
+            </w:tcBorders>
+            <w:tcMar>
+              <w:top w:type="dxa" w:w="60"/>
+              <w:left w:type="dxa" w:w="100"/>
+              <w:bottom w:type="dxa" w:w="60"/>
+              <w:right w:type="dxa" w:w="100"/>
+            </w:tcMar>
+          </w:tcPr>
+          <w:p>
+            <w:r>
+              <w:rPr>
+                <w:rFonts w:ascii="Consolas" w:cs="Consolas" w:eastAsia="Consolas" w:hAnsi="Consolas"/>
+                <w:sz w:val="20"/>
+                <w:szCs w:val="20"/>
+              </w:rPr>
+              <w:t xml:space="preserve">GET /atividades</w:t>
+            </w:r>
+          </w:p>
+        </w:tc>
+        <w:tc>
+          <w:tcPr>
+            <w:tcW w:type="dxa" w:w="5443"/>
+            <w:tcBorders>
+              <w:top w:val="single" w:color="BFBFBF" w:sz="4"/>
+              <w:left w:val="single" w:color="BFBFBF" w:sz="4"/>
+              <w:bottom w:val="single" w:color="BFBFBF" w:sz="4"/>
+              <w:right w:val="single" w:color="BFBFBF" w:sz="4"/>
+            </w:tcBorders>
+            <w:tcMar>
+              <w:top w:type="dxa" w:w="60"/>
+              <w:left w:type="dxa" w:w="100"/>
+              <w:bottom w:type="dxa" w:w="60"/>
+              <w:right w:type="dxa" w:w="100"/>
+            </w:tcMar>
+          </w:tcPr>
+          <w:p>
+            <w:r>
+              <w:rPr>
+                <w:sz w:val="20"/>
+                <w:szCs w:val="20"/>
+              </w:rPr>
+              <w:t xml:space="preserve">Mostra as atividades em blocos, da mais recente para a mais antiga, com turma, número de questões e quem criou, e o formulário de nova atividade</w:t>
+            </w:r>
+          </w:p>
+        </w:tc>
+      </w:tr>
+      <w:tr>
+        <w:trPr>
+          <w:cantSplit/>
+        </w:trPr>
+        <w:tc>
+          <w:tcPr>
+            <w:tcW w:type="dxa" w:w="3628"/>
+            <w:tcBorders>
+              <w:top w:val="single" w:color="BFBFBF" w:sz="4"/>
+              <w:left w:val="single" w:color="BFBFBF" w:sz="4"/>
+              <w:bottom w:val="single" w:color="BFBFBF" w:sz="4"/>
+              <w:right w:val="single" w:color="BFBFBF" w:sz="4"/>
+            </w:tcBorders>
+            <w:tcMar>
+              <w:top w:type="dxa" w:w="60"/>
+              <w:left w:type="dxa" w:w="100"/>
+              <w:bottom w:type="dxa" w:w="60"/>
+              <w:right w:type="dxa" w:w="100"/>
+            </w:tcMar>
+          </w:tcPr>
+          <w:p>
+            <w:r>
+              <w:rPr>
+                <w:rFonts w:ascii="Consolas" w:cs="Consolas" w:eastAsia="Consolas" w:hAnsi="Consolas"/>
+                <w:sz w:val="20"/>
+                <w:szCs w:val="20"/>
+              </w:rPr>
+              <w:t xml:space="preserve">POST /atividades</w:t>
+            </w:r>
+          </w:p>
+        </w:tc>
+        <w:tc>
+          <w:tcPr>
+            <w:tcW w:type="dxa" w:w="5443"/>
+            <w:tcBorders>
+              <w:top w:val="single" w:color="BFBFBF" w:sz="4"/>
+              <w:left w:val="single" w:color="BFBFBF" w:sz="4"/>
+              <w:bottom w:val="single" w:color="BFBFBF" w:sz="4"/>
+              <w:right w:val="single" w:color="BFBFBF" w:sz="4"/>
+            </w:tcBorders>
+            <w:tcMar>
+              <w:top w:type="dxa" w:w="60"/>
+              <w:left w:type="dxa" w:w="100"/>
+              <w:bottom w:type="dxa" w:w="60"/>
+              <w:right w:type="dxa" w:w="100"/>
+            </w:tcMar>
+          </w:tcPr>
+          <w:p>
+            <w:r>
+              <w:rPr>
+                <w:sz w:val="20"/>
+                <w:szCs w:val="20"/>
+              </w:rPr>
+              <w:t xml:space="preserve">Cria a atividade com título (obrigatório), turma e instruções</w:t>
+            </w:r>
+          </w:p>
+        </w:tc>
+      </w:tr>
+      <w:tr>
+        <w:trPr>
+          <w:cantSplit/>
+        </w:trPr>
+        <w:tc>
+          <w:tcPr>
+            <w:tcW w:type="dxa" w:w="3628"/>
+            <w:tcBorders>
+              <w:top w:val="single" w:color="BFBFBF" w:sz="4"/>
+              <w:left w:val="single" w:color="BFBFBF" w:sz="4"/>
+              <w:bottom w:val="single" w:color="BFBFBF" w:sz="4"/>
+              <w:right w:val="single" w:color="BFBFBF" w:sz="4"/>
+            </w:tcBorders>
+            <w:tcMar>
+              <w:top w:type="dxa" w:w="60"/>
+              <w:left w:type="dxa" w:w="100"/>
+              <w:bottom w:type="dxa" w:w="60"/>
+              <w:right w:type="dxa" w:w="100"/>
+            </w:tcMar>
+          </w:tcPr>
+          <w:p>
+            <w:r>
+              <w:rPr>
+                <w:rFonts w:ascii="Consolas" w:cs="Consolas" w:eastAsia="Consolas" w:hAnsi="Consolas"/>
+                <w:sz w:val="20"/>
+                <w:szCs w:val="20"/>
+              </w:rPr>
+              <w:t xml:space="preserve">GET /atividades/{id}</w:t>
+            </w:r>
+          </w:p>
+        </w:tc>
+        <w:tc>
+          <w:tcPr>
+            <w:tcW w:type="dxa" w:w="5443"/>
+            <w:tcBorders>
+              <w:top w:val="single" w:color="BFBFBF" w:sz="4"/>
+              <w:left w:val="single" w:color="BFBFBF" w:sz="4"/>
+              <w:bottom w:val="single" w:color="BFBFBF" w:sz="4"/>
+              <w:right w:val="single" w:color="BFBFBF" w:sz="4"/>
+            </w:tcBorders>
+            <w:tcMar>
+              <w:top w:type="dxa" w:w="60"/>
+              <w:left w:type="dxa" w:w="100"/>
+              <w:bottom w:type="dxa" w:w="60"/>
+              <w:right w:type="dxa" w:w="100"/>
+            </w:tcMar>
+          </w:tcPr>
+          <w:p>
+            <w:r>
+              <w:rPr>
+                <w:sz w:val="20"/>
+                <w:szCs w:val="20"/>
+              </w:rPr>
+              <w:t xml:space="preserve">Questões da atividade em ordem, com botões para subir, descer e remover, e uma busca para adicionar questões, que esconde as que já estão na atividade e mostra até 20 resultados</w:t>
+            </w:r>
+          </w:p>
+        </w:tc>
+      </w:tr>
+      <w:tr>
+        <w:trPr>
+          <w:cantSplit/>
+        </w:trPr>
+        <w:tc>
+          <w:tcPr>
+            <w:tcW w:type="dxa" w:w="3628"/>
+            <w:tcBorders>
+              <w:top w:val="single" w:color="BFBFBF" w:sz="4"/>
+              <w:left w:val="single" w:color="BFBFBF" w:sz="4"/>
+              <w:bottom w:val="single" w:color="BFBFBF" w:sz="4"/>
+              <w:right w:val="single" w:color="BFBFBF" w:sz="4"/>
+            </w:tcBorders>
+            <w:tcMar>
+              <w:top w:type="dxa" w:w="60"/>
+              <w:left w:type="dxa" w:w="100"/>
+              <w:bottom w:type="dxa" w:w="60"/>
+              <w:right w:type="dxa" w:w="100"/>
+            </w:tcMar>
+          </w:tcPr>
+          <w:p>
+            <w:r>
+              <w:rPr>
+                <w:rFonts w:ascii="Consolas" w:cs="Consolas" w:eastAsia="Consolas" w:hAnsi="Consolas"/>
+                <w:sz w:val="20"/>
+                <w:szCs w:val="20"/>
+              </w:rPr>
+              <w:t xml:space="preserve">POST /atividades/{id}/questoes</w:t>
+            </w:r>
+          </w:p>
+        </w:tc>
+        <w:tc>
+          <w:tcPr>
+            <w:tcW w:type="dxa" w:w="5443"/>
+            <w:tcBorders>
+              <w:top w:val="single" w:color="BFBFBF" w:sz="4"/>
+              <w:left w:val="single" w:color="BFBFBF" w:sz="4"/>
+              <w:bottom w:val="single" w:color="BFBFBF" w:sz="4"/>
+              <w:right w:val="single" w:color="BFBFBF" w:sz="4"/>
+            </w:tcBorders>
+            <w:tcMar>
+              <w:top w:type="dxa" w:w="60"/>
+              <w:left w:type="dxa" w:w="100"/>
+              <w:bottom w:type="dxa" w:w="60"/>
+              <w:right w:type="dxa" w:w="100"/>
+            </w:tcMar>
+          </w:tcPr>
+          <w:p>
+            <w:r>
+              <w:rPr>
+                <w:sz w:val="20"/>
+                <w:szCs w:val="20"/>
+              </w:rPr>
+              <w:t xml:space="preserve">Adiciona uma questão ao fim; a mesma questão não entra duas vezes. Depois volta para a mesma busca, para adicionar várias em sequência</w:t>
+            </w:r>
+          </w:p>
+        </w:tc>
+      </w:tr>
+      <w:tr>
+        <w:trPr>
+          <w:cantSplit/>
+        </w:trPr>
+        <w:tc>
+          <w:tcPr>
+            <w:tcW w:type="dxa" w:w="3628"/>
+            <w:tcBorders>
+              <w:top w:val="single" w:color="BFBFBF" w:sz="4"/>
+              <w:left w:val="single" w:color="BFBFBF" w:sz="4"/>
+              <w:bottom w:val="single" w:color="BFBFBF" w:sz="4"/>
+              <w:right w:val="single" w:color="BFBFBF" w:sz="4"/>
+            </w:tcBorders>
+            <w:tcMar>
+              <w:top w:type="dxa" w:w="60"/>
+              <w:left w:type="dxa" w:w="100"/>
+              <w:bottom w:type="dxa" w:w="60"/>
+              <w:right w:type="dxa" w:w="100"/>
+            </w:tcMar>
+          </w:tcPr>
+          <w:p>
+            <w:r>
+              <w:rPr>
+                <w:rFonts w:ascii="Consolas" w:cs="Consolas" w:eastAsia="Consolas" w:hAnsi="Consolas"/>
+                <w:sz w:val="20"/>
+                <w:szCs w:val="20"/>
+              </w:rPr>
+              <w:t xml:space="preserve">POST /atividades/{id}/questoes/{questao}/mover</w:t>
+            </w:r>
+          </w:p>
+        </w:tc>
+        <w:tc>
+          <w:tcPr>
+            <w:tcW w:type="dxa" w:w="5443"/>
+            <w:tcBorders>
+              <w:top w:val="single" w:color="BFBFBF" w:sz="4"/>
+              <w:left w:val="single" w:color="BFBFBF" w:sz="4"/>
+              <w:bottom w:val="single" w:color="BFBFBF" w:sz="4"/>
+              <w:right w:val="single" w:color="BFBFBF" w:sz="4"/>
+            </w:tcBorders>
+            <w:tcMar>
+              <w:top w:type="dxa" w:w="60"/>
+              <w:left w:type="dxa" w:w="100"/>
+              <w:bottom w:type="dxa" w:w="60"/>
+              <w:right w:type="dxa" w:w="100"/>
+            </w:tcMar>
+          </w:tcPr>
+          <w:p>
+            <w:r>
+              <w:rPr>
+                <w:sz w:val="20"/>
+                <w:szCs w:val="20"/>
+              </w:rPr>
+              <w:t xml:space="preserve">Troca a questão de lugar com a anterior ou a seguinte</w:t>
+            </w:r>
+          </w:p>
+        </w:tc>
+      </w:tr>
+      <w:tr>
+        <w:trPr>
+          <w:cantSplit/>
+        </w:trPr>
+        <w:tc>
+          <w:tcPr>
+            <w:tcW w:type="dxa" w:w="3628"/>
+            <w:tcBorders>
+              <w:top w:val="single" w:color="BFBFBF" w:sz="4"/>
+              <w:left w:val="single" w:color="BFBFBF" w:sz="4"/>
+              <w:bottom w:val="single" w:color="BFBFBF" w:sz="4"/>
+              <w:right w:val="single" w:color="BFBFBF" w:sz="4"/>
+            </w:tcBorders>
+            <w:tcMar>
+              <w:top w:type="dxa" w:w="60"/>
+              <w:left w:type="dxa" w:w="100"/>
+              <w:bottom w:type="dxa" w:w="60"/>
+              <w:right w:type="dxa" w:w="100"/>
+            </w:tcMar>
+          </w:tcPr>
+          <w:p>
+            <w:r>
+              <w:rPr>
+                <w:rFonts w:ascii="Consolas" w:cs="Consolas" w:eastAsia="Consolas" w:hAnsi="Consolas"/>
+                <w:sz w:val="20"/>
+                <w:szCs w:val="20"/>
+              </w:rPr>
+              <w:t xml:space="preserve">POST /atividades/{id}/questoes/{questao}/remover</w:t>
+            </w:r>
+          </w:p>
+        </w:tc>
+        <w:tc>
+          <w:tcPr>
+            <w:tcW w:type="dxa" w:w="5443"/>
+            <w:tcBorders>
+              <w:top w:val="single" w:color="BFBFBF" w:sz="4"/>
+              <w:left w:val="single" w:color="BFBFBF" w:sz="4"/>
+              <w:bottom w:val="single" w:color="BFBFBF" w:sz="4"/>
+              <w:right w:val="single" w:color="BFBFBF" w:sz="4"/>
+            </w:tcBorders>
+            <w:tcMar>
+              <w:top w:type="dxa" w:w="60"/>
+              <w:left w:type="dxa" w:w="100"/>
+              <w:bottom w:type="dxa" w:w="60"/>
+              <w:right w:type="dxa" w:w="100"/>
+            </w:tcMar>
+          </w:tcPr>
+          <w:p>
+            <w:r>
+              <w:rPr>
+                <w:sz w:val="20"/>
+                <w:szCs w:val="20"/>
+              </w:rPr>
+              <w:t xml:space="preserve">Tira a questão da atividade e renumera as demais. A questão continua cadastrada</w:t>
+            </w:r>
+          </w:p>
+        </w:tc>
+      </w:tr>
+      <w:tr>
+        <w:trPr>
+          <w:cantSplit/>
+        </w:trPr>
+        <w:tc>
+          <w:tcPr>
+            <w:tcW w:type="dxa" w:w="3628"/>
+            <w:tcBorders>
+              <w:top w:val="single" w:color="BFBFBF" w:sz="4"/>
+              <w:left w:val="single" w:color="BFBFBF" w:sz="4"/>
+              <w:bottom w:val="single" w:color="BFBFBF" w:sz="4"/>
+              <w:right w:val="single" w:color="BFBFBF" w:sz="4"/>
+            </w:tcBorders>
+            <w:tcMar>
+              <w:top w:type="dxa" w:w="60"/>
+              <w:left w:type="dxa" w:w="100"/>
+              <w:bottom w:type="dxa" w:w="60"/>
+              <w:right w:type="dxa" w:w="100"/>
+            </w:tcMar>
+          </w:tcPr>
+          <w:p>
+            <w:r>
+              <w:rPr>
+                <w:rFonts w:ascii="Consolas" w:cs="Consolas" w:eastAsia="Consolas" w:hAnsi="Consolas"/>
+                <w:sz w:val="20"/>
+                <w:szCs w:val="20"/>
+              </w:rPr>
+              <w:t xml:space="preserve">POST /atividades/{id}/editar</w:t>
+            </w:r>
+            <w:r>
+              <w:rPr>
+                <w:sz w:val="20"/>
+                <w:szCs w:val="20"/>
+              </w:rPr>
+              <w:t xml:space="preserve"> e </w:t>
+            </w:r>
+            <w:r>
+              <w:rPr>
+                <w:rFonts w:ascii="Consolas" w:cs="Consolas" w:eastAsia="Consolas" w:hAnsi="Consolas"/>
+                <w:sz w:val="20"/>
+                <w:szCs w:val="20"/>
+              </w:rPr>
+              <w:t xml:space="preserve">/excluir</w:t>
+            </w:r>
+          </w:p>
+        </w:tc>
+        <w:tc>
+          <w:tcPr>
+            <w:tcW w:type="dxa" w:w="5443"/>
+            <w:tcBorders>
+              <w:top w:val="single" w:color="BFBFBF" w:sz="4"/>
+              <w:left w:val="single" w:color="BFBFBF" w:sz="4"/>
+              <w:bottom w:val="single" w:color="BFBFBF" w:sz="4"/>
+              <w:right w:val="single" w:color="BFBFBF" w:sz="4"/>
+            </w:tcBorders>
+            <w:tcMar>
+              <w:top w:type="dxa" w:w="60"/>
+              <w:left w:type="dxa" w:w="100"/>
+              <w:bottom w:type="dxa" w:w="60"/>
+              <w:right w:type="dxa" w:w="100"/>
+            </w:tcMar>
+          </w:tcPr>
+          <w:p>
+            <w:r>
+              <w:rPr>
+                <w:sz w:val="20"/>
+                <w:szCs w:val="20"/>
+              </w:rPr>
+              <w:t xml:space="preserve">Altera título, turma e instruções, ou apaga a atividade, depois de confirmação. Apagar a atividade não apaga as questões</w:t>
+            </w:r>
+          </w:p>
+        </w:tc>
+      </w:tr>
+      <w:tr>
+        <w:trPr>
+          <w:cantSplit/>
+        </w:trPr>
+        <w:tc>
+          <w:tcPr>
+            <w:tcW w:type="dxa" w:w="3628"/>
+            <w:tcBorders>
+              <w:top w:val="single" w:color="BFBFBF" w:sz="4"/>
+              <w:left w:val="single" w:color="BFBFBF" w:sz="4"/>
+              <w:bottom w:val="single" w:color="BFBFBF" w:sz="4"/>
+              <w:right w:val="single" w:color="BFBFBF" w:sz="4"/>
+            </w:tcBorders>
+            <w:tcMar>
+              <w:top w:type="dxa" w:w="60"/>
+              <w:left w:type="dxa" w:w="100"/>
+              <w:bottom w:type="dxa" w:w="60"/>
+              <w:right w:type="dxa" w:w="100"/>
+            </w:tcMar>
+          </w:tcPr>
+          <w:p>
+            <w:r>
+              <w:rPr>
+                <w:rFonts w:ascii="Consolas" w:cs="Consolas" w:eastAsia="Consolas" w:hAnsi="Consolas"/>
+                <w:sz w:val="20"/>
+                <w:szCs w:val="20"/>
+              </w:rPr>
+              <w:t xml:space="preserve">GET /atividades/{id}/imprimir</w:t>
+            </w:r>
+          </w:p>
+        </w:tc>
+        <w:tc>
+          <w:tcPr>
+            <w:tcW w:type="dxa" w:w="5443"/>
+            <w:tcBorders>
+              <w:top w:val="single" w:color="BFBFBF" w:sz="4"/>
+              <w:left w:val="single" w:color="BFBFBF" w:sz="4"/>
+              <w:bottom w:val="single" w:color="BFBFBF" w:sz="4"/>
+              <w:right w:val="single" w:color="BFBFBF" w:sz="4"/>
+            </w:tcBorders>
+            <w:tcMar>
+              <w:top w:type="dxa" w:w="60"/>
+              <w:left w:type="dxa" w:w="100"/>
+              <w:bottom w:type="dxa" w:w="60"/>
+              <w:right w:type="dxa" w:w="100"/>
+            </w:tcMar>
+          </w:tcPr>
+          <w:p>
+            <w:r>
+              <w:rPr>
+                <w:sz w:val="20"/>
+                <w:szCs w:val="20"/>
+              </w:rPr>
+              <w:t xml:space="preserve">Folha pronta para imprimir ou salvar em PDF pelo navegador. Com </w:t>
+            </w:r>
+            <w:r>
+              <w:rPr>
+                <w:rFonts w:ascii="Consolas" w:cs="Consolas" w:eastAsia="Consolas" w:hAnsi="Consolas"/>
+                <w:sz w:val="20"/>
+                <w:szCs w:val="20"/>
+              </w:rPr>
+              <w:t xml:space="preserve">gabarito=1</w:t>
+            </w:r>
+            <w:r>
+              <w:rPr>
+                <w:sz w:val="20"/>
+                <w:szCs w:val="20"/>
+              </w:rPr>
+              <w:t xml:space="preserve">, é a versão do professor; </w:t>
+            </w:r>
+            <w:r>
+              <w:rPr>
+                <w:rFonts w:ascii="Consolas" w:cs="Consolas" w:eastAsia="Consolas" w:hAnsi="Consolas"/>
+                <w:sz w:val="20"/>
+                <w:szCs w:val="20"/>
+              </w:rPr>
+              <w:t xml:space="preserve">linhas</w:t>
+            </w:r>
+            <w:r>
+              <w:rPr>
+                <w:sz w:val="20"/>
+                <w:szCs w:val="20"/>
+              </w:rPr>
+              <w:t xml:space="preserve"> define quantas linhas cada resposta discursiva recebe (5, 8, 12 ou 16; padrão 8)</w:t>
+            </w:r>
+          </w:p>
+        </w:tc>
+      </w:tr>
+    </w:tbl>
+    <w:p>
+      <w:pPr>
+        <w:spacing w:after="120"/>
+      </w:pPr>
+    </w:p>
+    <w:p>
+      <w:pPr>
+        <w:pStyle w:val="Heading3"/>
+      </w:pPr>
+      <w:r>
+        <w:t xml:space="preserve">O que sai na folha</w:t>
+      </w:r>
+    </w:p>
+    <w:tbl>
+      <w:tblPr>
+        <w:tblW w:type="dxa" w:w="9071"/>
+        <w:tblBorders>
+          <w:top w:val="single" w:color="auto" w:sz="4"/>
+          <w:left w:val="single" w:color="auto" w:sz="4"/>
+          <w:bottom w:val="single" w:color="auto" w:sz="4"/>
+          <w:right w:val="single" w:color="auto" w:sz="4"/>
+          <w:insideH w:val="single" w:color="auto" w:sz="4"/>
+          <w:insideV w:val="single" w:color="auto" w:sz="4"/>
+        </w:tblBorders>
+      </w:tblPr>
+      <w:tblGrid>
+        <w:gridCol w:w="1814"/>
+        <w:gridCol w:w="3628"/>
+        <w:gridCol w:w="3629"/>
+      </w:tblGrid>
+      <w:tr>
+        <w:trPr>
+          <w:tblHeader/>
+        </w:trPr>
+        <w:tc>
+          <w:tcPr>
+            <w:tcW w:type="dxa" w:w="1814"/>
+            <w:tcBorders>
+              <w:top w:val="single" w:color="BFBFBF" w:sz="4"/>
+              <w:left w:val="single" w:color="BFBFBF" w:sz="4"/>
+              <w:bottom w:val="single" w:color="BFBFBF" w:sz="4"/>
+              <w:right w:val="single" w:color="BFBFBF" w:sz="4"/>
+            </w:tcBorders>
+            <w:shd w:fill="D9E2F3" w:color="auto" w:val="clear"/>
+            <w:tcMar>
+              <w:top w:type="dxa" w:w="60"/>
+              <w:left w:type="dxa" w:w="100"/>
+              <w:bottom w:type="dxa" w:w="60"/>
+              <w:right w:type="dxa" w:w="100"/>
+            </w:tcMar>
+          </w:tcPr>
+          <w:p>
+            <w:r>
+              <w:rPr>
+                <w:b/>
+                <w:bCs/>
+                <w:sz w:val="20"/>
+                <w:szCs w:val="20"/>
+              </w:rPr>
+              <w:t xml:space="preserve">Parte</w:t>
+            </w:r>
+          </w:p>
+        </w:tc>
+        <w:tc>
+          <w:tcPr>
+            <w:tcW w:type="dxa" w:w="3628"/>
+            <w:tcBorders>
+              <w:top w:val="single" w:color="BFBFBF" w:sz="4"/>
+              <w:left w:val="single" w:color="BFBFBF" w:sz="4"/>
+              <w:bottom w:val="single" w:color="BFBFBF" w:sz="4"/>
+              <w:right w:val="single" w:color="BFBFBF" w:sz="4"/>
+            </w:tcBorders>
+            <w:shd w:fill="D9E2F3" w:color="auto" w:val="clear"/>
+            <w:tcMar>
+              <w:top w:type="dxa" w:w="60"/>
+              <w:left w:type="dxa" w:w="100"/>
+              <w:bottom w:type="dxa" w:w="60"/>
+              <w:right w:type="dxa" w:w="100"/>
+            </w:tcMar>
+          </w:tcPr>
+          <w:p>
+            <w:r>
+              <w:rPr>
+                <w:b/>
+                <w:bCs/>
+                <w:sz w:val="20"/>
+                <w:szCs w:val="20"/>
+              </w:rPr>
+              <w:t xml:space="preserve">Folha do aluno</w:t>
+            </w:r>
+          </w:p>
+        </w:tc>
+        <w:tc>
+          <w:tcPr>
+            <w:tcW w:type="dxa" w:w="3629"/>
+            <w:tcBorders>
+              <w:top w:val="single" w:color="BFBFBF" w:sz="4"/>
+              <w:left w:val="single" w:color="BFBFBF" w:sz="4"/>
+              <w:bottom w:val="single" w:color="BFBFBF" w:sz="4"/>
+              <w:right w:val="single" w:color="BFBFBF" w:sz="4"/>
+            </w:tcBorders>
+            <w:shd w:fill="D9E2F3" w:color="auto" w:val="clear"/>
+            <w:tcMar>
+              <w:top w:type="dxa" w:w="60"/>
+              <w:left w:type="dxa" w:w="100"/>
+              <w:bottom w:type="dxa" w:w="60"/>
+              <w:right w:type="dxa" w:w="100"/>
+            </w:tcMar>
+          </w:tcPr>
+          <w:p>
+            <w:r>
+              <w:rPr>
+                <w:b/>
+                <w:bCs/>
+                <w:sz w:val="20"/>
+                <w:szCs w:val="20"/>
+              </w:rPr>
+              <w:t xml:space="preserve">Folha com gabarito</w:t>
+            </w:r>
+          </w:p>
+        </w:tc>
+      </w:tr>
+      <w:tr>
+        <w:trPr>
+          <w:cantSplit/>
+        </w:trPr>
+        <w:tc>
+          <w:tcPr>
+            <w:tcW w:type="dxa" w:w="1814"/>
+            <w:tcBorders>
+              <w:top w:val="single" w:color="BFBFBF" w:sz="4"/>
+              <w:left w:val="single" w:color="BFBFBF" w:sz="4"/>
+              <w:bottom w:val="single" w:color="BFBFBF" w:sz="4"/>
+              <w:right w:val="single" w:color="BFBFBF" w:sz="4"/>
+            </w:tcBorders>
+            <w:tcMar>
+              <w:top w:type="dxa" w:w="60"/>
+              <w:left w:type="dxa" w:w="100"/>
+              <w:bottom w:type="dxa" w:w="60"/>
+              <w:right w:type="dxa" w:w="100"/>
+            </w:tcMar>
+          </w:tcPr>
+          <w:p>
+            <w:r>
+              <w:rPr>
+                <w:sz w:val="20"/>
+                <w:szCs w:val="20"/>
+              </w:rPr>
+              <w:t xml:space="preserve">Cabeçalho</w:t>
+            </w:r>
+          </w:p>
+        </w:tc>
+        <w:tc>
+          <w:tcPr>
+            <w:tcW w:type="dxa" w:w="3628"/>
+            <w:tcBorders>
+              <w:top w:val="single" w:color="BFBFBF" w:sz="4"/>
+              <w:left w:val="single" w:color="BFBFBF" w:sz="4"/>
+              <w:bottom w:val="single" w:color="BFBFBF" w:sz="4"/>
+              <w:right w:val="single" w:color="BFBFBF" w:sz="4"/>
+            </w:tcBorders>
+            <w:tcMar>
+              <w:top w:type="dxa" w:w="60"/>
+              <w:left w:type="dxa" w:w="100"/>
+              <w:bottom w:type="dxa" w:w="60"/>
+              <w:right w:type="dxa" w:w="100"/>
+            </w:tcMar>
+          </w:tcPr>
+          <w:p>
+            <w:r>
+              <w:rPr>
+                <w:sz w:val="20"/>
+                <w:szCs w:val="20"/>
+              </w:rPr>
+              <w:t xml:space="preserve">Título, turma e campos para nome, turma, data e nota</w:t>
+            </w:r>
+          </w:p>
+        </w:tc>
+        <w:tc>
+          <w:tcPr>
+            <w:tcW w:type="dxa" w:w="3629"/>
+            <w:tcBorders>
+              <w:top w:val="single" w:color="BFBFBF" w:sz="4"/>
+              <w:left w:val="single" w:color="BFBFBF" w:sz="4"/>
+              <w:bottom w:val="single" w:color="BFBFBF" w:sz="4"/>
+              <w:right w:val="single" w:color="BFBFBF" w:sz="4"/>
+            </w:tcBorders>
+            <w:tcMar>
+              <w:top w:type="dxa" w:w="60"/>
+              <w:left w:type="dxa" w:w="100"/>
+              <w:bottom w:type="dxa" w:w="60"/>
+              <w:right w:type="dxa" w:w="100"/>
+            </w:tcMar>
+          </w:tcPr>
+          <w:p>
+            <w:r>
+              <w:rPr>
+                <w:sz w:val="20"/>
+                <w:szCs w:val="20"/>
+              </w:rPr>
+              <w:t xml:space="preserve">Título, turma e a indicação "Gabarito, uso do professor"</w:t>
+            </w:r>
+          </w:p>
+        </w:tc>
+      </w:tr>
+      <w:tr>
+        <w:trPr>
+          <w:cantSplit/>
+        </w:trPr>
+        <w:tc>
+          <w:tcPr>
+            <w:tcW w:type="dxa" w:w="1814"/>
+            <w:tcBorders>
+              <w:top w:val="single" w:color="BFBFBF" w:sz="4"/>
+              <w:left w:val="single" w:color="BFBFBF" w:sz="4"/>
+              <w:bottom w:val="single" w:color="BFBFBF" w:sz="4"/>
+              <w:right w:val="single" w:color="BFBFBF" w:sz="4"/>
+            </w:tcBorders>
+            <w:tcMar>
+              <w:top w:type="dxa" w:w="60"/>
+              <w:left w:type="dxa" w:w="100"/>
+              <w:bottom w:type="dxa" w:w="60"/>
+              <w:right w:type="dxa" w:w="100"/>
+            </w:tcMar>
+          </w:tcPr>
+          <w:p>
+            <w:r>
+              <w:rPr>
+                <w:sz w:val="20"/>
+                <w:szCs w:val="20"/>
+              </w:rPr>
+              <w:t xml:space="preserve">Instruções</w:t>
+            </w:r>
+          </w:p>
+        </w:tc>
+        <w:tc>
+          <w:tcPr>
+            <w:tcW w:type="dxa" w:w="3628"/>
+            <w:tcBorders>
+              <w:top w:val="single" w:color="BFBFBF" w:sz="4"/>
+              <w:left w:val="single" w:color="BFBFBF" w:sz="4"/>
+              <w:bottom w:val="single" w:color="BFBFBF" w:sz="4"/>
+              <w:right w:val="single" w:color="BFBFBF" w:sz="4"/>
+            </w:tcBorders>
+            <w:tcMar>
+              <w:top w:type="dxa" w:w="60"/>
+              <w:left w:type="dxa" w:w="100"/>
+              <w:bottom w:type="dxa" w:w="60"/>
+              <w:right w:type="dxa" w:w="100"/>
+            </w:tcMar>
+          </w:tcPr>
+          <w:p>
+            <w:r>
+              <w:rPr>
+                <w:sz w:val="20"/>
+                <w:szCs w:val="20"/>
+              </w:rPr>
+              <w:t xml:space="preserve">Impressas logo abaixo do cabeçalho</w:t>
+            </w:r>
+          </w:p>
+        </w:tc>
+        <w:tc>
+          <w:tcPr>
+            <w:tcW w:type="dxa" w:w="3629"/>
+            <w:tcBorders>
+              <w:top w:val="single" w:color="BFBFBF" w:sz="4"/>
+              <w:left w:val="single" w:color="BFBFBF" w:sz="4"/>
+              <w:bottom w:val="single" w:color="BFBFBF" w:sz="4"/>
+              <w:right w:val="single" w:color="BFBFBF" w:sz="4"/>
+            </w:tcBorders>
+            <w:tcMar>
+              <w:top w:type="dxa" w:w="60"/>
+              <w:left w:type="dxa" w:w="100"/>
+              <w:bottom w:type="dxa" w:w="60"/>
+              <w:right w:type="dxa" w:w="100"/>
+            </w:tcMar>
+          </w:tcPr>
+          <w:p>
+            <w:r>
+              <w:rPr>
+                <w:sz w:val="20"/>
+                <w:szCs w:val="20"/>
+              </w:rPr>
+              <w:t xml:space="preserve">Omitidas</w:t>
+            </w:r>
+          </w:p>
+        </w:tc>
+      </w:tr>
+      <w:tr>
+        <w:trPr>
+          <w:cantSplit/>
+        </w:trPr>
+        <w:tc>
+          <w:tcPr>
+            <w:tcW w:type="dxa" w:w="1814"/>
+            <w:tcBorders>
+              <w:top w:val="single" w:color="BFBFBF" w:sz="4"/>
+              <w:left w:val="single" w:color="BFBFBF" w:sz="4"/>
+              <w:bottom w:val="single" w:color="BFBFBF" w:sz="4"/>
+              <w:right w:val="single" w:color="BFBFBF" w:sz="4"/>
+            </w:tcBorders>
+            <w:tcMar>
+              <w:top w:type="dxa" w:w="60"/>
+              <w:left w:type="dxa" w:w="100"/>
+              <w:bottom w:type="dxa" w:w="60"/>
+              <w:right w:type="dxa" w:w="100"/>
+            </w:tcMar>
+          </w:tcPr>
+          <w:p>
+            <w:r>
+              <w:rPr>
+                <w:sz w:val="20"/>
+                <w:szCs w:val="20"/>
+              </w:rPr>
+              <w:t xml:space="preserve">Resumo</w:t>
+            </w:r>
+          </w:p>
+        </w:tc>
+        <w:tc>
+          <w:tcPr>
+            <w:tcW w:type="dxa" w:w="3628"/>
+            <w:tcBorders>
+              <w:top w:val="single" w:color="BFBFBF" w:sz="4"/>
+              <w:left w:val="single" w:color="BFBFBF" w:sz="4"/>
+              <w:bottom w:val="single" w:color="BFBFBF" w:sz="4"/>
+              <w:right w:val="single" w:color="BFBFBF" w:sz="4"/>
+            </w:tcBorders>
+            <w:tcMar>
+              <w:top w:type="dxa" w:w="60"/>
+              <w:left w:type="dxa" w:w="100"/>
+              <w:bottom w:type="dxa" w:w="60"/>
+              <w:right w:type="dxa" w:w="100"/>
+            </w:tcMar>
+          </w:tcPr>
+          <w:p>
+            <w:r>
+              <w:rPr>
+                <w:sz w:val="20"/>
+                <w:szCs w:val="20"/>
+              </w:rPr>
+              <w:t xml:space="preserve">Não há</w:t>
+            </w:r>
+          </w:p>
+        </w:tc>
+        <w:tc>
+          <w:tcPr>
+            <w:tcW w:type="dxa" w:w="3629"/>
+            <w:tcBorders>
+              <w:top w:val="single" w:color="BFBFBF" w:sz="4"/>
+              <w:left w:val="single" w:color="BFBFBF" w:sz="4"/>
+              <w:bottom w:val="single" w:color="BFBFBF" w:sz="4"/>
+              <w:right w:val="single" w:color="BFBFBF" w:sz="4"/>
+            </w:tcBorders>
+            <w:tcMar>
+              <w:top w:type="dxa" w:w="60"/>
+              <w:left w:type="dxa" w:w="100"/>
+              <w:bottom w:type="dxa" w:w="60"/>
+              <w:right w:type="dxa" w:w="100"/>
+            </w:tcMar>
+          </w:tcPr>
+          <w:p>
+            <w:r>
+              <w:rPr>
+                <w:sz w:val="20"/>
+                <w:szCs w:val="20"/>
+              </w:rPr>
+              <w:t xml:space="preserve">Lista das objetivas com a letra correta, pelo número da questão na folha</w:t>
+            </w:r>
+          </w:p>
+        </w:tc>
+      </w:tr>
+      <w:tr>
+        <w:trPr>
+          <w:cantSplit/>
+        </w:trPr>
+        <w:tc>
+          <w:tcPr>
+            <w:tcW w:type="dxa" w:w="1814"/>
+            <w:tcBorders>
+              <w:top w:val="single" w:color="BFBFBF" w:sz="4"/>
+              <w:left w:val="single" w:color="BFBFBF" w:sz="4"/>
+              <w:bottom w:val="single" w:color="BFBFBF" w:sz="4"/>
+              <w:right w:val="single" w:color="BFBFBF" w:sz="4"/>
+            </w:tcBorders>
+            <w:tcMar>
+              <w:top w:type="dxa" w:w="60"/>
+              <w:left w:type="dxa" w:w="100"/>
+              <w:bottom w:type="dxa" w:w="60"/>
+              <w:right w:type="dxa" w:w="100"/>
+            </w:tcMar>
+          </w:tcPr>
+          <w:p>
+            <w:r>
+              <w:rPr>
+                <w:sz w:val="20"/>
+                <w:szCs w:val="20"/>
+              </w:rPr>
+              <w:t xml:space="preserve">Objetivas</w:t>
+            </w:r>
+          </w:p>
+        </w:tc>
+        <w:tc>
+          <w:tcPr>
+            <w:tcW w:type="dxa" w:w="3628"/>
+            <w:tcBorders>
+              <w:top w:val="single" w:color="BFBFBF" w:sz="4"/>
+              <w:left w:val="single" w:color="BFBFBF" w:sz="4"/>
+              <w:bottom w:val="single" w:color="BFBFBF" w:sz="4"/>
+              <w:right w:val="single" w:color="BFBFBF" w:sz="4"/>
+            </w:tcBorders>
+            <w:tcMar>
+              <w:top w:type="dxa" w:w="60"/>
+              <w:left w:type="dxa" w:w="100"/>
+              <w:bottom w:type="dxa" w:w="60"/>
+              <w:right w:type="dxa" w:w="100"/>
+            </w:tcMar>
+          </w:tcPr>
+          <w:p>
+            <w:r>
+              <w:rPr>
+                <w:sz w:val="20"/>
+                <w:szCs w:val="20"/>
+              </w:rPr>
+              <w:t xml:space="preserve">Enunciado e alternativas com um círculo para marcar</w:t>
+            </w:r>
+          </w:p>
+        </w:tc>
+        <w:tc>
+          <w:tcPr>
+            <w:tcW w:type="dxa" w:w="3629"/>
+            <w:tcBorders>
+              <w:top w:val="single" w:color="BFBFBF" w:sz="4"/>
+              <w:left w:val="single" w:color="BFBFBF" w:sz="4"/>
+              <w:bottom w:val="single" w:color="BFBFBF" w:sz="4"/>
+              <w:right w:val="single" w:color="BFBFBF" w:sz="4"/>
+            </w:tcBorders>
+            <w:tcMar>
+              <w:top w:type="dxa" w:w="60"/>
+              <w:left w:type="dxa" w:w="100"/>
+              <w:bottom w:type="dxa" w:w="60"/>
+              <w:right w:type="dxa" w:w="100"/>
+            </w:tcMar>
+          </w:tcPr>
+          <w:p>
+            <w:r>
+              <w:rPr>
+                <w:sz w:val="20"/>
+                <w:szCs w:val="20"/>
+              </w:rPr>
+              <w:t xml:space="preserve">A alternativa correta com o círculo preenchido e em negrito</w:t>
+            </w:r>
+          </w:p>
+        </w:tc>
+      </w:tr>
+      <w:tr>
+        <w:trPr>
+          <w:cantSplit/>
+        </w:trPr>
+        <w:tc>
+          <w:tcPr>
+            <w:tcW w:type="dxa" w:w="1814"/>
+            <w:tcBorders>
+              <w:top w:val="single" w:color="BFBFBF" w:sz="4"/>
+              <w:left w:val="single" w:color="BFBFBF" w:sz="4"/>
+              <w:bottom w:val="single" w:color="BFBFBF" w:sz="4"/>
+              <w:right w:val="single" w:color="BFBFBF" w:sz="4"/>
+            </w:tcBorders>
+            <w:tcMar>
+              <w:top w:type="dxa" w:w="60"/>
+              <w:left w:type="dxa" w:w="100"/>
+              <w:bottom w:type="dxa" w:w="60"/>
+              <w:right w:type="dxa" w:w="100"/>
+            </w:tcMar>
+          </w:tcPr>
+          <w:p>
+            <w:r>
+              <w:rPr>
+                <w:sz w:val="20"/>
+                <w:szCs w:val="20"/>
+              </w:rPr>
+              <w:t xml:space="preserve">Discursivas</w:t>
+            </w:r>
+          </w:p>
+        </w:tc>
+        <w:tc>
+          <w:tcPr>
+            <w:tcW w:type="dxa" w:w="3628"/>
+            <w:tcBorders>
+              <w:top w:val="single" w:color="BFBFBF" w:sz="4"/>
+              <w:left w:val="single" w:color="BFBFBF" w:sz="4"/>
+              <w:bottom w:val="single" w:color="BFBFBF" w:sz="4"/>
+              <w:right w:val="single" w:color="BFBFBF" w:sz="4"/>
+            </w:tcBorders>
+            <w:tcMar>
+              <w:top w:type="dxa" w:w="60"/>
+              <w:left w:type="dxa" w:w="100"/>
+              <w:bottom w:type="dxa" w:w="60"/>
+              <w:right w:type="dxa" w:w="100"/>
+            </w:tcMar>
+          </w:tcPr>
+          <w:p>
+            <w:r>
+              <w:rPr>
+                <w:sz w:val="20"/>
+                <w:szCs w:val="20"/>
+              </w:rPr>
+              <w:t xml:space="preserve">Enunciado, valor em pontos e linhas para a resposta, separadas por item quando houver</w:t>
+            </w:r>
+          </w:p>
+        </w:tc>
+        <w:tc>
+          <w:tcPr>
+            <w:tcW w:type="dxa" w:w="3629"/>
+            <w:tcBorders>
+              <w:top w:val="single" w:color="BFBFBF" w:sz="4"/>
+              <w:left w:val="single" w:color="BFBFBF" w:sz="4"/>
+              <w:bottom w:val="single" w:color="BFBFBF" w:sz="4"/>
+              <w:right w:val="single" w:color="BFBFBF" w:sz="4"/>
+            </w:tcBorders>
+            <w:tcMar>
+              <w:top w:type="dxa" w:w="60"/>
+              <w:left w:type="dxa" w:w="100"/>
+              <w:bottom w:type="dxa" w:w="60"/>
+              <w:right w:type="dxa" w:w="100"/>
+            </w:tcMar>
+          </w:tcPr>
+          <w:p>
+            <w:r>
+              <w:rPr>
+                <w:sz w:val="20"/>
+                <w:szCs w:val="20"/>
+              </w:rPr>
+              <w:t xml:space="preserve">Enunciado, itens, resposta esperada e rubrica com os pontos de cada critério</w:t>
+            </w:r>
+          </w:p>
+        </w:tc>
+      </w:tr>
+    </w:tbl>
+    <w:p>
+      <w:pPr>
+        <w:spacing w:after="120"/>
+      </w:pPr>
+    </w:p>
+    <w:p>
+      <w:pPr>
+        <w:spacing w:after="120" w:line="300"/>
+      </w:pPr>
+      <w:r>
+        <w:t xml:space="preserve">A folha usa uma folha de estilo própria (</w:t>
+      </w:r>
+      <w:r>
+        <w:rPr>
+          <w:rFonts w:ascii="Consolas" w:cs="Consolas" w:eastAsia="Consolas" w:hAnsi="Consolas"/>
+          <w:sz w:val="20"/>
+          <w:szCs w:val="20"/>
+        </w:rPr>
+        <w:t xml:space="preserve">app/static/impressao.css</w:t>
+      </w:r>
+      <w:r>
+        <w:t xml:space="preserve">), sempre clara, com o tamanho de página A4 definido para a impressão. Uma questão de alternativas e o bloco de cada item não são quebrados entre páginas. A barra de controles do topo da tela não sai na impressão.</w:t>
+      </w:r>
+    </w:p>
+    <w:p>
+      <w:pPr>
+        <w:spacing w:after="120" w:line="300"/>
+      </w:pPr>
+      <w:r>
+        <w:t xml:space="preserve">Um layout padronizado de folha também prepara a fase posterior de reconhecimento de texto manuscrito: com as respostas sempre nas mesmas áreas da página, fica mais simples localizar cada resposta na imagem digitalizada.</w:t>
+      </w:r>
+    </w:p>
+    <w:p>
+      <w:pPr>
         <w:pStyle w:val="Heading1"/>
       </w:pPr>
       <w:r>
@@ -29715,7 +32236,7 @@
         <w:t xml:space="preserve">pytest</w:t>
       </w:r>
       <w:r>
-        <w:t xml:space="preserve"> e não acessam a internet nem gastam crédito: a API da OpenAI e a API do ENEM são substituídas por versões falsas que devolvem respostas controladas. Total nesta versão: 161 testes. Os testes de páginas entram com uma conta de administrador criada no banco de teste, e o custo do scrypt é reduzido só nos testes, para que rodem em poucos segundos.</w:t>
+        <w:t xml:space="preserve"> e não acessam a internet nem gastam crédito: a API da OpenAI e a API do ENEM são substituídas por versões falsas que devolvem respostas controladas. Total nesta versão: 172 testes. Os testes de páginas entram com uma conta de administrador criada no banco de teste, e o custo do scrypt é reduzido só nos testes, para que rodem em poucos segundos.</w:t>
       </w:r>
     </w:p>
     <w:tbl>
@@ -30288,6 +32809,64 @@
                 <w:sz w:val="20"/>
                 <w:szCs w:val="20"/>
               </w:rPr>
+              <w:t xml:space="preserve">tests/test_atividades.py</w:t>
+            </w:r>
+          </w:p>
+        </w:tc>
+        <w:tc>
+          <w:tcPr>
+            <w:tcW w:type="dxa" w:w="6350"/>
+            <w:tcBorders>
+              <w:top w:val="single" w:color="BFBFBF" w:sz="4"/>
+              <w:left w:val="single" w:color="BFBFBF" w:sz="4"/>
+              <w:bottom w:val="single" w:color="BFBFBF" w:sz="4"/>
+              <w:right w:val="single" w:color="BFBFBF" w:sz="4"/>
+            </w:tcBorders>
+            <w:tcMar>
+              <w:top w:type="dxa" w:w="60"/>
+              <w:left w:type="dxa" w:w="100"/>
+              <w:bottom w:type="dxa" w:w="60"/>
+              <w:right w:type="dxa" w:w="100"/>
+            </w:tcMar>
+          </w:tcPr>
+          <w:p>
+            <w:r>
+              <w:rPr>
+                <w:sz w:val="20"/>
+                <w:szCs w:val="20"/>
+              </w:rPr>
+              <w:t xml:space="preserve">Criação e título obrigatório; adicionar sem repetir, mover e remover com renumeração; busca que esconde as já incluídas; retorno só para dentro da atividade; editar e excluir sem apagar questões; folha do aluno com ordem, itens, alternativas e linhas; número de linhas; folha com gabarito, resumo das objetivas, resposta esperada e rubrica; acesso só com login</w:t>
+            </w:r>
+          </w:p>
+        </w:tc>
+      </w:tr>
+      <w:tr>
+        <w:trPr>
+          <w:cantSplit/>
+        </w:trPr>
+        <w:tc>
+          <w:tcPr>
+            <w:tcW w:type="dxa" w:w="2721"/>
+            <w:tcBorders>
+              <w:top w:val="single" w:color="BFBFBF" w:sz="4"/>
+              <w:left w:val="single" w:color="BFBFBF" w:sz="4"/>
+              <w:bottom w:val="single" w:color="BFBFBF" w:sz="4"/>
+              <w:right w:val="single" w:color="BFBFBF" w:sz="4"/>
+            </w:tcBorders>
+            <w:tcMar>
+              <w:top w:type="dxa" w:w="60"/>
+              <w:left w:type="dxa" w:w="100"/>
+              <w:bottom w:type="dxa" w:w="60"/>
+              <w:right w:type="dxa" w:w="100"/>
+            </w:tcMar>
+          </w:tcPr>
+          <w:p>
+            <w:r>
+              <w:rPr>
+                <w:rFonts w:ascii="Consolas" w:cs="Consolas" w:eastAsia="Consolas" w:hAnsi="Consolas"/>
+                <w:sz w:val="20"/>
+                <w:szCs w:val="20"/>
+              </w:rPr>
               <w:t xml:space="preserve">tests/test_lista_questoes.py</w:t>
             </w:r>
           </w:p>
@@ -32240,6 +34819,128 @@
                 <w:szCs w:val="20"/>
               </w:rPr>
               <w:t xml:space="preserve">Uma conta comprometida ou um uso por engano não consegue consumir o orçamento de um mês em um dia</w:t>
+            </w:r>
+          </w:p>
+        </w:tc>
+      </w:tr>
+      <w:tr>
+        <w:trPr>
+          <w:cantSplit/>
+        </w:trPr>
+        <w:tc>
+          <w:tcPr>
+            <w:tcW w:type="dxa" w:w="3628"/>
+            <w:tcBorders>
+              <w:top w:val="single" w:color="BFBFBF" w:sz="4"/>
+              <w:left w:val="single" w:color="BFBFBF" w:sz="4"/>
+              <w:bottom w:val="single" w:color="BFBFBF" w:sz="4"/>
+              <w:right w:val="single" w:color="BFBFBF" w:sz="4"/>
+            </w:tcBorders>
+            <w:tcMar>
+              <w:top w:type="dxa" w:w="60"/>
+              <w:left w:type="dxa" w:w="100"/>
+              <w:bottom w:type="dxa" w:w="60"/>
+              <w:right w:type="dxa" w:w="100"/>
+            </w:tcMar>
+          </w:tcPr>
+          <w:p>
+            <w:r>
+              <w:rPr>
+                <w:sz w:val="20"/>
+                <w:szCs w:val="20"/>
+              </w:rPr>
+              <w:t xml:space="preserve">Impressão pelo navegador, sem gerar PDF no servidor</w:t>
+            </w:r>
+          </w:p>
+        </w:tc>
+        <w:tc>
+          <w:tcPr>
+            <w:tcW w:type="dxa" w:w="5443"/>
+            <w:tcBorders>
+              <w:top w:val="single" w:color="BFBFBF" w:sz="4"/>
+              <w:left w:val="single" w:color="BFBFBF" w:sz="4"/>
+              <w:bottom w:val="single" w:color="BFBFBF" w:sz="4"/>
+              <w:right w:val="single" w:color="BFBFBF" w:sz="4"/>
+            </w:tcBorders>
+            <w:tcMar>
+              <w:top w:type="dxa" w:w="60"/>
+              <w:left w:type="dxa" w:w="100"/>
+              <w:bottom w:type="dxa" w:w="60"/>
+              <w:right w:type="dxa" w:w="100"/>
+            </w:tcMar>
+          </w:tcPr>
+          <w:p>
+            <w:r>
+              <w:rPr>
+                <w:sz w:val="20"/>
+                <w:szCs w:val="20"/>
+              </w:rPr>
+              <w:t xml:space="preserve">O navegador já imprime e salva em PDF; gerar o arquivo no servidor exigiria uma dependência pesada sem ganho para o uso</w:t>
+            </w:r>
+          </w:p>
+        </w:tc>
+      </w:tr>
+      <w:tr>
+        <w:trPr>
+          <w:cantSplit/>
+        </w:trPr>
+        <w:tc>
+          <w:tcPr>
+            <w:tcW w:type="dxa" w:w="3628"/>
+            <w:tcBorders>
+              <w:top w:val="single" w:color="BFBFBF" w:sz="4"/>
+              <w:left w:val="single" w:color="BFBFBF" w:sz="4"/>
+              <w:bottom w:val="single" w:color="BFBFBF" w:sz="4"/>
+              <w:right w:val="single" w:color="BFBFBF" w:sz="4"/>
+            </w:tcBorders>
+            <w:tcMar>
+              <w:top w:type="dxa" w:w="60"/>
+              <w:left w:type="dxa" w:w="100"/>
+              <w:bottom w:type="dxa" w:w="60"/>
+              <w:right w:type="dxa" w:w="100"/>
+            </w:tcMar>
+          </w:tcPr>
+          <w:p>
+            <w:r>
+              <w:rPr>
+                <w:sz w:val="20"/>
+                <w:szCs w:val="20"/>
+              </w:rPr>
+              <w:t xml:space="preserve">Atividades visíveis a todas as contas</w:t>
+            </w:r>
+          </w:p>
+        </w:tc>
+        <w:tc>
+          <w:tcPr>
+            <w:tcW w:type="dxa" w:w="5443"/>
+            <w:tcBorders>
+              <w:top w:val="single" w:color="BFBFBF" w:sz="4"/>
+              <w:left w:val="single" w:color="BFBFBF" w:sz="4"/>
+              <w:bottom w:val="single" w:color="BFBFBF" w:sz="4"/>
+              <w:right w:val="single" w:color="BFBFBF" w:sz="4"/>
+            </w:tcBorders>
+            <w:tcMar>
+              <w:top w:type="dxa" w:w="60"/>
+              <w:left w:type="dxa" w:w="100"/>
+              <w:bottom w:type="dxa" w:w="60"/>
+              <w:right w:type="dxa" w:w="100"/>
+            </w:tcMar>
+          </w:tcPr>
+          <w:p>
+            <w:r>
+              <w:rPr>
+                <w:sz w:val="20"/>
+                <w:szCs w:val="20"/>
+              </w:rPr>
+              <w:t xml:space="preserve">No protótipo, os avaliadores trabalham sobre o mesmo corpus. Num produto, cada professor veria só as suas, o que exige apenas filtrar por </w:t>
+            </w:r>
+            <w:r>
+              <w:rPr>
+                <w:rFonts w:ascii="Consolas" w:cs="Consolas" w:eastAsia="Consolas" w:hAnsi="Consolas"/>
+                <w:sz w:val="20"/>
+                <w:szCs w:val="20"/>
+              </w:rPr>
+              <w:t xml:space="preserve">usuario_id</w:t>
             </w:r>
           </w:p>
         </w:tc>
@@ -35193,6 +37894,115 @@
                 <w:szCs w:val="20"/>
               </w:rPr>
               <w:t xml:space="preserve">Mudança</w:t>
+            </w:r>
+          </w:p>
+        </w:tc>
+      </w:tr>
+      <w:tr>
+        <w:trPr>
+          <w:cantSplit/>
+        </w:trPr>
+        <w:tc>
+          <w:tcPr>
+            <w:tcW w:type="dxa" w:w="1511"/>
+            <w:tcBorders>
+              <w:top w:val="single" w:color="BFBFBF" w:sz="4"/>
+              <w:left w:val="single" w:color="BFBFBF" w:sz="4"/>
+              <w:bottom w:val="single" w:color="BFBFBF" w:sz="4"/>
+              <w:right w:val="single" w:color="BFBFBF" w:sz="4"/>
+            </w:tcBorders>
+            <w:tcMar>
+              <w:top w:type="dxa" w:w="60"/>
+              <w:left w:type="dxa" w:w="100"/>
+              <w:bottom w:type="dxa" w:w="60"/>
+              <w:right w:type="dxa" w:w="100"/>
+            </w:tcMar>
+          </w:tcPr>
+          <w:p>
+            <w:r>
+              <w:rPr>
+                <w:sz w:val="20"/>
+                <w:szCs w:val="20"/>
+              </w:rPr>
+              <w:t xml:space="preserve">24/10/2026</w:t>
+            </w:r>
+          </w:p>
+        </w:tc>
+        <w:tc>
+          <w:tcPr>
+            <w:tcW w:type="dxa" w:w="1209"/>
+            <w:tcBorders>
+              <w:top w:val="single" w:color="BFBFBF" w:sz="4"/>
+              <w:left w:val="single" w:color="BFBFBF" w:sz="4"/>
+              <w:bottom w:val="single" w:color="BFBFBF" w:sz="4"/>
+              <w:right w:val="single" w:color="BFBFBF" w:sz="4"/>
+            </w:tcBorders>
+            <w:tcMar>
+              <w:top w:type="dxa" w:w="60"/>
+              <w:left w:type="dxa" w:w="100"/>
+              <w:bottom w:type="dxa" w:w="60"/>
+              <w:right w:type="dxa" w:w="100"/>
+            </w:tcMar>
+          </w:tcPr>
+          <w:p>
+            <w:r>
+              <w:rPr>
+                <w:sz w:val="20"/>
+                <w:szCs w:val="20"/>
+              </w:rPr>
+              <w:t xml:space="preserve">0.12</w:t>
+            </w:r>
+          </w:p>
+        </w:tc>
+        <w:tc>
+          <w:tcPr>
+            <w:tcW w:type="dxa" w:w="2267"/>
+            <w:tcBorders>
+              <w:top w:val="single" w:color="BFBFBF" w:sz="4"/>
+              <w:left w:val="single" w:color="BFBFBF" w:sz="4"/>
+              <w:bottom w:val="single" w:color="BFBFBF" w:sz="4"/>
+              <w:right w:val="single" w:color="BFBFBF" w:sz="4"/>
+            </w:tcBorders>
+            <w:tcMar>
+              <w:top w:type="dxa" w:w="60"/>
+              <w:left w:type="dxa" w:w="100"/>
+              <w:bottom w:type="dxa" w:w="60"/>
+              <w:right w:type="dxa" w:w="100"/>
+            </w:tcMar>
+          </w:tcPr>
+          <w:p>
+            <w:r>
+              <w:rPr>
+                <w:sz w:val="20"/>
+                <w:szCs w:val="20"/>
+              </w:rPr>
+              <w:t xml:space="preserve">pull request das atividades</w:t>
+            </w:r>
+          </w:p>
+        </w:tc>
+        <w:tc>
+          <w:tcPr>
+            <w:tcW w:type="dxa" w:w="4084"/>
+            <w:tcBorders>
+              <w:top w:val="single" w:color="BFBFBF" w:sz="4"/>
+              <w:left w:val="single" w:color="BFBFBF" w:sz="4"/>
+              <w:bottom w:val="single" w:color="BFBFBF" w:sz="4"/>
+              <w:right w:val="single" w:color="BFBFBF" w:sz="4"/>
+            </w:tcBorders>
+            <w:tcMar>
+              <w:top w:type="dxa" w:w="60"/>
+              <w:left w:type="dxa" w:w="100"/>
+              <w:bottom w:type="dxa" w:w="60"/>
+              <w:right w:type="dxa" w:w="100"/>
+            </w:tcMar>
+          </w:tcPr>
+          <w:p>
+            <w:r>
+              <w:rPr>
+                <w:sz w:val="20"/>
+                <w:szCs w:val="20"/>
+              </w:rPr>
+              <w:t xml:space="preserve">Atividades com questões em ordem, aba própria na barra de navegação e folha de impressão em A4 para o aluno e com gabarito</w:t>
             </w:r>
           </w:p>
         </w:tc>
@@ -36761,7 +39571,7 @@
         <w:sz w:val="18"/>
         <w:szCs w:val="18"/>
       </w:rPr>
-      <w:t xml:space="preserve">Documentação Técnica do Protótipo, versão 0.11</w:t>
+      <w:t xml:space="preserve">Documentação Técnica do Protótipo, versão 0.12</w:t>
     </w:r>
   </w:p>
 </w:hdr>

</xml_diff>

<commit_message>
Documentação 0.14: folhas de resposta
Co-Authored-By: Claude Opus 5.5 <noreply@anthropic.com>
Claude-Session: https://claude.ai/code/session_01W2sxSqc4ZdmAUWH2L8vsV2
</commit_message>
<xml_diff>
--- a/docs/Documentacao_Tecnica.docx
+++ b/docs/Documentacao_Tecnica.docx
@@ -114,7 +114,7 @@
         <w:t xml:space="preserve">Versão: </w:t>
       </w:r>
       <w:r>
-        <w:t xml:space="preserve">0.13, de 26/10/2026</w:t>
+        <w:t xml:space="preserve">0.14, de 31/10/2026</w:t>
       </w:r>
     </w:p>
     <w:p>
@@ -1500,6 +1500,89 @@
                 <w:sz w:val="20"/>
                 <w:szCs w:val="20"/>
               </w:rPr>
+              <w:t xml:space="preserve">Apoio</w:t>
+            </w:r>
+          </w:p>
+        </w:tc>
+        <w:tc>
+          <w:tcPr>
+            <w:tcW w:type="dxa" w:w="4535"/>
+            <w:tcBorders>
+              <w:top w:val="single" w:color="BFBFBF" w:sz="4"/>
+              <w:left w:val="single" w:color="BFBFBF" w:sz="4"/>
+              <w:bottom w:val="single" w:color="BFBFBF" w:sz="4"/>
+              <w:right w:val="single" w:color="BFBFBF" w:sz="4"/>
+            </w:tcBorders>
+            <w:tcMar>
+              <w:top w:type="dxa" w:w="60"/>
+              <w:left w:type="dxa" w:w="100"/>
+              <w:bottom w:type="dxa" w:w="60"/>
+              <w:right w:type="dxa" w:w="100"/>
+            </w:tcMar>
+          </w:tcPr>
+          <w:p>
+            <w:r>
+              <w:rPr>
+                <w:sz w:val="20"/>
+                <w:szCs w:val="20"/>
+              </w:rPr>
+              <w:t xml:space="preserve">Folhas de resposta com código único, primeira parte do fluxo de resultados dos alunos</w:t>
+            </w:r>
+          </w:p>
+        </w:tc>
+        <w:tc>
+          <w:tcPr>
+            <w:tcW w:type="dxa" w:w="3629"/>
+            <w:tcBorders>
+              <w:top w:val="single" w:color="BFBFBF" w:sz="4"/>
+              <w:left w:val="single" w:color="BFBFBF" w:sz="4"/>
+              <w:bottom w:val="single" w:color="BFBFBF" w:sz="4"/>
+              <w:right w:val="single" w:color="BFBFBF" w:sz="4"/>
+            </w:tcBorders>
+            <w:tcMar>
+              <w:top w:type="dxa" w:w="60"/>
+              <w:left w:type="dxa" w:w="100"/>
+              <w:bottom w:type="dxa" w:w="60"/>
+              <w:right w:type="dxa" w:w="100"/>
+            </w:tcMar>
+          </w:tcPr>
+          <w:p>
+            <w:r>
+              <w:rPr>
+                <w:sz w:val="20"/>
+                <w:szCs w:val="20"/>
+              </w:rPr>
+              <w:t xml:space="preserve">Implementado em 31/10/2026; aguardando revisão</w:t>
+            </w:r>
+          </w:p>
+        </w:tc>
+      </w:tr>
+      <w:tr>
+        <w:trPr>
+          <w:cantSplit/>
+        </w:trPr>
+        <w:tc>
+          <w:tcPr>
+            <w:tcW w:type="dxa" w:w="907"/>
+            <w:tcBorders>
+              <w:top w:val="single" w:color="BFBFBF" w:sz="4"/>
+              <w:left w:val="single" w:color="BFBFBF" w:sz="4"/>
+              <w:bottom w:val="single" w:color="BFBFBF" w:sz="4"/>
+              <w:right w:val="single" w:color="BFBFBF" w:sz="4"/>
+            </w:tcBorders>
+            <w:tcMar>
+              <w:top w:type="dxa" w:w="60"/>
+              <w:left w:type="dxa" w:w="100"/>
+              <w:bottom w:type="dxa" w:w="60"/>
+              <w:right w:type="dxa" w:w="100"/>
+            </w:tcMar>
+          </w:tcPr>
+          <w:p>
+            <w:r>
+              <w:rPr>
+                <w:sz w:val="20"/>
+                <w:szCs w:val="20"/>
+              </w:rPr>
               <w:t xml:space="preserve">5</w:t>
             </w:r>
           </w:p>
@@ -3326,7 +3409,7 @@
                 <w:sz w:val="20"/>
                 <w:szCs w:val="20"/>
               </w:rPr>
-              <w:t xml:space="preserve">Definição das treze tabelas do banco</w:t>
+              <w:t xml:space="preserve">Definição das quatorze tabelas do banco</w:t>
             </w:r>
           </w:p>
         </w:tc>
@@ -3811,7 +3894,7 @@
                 <w:sz w:val="20"/>
                 <w:szCs w:val="20"/>
               </w:rPr>
-              <w:t xml:space="preserve">Atividades: montagem de conjuntos de questões e folha de impressão em A4 (</w:t>
+              <w:t xml:space="preserve">Atividades: montagem de conjuntos de questões, caderno de questões em A4 e rotas das folhas de resposta (</w:t>
             </w:r>
             <w:r>
               <w:rPr>
@@ -3820,6 +3903,94 @@
                 <w:szCs w:val="20"/>
               </w:rPr>
               <w:t xml:space="preserve">router.py</w:t>
+            </w:r>
+            <w:r>
+              <w:rPr>
+                <w:sz w:val="20"/>
+                <w:szCs w:val="20"/>
+              </w:rPr>
+              <w:t xml:space="preserve">)</w:t>
+            </w:r>
+          </w:p>
+        </w:tc>
+      </w:tr>
+      <w:tr>
+        <w:trPr>
+          <w:cantSplit/>
+        </w:trPr>
+        <w:tc>
+          <w:tcPr>
+            <w:tcW w:type="dxa" w:w="2721"/>
+            <w:tcBorders>
+              <w:top w:val="single" w:color="BFBFBF" w:sz="4"/>
+              <w:left w:val="single" w:color="BFBFBF" w:sz="4"/>
+              <w:bottom w:val="single" w:color="BFBFBF" w:sz="4"/>
+              <w:right w:val="single" w:color="BFBFBF" w:sz="4"/>
+            </w:tcBorders>
+            <w:tcMar>
+              <w:top w:type="dxa" w:w="60"/>
+              <w:left w:type="dxa" w:w="100"/>
+              <w:bottom w:type="dxa" w:w="60"/>
+              <w:right w:type="dxa" w:w="100"/>
+            </w:tcMar>
+          </w:tcPr>
+          <w:p>
+            <w:r>
+              <w:rPr>
+                <w:rFonts w:ascii="Consolas" w:cs="Consolas" w:eastAsia="Consolas" w:hAnsi="Consolas"/>
+                <w:sz w:val="20"/>
+                <w:szCs w:val="20"/>
+              </w:rPr>
+              <w:t xml:space="preserve">app/folhas/</w:t>
+            </w:r>
+          </w:p>
+        </w:tc>
+        <w:tc>
+          <w:tcPr>
+            <w:tcW w:type="dxa" w:w="6350"/>
+            <w:tcBorders>
+              <w:top w:val="single" w:color="BFBFBF" w:sz="4"/>
+              <w:left w:val="single" w:color="BFBFBF" w:sz="4"/>
+              <w:bottom w:val="single" w:color="BFBFBF" w:sz="4"/>
+              <w:right w:val="single" w:color="BFBFBF" w:sz="4"/>
+            </w:tcBorders>
+            <w:tcMar>
+              <w:top w:type="dxa" w:w="60"/>
+              <w:left w:type="dxa" w:w="100"/>
+              <w:bottom w:type="dxa" w:w="60"/>
+              <w:right w:type="dxa" w:w="100"/>
+            </w:tcMar>
+          </w:tcPr>
+          <w:p>
+            <w:r>
+              <w:rPr>
+                <w:sz w:val="20"/>
+                <w:szCs w:val="20"/>
+              </w:rPr>
+              <w:t xml:space="preserve">Folhas de resposta: posição de cada elemento na página (</w:t>
+            </w:r>
+            <w:r>
+              <w:rPr>
+                <w:rFonts w:ascii="Consolas" w:cs="Consolas" w:eastAsia="Consolas" w:hAnsi="Consolas"/>
+                <w:sz w:val="20"/>
+                <w:szCs w:val="20"/>
+              </w:rPr>
+              <w:t xml:space="preserve">layout.py</w:t>
+            </w:r>
+            <w:r>
+              <w:rPr>
+                <w:sz w:val="20"/>
+                <w:szCs w:val="20"/>
+              </w:rPr>
+              <w:t xml:space="preserve">) e geração dos códigos e do QR code (</w:t>
+            </w:r>
+            <w:r>
+              <w:rPr>
+                <w:rFonts w:ascii="Consolas" w:cs="Consolas" w:eastAsia="Consolas" w:hAnsi="Consolas"/>
+                <w:sz w:val="20"/>
+                <w:szCs w:val="20"/>
+              </w:rPr>
+              <w:t xml:space="preserve">servico.py</w:t>
             </w:r>
             <w:r>
               <w:rPr>
@@ -4548,7 +4719,7 @@
         <w:spacing w:after="120" w:line="300"/>
       </w:pPr>
       <w:r>
-        <w:t xml:space="preserve">O banco tem treze tabelas. As oito primeiras foram criadas pela migração inicial do Alembic, a tabela </w:t>
+        <w:t xml:space="preserve">O banco tem quatorze tabelas. As oito primeiras foram criadas pela migração inicial do Alembic, a tabela </w:t>
       </w:r>
       <w:r>
         <w:rPr>
@@ -4581,7 +4752,7 @@
         <w:t xml:space="preserve">resposta_item</w:t>
       </w:r>
       <w:r>
-        <w:t xml:space="preserve"> pela migração dos itens das discursivas, e as tabelas </w:t>
+        <w:t xml:space="preserve"> pela migração dos itens das discursivas, as tabelas </w:t>
       </w:r>
       <w:r>
         <w:rPr>
@@ -4603,7 +4774,18 @@
         <w:t xml:space="preserve">atividade_questao</w:t>
       </w:r>
       <w:r>
-        <w:t xml:space="preserve"> pela migração das atividades. Duas delas existem por razão metodológica e não devem ser simplificadas: </w:t>
+        <w:t xml:space="preserve"> pela migração das atividades, e a tabela </w:t>
+      </w:r>
+      <w:r>
+        <w:rPr>
+          <w:rFonts w:ascii="Consolas" w:cs="Consolas" w:eastAsia="Consolas" w:hAnsi="Consolas"/>
+          <w:sz w:val="20"/>
+          <w:szCs w:val="20"/>
+        </w:rPr>
+        <w:t xml:space="preserve">folha</w:t>
+      </w:r>
+      <w:r>
+        <w:t xml:space="preserve"> pela migração das folhas de resposta. Duas delas existem por razão metodológica e não devem ser simplificadas: </w:t>
       </w:r>
       <w:r>
         <w:rPr>
@@ -9910,6 +10092,90 @@
                 <w:sz w:val="20"/>
                 <w:szCs w:val="20"/>
               </w:rPr>
+              <w:t xml:space="preserve">linhas_por_resposta</w:t>
+            </w:r>
+          </w:p>
+        </w:tc>
+        <w:tc>
+          <w:tcPr>
+            <w:tcW w:type="dxa" w:w="1649"/>
+            <w:tcBorders>
+              <w:top w:val="single" w:color="BFBFBF" w:sz="4"/>
+              <w:left w:val="single" w:color="BFBFBF" w:sz="4"/>
+              <w:bottom w:val="single" w:color="BFBFBF" w:sz="4"/>
+              <w:right w:val="single" w:color="BFBFBF" w:sz="4"/>
+            </w:tcBorders>
+            <w:tcMar>
+              <w:top w:type="dxa" w:w="60"/>
+              <w:left w:type="dxa" w:w="100"/>
+              <w:bottom w:type="dxa" w:w="60"/>
+              <w:right w:type="dxa" w:w="100"/>
+            </w:tcMar>
+          </w:tcPr>
+          <w:p>
+            <w:r>
+              <w:rPr>
+                <w:sz w:val="20"/>
+                <w:szCs w:val="20"/>
+              </w:rPr>
+              <w:t xml:space="preserve">inteiro</w:t>
+            </w:r>
+          </w:p>
+        </w:tc>
+        <w:tc>
+          <w:tcPr>
+            <w:tcW w:type="dxa" w:w="4949"/>
+            <w:tcBorders>
+              <w:top w:val="single" w:color="BFBFBF" w:sz="4"/>
+              <w:left w:val="single" w:color="BFBFBF" w:sz="4"/>
+              <w:bottom w:val="single" w:color="BFBFBF" w:sz="4"/>
+              <w:right w:val="single" w:color="BFBFBF" w:sz="4"/>
+            </w:tcBorders>
+            <w:tcMar>
+              <w:top w:type="dxa" w:w="60"/>
+              <w:left w:type="dxa" w:w="100"/>
+              <w:bottom w:type="dxa" w:w="60"/>
+              <w:right w:type="dxa" w:w="100"/>
+            </w:tcMar>
+          </w:tcPr>
+          <w:p>
+            <w:r>
+              <w:rPr>
+                <w:sz w:val="20"/>
+                <w:szCs w:val="20"/>
+              </w:rPr>
+              <w:t xml:space="preserve">Linhas de cada caixa de resposta discursiva nas folhas de resposta; fixado na primeira geração de folhas (padrão 8)</w:t>
+            </w:r>
+          </w:p>
+        </w:tc>
+      </w:tr>
+      <w:tr>
+        <w:trPr>
+          <w:cantSplit/>
+        </w:trPr>
+        <w:tc>
+          <w:tcPr>
+            <w:tcW w:type="dxa" w:w="2473"/>
+            <w:tcBorders>
+              <w:top w:val="single" w:color="BFBFBF" w:sz="4"/>
+              <w:left w:val="single" w:color="BFBFBF" w:sz="4"/>
+              <w:bottom w:val="single" w:color="BFBFBF" w:sz="4"/>
+              <w:right w:val="single" w:color="BFBFBF" w:sz="4"/>
+            </w:tcBorders>
+            <w:tcMar>
+              <w:top w:type="dxa" w:w="60"/>
+              <w:left w:type="dxa" w:w="100"/>
+              <w:bottom w:type="dxa" w:w="60"/>
+              <w:right w:type="dxa" w:w="100"/>
+            </w:tcMar>
+          </w:tcPr>
+          <w:p>
+            <w:r>
+              <w:rPr>
+                <w:rFonts w:ascii="Consolas" w:cs="Consolas" w:eastAsia="Consolas" w:hAnsi="Consolas"/>
+                <w:sz w:val="20"/>
+                <w:szCs w:val="20"/>
+              </w:rPr>
               <w:t xml:space="preserve">criado_em</w:t>
             </w:r>
           </w:p>
@@ -9963,6 +10229,564 @@
                 <w:szCs w:val="20"/>
               </w:rPr>
               <w:t xml:space="preserve">Momento da criação</w:t>
+            </w:r>
+          </w:p>
+        </w:tc>
+      </w:tr>
+    </w:tbl>
+    <w:p>
+      <w:pPr>
+        <w:spacing w:after="120"/>
+      </w:pPr>
+    </w:p>
+    <w:p>
+      <w:pPr>
+        <w:pStyle w:val="Heading3"/>
+      </w:pPr>
+      <w:r>
+        <w:t xml:space="preserve">folha</w:t>
+      </w:r>
+    </w:p>
+    <w:tbl>
+      <w:tblPr>
+        <w:tblW w:type="dxa" w:w="9071"/>
+        <w:tblBorders>
+          <w:top w:val="single" w:color="auto" w:sz="4"/>
+          <w:left w:val="single" w:color="auto" w:sz="4"/>
+          <w:bottom w:val="single" w:color="auto" w:sz="4"/>
+          <w:right w:val="single" w:color="auto" w:sz="4"/>
+          <w:insideH w:val="single" w:color="auto" w:sz="4"/>
+          <w:insideV w:val="single" w:color="auto" w:sz="4"/>
+        </w:tblBorders>
+      </w:tblPr>
+      <w:tblGrid>
+        <w:gridCol w:w="2473"/>
+        <w:gridCol w:w="1649"/>
+        <w:gridCol w:w="4949"/>
+      </w:tblGrid>
+      <w:tr>
+        <w:trPr>
+          <w:tblHeader/>
+        </w:trPr>
+        <w:tc>
+          <w:tcPr>
+            <w:tcW w:type="dxa" w:w="2473"/>
+            <w:tcBorders>
+              <w:top w:val="single" w:color="BFBFBF" w:sz="4"/>
+              <w:left w:val="single" w:color="BFBFBF" w:sz="4"/>
+              <w:bottom w:val="single" w:color="BFBFBF" w:sz="4"/>
+              <w:right w:val="single" w:color="BFBFBF" w:sz="4"/>
+            </w:tcBorders>
+            <w:shd w:fill="D9E2F3" w:color="auto" w:val="clear"/>
+            <w:tcMar>
+              <w:top w:type="dxa" w:w="60"/>
+              <w:left w:type="dxa" w:w="100"/>
+              <w:bottom w:type="dxa" w:w="60"/>
+              <w:right w:type="dxa" w:w="100"/>
+            </w:tcMar>
+          </w:tcPr>
+          <w:p>
+            <w:r>
+              <w:rPr>
+                <w:b/>
+                <w:bCs/>
+                <w:sz w:val="20"/>
+                <w:szCs w:val="20"/>
+              </w:rPr>
+              <w:t xml:space="preserve">Campo</w:t>
+            </w:r>
+          </w:p>
+        </w:tc>
+        <w:tc>
+          <w:tcPr>
+            <w:tcW w:type="dxa" w:w="1649"/>
+            <w:tcBorders>
+              <w:top w:val="single" w:color="BFBFBF" w:sz="4"/>
+              <w:left w:val="single" w:color="BFBFBF" w:sz="4"/>
+              <w:bottom w:val="single" w:color="BFBFBF" w:sz="4"/>
+              <w:right w:val="single" w:color="BFBFBF" w:sz="4"/>
+            </w:tcBorders>
+            <w:shd w:fill="D9E2F3" w:color="auto" w:val="clear"/>
+            <w:tcMar>
+              <w:top w:type="dxa" w:w="60"/>
+              <w:left w:type="dxa" w:w="100"/>
+              <w:bottom w:type="dxa" w:w="60"/>
+              <w:right w:type="dxa" w:w="100"/>
+            </w:tcMar>
+          </w:tcPr>
+          <w:p>
+            <w:r>
+              <w:rPr>
+                <w:b/>
+                <w:bCs/>
+                <w:sz w:val="20"/>
+                <w:szCs w:val="20"/>
+              </w:rPr>
+              <w:t xml:space="preserve">Tipo</w:t>
+            </w:r>
+          </w:p>
+        </w:tc>
+        <w:tc>
+          <w:tcPr>
+            <w:tcW w:type="dxa" w:w="4949"/>
+            <w:tcBorders>
+              <w:top w:val="single" w:color="BFBFBF" w:sz="4"/>
+              <w:left w:val="single" w:color="BFBFBF" w:sz="4"/>
+              <w:bottom w:val="single" w:color="BFBFBF" w:sz="4"/>
+              <w:right w:val="single" w:color="BFBFBF" w:sz="4"/>
+            </w:tcBorders>
+            <w:shd w:fill="D9E2F3" w:color="auto" w:val="clear"/>
+            <w:tcMar>
+              <w:top w:type="dxa" w:w="60"/>
+              <w:left w:type="dxa" w:w="100"/>
+              <w:bottom w:type="dxa" w:w="60"/>
+              <w:right w:type="dxa" w:w="100"/>
+            </w:tcMar>
+          </w:tcPr>
+          <w:p>
+            <w:r>
+              <w:rPr>
+                <w:b/>
+                <w:bCs/>
+                <w:sz w:val="20"/>
+                <w:szCs w:val="20"/>
+              </w:rPr>
+              <w:t xml:space="preserve">Descrição</w:t>
+            </w:r>
+          </w:p>
+        </w:tc>
+      </w:tr>
+      <w:tr>
+        <w:trPr>
+          <w:cantSplit/>
+        </w:trPr>
+        <w:tc>
+          <w:tcPr>
+            <w:tcW w:type="dxa" w:w="2473"/>
+            <w:tcBorders>
+              <w:top w:val="single" w:color="BFBFBF" w:sz="4"/>
+              <w:left w:val="single" w:color="BFBFBF" w:sz="4"/>
+              <w:bottom w:val="single" w:color="BFBFBF" w:sz="4"/>
+              <w:right w:val="single" w:color="BFBFBF" w:sz="4"/>
+            </w:tcBorders>
+            <w:tcMar>
+              <w:top w:type="dxa" w:w="60"/>
+              <w:left w:type="dxa" w:w="100"/>
+              <w:bottom w:type="dxa" w:w="60"/>
+              <w:right w:type="dxa" w:w="100"/>
+            </w:tcMar>
+          </w:tcPr>
+          <w:p>
+            <w:r>
+              <w:rPr>
+                <w:rFonts w:ascii="Consolas" w:cs="Consolas" w:eastAsia="Consolas" w:hAnsi="Consolas"/>
+                <w:sz w:val="20"/>
+                <w:szCs w:val="20"/>
+              </w:rPr>
+              <w:t xml:space="preserve">id</w:t>
+            </w:r>
+          </w:p>
+        </w:tc>
+        <w:tc>
+          <w:tcPr>
+            <w:tcW w:type="dxa" w:w="1649"/>
+            <w:tcBorders>
+              <w:top w:val="single" w:color="BFBFBF" w:sz="4"/>
+              <w:left w:val="single" w:color="BFBFBF" w:sz="4"/>
+              <w:bottom w:val="single" w:color="BFBFBF" w:sz="4"/>
+              <w:right w:val="single" w:color="BFBFBF" w:sz="4"/>
+            </w:tcBorders>
+            <w:tcMar>
+              <w:top w:type="dxa" w:w="60"/>
+              <w:left w:type="dxa" w:w="100"/>
+              <w:bottom w:type="dxa" w:w="60"/>
+              <w:right w:type="dxa" w:w="100"/>
+            </w:tcMar>
+          </w:tcPr>
+          <w:p>
+            <w:r>
+              <w:rPr>
+                <w:sz w:val="20"/>
+                <w:szCs w:val="20"/>
+              </w:rPr>
+              <w:t xml:space="preserve">inteiro</w:t>
+            </w:r>
+          </w:p>
+        </w:tc>
+        <w:tc>
+          <w:tcPr>
+            <w:tcW w:type="dxa" w:w="4949"/>
+            <w:tcBorders>
+              <w:top w:val="single" w:color="BFBFBF" w:sz="4"/>
+              <w:left w:val="single" w:color="BFBFBF" w:sz="4"/>
+              <w:bottom w:val="single" w:color="BFBFBF" w:sz="4"/>
+              <w:right w:val="single" w:color="BFBFBF" w:sz="4"/>
+            </w:tcBorders>
+            <w:tcMar>
+              <w:top w:type="dxa" w:w="60"/>
+              <w:left w:type="dxa" w:w="100"/>
+              <w:bottom w:type="dxa" w:w="60"/>
+              <w:right w:type="dxa" w:w="100"/>
+            </w:tcMar>
+          </w:tcPr>
+          <w:p>
+            <w:r>
+              <w:rPr>
+                <w:sz w:val="20"/>
+                <w:szCs w:val="20"/>
+              </w:rPr>
+              <w:t xml:space="preserve">Identificador</w:t>
+            </w:r>
+          </w:p>
+        </w:tc>
+      </w:tr>
+      <w:tr>
+        <w:trPr>
+          <w:cantSplit/>
+        </w:trPr>
+        <w:tc>
+          <w:tcPr>
+            <w:tcW w:type="dxa" w:w="2473"/>
+            <w:tcBorders>
+              <w:top w:val="single" w:color="BFBFBF" w:sz="4"/>
+              <w:left w:val="single" w:color="BFBFBF" w:sz="4"/>
+              <w:bottom w:val="single" w:color="BFBFBF" w:sz="4"/>
+              <w:right w:val="single" w:color="BFBFBF" w:sz="4"/>
+            </w:tcBorders>
+            <w:tcMar>
+              <w:top w:type="dxa" w:w="60"/>
+              <w:left w:type="dxa" w:w="100"/>
+              <w:bottom w:type="dxa" w:w="60"/>
+              <w:right w:type="dxa" w:w="100"/>
+            </w:tcMar>
+          </w:tcPr>
+          <w:p>
+            <w:r>
+              <w:rPr>
+                <w:rFonts w:ascii="Consolas" w:cs="Consolas" w:eastAsia="Consolas" w:hAnsi="Consolas"/>
+                <w:sz w:val="20"/>
+                <w:szCs w:val="20"/>
+              </w:rPr>
+              <w:t xml:space="preserve">atividade_id</w:t>
+            </w:r>
+          </w:p>
+        </w:tc>
+        <w:tc>
+          <w:tcPr>
+            <w:tcW w:type="dxa" w:w="1649"/>
+            <w:tcBorders>
+              <w:top w:val="single" w:color="BFBFBF" w:sz="4"/>
+              <w:left w:val="single" w:color="BFBFBF" w:sz="4"/>
+              <w:bottom w:val="single" w:color="BFBFBF" w:sz="4"/>
+              <w:right w:val="single" w:color="BFBFBF" w:sz="4"/>
+            </w:tcBorders>
+            <w:tcMar>
+              <w:top w:type="dxa" w:w="60"/>
+              <w:left w:type="dxa" w:w="100"/>
+              <w:bottom w:type="dxa" w:w="60"/>
+              <w:right w:type="dxa" w:w="100"/>
+            </w:tcMar>
+          </w:tcPr>
+          <w:p>
+            <w:r>
+              <w:rPr>
+                <w:sz w:val="20"/>
+                <w:szCs w:val="20"/>
+              </w:rPr>
+              <w:t xml:space="preserve">inteiro</w:t>
+            </w:r>
+          </w:p>
+        </w:tc>
+        <w:tc>
+          <w:tcPr>
+            <w:tcW w:type="dxa" w:w="4949"/>
+            <w:tcBorders>
+              <w:top w:val="single" w:color="BFBFBF" w:sz="4"/>
+              <w:left w:val="single" w:color="BFBFBF" w:sz="4"/>
+              <w:bottom w:val="single" w:color="BFBFBF" w:sz="4"/>
+              <w:right w:val="single" w:color="BFBFBF" w:sz="4"/>
+            </w:tcBorders>
+            <w:tcMar>
+              <w:top w:type="dxa" w:w="60"/>
+              <w:left w:type="dxa" w:w="100"/>
+              <w:bottom w:type="dxa" w:w="60"/>
+              <w:right w:type="dxa" w:w="100"/>
+            </w:tcMar>
+          </w:tcPr>
+          <w:p>
+            <w:r>
+              <w:rPr>
+                <w:sz w:val="20"/>
+                <w:szCs w:val="20"/>
+              </w:rPr>
+              <w:t xml:space="preserve">Atividade a que a folha pertence</w:t>
+            </w:r>
+          </w:p>
+        </w:tc>
+      </w:tr>
+      <w:tr>
+        <w:trPr>
+          <w:cantSplit/>
+        </w:trPr>
+        <w:tc>
+          <w:tcPr>
+            <w:tcW w:type="dxa" w:w="2473"/>
+            <w:tcBorders>
+              <w:top w:val="single" w:color="BFBFBF" w:sz="4"/>
+              <w:left w:val="single" w:color="BFBFBF" w:sz="4"/>
+              <w:bottom w:val="single" w:color="BFBFBF" w:sz="4"/>
+              <w:right w:val="single" w:color="BFBFBF" w:sz="4"/>
+            </w:tcBorders>
+            <w:tcMar>
+              <w:top w:type="dxa" w:w="60"/>
+              <w:left w:type="dxa" w:w="100"/>
+              <w:bottom w:type="dxa" w:w="60"/>
+              <w:right w:type="dxa" w:w="100"/>
+            </w:tcMar>
+          </w:tcPr>
+          <w:p>
+            <w:r>
+              <w:rPr>
+                <w:rFonts w:ascii="Consolas" w:cs="Consolas" w:eastAsia="Consolas" w:hAnsi="Consolas"/>
+                <w:sz w:val="20"/>
+                <w:szCs w:val="20"/>
+              </w:rPr>
+              <w:t xml:space="preserve">numero</w:t>
+            </w:r>
+          </w:p>
+        </w:tc>
+        <w:tc>
+          <w:tcPr>
+            <w:tcW w:type="dxa" w:w="1649"/>
+            <w:tcBorders>
+              <w:top w:val="single" w:color="BFBFBF" w:sz="4"/>
+              <w:left w:val="single" w:color="BFBFBF" w:sz="4"/>
+              <w:bottom w:val="single" w:color="BFBFBF" w:sz="4"/>
+              <w:right w:val="single" w:color="BFBFBF" w:sz="4"/>
+            </w:tcBorders>
+            <w:tcMar>
+              <w:top w:type="dxa" w:w="60"/>
+              <w:left w:type="dxa" w:w="100"/>
+              <w:bottom w:type="dxa" w:w="60"/>
+              <w:right w:type="dxa" w:w="100"/>
+            </w:tcMar>
+          </w:tcPr>
+          <w:p>
+            <w:r>
+              <w:rPr>
+                <w:sz w:val="20"/>
+                <w:szCs w:val="20"/>
+              </w:rPr>
+              <w:t xml:space="preserve">inteiro</w:t>
+            </w:r>
+          </w:p>
+        </w:tc>
+        <w:tc>
+          <w:tcPr>
+            <w:tcW w:type="dxa" w:w="4949"/>
+            <w:tcBorders>
+              <w:top w:val="single" w:color="BFBFBF" w:sz="4"/>
+              <w:left w:val="single" w:color="BFBFBF" w:sz="4"/>
+              <w:bottom w:val="single" w:color="BFBFBF" w:sz="4"/>
+              <w:right w:val="single" w:color="BFBFBF" w:sz="4"/>
+            </w:tcBorders>
+            <w:tcMar>
+              <w:top w:type="dxa" w:w="60"/>
+              <w:left w:type="dxa" w:w="100"/>
+              <w:bottom w:type="dxa" w:w="60"/>
+              <w:right w:type="dxa" w:w="100"/>
+            </w:tcMar>
+          </w:tcPr>
+          <w:p>
+            <w:r>
+              <w:rPr>
+                <w:sz w:val="20"/>
+                <w:szCs w:val="20"/>
+              </w:rPr>
+              <w:t xml:space="preserve">Número sequencial da folha dentro da atividade (1, 2, 3...), único em cada atividade</w:t>
+            </w:r>
+          </w:p>
+        </w:tc>
+      </w:tr>
+      <w:tr>
+        <w:trPr>
+          <w:cantSplit/>
+        </w:trPr>
+        <w:tc>
+          <w:tcPr>
+            <w:tcW w:type="dxa" w:w="2473"/>
+            <w:tcBorders>
+              <w:top w:val="single" w:color="BFBFBF" w:sz="4"/>
+              <w:left w:val="single" w:color="BFBFBF" w:sz="4"/>
+              <w:bottom w:val="single" w:color="BFBFBF" w:sz="4"/>
+              <w:right w:val="single" w:color="BFBFBF" w:sz="4"/>
+            </w:tcBorders>
+            <w:tcMar>
+              <w:top w:type="dxa" w:w="60"/>
+              <w:left w:type="dxa" w:w="100"/>
+              <w:bottom w:type="dxa" w:w="60"/>
+              <w:right w:type="dxa" w:w="100"/>
+            </w:tcMar>
+          </w:tcPr>
+          <w:p>
+            <w:r>
+              <w:rPr>
+                <w:rFonts w:ascii="Consolas" w:cs="Consolas" w:eastAsia="Consolas" w:hAnsi="Consolas"/>
+                <w:sz w:val="20"/>
+                <w:szCs w:val="20"/>
+              </w:rPr>
+              <w:t xml:space="preserve">codigo</w:t>
+            </w:r>
+          </w:p>
+        </w:tc>
+        <w:tc>
+          <w:tcPr>
+            <w:tcW w:type="dxa" w:w="1649"/>
+            <w:tcBorders>
+              <w:top w:val="single" w:color="BFBFBF" w:sz="4"/>
+              <w:left w:val="single" w:color="BFBFBF" w:sz="4"/>
+              <w:bottom w:val="single" w:color="BFBFBF" w:sz="4"/>
+              <w:right w:val="single" w:color="BFBFBF" w:sz="4"/>
+            </w:tcBorders>
+            <w:tcMar>
+              <w:top w:type="dxa" w:w="60"/>
+              <w:left w:type="dxa" w:w="100"/>
+              <w:bottom w:type="dxa" w:w="60"/>
+              <w:right w:type="dxa" w:w="100"/>
+            </w:tcMar>
+          </w:tcPr>
+          <w:p>
+            <w:r>
+              <w:rPr>
+                <w:sz w:val="20"/>
+                <w:szCs w:val="20"/>
+              </w:rPr>
+              <w:t xml:space="preserve">texto</w:t>
+            </w:r>
+          </w:p>
+        </w:tc>
+        <w:tc>
+          <w:tcPr>
+            <w:tcW w:type="dxa" w:w="4949"/>
+            <w:tcBorders>
+              <w:top w:val="single" w:color="BFBFBF" w:sz="4"/>
+              <w:left w:val="single" w:color="BFBFBF" w:sz="4"/>
+              <w:bottom w:val="single" w:color="BFBFBF" w:sz="4"/>
+              <w:right w:val="single" w:color="BFBFBF" w:sz="4"/>
+            </w:tcBorders>
+            <w:tcMar>
+              <w:top w:type="dxa" w:w="60"/>
+              <w:left w:type="dxa" w:w="100"/>
+              <w:bottom w:type="dxa" w:w="60"/>
+              <w:right w:type="dxa" w:w="100"/>
+            </w:tcMar>
+          </w:tcPr>
+          <w:p>
+            <w:r>
+              <w:rPr>
+                <w:sz w:val="20"/>
+                <w:szCs w:val="20"/>
+              </w:rPr>
+              <w:t xml:space="preserve">Código da folha no formato </w:t>
+            </w:r>
+            <w:r>
+              <w:rPr>
+                <w:rFonts w:ascii="Consolas" w:cs="Consolas" w:eastAsia="Consolas" w:hAnsi="Consolas"/>
+                <w:sz w:val="20"/>
+                <w:szCs w:val="20"/>
+              </w:rPr>
+              <w:t xml:space="preserve">XXXX-XXXX</w:t>
+            </w:r>
+            <w:r>
+              <w:rPr>
+                <w:sz w:val="20"/>
+                <w:szCs w:val="20"/>
+              </w:rPr>
+              <w:t xml:space="preserve">, único em todo o sistema. Substitui o nome do aluno: é por ele que a folha digitalizada é identificada e que o aluno consulta o resultado</w:t>
+            </w:r>
+          </w:p>
+        </w:tc>
+      </w:tr>
+      <w:tr>
+        <w:trPr>
+          <w:cantSplit/>
+        </w:trPr>
+        <w:tc>
+          <w:tcPr>
+            <w:tcW w:type="dxa" w:w="2473"/>
+            <w:tcBorders>
+              <w:top w:val="single" w:color="BFBFBF" w:sz="4"/>
+              <w:left w:val="single" w:color="BFBFBF" w:sz="4"/>
+              <w:bottom w:val="single" w:color="BFBFBF" w:sz="4"/>
+              <w:right w:val="single" w:color="BFBFBF" w:sz="4"/>
+            </w:tcBorders>
+            <w:tcMar>
+              <w:top w:type="dxa" w:w="60"/>
+              <w:left w:type="dxa" w:w="100"/>
+              <w:bottom w:type="dxa" w:w="60"/>
+              <w:right w:type="dxa" w:w="100"/>
+            </w:tcMar>
+          </w:tcPr>
+          <w:p>
+            <w:r>
+              <w:rPr>
+                <w:rFonts w:ascii="Consolas" w:cs="Consolas" w:eastAsia="Consolas" w:hAnsi="Consolas"/>
+                <w:sz w:val="20"/>
+                <w:szCs w:val="20"/>
+              </w:rPr>
+              <w:t xml:space="preserve">criado_em</w:t>
+            </w:r>
+          </w:p>
+        </w:tc>
+        <w:tc>
+          <w:tcPr>
+            <w:tcW w:type="dxa" w:w="1649"/>
+            <w:tcBorders>
+              <w:top w:val="single" w:color="BFBFBF" w:sz="4"/>
+              <w:left w:val="single" w:color="BFBFBF" w:sz="4"/>
+              <w:bottom w:val="single" w:color="BFBFBF" w:sz="4"/>
+              <w:right w:val="single" w:color="BFBFBF" w:sz="4"/>
+            </w:tcBorders>
+            <w:tcMar>
+              <w:top w:type="dxa" w:w="60"/>
+              <w:left w:type="dxa" w:w="100"/>
+              <w:bottom w:type="dxa" w:w="60"/>
+              <w:right w:type="dxa" w:w="100"/>
+            </w:tcMar>
+          </w:tcPr>
+          <w:p>
+            <w:r>
+              <w:rPr>
+                <w:sz w:val="20"/>
+                <w:szCs w:val="20"/>
+              </w:rPr>
+              <w:t xml:space="preserve">data e hora</w:t>
+            </w:r>
+          </w:p>
+        </w:tc>
+        <w:tc>
+          <w:tcPr>
+            <w:tcW w:type="dxa" w:w="4949"/>
+            <w:tcBorders>
+              <w:top w:val="single" w:color="BFBFBF" w:sz="4"/>
+              <w:left w:val="single" w:color="BFBFBF" w:sz="4"/>
+              <w:bottom w:val="single" w:color="BFBFBF" w:sz="4"/>
+              <w:right w:val="single" w:color="BFBFBF" w:sz="4"/>
+            </w:tcBorders>
+            <w:tcMar>
+              <w:top w:type="dxa" w:w="60"/>
+              <w:left w:type="dxa" w:w="100"/>
+              <w:bottom w:type="dxa" w:w="60"/>
+              <w:right w:type="dxa" w:w="100"/>
+            </w:tcMar>
+          </w:tcPr>
+          <w:p>
+            <w:r>
+              <w:rPr>
+                <w:sz w:val="20"/>
+                <w:szCs w:val="20"/>
+              </w:rPr>
+              <w:t xml:space="preserve">Momento da geração</w:t>
             </w:r>
           </w:p>
         </w:tc>
@@ -29347,7 +30171,7 @@
                 <w:sz w:val="20"/>
                 <w:szCs w:val="20"/>
               </w:rPr>
-              <w:t xml:space="preserve">Folha pronta para imprimir ou salvar em PDF pelo navegador. Com </w:t>
+              <w:t xml:space="preserve">Caderno de questões pronto para imprimir ou salvar em PDF pelo navegador. Com </w:t>
             </w:r>
             <w:r>
               <w:rPr>
@@ -29377,7 +30201,196 @@
                 <w:sz w:val="20"/>
                 <w:szCs w:val="20"/>
               </w:rPr>
-              <w:t xml:space="preserve"> define quantas linhas cada resposta discursiva recebe (5, 8, 12 ou 16; padrão 8)</w:t>
+              <w:t xml:space="preserve"> define quantas linhas cada resposta discursiva recebe (5, 8, 12 ou 16; padrão 8). Quando a atividade já tem folhas de resposta, o caderno sai sem linhas, porque o aluno responde na folha</w:t>
+            </w:r>
+          </w:p>
+        </w:tc>
+      </w:tr>
+      <w:tr>
+        <w:trPr>
+          <w:cantSplit/>
+        </w:trPr>
+        <w:tc>
+          <w:tcPr>
+            <w:tcW w:type="dxa" w:w="3628"/>
+            <w:tcBorders>
+              <w:top w:val="single" w:color="BFBFBF" w:sz="4"/>
+              <w:left w:val="single" w:color="BFBFBF" w:sz="4"/>
+              <w:bottom w:val="single" w:color="BFBFBF" w:sz="4"/>
+              <w:right w:val="single" w:color="BFBFBF" w:sz="4"/>
+            </w:tcBorders>
+            <w:tcMar>
+              <w:top w:type="dxa" w:w="60"/>
+              <w:left w:type="dxa" w:w="100"/>
+              <w:bottom w:type="dxa" w:w="60"/>
+              <w:right w:type="dxa" w:w="100"/>
+            </w:tcMar>
+          </w:tcPr>
+          <w:p>
+            <w:r>
+              <w:rPr>
+                <w:rFonts w:ascii="Consolas" w:cs="Consolas" w:eastAsia="Consolas" w:hAnsi="Consolas"/>
+                <w:sz w:val="20"/>
+                <w:szCs w:val="20"/>
+              </w:rPr>
+              <w:t xml:space="preserve">POST /atividades/{id}/folhas</w:t>
+            </w:r>
+          </w:p>
+        </w:tc>
+        <w:tc>
+          <w:tcPr>
+            <w:tcW w:type="dxa" w:w="5443"/>
+            <w:tcBorders>
+              <w:top w:val="single" w:color="BFBFBF" w:sz="4"/>
+              <w:left w:val="single" w:color="BFBFBF" w:sz="4"/>
+              <w:bottom w:val="single" w:color="BFBFBF" w:sz="4"/>
+              <w:right w:val="single" w:color="BFBFBF" w:sz="4"/>
+            </w:tcBorders>
+            <w:tcMar>
+              <w:top w:type="dxa" w:w="60"/>
+              <w:left w:type="dxa" w:w="100"/>
+              <w:bottom w:type="dxa" w:w="60"/>
+              <w:right w:type="dxa" w:w="100"/>
+            </w:tcMar>
+          </w:tcPr>
+          <w:p>
+            <w:r>
+              <w:rPr>
+                <w:sz w:val="20"/>
+                <w:szCs w:val="20"/>
+              </w:rPr>
+              <w:t xml:space="preserve">Gera folhas de resposta (de 1 a 200 por vez). Na primeira geração, também define as linhas por resposta discursiva; gerações seguintes continuam a numeração e mantêm o mesmo layout</w:t>
+            </w:r>
+          </w:p>
+        </w:tc>
+      </w:tr>
+      <w:tr>
+        <w:trPr>
+          <w:cantSplit/>
+        </w:trPr>
+        <w:tc>
+          <w:tcPr>
+            <w:tcW w:type="dxa" w:w="3628"/>
+            <w:tcBorders>
+              <w:top w:val="single" w:color="BFBFBF" w:sz="4"/>
+              <w:left w:val="single" w:color="BFBFBF" w:sz="4"/>
+              <w:bottom w:val="single" w:color="BFBFBF" w:sz="4"/>
+              <w:right w:val="single" w:color="BFBFBF" w:sz="4"/>
+            </w:tcBorders>
+            <w:tcMar>
+              <w:top w:type="dxa" w:w="60"/>
+              <w:left w:type="dxa" w:w="100"/>
+              <w:bottom w:type="dxa" w:w="60"/>
+              <w:right w:type="dxa" w:w="100"/>
+            </w:tcMar>
+          </w:tcPr>
+          <w:p>
+            <w:r>
+              <w:rPr>
+                <w:rFonts w:ascii="Consolas" w:cs="Consolas" w:eastAsia="Consolas" w:hAnsi="Consolas"/>
+                <w:sz w:val="20"/>
+                <w:szCs w:val="20"/>
+              </w:rPr>
+              <w:t xml:space="preserve">POST /atividades/{id}/folhas/descartar</w:t>
+            </w:r>
+          </w:p>
+        </w:tc>
+        <w:tc>
+          <w:tcPr>
+            <w:tcW w:type="dxa" w:w="5443"/>
+            <w:tcBorders>
+              <w:top w:val="single" w:color="BFBFBF" w:sz="4"/>
+              <w:left w:val="single" w:color="BFBFBF" w:sz="4"/>
+              <w:bottom w:val="single" w:color="BFBFBF" w:sz="4"/>
+              <w:right w:val="single" w:color="BFBFBF" w:sz="4"/>
+            </w:tcBorders>
+            <w:tcMar>
+              <w:top w:type="dxa" w:w="60"/>
+              <w:left w:type="dxa" w:w="100"/>
+              <w:bottom w:type="dxa" w:w="60"/>
+              <w:right w:type="dxa" w:w="100"/>
+            </w:tcMar>
+          </w:tcPr>
+          <w:p>
+            <w:r>
+              <w:rPr>
+                <w:sz w:val="20"/>
+                <w:szCs w:val="20"/>
+              </w:rPr>
+              <w:t xml:space="preserve">Apaga todas as folhas da atividade, depois de confirmação, e destrava as questões</w:t>
+            </w:r>
+          </w:p>
+        </w:tc>
+      </w:tr>
+      <w:tr>
+        <w:trPr>
+          <w:cantSplit/>
+        </w:trPr>
+        <w:tc>
+          <w:tcPr>
+            <w:tcW w:type="dxa" w:w="3628"/>
+            <w:tcBorders>
+              <w:top w:val="single" w:color="BFBFBF" w:sz="4"/>
+              <w:left w:val="single" w:color="BFBFBF" w:sz="4"/>
+              <w:bottom w:val="single" w:color="BFBFBF" w:sz="4"/>
+              <w:right w:val="single" w:color="BFBFBF" w:sz="4"/>
+            </w:tcBorders>
+            <w:tcMar>
+              <w:top w:type="dxa" w:w="60"/>
+              <w:left w:type="dxa" w:w="100"/>
+              <w:bottom w:type="dxa" w:w="60"/>
+              <w:right w:type="dxa" w:w="100"/>
+            </w:tcMar>
+          </w:tcPr>
+          <w:p>
+            <w:r>
+              <w:rPr>
+                <w:rFonts w:ascii="Consolas" w:cs="Consolas" w:eastAsia="Consolas" w:hAnsi="Consolas"/>
+                <w:sz w:val="20"/>
+                <w:szCs w:val="20"/>
+              </w:rPr>
+              <w:t xml:space="preserve">GET /atividades/{id}/folhas/imprimir</w:t>
+            </w:r>
+          </w:p>
+        </w:tc>
+        <w:tc>
+          <w:tcPr>
+            <w:tcW w:type="dxa" w:w="5443"/>
+            <w:tcBorders>
+              <w:top w:val="single" w:color="BFBFBF" w:sz="4"/>
+              <w:left w:val="single" w:color="BFBFBF" w:sz="4"/>
+              <w:bottom w:val="single" w:color="BFBFBF" w:sz="4"/>
+              <w:right w:val="single" w:color="BFBFBF" w:sz="4"/>
+            </w:tcBorders>
+            <w:tcMar>
+              <w:top w:type="dxa" w:w="60"/>
+              <w:left w:type="dxa" w:w="100"/>
+              <w:bottom w:type="dxa" w:w="60"/>
+              <w:right w:type="dxa" w:w="100"/>
+            </w:tcMar>
+          </w:tcPr>
+          <w:p>
+            <w:r>
+              <w:rPr>
+                <w:sz w:val="20"/>
+                <w:szCs w:val="20"/>
+              </w:rPr>
+              <w:t xml:space="preserve">Página com as folhas de resposta em A4, uma ou mais páginas por folha. Com </w:t>
+            </w:r>
+            <w:r>
+              <w:rPr>
+                <w:rFonts w:ascii="Consolas" w:cs="Consolas" w:eastAsia="Consolas" w:hAnsi="Consolas"/>
+                <w:sz w:val="20"/>
+                <w:szCs w:val="20"/>
+              </w:rPr>
+              <w:t xml:space="preserve">folha={id}</w:t>
+            </w:r>
+            <w:r>
+              <w:rPr>
+                <w:sz w:val="20"/>
+                <w:szCs w:val="20"/>
+              </w:rPr>
+              <w:t xml:space="preserve">, só aquela folha, para reimprimir uma que se perdeu</w:t>
             </w:r>
           </w:p>
         </w:tc>
@@ -29557,7 +30570,7 @@
                 <w:sz w:val="20"/>
                 <w:szCs w:val="20"/>
               </w:rPr>
-              <w:t xml:space="preserve">Título, turma e campos para nome, turma, data e nota</w:t>
+              <w:t xml:space="preserve">Título e turma, sem campo de nome: o aluno é identificado pelo código da folha de respostas</w:t>
             </w:r>
           </w:p>
         </w:tc>
@@ -29950,7 +30963,7 @@
         <w:spacing w:after="120" w:line="300"/>
       </w:pPr>
       <w:r>
-        <w:t xml:space="preserve">Um layout padronizado de folha também prepara a fase posterior de reconhecimento de texto manuscrito: com as respostas sempre nas mesmas áreas da página, fica mais simples localizar cada resposta na imagem digitalizada.</w:t>
+        <w:t xml:space="preserve">Desde a versão 0.14, a atividade é impressa em duas partes: o caderno de questões, igual para todos e sem identificação, e uma folha de respostas por aluno, descrita na seção 4.23. Enquanto houver folhas geradas, as questões da atividade ficam travadas: adicionar, remover ou mudar a ordem é recusado com um aviso, porque a folha já impressa deixaria de corresponder às questões.</w:t>
       </w:r>
     </w:p>
     <w:p>
@@ -30191,6 +31204,912 @@
       <w:pPr>
         <w:spacing w:after="120"/>
       </w:pPr>
+    </w:p>
+    <w:p>
+      <w:pPr>
+        <w:pStyle w:val="Heading2"/>
+      </w:pPr>
+      <w:r>
+        <w:t xml:space="preserve">4.23 Folhas de resposta: app/folhas/</w:t>
+      </w:r>
+    </w:p>
+    <w:p>
+      <w:pPr>
+        <w:spacing w:after="120" w:line="300"/>
+      </w:pPr>
+      <w:r>
+        <w:t xml:space="preserve">É a primeira parte do fluxo de resultados dos alunos: o professor imprime uma folha de respostas por aluno, cada uma com um código único no lugar do nome; o aluno responde à mão e guarda o canhoto com o código; depois o professor digitaliza as folhas, o sistema identifica cada uma pelo código e o aluno consulta o próprio resultado digitando o código. As etapas seguintes (respostas por folha, digitalização, leitura automática e página do aluno) entram nas próximas versões.</w:t>
+      </w:r>
+    </w:p>
+    <w:p>
+      <w:pPr>
+        <w:pStyle w:val="Heading3"/>
+      </w:pPr>
+      <w:r>
+        <w:t xml:space="preserve">Código da folha (servico.py)</w:t>
+      </w:r>
+    </w:p>
+    <w:tbl>
+      <w:tblPr>
+        <w:tblW w:type="dxa" w:w="9071"/>
+        <w:tblBorders>
+          <w:top w:val="single" w:color="auto" w:sz="4"/>
+          <w:left w:val="single" w:color="auto" w:sz="4"/>
+          <w:bottom w:val="single" w:color="auto" w:sz="4"/>
+          <w:right w:val="single" w:color="auto" w:sz="4"/>
+          <w:insideH w:val="single" w:color="auto" w:sz="4"/>
+          <w:insideV w:val="single" w:color="auto" w:sz="4"/>
+        </w:tblBorders>
+      </w:tblPr>
+      <w:tblGrid>
+        <w:gridCol w:w="3628"/>
+        <w:gridCol w:w="5443"/>
+      </w:tblGrid>
+      <w:tr>
+        <w:trPr>
+          <w:tblHeader/>
+        </w:trPr>
+        <w:tc>
+          <w:tcPr>
+            <w:tcW w:type="dxa" w:w="3628"/>
+            <w:tcBorders>
+              <w:top w:val="single" w:color="BFBFBF" w:sz="4"/>
+              <w:left w:val="single" w:color="BFBFBF" w:sz="4"/>
+              <w:bottom w:val="single" w:color="BFBFBF" w:sz="4"/>
+              <w:right w:val="single" w:color="BFBFBF" w:sz="4"/>
+            </w:tcBorders>
+            <w:shd w:fill="D9E2F3" w:color="auto" w:val="clear"/>
+            <w:tcMar>
+              <w:top w:type="dxa" w:w="60"/>
+              <w:left w:type="dxa" w:w="100"/>
+              <w:bottom w:type="dxa" w:w="60"/>
+              <w:right w:type="dxa" w:w="100"/>
+            </w:tcMar>
+          </w:tcPr>
+          <w:p>
+            <w:r>
+              <w:rPr>
+                <w:b/>
+                <w:bCs/>
+                <w:sz w:val="20"/>
+                <w:szCs w:val="20"/>
+              </w:rPr>
+              <w:t xml:space="preserve">Função</w:t>
+            </w:r>
+          </w:p>
+        </w:tc>
+        <w:tc>
+          <w:tcPr>
+            <w:tcW w:type="dxa" w:w="5443"/>
+            <w:tcBorders>
+              <w:top w:val="single" w:color="BFBFBF" w:sz="4"/>
+              <w:left w:val="single" w:color="BFBFBF" w:sz="4"/>
+              <w:bottom w:val="single" w:color="BFBFBF" w:sz="4"/>
+              <w:right w:val="single" w:color="BFBFBF" w:sz="4"/>
+            </w:tcBorders>
+            <w:shd w:fill="D9E2F3" w:color="auto" w:val="clear"/>
+            <w:tcMar>
+              <w:top w:type="dxa" w:w="60"/>
+              <w:left w:type="dxa" w:w="100"/>
+              <w:bottom w:type="dxa" w:w="60"/>
+              <w:right w:type="dxa" w:w="100"/>
+            </w:tcMar>
+          </w:tcPr>
+          <w:p>
+            <w:r>
+              <w:rPr>
+                <w:b/>
+                <w:bCs/>
+                <w:sz w:val="20"/>
+                <w:szCs w:val="20"/>
+              </w:rPr>
+              <w:t xml:space="preserve">O que faz</w:t>
+            </w:r>
+          </w:p>
+        </w:tc>
+      </w:tr>
+      <w:tr>
+        <w:trPr>
+          <w:cantSplit/>
+        </w:trPr>
+        <w:tc>
+          <w:tcPr>
+            <w:tcW w:type="dxa" w:w="3628"/>
+            <w:tcBorders>
+              <w:top w:val="single" w:color="BFBFBF" w:sz="4"/>
+              <w:left w:val="single" w:color="BFBFBF" w:sz="4"/>
+              <w:bottom w:val="single" w:color="BFBFBF" w:sz="4"/>
+              <w:right w:val="single" w:color="BFBFBF" w:sz="4"/>
+            </w:tcBorders>
+            <w:tcMar>
+              <w:top w:type="dxa" w:w="60"/>
+              <w:left w:type="dxa" w:w="100"/>
+              <w:bottom w:type="dxa" w:w="60"/>
+              <w:right w:type="dxa" w:w="100"/>
+            </w:tcMar>
+          </w:tcPr>
+          <w:p>
+            <w:r>
+              <w:rPr>
+                <w:rFonts w:ascii="Consolas" w:cs="Consolas" w:eastAsia="Consolas" w:hAnsi="Consolas"/>
+                <w:sz w:val="20"/>
+                <w:szCs w:val="20"/>
+              </w:rPr>
+              <w:t xml:space="preserve">novo_codigo()</w:t>
+            </w:r>
+          </w:p>
+        </w:tc>
+        <w:tc>
+          <w:tcPr>
+            <w:tcW w:type="dxa" w:w="5443"/>
+            <w:tcBorders>
+              <w:top w:val="single" w:color="BFBFBF" w:sz="4"/>
+              <w:left w:val="single" w:color="BFBFBF" w:sz="4"/>
+              <w:bottom w:val="single" w:color="BFBFBF" w:sz="4"/>
+              <w:right w:val="single" w:color="BFBFBF" w:sz="4"/>
+            </w:tcBorders>
+            <w:tcMar>
+              <w:top w:type="dxa" w:w="60"/>
+              <w:left w:type="dxa" w:w="100"/>
+              <w:bottom w:type="dxa" w:w="60"/>
+              <w:right w:type="dxa" w:w="100"/>
+            </w:tcMar>
+          </w:tcPr>
+          <w:p>
+            <w:r>
+              <w:rPr>
+                <w:sz w:val="20"/>
+                <w:szCs w:val="20"/>
+              </w:rPr>
+              <w:t xml:space="preserve">Sorteia um código de 8 caracteres no formato </w:t>
+            </w:r>
+            <w:r>
+              <w:rPr>
+                <w:rFonts w:ascii="Consolas" w:cs="Consolas" w:eastAsia="Consolas" w:hAnsi="Consolas"/>
+                <w:sz w:val="20"/>
+                <w:szCs w:val="20"/>
+              </w:rPr>
+              <w:t xml:space="preserve">XXXX-XXXX</w:t>
+            </w:r>
+            <w:r>
+              <w:rPr>
+                <w:sz w:val="20"/>
+                <w:szCs w:val="20"/>
+              </w:rPr>
+              <w:t xml:space="preserve">, com o gerador criptográfico da biblioteca padrão (</w:t>
+            </w:r>
+            <w:r>
+              <w:rPr>
+                <w:rFonts w:ascii="Consolas" w:cs="Consolas" w:eastAsia="Consolas" w:hAnsi="Consolas"/>
+                <w:sz w:val="20"/>
+                <w:szCs w:val="20"/>
+              </w:rPr>
+              <w:t xml:space="preserve">secrets</w:t>
+            </w:r>
+            <w:r>
+              <w:rPr>
+                <w:sz w:val="20"/>
+                <w:szCs w:val="20"/>
+              </w:rPr>
+              <w:t xml:space="preserve">). O alfabeto não tem 0, O, 1, I e L, que se confundem na escrita e na leitura. São mais de 850 bilhões de combinações, o que torna inviável adivinhar o código de outro aluno</w:t>
+            </w:r>
+          </w:p>
+        </w:tc>
+      </w:tr>
+      <w:tr>
+        <w:trPr>
+          <w:cantSplit/>
+        </w:trPr>
+        <w:tc>
+          <w:tcPr>
+            <w:tcW w:type="dxa" w:w="3628"/>
+            <w:tcBorders>
+              <w:top w:val="single" w:color="BFBFBF" w:sz="4"/>
+              <w:left w:val="single" w:color="BFBFBF" w:sz="4"/>
+              <w:bottom w:val="single" w:color="BFBFBF" w:sz="4"/>
+              <w:right w:val="single" w:color="BFBFBF" w:sz="4"/>
+            </w:tcBorders>
+            <w:tcMar>
+              <w:top w:type="dxa" w:w="60"/>
+              <w:left w:type="dxa" w:w="100"/>
+              <w:bottom w:type="dxa" w:w="60"/>
+              <w:right w:type="dxa" w:w="100"/>
+            </w:tcMar>
+          </w:tcPr>
+          <w:p>
+            <w:r>
+              <w:rPr>
+                <w:rFonts w:ascii="Consolas" w:cs="Consolas" w:eastAsia="Consolas" w:hAnsi="Consolas"/>
+                <w:sz w:val="20"/>
+                <w:szCs w:val="20"/>
+              </w:rPr>
+              <w:t xml:space="preserve">normalizar_codigo(texto)</w:t>
+            </w:r>
+          </w:p>
+        </w:tc>
+        <w:tc>
+          <w:tcPr>
+            <w:tcW w:type="dxa" w:w="5443"/>
+            <w:tcBorders>
+              <w:top w:val="single" w:color="BFBFBF" w:sz="4"/>
+              <w:left w:val="single" w:color="BFBFBF" w:sz="4"/>
+              <w:bottom w:val="single" w:color="BFBFBF" w:sz="4"/>
+              <w:right w:val="single" w:color="BFBFBF" w:sz="4"/>
+            </w:tcBorders>
+            <w:tcMar>
+              <w:top w:type="dxa" w:w="60"/>
+              <w:left w:type="dxa" w:w="100"/>
+              <w:bottom w:type="dxa" w:w="60"/>
+              <w:right w:type="dxa" w:w="100"/>
+            </w:tcMar>
+          </w:tcPr>
+          <w:p>
+            <w:r>
+              <w:rPr>
+                <w:sz w:val="20"/>
+                <w:szCs w:val="20"/>
+              </w:rPr>
+              <w:t xml:space="preserve">Aceita o código digitado com letras minúsculas, espaços ou sem o hífen e devolve o formato padrão</w:t>
+            </w:r>
+          </w:p>
+        </w:tc>
+      </w:tr>
+      <w:tr>
+        <w:trPr>
+          <w:cantSplit/>
+        </w:trPr>
+        <w:tc>
+          <w:tcPr>
+            <w:tcW w:type="dxa" w:w="3628"/>
+            <w:tcBorders>
+              <w:top w:val="single" w:color="BFBFBF" w:sz="4"/>
+              <w:left w:val="single" w:color="BFBFBF" w:sz="4"/>
+              <w:bottom w:val="single" w:color="BFBFBF" w:sz="4"/>
+              <w:right w:val="single" w:color="BFBFBF" w:sz="4"/>
+            </w:tcBorders>
+            <w:tcMar>
+              <w:top w:type="dxa" w:w="60"/>
+              <w:left w:type="dxa" w:w="100"/>
+              <w:bottom w:type="dxa" w:w="60"/>
+              <w:right w:type="dxa" w:w="100"/>
+            </w:tcMar>
+          </w:tcPr>
+          <w:p>
+            <w:r>
+              <w:rPr>
+                <w:rFonts w:ascii="Consolas" w:cs="Consolas" w:eastAsia="Consolas" w:hAnsi="Consolas"/>
+                <w:sz w:val="20"/>
+                <w:szCs w:val="20"/>
+              </w:rPr>
+              <w:t xml:space="preserve">gerar_folhas(sessao, atividade, quantidade, linhas)</w:t>
+            </w:r>
+          </w:p>
+        </w:tc>
+        <w:tc>
+          <w:tcPr>
+            <w:tcW w:type="dxa" w:w="5443"/>
+            <w:tcBorders>
+              <w:top w:val="single" w:color="BFBFBF" w:sz="4"/>
+              <w:left w:val="single" w:color="BFBFBF" w:sz="4"/>
+              <w:bottom w:val="single" w:color="BFBFBF" w:sz="4"/>
+              <w:right w:val="single" w:color="BFBFBF" w:sz="4"/>
+            </w:tcBorders>
+            <w:tcMar>
+              <w:top w:type="dxa" w:w="60"/>
+              <w:left w:type="dxa" w:w="100"/>
+              <w:bottom w:type="dxa" w:w="60"/>
+              <w:right w:type="dxa" w:w="100"/>
+            </w:tcMar>
+          </w:tcPr>
+          <w:p>
+            <w:r>
+              <w:rPr>
+                <w:sz w:val="20"/>
+                <w:szCs w:val="20"/>
+              </w:rPr>
+              <w:t xml:space="preserve">Cria as folhas com códigos que não se repetem no sistema e numeração que continua a das já existentes</w:t>
+            </w:r>
+          </w:p>
+        </w:tc>
+      </w:tr>
+      <w:tr>
+        <w:trPr>
+          <w:cantSplit/>
+        </w:trPr>
+        <w:tc>
+          <w:tcPr>
+            <w:tcW w:type="dxa" w:w="3628"/>
+            <w:tcBorders>
+              <w:top w:val="single" w:color="BFBFBF" w:sz="4"/>
+              <w:left w:val="single" w:color="BFBFBF" w:sz="4"/>
+              <w:bottom w:val="single" w:color="BFBFBF" w:sz="4"/>
+              <w:right w:val="single" w:color="BFBFBF" w:sz="4"/>
+            </w:tcBorders>
+            <w:tcMar>
+              <w:top w:type="dxa" w:w="60"/>
+              <w:left w:type="dxa" w:w="100"/>
+              <w:bottom w:type="dxa" w:w="60"/>
+              <w:right w:type="dxa" w:w="100"/>
+            </w:tcMar>
+          </w:tcPr>
+          <w:p>
+            <w:r>
+              <w:rPr>
+                <w:rFonts w:ascii="Consolas" w:cs="Consolas" w:eastAsia="Consolas" w:hAnsi="Consolas"/>
+                <w:sz w:val="20"/>
+                <w:szCs w:val="20"/>
+              </w:rPr>
+              <w:t xml:space="preserve">questoes_travadas(atividade)</w:t>
+            </w:r>
+          </w:p>
+        </w:tc>
+        <w:tc>
+          <w:tcPr>
+            <w:tcW w:type="dxa" w:w="5443"/>
+            <w:tcBorders>
+              <w:top w:val="single" w:color="BFBFBF" w:sz="4"/>
+              <w:left w:val="single" w:color="BFBFBF" w:sz="4"/>
+              <w:bottom w:val="single" w:color="BFBFBF" w:sz="4"/>
+              <w:right w:val="single" w:color="BFBFBF" w:sz="4"/>
+            </w:tcBorders>
+            <w:tcMar>
+              <w:top w:type="dxa" w:w="60"/>
+              <w:left w:type="dxa" w:w="100"/>
+              <w:bottom w:type="dxa" w:w="60"/>
+              <w:right w:type="dxa" w:w="100"/>
+            </w:tcMar>
+          </w:tcPr>
+          <w:p>
+            <w:r>
+              <w:rPr>
+                <w:sz w:val="20"/>
+                <w:szCs w:val="20"/>
+              </w:rPr>
+              <w:t xml:space="preserve">Verdadeiro quando a atividade já tem folhas</w:t>
+            </w:r>
+          </w:p>
+        </w:tc>
+      </w:tr>
+      <w:tr>
+        <w:trPr>
+          <w:cantSplit/>
+        </w:trPr>
+        <w:tc>
+          <w:tcPr>
+            <w:tcW w:type="dxa" w:w="3628"/>
+            <w:tcBorders>
+              <w:top w:val="single" w:color="BFBFBF" w:sz="4"/>
+              <w:left w:val="single" w:color="BFBFBF" w:sz="4"/>
+              <w:bottom w:val="single" w:color="BFBFBF" w:sz="4"/>
+              <w:right w:val="single" w:color="BFBFBF" w:sz="4"/>
+            </w:tcBorders>
+            <w:tcMar>
+              <w:top w:type="dxa" w:w="60"/>
+              <w:left w:type="dxa" w:w="100"/>
+              <w:bottom w:type="dxa" w:w="60"/>
+              <w:right w:type="dxa" w:w="100"/>
+            </w:tcMar>
+          </w:tcPr>
+          <w:p>
+            <w:r>
+              <w:rPr>
+                <w:rFonts w:ascii="Consolas" w:cs="Consolas" w:eastAsia="Consolas" w:hAnsi="Consolas"/>
+                <w:sz w:val="20"/>
+                <w:szCs w:val="20"/>
+              </w:rPr>
+              <w:t xml:space="preserve">qr_svg(texto)</w:t>
+            </w:r>
+          </w:p>
+        </w:tc>
+        <w:tc>
+          <w:tcPr>
+            <w:tcW w:type="dxa" w:w="5443"/>
+            <w:tcBorders>
+              <w:top w:val="single" w:color="BFBFBF" w:sz="4"/>
+              <w:left w:val="single" w:color="BFBFBF" w:sz="4"/>
+              <w:bottom w:val="single" w:color="BFBFBF" w:sz="4"/>
+              <w:right w:val="single" w:color="BFBFBF" w:sz="4"/>
+            </w:tcBorders>
+            <w:tcMar>
+              <w:top w:type="dxa" w:w="60"/>
+              <w:left w:type="dxa" w:w="100"/>
+              <w:bottom w:type="dxa" w:w="60"/>
+              <w:right w:type="dxa" w:w="100"/>
+            </w:tcMar>
+          </w:tcPr>
+          <w:p>
+            <w:r>
+              <w:rPr>
+                <w:sz w:val="20"/>
+                <w:szCs w:val="20"/>
+              </w:rPr>
+              <w:t xml:space="preserve">Desenha o QR code em SVG, um formato vetorial que sai nítido em qualquer impressora</w:t>
+            </w:r>
+          </w:p>
+        </w:tc>
+      </w:tr>
+    </w:tbl>
+    <w:p>
+      <w:pPr>
+        <w:spacing w:after="120"/>
+      </w:pPr>
+    </w:p>
+    <w:p>
+      <w:pPr>
+        <w:pStyle w:val="Heading3"/>
+      </w:pPr>
+      <w:r>
+        <w:t xml:space="preserve">Posição dos elementos (layout.py)</w:t>
+      </w:r>
+    </w:p>
+    <w:p>
+      <w:pPr>
+        <w:spacing w:after="120" w:line="300"/>
+      </w:pPr>
+      <w:r>
+        <w:t xml:space="preserve">A função </w:t>
+      </w:r>
+      <w:r>
+        <w:rPr>
+          <w:rFonts w:ascii="Consolas" w:cs="Consolas" w:eastAsia="Consolas" w:hAnsi="Consolas"/>
+          <w:sz w:val="20"/>
+          <w:szCs w:val="20"/>
+        </w:rPr>
+        <w:t xml:space="preserve">montar(atividade, linhas)</w:t>
+      </w:r>
+      <w:r>
+        <w:t xml:space="preserve"> calcula, em milímetros, a posição de cada elemento de cada página: as bolinhas das objetivas, numa grade de duas colunas, e uma caixa com linhas para cada discursiva ou para cada item, passando para uma nova página quando a próxima caixa não cabe. As posições não dependem do navegador nem da impressora, e a mesma função será usada para ler a folha digitalizada: o sistema sabe exatamente onde procurar cada resposta na imagem.</w:t>
+      </w:r>
+    </w:p>
+    <w:tbl>
+      <w:tblPr>
+        <w:tblW w:type="dxa" w:w="9071"/>
+        <w:tblBorders>
+          <w:top w:val="single" w:color="auto" w:sz="4"/>
+          <w:left w:val="single" w:color="auto" w:sz="4"/>
+          <w:bottom w:val="single" w:color="auto" w:sz="4"/>
+          <w:right w:val="single" w:color="auto" w:sz="4"/>
+          <w:insideH w:val="single" w:color="auto" w:sz="4"/>
+          <w:insideV w:val="single" w:color="auto" w:sz="4"/>
+        </w:tblBorders>
+      </w:tblPr>
+      <w:tblGrid>
+        <w:gridCol w:w="2721"/>
+        <w:gridCol w:w="6350"/>
+      </w:tblGrid>
+      <w:tr>
+        <w:trPr>
+          <w:tblHeader/>
+        </w:trPr>
+        <w:tc>
+          <w:tcPr>
+            <w:tcW w:type="dxa" w:w="2721"/>
+            <w:tcBorders>
+              <w:top w:val="single" w:color="BFBFBF" w:sz="4"/>
+              <w:left w:val="single" w:color="BFBFBF" w:sz="4"/>
+              <w:bottom w:val="single" w:color="BFBFBF" w:sz="4"/>
+              <w:right w:val="single" w:color="BFBFBF" w:sz="4"/>
+            </w:tcBorders>
+            <w:shd w:fill="D9E2F3" w:color="auto" w:val="clear"/>
+            <w:tcMar>
+              <w:top w:type="dxa" w:w="60"/>
+              <w:left w:type="dxa" w:w="100"/>
+              <w:bottom w:type="dxa" w:w="60"/>
+              <w:right w:type="dxa" w:w="100"/>
+            </w:tcMar>
+          </w:tcPr>
+          <w:p>
+            <w:r>
+              <w:rPr>
+                <w:b/>
+                <w:bCs/>
+                <w:sz w:val="20"/>
+                <w:szCs w:val="20"/>
+              </w:rPr>
+              <w:t xml:space="preserve">Elemento</w:t>
+            </w:r>
+          </w:p>
+        </w:tc>
+        <w:tc>
+          <w:tcPr>
+            <w:tcW w:type="dxa" w:w="6350"/>
+            <w:tcBorders>
+              <w:top w:val="single" w:color="BFBFBF" w:sz="4"/>
+              <w:left w:val="single" w:color="BFBFBF" w:sz="4"/>
+              <w:bottom w:val="single" w:color="BFBFBF" w:sz="4"/>
+              <w:right w:val="single" w:color="BFBFBF" w:sz="4"/>
+            </w:tcBorders>
+            <w:shd w:fill="D9E2F3" w:color="auto" w:val="clear"/>
+            <w:tcMar>
+              <w:top w:type="dxa" w:w="60"/>
+              <w:left w:type="dxa" w:w="100"/>
+              <w:bottom w:type="dxa" w:w="60"/>
+              <w:right w:type="dxa" w:w="100"/>
+            </w:tcMar>
+          </w:tcPr>
+          <w:p>
+            <w:r>
+              <w:rPr>
+                <w:b/>
+                <w:bCs/>
+                <w:sz w:val="20"/>
+                <w:szCs w:val="20"/>
+              </w:rPr>
+              <w:t xml:space="preserve">Posição e finalidade</w:t>
+            </w:r>
+          </w:p>
+        </w:tc>
+      </w:tr>
+      <w:tr>
+        <w:trPr>
+          <w:cantSplit/>
+        </w:trPr>
+        <w:tc>
+          <w:tcPr>
+            <w:tcW w:type="dxa" w:w="2721"/>
+            <w:tcBorders>
+              <w:top w:val="single" w:color="BFBFBF" w:sz="4"/>
+              <w:left w:val="single" w:color="BFBFBF" w:sz="4"/>
+              <w:bottom w:val="single" w:color="BFBFBF" w:sz="4"/>
+              <w:right w:val="single" w:color="BFBFBF" w:sz="4"/>
+            </w:tcBorders>
+            <w:tcMar>
+              <w:top w:type="dxa" w:w="60"/>
+              <w:left w:type="dxa" w:w="100"/>
+              <w:bottom w:type="dxa" w:w="60"/>
+              <w:right w:type="dxa" w:w="100"/>
+            </w:tcMar>
+          </w:tcPr>
+          <w:p>
+            <w:r>
+              <w:rPr>
+                <w:sz w:val="20"/>
+                <w:szCs w:val="20"/>
+              </w:rPr>
+              <w:t xml:space="preserve">Marcas de alinhamento</w:t>
+            </w:r>
+          </w:p>
+        </w:tc>
+        <w:tc>
+          <w:tcPr>
+            <w:tcW w:type="dxa" w:w="6350"/>
+            <w:tcBorders>
+              <w:top w:val="single" w:color="BFBFBF" w:sz="4"/>
+              <w:left w:val="single" w:color="BFBFBF" w:sz="4"/>
+              <w:bottom w:val="single" w:color="BFBFBF" w:sz="4"/>
+              <w:right w:val="single" w:color="BFBFBF" w:sz="4"/>
+            </w:tcBorders>
+            <w:tcMar>
+              <w:top w:type="dxa" w:w="60"/>
+              <w:left w:type="dxa" w:w="100"/>
+              <w:bottom w:type="dxa" w:w="60"/>
+              <w:right w:type="dxa" w:w="100"/>
+            </w:tcMar>
+          </w:tcPr>
+          <w:p>
+            <w:r>
+              <w:rPr>
+                <w:sz w:val="20"/>
+                <w:szCs w:val="20"/>
+              </w:rPr>
+              <w:t xml:space="preserve">Quatro quadrados pretos de 8 mm nos cantos da área de respostas. Na leitura, servem para corrigir a inclinação e a escala da imagem digitalizada</w:t>
+            </w:r>
+          </w:p>
+        </w:tc>
+      </w:tr>
+      <w:tr>
+        <w:trPr>
+          <w:cantSplit/>
+        </w:trPr>
+        <w:tc>
+          <w:tcPr>
+            <w:tcW w:type="dxa" w:w="2721"/>
+            <w:tcBorders>
+              <w:top w:val="single" w:color="BFBFBF" w:sz="4"/>
+              <w:left w:val="single" w:color="BFBFBF" w:sz="4"/>
+              <w:bottom w:val="single" w:color="BFBFBF" w:sz="4"/>
+              <w:right w:val="single" w:color="BFBFBF" w:sz="4"/>
+            </w:tcBorders>
+            <w:tcMar>
+              <w:top w:type="dxa" w:w="60"/>
+              <w:left w:type="dxa" w:w="100"/>
+              <w:bottom w:type="dxa" w:w="60"/>
+              <w:right w:type="dxa" w:w="100"/>
+            </w:tcMar>
+          </w:tcPr>
+          <w:p>
+            <w:r>
+              <w:rPr>
+                <w:sz w:val="20"/>
+                <w:szCs w:val="20"/>
+              </w:rPr>
+              <w:t xml:space="preserve">QR code</w:t>
+            </w:r>
+          </w:p>
+        </w:tc>
+        <w:tc>
+          <w:tcPr>
+            <w:tcW w:type="dxa" w:w="6350"/>
+            <w:tcBorders>
+              <w:top w:val="single" w:color="BFBFBF" w:sz="4"/>
+              <w:left w:val="single" w:color="BFBFBF" w:sz="4"/>
+              <w:bottom w:val="single" w:color="BFBFBF" w:sz="4"/>
+              <w:right w:val="single" w:color="BFBFBF" w:sz="4"/>
+            </w:tcBorders>
+            <w:tcMar>
+              <w:top w:type="dxa" w:w="60"/>
+              <w:left w:type="dxa" w:w="100"/>
+              <w:bottom w:type="dxa" w:w="60"/>
+              <w:right w:type="dxa" w:w="100"/>
+            </w:tcMar>
+          </w:tcPr>
+          <w:p>
+            <w:r>
+              <w:rPr>
+                <w:sz w:val="20"/>
+                <w:szCs w:val="20"/>
+              </w:rPr>
+              <w:t xml:space="preserve">No canto superior direito, com o conteúdo </w:t>
+            </w:r>
+            <w:r>
+              <w:rPr>
+                <w:rFonts w:ascii="Consolas" w:cs="Consolas" w:eastAsia="Consolas" w:hAnsi="Consolas"/>
+                <w:sz w:val="20"/>
+                <w:szCs w:val="20"/>
+              </w:rPr>
+              <w:t xml:space="preserve">DEVOLUTIVA|código|página</w:t>
+            </w:r>
+            <w:r>
+              <w:rPr>
+                <w:sz w:val="20"/>
+                <w:szCs w:val="20"/>
+              </w:rPr>
+              <w:t xml:space="preserve">. Identifica a folha e a página sem depender de leitura de texto</w:t>
+            </w:r>
+          </w:p>
+        </w:tc>
+      </w:tr>
+      <w:tr>
+        <w:trPr>
+          <w:cantSplit/>
+        </w:trPr>
+        <w:tc>
+          <w:tcPr>
+            <w:tcW w:type="dxa" w:w="2721"/>
+            <w:tcBorders>
+              <w:top w:val="single" w:color="BFBFBF" w:sz="4"/>
+              <w:left w:val="single" w:color="BFBFBF" w:sz="4"/>
+              <w:bottom w:val="single" w:color="BFBFBF" w:sz="4"/>
+              <w:right w:val="single" w:color="BFBFBF" w:sz="4"/>
+            </w:tcBorders>
+            <w:tcMar>
+              <w:top w:type="dxa" w:w="60"/>
+              <w:left w:type="dxa" w:w="100"/>
+              <w:bottom w:type="dxa" w:w="60"/>
+              <w:right w:type="dxa" w:w="100"/>
+            </w:tcMar>
+          </w:tcPr>
+          <w:p>
+            <w:r>
+              <w:rPr>
+                <w:sz w:val="20"/>
+                <w:szCs w:val="20"/>
+              </w:rPr>
+              <w:t xml:space="preserve">Cabeçalho</w:t>
+            </w:r>
+          </w:p>
+        </w:tc>
+        <w:tc>
+          <w:tcPr>
+            <w:tcW w:type="dxa" w:w="6350"/>
+            <w:tcBorders>
+              <w:top w:val="single" w:color="BFBFBF" w:sz="4"/>
+              <w:left w:val="single" w:color="BFBFBF" w:sz="4"/>
+              <w:bottom w:val="single" w:color="BFBFBF" w:sz="4"/>
+              <w:right w:val="single" w:color="BFBFBF" w:sz="4"/>
+            </w:tcBorders>
+            <w:tcMar>
+              <w:top w:type="dxa" w:w="60"/>
+              <w:left w:type="dxa" w:w="100"/>
+              <w:bottom w:type="dxa" w:w="60"/>
+              <w:right w:type="dxa" w:w="100"/>
+            </w:tcMar>
+          </w:tcPr>
+          <w:p>
+            <w:r>
+              <w:rPr>
+                <w:sz w:val="20"/>
+                <w:szCs w:val="20"/>
+              </w:rPr>
+              <w:t xml:space="preserve">Título, turma, número da página e o código da folha em letras grandes, para conferência visual</w:t>
+            </w:r>
+          </w:p>
+        </w:tc>
+      </w:tr>
+      <w:tr>
+        <w:trPr>
+          <w:cantSplit/>
+        </w:trPr>
+        <w:tc>
+          <w:tcPr>
+            <w:tcW w:type="dxa" w:w="2721"/>
+            <w:tcBorders>
+              <w:top w:val="single" w:color="BFBFBF" w:sz="4"/>
+              <w:left w:val="single" w:color="BFBFBF" w:sz="4"/>
+              <w:bottom w:val="single" w:color="BFBFBF" w:sz="4"/>
+              <w:right w:val="single" w:color="BFBFBF" w:sz="4"/>
+            </w:tcBorders>
+            <w:tcMar>
+              <w:top w:type="dxa" w:w="60"/>
+              <w:left w:type="dxa" w:w="100"/>
+              <w:bottom w:type="dxa" w:w="60"/>
+              <w:right w:type="dxa" w:w="100"/>
+            </w:tcMar>
+          </w:tcPr>
+          <w:p>
+            <w:r>
+              <w:rPr>
+                <w:sz w:val="20"/>
+                <w:szCs w:val="20"/>
+              </w:rPr>
+              <w:t xml:space="preserve">Objetivas</w:t>
+            </w:r>
+          </w:p>
+        </w:tc>
+        <w:tc>
+          <w:tcPr>
+            <w:tcW w:type="dxa" w:w="6350"/>
+            <w:tcBorders>
+              <w:top w:val="single" w:color="BFBFBF" w:sz="4"/>
+              <w:left w:val="single" w:color="BFBFBF" w:sz="4"/>
+              <w:bottom w:val="single" w:color="BFBFBF" w:sz="4"/>
+              <w:right w:val="single" w:color="BFBFBF" w:sz="4"/>
+            </w:tcBorders>
+            <w:tcMar>
+              <w:top w:type="dxa" w:w="60"/>
+              <w:left w:type="dxa" w:w="100"/>
+              <w:bottom w:type="dxa" w:w="60"/>
+              <w:right w:type="dxa" w:w="100"/>
+            </w:tcMar>
+          </w:tcPr>
+          <w:p>
+            <w:r>
+              <w:rPr>
+                <w:sz w:val="20"/>
+                <w:szCs w:val="20"/>
+              </w:rPr>
+              <w:t xml:space="preserve">Uma linha por questão, com bolinhas de 5,2 mm de diâmetro identificadas pela letra. Se a objetiva não tem alternativas cadastradas, recebe as letras A a E</w:t>
+            </w:r>
+          </w:p>
+        </w:tc>
+      </w:tr>
+      <w:tr>
+        <w:trPr>
+          <w:cantSplit/>
+        </w:trPr>
+        <w:tc>
+          <w:tcPr>
+            <w:tcW w:type="dxa" w:w="2721"/>
+            <w:tcBorders>
+              <w:top w:val="single" w:color="BFBFBF" w:sz="4"/>
+              <w:left w:val="single" w:color="BFBFBF" w:sz="4"/>
+              <w:bottom w:val="single" w:color="BFBFBF" w:sz="4"/>
+              <w:right w:val="single" w:color="BFBFBF" w:sz="4"/>
+            </w:tcBorders>
+            <w:tcMar>
+              <w:top w:type="dxa" w:w="60"/>
+              <w:left w:type="dxa" w:w="100"/>
+              <w:bottom w:type="dxa" w:w="60"/>
+              <w:right w:type="dxa" w:w="100"/>
+            </w:tcMar>
+          </w:tcPr>
+          <w:p>
+            <w:r>
+              <w:rPr>
+                <w:sz w:val="20"/>
+                <w:szCs w:val="20"/>
+              </w:rPr>
+              <w:t xml:space="preserve">Discursivas</w:t>
+            </w:r>
+          </w:p>
+        </w:tc>
+        <w:tc>
+          <w:tcPr>
+            <w:tcW w:type="dxa" w:w="6350"/>
+            <w:tcBorders>
+              <w:top w:val="single" w:color="BFBFBF" w:sz="4"/>
+              <w:left w:val="single" w:color="BFBFBF" w:sz="4"/>
+              <w:bottom w:val="single" w:color="BFBFBF" w:sz="4"/>
+              <w:right w:val="single" w:color="BFBFBF" w:sz="4"/>
+            </w:tcBorders>
+            <w:tcMar>
+              <w:top w:type="dxa" w:w="60"/>
+              <w:left w:type="dxa" w:w="100"/>
+              <w:bottom w:type="dxa" w:w="60"/>
+              <w:right w:type="dxa" w:w="100"/>
+            </w:tcMar>
+          </w:tcPr>
+          <w:p>
+            <w:r>
+              <w:rPr>
+                <w:sz w:val="20"/>
+                <w:szCs w:val="20"/>
+              </w:rPr>
+              <w:t xml:space="preserve">Uma caixa por questão ou por item, com o rótulo acima e linhas de escrita a cada 8 mm</w:t>
+            </w:r>
+          </w:p>
+        </w:tc>
+      </w:tr>
+      <w:tr>
+        <w:trPr>
+          <w:cantSplit/>
+        </w:trPr>
+        <w:tc>
+          <w:tcPr>
+            <w:tcW w:type="dxa" w:w="2721"/>
+            <w:tcBorders>
+              <w:top w:val="single" w:color="BFBFBF" w:sz="4"/>
+              <w:left w:val="single" w:color="BFBFBF" w:sz="4"/>
+              <w:bottom w:val="single" w:color="BFBFBF" w:sz="4"/>
+              <w:right w:val="single" w:color="BFBFBF" w:sz="4"/>
+            </w:tcBorders>
+            <w:tcMar>
+              <w:top w:type="dxa" w:w="60"/>
+              <w:left w:type="dxa" w:w="100"/>
+              <w:bottom w:type="dxa" w:w="60"/>
+              <w:right w:type="dxa" w:w="100"/>
+            </w:tcMar>
+          </w:tcPr>
+          <w:p>
+            <w:r>
+              <w:rPr>
+                <w:sz w:val="20"/>
+                <w:szCs w:val="20"/>
+              </w:rPr>
+              <w:t xml:space="preserve">Canhoto</w:t>
+            </w:r>
+          </w:p>
+        </w:tc>
+        <w:tc>
+          <w:tcPr>
+            <w:tcW w:type="dxa" w:w="6350"/>
+            <w:tcBorders>
+              <w:top w:val="single" w:color="BFBFBF" w:sz="4"/>
+              <w:left w:val="single" w:color="BFBFBF" w:sz="4"/>
+              <w:bottom w:val="single" w:color="BFBFBF" w:sz="4"/>
+              <w:right w:val="single" w:color="BFBFBF" w:sz="4"/>
+            </w:tcBorders>
+            <w:tcMar>
+              <w:top w:type="dxa" w:w="60"/>
+              <w:left w:type="dxa" w:w="100"/>
+              <w:bottom w:type="dxa" w:w="60"/>
+              <w:right w:type="dxa" w:w="100"/>
+            </w:tcMar>
+          </w:tcPr>
+          <w:p>
+            <w:r>
+              <w:rPr>
+                <w:sz w:val="20"/>
+                <w:szCs w:val="20"/>
+              </w:rPr>
+              <w:t xml:space="preserve">Só na primeira página, abaixo de uma linha tracejada: título, código e o endereço onde o aluno consulta o resultado</w:t>
+            </w:r>
+          </w:p>
+        </w:tc>
+      </w:tr>
+    </w:tbl>
+    <w:p>
+      <w:pPr>
+        <w:spacing w:after="120"/>
+      </w:pPr>
+    </w:p>
+    <w:p>
+      <w:pPr>
+        <w:spacing w:after="120" w:line="300"/>
+      </w:pPr>
+      <w:r>
+        <w:t xml:space="preserve">Para imprimir, a página orienta a usar papel A4, escala 100% ("Tamanho real") e margens "Nenhuma". Com outra escala, as posições na folha deixam de corresponder às calculadas.</w:t>
+      </w:r>
     </w:p>
     <w:p>
       <w:pPr>
@@ -33622,7 +35541,7 @@
         <w:t xml:space="preserve">pytest</w:t>
       </w:r>
       <w:r>
-        <w:t xml:space="preserve"> e não acessam a internet nem gastam crédito: a API da OpenAI e a API do ENEM são substituídas por versões falsas que devolvem respostas controladas. Total nesta versão: 175 testes. Os testes de páginas entram com uma conta de administrador criada no banco de teste, e o custo do scrypt é reduzido só nos testes, para que rodem em poucos segundos.</w:t>
+        <w:t xml:space="preserve"> e não acessam a internet nem gastam crédito: a API da OpenAI e a API do ENEM são substituídas por versões falsas que devolvem respostas controladas. Total nesta versão: 195 testes. Os testes de páginas entram com uma conta de administrador criada no banco de teste, e o custo do scrypt é reduzido só nos testes, para que rodem em poucos segundos.</w:t>
       </w:r>
     </w:p>
     <w:tbl>
@@ -34311,6 +36230,64 @@
                 <w:sz w:val="20"/>
                 <w:szCs w:val="20"/>
               </w:rPr>
+              <w:t xml:space="preserve">tests/test_folhas.py</w:t>
+            </w:r>
+          </w:p>
+        </w:tc>
+        <w:tc>
+          <w:tcPr>
+            <w:tcW w:type="dxa" w:w="6350"/>
+            <w:tcBorders>
+              <w:top w:val="single" w:color="BFBFBF" w:sz="4"/>
+              <w:left w:val="single" w:color="BFBFBF" w:sz="4"/>
+              <w:bottom w:val="single" w:color="BFBFBF" w:sz="4"/>
+              <w:right w:val="single" w:color="BFBFBF" w:sz="4"/>
+            </w:tcBorders>
+            <w:tcMar>
+              <w:top w:type="dxa" w:w="60"/>
+              <w:left w:type="dxa" w:w="100"/>
+              <w:bottom w:type="dxa" w:w="60"/>
+              <w:right w:type="dxa" w:w="100"/>
+            </w:tcMar>
+          </w:tcPr>
+          <w:p>
+            <w:r>
+              <w:rPr>
+                <w:sz w:val="20"/>
+                <w:szCs w:val="20"/>
+              </w:rPr>
+              <w:t xml:space="preserve">Formato e alfabeto do código, sem repetições; código digitado normalizado; geração com numeração contínua e layout mantido; quantidades e linhas inválidas; atividade sem questões; questões travadas depois das folhas e liberadas ao descartar; folhas impressas com código, QR code, marcas, bolinhas, caixas e canhoto; impressão de uma única folha; caderno sem linhas quando há folhas; elementos dentro da área e sem sobreposição; duas colunas e nova página nas objetivas; quebra de página nas discursivas; objetiva sem alternativas cadastradas; conteúdo do QR code</w:t>
+            </w:r>
+          </w:p>
+        </w:tc>
+      </w:tr>
+      <w:tr>
+        <w:trPr>
+          <w:cantSplit/>
+        </w:trPr>
+        <w:tc>
+          <w:tcPr>
+            <w:tcW w:type="dxa" w:w="2721"/>
+            <w:tcBorders>
+              <w:top w:val="single" w:color="BFBFBF" w:sz="4"/>
+              <w:left w:val="single" w:color="BFBFBF" w:sz="4"/>
+              <w:bottom w:val="single" w:color="BFBFBF" w:sz="4"/>
+              <w:right w:val="single" w:color="BFBFBF" w:sz="4"/>
+            </w:tcBorders>
+            <w:tcMar>
+              <w:top w:type="dxa" w:w="60"/>
+              <w:left w:type="dxa" w:w="100"/>
+              <w:bottom w:type="dxa" w:w="60"/>
+              <w:right w:type="dxa" w:w="100"/>
+            </w:tcMar>
+          </w:tcPr>
+          <w:p>
+            <w:r>
+              <w:rPr>
+                <w:rFonts w:ascii="Consolas" w:cs="Consolas" w:eastAsia="Consolas" w:hAnsi="Consolas"/>
+                <w:sz w:val="20"/>
+                <w:szCs w:val="20"/>
+              </w:rPr>
               <w:t xml:space="preserve">tests/test_lista_questoes.py</w:t>
             </w:r>
           </w:p>
@@ -36674,6 +38651,291 @@
           </w:p>
         </w:tc>
       </w:tr>
+      <w:tr>
+        <w:trPr>
+          <w:cantSplit/>
+        </w:trPr>
+        <w:tc>
+          <w:tcPr>
+            <w:tcW w:type="dxa" w:w="3628"/>
+            <w:tcBorders>
+              <w:top w:val="single" w:color="BFBFBF" w:sz="4"/>
+              <w:left w:val="single" w:color="BFBFBF" w:sz="4"/>
+              <w:bottom w:val="single" w:color="BFBFBF" w:sz="4"/>
+              <w:right w:val="single" w:color="BFBFBF" w:sz="4"/>
+            </w:tcBorders>
+            <w:tcMar>
+              <w:top w:type="dxa" w:w="60"/>
+              <w:left w:type="dxa" w:w="100"/>
+              <w:bottom w:type="dxa" w:w="60"/>
+              <w:right w:type="dxa" w:w="100"/>
+            </w:tcMar>
+          </w:tcPr>
+          <w:p>
+            <w:r>
+              <w:rPr>
+                <w:sz w:val="20"/>
+                <w:szCs w:val="20"/>
+              </w:rPr>
+              <w:t xml:space="preserve">Código no lugar do nome do aluno</w:t>
+            </w:r>
+          </w:p>
+        </w:tc>
+        <w:tc>
+          <w:tcPr>
+            <w:tcW w:type="dxa" w:w="5443"/>
+            <w:tcBorders>
+              <w:top w:val="single" w:color="BFBFBF" w:sz="4"/>
+              <w:left w:val="single" w:color="BFBFBF" w:sz="4"/>
+              <w:bottom w:val="single" w:color="BFBFBF" w:sz="4"/>
+              <w:right w:val="single" w:color="BFBFBF" w:sz="4"/>
+            </w:tcBorders>
+            <w:tcMar>
+              <w:top w:type="dxa" w:w="60"/>
+              <w:left w:type="dxa" w:w="100"/>
+              <w:bottom w:type="dxa" w:w="60"/>
+              <w:right w:type="dxa" w:w="100"/>
+            </w:tcMar>
+          </w:tcPr>
+          <w:p>
+            <w:r>
+              <w:rPr>
+                <w:sz w:val="20"/>
+                <w:szCs w:val="20"/>
+              </w:rPr>
+              <w:t xml:space="preserve">O sistema não guarda nenhum dado pessoal do aluno; só quem tem o canhoto liga o código a uma pessoa. Isso reduz o tratamento de dados pessoais previsto na LGPD e evita que o nome influencie a correção</w:t>
+            </w:r>
+          </w:p>
+        </w:tc>
+      </w:tr>
+      <w:tr>
+        <w:trPr>
+          <w:cantSplit/>
+        </w:trPr>
+        <w:tc>
+          <w:tcPr>
+            <w:tcW w:type="dxa" w:w="3628"/>
+            <w:tcBorders>
+              <w:top w:val="single" w:color="BFBFBF" w:sz="4"/>
+              <w:left w:val="single" w:color="BFBFBF" w:sz="4"/>
+              <w:bottom w:val="single" w:color="BFBFBF" w:sz="4"/>
+              <w:right w:val="single" w:color="BFBFBF" w:sz="4"/>
+            </w:tcBorders>
+            <w:tcMar>
+              <w:top w:type="dxa" w:w="60"/>
+              <w:left w:type="dxa" w:w="100"/>
+              <w:bottom w:type="dxa" w:w="60"/>
+              <w:right w:type="dxa" w:w="100"/>
+            </w:tcMar>
+          </w:tcPr>
+          <w:p>
+            <w:r>
+              <w:rPr>
+                <w:sz w:val="20"/>
+                <w:szCs w:val="20"/>
+              </w:rPr>
+              <w:t xml:space="preserve">Caderno de questões separado da folha de respostas</w:t>
+            </w:r>
+          </w:p>
+        </w:tc>
+        <w:tc>
+          <w:tcPr>
+            <w:tcW w:type="dxa" w:w="5443"/>
+            <w:tcBorders>
+              <w:top w:val="single" w:color="BFBFBF" w:sz="4"/>
+              <w:left w:val="single" w:color="BFBFBF" w:sz="4"/>
+              <w:bottom w:val="single" w:color="BFBFBF" w:sz="4"/>
+              <w:right w:val="single" w:color="BFBFBF" w:sz="4"/>
+            </w:tcBorders>
+            <w:tcMar>
+              <w:top w:type="dxa" w:w="60"/>
+              <w:left w:type="dxa" w:w="100"/>
+              <w:bottom w:type="dxa" w:w="60"/>
+              <w:right w:type="dxa" w:w="100"/>
+            </w:tcMar>
+          </w:tcPr>
+          <w:p>
+            <w:r>
+              <w:rPr>
+                <w:sz w:val="20"/>
+                <w:szCs w:val="20"/>
+              </w:rPr>
+              <w:t xml:space="preserve">Só a folha de respostas é digitalizada e lida, o que diminui o número de páginas, e o caderno pode ser reaproveitado entre turmas</w:t>
+            </w:r>
+          </w:p>
+        </w:tc>
+      </w:tr>
+      <w:tr>
+        <w:trPr>
+          <w:cantSplit/>
+        </w:trPr>
+        <w:tc>
+          <w:tcPr>
+            <w:tcW w:type="dxa" w:w="3628"/>
+            <w:tcBorders>
+              <w:top w:val="single" w:color="BFBFBF" w:sz="4"/>
+              <w:left w:val="single" w:color="BFBFBF" w:sz="4"/>
+              <w:bottom w:val="single" w:color="BFBFBF" w:sz="4"/>
+              <w:right w:val="single" w:color="BFBFBF" w:sz="4"/>
+            </w:tcBorders>
+            <w:tcMar>
+              <w:top w:type="dxa" w:w="60"/>
+              <w:left w:type="dxa" w:w="100"/>
+              <w:bottom w:type="dxa" w:w="60"/>
+              <w:right w:type="dxa" w:w="100"/>
+            </w:tcMar>
+          </w:tcPr>
+          <w:p>
+            <w:r>
+              <w:rPr>
+                <w:sz w:val="20"/>
+                <w:szCs w:val="20"/>
+              </w:rPr>
+              <w:t xml:space="preserve">Layout calculado no servidor, em milímetros</w:t>
+            </w:r>
+          </w:p>
+        </w:tc>
+        <w:tc>
+          <w:tcPr>
+            <w:tcW w:type="dxa" w:w="5443"/>
+            <w:tcBorders>
+              <w:top w:val="single" w:color="BFBFBF" w:sz="4"/>
+              <w:left w:val="single" w:color="BFBFBF" w:sz="4"/>
+              <w:bottom w:val="single" w:color="BFBFBF" w:sz="4"/>
+              <w:right w:val="single" w:color="BFBFBF" w:sz="4"/>
+            </w:tcBorders>
+            <w:tcMar>
+              <w:top w:type="dxa" w:w="60"/>
+              <w:left w:type="dxa" w:w="100"/>
+              <w:bottom w:type="dxa" w:w="60"/>
+              <w:right w:type="dxa" w:w="100"/>
+            </w:tcMar>
+          </w:tcPr>
+          <w:p>
+            <w:r>
+              <w:rPr>
+                <w:sz w:val="20"/>
+                <w:szCs w:val="20"/>
+              </w:rPr>
+              <w:t xml:space="preserve">A mesma função posiciona os elementos na impressão e os localiza na leitura; um layout calculado pelo navegador poderia variar entre computadores</w:t>
+            </w:r>
+          </w:p>
+        </w:tc>
+      </w:tr>
+      <w:tr>
+        <w:trPr>
+          <w:cantSplit/>
+        </w:trPr>
+        <w:tc>
+          <w:tcPr>
+            <w:tcW w:type="dxa" w:w="3628"/>
+            <w:tcBorders>
+              <w:top w:val="single" w:color="BFBFBF" w:sz="4"/>
+              <w:left w:val="single" w:color="BFBFBF" w:sz="4"/>
+              <w:bottom w:val="single" w:color="BFBFBF" w:sz="4"/>
+              <w:right w:val="single" w:color="BFBFBF" w:sz="4"/>
+            </w:tcBorders>
+            <w:tcMar>
+              <w:top w:type="dxa" w:w="60"/>
+              <w:left w:type="dxa" w:w="100"/>
+              <w:bottom w:type="dxa" w:w="60"/>
+              <w:right w:type="dxa" w:w="100"/>
+            </w:tcMar>
+          </w:tcPr>
+          <w:p>
+            <w:r>
+              <w:rPr>
+                <w:sz w:val="20"/>
+                <w:szCs w:val="20"/>
+              </w:rPr>
+              <w:t xml:space="preserve">QR code e marcas de alinhamento, em vez de ler o código impresso</w:t>
+            </w:r>
+          </w:p>
+        </w:tc>
+        <w:tc>
+          <w:tcPr>
+            <w:tcW w:type="dxa" w:w="5443"/>
+            <w:tcBorders>
+              <w:top w:val="single" w:color="BFBFBF" w:sz="4"/>
+              <w:left w:val="single" w:color="BFBFBF" w:sz="4"/>
+              <w:bottom w:val="single" w:color="BFBFBF" w:sz="4"/>
+              <w:right w:val="single" w:color="BFBFBF" w:sz="4"/>
+            </w:tcBorders>
+            <w:tcMar>
+              <w:top w:type="dxa" w:w="60"/>
+              <w:left w:type="dxa" w:w="100"/>
+              <w:bottom w:type="dxa" w:w="60"/>
+              <w:right w:type="dxa" w:w="100"/>
+            </w:tcMar>
+          </w:tcPr>
+          <w:p>
+            <w:r>
+              <w:rPr>
+                <w:sz w:val="20"/>
+                <w:szCs w:val="20"/>
+              </w:rPr>
+              <w:t xml:space="preserve">O QR code tem correção de erros e é lido com segurança mesmo em digitalizações de baixa qualidade; as marcas permitem endireitar a imagem antes de procurar as respostas</w:t>
+            </w:r>
+          </w:p>
+        </w:tc>
+      </w:tr>
+      <w:tr>
+        <w:trPr>
+          <w:cantSplit/>
+        </w:trPr>
+        <w:tc>
+          <w:tcPr>
+            <w:tcW w:type="dxa" w:w="3628"/>
+            <w:tcBorders>
+              <w:top w:val="single" w:color="BFBFBF" w:sz="4"/>
+              <w:left w:val="single" w:color="BFBFBF" w:sz="4"/>
+              <w:bottom w:val="single" w:color="BFBFBF" w:sz="4"/>
+              <w:right w:val="single" w:color="BFBFBF" w:sz="4"/>
+            </w:tcBorders>
+            <w:tcMar>
+              <w:top w:type="dxa" w:w="60"/>
+              <w:left w:type="dxa" w:w="100"/>
+              <w:bottom w:type="dxa" w:w="60"/>
+              <w:right w:type="dxa" w:w="100"/>
+            </w:tcMar>
+          </w:tcPr>
+          <w:p>
+            <w:r>
+              <w:rPr>
+                <w:sz w:val="20"/>
+                <w:szCs w:val="20"/>
+              </w:rPr>
+              <w:t xml:space="preserve">Questões travadas enquanto houver folhas</w:t>
+            </w:r>
+          </w:p>
+        </w:tc>
+        <w:tc>
+          <w:tcPr>
+            <w:tcW w:type="dxa" w:w="5443"/>
+            <w:tcBorders>
+              <w:top w:val="single" w:color="BFBFBF" w:sz="4"/>
+              <w:left w:val="single" w:color="BFBFBF" w:sz="4"/>
+              <w:bottom w:val="single" w:color="BFBFBF" w:sz="4"/>
+              <w:right w:val="single" w:color="BFBFBF" w:sz="4"/>
+            </w:tcBorders>
+            <w:tcMar>
+              <w:top w:type="dxa" w:w="60"/>
+              <w:left w:type="dxa" w:w="100"/>
+              <w:bottom w:type="dxa" w:w="60"/>
+              <w:right w:type="dxa" w:w="100"/>
+            </w:tcMar>
+          </w:tcPr>
+          <w:p>
+            <w:r>
+              <w:rPr>
+                <w:sz w:val="20"/>
+                <w:szCs w:val="20"/>
+              </w:rPr>
+              <w:t xml:space="preserve">Mudar a ordem ou as questões depois da impressão faria a leitura procurar respostas no lugar errado</w:t>
+            </w:r>
+          </w:p>
+        </w:tc>
+      </w:tr>
     </w:tbl>
     <w:p>
       <w:pPr>
@@ -37048,6 +39310,57 @@
       </w:r>
       <w:r>
         <w:t xml:space="preserve"> uma chamada que falhou também foi cobrada pela OpenAI, por isso entra na contagem.</w:t>
+      </w:r>
+    </w:p>
+    <w:p>
+      <w:pPr>
+        <w:pStyle w:val="ListParagraph"/>
+        <w:numPr>
+          <w:ilvl w:val="0"/>
+          <w:numId w:val="5"/>
+        </w:numPr>
+        <w:spacing w:after="80" w:line="290"/>
+      </w:pPr>
+      <w:r>
+        <w:rPr>
+          <w:b/>
+          <w:bCs/>
+        </w:rPr>
+        <w:t xml:space="preserve">Layout ligado à versão do sistema:</w:t>
+      </w:r>
+      <w:r>
+        <w:t xml:space="preserve"> a posição dos elementos é recalculada a partir da atividade, e não gravada. Uma mudança futura em </w:t>
+      </w:r>
+      <w:r>
+        <w:rPr>
+          <w:rFonts w:ascii="Consolas" w:cs="Consolas" w:eastAsia="Consolas" w:hAnsi="Consolas"/>
+          <w:sz w:val="20"/>
+          <w:szCs w:val="20"/>
+        </w:rPr>
+        <w:t xml:space="preserve">layout.py</w:t>
+      </w:r>
+      <w:r>
+        <w:t xml:space="preserve"> alteraria a posição esperada em folhas já impressas; por isso, mudanças nesse arquivo só devem ser feitas quando não houver folhas em uso.</w:t>
+      </w:r>
+    </w:p>
+    <w:p>
+      <w:pPr>
+        <w:pStyle w:val="ListParagraph"/>
+        <w:numPr>
+          <w:ilvl w:val="0"/>
+          <w:numId w:val="5"/>
+        </w:numPr>
+        <w:spacing w:after="80" w:line="290"/>
+      </w:pPr>
+      <w:r>
+        <w:rPr>
+          <w:b/>
+          <w:bCs/>
+        </w:rPr>
+        <w:t xml:space="preserve">Impressão em escala diferente de 100%:</w:t>
+      </w:r>
+      <w:r>
+        <w:t xml:space="preserve"> algumas impressoras reduzem a página para caber nas margens. As marcas de alinhamento corrigem parte disso na leitura, mas a orientação é imprimir em tamanho real.</w:t>
       </w:r>
     </w:p>
     <w:p>
@@ -38657,6 +40970,234 @@
                 <w:szCs w:val="20"/>
               </w:rPr>
               <w:t xml:space="preserve">Texto de instrução enviado ao modelo de linguagem</w:t>
+            </w:r>
+          </w:p>
+        </w:tc>
+      </w:tr>
+      <w:tr>
+        <w:trPr>
+          <w:cantSplit/>
+        </w:trPr>
+        <w:tc>
+          <w:tcPr>
+            <w:tcW w:type="dxa" w:w="2721"/>
+            <w:tcBorders>
+              <w:top w:val="single" w:color="BFBFBF" w:sz="4"/>
+              <w:left w:val="single" w:color="BFBFBF" w:sz="4"/>
+              <w:bottom w:val="single" w:color="BFBFBF" w:sz="4"/>
+              <w:right w:val="single" w:color="BFBFBF" w:sz="4"/>
+            </w:tcBorders>
+            <w:tcMar>
+              <w:top w:type="dxa" w:w="60"/>
+              <w:left w:type="dxa" w:w="100"/>
+              <w:bottom w:type="dxa" w:w="60"/>
+              <w:right w:type="dxa" w:w="100"/>
+            </w:tcMar>
+          </w:tcPr>
+          <w:p>
+            <w:r>
+              <w:rPr>
+                <w:sz w:val="20"/>
+                <w:szCs w:val="20"/>
+              </w:rPr>
+              <w:t xml:space="preserve">QR code</w:t>
+            </w:r>
+          </w:p>
+        </w:tc>
+        <w:tc>
+          <w:tcPr>
+            <w:tcW w:type="dxa" w:w="6350"/>
+            <w:tcBorders>
+              <w:top w:val="single" w:color="BFBFBF" w:sz="4"/>
+              <w:left w:val="single" w:color="BFBFBF" w:sz="4"/>
+              <w:bottom w:val="single" w:color="BFBFBF" w:sz="4"/>
+              <w:right w:val="single" w:color="BFBFBF" w:sz="4"/>
+            </w:tcBorders>
+            <w:tcMar>
+              <w:top w:type="dxa" w:w="60"/>
+              <w:left w:type="dxa" w:w="100"/>
+              <w:bottom w:type="dxa" w:w="60"/>
+              <w:right w:type="dxa" w:w="100"/>
+            </w:tcMar>
+          </w:tcPr>
+          <w:p>
+            <w:r>
+              <w:rPr>
+                <w:sz w:val="20"/>
+                <w:szCs w:val="20"/>
+              </w:rPr>
+              <w:t xml:space="preserve">Código de barras em duas dimensões, lido por câmeras e por programas de imagem, que guarda um texto curto com correção de erros</w:t>
+            </w:r>
+          </w:p>
+        </w:tc>
+      </w:tr>
+      <w:tr>
+        <w:trPr>
+          <w:cantSplit/>
+        </w:trPr>
+        <w:tc>
+          <w:tcPr>
+            <w:tcW w:type="dxa" w:w="2721"/>
+            <w:tcBorders>
+              <w:top w:val="single" w:color="BFBFBF" w:sz="4"/>
+              <w:left w:val="single" w:color="BFBFBF" w:sz="4"/>
+              <w:bottom w:val="single" w:color="BFBFBF" w:sz="4"/>
+              <w:right w:val="single" w:color="BFBFBF" w:sz="4"/>
+            </w:tcBorders>
+            <w:tcMar>
+              <w:top w:type="dxa" w:w="60"/>
+              <w:left w:type="dxa" w:w="100"/>
+              <w:bottom w:type="dxa" w:w="60"/>
+              <w:right w:type="dxa" w:w="100"/>
+            </w:tcMar>
+          </w:tcPr>
+          <w:p>
+            <w:r>
+              <w:rPr>
+                <w:sz w:val="20"/>
+                <w:szCs w:val="20"/>
+              </w:rPr>
+              <w:t xml:space="preserve">LGPD</w:t>
+            </w:r>
+          </w:p>
+        </w:tc>
+        <w:tc>
+          <w:tcPr>
+            <w:tcW w:type="dxa" w:w="6350"/>
+            <w:tcBorders>
+              <w:top w:val="single" w:color="BFBFBF" w:sz="4"/>
+              <w:left w:val="single" w:color="BFBFBF" w:sz="4"/>
+              <w:bottom w:val="single" w:color="BFBFBF" w:sz="4"/>
+              <w:right w:val="single" w:color="BFBFBF" w:sz="4"/>
+            </w:tcBorders>
+            <w:tcMar>
+              <w:top w:type="dxa" w:w="60"/>
+              <w:left w:type="dxa" w:w="100"/>
+              <w:bottom w:type="dxa" w:w="60"/>
+              <w:right w:type="dxa" w:w="100"/>
+            </w:tcMar>
+          </w:tcPr>
+          <w:p>
+            <w:r>
+              <w:rPr>
+                <w:sz w:val="20"/>
+                <w:szCs w:val="20"/>
+              </w:rPr>
+              <w:t xml:space="preserve">Lei Geral de Proteção de Dados Pessoais (Lei nº 13.709/2018)</w:t>
+            </w:r>
+          </w:p>
+        </w:tc>
+      </w:tr>
+      <w:tr>
+        <w:trPr>
+          <w:cantSplit/>
+        </w:trPr>
+        <w:tc>
+          <w:tcPr>
+            <w:tcW w:type="dxa" w:w="2721"/>
+            <w:tcBorders>
+              <w:top w:val="single" w:color="BFBFBF" w:sz="4"/>
+              <w:left w:val="single" w:color="BFBFBF" w:sz="4"/>
+              <w:bottom w:val="single" w:color="BFBFBF" w:sz="4"/>
+              <w:right w:val="single" w:color="BFBFBF" w:sz="4"/>
+            </w:tcBorders>
+            <w:tcMar>
+              <w:top w:type="dxa" w:w="60"/>
+              <w:left w:type="dxa" w:w="100"/>
+              <w:bottom w:type="dxa" w:w="60"/>
+              <w:right w:type="dxa" w:w="100"/>
+            </w:tcMar>
+          </w:tcPr>
+          <w:p>
+            <w:r>
+              <w:rPr>
+                <w:sz w:val="20"/>
+                <w:szCs w:val="20"/>
+              </w:rPr>
+              <w:t xml:space="preserve">Marcas de alinhamento</w:t>
+            </w:r>
+          </w:p>
+        </w:tc>
+        <w:tc>
+          <w:tcPr>
+            <w:tcW w:type="dxa" w:w="6350"/>
+            <w:tcBorders>
+              <w:top w:val="single" w:color="BFBFBF" w:sz="4"/>
+              <w:left w:val="single" w:color="BFBFBF" w:sz="4"/>
+              <w:bottom w:val="single" w:color="BFBFBF" w:sz="4"/>
+              <w:right w:val="single" w:color="BFBFBF" w:sz="4"/>
+            </w:tcBorders>
+            <w:tcMar>
+              <w:top w:type="dxa" w:w="60"/>
+              <w:left w:type="dxa" w:w="100"/>
+              <w:bottom w:type="dxa" w:w="60"/>
+              <w:right w:type="dxa" w:w="100"/>
+            </w:tcMar>
+          </w:tcPr>
+          <w:p>
+            <w:r>
+              <w:rPr>
+                <w:sz w:val="20"/>
+                <w:szCs w:val="20"/>
+              </w:rPr>
+              <w:t xml:space="preserve">Quadrados pretos impressos em posições fixas da folha, usados para endireitar e ajustar a escala da imagem digitalizada</w:t>
+            </w:r>
+          </w:p>
+        </w:tc>
+      </w:tr>
+      <w:tr>
+        <w:trPr>
+          <w:cantSplit/>
+        </w:trPr>
+        <w:tc>
+          <w:tcPr>
+            <w:tcW w:type="dxa" w:w="2721"/>
+            <w:tcBorders>
+              <w:top w:val="single" w:color="BFBFBF" w:sz="4"/>
+              <w:left w:val="single" w:color="BFBFBF" w:sz="4"/>
+              <w:bottom w:val="single" w:color="BFBFBF" w:sz="4"/>
+              <w:right w:val="single" w:color="BFBFBF" w:sz="4"/>
+            </w:tcBorders>
+            <w:tcMar>
+              <w:top w:type="dxa" w:w="60"/>
+              <w:left w:type="dxa" w:w="100"/>
+              <w:bottom w:type="dxa" w:w="60"/>
+              <w:right w:type="dxa" w:w="100"/>
+            </w:tcMar>
+          </w:tcPr>
+          <w:p>
+            <w:r>
+              <w:rPr>
+                <w:sz w:val="20"/>
+                <w:szCs w:val="20"/>
+              </w:rPr>
+              <w:t xml:space="preserve">SVG</w:t>
+            </w:r>
+          </w:p>
+        </w:tc>
+        <w:tc>
+          <w:tcPr>
+            <w:tcW w:type="dxa" w:w="6350"/>
+            <w:tcBorders>
+              <w:top w:val="single" w:color="BFBFBF" w:sz="4"/>
+              <w:left w:val="single" w:color="BFBFBF" w:sz="4"/>
+              <w:bottom w:val="single" w:color="BFBFBF" w:sz="4"/>
+              <w:right w:val="single" w:color="BFBFBF" w:sz="4"/>
+            </w:tcBorders>
+            <w:tcMar>
+              <w:top w:type="dxa" w:w="60"/>
+              <w:left w:type="dxa" w:w="100"/>
+              <w:bottom w:type="dxa" w:w="60"/>
+              <w:right w:type="dxa" w:w="100"/>
+            </w:tcMar>
+          </w:tcPr>
+          <w:p>
+            <w:r>
+              <w:rPr>
+                <w:sz w:val="20"/>
+                <w:szCs w:val="20"/>
+              </w:rPr>
+              <w:t xml:space="preserve">Formato de imagem vetorial, descrita por formas geométricas, que não perde nitidez ao ser ampliada ou impressa</w:t>
             </w:r>
           </w:p>
         </w:tc>
@@ -39824,6 +42365,115 @@
                 <w:sz w:val="20"/>
                 <w:szCs w:val="20"/>
               </w:rPr>
+              <w:t xml:space="preserve">31/10/2026</w:t>
+            </w:r>
+          </w:p>
+        </w:tc>
+        <w:tc>
+          <w:tcPr>
+            <w:tcW w:type="dxa" w:w="1209"/>
+            <w:tcBorders>
+              <w:top w:val="single" w:color="BFBFBF" w:sz="4"/>
+              <w:left w:val="single" w:color="BFBFBF" w:sz="4"/>
+              <w:bottom w:val="single" w:color="BFBFBF" w:sz="4"/>
+              <w:right w:val="single" w:color="BFBFBF" w:sz="4"/>
+            </w:tcBorders>
+            <w:tcMar>
+              <w:top w:type="dxa" w:w="60"/>
+              <w:left w:type="dxa" w:w="100"/>
+              <w:bottom w:type="dxa" w:w="60"/>
+              <w:right w:type="dxa" w:w="100"/>
+            </w:tcMar>
+          </w:tcPr>
+          <w:p>
+            <w:r>
+              <w:rPr>
+                <w:sz w:val="20"/>
+                <w:szCs w:val="20"/>
+              </w:rPr>
+              <w:t xml:space="preserve">0.14</w:t>
+            </w:r>
+          </w:p>
+        </w:tc>
+        <w:tc>
+          <w:tcPr>
+            <w:tcW w:type="dxa" w:w="2267"/>
+            <w:tcBorders>
+              <w:top w:val="single" w:color="BFBFBF" w:sz="4"/>
+              <w:left w:val="single" w:color="BFBFBF" w:sz="4"/>
+              <w:bottom w:val="single" w:color="BFBFBF" w:sz="4"/>
+              <w:right w:val="single" w:color="BFBFBF" w:sz="4"/>
+            </w:tcBorders>
+            <w:tcMar>
+              <w:top w:type="dxa" w:w="60"/>
+              <w:left w:type="dxa" w:w="100"/>
+              <w:bottom w:type="dxa" w:w="60"/>
+              <w:right w:type="dxa" w:w="100"/>
+            </w:tcMar>
+          </w:tcPr>
+          <w:p>
+            <w:r>
+              <w:rPr>
+                <w:sz w:val="20"/>
+                <w:szCs w:val="20"/>
+              </w:rPr>
+              <w:t xml:space="preserve">pull request das folhas de resposta</w:t>
+            </w:r>
+          </w:p>
+        </w:tc>
+        <w:tc>
+          <w:tcPr>
+            <w:tcW w:type="dxa" w:w="4084"/>
+            <w:tcBorders>
+              <w:top w:val="single" w:color="BFBFBF" w:sz="4"/>
+              <w:left w:val="single" w:color="BFBFBF" w:sz="4"/>
+              <w:bottom w:val="single" w:color="BFBFBF" w:sz="4"/>
+              <w:right w:val="single" w:color="BFBFBF" w:sz="4"/>
+            </w:tcBorders>
+            <w:tcMar>
+              <w:top w:type="dxa" w:w="60"/>
+              <w:left w:type="dxa" w:w="100"/>
+              <w:bottom w:type="dxa" w:w="60"/>
+              <w:right w:type="dxa" w:w="100"/>
+            </w:tcMar>
+          </w:tcPr>
+          <w:p>
+            <w:r>
+              <w:rPr>
+                <w:sz w:val="20"/>
+                <w:szCs w:val="20"/>
+              </w:rPr>
+              <w:t xml:space="preserve">Folhas de resposta com código único no lugar do nome, QR code, marcas de alinhamento, bolinhas e caixas em posições fixas e canhoto para o aluno; caderno de questões sem identificação; questões travadas enquanto houver folhas</w:t>
+            </w:r>
+          </w:p>
+        </w:tc>
+      </w:tr>
+      <w:tr>
+        <w:trPr>
+          <w:cantSplit/>
+        </w:trPr>
+        <w:tc>
+          <w:tcPr>
+            <w:tcW w:type="dxa" w:w="1511"/>
+            <w:tcBorders>
+              <w:top w:val="single" w:color="BFBFBF" w:sz="4"/>
+              <w:left w:val="single" w:color="BFBFBF" w:sz="4"/>
+              <w:bottom w:val="single" w:color="BFBFBF" w:sz="4"/>
+              <w:right w:val="single" w:color="BFBFBF" w:sz="4"/>
+            </w:tcBorders>
+            <w:tcMar>
+              <w:top w:type="dxa" w:w="60"/>
+              <w:left w:type="dxa" w:w="100"/>
+              <w:bottom w:type="dxa" w:w="60"/>
+              <w:right w:type="dxa" w:w="100"/>
+            </w:tcMar>
+          </w:tcPr>
+          <w:p>
+            <w:r>
+              <w:rPr>
+                <w:sz w:val="20"/>
+                <w:szCs w:val="20"/>
+              </w:rPr>
               <w:t xml:space="preserve">26/10/2026</w:t>
             </w:r>
           </w:p>
@@ -41427,6 +44077,19 @@
       </w:pPr>
       <w:r>
         <w:t xml:space="preserve">BRAILLE INSTITUTE. Atkinson Hyperlegible Font. Disponível em: https://www.brailleinstitute.org/freefont/. Acesso em: 23 out. 2026.</w:t>
+      </w:r>
+    </w:p>
+    <w:p>
+      <w:pPr>
+        <w:pStyle w:val="ListParagraph"/>
+        <w:numPr>
+          <w:ilvl w:val="0"/>
+          <w:numId w:val="5"/>
+        </w:numPr>
+        <w:spacing w:after="80" w:line="290"/>
+      </w:pPr>
+      <w:r>
+        <w:t xml:space="preserve">BRASIL. Lei nº 13.709, de 14 de agosto de 2018. Lei Geral de Proteção de Dados Pessoais (LGPD). Disponível em: https://www.planalto.gov.br/ccivil_03/_ato2015-2018/2018/lei/l13709.htm. Acesso em: 31 out. 2026.</w:t>
       </w:r>
     </w:p>
     <w:sectPr>
@@ -41580,7 +44243,7 @@
         <w:sz w:val="18"/>
         <w:szCs w:val="18"/>
       </w:rPr>
-      <w:t xml:space="preserve">Documentação Técnica do Protótipo, versão 0.13</w:t>
+      <w:t xml:space="preserve">Documentação Técnica do Protótipo, versão 0.14</w:t>
     </w:r>
   </w:p>
 </w:hdr>

</xml_diff>

<commit_message>
Documentação 0.15: respostas, correção e resultados
Co-Authored-By: Claude Opus 5.5 <noreply@anthropic.com>
Claude-Session: https://claude.ai/code/session_01W2sxSqc4ZdmAUWH2L8vsV2
</commit_message>
<xml_diff>
--- a/docs/Documentacao_Tecnica.docx
+++ b/docs/Documentacao_Tecnica.docx
@@ -114,7 +114,7 @@
         <w:t xml:space="preserve">Versão: </w:t>
       </w:r>
       <w:r>
-        <w:t xml:space="preserve">0.14, de 31/10/2026</w:t>
+        <w:t xml:space="preserve">0.15, de 31/10/2026</w:t>
       </w:r>
     </w:p>
     <w:p>
@@ -1583,6 +1583,89 @@
                 <w:sz w:val="20"/>
                 <w:szCs w:val="20"/>
               </w:rPr>
+              <w:t xml:space="preserve">Apoio</w:t>
+            </w:r>
+          </w:p>
+        </w:tc>
+        <w:tc>
+          <w:tcPr>
+            <w:tcW w:type="dxa" w:w="4535"/>
+            <w:tcBorders>
+              <w:top w:val="single" w:color="BFBFBF" w:sz="4"/>
+              <w:left w:val="single" w:color="BFBFBF" w:sz="4"/>
+              <w:bottom w:val="single" w:color="BFBFBF" w:sz="4"/>
+              <w:right w:val="single" w:color="BFBFBF" w:sz="4"/>
+            </w:tcBorders>
+            <w:tcMar>
+              <w:top w:type="dxa" w:w="60"/>
+              <w:left w:type="dxa" w:w="100"/>
+              <w:bottom w:type="dxa" w:w="60"/>
+              <w:right w:type="dxa" w:w="100"/>
+            </w:tcMar>
+          </w:tcPr>
+          <w:p>
+            <w:r>
+              <w:rPr>
+                <w:sz w:val="20"/>
+                <w:szCs w:val="20"/>
+              </w:rPr>
+              <w:t xml:space="preserve">Respostas por folha, correção, painel de resultados e liberação</w:t>
+            </w:r>
+          </w:p>
+        </w:tc>
+        <w:tc>
+          <w:tcPr>
+            <w:tcW w:type="dxa" w:w="3629"/>
+            <w:tcBorders>
+              <w:top w:val="single" w:color="BFBFBF" w:sz="4"/>
+              <w:left w:val="single" w:color="BFBFBF" w:sz="4"/>
+              <w:bottom w:val="single" w:color="BFBFBF" w:sz="4"/>
+              <w:right w:val="single" w:color="BFBFBF" w:sz="4"/>
+            </w:tcBorders>
+            <w:tcMar>
+              <w:top w:type="dxa" w:w="60"/>
+              <w:left w:type="dxa" w:w="100"/>
+              <w:bottom w:type="dxa" w:w="60"/>
+              <w:right w:type="dxa" w:w="100"/>
+            </w:tcMar>
+          </w:tcPr>
+          <w:p>
+            <w:r>
+              <w:rPr>
+                <w:sz w:val="20"/>
+                <w:szCs w:val="20"/>
+              </w:rPr>
+              <w:t xml:space="preserve">Implementado em 31/10/2026; aguardando revisão</w:t>
+            </w:r>
+          </w:p>
+        </w:tc>
+      </w:tr>
+      <w:tr>
+        <w:trPr>
+          <w:cantSplit/>
+        </w:trPr>
+        <w:tc>
+          <w:tcPr>
+            <w:tcW w:type="dxa" w:w="907"/>
+            <w:tcBorders>
+              <w:top w:val="single" w:color="BFBFBF" w:sz="4"/>
+              <w:left w:val="single" w:color="BFBFBF" w:sz="4"/>
+              <w:bottom w:val="single" w:color="BFBFBF" w:sz="4"/>
+              <w:right w:val="single" w:color="BFBFBF" w:sz="4"/>
+            </w:tcBorders>
+            <w:tcMar>
+              <w:top w:type="dxa" w:w="60"/>
+              <w:left w:type="dxa" w:w="100"/>
+              <w:bottom w:type="dxa" w:w="60"/>
+              <w:right w:type="dxa" w:w="100"/>
+            </w:tcMar>
+          </w:tcPr>
+          <w:p>
+            <w:r>
+              <w:rPr>
+                <w:sz w:val="20"/>
+                <w:szCs w:val="20"/>
+              </w:rPr>
               <w:t xml:space="preserve">5</w:t>
             </w:r>
           </w:p>
@@ -3941,6 +4024,109 @@
                 <w:sz w:val="20"/>
                 <w:szCs w:val="20"/>
               </w:rPr>
+              <w:t xml:space="preserve">app/resultados/</w:t>
+            </w:r>
+          </w:p>
+        </w:tc>
+        <w:tc>
+          <w:tcPr>
+            <w:tcW w:type="dxa" w:w="6350"/>
+            <w:tcBorders>
+              <w:top w:val="single" w:color="BFBFBF" w:sz="4"/>
+              <w:left w:val="single" w:color="BFBFBF" w:sz="4"/>
+              <w:bottom w:val="single" w:color="BFBFBF" w:sz="4"/>
+              <w:right w:val="single" w:color="BFBFBF" w:sz="4"/>
+            </w:tcBorders>
+            <w:tcMar>
+              <w:top w:type="dxa" w:w="60"/>
+              <w:left w:type="dxa" w:w="100"/>
+              <w:bottom w:type="dxa" w:w="60"/>
+              <w:right w:type="dxa" w:w="100"/>
+            </w:tcMar>
+          </w:tcPr>
+          <w:p>
+            <w:r>
+              <w:rPr>
+                <w:sz w:val="20"/>
+                <w:szCs w:val="20"/>
+              </w:rPr>
+              <w:t xml:space="preserve">Respostas de cada folha, nota da folha e liberação (</w:t>
+            </w:r>
+            <w:r>
+              <w:rPr>
+                <w:rFonts w:ascii="Consolas" w:cs="Consolas" w:eastAsia="Consolas" w:hAnsi="Consolas"/>
+                <w:sz w:val="20"/>
+                <w:szCs w:val="20"/>
+              </w:rPr>
+              <w:t xml:space="preserve">servico.py</w:t>
+            </w:r>
+            <w:r>
+              <w:rPr>
+                <w:sz w:val="20"/>
+                <w:szCs w:val="20"/>
+              </w:rPr>
+              <w:t xml:space="preserve">), correção em lote das discursivas (</w:t>
+            </w:r>
+            <w:r>
+              <w:rPr>
+                <w:rFonts w:ascii="Consolas" w:cs="Consolas" w:eastAsia="Consolas" w:hAnsi="Consolas"/>
+                <w:sz w:val="20"/>
+                <w:szCs w:val="20"/>
+              </w:rPr>
+              <w:t xml:space="preserve">lote.py</w:t>
+            </w:r>
+            <w:r>
+              <w:rPr>
+                <w:sz w:val="20"/>
+                <w:szCs w:val="20"/>
+              </w:rPr>
+              <w:t xml:space="preserve">) e páginas do painel e da folha (</w:t>
+            </w:r>
+            <w:r>
+              <w:rPr>
+                <w:rFonts w:ascii="Consolas" w:cs="Consolas" w:eastAsia="Consolas" w:hAnsi="Consolas"/>
+                <w:sz w:val="20"/>
+                <w:szCs w:val="20"/>
+              </w:rPr>
+              <w:t xml:space="preserve">router.py</w:t>
+            </w:r>
+            <w:r>
+              <w:rPr>
+                <w:sz w:val="20"/>
+                <w:szCs w:val="20"/>
+              </w:rPr>
+              <w:t xml:space="preserve">)</w:t>
+            </w:r>
+          </w:p>
+        </w:tc>
+      </w:tr>
+      <w:tr>
+        <w:trPr>
+          <w:cantSplit/>
+        </w:trPr>
+        <w:tc>
+          <w:tcPr>
+            <w:tcW w:type="dxa" w:w="2721"/>
+            <w:tcBorders>
+              <w:top w:val="single" w:color="BFBFBF" w:sz="4"/>
+              <w:left w:val="single" w:color="BFBFBF" w:sz="4"/>
+              <w:bottom w:val="single" w:color="BFBFBF" w:sz="4"/>
+              <w:right w:val="single" w:color="BFBFBF" w:sz="4"/>
+            </w:tcBorders>
+            <w:tcMar>
+              <w:top w:type="dxa" w:w="60"/>
+              <w:left w:type="dxa" w:w="100"/>
+              <w:bottom w:type="dxa" w:w="60"/>
+              <w:right w:type="dxa" w:w="100"/>
+            </w:tcMar>
+          </w:tcPr>
+          <w:p>
+            <w:r>
+              <w:rPr>
+                <w:rFonts w:ascii="Consolas" w:cs="Consolas" w:eastAsia="Consolas" w:hAnsi="Consolas"/>
+                <w:sz w:val="20"/>
+                <w:szCs w:val="20"/>
+              </w:rPr>
               <w:t xml:space="preserve">app/folhas/</w:t>
             </w:r>
           </w:p>
@@ -8760,7 +8946,22 @@
                 <w:sz w:val="20"/>
                 <w:szCs w:val="20"/>
               </w:rPr>
-              <w:t xml:space="preserve">Letra escolhida, nas objetivas</w:t>
+              <w:t xml:space="preserve">Letra escolhida, nas objetivas. Vazio é em branco; </w:t>
+            </w:r>
+            <w:r>
+              <w:rPr>
+                <w:rFonts w:ascii="Consolas" w:cs="Consolas" w:eastAsia="Consolas" w:hAnsi="Consolas"/>
+                <w:sz w:val="20"/>
+                <w:szCs w:val="20"/>
+              </w:rPr>
+              <w:t xml:space="preserve">*</w:t>
+            </w:r>
+            <w:r>
+              <w:rPr>
+                <w:sz w:val="20"/>
+                <w:szCs w:val="20"/>
+              </w:rPr>
+              <w:t xml:space="preserve"> indica mais de uma alternativa marcada na folha</w:t>
             </w:r>
           </w:p>
         </w:tc>
@@ -8792,6 +8993,90 @@
                 <w:sz w:val="20"/>
                 <w:szCs w:val="20"/>
               </w:rPr>
+              <w:t xml:space="preserve">folha_id</w:t>
+            </w:r>
+          </w:p>
+        </w:tc>
+        <w:tc>
+          <w:tcPr>
+            <w:tcW w:type="dxa" w:w="1649"/>
+            <w:tcBorders>
+              <w:top w:val="single" w:color="BFBFBF" w:sz="4"/>
+              <w:left w:val="single" w:color="BFBFBF" w:sz="4"/>
+              <w:bottom w:val="single" w:color="BFBFBF" w:sz="4"/>
+              <w:right w:val="single" w:color="BFBFBF" w:sz="4"/>
+            </w:tcBorders>
+            <w:tcMar>
+              <w:top w:type="dxa" w:w="60"/>
+              <w:left w:type="dxa" w:w="100"/>
+              <w:bottom w:type="dxa" w:w="60"/>
+              <w:right w:type="dxa" w:w="100"/>
+            </w:tcMar>
+          </w:tcPr>
+          <w:p>
+            <w:r>
+              <w:rPr>
+                <w:sz w:val="20"/>
+                <w:szCs w:val="20"/>
+              </w:rPr>
+              <w:t xml:space="preserve">inteiro</w:t>
+            </w:r>
+          </w:p>
+        </w:tc>
+        <w:tc>
+          <w:tcPr>
+            <w:tcW w:type="dxa" w:w="4949"/>
+            <w:tcBorders>
+              <w:top w:val="single" w:color="BFBFBF" w:sz="4"/>
+              <w:left w:val="single" w:color="BFBFBF" w:sz="4"/>
+              <w:bottom w:val="single" w:color="BFBFBF" w:sz="4"/>
+              <w:right w:val="single" w:color="BFBFBF" w:sz="4"/>
+            </w:tcBorders>
+            <w:tcMar>
+              <w:top w:type="dxa" w:w="60"/>
+              <w:left w:type="dxa" w:w="100"/>
+              <w:bottom w:type="dxa" w:w="60"/>
+              <w:right w:type="dxa" w:w="100"/>
+            </w:tcMar>
+          </w:tcPr>
+          <w:p>
+            <w:r>
+              <w:rPr>
+                <w:sz w:val="20"/>
+                <w:szCs w:val="20"/>
+              </w:rPr>
+              <w:t xml:space="preserve">Folha de respostas de onde veio a resposta; vazio nas respostas do corpus. Cada questão tem no máximo uma resposta por folha</w:t>
+            </w:r>
+          </w:p>
+        </w:tc>
+      </w:tr>
+      <w:tr>
+        <w:trPr>
+          <w:cantSplit/>
+        </w:trPr>
+        <w:tc>
+          <w:tcPr>
+            <w:tcW w:type="dxa" w:w="2473"/>
+            <w:tcBorders>
+              <w:top w:val="single" w:color="BFBFBF" w:sz="4"/>
+              <w:left w:val="single" w:color="BFBFBF" w:sz="4"/>
+              <w:bottom w:val="single" w:color="BFBFBF" w:sz="4"/>
+              <w:right w:val="single" w:color="BFBFBF" w:sz="4"/>
+            </w:tcBorders>
+            <w:tcMar>
+              <w:top w:type="dxa" w:w="60"/>
+              <w:left w:type="dxa" w:w="100"/>
+              <w:bottom w:type="dxa" w:w="60"/>
+              <w:right w:type="dxa" w:w="100"/>
+            </w:tcMar>
+          </w:tcPr>
+          <w:p>
+            <w:r>
+              <w:rPr>
+                <w:rFonts w:ascii="Consolas" w:cs="Consolas" w:eastAsia="Consolas" w:hAnsi="Consolas"/>
+                <w:sz w:val="20"/>
+                <w:szCs w:val="20"/>
+              </w:rPr>
               <w:t xml:space="preserve">codigo_corpus</w:t>
             </w:r>
           </w:p>
@@ -8974,7 +9259,22 @@
                 <w:sz w:val="20"/>
                 <w:szCs w:val="20"/>
               </w:rPr>
-              <w:t xml:space="preserve">; usada como variável de análise</w:t>
+              <w:t xml:space="preserve"> no corpus, usada como variável de análise; </w:t>
+            </w:r>
+            <w:r>
+              <w:rPr>
+                <w:rFonts w:ascii="Consolas" w:cs="Consolas" w:eastAsia="Consolas" w:hAnsi="Consolas"/>
+                <w:sz w:val="20"/>
+                <w:szCs w:val="20"/>
+              </w:rPr>
+              <w:t xml:space="preserve">folha</w:t>
+            </w:r>
+            <w:r>
+              <w:rPr>
+                <w:sz w:val="20"/>
+                <w:szCs w:val="20"/>
+              </w:rPr>
+              <w:t xml:space="preserve"> nas respostas das folhas de resposta</w:t>
             </w:r>
           </w:p>
         </w:tc>
@@ -10145,6 +10445,174 @@
                 <w:szCs w:val="20"/>
               </w:rPr>
               <w:t xml:space="preserve">Linhas de cada caixa de resposta discursiva nas folhas de resposta; fixado na primeira geração de folhas (padrão 8)</w:t>
+            </w:r>
+          </w:p>
+        </w:tc>
+      </w:tr>
+      <w:tr>
+        <w:trPr>
+          <w:cantSplit/>
+        </w:trPr>
+        <w:tc>
+          <w:tcPr>
+            <w:tcW w:type="dxa" w:w="2473"/>
+            <w:tcBorders>
+              <w:top w:val="single" w:color="BFBFBF" w:sz="4"/>
+              <w:left w:val="single" w:color="BFBFBF" w:sz="4"/>
+              <w:bottom w:val="single" w:color="BFBFBF" w:sz="4"/>
+              <w:right w:val="single" w:color="BFBFBF" w:sz="4"/>
+            </w:tcBorders>
+            <w:tcMar>
+              <w:top w:type="dxa" w:w="60"/>
+              <w:left w:type="dxa" w:w="100"/>
+              <w:bottom w:type="dxa" w:w="60"/>
+              <w:right w:type="dxa" w:w="100"/>
+            </w:tcMar>
+          </w:tcPr>
+          <w:p>
+            <w:r>
+              <w:rPr>
+                <w:rFonts w:ascii="Consolas" w:cs="Consolas" w:eastAsia="Consolas" w:hAnsi="Consolas"/>
+                <w:sz w:val="20"/>
+                <w:szCs w:val="20"/>
+              </w:rPr>
+              <w:t xml:space="preserve">valor_objetiva</w:t>
+            </w:r>
+          </w:p>
+        </w:tc>
+        <w:tc>
+          <w:tcPr>
+            <w:tcW w:type="dxa" w:w="1649"/>
+            <w:tcBorders>
+              <w:top w:val="single" w:color="BFBFBF" w:sz="4"/>
+              <w:left w:val="single" w:color="BFBFBF" w:sz="4"/>
+              <w:bottom w:val="single" w:color="BFBFBF" w:sz="4"/>
+              <w:right w:val="single" w:color="BFBFBF" w:sz="4"/>
+            </w:tcBorders>
+            <w:tcMar>
+              <w:top w:type="dxa" w:w="60"/>
+              <w:left w:type="dxa" w:w="100"/>
+              <w:bottom w:type="dxa" w:w="60"/>
+              <w:right w:type="dxa" w:w="100"/>
+            </w:tcMar>
+          </w:tcPr>
+          <w:p>
+            <w:r>
+              <w:rPr>
+                <w:sz w:val="20"/>
+                <w:szCs w:val="20"/>
+              </w:rPr>
+              <w:t xml:space="preserve">decimal</w:t>
+            </w:r>
+          </w:p>
+        </w:tc>
+        <w:tc>
+          <w:tcPr>
+            <w:tcW w:type="dxa" w:w="4949"/>
+            <w:tcBorders>
+              <w:top w:val="single" w:color="BFBFBF" w:sz="4"/>
+              <w:left w:val="single" w:color="BFBFBF" w:sz="4"/>
+              <w:bottom w:val="single" w:color="BFBFBF" w:sz="4"/>
+              <w:right w:val="single" w:color="BFBFBF" w:sz="4"/>
+            </w:tcBorders>
+            <w:tcMar>
+              <w:top w:type="dxa" w:w="60"/>
+              <w:left w:type="dxa" w:w="100"/>
+              <w:bottom w:type="dxa" w:w="60"/>
+              <w:right w:type="dxa" w:w="100"/>
+            </w:tcMar>
+          </w:tcPr>
+          <w:p>
+            <w:r>
+              <w:rPr>
+                <w:sz w:val="20"/>
+                <w:szCs w:val="20"/>
+              </w:rPr>
+              <w:t xml:space="preserve">Pontos de cada objetiva certa (padrão 1). As discursivas valem a nota máxima da questão</w:t>
+            </w:r>
+          </w:p>
+        </w:tc>
+      </w:tr>
+      <w:tr>
+        <w:trPr>
+          <w:cantSplit/>
+        </w:trPr>
+        <w:tc>
+          <w:tcPr>
+            <w:tcW w:type="dxa" w:w="2473"/>
+            <w:tcBorders>
+              <w:top w:val="single" w:color="BFBFBF" w:sz="4"/>
+              <w:left w:val="single" w:color="BFBFBF" w:sz="4"/>
+              <w:bottom w:val="single" w:color="BFBFBF" w:sz="4"/>
+              <w:right w:val="single" w:color="BFBFBF" w:sz="4"/>
+            </w:tcBorders>
+            <w:tcMar>
+              <w:top w:type="dxa" w:w="60"/>
+              <w:left w:type="dxa" w:w="100"/>
+              <w:bottom w:type="dxa" w:w="60"/>
+              <w:right w:type="dxa" w:w="100"/>
+            </w:tcMar>
+          </w:tcPr>
+          <w:p>
+            <w:r>
+              <w:rPr>
+                <w:rFonts w:ascii="Consolas" w:cs="Consolas" w:eastAsia="Consolas" w:hAnsi="Consolas"/>
+                <w:sz w:val="20"/>
+                <w:szCs w:val="20"/>
+              </w:rPr>
+              <w:t xml:space="preserve">resultados_liberados_em</w:t>
+            </w:r>
+          </w:p>
+        </w:tc>
+        <w:tc>
+          <w:tcPr>
+            <w:tcW w:type="dxa" w:w="1649"/>
+            <w:tcBorders>
+              <w:top w:val="single" w:color="BFBFBF" w:sz="4"/>
+              <w:left w:val="single" w:color="BFBFBF" w:sz="4"/>
+              <w:bottom w:val="single" w:color="BFBFBF" w:sz="4"/>
+              <w:right w:val="single" w:color="BFBFBF" w:sz="4"/>
+            </w:tcBorders>
+            <w:tcMar>
+              <w:top w:type="dxa" w:w="60"/>
+              <w:left w:type="dxa" w:w="100"/>
+              <w:bottom w:type="dxa" w:w="60"/>
+              <w:right w:type="dxa" w:w="100"/>
+            </w:tcMar>
+          </w:tcPr>
+          <w:p>
+            <w:r>
+              <w:rPr>
+                <w:sz w:val="20"/>
+                <w:szCs w:val="20"/>
+              </w:rPr>
+              <w:t xml:space="preserve">data e hora</w:t>
+            </w:r>
+          </w:p>
+        </w:tc>
+        <w:tc>
+          <w:tcPr>
+            <w:tcW w:type="dxa" w:w="4949"/>
+            <w:tcBorders>
+              <w:top w:val="single" w:color="BFBFBF" w:sz="4"/>
+              <w:left w:val="single" w:color="BFBFBF" w:sz="4"/>
+              <w:bottom w:val="single" w:color="BFBFBF" w:sz="4"/>
+              <w:right w:val="single" w:color="BFBFBF" w:sz="4"/>
+            </w:tcBorders>
+            <w:tcMar>
+              <w:top w:type="dxa" w:w="60"/>
+              <w:left w:type="dxa" w:w="100"/>
+              <w:bottom w:type="dxa" w:w="60"/>
+              <w:right w:type="dxa" w:w="100"/>
+            </w:tcMar>
+          </w:tcPr>
+          <w:p>
+            <w:r>
+              <w:rPr>
+                <w:sz w:val="20"/>
+                <w:szCs w:val="20"/>
+              </w:rPr>
+              <w:t xml:space="preserve">Quando o professor liberou os resultados para os alunos; vazio enquanto não liberou</w:t>
             </w:r>
           </w:p>
         </w:tc>
@@ -32108,7 +32576,954 @@
         <w:spacing w:after="120" w:line="300"/>
       </w:pPr>
       <w:r>
+        <w:t xml:space="preserve">Depois que há respostas registradas em alguma folha, as folhas não podem mais ser descartadas, porque as respostas e as correções dependem delas.</w:t>
+      </w:r>
+    </w:p>
+    <w:p>
+      <w:pPr>
+        <w:spacing w:after="120" w:line="300"/>
+      </w:pPr>
+      <w:r>
         <w:t xml:space="preserve">Para imprimir, a página orienta a usar papel A4, escala 100% ("Tamanho real") e margens "Nenhuma". Com outra escala, as posições na folha deixam de corresponder às calculadas.</w:t>
+      </w:r>
+    </w:p>
+    <w:p>
+      <w:pPr>
+        <w:pStyle w:val="Heading2"/>
+      </w:pPr>
+      <w:r>
+        <w:t xml:space="preserve">4.24 Respostas, correção e resultados: app/resultados/</w:t>
+      </w:r>
+    </w:p>
+    <w:p>
+      <w:pPr>
+        <w:spacing w:after="120" w:line="300"/>
+      </w:pPr>
+      <w:r>
+        <w:t xml:space="preserve">Segunda parte do fluxo: o professor registra o que cada aluno respondeu na folha, o sistema corrige, o professor confirma as notas e libera os resultados. Nesta versão, as respostas são digitadas pelo professor; a leitura automática das folhas digitalizadas entra numa versão posterior e vai preencher os mesmos campos.</w:t>
+      </w:r>
+    </w:p>
+    <w:tbl>
+      <w:tblPr>
+        <w:tblW w:type="dxa" w:w="9071"/>
+        <w:tblBorders>
+          <w:top w:val="single" w:color="auto" w:sz="4"/>
+          <w:left w:val="single" w:color="auto" w:sz="4"/>
+          <w:bottom w:val="single" w:color="auto" w:sz="4"/>
+          <w:right w:val="single" w:color="auto" w:sz="4"/>
+          <w:insideH w:val="single" w:color="auto" w:sz="4"/>
+          <w:insideV w:val="single" w:color="auto" w:sz="4"/>
+        </w:tblBorders>
+      </w:tblPr>
+      <w:tblGrid>
+        <w:gridCol w:w="3628"/>
+        <w:gridCol w:w="5443"/>
+      </w:tblGrid>
+      <w:tr>
+        <w:trPr>
+          <w:tblHeader/>
+        </w:trPr>
+        <w:tc>
+          <w:tcPr>
+            <w:tcW w:type="dxa" w:w="3628"/>
+            <w:tcBorders>
+              <w:top w:val="single" w:color="BFBFBF" w:sz="4"/>
+              <w:left w:val="single" w:color="BFBFBF" w:sz="4"/>
+              <w:bottom w:val="single" w:color="BFBFBF" w:sz="4"/>
+              <w:right w:val="single" w:color="BFBFBF" w:sz="4"/>
+            </w:tcBorders>
+            <w:shd w:fill="D9E2F3" w:color="auto" w:val="clear"/>
+            <w:tcMar>
+              <w:top w:type="dxa" w:w="60"/>
+              <w:left w:type="dxa" w:w="100"/>
+              <w:bottom w:type="dxa" w:w="60"/>
+              <w:right w:type="dxa" w:w="100"/>
+            </w:tcMar>
+          </w:tcPr>
+          <w:p>
+            <w:r>
+              <w:rPr>
+                <w:b/>
+                <w:bCs/>
+                <w:sz w:val="20"/>
+                <w:szCs w:val="20"/>
+              </w:rPr>
+              <w:t xml:space="preserve">Rota</w:t>
+            </w:r>
+          </w:p>
+        </w:tc>
+        <w:tc>
+          <w:tcPr>
+            <w:tcW w:type="dxa" w:w="5443"/>
+            <w:tcBorders>
+              <w:top w:val="single" w:color="BFBFBF" w:sz="4"/>
+              <w:left w:val="single" w:color="BFBFBF" w:sz="4"/>
+              <w:bottom w:val="single" w:color="BFBFBF" w:sz="4"/>
+              <w:right w:val="single" w:color="BFBFBF" w:sz="4"/>
+            </w:tcBorders>
+            <w:shd w:fill="D9E2F3" w:color="auto" w:val="clear"/>
+            <w:tcMar>
+              <w:top w:type="dxa" w:w="60"/>
+              <w:left w:type="dxa" w:w="100"/>
+              <w:bottom w:type="dxa" w:w="60"/>
+              <w:right w:type="dxa" w:w="100"/>
+            </w:tcMar>
+          </w:tcPr>
+          <w:p>
+            <w:r>
+              <w:rPr>
+                <w:b/>
+                <w:bCs/>
+                <w:sz w:val="20"/>
+                <w:szCs w:val="20"/>
+              </w:rPr>
+              <w:t xml:space="preserve">O que faz</w:t>
+            </w:r>
+          </w:p>
+        </w:tc>
+      </w:tr>
+      <w:tr>
+        <w:trPr>
+          <w:cantSplit/>
+        </w:trPr>
+        <w:tc>
+          <w:tcPr>
+            <w:tcW w:type="dxa" w:w="3628"/>
+            <w:tcBorders>
+              <w:top w:val="single" w:color="BFBFBF" w:sz="4"/>
+              <w:left w:val="single" w:color="BFBFBF" w:sz="4"/>
+              <w:bottom w:val="single" w:color="BFBFBF" w:sz="4"/>
+              <w:right w:val="single" w:color="BFBFBF" w:sz="4"/>
+            </w:tcBorders>
+            <w:tcMar>
+              <w:top w:type="dxa" w:w="60"/>
+              <w:left w:type="dxa" w:w="100"/>
+              <w:bottom w:type="dxa" w:w="60"/>
+              <w:right w:type="dxa" w:w="100"/>
+            </w:tcMar>
+          </w:tcPr>
+          <w:p>
+            <w:r>
+              <w:rPr>
+                <w:rFonts w:ascii="Consolas" w:cs="Consolas" w:eastAsia="Consolas" w:hAnsi="Consolas"/>
+                <w:sz w:val="20"/>
+                <w:szCs w:val="20"/>
+              </w:rPr>
+              <w:t xml:space="preserve">GET /atividades/{id}/resultados</w:t>
+            </w:r>
+          </w:p>
+        </w:tc>
+        <w:tc>
+          <w:tcPr>
+            <w:tcW w:type="dxa" w:w="5443"/>
+            <w:tcBorders>
+              <w:top w:val="single" w:color="BFBFBF" w:sz="4"/>
+              <w:left w:val="single" w:color="BFBFBF" w:sz="4"/>
+              <w:bottom w:val="single" w:color="BFBFBF" w:sz="4"/>
+              <w:right w:val="single" w:color="BFBFBF" w:sz="4"/>
+            </w:tcBorders>
+            <w:tcMar>
+              <w:top w:type="dxa" w:w="60"/>
+              <w:left w:type="dxa" w:w="100"/>
+              <w:bottom w:type="dxa" w:w="60"/>
+              <w:right w:type="dxa" w:w="100"/>
+            </w:tcMar>
+          </w:tcPr>
+          <w:p>
+            <w:r>
+              <w:rPr>
+                <w:sz w:val="20"/>
+                <w:szCs w:val="20"/>
+              </w:rPr>
+              <w:t xml:space="preserve">Painel: folhas com respostas, concluídas, discursivas a corrigir e esperando revisão, média das concluídas, valor das objetivas, liberação e a lista das folhas com situação e pontos. Com </w:t>
+            </w:r>
+            <w:r>
+              <w:rPr>
+                <w:rFonts w:ascii="Consolas" w:cs="Consolas" w:eastAsia="Consolas" w:hAnsi="Consolas"/>
+                <w:sz w:val="20"/>
+                <w:szCs w:val="20"/>
+              </w:rPr>
+              <w:t xml:space="preserve">codigo</w:t>
+            </w:r>
+            <w:r>
+              <w:rPr>
+                <w:sz w:val="20"/>
+                <w:szCs w:val="20"/>
+              </w:rPr>
+              <w:t xml:space="preserve">, abre a folha daquele código (aceita minúsculas e sem hífen)</w:t>
+            </w:r>
+          </w:p>
+        </w:tc>
+      </w:tr>
+      <w:tr>
+        <w:trPr>
+          <w:cantSplit/>
+        </w:trPr>
+        <w:tc>
+          <w:tcPr>
+            <w:tcW w:type="dxa" w:w="3628"/>
+            <w:tcBorders>
+              <w:top w:val="single" w:color="BFBFBF" w:sz="4"/>
+              <w:left w:val="single" w:color="BFBFBF" w:sz="4"/>
+              <w:bottom w:val="single" w:color="BFBFBF" w:sz="4"/>
+              <w:right w:val="single" w:color="BFBFBF" w:sz="4"/>
+            </w:tcBorders>
+            <w:tcMar>
+              <w:top w:type="dxa" w:w="60"/>
+              <w:left w:type="dxa" w:w="100"/>
+              <w:bottom w:type="dxa" w:w="60"/>
+              <w:right w:type="dxa" w:w="100"/>
+            </w:tcMar>
+          </w:tcPr>
+          <w:p>
+            <w:r>
+              <w:rPr>
+                <w:rFonts w:ascii="Consolas" w:cs="Consolas" w:eastAsia="Consolas" w:hAnsi="Consolas"/>
+                <w:sz w:val="20"/>
+                <w:szCs w:val="20"/>
+              </w:rPr>
+              <w:t xml:space="preserve">GET /atividades/{id}/folhas/{folha}</w:t>
+            </w:r>
+          </w:p>
+        </w:tc>
+        <w:tc>
+          <w:tcPr>
+            <w:tcW w:type="dxa" w:w="5443"/>
+            <w:tcBorders>
+              <w:top w:val="single" w:color="BFBFBF" w:sz="4"/>
+              <w:left w:val="single" w:color="BFBFBF" w:sz="4"/>
+              <w:bottom w:val="single" w:color="BFBFBF" w:sz="4"/>
+              <w:right w:val="single" w:color="BFBFBF" w:sz="4"/>
+            </w:tcBorders>
+            <w:tcMar>
+              <w:top w:type="dxa" w:w="60"/>
+              <w:left w:type="dxa" w:w="100"/>
+              <w:bottom w:type="dxa" w:w="60"/>
+              <w:right w:type="dxa" w:w="100"/>
+            </w:tcMar>
+          </w:tcPr>
+          <w:p>
+            <w:r>
+              <w:rPr>
+                <w:sz w:val="20"/>
+                <w:szCs w:val="20"/>
+              </w:rPr>
+              <w:t xml:space="preserve">Página da folha: uma linha por objetiva com as letras, "em branco" e "mais de uma"; uma caixa de texto por discursiva ou por item; resultado de cada questão; botões para ir à folha anterior ou seguinte</w:t>
+            </w:r>
+          </w:p>
+        </w:tc>
+      </w:tr>
+      <w:tr>
+        <w:trPr>
+          <w:cantSplit/>
+        </w:trPr>
+        <w:tc>
+          <w:tcPr>
+            <w:tcW w:type="dxa" w:w="3628"/>
+            <w:tcBorders>
+              <w:top w:val="single" w:color="BFBFBF" w:sz="4"/>
+              <w:left w:val="single" w:color="BFBFBF" w:sz="4"/>
+              <w:bottom w:val="single" w:color="BFBFBF" w:sz="4"/>
+              <w:right w:val="single" w:color="BFBFBF" w:sz="4"/>
+            </w:tcBorders>
+            <w:tcMar>
+              <w:top w:type="dxa" w:w="60"/>
+              <w:left w:type="dxa" w:w="100"/>
+              <w:bottom w:type="dxa" w:w="60"/>
+              <w:right w:type="dxa" w:w="100"/>
+            </w:tcMar>
+          </w:tcPr>
+          <w:p>
+            <w:r>
+              <w:rPr>
+                <w:rFonts w:ascii="Consolas" w:cs="Consolas" w:eastAsia="Consolas" w:hAnsi="Consolas"/>
+                <w:sz w:val="20"/>
+                <w:szCs w:val="20"/>
+              </w:rPr>
+              <w:t xml:space="preserve">POST .../folhas/{folha}/respostas</w:t>
+            </w:r>
+          </w:p>
+        </w:tc>
+        <w:tc>
+          <w:tcPr>
+            <w:tcW w:type="dxa" w:w="5443"/>
+            <w:tcBorders>
+              <w:top w:val="single" w:color="BFBFBF" w:sz="4"/>
+              <w:left w:val="single" w:color="BFBFBF" w:sz="4"/>
+              <w:bottom w:val="single" w:color="BFBFBF" w:sz="4"/>
+              <w:right w:val="single" w:color="BFBFBF" w:sz="4"/>
+            </w:tcBorders>
+            <w:tcMar>
+              <w:top w:type="dxa" w:w="60"/>
+              <w:left w:type="dxa" w:w="100"/>
+              <w:bottom w:type="dxa" w:w="60"/>
+              <w:right w:type="dxa" w:w="100"/>
+            </w:tcMar>
+          </w:tcPr>
+          <w:p>
+            <w:r>
+              <w:rPr>
+                <w:sz w:val="20"/>
+                <w:szCs w:val="20"/>
+              </w:rPr>
+              <w:t xml:space="preserve">Grava as respostas. "Salvar e ir para a próxima" leva à folha seguinte, para digitar a turma em sequência</w:t>
+            </w:r>
+          </w:p>
+        </w:tc>
+      </w:tr>
+      <w:tr>
+        <w:trPr>
+          <w:cantSplit/>
+        </w:trPr>
+        <w:tc>
+          <w:tcPr>
+            <w:tcW w:type="dxa" w:w="3628"/>
+            <w:tcBorders>
+              <w:top w:val="single" w:color="BFBFBF" w:sz="4"/>
+              <w:left w:val="single" w:color="BFBFBF" w:sz="4"/>
+              <w:bottom w:val="single" w:color="BFBFBF" w:sz="4"/>
+              <w:right w:val="single" w:color="BFBFBF" w:sz="4"/>
+            </w:tcBorders>
+            <w:tcMar>
+              <w:top w:type="dxa" w:w="60"/>
+              <w:left w:type="dxa" w:w="100"/>
+              <w:bottom w:type="dxa" w:w="60"/>
+              <w:right w:type="dxa" w:w="100"/>
+            </w:tcMar>
+          </w:tcPr>
+          <w:p>
+            <w:r>
+              <w:rPr>
+                <w:rFonts w:ascii="Consolas" w:cs="Consolas" w:eastAsia="Consolas" w:hAnsi="Consolas"/>
+                <w:sz w:val="20"/>
+                <w:szCs w:val="20"/>
+              </w:rPr>
+              <w:t xml:space="preserve">POST .../folhas/{folha}/corrigir</w:t>
+            </w:r>
+          </w:p>
+        </w:tc>
+        <w:tc>
+          <w:tcPr>
+            <w:tcW w:type="dxa" w:w="5443"/>
+            <w:tcBorders>
+              <w:top w:val="single" w:color="BFBFBF" w:sz="4"/>
+              <w:left w:val="single" w:color="BFBFBF" w:sz="4"/>
+              <w:bottom w:val="single" w:color="BFBFBF" w:sz="4"/>
+              <w:right w:val="single" w:color="BFBFBF" w:sz="4"/>
+            </w:tcBorders>
+            <w:tcMar>
+              <w:top w:type="dxa" w:w="60"/>
+              <w:left w:type="dxa" w:w="100"/>
+              <w:bottom w:type="dxa" w:w="60"/>
+              <w:right w:type="dxa" w:w="100"/>
+            </w:tcMar>
+          </w:tcPr>
+          <w:p>
+            <w:r>
+              <w:rPr>
+                <w:sz w:val="20"/>
+                <w:szCs w:val="20"/>
+              </w:rPr>
+              <w:t xml:space="preserve">Corrige na hora as discursivas daquela folha</w:t>
+            </w:r>
+          </w:p>
+        </w:tc>
+      </w:tr>
+      <w:tr>
+        <w:trPr>
+          <w:cantSplit/>
+        </w:trPr>
+        <w:tc>
+          <w:tcPr>
+            <w:tcW w:type="dxa" w:w="3628"/>
+            <w:tcBorders>
+              <w:top w:val="single" w:color="BFBFBF" w:sz="4"/>
+              <w:left w:val="single" w:color="BFBFBF" w:sz="4"/>
+              <w:bottom w:val="single" w:color="BFBFBF" w:sz="4"/>
+              <w:right w:val="single" w:color="BFBFBF" w:sz="4"/>
+            </w:tcBorders>
+            <w:tcMar>
+              <w:top w:type="dxa" w:w="60"/>
+              <w:left w:type="dxa" w:w="100"/>
+              <w:bottom w:type="dxa" w:w="60"/>
+              <w:right w:type="dxa" w:w="100"/>
+            </w:tcMar>
+          </w:tcPr>
+          <w:p>
+            <w:r>
+              <w:rPr>
+                <w:rFonts w:ascii="Consolas" w:cs="Consolas" w:eastAsia="Consolas" w:hAnsi="Consolas"/>
+                <w:sz w:val="20"/>
+                <w:szCs w:val="20"/>
+              </w:rPr>
+              <w:t xml:space="preserve">POST /atividades/{id}/resultados/corrigir</w:t>
+            </w:r>
+          </w:p>
+        </w:tc>
+        <w:tc>
+          <w:tcPr>
+            <w:tcW w:type="dxa" w:w="5443"/>
+            <w:tcBorders>
+              <w:top w:val="single" w:color="BFBFBF" w:sz="4"/>
+              <w:left w:val="single" w:color="BFBFBF" w:sz="4"/>
+              <w:bottom w:val="single" w:color="BFBFBF" w:sz="4"/>
+              <w:right w:val="single" w:color="BFBFBF" w:sz="4"/>
+            </w:tcBorders>
+            <w:tcMar>
+              <w:top w:type="dxa" w:w="60"/>
+              <w:left w:type="dxa" w:w="100"/>
+              <w:bottom w:type="dxa" w:w="60"/>
+              <w:right w:type="dxa" w:w="100"/>
+            </w:tcMar>
+          </w:tcPr>
+          <w:p>
+            <w:r>
+              <w:rPr>
+                <w:sz w:val="20"/>
+                <w:szCs w:val="20"/>
+              </w:rPr>
+              <w:t xml:space="preserve">Corrige em lote todas as discursivas pendentes da atividade, fora da requisição</w:t>
+            </w:r>
+          </w:p>
+        </w:tc>
+      </w:tr>
+      <w:tr>
+        <w:trPr>
+          <w:cantSplit/>
+        </w:trPr>
+        <w:tc>
+          <w:tcPr>
+            <w:tcW w:type="dxa" w:w="3628"/>
+            <w:tcBorders>
+              <w:top w:val="single" w:color="BFBFBF" w:sz="4"/>
+              <w:left w:val="single" w:color="BFBFBF" w:sz="4"/>
+              <w:bottom w:val="single" w:color="BFBFBF" w:sz="4"/>
+              <w:right w:val="single" w:color="BFBFBF" w:sz="4"/>
+            </w:tcBorders>
+            <w:tcMar>
+              <w:top w:type="dxa" w:w="60"/>
+              <w:left w:type="dxa" w:w="100"/>
+              <w:bottom w:type="dxa" w:w="60"/>
+              <w:right w:type="dxa" w:w="100"/>
+            </w:tcMar>
+          </w:tcPr>
+          <w:p>
+            <w:r>
+              <w:rPr>
+                <w:rFonts w:ascii="Consolas" w:cs="Consolas" w:eastAsia="Consolas" w:hAnsi="Consolas"/>
+                <w:sz w:val="20"/>
+                <w:szCs w:val="20"/>
+              </w:rPr>
+              <w:t xml:space="preserve">POST /atividades/{id}/resultados/liberar</w:t>
+            </w:r>
+            <w:r>
+              <w:rPr>
+                <w:sz w:val="20"/>
+                <w:szCs w:val="20"/>
+              </w:rPr>
+              <w:t xml:space="preserve"> e </w:t>
+            </w:r>
+            <w:r>
+              <w:rPr>
+                <w:rFonts w:ascii="Consolas" w:cs="Consolas" w:eastAsia="Consolas" w:hAnsi="Consolas"/>
+                <w:sz w:val="20"/>
+                <w:szCs w:val="20"/>
+              </w:rPr>
+              <w:t xml:space="preserve">/recolher</w:t>
+            </w:r>
+          </w:p>
+        </w:tc>
+        <w:tc>
+          <w:tcPr>
+            <w:tcW w:type="dxa" w:w="5443"/>
+            <w:tcBorders>
+              <w:top w:val="single" w:color="BFBFBF" w:sz="4"/>
+              <w:left w:val="single" w:color="BFBFBF" w:sz="4"/>
+              <w:bottom w:val="single" w:color="BFBFBF" w:sz="4"/>
+              <w:right w:val="single" w:color="BFBFBF" w:sz="4"/>
+            </w:tcBorders>
+            <w:tcMar>
+              <w:top w:type="dxa" w:w="60"/>
+              <w:left w:type="dxa" w:w="100"/>
+              <w:bottom w:type="dxa" w:w="60"/>
+              <w:right w:type="dxa" w:w="100"/>
+            </w:tcMar>
+          </w:tcPr>
+          <w:p>
+            <w:r>
+              <w:rPr>
+                <w:sz w:val="20"/>
+                <w:szCs w:val="20"/>
+              </w:rPr>
+              <w:t xml:space="preserve">Libera os resultados para os alunos ou recolhe a liberação</w:t>
+            </w:r>
+          </w:p>
+        </w:tc>
+      </w:tr>
+      <w:tr>
+        <w:trPr>
+          <w:cantSplit/>
+        </w:trPr>
+        <w:tc>
+          <w:tcPr>
+            <w:tcW w:type="dxa" w:w="3628"/>
+            <w:tcBorders>
+              <w:top w:val="single" w:color="BFBFBF" w:sz="4"/>
+              <w:left w:val="single" w:color="BFBFBF" w:sz="4"/>
+              <w:bottom w:val="single" w:color="BFBFBF" w:sz="4"/>
+              <w:right w:val="single" w:color="BFBFBF" w:sz="4"/>
+            </w:tcBorders>
+            <w:tcMar>
+              <w:top w:type="dxa" w:w="60"/>
+              <w:left w:type="dxa" w:w="100"/>
+              <w:bottom w:type="dxa" w:w="60"/>
+              <w:right w:type="dxa" w:w="100"/>
+            </w:tcMar>
+          </w:tcPr>
+          <w:p>
+            <w:r>
+              <w:rPr>
+                <w:rFonts w:ascii="Consolas" w:cs="Consolas" w:eastAsia="Consolas" w:hAnsi="Consolas"/>
+                <w:sz w:val="20"/>
+                <w:szCs w:val="20"/>
+              </w:rPr>
+              <w:t xml:space="preserve">POST /atividades/{id}/resultados/valor</w:t>
+            </w:r>
+          </w:p>
+        </w:tc>
+        <w:tc>
+          <w:tcPr>
+            <w:tcW w:type="dxa" w:w="5443"/>
+            <w:tcBorders>
+              <w:top w:val="single" w:color="BFBFBF" w:sz="4"/>
+              <w:left w:val="single" w:color="BFBFBF" w:sz="4"/>
+              <w:bottom w:val="single" w:color="BFBFBF" w:sz="4"/>
+              <w:right w:val="single" w:color="BFBFBF" w:sz="4"/>
+            </w:tcBorders>
+            <w:tcMar>
+              <w:top w:type="dxa" w:w="60"/>
+              <w:left w:type="dxa" w:w="100"/>
+              <w:bottom w:type="dxa" w:w="60"/>
+              <w:right w:type="dxa" w:w="100"/>
+            </w:tcMar>
+          </w:tcPr>
+          <w:p>
+            <w:r>
+              <w:rPr>
+                <w:sz w:val="20"/>
+                <w:szCs w:val="20"/>
+              </w:rPr>
+              <w:t xml:space="preserve">Altera os pontos de cada objetiva (maior que 0 e até 100)</w:t>
+            </w:r>
+          </w:p>
+        </w:tc>
+      </w:tr>
+    </w:tbl>
+    <w:p>
+      <w:pPr>
+        <w:spacing w:after="120"/>
+      </w:pPr>
+    </w:p>
+    <w:p>
+      <w:pPr>
+        <w:pStyle w:val="Heading3"/>
+      </w:pPr>
+      <w:r>
+        <w:t xml:space="preserve">Nota de cada questão</w:t>
+      </w:r>
+    </w:p>
+    <w:tbl>
+      <w:tblPr>
+        <w:tblW w:type="dxa" w:w="9071"/>
+        <w:tblBorders>
+          <w:top w:val="single" w:color="auto" w:sz="4"/>
+          <w:left w:val="single" w:color="auto" w:sz="4"/>
+          <w:bottom w:val="single" w:color="auto" w:sz="4"/>
+          <w:right w:val="single" w:color="auto" w:sz="4"/>
+          <w:insideH w:val="single" w:color="auto" w:sz="4"/>
+          <w:insideV w:val="single" w:color="auto" w:sz="4"/>
+        </w:tblBorders>
+      </w:tblPr>
+      <w:tblGrid>
+        <w:gridCol w:w="3628"/>
+        <w:gridCol w:w="5443"/>
+      </w:tblGrid>
+      <w:tr>
+        <w:trPr>
+          <w:tblHeader/>
+        </w:trPr>
+        <w:tc>
+          <w:tcPr>
+            <w:tcW w:type="dxa" w:w="3628"/>
+            <w:tcBorders>
+              <w:top w:val="single" w:color="BFBFBF" w:sz="4"/>
+              <w:left w:val="single" w:color="BFBFBF" w:sz="4"/>
+              <w:bottom w:val="single" w:color="BFBFBF" w:sz="4"/>
+              <w:right w:val="single" w:color="BFBFBF" w:sz="4"/>
+            </w:tcBorders>
+            <w:shd w:fill="D9E2F3" w:color="auto" w:val="clear"/>
+            <w:tcMar>
+              <w:top w:type="dxa" w:w="60"/>
+              <w:left w:type="dxa" w:w="100"/>
+              <w:bottom w:type="dxa" w:w="60"/>
+              <w:right w:type="dxa" w:w="100"/>
+            </w:tcMar>
+          </w:tcPr>
+          <w:p>
+            <w:r>
+              <w:rPr>
+                <w:b/>
+                <w:bCs/>
+                <w:sz w:val="20"/>
+                <w:szCs w:val="20"/>
+              </w:rPr>
+              <w:t xml:space="preserve">Situação</w:t>
+            </w:r>
+          </w:p>
+        </w:tc>
+        <w:tc>
+          <w:tcPr>
+            <w:tcW w:type="dxa" w:w="5443"/>
+            <w:tcBorders>
+              <w:top w:val="single" w:color="BFBFBF" w:sz="4"/>
+              <w:left w:val="single" w:color="BFBFBF" w:sz="4"/>
+              <w:bottom w:val="single" w:color="BFBFBF" w:sz="4"/>
+              <w:right w:val="single" w:color="BFBFBF" w:sz="4"/>
+            </w:tcBorders>
+            <w:shd w:fill="D9E2F3" w:color="auto" w:val="clear"/>
+            <w:tcMar>
+              <w:top w:type="dxa" w:w="60"/>
+              <w:left w:type="dxa" w:w="100"/>
+              <w:bottom w:type="dxa" w:w="60"/>
+              <w:right w:type="dxa" w:w="100"/>
+            </w:tcMar>
+          </w:tcPr>
+          <w:p>
+            <w:r>
+              <w:rPr>
+                <w:b/>
+                <w:bCs/>
+                <w:sz w:val="20"/>
+                <w:szCs w:val="20"/>
+              </w:rPr>
+              <w:t xml:space="preserve">Pontos</w:t>
+            </w:r>
+          </w:p>
+        </w:tc>
+      </w:tr>
+      <w:tr>
+        <w:trPr>
+          <w:cantSplit/>
+        </w:trPr>
+        <w:tc>
+          <w:tcPr>
+            <w:tcW w:type="dxa" w:w="3628"/>
+            <w:tcBorders>
+              <w:top w:val="single" w:color="BFBFBF" w:sz="4"/>
+              <w:left w:val="single" w:color="BFBFBF" w:sz="4"/>
+              <w:bottom w:val="single" w:color="BFBFBF" w:sz="4"/>
+              <w:right w:val="single" w:color="BFBFBF" w:sz="4"/>
+            </w:tcBorders>
+            <w:tcMar>
+              <w:top w:type="dxa" w:w="60"/>
+              <w:left w:type="dxa" w:w="100"/>
+              <w:bottom w:type="dxa" w:w="60"/>
+              <w:right w:type="dxa" w:w="100"/>
+            </w:tcMar>
+          </w:tcPr>
+          <w:p>
+            <w:r>
+              <w:rPr>
+                <w:sz w:val="20"/>
+                <w:szCs w:val="20"/>
+              </w:rPr>
+              <w:t xml:space="preserve">Objetiva certa</w:t>
+            </w:r>
+          </w:p>
+        </w:tc>
+        <w:tc>
+          <w:tcPr>
+            <w:tcW w:type="dxa" w:w="5443"/>
+            <w:tcBorders>
+              <w:top w:val="single" w:color="BFBFBF" w:sz="4"/>
+              <w:left w:val="single" w:color="BFBFBF" w:sz="4"/>
+              <w:bottom w:val="single" w:color="BFBFBF" w:sz="4"/>
+              <w:right w:val="single" w:color="BFBFBF" w:sz="4"/>
+            </w:tcBorders>
+            <w:tcMar>
+              <w:top w:type="dxa" w:w="60"/>
+              <w:left w:type="dxa" w:w="100"/>
+              <w:bottom w:type="dxa" w:w="60"/>
+              <w:right w:type="dxa" w:w="100"/>
+            </w:tcMar>
+          </w:tcPr>
+          <w:p>
+            <w:r>
+              <w:rPr>
+                <w:sz w:val="20"/>
+                <w:szCs w:val="20"/>
+              </w:rPr>
+              <w:t xml:space="preserve">O valor das objetivas da atividade</w:t>
+            </w:r>
+          </w:p>
+        </w:tc>
+      </w:tr>
+      <w:tr>
+        <w:trPr>
+          <w:cantSplit/>
+        </w:trPr>
+        <w:tc>
+          <w:tcPr>
+            <w:tcW w:type="dxa" w:w="3628"/>
+            <w:tcBorders>
+              <w:top w:val="single" w:color="BFBFBF" w:sz="4"/>
+              <w:left w:val="single" w:color="BFBFBF" w:sz="4"/>
+              <w:bottom w:val="single" w:color="BFBFBF" w:sz="4"/>
+              <w:right w:val="single" w:color="BFBFBF" w:sz="4"/>
+            </w:tcBorders>
+            <w:tcMar>
+              <w:top w:type="dxa" w:w="60"/>
+              <w:left w:type="dxa" w:w="100"/>
+              <w:bottom w:type="dxa" w:w="60"/>
+              <w:right w:type="dxa" w:w="100"/>
+            </w:tcMar>
+          </w:tcPr>
+          <w:p>
+            <w:r>
+              <w:rPr>
+                <w:sz w:val="20"/>
+                <w:szCs w:val="20"/>
+              </w:rPr>
+              <w:t xml:space="preserve">Objetiva errada, em branco ou com mais de uma marcada</w:t>
+            </w:r>
+          </w:p>
+        </w:tc>
+        <w:tc>
+          <w:tcPr>
+            <w:tcW w:type="dxa" w:w="5443"/>
+            <w:tcBorders>
+              <w:top w:val="single" w:color="BFBFBF" w:sz="4"/>
+              <w:left w:val="single" w:color="BFBFBF" w:sz="4"/>
+              <w:bottom w:val="single" w:color="BFBFBF" w:sz="4"/>
+              <w:right w:val="single" w:color="BFBFBF" w:sz="4"/>
+            </w:tcBorders>
+            <w:tcMar>
+              <w:top w:type="dxa" w:w="60"/>
+              <w:left w:type="dxa" w:w="100"/>
+              <w:bottom w:type="dxa" w:w="60"/>
+              <w:right w:type="dxa" w:w="100"/>
+            </w:tcMar>
+          </w:tcPr>
+          <w:p>
+            <w:r>
+              <w:rPr>
+                <w:sz w:val="20"/>
+                <w:szCs w:val="20"/>
+              </w:rPr>
+              <w:t xml:space="preserve">Zero</w:t>
+            </w:r>
+          </w:p>
+        </w:tc>
+      </w:tr>
+      <w:tr>
+        <w:trPr>
+          <w:cantSplit/>
+        </w:trPr>
+        <w:tc>
+          <w:tcPr>
+            <w:tcW w:type="dxa" w:w="3628"/>
+            <w:tcBorders>
+              <w:top w:val="single" w:color="BFBFBF" w:sz="4"/>
+              <w:left w:val="single" w:color="BFBFBF" w:sz="4"/>
+              <w:bottom w:val="single" w:color="BFBFBF" w:sz="4"/>
+              <w:right w:val="single" w:color="BFBFBF" w:sz="4"/>
+            </w:tcBorders>
+            <w:tcMar>
+              <w:top w:type="dxa" w:w="60"/>
+              <w:left w:type="dxa" w:w="100"/>
+              <w:bottom w:type="dxa" w:w="60"/>
+              <w:right w:type="dxa" w:w="100"/>
+            </w:tcMar>
+          </w:tcPr>
+          <w:p>
+            <w:r>
+              <w:rPr>
+                <w:sz w:val="20"/>
+                <w:szCs w:val="20"/>
+              </w:rPr>
+              <w:t xml:space="preserve">Objetiva sem alternativa correta cadastrada</w:t>
+            </w:r>
+          </w:p>
+        </w:tc>
+        <w:tc>
+          <w:tcPr>
+            <w:tcW w:type="dxa" w:w="5443"/>
+            <w:tcBorders>
+              <w:top w:val="single" w:color="BFBFBF" w:sz="4"/>
+              <w:left w:val="single" w:color="BFBFBF" w:sz="4"/>
+              <w:bottom w:val="single" w:color="BFBFBF" w:sz="4"/>
+              <w:right w:val="single" w:color="BFBFBF" w:sz="4"/>
+            </w:tcBorders>
+            <w:tcMar>
+              <w:top w:type="dxa" w:w="60"/>
+              <w:left w:type="dxa" w:w="100"/>
+              <w:bottom w:type="dxa" w:w="60"/>
+              <w:right w:type="dxa" w:w="100"/>
+            </w:tcMar>
+          </w:tcPr>
+          <w:p>
+            <w:r>
+              <w:rPr>
+                <w:sz w:val="20"/>
+                <w:szCs w:val="20"/>
+              </w:rPr>
+              <w:t xml:space="preserve">Sem nota: a folha não fica concluída, e o painel avisa quais questões estão sem gabarito</w:t>
+            </w:r>
+          </w:p>
+        </w:tc>
+      </w:tr>
+      <w:tr>
+        <w:trPr>
+          <w:cantSplit/>
+        </w:trPr>
+        <w:tc>
+          <w:tcPr>
+            <w:tcW w:type="dxa" w:w="3628"/>
+            <w:tcBorders>
+              <w:top w:val="single" w:color="BFBFBF" w:sz="4"/>
+              <w:left w:val="single" w:color="BFBFBF" w:sz="4"/>
+              <w:bottom w:val="single" w:color="BFBFBF" w:sz="4"/>
+              <w:right w:val="single" w:color="BFBFBF" w:sz="4"/>
+            </w:tcBorders>
+            <w:tcMar>
+              <w:top w:type="dxa" w:w="60"/>
+              <w:left w:type="dxa" w:w="100"/>
+              <w:bottom w:type="dxa" w:w="60"/>
+              <w:right w:type="dxa" w:w="100"/>
+            </w:tcMar>
+          </w:tcPr>
+          <w:p>
+            <w:r>
+              <w:rPr>
+                <w:sz w:val="20"/>
+                <w:szCs w:val="20"/>
+              </w:rPr>
+              <w:t xml:space="preserve">Discursiva em branco</w:t>
+            </w:r>
+          </w:p>
+        </w:tc>
+        <w:tc>
+          <w:tcPr>
+            <w:tcW w:type="dxa" w:w="5443"/>
+            <w:tcBorders>
+              <w:top w:val="single" w:color="BFBFBF" w:sz="4"/>
+              <w:left w:val="single" w:color="BFBFBF" w:sz="4"/>
+              <w:bottom w:val="single" w:color="BFBFBF" w:sz="4"/>
+              <w:right w:val="single" w:color="BFBFBF" w:sz="4"/>
+            </w:tcBorders>
+            <w:tcMar>
+              <w:top w:type="dxa" w:w="60"/>
+              <w:left w:type="dxa" w:w="100"/>
+              <w:bottom w:type="dxa" w:w="60"/>
+              <w:right w:type="dxa" w:w="100"/>
+            </w:tcMar>
+          </w:tcPr>
+          <w:p>
+            <w:r>
+              <w:rPr>
+                <w:sz w:val="20"/>
+                <w:szCs w:val="20"/>
+              </w:rPr>
+              <w:t xml:space="preserve">Zero, sem chamar o modelo</w:t>
+            </w:r>
+          </w:p>
+        </w:tc>
+      </w:tr>
+      <w:tr>
+        <w:trPr>
+          <w:cantSplit/>
+        </w:trPr>
+        <w:tc>
+          <w:tcPr>
+            <w:tcW w:type="dxa" w:w="3628"/>
+            <w:tcBorders>
+              <w:top w:val="single" w:color="BFBFBF" w:sz="4"/>
+              <w:left w:val="single" w:color="BFBFBF" w:sz="4"/>
+              <w:bottom w:val="single" w:color="BFBFBF" w:sz="4"/>
+              <w:right w:val="single" w:color="BFBFBF" w:sz="4"/>
+            </w:tcBorders>
+            <w:tcMar>
+              <w:top w:type="dxa" w:w="60"/>
+              <w:left w:type="dxa" w:w="100"/>
+              <w:bottom w:type="dxa" w:w="60"/>
+              <w:right w:type="dxa" w:w="100"/>
+            </w:tcMar>
+          </w:tcPr>
+          <w:p>
+            <w:r>
+              <w:rPr>
+                <w:sz w:val="20"/>
+                <w:szCs w:val="20"/>
+              </w:rPr>
+              <w:t xml:space="preserve">Discursiva respondida</w:t>
+            </w:r>
+          </w:p>
+        </w:tc>
+        <w:tc>
+          <w:tcPr>
+            <w:tcW w:type="dxa" w:w="5443"/>
+            <w:tcBorders>
+              <w:top w:val="single" w:color="BFBFBF" w:sz="4"/>
+              <w:left w:val="single" w:color="BFBFBF" w:sz="4"/>
+              <w:bottom w:val="single" w:color="BFBFBF" w:sz="4"/>
+              <w:right w:val="single" w:color="BFBFBF" w:sz="4"/>
+            </w:tcBorders>
+            <w:tcMar>
+              <w:top w:type="dxa" w:w="60"/>
+              <w:left w:type="dxa" w:w="100"/>
+              <w:bottom w:type="dxa" w:w="60"/>
+              <w:right w:type="dxa" w:w="100"/>
+            </w:tcMar>
+          </w:tcPr>
+          <w:p>
+            <w:r>
+              <w:rPr>
+                <w:sz w:val="20"/>
+                <w:szCs w:val="20"/>
+              </w:rPr>
+              <w:t xml:space="preserve">Corrigida pelo mesmo procedimento da seção 4.9, com a resposta esperada quando a questão tem uma. A nota sugerida aparece como pendente até o professor aceitar ou ajustar na página da resposta (seção 4.11); só então conta</w:t>
+            </w:r>
+          </w:p>
+        </w:tc>
+      </w:tr>
+    </w:tbl>
+    <w:p>
+      <w:pPr>
+        <w:spacing w:after="120"/>
+      </w:pPr>
+    </w:p>
+    <w:p>
+      <w:pPr>
+        <w:spacing w:after="120" w:line="300"/>
+      </w:pPr>
+      <w:r>
+        <w:t xml:space="preserve">Uma folha está concluída quando todas as questões têm pontos. Depois da liberação, o aluno vê o resultado apenas das folhas concluídas; as demais aparecem quando o professor terminar de revisar. As objetivas podem ser alteradas a qualquer momento, porque a nota é só uma comparação com o gabarito. Uma discursiva já corrigida não é alterada: a correção e a decisão do professor se referem ao texto corrigido, e uma tentativa de mudar o texto é avisada.</w:t>
+      </w:r>
+    </w:p>
+    <w:p>
+      <w:pPr>
+        <w:pStyle w:val="Heading3"/>
+      </w:pPr>
+      <w:r>
+        <w:t xml:space="preserve">Correção em lote (lote.py)</w:t>
+      </w:r>
+    </w:p>
+    <w:p>
+      <w:pPr>
+        <w:spacing w:after="120" w:line="300"/>
+      </w:pPr>
+      <w:r>
+        <w:t xml:space="preserve">Uma turma de 40 alunos com duas discursivas exige 80 chamadas ao modelo, o que levaria vários minutos. Por isso a correção em lote roda numa linha de execução separada, e o painel mostra o andamento, atualizando a página a cada 5 segundos. Antes de cada chamada, o limite diário da conta é conferido; se for atingido, o lote para e as respostas restantes continuam pendentes. Uma falha do modelo é registrada nas métricas, como qualquer outra, e a resposta continua pendente para uma nova tentativa.</w:t>
       </w:r>
     </w:p>
     <w:p>
@@ -35541,7 +36956,7 @@
         <w:t xml:space="preserve">pytest</w:t>
       </w:r>
       <w:r>
-        <w:t xml:space="preserve"> e não acessam a internet nem gastam crédito: a API da OpenAI e a API do ENEM são substituídas por versões falsas que devolvem respostas controladas. Total nesta versão: 195 testes. Os testes de páginas entram com uma conta de administrador criada no banco de teste, e o custo do scrypt é reduzido só nos testes, para que rodem em poucos segundos.</w:t>
+        <w:t xml:space="preserve"> e não acessam a internet nem gastam crédito: a API da OpenAI e a API do ENEM são substituídas por versões falsas que devolvem respostas controladas. Total nesta versão: 213 testes. Os testes de páginas entram com uma conta de administrador criada no banco de teste, e o custo do scrypt é reduzido só nos testes, para que rodem em poucos segundos.</w:t>
       </w:r>
     </w:p>
     <w:tbl>
@@ -36288,6 +37703,64 @@
                 <w:sz w:val="20"/>
                 <w:szCs w:val="20"/>
               </w:rPr>
+              <w:t xml:space="preserve">tests/test_resultados.py</w:t>
+            </w:r>
+          </w:p>
+        </w:tc>
+        <w:tc>
+          <w:tcPr>
+            <w:tcW w:type="dxa" w:w="6350"/>
+            <w:tcBorders>
+              <w:top w:val="single" w:color="BFBFBF" w:sz="4"/>
+              <w:left w:val="single" w:color="BFBFBF" w:sz="4"/>
+              <w:bottom w:val="single" w:color="BFBFBF" w:sz="4"/>
+              <w:right w:val="single" w:color="BFBFBF" w:sz="4"/>
+            </w:tcBorders>
+            <w:tcMar>
+              <w:top w:type="dxa" w:w="60"/>
+              <w:left w:type="dxa" w:w="100"/>
+              <w:bottom w:type="dxa" w:w="60"/>
+              <w:right w:type="dxa" w:w="100"/>
+            </w:tcMar>
+          </w:tcPr>
+          <w:p>
+            <w:r>
+              <w:rPr>
+                <w:sz w:val="20"/>
+                <w:szCs w:val="20"/>
+              </w:rPr>
+              <w:t xml:space="preserve">Registro de objetivas certas, erradas, em branco e com mais de uma marcada, e de discursivas; alternativa inválida sem gravar nada; salvar e ir para a próxima folha; objetiva sem gabarito e aviso no painel; folha de outra atividade; correção da folha com resposta esperada, revisão e folha concluída; falha do modelo mantendo a resposta pendente; discursiva corrigida não alterada; correção em lote e parada no limite diário; painel e busca pelo código; liberação, recolhimento e visibilidade para o aluno; valor das objetivas; folhas com respostas não descartadas</w:t>
+            </w:r>
+          </w:p>
+        </w:tc>
+      </w:tr>
+      <w:tr>
+        <w:trPr>
+          <w:cantSplit/>
+        </w:trPr>
+        <w:tc>
+          <w:tcPr>
+            <w:tcW w:type="dxa" w:w="2721"/>
+            <w:tcBorders>
+              <w:top w:val="single" w:color="BFBFBF" w:sz="4"/>
+              <w:left w:val="single" w:color="BFBFBF" w:sz="4"/>
+              <w:bottom w:val="single" w:color="BFBFBF" w:sz="4"/>
+              <w:right w:val="single" w:color="BFBFBF" w:sz="4"/>
+            </w:tcBorders>
+            <w:tcMar>
+              <w:top w:type="dxa" w:w="60"/>
+              <w:left w:type="dxa" w:w="100"/>
+              <w:bottom w:type="dxa" w:w="60"/>
+              <w:right w:type="dxa" w:w="100"/>
+            </w:tcMar>
+          </w:tcPr>
+          <w:p>
+            <w:r>
+              <w:rPr>
+                <w:rFonts w:ascii="Consolas" w:cs="Consolas" w:eastAsia="Consolas" w:hAnsi="Consolas"/>
+                <w:sz w:val="20"/>
+                <w:szCs w:val="20"/>
+              </w:rPr>
               <w:t xml:space="preserve">tests/test_lista_questoes.py</w:t>
             </w:r>
           </w:p>
@@ -38905,6 +40378,234 @@
                 <w:sz w:val="20"/>
                 <w:szCs w:val="20"/>
               </w:rPr>
+              <w:t xml:space="preserve">Correção das folhas com a resposta esperada, quando existe</w:t>
+            </w:r>
+          </w:p>
+        </w:tc>
+        <w:tc>
+          <w:tcPr>
+            <w:tcW w:type="dxa" w:w="5443"/>
+            <w:tcBorders>
+              <w:top w:val="single" w:color="BFBFBF" w:sz="4"/>
+              <w:left w:val="single" w:color="BFBFBF" w:sz="4"/>
+              <w:bottom w:val="single" w:color="BFBFBF" w:sz="4"/>
+              <w:right w:val="single" w:color="BFBFBF" w:sz="4"/>
+            </w:tcBorders>
+            <w:tcMar>
+              <w:top w:type="dxa" w:w="60"/>
+              <w:left w:type="dxa" w:w="100"/>
+              <w:bottom w:type="dxa" w:w="60"/>
+              <w:right w:type="dxa" w:w="100"/>
+            </w:tcMar>
+          </w:tcPr>
+          <w:p>
+            <w:r>
+              <w:rPr>
+                <w:sz w:val="20"/>
+                <w:szCs w:val="20"/>
+              </w:rPr>
+              <w:t xml:space="preserve">Na sala de aula, o objetivo é a melhor correção possível; a comparação entre as duas condições continua restrita ao corpus da pesquisa</w:t>
+            </w:r>
+          </w:p>
+        </w:tc>
+      </w:tr>
+      <w:tr>
+        <w:trPr>
+          <w:cantSplit/>
+        </w:trPr>
+        <w:tc>
+          <w:tcPr>
+            <w:tcW w:type="dxa" w:w="3628"/>
+            <w:tcBorders>
+              <w:top w:val="single" w:color="BFBFBF" w:sz="4"/>
+              <w:left w:val="single" w:color="BFBFBF" w:sz="4"/>
+              <w:bottom w:val="single" w:color="BFBFBF" w:sz="4"/>
+              <w:right w:val="single" w:color="BFBFBF" w:sz="4"/>
+            </w:tcBorders>
+            <w:tcMar>
+              <w:top w:type="dxa" w:w="60"/>
+              <w:left w:type="dxa" w:w="100"/>
+              <w:bottom w:type="dxa" w:w="60"/>
+              <w:right w:type="dxa" w:w="100"/>
+            </w:tcMar>
+          </w:tcPr>
+          <w:p>
+            <w:r>
+              <w:rPr>
+                <w:sz w:val="20"/>
+                <w:szCs w:val="20"/>
+              </w:rPr>
+              <w:t xml:space="preserve">Nota da folha só com todas as discursivas confirmadas</w:t>
+            </w:r>
+          </w:p>
+        </w:tc>
+        <w:tc>
+          <w:tcPr>
+            <w:tcW w:type="dxa" w:w="5443"/>
+            <w:tcBorders>
+              <w:top w:val="single" w:color="BFBFBF" w:sz="4"/>
+              <w:left w:val="single" w:color="BFBFBF" w:sz="4"/>
+              <w:bottom w:val="single" w:color="BFBFBF" w:sz="4"/>
+              <w:right w:val="single" w:color="BFBFBF" w:sz="4"/>
+            </w:tcBorders>
+            <w:tcMar>
+              <w:top w:type="dxa" w:w="60"/>
+              <w:left w:type="dxa" w:w="100"/>
+              <w:bottom w:type="dxa" w:w="60"/>
+              <w:right w:type="dxa" w:w="100"/>
+            </w:tcMar>
+          </w:tcPr>
+          <w:p>
+            <w:r>
+              <w:rPr>
+                <w:sz w:val="20"/>
+                <w:szCs w:val="20"/>
+              </w:rPr>
+              <w:t xml:space="preserve">Cumpre o RF11: nenhuma nota chega ao aluno sem a decisão do professor</w:t>
+            </w:r>
+          </w:p>
+        </w:tc>
+      </w:tr>
+      <w:tr>
+        <w:trPr>
+          <w:cantSplit/>
+        </w:trPr>
+        <w:tc>
+          <w:tcPr>
+            <w:tcW w:type="dxa" w:w="3628"/>
+            <w:tcBorders>
+              <w:top w:val="single" w:color="BFBFBF" w:sz="4"/>
+              <w:left w:val="single" w:color="BFBFBF" w:sz="4"/>
+              <w:bottom w:val="single" w:color="BFBFBF" w:sz="4"/>
+              <w:right w:val="single" w:color="BFBFBF" w:sz="4"/>
+            </w:tcBorders>
+            <w:tcMar>
+              <w:top w:type="dxa" w:w="60"/>
+              <w:left w:type="dxa" w:w="100"/>
+              <w:bottom w:type="dxa" w:w="60"/>
+              <w:right w:type="dxa" w:w="100"/>
+            </w:tcMar>
+          </w:tcPr>
+          <w:p>
+            <w:r>
+              <w:rPr>
+                <w:sz w:val="20"/>
+                <w:szCs w:val="20"/>
+              </w:rPr>
+              <w:t xml:space="preserve">Discursiva em branco vale zero sem chamar o modelo</w:t>
+            </w:r>
+          </w:p>
+        </w:tc>
+        <w:tc>
+          <w:tcPr>
+            <w:tcW w:type="dxa" w:w="5443"/>
+            <w:tcBorders>
+              <w:top w:val="single" w:color="BFBFBF" w:sz="4"/>
+              <w:left w:val="single" w:color="BFBFBF" w:sz="4"/>
+              <w:bottom w:val="single" w:color="BFBFBF" w:sz="4"/>
+              <w:right w:val="single" w:color="BFBFBF" w:sz="4"/>
+            </w:tcBorders>
+            <w:tcMar>
+              <w:top w:type="dxa" w:w="60"/>
+              <w:left w:type="dxa" w:w="100"/>
+              <w:bottom w:type="dxa" w:w="60"/>
+              <w:right w:type="dxa" w:w="100"/>
+            </w:tcMar>
+          </w:tcPr>
+          <w:p>
+            <w:r>
+              <w:rPr>
+                <w:sz w:val="20"/>
+                <w:szCs w:val="20"/>
+              </w:rPr>
+              <w:t xml:space="preserve">Não há o que avaliar, e a chamada teria custo</w:t>
+            </w:r>
+          </w:p>
+        </w:tc>
+      </w:tr>
+      <w:tr>
+        <w:trPr>
+          <w:cantSplit/>
+        </w:trPr>
+        <w:tc>
+          <w:tcPr>
+            <w:tcW w:type="dxa" w:w="3628"/>
+            <w:tcBorders>
+              <w:top w:val="single" w:color="BFBFBF" w:sz="4"/>
+              <w:left w:val="single" w:color="BFBFBF" w:sz="4"/>
+              <w:bottom w:val="single" w:color="BFBFBF" w:sz="4"/>
+              <w:right w:val="single" w:color="BFBFBF" w:sz="4"/>
+            </w:tcBorders>
+            <w:tcMar>
+              <w:top w:type="dxa" w:w="60"/>
+              <w:left w:type="dxa" w:w="100"/>
+              <w:bottom w:type="dxa" w:w="60"/>
+              <w:right w:type="dxa" w:w="100"/>
+            </w:tcMar>
+          </w:tcPr>
+          <w:p>
+            <w:r>
+              <w:rPr>
+                <w:sz w:val="20"/>
+                <w:szCs w:val="20"/>
+              </w:rPr>
+              <w:t xml:space="preserve">Correção em lote numa linha de execução, com andamento em memória</w:t>
+            </w:r>
+          </w:p>
+        </w:tc>
+        <w:tc>
+          <w:tcPr>
+            <w:tcW w:type="dxa" w:w="5443"/>
+            <w:tcBorders>
+              <w:top w:val="single" w:color="BFBFBF" w:sz="4"/>
+              <w:left w:val="single" w:color="BFBFBF" w:sz="4"/>
+              <w:bottom w:val="single" w:color="BFBFBF" w:sz="4"/>
+              <w:right w:val="single" w:color="BFBFBF" w:sz="4"/>
+            </w:tcBorders>
+            <w:tcMar>
+              <w:top w:type="dxa" w:w="60"/>
+              <w:left w:type="dxa" w:w="100"/>
+              <w:bottom w:type="dxa" w:w="60"/>
+              <w:right w:type="dxa" w:w="100"/>
+            </w:tcMar>
+          </w:tcPr>
+          <w:p>
+            <w:r>
+              <w:rPr>
+                <w:sz w:val="20"/>
+                <w:szCs w:val="20"/>
+              </w:rPr>
+              <w:t xml:space="preserve">A página não pode esperar minutos; uma fila de tarefas exigiria outro serviço, desnecessário com um único processo no servidor</w:t>
+            </w:r>
+          </w:p>
+        </w:tc>
+      </w:tr>
+      <w:tr>
+        <w:trPr>
+          <w:cantSplit/>
+        </w:trPr>
+        <w:tc>
+          <w:tcPr>
+            <w:tcW w:type="dxa" w:w="3628"/>
+            <w:tcBorders>
+              <w:top w:val="single" w:color="BFBFBF" w:sz="4"/>
+              <w:left w:val="single" w:color="BFBFBF" w:sz="4"/>
+              <w:bottom w:val="single" w:color="BFBFBF" w:sz="4"/>
+              <w:right w:val="single" w:color="BFBFBF" w:sz="4"/>
+            </w:tcBorders>
+            <w:tcMar>
+              <w:top w:type="dxa" w:w="60"/>
+              <w:left w:type="dxa" w:w="100"/>
+              <w:bottom w:type="dxa" w:w="60"/>
+              <w:right w:type="dxa" w:w="100"/>
+            </w:tcMar>
+          </w:tcPr>
+          <w:p>
+            <w:r>
+              <w:rPr>
+                <w:sz w:val="20"/>
+                <w:szCs w:val="20"/>
+              </w:rPr>
               <w:t xml:space="preserve">Questões travadas enquanto houver folhas</w:t>
             </w:r>
           </w:p>
@@ -39361,6 +41062,57 @@
       </w:r>
       <w:r>
         <w:t xml:space="preserve"> algumas impressoras reduzem a página para caber nas margens. As marcas de alinhamento corrigem parte disso na leitura, mas a orientação é imprimir em tamanho real.</w:t>
+      </w:r>
+    </w:p>
+    <w:p>
+      <w:pPr>
+        <w:pStyle w:val="ListParagraph"/>
+        <w:numPr>
+          <w:ilvl w:val="0"/>
+          <w:numId w:val="5"/>
+        </w:numPr>
+        <w:spacing w:after="80" w:line="290"/>
+      </w:pPr>
+      <w:r>
+        <w:rPr>
+          <w:b/>
+          <w:bCs/>
+        </w:rPr>
+        <w:t xml:space="preserve">Correções das folhas nas métricas:</w:t>
+      </w:r>
+      <w:r>
+        <w:t xml:space="preserve"> as correções feitas pelas folhas de resposta entram nas métricas e nas revisões como qualquer outra. Para a análise da pesquisa, elas podem ser separadas pela origem da resposta (</w:t>
+      </w:r>
+      <w:r>
+        <w:rPr>
+          <w:rFonts w:ascii="Consolas" w:cs="Consolas" w:eastAsia="Consolas" w:hAnsi="Consolas"/>
+          <w:sz w:val="20"/>
+          <w:szCs w:val="20"/>
+        </w:rPr>
+        <w:t xml:space="preserve">folha</w:t>
+      </w:r>
+      <w:r>
+        <w:t xml:space="preserve">); como usam sempre a condição com resposta esperada quando disponível, não devem entrar na comparação entre condições.</w:t>
+      </w:r>
+    </w:p>
+    <w:p>
+      <w:pPr>
+        <w:pStyle w:val="ListParagraph"/>
+        <w:numPr>
+          <w:ilvl w:val="0"/>
+          <w:numId w:val="5"/>
+        </w:numPr>
+        <w:spacing w:after="80" w:line="290"/>
+      </w:pPr>
+      <w:r>
+        <w:rPr>
+          <w:b/>
+          <w:bCs/>
+        </w:rPr>
+        <w:t xml:space="preserve">Andamento do lote em memória:</w:t>
+      </w:r>
+      <w:r>
+        <w:t xml:space="preserve"> se o servidor reiniciar durante uma correção em lote, ela para. As respostas que faltaram continuam pendentes, e basta pedir a correção de novo.</w:t>
       </w:r>
     </w:p>
     <w:p>
@@ -42335,6 +44087,115 @@
                 <w:szCs w:val="20"/>
               </w:rPr>
               <w:t xml:space="preserve">Mudança</w:t>
+            </w:r>
+          </w:p>
+        </w:tc>
+      </w:tr>
+      <w:tr>
+        <w:trPr>
+          <w:cantSplit/>
+        </w:trPr>
+        <w:tc>
+          <w:tcPr>
+            <w:tcW w:type="dxa" w:w="1511"/>
+            <w:tcBorders>
+              <w:top w:val="single" w:color="BFBFBF" w:sz="4"/>
+              <w:left w:val="single" w:color="BFBFBF" w:sz="4"/>
+              <w:bottom w:val="single" w:color="BFBFBF" w:sz="4"/>
+              <w:right w:val="single" w:color="BFBFBF" w:sz="4"/>
+            </w:tcBorders>
+            <w:tcMar>
+              <w:top w:type="dxa" w:w="60"/>
+              <w:left w:type="dxa" w:w="100"/>
+              <w:bottom w:type="dxa" w:w="60"/>
+              <w:right w:type="dxa" w:w="100"/>
+            </w:tcMar>
+          </w:tcPr>
+          <w:p>
+            <w:r>
+              <w:rPr>
+                <w:sz w:val="20"/>
+                <w:szCs w:val="20"/>
+              </w:rPr>
+              <w:t xml:space="preserve">31/10/2026</w:t>
+            </w:r>
+          </w:p>
+        </w:tc>
+        <w:tc>
+          <w:tcPr>
+            <w:tcW w:type="dxa" w:w="1209"/>
+            <w:tcBorders>
+              <w:top w:val="single" w:color="BFBFBF" w:sz="4"/>
+              <w:left w:val="single" w:color="BFBFBF" w:sz="4"/>
+              <w:bottom w:val="single" w:color="BFBFBF" w:sz="4"/>
+              <w:right w:val="single" w:color="BFBFBF" w:sz="4"/>
+            </w:tcBorders>
+            <w:tcMar>
+              <w:top w:type="dxa" w:w="60"/>
+              <w:left w:type="dxa" w:w="100"/>
+              <w:bottom w:type="dxa" w:w="60"/>
+              <w:right w:type="dxa" w:w="100"/>
+            </w:tcMar>
+          </w:tcPr>
+          <w:p>
+            <w:r>
+              <w:rPr>
+                <w:sz w:val="20"/>
+                <w:szCs w:val="20"/>
+              </w:rPr>
+              <w:t xml:space="preserve">0.15</w:t>
+            </w:r>
+          </w:p>
+        </w:tc>
+        <w:tc>
+          <w:tcPr>
+            <w:tcW w:type="dxa" w:w="2267"/>
+            <w:tcBorders>
+              <w:top w:val="single" w:color="BFBFBF" w:sz="4"/>
+              <w:left w:val="single" w:color="BFBFBF" w:sz="4"/>
+              <w:bottom w:val="single" w:color="BFBFBF" w:sz="4"/>
+              <w:right w:val="single" w:color="BFBFBF" w:sz="4"/>
+            </w:tcBorders>
+            <w:tcMar>
+              <w:top w:type="dxa" w:w="60"/>
+              <w:left w:type="dxa" w:w="100"/>
+              <w:bottom w:type="dxa" w:w="60"/>
+              <w:right w:type="dxa" w:w="100"/>
+            </w:tcMar>
+          </w:tcPr>
+          <w:p>
+            <w:r>
+              <w:rPr>
+                <w:sz w:val="20"/>
+                <w:szCs w:val="20"/>
+              </w:rPr>
+              <w:t xml:space="preserve">pull request das respostas por folha</w:t>
+            </w:r>
+          </w:p>
+        </w:tc>
+        <w:tc>
+          <w:tcPr>
+            <w:tcW w:type="dxa" w:w="4084"/>
+            <w:tcBorders>
+              <w:top w:val="single" w:color="BFBFBF" w:sz="4"/>
+              <w:left w:val="single" w:color="BFBFBF" w:sz="4"/>
+              <w:bottom w:val="single" w:color="BFBFBF" w:sz="4"/>
+              <w:right w:val="single" w:color="BFBFBF" w:sz="4"/>
+            </w:tcBorders>
+            <w:tcMar>
+              <w:top w:type="dxa" w:w="60"/>
+              <w:left w:type="dxa" w:w="100"/>
+              <w:bottom w:type="dxa" w:w="60"/>
+              <w:right w:type="dxa" w:w="100"/>
+            </w:tcMar>
+          </w:tcPr>
+          <w:p>
+            <w:r>
+              <w:rPr>
+                <w:sz w:val="20"/>
+                <w:szCs w:val="20"/>
+              </w:rPr>
+              <w:t xml:space="preserve">Respostas de cada folha digitadas pelo professor, nota das objetivas pelo gabarito, correção das discursivas por folha ou em lote, nota da folha só com as discursivas confirmadas, painel de resultados e liberação para os alunos</w:t>
             </w:r>
           </w:p>
         </w:tc>
@@ -44243,7 +46104,7 @@
         <w:sz w:val="18"/>
         <w:szCs w:val="18"/>
       </w:rPr>
-      <w:t xml:space="preserve">Documentação Técnica do Protótipo, versão 0.14</w:t>
+      <w:t xml:space="preserve">Documentação Técnica do Protótipo, versão 0.15</w:t>
     </w:r>
   </w:p>
 </w:hdr>

</xml_diff>

<commit_message>
Documentação 0.16: página do aluno
Co-Authored-By: Claude Opus 5.5 <noreply@anthropic.com>
Claude-Session: https://claude.ai/code/session_01W2sxSqc4ZdmAUWH2L8vsV2
</commit_message>
<xml_diff>
--- a/docs/Documentacao_Tecnica.docx
+++ b/docs/Documentacao_Tecnica.docx
@@ -114,7 +114,7 @@
         <w:t xml:space="preserve">Versão: </w:t>
       </w:r>
       <w:r>
-        <w:t xml:space="preserve">0.15, de 31/10/2026</w:t>
+        <w:t xml:space="preserve">0.16, de 31/10/2026</w:t>
       </w:r>
     </w:p>
     <w:p>
@@ -595,7 +595,7 @@
                 <w:sz w:val="20"/>
                 <w:szCs w:val="20"/>
               </w:rPr>
-              <w:t xml:space="preserve">Acesso direto de alunos ao sistema</w:t>
+              <w:t xml:space="preserve">Contas e login para alunos</w:t>
             </w:r>
           </w:p>
         </w:tc>
@@ -782,6 +782,55 @@
                 <w:szCs w:val="20"/>
               </w:rPr>
               <w:t xml:space="preserve">Atividades montadas pelo professor, impressas em folha A4</w:t>
+            </w:r>
+          </w:p>
+        </w:tc>
+        <w:tc>
+          <w:tcPr>
+            <w:tcW w:type="dxa" w:w="4536"/>
+            <w:tcBorders>
+              <w:top w:val="single" w:color="BFBFBF" w:sz="4"/>
+              <w:left w:val="single" w:color="BFBFBF" w:sz="4"/>
+              <w:bottom w:val="single" w:color="BFBFBF" w:sz="4"/>
+              <w:right w:val="single" w:color="BFBFBF" w:sz="4"/>
+            </w:tcBorders>
+            <w:tcMar>
+              <w:top w:type="dxa" w:w="60"/>
+              <w:left w:type="dxa" w:w="100"/>
+              <w:bottom w:type="dxa" w:w="60"/>
+              <w:right w:type="dxa" w:w="100"/>
+            </w:tcMar>
+          </w:tcPr>
+          <w:p/>
+        </w:tc>
+      </w:tr>
+      <w:tr>
+        <w:trPr>
+          <w:cantSplit/>
+        </w:trPr>
+        <w:tc>
+          <w:tcPr>
+            <w:tcW w:type="dxa" w:w="4535"/>
+            <w:tcBorders>
+              <w:top w:val="single" w:color="BFBFBF" w:sz="4"/>
+              <w:left w:val="single" w:color="BFBFBF" w:sz="4"/>
+              <w:bottom w:val="single" w:color="BFBFBF" w:sz="4"/>
+              <w:right w:val="single" w:color="BFBFBF" w:sz="4"/>
+            </w:tcBorders>
+            <w:tcMar>
+              <w:top w:type="dxa" w:w="60"/>
+              <w:left w:type="dxa" w:w="100"/>
+              <w:bottom w:type="dxa" w:w="60"/>
+              <w:right w:type="dxa" w:w="100"/>
+            </w:tcMar>
+          </w:tcPr>
+          <w:p>
+            <w:r>
+              <w:rPr>
+                <w:sz w:val="20"/>
+                <w:szCs w:val="20"/>
+              </w:rPr>
+              <w:t xml:space="preserve">Folhas de resposta com código, correção da turma e consulta do resultado pelo aluno com o código, sem login</w:t>
             </w:r>
           </w:p>
         </w:tc>
@@ -1666,6 +1715,89 @@
                 <w:sz w:val="20"/>
                 <w:szCs w:val="20"/>
               </w:rPr>
+              <w:t xml:space="preserve">Apoio</w:t>
+            </w:r>
+          </w:p>
+        </w:tc>
+        <w:tc>
+          <w:tcPr>
+            <w:tcW w:type="dxa" w:w="4535"/>
+            <w:tcBorders>
+              <w:top w:val="single" w:color="BFBFBF" w:sz="4"/>
+              <w:left w:val="single" w:color="BFBFBF" w:sz="4"/>
+              <w:bottom w:val="single" w:color="BFBFBF" w:sz="4"/>
+              <w:right w:val="single" w:color="BFBFBF" w:sz="4"/>
+            </w:tcBorders>
+            <w:tcMar>
+              <w:top w:type="dxa" w:w="60"/>
+              <w:left w:type="dxa" w:w="100"/>
+              <w:bottom w:type="dxa" w:w="60"/>
+              <w:right w:type="dxa" w:w="100"/>
+            </w:tcMar>
+          </w:tcPr>
+          <w:p>
+            <w:r>
+              <w:rPr>
+                <w:sz w:val="20"/>
+                <w:szCs w:val="20"/>
+              </w:rPr>
+              <w:t xml:space="preserve">Página do aluno para consultar o resultado pelo código</w:t>
+            </w:r>
+          </w:p>
+        </w:tc>
+        <w:tc>
+          <w:tcPr>
+            <w:tcW w:type="dxa" w:w="3629"/>
+            <w:tcBorders>
+              <w:top w:val="single" w:color="BFBFBF" w:sz="4"/>
+              <w:left w:val="single" w:color="BFBFBF" w:sz="4"/>
+              <w:bottom w:val="single" w:color="BFBFBF" w:sz="4"/>
+              <w:right w:val="single" w:color="BFBFBF" w:sz="4"/>
+            </w:tcBorders>
+            <w:tcMar>
+              <w:top w:type="dxa" w:w="60"/>
+              <w:left w:type="dxa" w:w="100"/>
+              <w:bottom w:type="dxa" w:w="60"/>
+              <w:right w:type="dxa" w:w="100"/>
+            </w:tcMar>
+          </w:tcPr>
+          <w:p>
+            <w:r>
+              <w:rPr>
+                <w:sz w:val="20"/>
+                <w:szCs w:val="20"/>
+              </w:rPr>
+              <w:t xml:space="preserve">Implementado em 31/10/2026; aguardando revisão</w:t>
+            </w:r>
+          </w:p>
+        </w:tc>
+      </w:tr>
+      <w:tr>
+        <w:trPr>
+          <w:cantSplit/>
+        </w:trPr>
+        <w:tc>
+          <w:tcPr>
+            <w:tcW w:type="dxa" w:w="907"/>
+            <w:tcBorders>
+              <w:top w:val="single" w:color="BFBFBF" w:sz="4"/>
+              <w:left w:val="single" w:color="BFBFBF" w:sz="4"/>
+              <w:bottom w:val="single" w:color="BFBFBF" w:sz="4"/>
+              <w:right w:val="single" w:color="BFBFBF" w:sz="4"/>
+            </w:tcBorders>
+            <w:tcMar>
+              <w:top w:type="dxa" w:w="60"/>
+              <w:left w:type="dxa" w:w="100"/>
+              <w:bottom w:type="dxa" w:w="60"/>
+              <w:right w:type="dxa" w:w="100"/>
+            </w:tcMar>
+          </w:tcPr>
+          <w:p>
+            <w:r>
+              <w:rPr>
+                <w:sz w:val="20"/>
+                <w:szCs w:val="20"/>
+              </w:rPr>
               <w:t xml:space="preserve">5</w:t>
             </w:r>
           </w:p>
@@ -3978,6 +4110,94 @@
                 <w:szCs w:val="20"/>
               </w:rPr>
               <w:t xml:space="preserve">Atividades: montagem de conjuntos de questões, caderno de questões em A4 e rotas das folhas de resposta (</w:t>
+            </w:r>
+            <w:r>
+              <w:rPr>
+                <w:rFonts w:ascii="Consolas" w:cs="Consolas" w:eastAsia="Consolas" w:hAnsi="Consolas"/>
+                <w:sz w:val="20"/>
+                <w:szCs w:val="20"/>
+              </w:rPr>
+              <w:t xml:space="preserve">router.py</w:t>
+            </w:r>
+            <w:r>
+              <w:rPr>
+                <w:sz w:val="20"/>
+                <w:szCs w:val="20"/>
+              </w:rPr>
+              <w:t xml:space="preserve">)</w:t>
+            </w:r>
+          </w:p>
+        </w:tc>
+      </w:tr>
+      <w:tr>
+        <w:trPr>
+          <w:cantSplit/>
+        </w:trPr>
+        <w:tc>
+          <w:tcPr>
+            <w:tcW w:type="dxa" w:w="2721"/>
+            <w:tcBorders>
+              <w:top w:val="single" w:color="BFBFBF" w:sz="4"/>
+              <w:left w:val="single" w:color="BFBFBF" w:sz="4"/>
+              <w:bottom w:val="single" w:color="BFBFBF" w:sz="4"/>
+              <w:right w:val="single" w:color="BFBFBF" w:sz="4"/>
+            </w:tcBorders>
+            <w:tcMar>
+              <w:top w:type="dxa" w:w="60"/>
+              <w:left w:type="dxa" w:w="100"/>
+              <w:bottom w:type="dxa" w:w="60"/>
+              <w:right w:type="dxa" w:w="100"/>
+            </w:tcMar>
+          </w:tcPr>
+          <w:p>
+            <w:r>
+              <w:rPr>
+                <w:rFonts w:ascii="Consolas" w:cs="Consolas" w:eastAsia="Consolas" w:hAnsi="Consolas"/>
+                <w:sz w:val="20"/>
+                <w:szCs w:val="20"/>
+              </w:rPr>
+              <w:t xml:space="preserve">app/aluno/</w:t>
+            </w:r>
+          </w:p>
+        </w:tc>
+        <w:tc>
+          <w:tcPr>
+            <w:tcW w:type="dxa" w:w="6350"/>
+            <w:tcBorders>
+              <w:top w:val="single" w:color="BFBFBF" w:sz="4"/>
+              <w:left w:val="single" w:color="BFBFBF" w:sz="4"/>
+              <w:bottom w:val="single" w:color="BFBFBF" w:sz="4"/>
+              <w:right w:val="single" w:color="BFBFBF" w:sz="4"/>
+            </w:tcBorders>
+            <w:tcMar>
+              <w:top w:type="dxa" w:w="60"/>
+              <w:left w:type="dxa" w:w="100"/>
+              <w:bottom w:type="dxa" w:w="60"/>
+              <w:right w:type="dxa" w:w="100"/>
+            </w:tcMar>
+          </w:tcPr>
+          <w:p>
+            <w:r>
+              <w:rPr>
+                <w:sz w:val="20"/>
+                <w:szCs w:val="20"/>
+              </w:rPr>
+              <w:t xml:space="preserve">Página pública do aluno: o que ele pode ver do próprio resultado (</w:t>
+            </w:r>
+            <w:r>
+              <w:rPr>
+                <w:rFonts w:ascii="Consolas" w:cs="Consolas" w:eastAsia="Consolas" w:hAnsi="Consolas"/>
+                <w:sz w:val="20"/>
+                <w:szCs w:val="20"/>
+              </w:rPr>
+              <w:t xml:space="preserve">servico.py</w:t>
+            </w:r>
+            <w:r>
+              <w:rPr>
+                <w:sz w:val="20"/>
+                <w:szCs w:val="20"/>
+              </w:rPr>
+              <w:t xml:space="preserve">) e as rotas de consulta pelo código (</w:t>
             </w:r>
             <w:r>
               <w:rPr>
@@ -32560,7 +32780,7 @@
                 <w:sz w:val="20"/>
                 <w:szCs w:val="20"/>
               </w:rPr>
-              <w:t xml:space="preserve">Só na primeira página, abaixo de uma linha tracejada: título, código e o endereço onde o aluno consulta o resultado</w:t>
+              <w:t xml:space="preserve">Só na primeira página, abaixo de uma linha tracejada: título, código, o endereço onde o aluno consulta o resultado e um segundo QR code que abre a página do aluno já com o código. Fica fora da área lida, porque o aluno o leva embora</w:t>
             </w:r>
           </w:p>
         </w:tc>
@@ -33524,6 +33744,603 @@
       </w:pPr>
       <w:r>
         <w:t xml:space="preserve">Uma turma de 40 alunos com duas discursivas exige 80 chamadas ao modelo, o que levaria vários minutos. Por isso a correção em lote roda numa linha de execução separada, e o painel mostra o andamento, atualizando a página a cada 5 segundos. Antes de cada chamada, o limite diário da conta é conferido; se for atingido, o lote para e as respostas restantes continuam pendentes. Uma falha do modelo é registrada nas métricas, como qualquer outra, e a resposta continua pendente para uma nova tentativa.</w:t>
+      </w:r>
+    </w:p>
+    <w:p>
+      <w:pPr>
+        <w:pStyle w:val="Heading2"/>
+      </w:pPr>
+      <w:r>
+        <w:t xml:space="preserve">4.25 Página do aluno: app/aluno/</w:t>
+      </w:r>
+    </w:p>
+    <w:p>
+      <w:pPr>
+        <w:spacing w:after="120" w:line="300"/>
+      </w:pPr>
+      <w:r>
+        <w:t xml:space="preserve">É a única parte do sistema aberta sem login. O aluno digita o código do canhoto, ou aponta a câmera para o QR code do canhoto, e vê o resultado da própria folha. O código é a chave: é aleatório, só o aluno tem o canhoto, e o sistema não guarda o nome de ninguém.</w:t>
+      </w:r>
+    </w:p>
+    <w:tbl>
+      <w:tblPr>
+        <w:tblW w:type="dxa" w:w="9071"/>
+        <w:tblBorders>
+          <w:top w:val="single" w:color="auto" w:sz="4"/>
+          <w:left w:val="single" w:color="auto" w:sz="4"/>
+          <w:bottom w:val="single" w:color="auto" w:sz="4"/>
+          <w:right w:val="single" w:color="auto" w:sz="4"/>
+          <w:insideH w:val="single" w:color="auto" w:sz="4"/>
+          <w:insideV w:val="single" w:color="auto" w:sz="4"/>
+        </w:tblBorders>
+      </w:tblPr>
+      <w:tblGrid>
+        <w:gridCol w:w="2721"/>
+        <w:gridCol w:w="6350"/>
+      </w:tblGrid>
+      <w:tr>
+        <w:trPr>
+          <w:tblHeader/>
+        </w:trPr>
+        <w:tc>
+          <w:tcPr>
+            <w:tcW w:type="dxa" w:w="2721"/>
+            <w:tcBorders>
+              <w:top w:val="single" w:color="BFBFBF" w:sz="4"/>
+              <w:left w:val="single" w:color="BFBFBF" w:sz="4"/>
+              <w:bottom w:val="single" w:color="BFBFBF" w:sz="4"/>
+              <w:right w:val="single" w:color="BFBFBF" w:sz="4"/>
+            </w:tcBorders>
+            <w:shd w:fill="D9E2F3" w:color="auto" w:val="clear"/>
+            <w:tcMar>
+              <w:top w:type="dxa" w:w="60"/>
+              <w:left w:type="dxa" w:w="100"/>
+              <w:bottom w:type="dxa" w:w="60"/>
+              <w:right w:type="dxa" w:w="100"/>
+            </w:tcMar>
+          </w:tcPr>
+          <w:p>
+            <w:r>
+              <w:rPr>
+                <w:b/>
+                <w:bCs/>
+                <w:sz w:val="20"/>
+                <w:szCs w:val="20"/>
+              </w:rPr>
+              <w:t xml:space="preserve">Rota</w:t>
+            </w:r>
+          </w:p>
+        </w:tc>
+        <w:tc>
+          <w:tcPr>
+            <w:tcW w:type="dxa" w:w="6350"/>
+            <w:tcBorders>
+              <w:top w:val="single" w:color="BFBFBF" w:sz="4"/>
+              <w:left w:val="single" w:color="BFBFBF" w:sz="4"/>
+              <w:bottom w:val="single" w:color="BFBFBF" w:sz="4"/>
+              <w:right w:val="single" w:color="BFBFBF" w:sz="4"/>
+            </w:tcBorders>
+            <w:shd w:fill="D9E2F3" w:color="auto" w:val="clear"/>
+            <w:tcMar>
+              <w:top w:type="dxa" w:w="60"/>
+              <w:left w:type="dxa" w:w="100"/>
+              <w:bottom w:type="dxa" w:w="60"/>
+              <w:right w:type="dxa" w:w="100"/>
+            </w:tcMar>
+          </w:tcPr>
+          <w:p>
+            <w:r>
+              <w:rPr>
+                <w:b/>
+                <w:bCs/>
+                <w:sz w:val="20"/>
+                <w:szCs w:val="20"/>
+              </w:rPr>
+              <w:t xml:space="preserve">O que faz</w:t>
+            </w:r>
+          </w:p>
+        </w:tc>
+      </w:tr>
+      <w:tr>
+        <w:trPr>
+          <w:cantSplit/>
+        </w:trPr>
+        <w:tc>
+          <w:tcPr>
+            <w:tcW w:type="dxa" w:w="2721"/>
+            <w:tcBorders>
+              <w:top w:val="single" w:color="BFBFBF" w:sz="4"/>
+              <w:left w:val="single" w:color="BFBFBF" w:sz="4"/>
+              <w:bottom w:val="single" w:color="BFBFBF" w:sz="4"/>
+              <w:right w:val="single" w:color="BFBFBF" w:sz="4"/>
+            </w:tcBorders>
+            <w:tcMar>
+              <w:top w:type="dxa" w:w="60"/>
+              <w:left w:type="dxa" w:w="100"/>
+              <w:bottom w:type="dxa" w:w="60"/>
+              <w:right w:type="dxa" w:w="100"/>
+            </w:tcMar>
+          </w:tcPr>
+          <w:p>
+            <w:r>
+              <w:rPr>
+                <w:rFonts w:ascii="Consolas" w:cs="Consolas" w:eastAsia="Consolas" w:hAnsi="Consolas"/>
+                <w:sz w:val="20"/>
+                <w:szCs w:val="20"/>
+              </w:rPr>
+              <w:t xml:space="preserve">GET /resultado</w:t>
+            </w:r>
+          </w:p>
+        </w:tc>
+        <w:tc>
+          <w:tcPr>
+            <w:tcW w:type="dxa" w:w="6350"/>
+            <w:tcBorders>
+              <w:top w:val="single" w:color="BFBFBF" w:sz="4"/>
+              <w:left w:val="single" w:color="BFBFBF" w:sz="4"/>
+              <w:bottom w:val="single" w:color="BFBFBF" w:sz="4"/>
+              <w:right w:val="single" w:color="BFBFBF" w:sz="4"/>
+            </w:tcBorders>
+            <w:tcMar>
+              <w:top w:type="dxa" w:w="60"/>
+              <w:left w:type="dxa" w:w="100"/>
+              <w:bottom w:type="dxa" w:w="60"/>
+              <w:right w:type="dxa" w:w="100"/>
+            </w:tcMar>
+          </w:tcPr>
+          <w:p>
+            <w:r>
+              <w:rPr>
+                <w:sz w:val="20"/>
+                <w:szCs w:val="20"/>
+              </w:rPr>
+              <w:t xml:space="preserve">Formulário para digitar o código. Com </w:t>
+            </w:r>
+            <w:r>
+              <w:rPr>
+                <w:rFonts w:ascii="Consolas" w:cs="Consolas" w:eastAsia="Consolas" w:hAnsi="Consolas"/>
+                <w:sz w:val="20"/>
+                <w:szCs w:val="20"/>
+              </w:rPr>
+              <w:t xml:space="preserve">codigo</w:t>
+            </w:r>
+            <w:r>
+              <w:rPr>
+                <w:sz w:val="20"/>
+                <w:szCs w:val="20"/>
+              </w:rPr>
+              <w:t xml:space="preserve">, normaliza o que foi digitado (minúsculas, espaços, sem hífen) e leva à rota seguinte</w:t>
+            </w:r>
+          </w:p>
+        </w:tc>
+      </w:tr>
+      <w:tr>
+        <w:trPr>
+          <w:cantSplit/>
+        </w:trPr>
+        <w:tc>
+          <w:tcPr>
+            <w:tcW w:type="dxa" w:w="2721"/>
+            <w:tcBorders>
+              <w:top w:val="single" w:color="BFBFBF" w:sz="4"/>
+              <w:left w:val="single" w:color="BFBFBF" w:sz="4"/>
+              <w:bottom w:val="single" w:color="BFBFBF" w:sz="4"/>
+              <w:right w:val="single" w:color="BFBFBF" w:sz="4"/>
+            </w:tcBorders>
+            <w:tcMar>
+              <w:top w:type="dxa" w:w="60"/>
+              <w:left w:type="dxa" w:w="100"/>
+              <w:bottom w:type="dxa" w:w="60"/>
+              <w:right w:type="dxa" w:w="100"/>
+            </w:tcMar>
+          </w:tcPr>
+          <w:p>
+            <w:r>
+              <w:rPr>
+                <w:rFonts w:ascii="Consolas" w:cs="Consolas" w:eastAsia="Consolas" w:hAnsi="Consolas"/>
+                <w:sz w:val="20"/>
+                <w:szCs w:val="20"/>
+              </w:rPr>
+              <w:t xml:space="preserve">GET /r/{codigo}</w:t>
+            </w:r>
+          </w:p>
+        </w:tc>
+        <w:tc>
+          <w:tcPr>
+            <w:tcW w:type="dxa" w:w="6350"/>
+            <w:tcBorders>
+              <w:top w:val="single" w:color="BFBFBF" w:sz="4"/>
+              <w:left w:val="single" w:color="BFBFBF" w:sz="4"/>
+              <w:bottom w:val="single" w:color="BFBFBF" w:sz="4"/>
+              <w:right w:val="single" w:color="BFBFBF" w:sz="4"/>
+            </w:tcBorders>
+            <w:tcMar>
+              <w:top w:type="dxa" w:w="60"/>
+              <w:left w:type="dxa" w:w="100"/>
+              <w:bottom w:type="dxa" w:w="60"/>
+              <w:right w:type="dxa" w:w="100"/>
+            </w:tcMar>
+          </w:tcPr>
+          <w:p>
+            <w:r>
+              <w:rPr>
+                <w:sz w:val="20"/>
+                <w:szCs w:val="20"/>
+              </w:rPr>
+              <w:t xml:space="preserve">Resultado da folha, quando liberado e concluído; senão, um aviso de que o professor ainda não liberou ou de que a folha está em correção</w:t>
+            </w:r>
+          </w:p>
+        </w:tc>
+      </w:tr>
+    </w:tbl>
+    <w:p>
+      <w:pPr>
+        <w:spacing w:after="120"/>
+      </w:pPr>
+    </w:p>
+    <w:p>
+      <w:pPr>
+        <w:pStyle w:val="Heading3"/>
+      </w:pPr>
+      <w:r>
+        <w:t xml:space="preserve">O que o aluno vê e o que não vê</w:t>
+      </w:r>
+    </w:p>
+    <w:tbl>
+      <w:tblPr>
+        <w:tblW w:type="dxa" w:w="9071"/>
+        <w:tblBorders>
+          <w:top w:val="single" w:color="auto" w:sz="4"/>
+          <w:left w:val="single" w:color="auto" w:sz="4"/>
+          <w:bottom w:val="single" w:color="auto" w:sz="4"/>
+          <w:right w:val="single" w:color="auto" w:sz="4"/>
+          <w:insideH w:val="single" w:color="auto" w:sz="4"/>
+          <w:insideV w:val="single" w:color="auto" w:sz="4"/>
+        </w:tblBorders>
+      </w:tblPr>
+      <w:tblGrid>
+        <w:gridCol w:w="4535"/>
+        <w:gridCol w:w="4536"/>
+      </w:tblGrid>
+      <w:tr>
+        <w:trPr>
+          <w:tblHeader/>
+        </w:trPr>
+        <w:tc>
+          <w:tcPr>
+            <w:tcW w:type="dxa" w:w="4535"/>
+            <w:tcBorders>
+              <w:top w:val="single" w:color="BFBFBF" w:sz="4"/>
+              <w:left w:val="single" w:color="BFBFBF" w:sz="4"/>
+              <w:bottom w:val="single" w:color="BFBFBF" w:sz="4"/>
+              <w:right w:val="single" w:color="BFBFBF" w:sz="4"/>
+            </w:tcBorders>
+            <w:shd w:fill="D9E2F3" w:color="auto" w:val="clear"/>
+            <w:tcMar>
+              <w:top w:type="dxa" w:w="60"/>
+              <w:left w:type="dxa" w:w="100"/>
+              <w:bottom w:type="dxa" w:w="60"/>
+              <w:right w:type="dxa" w:w="100"/>
+            </w:tcMar>
+          </w:tcPr>
+          <w:p>
+            <w:r>
+              <w:rPr>
+                <w:b/>
+                <w:bCs/>
+                <w:sz w:val="20"/>
+                <w:szCs w:val="20"/>
+              </w:rPr>
+              <w:t xml:space="preserve">Mostrado ao aluno</w:t>
+            </w:r>
+          </w:p>
+        </w:tc>
+        <w:tc>
+          <w:tcPr>
+            <w:tcW w:type="dxa" w:w="4536"/>
+            <w:tcBorders>
+              <w:top w:val="single" w:color="BFBFBF" w:sz="4"/>
+              <w:left w:val="single" w:color="BFBFBF" w:sz="4"/>
+              <w:bottom w:val="single" w:color="BFBFBF" w:sz="4"/>
+              <w:right w:val="single" w:color="BFBFBF" w:sz="4"/>
+            </w:tcBorders>
+            <w:shd w:fill="D9E2F3" w:color="auto" w:val="clear"/>
+            <w:tcMar>
+              <w:top w:type="dxa" w:w="60"/>
+              <w:left w:type="dxa" w:w="100"/>
+              <w:bottom w:type="dxa" w:w="60"/>
+              <w:right w:type="dxa" w:w="100"/>
+            </w:tcMar>
+          </w:tcPr>
+          <w:p>
+            <w:r>
+              <w:rPr>
+                <w:b/>
+                <w:bCs/>
+                <w:sz w:val="20"/>
+                <w:szCs w:val="20"/>
+              </w:rPr>
+              <w:t xml:space="preserve">Nunca mostrado</w:t>
+            </w:r>
+          </w:p>
+        </w:tc>
+      </w:tr>
+      <w:tr>
+        <w:trPr>
+          <w:cantSplit/>
+        </w:trPr>
+        <w:tc>
+          <w:tcPr>
+            <w:tcW w:type="dxa" w:w="4535"/>
+            <w:tcBorders>
+              <w:top w:val="single" w:color="BFBFBF" w:sz="4"/>
+              <w:left w:val="single" w:color="BFBFBF" w:sz="4"/>
+              <w:bottom w:val="single" w:color="BFBFBF" w:sz="4"/>
+              <w:right w:val="single" w:color="BFBFBF" w:sz="4"/>
+            </w:tcBorders>
+            <w:tcMar>
+              <w:top w:type="dxa" w:w="60"/>
+              <w:left w:type="dxa" w:w="100"/>
+              <w:bottom w:type="dxa" w:w="60"/>
+              <w:right w:type="dxa" w:w="100"/>
+            </w:tcMar>
+          </w:tcPr>
+          <w:p>
+            <w:r>
+              <w:rPr>
+                <w:sz w:val="20"/>
+                <w:szCs w:val="20"/>
+              </w:rPr>
+              <w:t xml:space="preserve">Nota total e pontos de cada questão</w:t>
+            </w:r>
+          </w:p>
+        </w:tc>
+        <w:tc>
+          <w:tcPr>
+            <w:tcW w:type="dxa" w:w="4536"/>
+            <w:tcBorders>
+              <w:top w:val="single" w:color="BFBFBF" w:sz="4"/>
+              <w:left w:val="single" w:color="BFBFBF" w:sz="4"/>
+              <w:bottom w:val="single" w:color="BFBFBF" w:sz="4"/>
+              <w:right w:val="single" w:color="BFBFBF" w:sz="4"/>
+            </w:tcBorders>
+            <w:tcMar>
+              <w:top w:type="dxa" w:w="60"/>
+              <w:left w:type="dxa" w:w="100"/>
+              <w:bottom w:type="dxa" w:w="60"/>
+              <w:right w:type="dxa" w:w="100"/>
+            </w:tcMar>
+          </w:tcPr>
+          <w:p>
+            <w:r>
+              <w:rPr>
+                <w:sz w:val="20"/>
+                <w:szCs w:val="20"/>
+              </w:rPr>
+              <w:t xml:space="preserve">Nota sugerida pelo modelo</w:t>
+            </w:r>
+          </w:p>
+        </w:tc>
+      </w:tr>
+      <w:tr>
+        <w:trPr>
+          <w:cantSplit/>
+        </w:trPr>
+        <w:tc>
+          <w:tcPr>
+            <w:tcW w:type="dxa" w:w="4535"/>
+            <w:tcBorders>
+              <w:top w:val="single" w:color="BFBFBF" w:sz="4"/>
+              <w:left w:val="single" w:color="BFBFBF" w:sz="4"/>
+              <w:bottom w:val="single" w:color="BFBFBF" w:sz="4"/>
+              <w:right w:val="single" w:color="BFBFBF" w:sz="4"/>
+            </w:tcBorders>
+            <w:tcMar>
+              <w:top w:type="dxa" w:w="60"/>
+              <w:left w:type="dxa" w:w="100"/>
+              <w:bottom w:type="dxa" w:w="60"/>
+              <w:right w:type="dxa" w:w="100"/>
+            </w:tcMar>
+          </w:tcPr>
+          <w:p>
+            <w:r>
+              <w:rPr>
+                <w:sz w:val="20"/>
+                <w:szCs w:val="20"/>
+              </w:rPr>
+              <w:t xml:space="preserve">Objetivas: alternativa marcada, alternativa correta, por que a marcada está errada, o caminho até a correta e a pista do enunciado, quando a explicação foi gerada para a questão</w:t>
+            </w:r>
+          </w:p>
+        </w:tc>
+        <w:tc>
+          <w:tcPr>
+            <w:tcW w:type="dxa" w:w="4536"/>
+            <w:tcBorders>
+              <w:top w:val="single" w:color="BFBFBF" w:sz="4"/>
+              <w:left w:val="single" w:color="BFBFBF" w:sz="4"/>
+              <w:bottom w:val="single" w:color="BFBFBF" w:sz="4"/>
+              <w:right w:val="single" w:color="BFBFBF" w:sz="4"/>
+            </w:tcBorders>
+            <w:tcMar>
+              <w:top w:type="dxa" w:w="60"/>
+              <w:left w:type="dxa" w:w="100"/>
+              <w:bottom w:type="dxa" w:w="60"/>
+              <w:right w:type="dxa" w:w="100"/>
+            </w:tcMar>
+          </w:tcPr>
+          <w:p>
+            <w:r>
+              <w:rPr>
+                <w:sz w:val="20"/>
+                <w:szCs w:val="20"/>
+              </w:rPr>
+              <w:t xml:space="preserve">Análise por critério, escrita para o professor, que revela o conteúdo esperado</w:t>
+            </w:r>
+          </w:p>
+        </w:tc>
+      </w:tr>
+      <w:tr>
+        <w:trPr>
+          <w:cantSplit/>
+        </w:trPr>
+        <w:tc>
+          <w:tcPr>
+            <w:tcW w:type="dxa" w:w="4535"/>
+            <w:tcBorders>
+              <w:top w:val="single" w:color="BFBFBF" w:sz="4"/>
+              <w:left w:val="single" w:color="BFBFBF" w:sz="4"/>
+              <w:bottom w:val="single" w:color="BFBFBF" w:sz="4"/>
+              <w:right w:val="single" w:color="BFBFBF" w:sz="4"/>
+            </w:tcBorders>
+            <w:tcMar>
+              <w:top w:type="dxa" w:w="60"/>
+              <w:left w:type="dxa" w:w="100"/>
+              <w:bottom w:type="dxa" w:w="60"/>
+              <w:right w:type="dxa" w:w="100"/>
+            </w:tcMar>
+          </w:tcPr>
+          <w:p>
+            <w:r>
+              <w:rPr>
+                <w:sz w:val="20"/>
+                <w:szCs w:val="20"/>
+              </w:rPr>
+              <w:t xml:space="preserve">Discursivas: o feedback elaborado para o aluno e a nota confirmada pelo professor</w:t>
+            </w:r>
+          </w:p>
+        </w:tc>
+        <w:tc>
+          <w:tcPr>
+            <w:tcW w:type="dxa" w:w="4536"/>
+            <w:tcBorders>
+              <w:top w:val="single" w:color="BFBFBF" w:sz="4"/>
+              <w:left w:val="single" w:color="BFBFBF" w:sz="4"/>
+              <w:bottom w:val="single" w:color="BFBFBF" w:sz="4"/>
+              <w:right w:val="single" w:color="BFBFBF" w:sz="4"/>
+            </w:tcBorders>
+            <w:tcMar>
+              <w:top w:type="dxa" w:w="60"/>
+              <w:left w:type="dxa" w:w="100"/>
+              <w:bottom w:type="dxa" w:w="60"/>
+              <w:right w:type="dxa" w:w="100"/>
+            </w:tcMar>
+          </w:tcPr>
+          <w:p>
+            <w:r>
+              <w:rPr>
+                <w:sz w:val="20"/>
+                <w:szCs w:val="20"/>
+              </w:rPr>
+              <w:t xml:space="preserve">Comentário da revisão, motivo da confiança e dados de custo e de métricas</w:t>
+            </w:r>
+          </w:p>
+        </w:tc>
+      </w:tr>
+    </w:tbl>
+    <w:p>
+      <w:pPr>
+        <w:spacing w:after="120"/>
+      </w:pPr>
+    </w:p>
+    <w:p>
+      <w:pPr>
+        <w:pStyle w:val="Heading3"/>
+      </w:pPr>
+      <w:r>
+        <w:t xml:space="preserve">Proteções</w:t>
+      </w:r>
+    </w:p>
+    <w:p>
+      <w:pPr>
+        <w:pStyle w:val="ListParagraph"/>
+        <w:numPr>
+          <w:ilvl w:val="0"/>
+          <w:numId w:val="5"/>
+        </w:numPr>
+        <w:spacing w:after="80" w:line="290"/>
+      </w:pPr>
+      <w:r>
+        <w:rPr>
+          <w:b/>
+          <w:bCs/>
+        </w:rPr>
+        <w:t xml:space="preserve">Tentativas de adivinhar códigos:</w:t>
+      </w:r>
+      <w:r>
+        <w:t xml:space="preserve"> consultas com código inexistente são contadas por endereço de rede; depois de 30 em 10 minutos, novas consultas daquela rede são recusadas até a janela passar. O limite é folgado porque uma turma inteira costuma usar a mesma rede da escola. Com mais de 850 bilhões de códigos possíveis, 30 tentativas a cada 10 minutos não chegam perto de encontrar um código válido.</w:t>
+      </w:r>
+    </w:p>
+    <w:p>
+      <w:pPr>
+        <w:pStyle w:val="ListParagraph"/>
+        <w:numPr>
+          <w:ilvl w:val="0"/>
+          <w:numId w:val="5"/>
+        </w:numPr>
+        <w:spacing w:after="80" w:line="290"/>
+      </w:pPr>
+      <w:r>
+        <w:rPr>
+          <w:b/>
+          <w:bCs/>
+        </w:rPr>
+        <w:t xml:space="preserve">Cabeçalhos da resposta:</w:t>
+      </w:r>
+      <w:r>
+        <w:t xml:space="preserve"> a página não é guardada pelo navegador nem por intermediários (</w:t>
+      </w:r>
+      <w:r>
+        <w:rPr>
+          <w:rFonts w:ascii="Consolas" w:cs="Consolas" w:eastAsia="Consolas" w:hAnsi="Consolas"/>
+          <w:sz w:val="20"/>
+          <w:szCs w:val="20"/>
+        </w:rPr>
+        <w:t xml:space="preserve">Cache-Control: no-store</w:t>
+      </w:r>
+      <w:r>
+        <w:t xml:space="preserve">), não é indexada por buscadores (</w:t>
+      </w:r>
+      <w:r>
+        <w:rPr>
+          <w:rFonts w:ascii="Consolas" w:cs="Consolas" w:eastAsia="Consolas" w:hAnsi="Consolas"/>
+          <w:sz w:val="20"/>
+          <w:szCs w:val="20"/>
+        </w:rPr>
+        <w:t xml:space="preserve">noindex</w:t>
+      </w:r>
+      <w:r>
+        <w:t xml:space="preserve">) e não envia o endereço com o código para outros sites (</w:t>
+      </w:r>
+      <w:r>
+        <w:rPr>
+          <w:rFonts w:ascii="Consolas" w:cs="Consolas" w:eastAsia="Consolas" w:hAnsi="Consolas"/>
+          <w:sz w:val="20"/>
+          <w:szCs w:val="20"/>
+        </w:rPr>
+        <w:t xml:space="preserve">Referrer-Policy: no-referrer</w:t>
+      </w:r>
+      <w:r>
+        <w:t xml:space="preserve">).</w:t>
+      </w:r>
+    </w:p>
+    <w:p>
+      <w:pPr>
+        <w:pStyle w:val="ListParagraph"/>
+        <w:numPr>
+          <w:ilvl w:val="0"/>
+          <w:numId w:val="5"/>
+        </w:numPr>
+        <w:spacing w:after="80" w:line="290"/>
+      </w:pPr>
+      <w:r>
+        <w:rPr>
+          <w:b/>
+          <w:bCs/>
+        </w:rPr>
+        <w:t xml:space="preserve">Página separada:</w:t>
+      </w:r>
+      <w:r>
+        <w:t xml:space="preserve"> a página do aluno não tem a barra de navegação do professor nem links para o resto do sistema.</w:t>
       </w:r>
     </w:p>
     <w:p>
@@ -36956,7 +37773,7 @@
         <w:t xml:space="preserve">pytest</w:t>
       </w:r>
       <w:r>
-        <w:t xml:space="preserve"> e não acessam a internet nem gastam crédito: a API da OpenAI e a API do ENEM são substituídas por versões falsas que devolvem respostas controladas. Total nesta versão: 213 testes. Os testes de páginas entram com uma conta de administrador criada no banco de teste, e o custo do scrypt é reduzido só nos testes, para que rodem em poucos segundos.</w:t>
+        <w:t xml:space="preserve"> e não acessam a internet nem gastam crédito: a API da OpenAI e a API do ENEM são substituídas por versões falsas que devolvem respostas controladas. Total nesta versão: 219 testes. Os testes de páginas entram com uma conta de administrador criada no banco de teste, e o custo do scrypt é reduzido só nos testes, para que rodem em poucos segundos.</w:t>
       </w:r>
     </w:p>
     <w:tbl>
@@ -37761,6 +38578,64 @@
                 <w:sz w:val="20"/>
                 <w:szCs w:val="20"/>
               </w:rPr>
+              <w:t xml:space="preserve">tests/test_aluno.py</w:t>
+            </w:r>
+          </w:p>
+        </w:tc>
+        <w:tc>
+          <w:tcPr>
+            <w:tcW w:type="dxa" w:w="6350"/>
+            <w:tcBorders>
+              <w:top w:val="single" w:color="BFBFBF" w:sz="4"/>
+              <w:left w:val="single" w:color="BFBFBF" w:sz="4"/>
+              <w:bottom w:val="single" w:color="BFBFBF" w:sz="4"/>
+              <w:right w:val="single" w:color="BFBFBF" w:sz="4"/>
+            </w:tcBorders>
+            <w:tcMar>
+              <w:top w:type="dxa" w:w="60"/>
+              <w:left w:type="dxa" w:w="100"/>
+              <w:bottom w:type="dxa" w:w="60"/>
+              <w:right w:type="dxa" w:w="100"/>
+            </w:tcMar>
+          </w:tcPr>
+          <w:p>
+            <w:r>
+              <w:rPr>
+                <w:sz w:val="20"/>
+                <w:szCs w:val="20"/>
+              </w:rPr>
+              <w:t xml:space="preserve">Resultado liberado com explicação da objetiva e feedback da discursiva, sem nada do que é do professor, e sem cache; código digitado com minúsculas e espaços; aviso antes da liberação e para folha incompleta; código inexistente e bloqueio após muitas tentativas; formulário sem indexação; QR code com link no canhoto</w:t>
+            </w:r>
+          </w:p>
+        </w:tc>
+      </w:tr>
+      <w:tr>
+        <w:trPr>
+          <w:cantSplit/>
+        </w:trPr>
+        <w:tc>
+          <w:tcPr>
+            <w:tcW w:type="dxa" w:w="2721"/>
+            <w:tcBorders>
+              <w:top w:val="single" w:color="BFBFBF" w:sz="4"/>
+              <w:left w:val="single" w:color="BFBFBF" w:sz="4"/>
+              <w:bottom w:val="single" w:color="BFBFBF" w:sz="4"/>
+              <w:right w:val="single" w:color="BFBFBF" w:sz="4"/>
+            </w:tcBorders>
+            <w:tcMar>
+              <w:top w:type="dxa" w:w="60"/>
+              <w:left w:type="dxa" w:w="100"/>
+              <w:bottom w:type="dxa" w:w="60"/>
+              <w:right w:type="dxa" w:w="100"/>
+            </w:tcMar>
+          </w:tcPr>
+          <w:p>
+            <w:r>
+              <w:rPr>
+                <w:rFonts w:ascii="Consolas" w:cs="Consolas" w:eastAsia="Consolas" w:hAnsi="Consolas"/>
+                <w:sz w:val="20"/>
+                <w:szCs w:val="20"/>
+              </w:rPr>
               <w:t xml:space="preserve">tests/test_lista_questoes.py</w:t>
             </w:r>
           </w:p>
@@ -40606,6 +41481,120 @@
                 <w:sz w:val="20"/>
                 <w:szCs w:val="20"/>
               </w:rPr>
+              <w:t xml:space="preserve">Consulta do aluno sem login, pelo código da folha</w:t>
+            </w:r>
+          </w:p>
+        </w:tc>
+        <w:tc>
+          <w:tcPr>
+            <w:tcW w:type="dxa" w:w="5443"/>
+            <w:tcBorders>
+              <w:top w:val="single" w:color="BFBFBF" w:sz="4"/>
+              <w:left w:val="single" w:color="BFBFBF" w:sz="4"/>
+              <w:bottom w:val="single" w:color="BFBFBF" w:sz="4"/>
+              <w:right w:val="single" w:color="BFBFBF" w:sz="4"/>
+            </w:tcBorders>
+            <w:tcMar>
+              <w:top w:type="dxa" w:w="60"/>
+              <w:left w:type="dxa" w:w="100"/>
+              <w:bottom w:type="dxa" w:w="60"/>
+              <w:right w:type="dxa" w:w="100"/>
+            </w:tcMar>
+          </w:tcPr>
+          <w:p>
+            <w:r>
+              <w:rPr>
+                <w:sz w:val="20"/>
+                <w:szCs w:val="20"/>
+              </w:rPr>
+              <w:t xml:space="preserve">Evita criar e administrar contas de alunos e guardar dados pessoais; o código já é um segredo que só o aluno tem</w:t>
+            </w:r>
+          </w:p>
+        </w:tc>
+      </w:tr>
+      <w:tr>
+        <w:trPr>
+          <w:cantSplit/>
+        </w:trPr>
+        <w:tc>
+          <w:tcPr>
+            <w:tcW w:type="dxa" w:w="3628"/>
+            <w:tcBorders>
+              <w:top w:val="single" w:color="BFBFBF" w:sz="4"/>
+              <w:left w:val="single" w:color="BFBFBF" w:sz="4"/>
+              <w:bottom w:val="single" w:color="BFBFBF" w:sz="4"/>
+              <w:right w:val="single" w:color="BFBFBF" w:sz="4"/>
+            </w:tcBorders>
+            <w:tcMar>
+              <w:top w:type="dxa" w:w="60"/>
+              <w:left w:type="dxa" w:w="100"/>
+              <w:bottom w:type="dxa" w:w="60"/>
+              <w:right w:type="dxa" w:w="100"/>
+            </w:tcMar>
+          </w:tcPr>
+          <w:p>
+            <w:r>
+              <w:rPr>
+                <w:sz w:val="20"/>
+                <w:szCs w:val="20"/>
+              </w:rPr>
+              <w:t xml:space="preserve">Link de consulta por QR code no canhoto</w:t>
+            </w:r>
+          </w:p>
+        </w:tc>
+        <w:tc>
+          <w:tcPr>
+            <w:tcW w:type="dxa" w:w="5443"/>
+            <w:tcBorders>
+              <w:top w:val="single" w:color="BFBFBF" w:sz="4"/>
+              <w:left w:val="single" w:color="BFBFBF" w:sz="4"/>
+              <w:bottom w:val="single" w:color="BFBFBF" w:sz="4"/>
+              <w:right w:val="single" w:color="BFBFBF" w:sz="4"/>
+            </w:tcBorders>
+            <w:tcMar>
+              <w:top w:type="dxa" w:w="60"/>
+              <w:left w:type="dxa" w:w="100"/>
+              <w:bottom w:type="dxa" w:w="60"/>
+              <w:right w:type="dxa" w:w="100"/>
+            </w:tcMar>
+          </w:tcPr>
+          <w:p>
+            <w:r>
+              <w:rPr>
+                <w:sz w:val="20"/>
+                <w:szCs w:val="20"/>
+              </w:rPr>
+              <w:t xml:space="preserve">O aluno abre o resultado no celular sem digitar o código; o canhoto fica com o aluno e não é digitalizado</w:t>
+            </w:r>
+          </w:p>
+        </w:tc>
+      </w:tr>
+      <w:tr>
+        <w:trPr>
+          <w:cantSplit/>
+        </w:trPr>
+        <w:tc>
+          <w:tcPr>
+            <w:tcW w:type="dxa" w:w="3628"/>
+            <w:tcBorders>
+              <w:top w:val="single" w:color="BFBFBF" w:sz="4"/>
+              <w:left w:val="single" w:color="BFBFBF" w:sz="4"/>
+              <w:bottom w:val="single" w:color="BFBFBF" w:sz="4"/>
+              <w:right w:val="single" w:color="BFBFBF" w:sz="4"/>
+            </w:tcBorders>
+            <w:tcMar>
+              <w:top w:type="dxa" w:w="60"/>
+              <w:left w:type="dxa" w:w="100"/>
+              <w:bottom w:type="dxa" w:w="60"/>
+              <w:right w:type="dxa" w:w="100"/>
+            </w:tcMar>
+          </w:tcPr>
+          <w:p>
+            <w:r>
+              <w:rPr>
+                <w:sz w:val="20"/>
+                <w:szCs w:val="20"/>
+              </w:rPr>
               <w:t xml:space="preserve">Questões travadas enquanto houver folhas</w:t>
             </w:r>
           </w:p>
@@ -41093,6 +42082,46 @@
       </w:r>
       <w:r>
         <w:t xml:space="preserve">); como usam sempre a condição com resposta esperada quando disponível, não devem entrar na comparação entre condições.</w:t>
+      </w:r>
+    </w:p>
+    <w:p>
+      <w:pPr>
+        <w:pStyle w:val="ListParagraph"/>
+        <w:numPr>
+          <w:ilvl w:val="0"/>
+          <w:numId w:val="5"/>
+        </w:numPr>
+        <w:spacing w:after="80" w:line="290"/>
+      </w:pPr>
+      <w:r>
+        <w:rPr>
+          <w:b/>
+          <w:bCs/>
+        </w:rPr>
+        <w:t xml:space="preserve">Quem tem o canhoto vê o resultado:</w:t>
+      </w:r>
+      <w:r>
+        <w:t xml:space="preserve"> como não há login, um canhoto perdido ou fotografado por outra pessoa dá acesso ao resultado daquela folha. Como o resultado não tem nome, o dano é limitado; o professor deve orientar os alunos a guardar o canhoto.</w:t>
+      </w:r>
+    </w:p>
+    <w:p>
+      <w:pPr>
+        <w:pStyle w:val="ListParagraph"/>
+        <w:numPr>
+          <w:ilvl w:val="0"/>
+          <w:numId w:val="5"/>
+        </w:numPr>
+        <w:spacing w:after="80" w:line="290"/>
+      </w:pPr>
+      <w:r>
+        <w:rPr>
+          <w:b/>
+          <w:bCs/>
+        </w:rPr>
+        <w:t xml:space="preserve">Bloqueio de consultas em memória:</w:t>
+      </w:r>
+      <w:r>
+        <w:t xml:space="preserve"> a contagem de códigos inexistentes recomeça quando o servidor reinicia, como o bloqueio de senhas.</w:t>
       </w:r>
     </w:p>
     <w:p>
@@ -44087,6 +45116,115 @@
                 <w:szCs w:val="20"/>
               </w:rPr>
               <w:t xml:space="preserve">Mudança</w:t>
+            </w:r>
+          </w:p>
+        </w:tc>
+      </w:tr>
+      <w:tr>
+        <w:trPr>
+          <w:cantSplit/>
+        </w:trPr>
+        <w:tc>
+          <w:tcPr>
+            <w:tcW w:type="dxa" w:w="1511"/>
+            <w:tcBorders>
+              <w:top w:val="single" w:color="BFBFBF" w:sz="4"/>
+              <w:left w:val="single" w:color="BFBFBF" w:sz="4"/>
+              <w:bottom w:val="single" w:color="BFBFBF" w:sz="4"/>
+              <w:right w:val="single" w:color="BFBFBF" w:sz="4"/>
+            </w:tcBorders>
+            <w:tcMar>
+              <w:top w:type="dxa" w:w="60"/>
+              <w:left w:type="dxa" w:w="100"/>
+              <w:bottom w:type="dxa" w:w="60"/>
+              <w:right w:type="dxa" w:w="100"/>
+            </w:tcMar>
+          </w:tcPr>
+          <w:p>
+            <w:r>
+              <w:rPr>
+                <w:sz w:val="20"/>
+                <w:szCs w:val="20"/>
+              </w:rPr>
+              <w:t xml:space="preserve">31/10/2026</w:t>
+            </w:r>
+          </w:p>
+        </w:tc>
+        <w:tc>
+          <w:tcPr>
+            <w:tcW w:type="dxa" w:w="1209"/>
+            <w:tcBorders>
+              <w:top w:val="single" w:color="BFBFBF" w:sz="4"/>
+              <w:left w:val="single" w:color="BFBFBF" w:sz="4"/>
+              <w:bottom w:val="single" w:color="BFBFBF" w:sz="4"/>
+              <w:right w:val="single" w:color="BFBFBF" w:sz="4"/>
+            </w:tcBorders>
+            <w:tcMar>
+              <w:top w:type="dxa" w:w="60"/>
+              <w:left w:type="dxa" w:w="100"/>
+              <w:bottom w:type="dxa" w:w="60"/>
+              <w:right w:type="dxa" w:w="100"/>
+            </w:tcMar>
+          </w:tcPr>
+          <w:p>
+            <w:r>
+              <w:rPr>
+                <w:sz w:val="20"/>
+                <w:szCs w:val="20"/>
+              </w:rPr>
+              <w:t xml:space="preserve">0.16</w:t>
+            </w:r>
+          </w:p>
+        </w:tc>
+        <w:tc>
+          <w:tcPr>
+            <w:tcW w:type="dxa" w:w="2267"/>
+            <w:tcBorders>
+              <w:top w:val="single" w:color="BFBFBF" w:sz="4"/>
+              <w:left w:val="single" w:color="BFBFBF" w:sz="4"/>
+              <w:bottom w:val="single" w:color="BFBFBF" w:sz="4"/>
+              <w:right w:val="single" w:color="BFBFBF" w:sz="4"/>
+            </w:tcBorders>
+            <w:tcMar>
+              <w:top w:type="dxa" w:w="60"/>
+              <w:left w:type="dxa" w:w="100"/>
+              <w:bottom w:type="dxa" w:w="60"/>
+              <w:right w:type="dxa" w:w="100"/>
+            </w:tcMar>
+          </w:tcPr>
+          <w:p>
+            <w:r>
+              <w:rPr>
+                <w:sz w:val="20"/>
+                <w:szCs w:val="20"/>
+              </w:rPr>
+              <w:t xml:space="preserve">pull request da página do aluno</w:t>
+            </w:r>
+          </w:p>
+        </w:tc>
+        <w:tc>
+          <w:tcPr>
+            <w:tcW w:type="dxa" w:w="4084"/>
+            <w:tcBorders>
+              <w:top w:val="single" w:color="BFBFBF" w:sz="4"/>
+              <w:left w:val="single" w:color="BFBFBF" w:sz="4"/>
+              <w:bottom w:val="single" w:color="BFBFBF" w:sz="4"/>
+              <w:right w:val="single" w:color="BFBFBF" w:sz="4"/>
+            </w:tcBorders>
+            <w:tcMar>
+              <w:top w:type="dxa" w:w="60"/>
+              <w:left w:type="dxa" w:w="100"/>
+              <w:bottom w:type="dxa" w:w="60"/>
+              <w:right w:type="dxa" w:w="100"/>
+            </w:tcMar>
+          </w:tcPr>
+          <w:p>
+            <w:r>
+              <w:rPr>
+                <w:sz w:val="20"/>
+                <w:szCs w:val="20"/>
+              </w:rPr>
+              <w:t xml:space="preserve">Página pública em que o aluno consulta o próprio resultado pelo código da folha, só depois da liberação e com a folha concluída; QR code com link no canhoto; limite de consultas com código inexistente</w:t>
             </w:r>
           </w:p>
         </w:tc>
@@ -46104,7 +47242,7 @@
         <w:sz w:val="18"/>
         <w:szCs w:val="18"/>
       </w:rPr>
-      <w:t xml:space="preserve">Documentação Técnica do Protótipo, versão 0.15</w:t>
+      <w:t xml:space="preserve">Documentação Técnica do Protótipo, versão 0.16</w:t>
     </w:r>
   </w:p>
 </w:hdr>

</xml_diff>

<commit_message>
Documentação 0.17: folhas digitalizadas
Co-Authored-By: Claude Opus 5.5 <noreply@anthropic.com>
Claude-Session: https://claude.ai/code/session_01W2sxSqc4ZdmAUWH2L8vsV2
</commit_message>
<xml_diff>
--- a/docs/Documentacao_Tecnica.docx
+++ b/docs/Documentacao_Tecnica.docx
@@ -114,7 +114,7 @@
         <w:t xml:space="preserve">Versão: </w:t>
       </w:r>
       <w:r>
-        <w:t xml:space="preserve">0.16, de 31/10/2026</w:t>
+        <w:t xml:space="preserve">0.17, de 31/10/2026</w:t>
       </w:r>
     </w:p>
     <w:p>
@@ -1798,6 +1798,89 @@
                 <w:sz w:val="20"/>
                 <w:szCs w:val="20"/>
               </w:rPr>
+              <w:t xml:space="preserve">Apoio</w:t>
+            </w:r>
+          </w:p>
+        </w:tc>
+        <w:tc>
+          <w:tcPr>
+            <w:tcW w:type="dxa" w:w="4535"/>
+            <w:tcBorders>
+              <w:top w:val="single" w:color="BFBFBF" w:sz="4"/>
+              <w:left w:val="single" w:color="BFBFBF" w:sz="4"/>
+              <w:bottom w:val="single" w:color="BFBFBF" w:sz="4"/>
+              <w:right w:val="single" w:color="BFBFBF" w:sz="4"/>
+            </w:tcBorders>
+            <w:tcMar>
+              <w:top w:type="dxa" w:w="60"/>
+              <w:left w:type="dxa" w:w="100"/>
+              <w:bottom w:type="dxa" w:w="60"/>
+              <w:right w:type="dxa" w:w="100"/>
+            </w:tcMar>
+          </w:tcPr>
+          <w:p>
+            <w:r>
+              <w:rPr>
+                <w:sz w:val="20"/>
+                <w:szCs w:val="20"/>
+              </w:rPr>
+              <w:t xml:space="preserve">Envio das folhas digitalizadas e identificação pelo QR code</w:t>
+            </w:r>
+          </w:p>
+        </w:tc>
+        <w:tc>
+          <w:tcPr>
+            <w:tcW w:type="dxa" w:w="3629"/>
+            <w:tcBorders>
+              <w:top w:val="single" w:color="BFBFBF" w:sz="4"/>
+              <w:left w:val="single" w:color="BFBFBF" w:sz="4"/>
+              <w:bottom w:val="single" w:color="BFBFBF" w:sz="4"/>
+              <w:right w:val="single" w:color="BFBFBF" w:sz="4"/>
+            </w:tcBorders>
+            <w:tcMar>
+              <w:top w:type="dxa" w:w="60"/>
+              <w:left w:type="dxa" w:w="100"/>
+              <w:bottom w:type="dxa" w:w="60"/>
+              <w:right w:type="dxa" w:w="100"/>
+            </w:tcMar>
+          </w:tcPr>
+          <w:p>
+            <w:r>
+              <w:rPr>
+                <w:sz w:val="20"/>
+                <w:szCs w:val="20"/>
+              </w:rPr>
+              <w:t xml:space="preserve">Implementado em 31/10/2026; aguardando revisão</w:t>
+            </w:r>
+          </w:p>
+        </w:tc>
+      </w:tr>
+      <w:tr>
+        <w:trPr>
+          <w:cantSplit/>
+        </w:trPr>
+        <w:tc>
+          <w:tcPr>
+            <w:tcW w:type="dxa" w:w="907"/>
+            <w:tcBorders>
+              <w:top w:val="single" w:color="BFBFBF" w:sz="4"/>
+              <w:left w:val="single" w:color="BFBFBF" w:sz="4"/>
+              <w:bottom w:val="single" w:color="BFBFBF" w:sz="4"/>
+              <w:right w:val="single" w:color="BFBFBF" w:sz="4"/>
+            </w:tcBorders>
+            <w:tcMar>
+              <w:top w:type="dxa" w:w="60"/>
+              <w:left w:type="dxa" w:w="100"/>
+              <w:bottom w:type="dxa" w:w="60"/>
+              <w:right w:type="dxa" w:w="100"/>
+            </w:tcMar>
+          </w:tcPr>
+          <w:p>
+            <w:r>
+              <w:rPr>
+                <w:sz w:val="20"/>
+                <w:szCs w:val="20"/>
+              </w:rPr>
               <w:t xml:space="preserve">5</w:t>
             </w:r>
           </w:p>
@@ -3624,7 +3707,7 @@
                 <w:sz w:val="20"/>
                 <w:szCs w:val="20"/>
               </w:rPr>
-              <w:t xml:space="preserve">Definição das quatorze tabelas do banco</w:t>
+              <w:t xml:space="preserve">Definição das quinze tabelas do banco</w:t>
             </w:r>
           </w:p>
         </w:tc>
@@ -4110,6 +4193,94 @@
                 <w:szCs w:val="20"/>
               </w:rPr>
               <w:t xml:space="preserve">Atividades: montagem de conjuntos de questões, caderno de questões em A4 e rotas das folhas de resposta (</w:t>
+            </w:r>
+            <w:r>
+              <w:rPr>
+                <w:rFonts w:ascii="Consolas" w:cs="Consolas" w:eastAsia="Consolas" w:hAnsi="Consolas"/>
+                <w:sz w:val="20"/>
+                <w:szCs w:val="20"/>
+              </w:rPr>
+              <w:t xml:space="preserve">router.py</w:t>
+            </w:r>
+            <w:r>
+              <w:rPr>
+                <w:sz w:val="20"/>
+                <w:szCs w:val="20"/>
+              </w:rPr>
+              <w:t xml:space="preserve">)</w:t>
+            </w:r>
+          </w:p>
+        </w:tc>
+      </w:tr>
+      <w:tr>
+        <w:trPr>
+          <w:cantSplit/>
+        </w:trPr>
+        <w:tc>
+          <w:tcPr>
+            <w:tcW w:type="dxa" w:w="2721"/>
+            <w:tcBorders>
+              <w:top w:val="single" w:color="BFBFBF" w:sz="4"/>
+              <w:left w:val="single" w:color="BFBFBF" w:sz="4"/>
+              <w:bottom w:val="single" w:color="BFBFBF" w:sz="4"/>
+              <w:right w:val="single" w:color="BFBFBF" w:sz="4"/>
+            </w:tcBorders>
+            <w:tcMar>
+              <w:top w:type="dxa" w:w="60"/>
+              <w:left w:type="dxa" w:w="100"/>
+              <w:bottom w:type="dxa" w:w="60"/>
+              <w:right w:type="dxa" w:w="100"/>
+            </w:tcMar>
+          </w:tcPr>
+          <w:p>
+            <w:r>
+              <w:rPr>
+                <w:rFonts w:ascii="Consolas" w:cs="Consolas" w:eastAsia="Consolas" w:hAnsi="Consolas"/>
+                <w:sz w:val="20"/>
+                <w:szCs w:val="20"/>
+              </w:rPr>
+              <w:t xml:space="preserve">app/digitalizacao/</w:t>
+            </w:r>
+          </w:p>
+        </w:tc>
+        <w:tc>
+          <w:tcPr>
+            <w:tcW w:type="dxa" w:w="6350"/>
+            <w:tcBorders>
+              <w:top w:val="single" w:color="BFBFBF" w:sz="4"/>
+              <w:left w:val="single" w:color="BFBFBF" w:sz="4"/>
+              <w:bottom w:val="single" w:color="BFBFBF" w:sz="4"/>
+              <w:right w:val="single" w:color="BFBFBF" w:sz="4"/>
+            </w:tcBorders>
+            <w:tcMar>
+              <w:top w:type="dxa" w:w="60"/>
+              <w:left w:type="dxa" w:w="100"/>
+              <w:bottom w:type="dxa" w:w="60"/>
+              <w:right w:type="dxa" w:w="100"/>
+            </w:tcMar>
+          </w:tcPr>
+          <w:p>
+            <w:r>
+              <w:rPr>
+                <w:sz w:val="20"/>
+                <w:szCs w:val="20"/>
+              </w:rPr>
+              <w:t xml:space="preserve">Folhas digitalizadas: conversão de PDF e fotos em imagens, leitura do QR code, armazenamento e conferência (</w:t>
+            </w:r>
+            <w:r>
+              <w:rPr>
+                <w:rFonts w:ascii="Consolas" w:cs="Consolas" w:eastAsia="Consolas" w:hAnsi="Consolas"/>
+                <w:sz w:val="20"/>
+                <w:szCs w:val="20"/>
+              </w:rPr>
+              <w:t xml:space="preserve">servico.py</w:t>
+            </w:r>
+            <w:r>
+              <w:rPr>
+                <w:sz w:val="20"/>
+                <w:szCs w:val="20"/>
+              </w:rPr>
+              <w:t xml:space="preserve"> e </w:t>
             </w:r>
             <w:r>
               <w:rPr>
@@ -5125,7 +5296,7 @@
         <w:spacing w:after="120" w:line="300"/>
       </w:pPr>
       <w:r>
-        <w:t xml:space="preserve">O banco tem quatorze tabelas. As oito primeiras foram criadas pela migração inicial do Alembic, a tabela </w:t>
+        <w:t xml:space="preserve">O banco tem quinze tabelas. As oito primeiras foram criadas pela migração inicial do Alembic, a tabela </w:t>
       </w:r>
       <w:r>
         <w:rPr>
@@ -5180,7 +5351,7 @@
         <w:t xml:space="preserve">atividade_questao</w:t>
       </w:r>
       <w:r>
-        <w:t xml:space="preserve"> pela migração das atividades, e a tabela </w:t>
+        <w:t xml:space="preserve"> pela migração das atividades, a tabela </w:t>
       </w:r>
       <w:r>
         <w:rPr>
@@ -5191,7 +5362,18 @@
         <w:t xml:space="preserve">folha</w:t>
       </w:r>
       <w:r>
-        <w:t xml:space="preserve"> pela migração das folhas de resposta. Duas delas existem por razão metodológica e não devem ser simplificadas: </w:t>
+        <w:t xml:space="preserve"> pela migração das folhas de resposta, e a tabela </w:t>
+      </w:r>
+      <w:r>
+        <w:rPr>
+          <w:rFonts w:ascii="Consolas" w:cs="Consolas" w:eastAsia="Consolas" w:hAnsi="Consolas"/>
+          <w:sz w:val="20"/>
+          <w:szCs w:val="20"/>
+        </w:rPr>
+        <w:t xml:space="preserve">pagina_digitalizada</w:t>
+      </w:r>
+      <w:r>
+        <w:t xml:space="preserve"> pela migração das digitalizações. Duas delas existem por razão metodológica e não devem ser simplificadas: </w:t>
       </w:r>
       <w:r>
         <w:rPr>
@@ -11475,6 +11657,1022 @@
                 <w:szCs w:val="20"/>
               </w:rPr>
               <w:t xml:space="preserve">Momento da geração</w:t>
+            </w:r>
+          </w:p>
+        </w:tc>
+      </w:tr>
+    </w:tbl>
+    <w:p>
+      <w:pPr>
+        <w:spacing w:after="120"/>
+      </w:pPr>
+    </w:p>
+    <w:p>
+      <w:pPr>
+        <w:pStyle w:val="Heading3"/>
+      </w:pPr>
+      <w:r>
+        <w:t xml:space="preserve">pagina_digitalizada</w:t>
+      </w:r>
+    </w:p>
+    <w:tbl>
+      <w:tblPr>
+        <w:tblW w:type="dxa" w:w="9071"/>
+        <w:tblBorders>
+          <w:top w:val="single" w:color="auto" w:sz="4"/>
+          <w:left w:val="single" w:color="auto" w:sz="4"/>
+          <w:bottom w:val="single" w:color="auto" w:sz="4"/>
+          <w:right w:val="single" w:color="auto" w:sz="4"/>
+          <w:insideH w:val="single" w:color="auto" w:sz="4"/>
+          <w:insideV w:val="single" w:color="auto" w:sz="4"/>
+        </w:tblBorders>
+      </w:tblPr>
+      <w:tblGrid>
+        <w:gridCol w:w="2473"/>
+        <w:gridCol w:w="1649"/>
+        <w:gridCol w:w="4949"/>
+      </w:tblGrid>
+      <w:tr>
+        <w:trPr>
+          <w:tblHeader/>
+        </w:trPr>
+        <w:tc>
+          <w:tcPr>
+            <w:tcW w:type="dxa" w:w="2473"/>
+            <w:tcBorders>
+              <w:top w:val="single" w:color="BFBFBF" w:sz="4"/>
+              <w:left w:val="single" w:color="BFBFBF" w:sz="4"/>
+              <w:bottom w:val="single" w:color="BFBFBF" w:sz="4"/>
+              <w:right w:val="single" w:color="BFBFBF" w:sz="4"/>
+            </w:tcBorders>
+            <w:shd w:fill="D9E2F3" w:color="auto" w:val="clear"/>
+            <w:tcMar>
+              <w:top w:type="dxa" w:w="60"/>
+              <w:left w:type="dxa" w:w="100"/>
+              <w:bottom w:type="dxa" w:w="60"/>
+              <w:right w:type="dxa" w:w="100"/>
+            </w:tcMar>
+          </w:tcPr>
+          <w:p>
+            <w:r>
+              <w:rPr>
+                <w:b/>
+                <w:bCs/>
+                <w:sz w:val="20"/>
+                <w:szCs w:val="20"/>
+              </w:rPr>
+              <w:t xml:space="preserve">Campo</w:t>
+            </w:r>
+          </w:p>
+        </w:tc>
+        <w:tc>
+          <w:tcPr>
+            <w:tcW w:type="dxa" w:w="1649"/>
+            <w:tcBorders>
+              <w:top w:val="single" w:color="BFBFBF" w:sz="4"/>
+              <w:left w:val="single" w:color="BFBFBF" w:sz="4"/>
+              <w:bottom w:val="single" w:color="BFBFBF" w:sz="4"/>
+              <w:right w:val="single" w:color="BFBFBF" w:sz="4"/>
+            </w:tcBorders>
+            <w:shd w:fill="D9E2F3" w:color="auto" w:val="clear"/>
+            <w:tcMar>
+              <w:top w:type="dxa" w:w="60"/>
+              <w:left w:type="dxa" w:w="100"/>
+              <w:bottom w:type="dxa" w:w="60"/>
+              <w:right w:type="dxa" w:w="100"/>
+            </w:tcMar>
+          </w:tcPr>
+          <w:p>
+            <w:r>
+              <w:rPr>
+                <w:b/>
+                <w:bCs/>
+                <w:sz w:val="20"/>
+                <w:szCs w:val="20"/>
+              </w:rPr>
+              <w:t xml:space="preserve">Tipo</w:t>
+            </w:r>
+          </w:p>
+        </w:tc>
+        <w:tc>
+          <w:tcPr>
+            <w:tcW w:type="dxa" w:w="4949"/>
+            <w:tcBorders>
+              <w:top w:val="single" w:color="BFBFBF" w:sz="4"/>
+              <w:left w:val="single" w:color="BFBFBF" w:sz="4"/>
+              <w:bottom w:val="single" w:color="BFBFBF" w:sz="4"/>
+              <w:right w:val="single" w:color="BFBFBF" w:sz="4"/>
+            </w:tcBorders>
+            <w:shd w:fill="D9E2F3" w:color="auto" w:val="clear"/>
+            <w:tcMar>
+              <w:top w:type="dxa" w:w="60"/>
+              <w:left w:type="dxa" w:w="100"/>
+              <w:bottom w:type="dxa" w:w="60"/>
+              <w:right w:type="dxa" w:w="100"/>
+            </w:tcMar>
+          </w:tcPr>
+          <w:p>
+            <w:r>
+              <w:rPr>
+                <w:b/>
+                <w:bCs/>
+                <w:sz w:val="20"/>
+                <w:szCs w:val="20"/>
+              </w:rPr>
+              <w:t xml:space="preserve">Descrição</w:t>
+            </w:r>
+          </w:p>
+        </w:tc>
+      </w:tr>
+      <w:tr>
+        <w:trPr>
+          <w:cantSplit/>
+        </w:trPr>
+        <w:tc>
+          <w:tcPr>
+            <w:tcW w:type="dxa" w:w="2473"/>
+            <w:tcBorders>
+              <w:top w:val="single" w:color="BFBFBF" w:sz="4"/>
+              <w:left w:val="single" w:color="BFBFBF" w:sz="4"/>
+              <w:bottom w:val="single" w:color="BFBFBF" w:sz="4"/>
+              <w:right w:val="single" w:color="BFBFBF" w:sz="4"/>
+            </w:tcBorders>
+            <w:tcMar>
+              <w:top w:type="dxa" w:w="60"/>
+              <w:left w:type="dxa" w:w="100"/>
+              <w:bottom w:type="dxa" w:w="60"/>
+              <w:right w:type="dxa" w:w="100"/>
+            </w:tcMar>
+          </w:tcPr>
+          <w:p>
+            <w:r>
+              <w:rPr>
+                <w:rFonts w:ascii="Consolas" w:cs="Consolas" w:eastAsia="Consolas" w:hAnsi="Consolas"/>
+                <w:sz w:val="20"/>
+                <w:szCs w:val="20"/>
+              </w:rPr>
+              <w:t xml:space="preserve">id</w:t>
+            </w:r>
+          </w:p>
+        </w:tc>
+        <w:tc>
+          <w:tcPr>
+            <w:tcW w:type="dxa" w:w="1649"/>
+            <w:tcBorders>
+              <w:top w:val="single" w:color="BFBFBF" w:sz="4"/>
+              <w:left w:val="single" w:color="BFBFBF" w:sz="4"/>
+              <w:bottom w:val="single" w:color="BFBFBF" w:sz="4"/>
+              <w:right w:val="single" w:color="BFBFBF" w:sz="4"/>
+            </w:tcBorders>
+            <w:tcMar>
+              <w:top w:type="dxa" w:w="60"/>
+              <w:left w:type="dxa" w:w="100"/>
+              <w:bottom w:type="dxa" w:w="60"/>
+              <w:right w:type="dxa" w:w="100"/>
+            </w:tcMar>
+          </w:tcPr>
+          <w:p>
+            <w:r>
+              <w:rPr>
+                <w:sz w:val="20"/>
+                <w:szCs w:val="20"/>
+              </w:rPr>
+              <w:t xml:space="preserve">inteiro</w:t>
+            </w:r>
+          </w:p>
+        </w:tc>
+        <w:tc>
+          <w:tcPr>
+            <w:tcW w:type="dxa" w:w="4949"/>
+            <w:tcBorders>
+              <w:top w:val="single" w:color="BFBFBF" w:sz="4"/>
+              <w:left w:val="single" w:color="BFBFBF" w:sz="4"/>
+              <w:bottom w:val="single" w:color="BFBFBF" w:sz="4"/>
+              <w:right w:val="single" w:color="BFBFBF" w:sz="4"/>
+            </w:tcBorders>
+            <w:tcMar>
+              <w:top w:type="dxa" w:w="60"/>
+              <w:left w:type="dxa" w:w="100"/>
+              <w:bottom w:type="dxa" w:w="60"/>
+              <w:right w:type="dxa" w:w="100"/>
+            </w:tcMar>
+          </w:tcPr>
+          <w:p>
+            <w:r>
+              <w:rPr>
+                <w:sz w:val="20"/>
+                <w:szCs w:val="20"/>
+              </w:rPr>
+              <w:t xml:space="preserve">Identificador</w:t>
+            </w:r>
+          </w:p>
+        </w:tc>
+      </w:tr>
+      <w:tr>
+        <w:trPr>
+          <w:cantSplit/>
+        </w:trPr>
+        <w:tc>
+          <w:tcPr>
+            <w:tcW w:type="dxa" w:w="2473"/>
+            <w:tcBorders>
+              <w:top w:val="single" w:color="BFBFBF" w:sz="4"/>
+              <w:left w:val="single" w:color="BFBFBF" w:sz="4"/>
+              <w:bottom w:val="single" w:color="BFBFBF" w:sz="4"/>
+              <w:right w:val="single" w:color="BFBFBF" w:sz="4"/>
+            </w:tcBorders>
+            <w:tcMar>
+              <w:top w:type="dxa" w:w="60"/>
+              <w:left w:type="dxa" w:w="100"/>
+              <w:bottom w:type="dxa" w:w="60"/>
+              <w:right w:type="dxa" w:w="100"/>
+            </w:tcMar>
+          </w:tcPr>
+          <w:p>
+            <w:r>
+              <w:rPr>
+                <w:rFonts w:ascii="Consolas" w:cs="Consolas" w:eastAsia="Consolas" w:hAnsi="Consolas"/>
+                <w:sz w:val="20"/>
+                <w:szCs w:val="20"/>
+              </w:rPr>
+              <w:t xml:space="preserve">atividade_id</w:t>
+            </w:r>
+          </w:p>
+        </w:tc>
+        <w:tc>
+          <w:tcPr>
+            <w:tcW w:type="dxa" w:w="1649"/>
+            <w:tcBorders>
+              <w:top w:val="single" w:color="BFBFBF" w:sz="4"/>
+              <w:left w:val="single" w:color="BFBFBF" w:sz="4"/>
+              <w:bottom w:val="single" w:color="BFBFBF" w:sz="4"/>
+              <w:right w:val="single" w:color="BFBFBF" w:sz="4"/>
+            </w:tcBorders>
+            <w:tcMar>
+              <w:top w:type="dxa" w:w="60"/>
+              <w:left w:type="dxa" w:w="100"/>
+              <w:bottom w:type="dxa" w:w="60"/>
+              <w:right w:type="dxa" w:w="100"/>
+            </w:tcMar>
+          </w:tcPr>
+          <w:p>
+            <w:r>
+              <w:rPr>
+                <w:sz w:val="20"/>
+                <w:szCs w:val="20"/>
+              </w:rPr>
+              <w:t xml:space="preserve">inteiro</w:t>
+            </w:r>
+          </w:p>
+        </w:tc>
+        <w:tc>
+          <w:tcPr>
+            <w:tcW w:type="dxa" w:w="4949"/>
+            <w:tcBorders>
+              <w:top w:val="single" w:color="BFBFBF" w:sz="4"/>
+              <w:left w:val="single" w:color="BFBFBF" w:sz="4"/>
+              <w:bottom w:val="single" w:color="BFBFBF" w:sz="4"/>
+              <w:right w:val="single" w:color="BFBFBF" w:sz="4"/>
+            </w:tcBorders>
+            <w:tcMar>
+              <w:top w:type="dxa" w:w="60"/>
+              <w:left w:type="dxa" w:w="100"/>
+              <w:bottom w:type="dxa" w:w="60"/>
+              <w:right w:type="dxa" w:w="100"/>
+            </w:tcMar>
+          </w:tcPr>
+          <w:p>
+            <w:r>
+              <w:rPr>
+                <w:sz w:val="20"/>
+                <w:szCs w:val="20"/>
+              </w:rPr>
+              <w:t xml:space="preserve">Atividade para a qual a página foi enviada</w:t>
+            </w:r>
+          </w:p>
+        </w:tc>
+      </w:tr>
+      <w:tr>
+        <w:trPr>
+          <w:cantSplit/>
+        </w:trPr>
+        <w:tc>
+          <w:tcPr>
+            <w:tcW w:type="dxa" w:w="2473"/>
+            <w:tcBorders>
+              <w:top w:val="single" w:color="BFBFBF" w:sz="4"/>
+              <w:left w:val="single" w:color="BFBFBF" w:sz="4"/>
+              <w:bottom w:val="single" w:color="BFBFBF" w:sz="4"/>
+              <w:right w:val="single" w:color="BFBFBF" w:sz="4"/>
+            </w:tcBorders>
+            <w:tcMar>
+              <w:top w:type="dxa" w:w="60"/>
+              <w:left w:type="dxa" w:w="100"/>
+              <w:bottom w:type="dxa" w:w="60"/>
+              <w:right w:type="dxa" w:w="100"/>
+            </w:tcMar>
+          </w:tcPr>
+          <w:p>
+            <w:r>
+              <w:rPr>
+                <w:rFonts w:ascii="Consolas" w:cs="Consolas" w:eastAsia="Consolas" w:hAnsi="Consolas"/>
+                <w:sz w:val="20"/>
+                <w:szCs w:val="20"/>
+              </w:rPr>
+              <w:t xml:space="preserve">folha_id</w:t>
+            </w:r>
+          </w:p>
+        </w:tc>
+        <w:tc>
+          <w:tcPr>
+            <w:tcW w:type="dxa" w:w="1649"/>
+            <w:tcBorders>
+              <w:top w:val="single" w:color="BFBFBF" w:sz="4"/>
+              <w:left w:val="single" w:color="BFBFBF" w:sz="4"/>
+              <w:bottom w:val="single" w:color="BFBFBF" w:sz="4"/>
+              <w:right w:val="single" w:color="BFBFBF" w:sz="4"/>
+            </w:tcBorders>
+            <w:tcMar>
+              <w:top w:type="dxa" w:w="60"/>
+              <w:left w:type="dxa" w:w="100"/>
+              <w:bottom w:type="dxa" w:w="60"/>
+              <w:right w:type="dxa" w:w="100"/>
+            </w:tcMar>
+          </w:tcPr>
+          <w:p>
+            <w:r>
+              <w:rPr>
+                <w:sz w:val="20"/>
+                <w:szCs w:val="20"/>
+              </w:rPr>
+              <w:t xml:space="preserve">inteiro</w:t>
+            </w:r>
+          </w:p>
+        </w:tc>
+        <w:tc>
+          <w:tcPr>
+            <w:tcW w:type="dxa" w:w="4949"/>
+            <w:tcBorders>
+              <w:top w:val="single" w:color="BFBFBF" w:sz="4"/>
+              <w:left w:val="single" w:color="BFBFBF" w:sz="4"/>
+              <w:bottom w:val="single" w:color="BFBFBF" w:sz="4"/>
+              <w:right w:val="single" w:color="BFBFBF" w:sz="4"/>
+            </w:tcBorders>
+            <w:tcMar>
+              <w:top w:type="dxa" w:w="60"/>
+              <w:left w:type="dxa" w:w="100"/>
+              <w:bottom w:type="dxa" w:w="60"/>
+              <w:right w:type="dxa" w:w="100"/>
+            </w:tcMar>
+          </w:tcPr>
+          <w:p>
+            <w:r>
+              <w:rPr>
+                <w:sz w:val="20"/>
+                <w:szCs w:val="20"/>
+              </w:rPr>
+              <w:t xml:space="preserve">Folha identificada; vazio enquanto o QR code não foi lido e o professor não indicou a folha</w:t>
+            </w:r>
+          </w:p>
+        </w:tc>
+      </w:tr>
+      <w:tr>
+        <w:trPr>
+          <w:cantSplit/>
+        </w:trPr>
+        <w:tc>
+          <w:tcPr>
+            <w:tcW w:type="dxa" w:w="2473"/>
+            <w:tcBorders>
+              <w:top w:val="single" w:color="BFBFBF" w:sz="4"/>
+              <w:left w:val="single" w:color="BFBFBF" w:sz="4"/>
+              <w:bottom w:val="single" w:color="BFBFBF" w:sz="4"/>
+              <w:right w:val="single" w:color="BFBFBF" w:sz="4"/>
+            </w:tcBorders>
+            <w:tcMar>
+              <w:top w:type="dxa" w:w="60"/>
+              <w:left w:type="dxa" w:w="100"/>
+              <w:bottom w:type="dxa" w:w="60"/>
+              <w:right w:type="dxa" w:w="100"/>
+            </w:tcMar>
+          </w:tcPr>
+          <w:p>
+            <w:r>
+              <w:rPr>
+                <w:rFonts w:ascii="Consolas" w:cs="Consolas" w:eastAsia="Consolas" w:hAnsi="Consolas"/>
+                <w:sz w:val="20"/>
+                <w:szCs w:val="20"/>
+              </w:rPr>
+              <w:t xml:space="preserve">pagina</w:t>
+            </w:r>
+          </w:p>
+        </w:tc>
+        <w:tc>
+          <w:tcPr>
+            <w:tcW w:type="dxa" w:w="1649"/>
+            <w:tcBorders>
+              <w:top w:val="single" w:color="BFBFBF" w:sz="4"/>
+              <w:left w:val="single" w:color="BFBFBF" w:sz="4"/>
+              <w:bottom w:val="single" w:color="BFBFBF" w:sz="4"/>
+              <w:right w:val="single" w:color="BFBFBF" w:sz="4"/>
+            </w:tcBorders>
+            <w:tcMar>
+              <w:top w:type="dxa" w:w="60"/>
+              <w:left w:type="dxa" w:w="100"/>
+              <w:bottom w:type="dxa" w:w="60"/>
+              <w:right w:type="dxa" w:w="100"/>
+            </w:tcMar>
+          </w:tcPr>
+          <w:p>
+            <w:r>
+              <w:rPr>
+                <w:sz w:val="20"/>
+                <w:szCs w:val="20"/>
+              </w:rPr>
+              <w:t xml:space="preserve">inteiro</w:t>
+            </w:r>
+          </w:p>
+        </w:tc>
+        <w:tc>
+          <w:tcPr>
+            <w:tcW w:type="dxa" w:w="4949"/>
+            <w:tcBorders>
+              <w:top w:val="single" w:color="BFBFBF" w:sz="4"/>
+              <w:left w:val="single" w:color="BFBFBF" w:sz="4"/>
+              <w:bottom w:val="single" w:color="BFBFBF" w:sz="4"/>
+              <w:right w:val="single" w:color="BFBFBF" w:sz="4"/>
+            </w:tcBorders>
+            <w:tcMar>
+              <w:top w:type="dxa" w:w="60"/>
+              <w:left w:type="dxa" w:w="100"/>
+              <w:bottom w:type="dxa" w:w="60"/>
+              <w:right w:type="dxa" w:w="100"/>
+            </w:tcMar>
+          </w:tcPr>
+          <w:p>
+            <w:r>
+              <w:rPr>
+                <w:sz w:val="20"/>
+                <w:szCs w:val="20"/>
+              </w:rPr>
+              <w:t xml:space="preserve">Página da folha (1, 2...)</w:t>
+            </w:r>
+          </w:p>
+        </w:tc>
+      </w:tr>
+      <w:tr>
+        <w:trPr>
+          <w:cantSplit/>
+        </w:trPr>
+        <w:tc>
+          <w:tcPr>
+            <w:tcW w:type="dxa" w:w="2473"/>
+            <w:tcBorders>
+              <w:top w:val="single" w:color="BFBFBF" w:sz="4"/>
+              <w:left w:val="single" w:color="BFBFBF" w:sz="4"/>
+              <w:bottom w:val="single" w:color="BFBFBF" w:sz="4"/>
+              <w:right w:val="single" w:color="BFBFBF" w:sz="4"/>
+            </w:tcBorders>
+            <w:tcMar>
+              <w:top w:type="dxa" w:w="60"/>
+              <w:left w:type="dxa" w:w="100"/>
+              <w:bottom w:type="dxa" w:w="60"/>
+              <w:right w:type="dxa" w:w="100"/>
+            </w:tcMar>
+          </w:tcPr>
+          <w:p>
+            <w:r>
+              <w:rPr>
+                <w:rFonts w:ascii="Consolas" w:cs="Consolas" w:eastAsia="Consolas" w:hAnsi="Consolas"/>
+                <w:sz w:val="20"/>
+                <w:szCs w:val="20"/>
+              </w:rPr>
+              <w:t xml:space="preserve">arquivo</w:t>
+            </w:r>
+          </w:p>
+        </w:tc>
+        <w:tc>
+          <w:tcPr>
+            <w:tcW w:type="dxa" w:w="1649"/>
+            <w:tcBorders>
+              <w:top w:val="single" w:color="BFBFBF" w:sz="4"/>
+              <w:left w:val="single" w:color="BFBFBF" w:sz="4"/>
+              <w:bottom w:val="single" w:color="BFBFBF" w:sz="4"/>
+              <w:right w:val="single" w:color="BFBFBF" w:sz="4"/>
+            </w:tcBorders>
+            <w:tcMar>
+              <w:top w:type="dxa" w:w="60"/>
+              <w:left w:type="dxa" w:w="100"/>
+              <w:bottom w:type="dxa" w:w="60"/>
+              <w:right w:type="dxa" w:w="100"/>
+            </w:tcMar>
+          </w:tcPr>
+          <w:p>
+            <w:r>
+              <w:rPr>
+                <w:sz w:val="20"/>
+                <w:szCs w:val="20"/>
+              </w:rPr>
+              <w:t xml:space="preserve">texto</w:t>
+            </w:r>
+          </w:p>
+        </w:tc>
+        <w:tc>
+          <w:tcPr>
+            <w:tcW w:type="dxa" w:w="4949"/>
+            <w:tcBorders>
+              <w:top w:val="single" w:color="BFBFBF" w:sz="4"/>
+              <w:left w:val="single" w:color="BFBFBF" w:sz="4"/>
+              <w:bottom w:val="single" w:color="BFBFBF" w:sz="4"/>
+              <w:right w:val="single" w:color="BFBFBF" w:sz="4"/>
+            </w:tcBorders>
+            <w:tcMar>
+              <w:top w:type="dxa" w:w="60"/>
+              <w:left w:type="dxa" w:w="100"/>
+              <w:bottom w:type="dxa" w:w="60"/>
+              <w:right w:type="dxa" w:w="100"/>
+            </w:tcMar>
+          </w:tcPr>
+          <w:p>
+            <w:r>
+              <w:rPr>
+                <w:sz w:val="20"/>
+                <w:szCs w:val="20"/>
+              </w:rPr>
+              <w:t xml:space="preserve">Caminho da imagem, relativo à pasta de arquivos do sistema; a imagem fica em disco, não no banco</w:t>
+            </w:r>
+          </w:p>
+        </w:tc>
+      </w:tr>
+      <w:tr>
+        <w:trPr>
+          <w:cantSplit/>
+        </w:trPr>
+        <w:tc>
+          <w:tcPr>
+            <w:tcW w:type="dxa" w:w="2473"/>
+            <w:tcBorders>
+              <w:top w:val="single" w:color="BFBFBF" w:sz="4"/>
+              <w:left w:val="single" w:color="BFBFBF" w:sz="4"/>
+              <w:bottom w:val="single" w:color="BFBFBF" w:sz="4"/>
+              <w:right w:val="single" w:color="BFBFBF" w:sz="4"/>
+            </w:tcBorders>
+            <w:tcMar>
+              <w:top w:type="dxa" w:w="60"/>
+              <w:left w:type="dxa" w:w="100"/>
+              <w:bottom w:type="dxa" w:w="60"/>
+              <w:right w:type="dxa" w:w="100"/>
+            </w:tcMar>
+          </w:tcPr>
+          <w:p>
+            <w:r>
+              <w:rPr>
+                <w:rFonts w:ascii="Consolas" w:cs="Consolas" w:eastAsia="Consolas" w:hAnsi="Consolas"/>
+                <w:sz w:val="20"/>
+                <w:szCs w:val="20"/>
+              </w:rPr>
+              <w:t xml:space="preserve">nome_original</w:t>
+            </w:r>
+          </w:p>
+        </w:tc>
+        <w:tc>
+          <w:tcPr>
+            <w:tcW w:type="dxa" w:w="1649"/>
+            <w:tcBorders>
+              <w:top w:val="single" w:color="BFBFBF" w:sz="4"/>
+              <w:left w:val="single" w:color="BFBFBF" w:sz="4"/>
+              <w:bottom w:val="single" w:color="BFBFBF" w:sz="4"/>
+              <w:right w:val="single" w:color="BFBFBF" w:sz="4"/>
+            </w:tcBorders>
+            <w:tcMar>
+              <w:top w:type="dxa" w:w="60"/>
+              <w:left w:type="dxa" w:w="100"/>
+              <w:bottom w:type="dxa" w:w="60"/>
+              <w:right w:type="dxa" w:w="100"/>
+            </w:tcMar>
+          </w:tcPr>
+          <w:p>
+            <w:r>
+              <w:rPr>
+                <w:sz w:val="20"/>
+                <w:szCs w:val="20"/>
+              </w:rPr>
+              <w:t xml:space="preserve">texto</w:t>
+            </w:r>
+          </w:p>
+        </w:tc>
+        <w:tc>
+          <w:tcPr>
+            <w:tcW w:type="dxa" w:w="4949"/>
+            <w:tcBorders>
+              <w:top w:val="single" w:color="BFBFBF" w:sz="4"/>
+              <w:left w:val="single" w:color="BFBFBF" w:sz="4"/>
+              <w:bottom w:val="single" w:color="BFBFBF" w:sz="4"/>
+              <w:right w:val="single" w:color="BFBFBF" w:sz="4"/>
+            </w:tcBorders>
+            <w:tcMar>
+              <w:top w:type="dxa" w:w="60"/>
+              <w:left w:type="dxa" w:w="100"/>
+              <w:bottom w:type="dxa" w:w="60"/>
+              <w:right w:type="dxa" w:w="100"/>
+            </w:tcMar>
+          </w:tcPr>
+          <w:p>
+            <w:r>
+              <w:rPr>
+                <w:sz w:val="20"/>
+                <w:szCs w:val="20"/>
+              </w:rPr>
+              <w:t xml:space="preserve">Nome do arquivo enviado pelo professor</w:t>
+            </w:r>
+          </w:p>
+        </w:tc>
+      </w:tr>
+      <w:tr>
+        <w:trPr>
+          <w:cantSplit/>
+        </w:trPr>
+        <w:tc>
+          <w:tcPr>
+            <w:tcW w:type="dxa" w:w="2473"/>
+            <w:tcBorders>
+              <w:top w:val="single" w:color="BFBFBF" w:sz="4"/>
+              <w:left w:val="single" w:color="BFBFBF" w:sz="4"/>
+              <w:bottom w:val="single" w:color="BFBFBF" w:sz="4"/>
+              <w:right w:val="single" w:color="BFBFBF" w:sz="4"/>
+            </w:tcBorders>
+            <w:tcMar>
+              <w:top w:type="dxa" w:w="60"/>
+              <w:left w:type="dxa" w:w="100"/>
+              <w:bottom w:type="dxa" w:w="60"/>
+              <w:right w:type="dxa" w:w="100"/>
+            </w:tcMar>
+          </w:tcPr>
+          <w:p>
+            <w:r>
+              <w:rPr>
+                <w:rFonts w:ascii="Consolas" w:cs="Consolas" w:eastAsia="Consolas" w:hAnsi="Consolas"/>
+                <w:sz w:val="20"/>
+                <w:szCs w:val="20"/>
+              </w:rPr>
+              <w:t xml:space="preserve">pagina_do_arquivo</w:t>
+            </w:r>
+          </w:p>
+        </w:tc>
+        <w:tc>
+          <w:tcPr>
+            <w:tcW w:type="dxa" w:w="1649"/>
+            <w:tcBorders>
+              <w:top w:val="single" w:color="BFBFBF" w:sz="4"/>
+              <w:left w:val="single" w:color="BFBFBF" w:sz="4"/>
+              <w:bottom w:val="single" w:color="BFBFBF" w:sz="4"/>
+              <w:right w:val="single" w:color="BFBFBF" w:sz="4"/>
+            </w:tcBorders>
+            <w:tcMar>
+              <w:top w:type="dxa" w:w="60"/>
+              <w:left w:type="dxa" w:w="100"/>
+              <w:bottom w:type="dxa" w:w="60"/>
+              <w:right w:type="dxa" w:w="100"/>
+            </w:tcMar>
+          </w:tcPr>
+          <w:p>
+            <w:r>
+              <w:rPr>
+                <w:sz w:val="20"/>
+                <w:szCs w:val="20"/>
+              </w:rPr>
+              <w:t xml:space="preserve">inteiro</w:t>
+            </w:r>
+          </w:p>
+        </w:tc>
+        <w:tc>
+          <w:tcPr>
+            <w:tcW w:type="dxa" w:w="4949"/>
+            <w:tcBorders>
+              <w:top w:val="single" w:color="BFBFBF" w:sz="4"/>
+              <w:left w:val="single" w:color="BFBFBF" w:sz="4"/>
+              <w:bottom w:val="single" w:color="BFBFBF" w:sz="4"/>
+              <w:right w:val="single" w:color="BFBFBF" w:sz="4"/>
+            </w:tcBorders>
+            <w:tcMar>
+              <w:top w:type="dxa" w:w="60"/>
+              <w:left w:type="dxa" w:w="100"/>
+              <w:bottom w:type="dxa" w:w="60"/>
+              <w:right w:type="dxa" w:w="100"/>
+            </w:tcMar>
+          </w:tcPr>
+          <w:p>
+            <w:r>
+              <w:rPr>
+                <w:sz w:val="20"/>
+                <w:szCs w:val="20"/>
+              </w:rPr>
+              <w:t xml:space="preserve">Posição da página no PDF enviado (1 nas imagens)</w:t>
+            </w:r>
+          </w:p>
+        </w:tc>
+      </w:tr>
+      <w:tr>
+        <w:trPr>
+          <w:cantSplit/>
+        </w:trPr>
+        <w:tc>
+          <w:tcPr>
+            <w:tcW w:type="dxa" w:w="2473"/>
+            <w:tcBorders>
+              <w:top w:val="single" w:color="BFBFBF" w:sz="4"/>
+              <w:left w:val="single" w:color="BFBFBF" w:sz="4"/>
+              <w:bottom w:val="single" w:color="BFBFBF" w:sz="4"/>
+              <w:right w:val="single" w:color="BFBFBF" w:sz="4"/>
+            </w:tcBorders>
+            <w:tcMar>
+              <w:top w:type="dxa" w:w="60"/>
+              <w:left w:type="dxa" w:w="100"/>
+              <w:bottom w:type="dxa" w:w="60"/>
+              <w:right w:type="dxa" w:w="100"/>
+            </w:tcMar>
+          </w:tcPr>
+          <w:p>
+            <w:r>
+              <w:rPr>
+                <w:rFonts w:ascii="Consolas" w:cs="Consolas" w:eastAsia="Consolas" w:hAnsi="Consolas"/>
+                <w:sz w:val="20"/>
+                <w:szCs w:val="20"/>
+              </w:rPr>
+              <w:t xml:space="preserve">situacao</w:t>
+            </w:r>
+          </w:p>
+        </w:tc>
+        <w:tc>
+          <w:tcPr>
+            <w:tcW w:type="dxa" w:w="1649"/>
+            <w:tcBorders>
+              <w:top w:val="single" w:color="BFBFBF" w:sz="4"/>
+              <w:left w:val="single" w:color="BFBFBF" w:sz="4"/>
+              <w:bottom w:val="single" w:color="BFBFBF" w:sz="4"/>
+              <w:right w:val="single" w:color="BFBFBF" w:sz="4"/>
+            </w:tcBorders>
+            <w:tcMar>
+              <w:top w:type="dxa" w:w="60"/>
+              <w:left w:type="dxa" w:w="100"/>
+              <w:bottom w:type="dxa" w:w="60"/>
+              <w:right w:type="dxa" w:w="100"/>
+            </w:tcMar>
+          </w:tcPr>
+          <w:p>
+            <w:r>
+              <w:rPr>
+                <w:sz w:val="20"/>
+                <w:szCs w:val="20"/>
+              </w:rPr>
+              <w:t xml:space="preserve">texto</w:t>
+            </w:r>
+          </w:p>
+        </w:tc>
+        <w:tc>
+          <w:tcPr>
+            <w:tcW w:type="dxa" w:w="4949"/>
+            <w:tcBorders>
+              <w:top w:val="single" w:color="BFBFBF" w:sz="4"/>
+              <w:left w:val="single" w:color="BFBFBF" w:sz="4"/>
+              <w:bottom w:val="single" w:color="BFBFBF" w:sz="4"/>
+              <w:right w:val="single" w:color="BFBFBF" w:sz="4"/>
+            </w:tcBorders>
+            <w:tcMar>
+              <w:top w:type="dxa" w:w="60"/>
+              <w:left w:type="dxa" w:w="100"/>
+              <w:bottom w:type="dxa" w:w="60"/>
+              <w:right w:type="dxa" w:w="100"/>
+            </w:tcMar>
+          </w:tcPr>
+          <w:p>
+            <w:r>
+              <w:rPr>
+                <w:rFonts w:ascii="Consolas" w:cs="Consolas" w:eastAsia="Consolas" w:hAnsi="Consolas"/>
+                <w:sz w:val="20"/>
+                <w:szCs w:val="20"/>
+              </w:rPr>
+              <w:t xml:space="preserve">identificada</w:t>
+            </w:r>
+            <w:r>
+              <w:rPr>
+                <w:sz w:val="20"/>
+                <w:szCs w:val="20"/>
+              </w:rPr>
+              <w:t xml:space="preserve">, </w:t>
+            </w:r>
+            <w:r>
+              <w:rPr>
+                <w:rFonts w:ascii="Consolas" w:cs="Consolas" w:eastAsia="Consolas" w:hAnsi="Consolas"/>
+                <w:sz w:val="20"/>
+                <w:szCs w:val="20"/>
+              </w:rPr>
+              <w:t xml:space="preserve">sem_qr</w:t>
+            </w:r>
+            <w:r>
+              <w:rPr>
+                <w:sz w:val="20"/>
+                <w:szCs w:val="20"/>
+              </w:rPr>
+              <w:t xml:space="preserve">, </w:t>
+            </w:r>
+            <w:r>
+              <w:rPr>
+                <w:rFonts w:ascii="Consolas" w:cs="Consolas" w:eastAsia="Consolas" w:hAnsi="Consolas"/>
+                <w:sz w:val="20"/>
+                <w:szCs w:val="20"/>
+              </w:rPr>
+              <w:t xml:space="preserve">outra_atividade</w:t>
+            </w:r>
+            <w:r>
+              <w:rPr>
+                <w:sz w:val="20"/>
+                <w:szCs w:val="20"/>
+              </w:rPr>
+              <w:t xml:space="preserve"> ou </w:t>
+            </w:r>
+            <w:r>
+              <w:rPr>
+                <w:rFonts w:ascii="Consolas" w:cs="Consolas" w:eastAsia="Consolas" w:hAnsi="Consolas"/>
+                <w:sz w:val="20"/>
+                <w:szCs w:val="20"/>
+              </w:rPr>
+              <w:t xml:space="preserve">substituida</w:t>
+            </w:r>
+            <w:r>
+              <w:rPr>
+                <w:sz w:val="20"/>
+                <w:szCs w:val="20"/>
+              </w:rPr>
+              <w:t xml:space="preserve">, quando uma digitalização mais nova da mesma página ocupou o lugar</w:t>
+            </w:r>
+          </w:p>
+        </w:tc>
+      </w:tr>
+      <w:tr>
+        <w:trPr>
+          <w:cantSplit/>
+        </w:trPr>
+        <w:tc>
+          <w:tcPr>
+            <w:tcW w:type="dxa" w:w="2473"/>
+            <w:tcBorders>
+              <w:top w:val="single" w:color="BFBFBF" w:sz="4"/>
+              <w:left w:val="single" w:color="BFBFBF" w:sz="4"/>
+              <w:bottom w:val="single" w:color="BFBFBF" w:sz="4"/>
+              <w:right w:val="single" w:color="BFBFBF" w:sz="4"/>
+            </w:tcBorders>
+            <w:tcMar>
+              <w:top w:type="dxa" w:w="60"/>
+              <w:left w:type="dxa" w:w="100"/>
+              <w:bottom w:type="dxa" w:w="60"/>
+              <w:right w:type="dxa" w:w="100"/>
+            </w:tcMar>
+          </w:tcPr>
+          <w:p>
+            <w:r>
+              <w:rPr>
+                <w:rFonts w:ascii="Consolas" w:cs="Consolas" w:eastAsia="Consolas" w:hAnsi="Consolas"/>
+                <w:sz w:val="20"/>
+                <w:szCs w:val="20"/>
+              </w:rPr>
+              <w:t xml:space="preserve">usuario_id</w:t>
+            </w:r>
+          </w:p>
+        </w:tc>
+        <w:tc>
+          <w:tcPr>
+            <w:tcW w:type="dxa" w:w="1649"/>
+            <w:tcBorders>
+              <w:top w:val="single" w:color="BFBFBF" w:sz="4"/>
+              <w:left w:val="single" w:color="BFBFBF" w:sz="4"/>
+              <w:bottom w:val="single" w:color="BFBFBF" w:sz="4"/>
+              <w:right w:val="single" w:color="BFBFBF" w:sz="4"/>
+            </w:tcBorders>
+            <w:tcMar>
+              <w:top w:type="dxa" w:w="60"/>
+              <w:left w:type="dxa" w:w="100"/>
+              <w:bottom w:type="dxa" w:w="60"/>
+              <w:right w:type="dxa" w:w="100"/>
+            </w:tcMar>
+          </w:tcPr>
+          <w:p>
+            <w:r>
+              <w:rPr>
+                <w:sz w:val="20"/>
+                <w:szCs w:val="20"/>
+              </w:rPr>
+              <w:t xml:space="preserve">inteiro</w:t>
+            </w:r>
+          </w:p>
+        </w:tc>
+        <w:tc>
+          <w:tcPr>
+            <w:tcW w:type="dxa" w:w="4949"/>
+            <w:tcBorders>
+              <w:top w:val="single" w:color="BFBFBF" w:sz="4"/>
+              <w:left w:val="single" w:color="BFBFBF" w:sz="4"/>
+              <w:bottom w:val="single" w:color="BFBFBF" w:sz="4"/>
+              <w:right w:val="single" w:color="BFBFBF" w:sz="4"/>
+            </w:tcBorders>
+            <w:tcMar>
+              <w:top w:type="dxa" w:w="60"/>
+              <w:left w:type="dxa" w:w="100"/>
+              <w:bottom w:type="dxa" w:w="60"/>
+              <w:right w:type="dxa" w:w="100"/>
+            </w:tcMar>
+          </w:tcPr>
+          <w:p>
+            <w:r>
+              <w:rPr>
+                <w:sz w:val="20"/>
+                <w:szCs w:val="20"/>
+              </w:rPr>
+              <w:t xml:space="preserve">Quem enviou</w:t>
+            </w:r>
+          </w:p>
+        </w:tc>
+      </w:tr>
+      <w:tr>
+        <w:trPr>
+          <w:cantSplit/>
+        </w:trPr>
+        <w:tc>
+          <w:tcPr>
+            <w:tcW w:type="dxa" w:w="2473"/>
+            <w:tcBorders>
+              <w:top w:val="single" w:color="BFBFBF" w:sz="4"/>
+              <w:left w:val="single" w:color="BFBFBF" w:sz="4"/>
+              <w:bottom w:val="single" w:color="BFBFBF" w:sz="4"/>
+              <w:right w:val="single" w:color="BFBFBF" w:sz="4"/>
+            </w:tcBorders>
+            <w:tcMar>
+              <w:top w:type="dxa" w:w="60"/>
+              <w:left w:type="dxa" w:w="100"/>
+              <w:bottom w:type="dxa" w:w="60"/>
+              <w:right w:type="dxa" w:w="100"/>
+            </w:tcMar>
+          </w:tcPr>
+          <w:p>
+            <w:r>
+              <w:rPr>
+                <w:rFonts w:ascii="Consolas" w:cs="Consolas" w:eastAsia="Consolas" w:hAnsi="Consolas"/>
+                <w:sz w:val="20"/>
+                <w:szCs w:val="20"/>
+              </w:rPr>
+              <w:t xml:space="preserve">criado_em</w:t>
+            </w:r>
+          </w:p>
+        </w:tc>
+        <w:tc>
+          <w:tcPr>
+            <w:tcW w:type="dxa" w:w="1649"/>
+            <w:tcBorders>
+              <w:top w:val="single" w:color="BFBFBF" w:sz="4"/>
+              <w:left w:val="single" w:color="BFBFBF" w:sz="4"/>
+              <w:bottom w:val="single" w:color="BFBFBF" w:sz="4"/>
+              <w:right w:val="single" w:color="BFBFBF" w:sz="4"/>
+            </w:tcBorders>
+            <w:tcMar>
+              <w:top w:type="dxa" w:w="60"/>
+              <w:left w:type="dxa" w:w="100"/>
+              <w:bottom w:type="dxa" w:w="60"/>
+              <w:right w:type="dxa" w:w="100"/>
+            </w:tcMar>
+          </w:tcPr>
+          <w:p>
+            <w:r>
+              <w:rPr>
+                <w:sz w:val="20"/>
+                <w:szCs w:val="20"/>
+              </w:rPr>
+              <w:t xml:space="preserve">data e hora</w:t>
+            </w:r>
+          </w:p>
+        </w:tc>
+        <w:tc>
+          <w:tcPr>
+            <w:tcW w:type="dxa" w:w="4949"/>
+            <w:tcBorders>
+              <w:top w:val="single" w:color="BFBFBF" w:sz="4"/>
+              <w:left w:val="single" w:color="BFBFBF" w:sz="4"/>
+              <w:bottom w:val="single" w:color="BFBFBF" w:sz="4"/>
+              <w:right w:val="single" w:color="BFBFBF" w:sz="4"/>
+            </w:tcBorders>
+            <w:tcMar>
+              <w:top w:type="dxa" w:w="60"/>
+              <w:left w:type="dxa" w:w="100"/>
+              <w:bottom w:type="dxa" w:w="60"/>
+              <w:right w:type="dxa" w:w="100"/>
+            </w:tcMar>
+          </w:tcPr>
+          <w:p>
+            <w:r>
+              <w:rPr>
+                <w:sz w:val="20"/>
+                <w:szCs w:val="20"/>
+              </w:rPr>
+              <w:t xml:space="preserve">Momento do envio</w:t>
             </w:r>
           </w:p>
         </w:tc>
@@ -34345,6 +35543,493 @@
     </w:p>
     <w:p>
       <w:pPr>
+        <w:pStyle w:val="Heading2"/>
+      </w:pPr>
+      <w:r>
+        <w:t xml:space="preserve">4.26 Folhas digitalizadas: app/digitalizacao/</w:t>
+      </w:r>
+    </w:p>
+    <w:p>
+      <w:pPr>
+        <w:spacing w:after="120" w:line="300"/>
+      </w:pPr>
+      <w:r>
+        <w:t xml:space="preserve">Terceira parte do fluxo: o professor digitaliza as folhas respondidas e envia ao sistema, que identifica cada página pelo QR code e mostra a imagem ao lado das respostas da folha. A leitura automática das bolinhas e da escrita fica para a etapa seguinte; nesta, a imagem já evita que o professor precise manusear o papel para digitar as respostas.</w:t>
+      </w:r>
+    </w:p>
+    <w:tbl>
+      <w:tblPr>
+        <w:tblW w:type="dxa" w:w="9071"/>
+        <w:tblBorders>
+          <w:top w:val="single" w:color="auto" w:sz="4"/>
+          <w:left w:val="single" w:color="auto" w:sz="4"/>
+          <w:bottom w:val="single" w:color="auto" w:sz="4"/>
+          <w:right w:val="single" w:color="auto" w:sz="4"/>
+          <w:insideH w:val="single" w:color="auto" w:sz="4"/>
+          <w:insideV w:val="single" w:color="auto" w:sz="4"/>
+        </w:tblBorders>
+      </w:tblPr>
+      <w:tblGrid>
+        <w:gridCol w:w="3628"/>
+        <w:gridCol w:w="5443"/>
+      </w:tblGrid>
+      <w:tr>
+        <w:trPr>
+          <w:tblHeader/>
+        </w:trPr>
+        <w:tc>
+          <w:tcPr>
+            <w:tcW w:type="dxa" w:w="3628"/>
+            <w:tcBorders>
+              <w:top w:val="single" w:color="BFBFBF" w:sz="4"/>
+              <w:left w:val="single" w:color="BFBFBF" w:sz="4"/>
+              <w:bottom w:val="single" w:color="BFBFBF" w:sz="4"/>
+              <w:right w:val="single" w:color="BFBFBF" w:sz="4"/>
+            </w:tcBorders>
+            <w:shd w:fill="D9E2F3" w:color="auto" w:val="clear"/>
+            <w:tcMar>
+              <w:top w:type="dxa" w:w="60"/>
+              <w:left w:type="dxa" w:w="100"/>
+              <w:bottom w:type="dxa" w:w="60"/>
+              <w:right w:type="dxa" w:w="100"/>
+            </w:tcMar>
+          </w:tcPr>
+          <w:p>
+            <w:r>
+              <w:rPr>
+                <w:b/>
+                <w:bCs/>
+                <w:sz w:val="20"/>
+                <w:szCs w:val="20"/>
+              </w:rPr>
+              <w:t xml:space="preserve">Rota</w:t>
+            </w:r>
+          </w:p>
+        </w:tc>
+        <w:tc>
+          <w:tcPr>
+            <w:tcW w:type="dxa" w:w="5443"/>
+            <w:tcBorders>
+              <w:top w:val="single" w:color="BFBFBF" w:sz="4"/>
+              <w:left w:val="single" w:color="BFBFBF" w:sz="4"/>
+              <w:bottom w:val="single" w:color="BFBFBF" w:sz="4"/>
+              <w:right w:val="single" w:color="BFBFBF" w:sz="4"/>
+            </w:tcBorders>
+            <w:shd w:fill="D9E2F3" w:color="auto" w:val="clear"/>
+            <w:tcMar>
+              <w:top w:type="dxa" w:w="60"/>
+              <w:left w:type="dxa" w:w="100"/>
+              <w:bottom w:type="dxa" w:w="60"/>
+              <w:right w:type="dxa" w:w="100"/>
+            </w:tcMar>
+          </w:tcPr>
+          <w:p>
+            <w:r>
+              <w:rPr>
+                <w:b/>
+                <w:bCs/>
+                <w:sz w:val="20"/>
+                <w:szCs w:val="20"/>
+              </w:rPr>
+              <w:t xml:space="preserve">O que faz</w:t>
+            </w:r>
+          </w:p>
+        </w:tc>
+      </w:tr>
+      <w:tr>
+        <w:trPr>
+          <w:cantSplit/>
+        </w:trPr>
+        <w:tc>
+          <w:tcPr>
+            <w:tcW w:type="dxa" w:w="3628"/>
+            <w:tcBorders>
+              <w:top w:val="single" w:color="BFBFBF" w:sz="4"/>
+              <w:left w:val="single" w:color="BFBFBF" w:sz="4"/>
+              <w:bottom w:val="single" w:color="BFBFBF" w:sz="4"/>
+              <w:right w:val="single" w:color="BFBFBF" w:sz="4"/>
+            </w:tcBorders>
+            <w:tcMar>
+              <w:top w:type="dxa" w:w="60"/>
+              <w:left w:type="dxa" w:w="100"/>
+              <w:bottom w:type="dxa" w:w="60"/>
+              <w:right w:type="dxa" w:w="100"/>
+            </w:tcMar>
+          </w:tcPr>
+          <w:p>
+            <w:r>
+              <w:rPr>
+                <w:rFonts w:ascii="Consolas" w:cs="Consolas" w:eastAsia="Consolas" w:hAnsi="Consolas"/>
+                <w:sz w:val="20"/>
+                <w:szCs w:val="20"/>
+              </w:rPr>
+              <w:t xml:space="preserve">GET /atividades/{id}/digitalizacoes</w:t>
+            </w:r>
+          </w:p>
+        </w:tc>
+        <w:tc>
+          <w:tcPr>
+            <w:tcW w:type="dxa" w:w="5443"/>
+            <w:tcBorders>
+              <w:top w:val="single" w:color="BFBFBF" w:sz="4"/>
+              <w:left w:val="single" w:color="BFBFBF" w:sz="4"/>
+              <w:bottom w:val="single" w:color="BFBFBF" w:sz="4"/>
+              <w:right w:val="single" w:color="BFBFBF" w:sz="4"/>
+            </w:tcBorders>
+            <w:tcMar>
+              <w:top w:type="dxa" w:w="60"/>
+              <w:left w:type="dxa" w:w="100"/>
+              <w:bottom w:type="dxa" w:w="60"/>
+              <w:right w:type="dxa" w:w="100"/>
+            </w:tcMar>
+          </w:tcPr>
+          <w:p>
+            <w:r>
+              <w:rPr>
+                <w:sz w:val="20"/>
+                <w:szCs w:val="20"/>
+              </w:rPr>
+              <w:t xml:space="preserve">Envio de arquivos, números (folhas com digitalização e com todas as páginas), páginas sem folha com a imagem e a lista das folhas com as páginas recebidas</w:t>
+            </w:r>
+          </w:p>
+        </w:tc>
+      </w:tr>
+      <w:tr>
+        <w:trPr>
+          <w:cantSplit/>
+        </w:trPr>
+        <w:tc>
+          <w:tcPr>
+            <w:tcW w:type="dxa" w:w="3628"/>
+            <w:tcBorders>
+              <w:top w:val="single" w:color="BFBFBF" w:sz="4"/>
+              <w:left w:val="single" w:color="BFBFBF" w:sz="4"/>
+              <w:bottom w:val="single" w:color="BFBFBF" w:sz="4"/>
+              <w:right w:val="single" w:color="BFBFBF" w:sz="4"/>
+            </w:tcBorders>
+            <w:tcMar>
+              <w:top w:type="dxa" w:w="60"/>
+              <w:left w:type="dxa" w:w="100"/>
+              <w:bottom w:type="dxa" w:w="60"/>
+              <w:right w:type="dxa" w:w="100"/>
+            </w:tcMar>
+          </w:tcPr>
+          <w:p>
+            <w:r>
+              <w:rPr>
+                <w:rFonts w:ascii="Consolas" w:cs="Consolas" w:eastAsia="Consolas" w:hAnsi="Consolas"/>
+                <w:sz w:val="20"/>
+                <w:szCs w:val="20"/>
+              </w:rPr>
+              <w:t xml:space="preserve">POST /atividades/{id}/digitalizacoes</w:t>
+            </w:r>
+          </w:p>
+        </w:tc>
+        <w:tc>
+          <w:tcPr>
+            <w:tcW w:type="dxa" w:w="5443"/>
+            <w:tcBorders>
+              <w:top w:val="single" w:color="BFBFBF" w:sz="4"/>
+              <w:left w:val="single" w:color="BFBFBF" w:sz="4"/>
+              <w:bottom w:val="single" w:color="BFBFBF" w:sz="4"/>
+              <w:right w:val="single" w:color="BFBFBF" w:sz="4"/>
+            </w:tcBorders>
+            <w:tcMar>
+              <w:top w:type="dxa" w:w="60"/>
+              <w:left w:type="dxa" w:w="100"/>
+              <w:bottom w:type="dxa" w:w="60"/>
+              <w:right w:type="dxa" w:w="100"/>
+            </w:tcMar>
+          </w:tcPr>
+          <w:p>
+            <w:r>
+              <w:rPr>
+                <w:sz w:val="20"/>
+                <w:szCs w:val="20"/>
+              </w:rPr>
+              <w:t xml:space="preserve">Recebe um ou mais arquivos PDF, PNG ou JPG, até 80 MB e 150 páginas por PDF</w:t>
+            </w:r>
+          </w:p>
+        </w:tc>
+      </w:tr>
+      <w:tr>
+        <w:trPr>
+          <w:cantSplit/>
+        </w:trPr>
+        <w:tc>
+          <w:tcPr>
+            <w:tcW w:type="dxa" w:w="3628"/>
+            <w:tcBorders>
+              <w:top w:val="single" w:color="BFBFBF" w:sz="4"/>
+              <w:left w:val="single" w:color="BFBFBF" w:sz="4"/>
+              <w:bottom w:val="single" w:color="BFBFBF" w:sz="4"/>
+              <w:right w:val="single" w:color="BFBFBF" w:sz="4"/>
+            </w:tcBorders>
+            <w:tcMar>
+              <w:top w:type="dxa" w:w="60"/>
+              <w:left w:type="dxa" w:w="100"/>
+              <w:bottom w:type="dxa" w:w="60"/>
+              <w:right w:type="dxa" w:w="100"/>
+            </w:tcMar>
+          </w:tcPr>
+          <w:p>
+            <w:r>
+              <w:rPr>
+                <w:rFonts w:ascii="Consolas" w:cs="Consolas" w:eastAsia="Consolas" w:hAnsi="Consolas"/>
+                <w:sz w:val="20"/>
+                <w:szCs w:val="20"/>
+              </w:rPr>
+              <w:t xml:space="preserve">GET .../digitalizacoes/{pagina}/imagem</w:t>
+            </w:r>
+          </w:p>
+        </w:tc>
+        <w:tc>
+          <w:tcPr>
+            <w:tcW w:type="dxa" w:w="5443"/>
+            <w:tcBorders>
+              <w:top w:val="single" w:color="BFBFBF" w:sz="4"/>
+              <w:left w:val="single" w:color="BFBFBF" w:sz="4"/>
+              <w:bottom w:val="single" w:color="BFBFBF" w:sz="4"/>
+              <w:right w:val="single" w:color="BFBFBF" w:sz="4"/>
+            </w:tcBorders>
+            <w:tcMar>
+              <w:top w:type="dxa" w:w="60"/>
+              <w:left w:type="dxa" w:w="100"/>
+              <w:bottom w:type="dxa" w:w="60"/>
+              <w:right w:type="dxa" w:w="100"/>
+            </w:tcMar>
+          </w:tcPr>
+          <w:p>
+            <w:r>
+              <w:rPr>
+                <w:sz w:val="20"/>
+                <w:szCs w:val="20"/>
+              </w:rPr>
+              <w:t xml:space="preserve">A imagem da página, só com login e só na atividade a que pertence</w:t>
+            </w:r>
+          </w:p>
+        </w:tc>
+      </w:tr>
+      <w:tr>
+        <w:trPr>
+          <w:cantSplit/>
+        </w:trPr>
+        <w:tc>
+          <w:tcPr>
+            <w:tcW w:type="dxa" w:w="3628"/>
+            <w:tcBorders>
+              <w:top w:val="single" w:color="BFBFBF" w:sz="4"/>
+              <w:left w:val="single" w:color="BFBFBF" w:sz="4"/>
+              <w:bottom w:val="single" w:color="BFBFBF" w:sz="4"/>
+              <w:right w:val="single" w:color="BFBFBF" w:sz="4"/>
+            </w:tcBorders>
+            <w:tcMar>
+              <w:top w:type="dxa" w:w="60"/>
+              <w:left w:type="dxa" w:w="100"/>
+              <w:bottom w:type="dxa" w:w="60"/>
+              <w:right w:type="dxa" w:w="100"/>
+            </w:tcMar>
+          </w:tcPr>
+          <w:p>
+            <w:r>
+              <w:rPr>
+                <w:rFonts w:ascii="Consolas" w:cs="Consolas" w:eastAsia="Consolas" w:hAnsi="Consolas"/>
+                <w:sz w:val="20"/>
+                <w:szCs w:val="20"/>
+              </w:rPr>
+              <w:t xml:space="preserve">POST .../digitalizacoes/{pagina}/atribuir</w:t>
+            </w:r>
+          </w:p>
+        </w:tc>
+        <w:tc>
+          <w:tcPr>
+            <w:tcW w:type="dxa" w:w="5443"/>
+            <w:tcBorders>
+              <w:top w:val="single" w:color="BFBFBF" w:sz="4"/>
+              <w:left w:val="single" w:color="BFBFBF" w:sz="4"/>
+              <w:bottom w:val="single" w:color="BFBFBF" w:sz="4"/>
+              <w:right w:val="single" w:color="BFBFBF" w:sz="4"/>
+            </w:tcBorders>
+            <w:tcMar>
+              <w:top w:type="dxa" w:w="60"/>
+              <w:left w:type="dxa" w:w="100"/>
+              <w:bottom w:type="dxa" w:w="60"/>
+              <w:right w:type="dxa" w:w="100"/>
+            </w:tcMar>
+          </w:tcPr>
+          <w:p>
+            <w:r>
+              <w:rPr>
+                <w:sz w:val="20"/>
+                <w:szCs w:val="20"/>
+              </w:rPr>
+              <w:t xml:space="preserve">O professor indica o código da folha e a página, quando o QR code não foi lido</w:t>
+            </w:r>
+          </w:p>
+        </w:tc>
+      </w:tr>
+      <w:tr>
+        <w:trPr>
+          <w:cantSplit/>
+        </w:trPr>
+        <w:tc>
+          <w:tcPr>
+            <w:tcW w:type="dxa" w:w="3628"/>
+            <w:tcBorders>
+              <w:top w:val="single" w:color="BFBFBF" w:sz="4"/>
+              <w:left w:val="single" w:color="BFBFBF" w:sz="4"/>
+              <w:bottom w:val="single" w:color="BFBFBF" w:sz="4"/>
+              <w:right w:val="single" w:color="BFBFBF" w:sz="4"/>
+            </w:tcBorders>
+            <w:tcMar>
+              <w:top w:type="dxa" w:w="60"/>
+              <w:left w:type="dxa" w:w="100"/>
+              <w:bottom w:type="dxa" w:w="60"/>
+              <w:right w:type="dxa" w:w="100"/>
+            </w:tcMar>
+          </w:tcPr>
+          <w:p>
+            <w:r>
+              <w:rPr>
+                <w:rFonts w:ascii="Consolas" w:cs="Consolas" w:eastAsia="Consolas" w:hAnsi="Consolas"/>
+                <w:sz w:val="20"/>
+                <w:szCs w:val="20"/>
+              </w:rPr>
+              <w:t xml:space="preserve">POST .../digitalizacoes/{pagina}/excluir</w:t>
+            </w:r>
+          </w:p>
+        </w:tc>
+        <w:tc>
+          <w:tcPr>
+            <w:tcW w:type="dxa" w:w="5443"/>
+            <w:tcBorders>
+              <w:top w:val="single" w:color="BFBFBF" w:sz="4"/>
+              <w:left w:val="single" w:color="BFBFBF" w:sz="4"/>
+              <w:bottom w:val="single" w:color="BFBFBF" w:sz="4"/>
+              <w:right w:val="single" w:color="BFBFBF" w:sz="4"/>
+            </w:tcBorders>
+            <w:tcMar>
+              <w:top w:type="dxa" w:w="60"/>
+              <w:left w:type="dxa" w:w="100"/>
+              <w:bottom w:type="dxa" w:w="60"/>
+              <w:right w:type="dxa" w:w="100"/>
+            </w:tcMar>
+          </w:tcPr>
+          <w:p>
+            <w:r>
+              <w:rPr>
+                <w:sz w:val="20"/>
+                <w:szCs w:val="20"/>
+              </w:rPr>
+              <w:t xml:space="preserve">Apaga a página e o arquivo da imagem</w:t>
+            </w:r>
+          </w:p>
+        </w:tc>
+      </w:tr>
+    </w:tbl>
+    <w:p>
+      <w:pPr>
+        <w:spacing w:after="120"/>
+      </w:pPr>
+    </w:p>
+    <w:p>
+      <w:pPr>
+        <w:pStyle w:val="Heading3"/>
+      </w:pPr>
+      <w:r>
+        <w:t xml:space="preserve">Como cada página é tratada</w:t>
+      </w:r>
+    </w:p>
+    <w:p>
+      <w:pPr>
+        <w:pStyle w:val="ListParagraph"/>
+        <w:numPr>
+          <w:ilvl w:val="0"/>
+          <w:numId w:val="5"/>
+        </w:numPr>
+        <w:spacing w:after="80" w:line="290"/>
+      </w:pPr>
+      <w:r>
+        <w:rPr>
+          <w:b/>
+          <w:bCs/>
+        </w:rPr>
+        <w:t xml:space="preserve">Conversão:</w:t>
+      </w:r>
+      <w:r>
+        <w:t xml:space="preserve"> cada página do PDF vira uma imagem em tons de cinza a 200 dpi, com a biblioteca PyMuPDF; fotos são abertas com o OpenCV e reduzidas a no máximo 3000 pixels no lado maior. A imagem é gravada em JPEG, em disco, numa pasta por atividade.</w:t>
+      </w:r>
+    </w:p>
+    <w:p>
+      <w:pPr>
+        <w:pStyle w:val="ListParagraph"/>
+        <w:numPr>
+          <w:ilvl w:val="0"/>
+          <w:numId w:val="5"/>
+        </w:numPr>
+        <w:spacing w:after="80" w:line="290"/>
+      </w:pPr>
+      <w:r>
+        <w:rPr>
+          <w:b/>
+          <w:bCs/>
+        </w:rPr>
+        <w:t xml:space="preserve">Identificação:</w:t>
+      </w:r>
+      <w:r>
+        <w:t xml:space="preserve"> o QR code é procurado com o detector do OpenCV, primeiro na página inteira e depois em versões que ajudam em digitalizações ruins: o canto superior direito ampliado, o canto inferior esquerdo ampliado (página de cabeça para baixo) e a página em preto e branco puro.</w:t>
+      </w:r>
+    </w:p>
+    <w:p>
+      <w:pPr>
+        <w:pStyle w:val="ListParagraph"/>
+        <w:numPr>
+          <w:ilvl w:val="0"/>
+          <w:numId w:val="5"/>
+        </w:numPr>
+        <w:spacing w:after="80" w:line="290"/>
+      </w:pPr>
+      <w:r>
+        <w:rPr>
+          <w:b/>
+          <w:bCs/>
+        </w:rPr>
+        <w:t xml:space="preserve">Resultado:</w:t>
+      </w:r>
+      <w:r>
+        <w:t xml:space="preserve"> a página é ligada à folha e à página indicadas no QR code. Se o código for de outra atividade, ou se o QR code não for lido, a página fica na lista de pendentes, com a imagem, para o professor indicar a folha ou excluir. Uma nova digitalização da mesma página substitui a anterior, que fica registrada como substituída.</w:t>
+      </w:r>
+    </w:p>
+    <w:p>
+      <w:pPr>
+        <w:pStyle w:val="ListParagraph"/>
+        <w:numPr>
+          <w:ilvl w:val="0"/>
+          <w:numId w:val="5"/>
+        </w:numPr>
+        <w:spacing w:after="80" w:line="290"/>
+      </w:pPr>
+      <w:r>
+        <w:rPr>
+          <w:b/>
+          <w:bCs/>
+        </w:rPr>
+        <w:t xml:space="preserve">Na página da folha:</w:t>
+      </w:r>
+      <w:r>
+        <w:t xml:space="preserve"> as imagens aparecem ao lado do formulário de respostas, em telas largas, ou acima dele, em telas estreitas.</w:t>
+      </w:r>
+    </w:p>
+    <w:p>
+      <w:pPr>
+        <w:spacing w:after="120" w:line="300"/>
+      </w:pPr>
+      <w:r>
+        <w:t xml:space="preserve">Com folhas de resposta impressas e páginas digitalizadas, as folhas não podem ser descartadas e a atividade não pode ser excluída, pela mesma razão das respostas registradas.</w:t>
+      </w:r>
+    </w:p>
+    <w:p>
+      <w:pPr>
         <w:pStyle w:val="Heading1"/>
       </w:pPr>
       <w:r>
@@ -35043,7 +36728,7 @@
                 <w:sz w:val="20"/>
                 <w:szCs w:val="20"/>
               </w:rPr>
-              <w:t xml:space="preserve">Máximo de chamadas ao modelo por pessoa por dia; padrão 60</w:t>
+              <w:t xml:space="preserve">Máximo de chamadas ao modelo por pessoa por dia; padrão 60. Uma turma de 40 alunos com duas discursivas exige 80 chamadas: para corrigir a turma num dia, aumente o valor</w:t>
             </w:r>
           </w:p>
         </w:tc>
@@ -35128,6 +36813,105 @@
                 <w:szCs w:val="20"/>
               </w:rPr>
               <w:t xml:space="preserve">Nome exibido nas páginas; padrão Devolutiva</w:t>
+            </w:r>
+          </w:p>
+        </w:tc>
+      </w:tr>
+      <w:tr>
+        <w:trPr>
+          <w:cantSplit/>
+        </w:trPr>
+        <w:tc>
+          <w:tcPr>
+            <w:tcW w:type="dxa" w:w="2473"/>
+            <w:tcBorders>
+              <w:top w:val="single" w:color="BFBFBF" w:sz="4"/>
+              <w:left w:val="single" w:color="BFBFBF" w:sz="4"/>
+              <w:bottom w:val="single" w:color="BFBFBF" w:sz="4"/>
+              <w:right w:val="single" w:color="BFBFBF" w:sz="4"/>
+            </w:tcBorders>
+            <w:tcMar>
+              <w:top w:type="dxa" w:w="60"/>
+              <w:left w:type="dxa" w:w="100"/>
+              <w:bottom w:type="dxa" w:w="60"/>
+              <w:right w:type="dxa" w:w="100"/>
+            </w:tcMar>
+          </w:tcPr>
+          <w:p>
+            <w:r>
+              <w:rPr>
+                <w:rFonts w:ascii="Consolas" w:cs="Consolas" w:eastAsia="Consolas" w:hAnsi="Consolas"/>
+                <w:sz w:val="20"/>
+                <w:szCs w:val="20"/>
+              </w:rPr>
+              <w:t xml:space="preserve">PASTA_ARQUIVOS</w:t>
+            </w:r>
+          </w:p>
+        </w:tc>
+        <w:tc>
+          <w:tcPr>
+            <w:tcW w:type="dxa" w:w="1649"/>
+            <w:tcBorders>
+              <w:top w:val="single" w:color="BFBFBF" w:sz="4"/>
+              <w:left w:val="single" w:color="BFBFBF" w:sz="4"/>
+              <w:bottom w:val="single" w:color="BFBFBF" w:sz="4"/>
+              <w:right w:val="single" w:color="BFBFBF" w:sz="4"/>
+            </w:tcBorders>
+            <w:tcMar>
+              <w:top w:type="dxa" w:w="60"/>
+              <w:left w:type="dxa" w:w="100"/>
+              <w:bottom w:type="dxa" w:w="60"/>
+              <w:right w:type="dxa" w:w="100"/>
+            </w:tcMar>
+          </w:tcPr>
+          <w:p>
+            <w:r>
+              <w:rPr>
+                <w:sz w:val="20"/>
+                <w:szCs w:val="20"/>
+              </w:rPr>
+              <w:t xml:space="preserve">Não</w:t>
+            </w:r>
+          </w:p>
+        </w:tc>
+        <w:tc>
+          <w:tcPr>
+            <w:tcW w:type="dxa" w:w="4949"/>
+            <w:tcBorders>
+              <w:top w:val="single" w:color="BFBFBF" w:sz="4"/>
+              <w:left w:val="single" w:color="BFBFBF" w:sz="4"/>
+              <w:bottom w:val="single" w:color="BFBFBF" w:sz="4"/>
+              <w:right w:val="single" w:color="BFBFBF" w:sz="4"/>
+            </w:tcBorders>
+            <w:tcMar>
+              <w:top w:type="dxa" w:w="60"/>
+              <w:left w:type="dxa" w:w="100"/>
+              <w:bottom w:type="dxa" w:w="60"/>
+              <w:right w:type="dxa" w:w="100"/>
+            </w:tcMar>
+          </w:tcPr>
+          <w:p>
+            <w:r>
+              <w:rPr>
+                <w:sz w:val="20"/>
+                <w:szCs w:val="20"/>
+              </w:rPr>
+              <w:t xml:space="preserve">Pasta das folhas digitalizadas, com caminho absoluto; padrão </w:t>
+            </w:r>
+            <w:r>
+              <w:rPr>
+                <w:rFonts w:ascii="Consolas" w:cs="Consolas" w:eastAsia="Consolas" w:hAnsi="Consolas"/>
+                <w:sz w:val="20"/>
+                <w:szCs w:val="20"/>
+              </w:rPr>
+              <w:t xml:space="preserve">arquivos</w:t>
+            </w:r>
+            <w:r>
+              <w:rPr>
+                <w:sz w:val="20"/>
+                <w:szCs w:val="20"/>
+              </w:rPr>
+              <w:t xml:space="preserve"> na raiz do projeto</w:t>
             </w:r>
           </w:p>
         </w:tc>
@@ -37773,7 +39557,7 @@
         <w:t xml:space="preserve">pytest</w:t>
       </w:r>
       <w:r>
-        <w:t xml:space="preserve"> e não acessam a internet nem gastam crédito: a API da OpenAI e a API do ENEM são substituídas por versões falsas que devolvem respostas controladas. Total nesta versão: 219 testes. Os testes de páginas entram com uma conta de administrador criada no banco de teste, e o custo do scrypt é reduzido só nos testes, para que rodem em poucos segundos.</w:t>
+        <w:t xml:space="preserve"> e não acessam a internet nem gastam crédito: a API da OpenAI e a API do ENEM são substituídas por versões falsas que devolvem respostas controladas. Total nesta versão: 231 testes. Os testes de páginas entram com uma conta de administrador criada no banco de teste, e o custo do scrypt é reduzido só nos testes, para que rodem em poucos segundos.</w:t>
       </w:r>
     </w:p>
     <w:tbl>
@@ -38636,6 +40420,64 @@
                 <w:sz w:val="20"/>
                 <w:szCs w:val="20"/>
               </w:rPr>
+              <w:t xml:space="preserve">tests/test_digitalizacao.py</w:t>
+            </w:r>
+          </w:p>
+        </w:tc>
+        <w:tc>
+          <w:tcPr>
+            <w:tcW w:type="dxa" w:w="6350"/>
+            <w:tcBorders>
+              <w:top w:val="single" w:color="BFBFBF" w:sz="4"/>
+              <w:left w:val="single" w:color="BFBFBF" w:sz="4"/>
+              <w:bottom w:val="single" w:color="BFBFBF" w:sz="4"/>
+              <w:right w:val="single" w:color="BFBFBF" w:sz="4"/>
+            </w:tcBorders>
+            <w:tcMar>
+              <w:top w:type="dxa" w:w="60"/>
+              <w:left w:type="dxa" w:w="100"/>
+              <w:bottom w:type="dxa" w:w="60"/>
+              <w:right w:type="dxa" w:w="100"/>
+            </w:tcMar>
+          </w:tcPr>
+          <w:p>
+            <w:r>
+              <w:rPr>
+                <w:sz w:val="20"/>
+                <w:szCs w:val="20"/>
+              </w:rPr>
+              <w:t xml:space="preserve">QR code lido em página reta, de cabeça para baixo e com ruído, em folhas sintéticas com o layout real; página sem QR code; PDF com várias folhas e foto sem QR code; página de outra atividade e reenvio que substitui; arquivos recusados; atividade sem folhas; indicação manual da folha com código e página inválidos; exclusão da página e do arquivo; imagem só com login e na atividade certa; atividade com digitalizações não excluída</w:t>
+            </w:r>
+          </w:p>
+        </w:tc>
+      </w:tr>
+      <w:tr>
+        <w:trPr>
+          <w:cantSplit/>
+        </w:trPr>
+        <w:tc>
+          <w:tcPr>
+            <w:tcW w:type="dxa" w:w="2721"/>
+            <w:tcBorders>
+              <w:top w:val="single" w:color="BFBFBF" w:sz="4"/>
+              <w:left w:val="single" w:color="BFBFBF" w:sz="4"/>
+              <w:bottom w:val="single" w:color="BFBFBF" w:sz="4"/>
+              <w:right w:val="single" w:color="BFBFBF" w:sz="4"/>
+            </w:tcBorders>
+            <w:tcMar>
+              <w:top w:type="dxa" w:w="60"/>
+              <w:left w:type="dxa" w:w="100"/>
+              <w:bottom w:type="dxa" w:w="60"/>
+              <w:right w:type="dxa" w:w="100"/>
+            </w:tcMar>
+          </w:tcPr>
+          <w:p>
+            <w:r>
+              <w:rPr>
+                <w:rFonts w:ascii="Consolas" w:cs="Consolas" w:eastAsia="Consolas" w:hAnsi="Consolas"/>
+                <w:sz w:val="20"/>
+                <w:szCs w:val="20"/>
+              </w:rPr>
               <w:t xml:space="preserve">tests/test_lista_questoes.py</w:t>
             </w:r>
           </w:p>
@@ -41595,6 +43437,177 @@
                 <w:sz w:val="20"/>
                 <w:szCs w:val="20"/>
               </w:rPr>
+              <w:t xml:space="preserve">Imagens em disco, e não no banco</w:t>
+            </w:r>
+          </w:p>
+        </w:tc>
+        <w:tc>
+          <w:tcPr>
+            <w:tcW w:type="dxa" w:w="5443"/>
+            <w:tcBorders>
+              <w:top w:val="single" w:color="BFBFBF" w:sz="4"/>
+              <w:left w:val="single" w:color="BFBFBF" w:sz="4"/>
+              <w:bottom w:val="single" w:color="BFBFBF" w:sz="4"/>
+              <w:right w:val="single" w:color="BFBFBF" w:sz="4"/>
+            </w:tcBorders>
+            <w:tcMar>
+              <w:top w:type="dxa" w:w="60"/>
+              <w:left w:type="dxa" w:w="100"/>
+              <w:bottom w:type="dxa" w:w="60"/>
+              <w:right w:type="dxa" w:w="100"/>
+            </w:tcMar>
+          </w:tcPr>
+          <w:p>
+            <w:r>
+              <w:rPr>
+                <w:sz w:val="20"/>
+                <w:szCs w:val="20"/>
+              </w:rPr>
+              <w:t xml:space="preserve">Mantém o banco pequeno e a cópia diária rápida; o banco guarda só o caminho</w:t>
+            </w:r>
+          </w:p>
+        </w:tc>
+      </w:tr>
+      <w:tr>
+        <w:trPr>
+          <w:cantSplit/>
+        </w:trPr>
+        <w:tc>
+          <w:tcPr>
+            <w:tcW w:type="dxa" w:w="3628"/>
+            <w:tcBorders>
+              <w:top w:val="single" w:color="BFBFBF" w:sz="4"/>
+              <w:left w:val="single" w:color="BFBFBF" w:sz="4"/>
+              <w:bottom w:val="single" w:color="BFBFBF" w:sz="4"/>
+              <w:right w:val="single" w:color="BFBFBF" w:sz="4"/>
+            </w:tcBorders>
+            <w:tcMar>
+              <w:top w:type="dxa" w:w="60"/>
+              <w:left w:type="dxa" w:w="100"/>
+              <w:bottom w:type="dxa" w:w="60"/>
+              <w:right w:type="dxa" w:w="100"/>
+            </w:tcMar>
+          </w:tcPr>
+          <w:p>
+            <w:r>
+              <w:rPr>
+                <w:sz w:val="20"/>
+                <w:szCs w:val="20"/>
+              </w:rPr>
+              <w:t xml:space="preserve">QR code como única identificação automática</w:t>
+            </w:r>
+          </w:p>
+        </w:tc>
+        <w:tc>
+          <w:tcPr>
+            <w:tcW w:type="dxa" w:w="5443"/>
+            <w:tcBorders>
+              <w:top w:val="single" w:color="BFBFBF" w:sz="4"/>
+              <w:left w:val="single" w:color="BFBFBF" w:sz="4"/>
+              <w:bottom w:val="single" w:color="BFBFBF" w:sz="4"/>
+              <w:right w:val="single" w:color="BFBFBF" w:sz="4"/>
+            </w:tcBorders>
+            <w:tcMar>
+              <w:top w:type="dxa" w:w="60"/>
+              <w:left w:type="dxa" w:w="100"/>
+              <w:bottom w:type="dxa" w:w="60"/>
+              <w:right w:type="dxa" w:w="100"/>
+            </w:tcMar>
+          </w:tcPr>
+          <w:p>
+            <w:r>
+              <w:rPr>
+                <w:sz w:val="20"/>
+                <w:szCs w:val="20"/>
+              </w:rPr>
+              <w:t xml:space="preserve">É lido com segurança mesmo em digitalizações ruins; ler o código impresso em letras exigiria reconhecimento de texto, mais sujeito a erro</w:t>
+            </w:r>
+          </w:p>
+        </w:tc>
+      </w:tr>
+      <w:tr>
+        <w:trPr>
+          <w:cantSplit/>
+        </w:trPr>
+        <w:tc>
+          <w:tcPr>
+            <w:tcW w:type="dxa" w:w="3628"/>
+            <w:tcBorders>
+              <w:top w:val="single" w:color="BFBFBF" w:sz="4"/>
+              <w:left w:val="single" w:color="BFBFBF" w:sz="4"/>
+              <w:bottom w:val="single" w:color="BFBFBF" w:sz="4"/>
+              <w:right w:val="single" w:color="BFBFBF" w:sz="4"/>
+            </w:tcBorders>
+            <w:tcMar>
+              <w:top w:type="dxa" w:w="60"/>
+              <w:left w:type="dxa" w:w="100"/>
+              <w:bottom w:type="dxa" w:w="60"/>
+              <w:right w:type="dxa" w:w="100"/>
+            </w:tcMar>
+          </w:tcPr>
+          <w:p>
+            <w:r>
+              <w:rPr>
+                <w:sz w:val="20"/>
+                <w:szCs w:val="20"/>
+              </w:rPr>
+              <w:t xml:space="preserve">Página não identificada guardada, e não descartada</w:t>
+            </w:r>
+          </w:p>
+        </w:tc>
+        <w:tc>
+          <w:tcPr>
+            <w:tcW w:type="dxa" w:w="5443"/>
+            <w:tcBorders>
+              <w:top w:val="single" w:color="BFBFBF" w:sz="4"/>
+              <w:left w:val="single" w:color="BFBFBF" w:sz="4"/>
+              <w:bottom w:val="single" w:color="BFBFBF" w:sz="4"/>
+              <w:right w:val="single" w:color="BFBFBF" w:sz="4"/>
+            </w:tcBorders>
+            <w:tcMar>
+              <w:top w:type="dxa" w:w="60"/>
+              <w:left w:type="dxa" w:w="100"/>
+              <w:bottom w:type="dxa" w:w="60"/>
+              <w:right w:type="dxa" w:w="100"/>
+            </w:tcMar>
+          </w:tcPr>
+          <w:p>
+            <w:r>
+              <w:rPr>
+                <w:sz w:val="20"/>
+                <w:szCs w:val="20"/>
+              </w:rPr>
+              <w:t xml:space="preserve">O professor vê a imagem e indica a folha, sem precisar digitalizar de novo</w:t>
+            </w:r>
+          </w:p>
+        </w:tc>
+      </w:tr>
+      <w:tr>
+        <w:trPr>
+          <w:cantSplit/>
+        </w:trPr>
+        <w:tc>
+          <w:tcPr>
+            <w:tcW w:type="dxa" w:w="3628"/>
+            <w:tcBorders>
+              <w:top w:val="single" w:color="BFBFBF" w:sz="4"/>
+              <w:left w:val="single" w:color="BFBFBF" w:sz="4"/>
+              <w:bottom w:val="single" w:color="BFBFBF" w:sz="4"/>
+              <w:right w:val="single" w:color="BFBFBF" w:sz="4"/>
+            </w:tcBorders>
+            <w:tcMar>
+              <w:top w:type="dxa" w:w="60"/>
+              <w:left w:type="dxa" w:w="100"/>
+              <w:bottom w:type="dxa" w:w="60"/>
+              <w:right w:type="dxa" w:w="100"/>
+            </w:tcMar>
+          </w:tcPr>
+          <w:p>
+            <w:r>
+              <w:rPr>
+                <w:sz w:val="20"/>
+                <w:szCs w:val="20"/>
+              </w:rPr>
               <w:t xml:space="preserve">Questões travadas enquanto houver folhas</w:t>
             </w:r>
           </w:p>
@@ -42122,6 +44135,46 @@
       </w:r>
       <w:r>
         <w:t xml:space="preserve"> a contagem de códigos inexistentes recomeça quando o servidor reinicia, como o bloqueio de senhas.</w:t>
+      </w:r>
+    </w:p>
+    <w:p>
+      <w:pPr>
+        <w:pStyle w:val="ListParagraph"/>
+        <w:numPr>
+          <w:ilvl w:val="0"/>
+          <w:numId w:val="5"/>
+        </w:numPr>
+        <w:spacing w:after="80" w:line="290"/>
+      </w:pPr>
+      <w:r>
+        <w:rPr>
+          <w:b/>
+          <w:bCs/>
+        </w:rPr>
+        <w:t xml:space="preserve">Digitalizações fora da cópia diária:</w:t>
+      </w:r>
+      <w:r>
+        <w:t xml:space="preserve"> a cópia automática cobre só o banco. As imagens ficam na pasta de arquivos do servidor; o professor deve guardar os PDFs originais até o fim do semestre.</w:t>
+      </w:r>
+    </w:p>
+    <w:p>
+      <w:pPr>
+        <w:pStyle w:val="ListParagraph"/>
+        <w:numPr>
+          <w:ilvl w:val="0"/>
+          <w:numId w:val="5"/>
+        </w:numPr>
+        <w:spacing w:after="80" w:line="290"/>
+      </w:pPr>
+      <w:r>
+        <w:rPr>
+          <w:b/>
+          <w:bCs/>
+        </w:rPr>
+        <w:t xml:space="preserve">Fotos com perspectiva forte:</w:t>
+      </w:r>
+      <w:r>
+        <w:t xml:space="preserve"> o QR code costuma ser lido mesmo em fotos tortas, mas a leitura das respostas, na etapa seguinte, precisa das quatro marcas dos cantos visíveis na imagem.</w:t>
       </w:r>
     </w:p>
     <w:p>
@@ -43751,6 +45804,177 @@
                 <w:szCs w:val="20"/>
               </w:rPr>
               <w:t xml:space="preserve">Texto de instrução enviado ao modelo de linguagem</w:t>
+            </w:r>
+          </w:p>
+        </w:tc>
+      </w:tr>
+      <w:tr>
+        <w:trPr>
+          <w:cantSplit/>
+        </w:trPr>
+        <w:tc>
+          <w:tcPr>
+            <w:tcW w:type="dxa" w:w="2721"/>
+            <w:tcBorders>
+              <w:top w:val="single" w:color="BFBFBF" w:sz="4"/>
+              <w:left w:val="single" w:color="BFBFBF" w:sz="4"/>
+              <w:bottom w:val="single" w:color="BFBFBF" w:sz="4"/>
+              <w:right w:val="single" w:color="BFBFBF" w:sz="4"/>
+            </w:tcBorders>
+            <w:tcMar>
+              <w:top w:type="dxa" w:w="60"/>
+              <w:left w:type="dxa" w:w="100"/>
+              <w:bottom w:type="dxa" w:w="60"/>
+              <w:right w:type="dxa" w:w="100"/>
+            </w:tcMar>
+          </w:tcPr>
+          <w:p>
+            <w:r>
+              <w:rPr>
+                <w:sz w:val="20"/>
+                <w:szCs w:val="20"/>
+              </w:rPr>
+              <w:t xml:space="preserve">OpenCV</w:t>
+            </w:r>
+          </w:p>
+        </w:tc>
+        <w:tc>
+          <w:tcPr>
+            <w:tcW w:type="dxa" w:w="6350"/>
+            <w:tcBorders>
+              <w:top w:val="single" w:color="BFBFBF" w:sz="4"/>
+              <w:left w:val="single" w:color="BFBFBF" w:sz="4"/>
+              <w:bottom w:val="single" w:color="BFBFBF" w:sz="4"/>
+              <w:right w:val="single" w:color="BFBFBF" w:sz="4"/>
+            </w:tcBorders>
+            <w:tcMar>
+              <w:top w:type="dxa" w:w="60"/>
+              <w:left w:type="dxa" w:w="100"/>
+              <w:bottom w:type="dxa" w:w="60"/>
+              <w:right w:type="dxa" w:w="100"/>
+            </w:tcMar>
+          </w:tcPr>
+          <w:p>
+            <w:r>
+              <w:rPr>
+                <w:sz w:val="20"/>
+                <w:szCs w:val="20"/>
+              </w:rPr>
+              <w:t xml:space="preserve">Biblioteca aberta de processamento de imagens, usada para ler o QR code e, na etapa seguinte, para alinhar a página e ler as bolinhas</w:t>
+            </w:r>
+          </w:p>
+        </w:tc>
+      </w:tr>
+      <w:tr>
+        <w:trPr>
+          <w:cantSplit/>
+        </w:trPr>
+        <w:tc>
+          <w:tcPr>
+            <w:tcW w:type="dxa" w:w="2721"/>
+            <w:tcBorders>
+              <w:top w:val="single" w:color="BFBFBF" w:sz="4"/>
+              <w:left w:val="single" w:color="BFBFBF" w:sz="4"/>
+              <w:bottom w:val="single" w:color="BFBFBF" w:sz="4"/>
+              <w:right w:val="single" w:color="BFBFBF" w:sz="4"/>
+            </w:tcBorders>
+            <w:tcMar>
+              <w:top w:type="dxa" w:w="60"/>
+              <w:left w:type="dxa" w:w="100"/>
+              <w:bottom w:type="dxa" w:w="60"/>
+              <w:right w:type="dxa" w:w="100"/>
+            </w:tcMar>
+          </w:tcPr>
+          <w:p>
+            <w:r>
+              <w:rPr>
+                <w:sz w:val="20"/>
+                <w:szCs w:val="20"/>
+              </w:rPr>
+              <w:t xml:space="preserve">PyMuPDF</w:t>
+            </w:r>
+          </w:p>
+        </w:tc>
+        <w:tc>
+          <w:tcPr>
+            <w:tcW w:type="dxa" w:w="6350"/>
+            <w:tcBorders>
+              <w:top w:val="single" w:color="BFBFBF" w:sz="4"/>
+              <w:left w:val="single" w:color="BFBFBF" w:sz="4"/>
+              <w:bottom w:val="single" w:color="BFBFBF" w:sz="4"/>
+              <w:right w:val="single" w:color="BFBFBF" w:sz="4"/>
+            </w:tcBorders>
+            <w:tcMar>
+              <w:top w:type="dxa" w:w="60"/>
+              <w:left w:type="dxa" w:w="100"/>
+              <w:bottom w:type="dxa" w:w="60"/>
+              <w:right w:type="dxa" w:w="100"/>
+            </w:tcMar>
+          </w:tcPr>
+          <w:p>
+            <w:r>
+              <w:rPr>
+                <w:sz w:val="20"/>
+                <w:szCs w:val="20"/>
+              </w:rPr>
+              <w:t xml:space="preserve">Biblioteca para abrir arquivos PDF e converter as páginas em imagens</w:t>
+            </w:r>
+          </w:p>
+        </w:tc>
+      </w:tr>
+      <w:tr>
+        <w:trPr>
+          <w:cantSplit/>
+        </w:trPr>
+        <w:tc>
+          <w:tcPr>
+            <w:tcW w:type="dxa" w:w="2721"/>
+            <w:tcBorders>
+              <w:top w:val="single" w:color="BFBFBF" w:sz="4"/>
+              <w:left w:val="single" w:color="BFBFBF" w:sz="4"/>
+              <w:bottom w:val="single" w:color="BFBFBF" w:sz="4"/>
+              <w:right w:val="single" w:color="BFBFBF" w:sz="4"/>
+            </w:tcBorders>
+            <w:tcMar>
+              <w:top w:type="dxa" w:w="60"/>
+              <w:left w:type="dxa" w:w="100"/>
+              <w:bottom w:type="dxa" w:w="60"/>
+              <w:right w:type="dxa" w:w="100"/>
+            </w:tcMar>
+          </w:tcPr>
+          <w:p>
+            <w:r>
+              <w:rPr>
+                <w:sz w:val="20"/>
+                <w:szCs w:val="20"/>
+              </w:rPr>
+              <w:t xml:space="preserve">dpi</w:t>
+            </w:r>
+          </w:p>
+        </w:tc>
+        <w:tc>
+          <w:tcPr>
+            <w:tcW w:type="dxa" w:w="6350"/>
+            <w:tcBorders>
+              <w:top w:val="single" w:color="BFBFBF" w:sz="4"/>
+              <w:left w:val="single" w:color="BFBFBF" w:sz="4"/>
+              <w:bottom w:val="single" w:color="BFBFBF" w:sz="4"/>
+              <w:right w:val="single" w:color="BFBFBF" w:sz="4"/>
+            </w:tcBorders>
+            <w:tcMar>
+              <w:top w:type="dxa" w:w="60"/>
+              <w:left w:type="dxa" w:w="100"/>
+              <w:bottom w:type="dxa" w:w="60"/>
+              <w:right w:type="dxa" w:w="100"/>
+            </w:tcMar>
+          </w:tcPr>
+          <w:p>
+            <w:r>
+              <w:rPr>
+                <w:sz w:val="20"/>
+                <w:szCs w:val="20"/>
+              </w:rPr>
+              <w:t xml:space="preserve">Pontos por polegada: a resolução de uma digitalização. A 200 dpi, um milímetro da folha tem cerca de 8 pixels</w:t>
             </w:r>
           </w:p>
         </w:tc>
@@ -45172,6 +47396,115 @@
                 <w:sz w:val="20"/>
                 <w:szCs w:val="20"/>
               </w:rPr>
+              <w:t xml:space="preserve">0.17</w:t>
+            </w:r>
+          </w:p>
+        </w:tc>
+        <w:tc>
+          <w:tcPr>
+            <w:tcW w:type="dxa" w:w="2267"/>
+            <w:tcBorders>
+              <w:top w:val="single" w:color="BFBFBF" w:sz="4"/>
+              <w:left w:val="single" w:color="BFBFBF" w:sz="4"/>
+              <w:bottom w:val="single" w:color="BFBFBF" w:sz="4"/>
+              <w:right w:val="single" w:color="BFBFBF" w:sz="4"/>
+            </w:tcBorders>
+            <w:tcMar>
+              <w:top w:type="dxa" w:w="60"/>
+              <w:left w:type="dxa" w:w="100"/>
+              <w:bottom w:type="dxa" w:w="60"/>
+              <w:right w:type="dxa" w:w="100"/>
+            </w:tcMar>
+          </w:tcPr>
+          <w:p>
+            <w:r>
+              <w:rPr>
+                <w:sz w:val="20"/>
+                <w:szCs w:val="20"/>
+              </w:rPr>
+              <w:t xml:space="preserve">pull request das digitalizações</w:t>
+            </w:r>
+          </w:p>
+        </w:tc>
+        <w:tc>
+          <w:tcPr>
+            <w:tcW w:type="dxa" w:w="4084"/>
+            <w:tcBorders>
+              <w:top w:val="single" w:color="BFBFBF" w:sz="4"/>
+              <w:left w:val="single" w:color="BFBFBF" w:sz="4"/>
+              <w:bottom w:val="single" w:color="BFBFBF" w:sz="4"/>
+              <w:right w:val="single" w:color="BFBFBF" w:sz="4"/>
+            </w:tcBorders>
+            <w:tcMar>
+              <w:top w:type="dxa" w:w="60"/>
+              <w:left w:type="dxa" w:w="100"/>
+              <w:bottom w:type="dxa" w:w="60"/>
+              <w:right w:type="dxa" w:w="100"/>
+            </w:tcMar>
+          </w:tcPr>
+          <w:p>
+            <w:r>
+              <w:rPr>
+                <w:sz w:val="20"/>
+                <w:szCs w:val="20"/>
+              </w:rPr>
+              <w:t xml:space="preserve">Envio de PDF ou fotos das folhas respondidas, identificação de cada página pelo QR code, conferência das páginas não identificadas e imagem ao lado das respostas da folha; atividade com respostas ou digitalizações não pode ser excluída</w:t>
+            </w:r>
+          </w:p>
+        </w:tc>
+      </w:tr>
+      <w:tr>
+        <w:trPr>
+          <w:cantSplit/>
+        </w:trPr>
+        <w:tc>
+          <w:tcPr>
+            <w:tcW w:type="dxa" w:w="1511"/>
+            <w:tcBorders>
+              <w:top w:val="single" w:color="BFBFBF" w:sz="4"/>
+              <w:left w:val="single" w:color="BFBFBF" w:sz="4"/>
+              <w:bottom w:val="single" w:color="BFBFBF" w:sz="4"/>
+              <w:right w:val="single" w:color="BFBFBF" w:sz="4"/>
+            </w:tcBorders>
+            <w:tcMar>
+              <w:top w:type="dxa" w:w="60"/>
+              <w:left w:type="dxa" w:w="100"/>
+              <w:bottom w:type="dxa" w:w="60"/>
+              <w:right w:type="dxa" w:w="100"/>
+            </w:tcMar>
+          </w:tcPr>
+          <w:p>
+            <w:r>
+              <w:rPr>
+                <w:sz w:val="20"/>
+                <w:szCs w:val="20"/>
+              </w:rPr>
+              <w:t xml:space="preserve">31/10/2026</w:t>
+            </w:r>
+          </w:p>
+        </w:tc>
+        <w:tc>
+          <w:tcPr>
+            <w:tcW w:type="dxa" w:w="1209"/>
+            <w:tcBorders>
+              <w:top w:val="single" w:color="BFBFBF" w:sz="4"/>
+              <w:left w:val="single" w:color="BFBFBF" w:sz="4"/>
+              <w:bottom w:val="single" w:color="BFBFBF" w:sz="4"/>
+              <w:right w:val="single" w:color="BFBFBF" w:sz="4"/>
+            </w:tcBorders>
+            <w:tcMar>
+              <w:top w:type="dxa" w:w="60"/>
+              <w:left w:type="dxa" w:w="100"/>
+              <w:bottom w:type="dxa" w:w="60"/>
+              <w:right w:type="dxa" w:w="100"/>
+            </w:tcMar>
+          </w:tcPr>
+          <w:p>
+            <w:r>
+              <w:rPr>
+                <w:sz w:val="20"/>
+                <w:szCs w:val="20"/>
+              </w:rPr>
               <w:t xml:space="preserve">0.16</w:t>
             </w:r>
           </w:p>
@@ -47076,6 +49409,32 @@
       </w:pPr>
       <w:r>
         <w:t xml:space="preserve">BRAILLE INSTITUTE. Atkinson Hyperlegible Font. Disponível em: https://www.brailleinstitute.org/freefont/. Acesso em: 23 out. 2026.</w:t>
+      </w:r>
+    </w:p>
+    <w:p>
+      <w:pPr>
+        <w:pStyle w:val="ListParagraph"/>
+        <w:numPr>
+          <w:ilvl w:val="0"/>
+          <w:numId w:val="5"/>
+        </w:numPr>
+        <w:spacing w:after="80" w:line="290"/>
+      </w:pPr>
+      <w:r>
+        <w:t xml:space="preserve">OPENCV. OpenCV: Open Source Computer Vision Library. Disponível em: https://opencv.org/. Acesso em: 31 out. 2026.</w:t>
+      </w:r>
+    </w:p>
+    <w:p>
+      <w:pPr>
+        <w:pStyle w:val="ListParagraph"/>
+        <w:numPr>
+          <w:ilvl w:val="0"/>
+          <w:numId w:val="5"/>
+        </w:numPr>
+        <w:spacing w:after="80" w:line="290"/>
+      </w:pPr>
+      <w:r>
+        <w:t xml:space="preserve">ARTIFEX. PyMuPDF Documentation. Disponível em: https://pymupdf.readthedocs.io/. Acesso em: 31 out. 2026.</w:t>
       </w:r>
     </w:p>
     <w:p>
@@ -47242,7 +49601,7 @@
         <w:sz w:val="18"/>
         <w:szCs w:val="18"/>
       </w:rPr>
-      <w:t xml:space="preserve">Documentação Técnica do Protótipo, versão 0.16</w:t>
+      <w:t xml:space="preserve">Documentação Técnica do Protótipo, versão 0.17</w:t>
     </w:r>
   </w:p>
 </w:hdr>

</xml_diff>

<commit_message>
Documentação 0.18 e guia do Google Cloud Vision
Co-Authored-By: Claude Opus 5.5 <noreply@anthropic.com>
Claude-Session: https://claude.ai/code/session_01W2sxSqc4ZdmAUWH2L8vsV2
</commit_message>
<xml_diff>
--- a/docs/Documentacao_Tecnica.docx
+++ b/docs/Documentacao_Tecnica.docx
@@ -114,7 +114,7 @@
         <w:t xml:space="preserve">Versão: </w:t>
       </w:r>
       <w:r>
-        <w:t xml:space="preserve">0.17, de 31/10/2026</w:t>
+        <w:t xml:space="preserve">0.18, de 31/10/2026</w:t>
       </w:r>
     </w:p>
     <w:p>
@@ -481,7 +481,7 @@
                 <w:sz w:val="20"/>
                 <w:szCs w:val="20"/>
               </w:rPr>
-              <w:t xml:space="preserve">Reconhecimento de texto manuscrito (fase posterior, medida à parte)</w:t>
+              <w:t xml:space="preserve">Treinamento de um reconhecedor de escrita próprio: a transcrição usa um serviço pronto e é sempre conferida pelo professor</w:t>
             </w:r>
           </w:p>
         </w:tc>
@@ -831,6 +831,55 @@
                 <w:szCs w:val="20"/>
               </w:rPr>
               <w:t xml:space="preserve">Folhas de resposta com código, correção da turma e consulta do resultado pelo aluno com o código, sem login</w:t>
+            </w:r>
+          </w:p>
+        </w:tc>
+        <w:tc>
+          <w:tcPr>
+            <w:tcW w:type="dxa" w:w="4536"/>
+            <w:tcBorders>
+              <w:top w:val="single" w:color="BFBFBF" w:sz="4"/>
+              <w:left w:val="single" w:color="BFBFBF" w:sz="4"/>
+              <w:bottom w:val="single" w:color="BFBFBF" w:sz="4"/>
+              <w:right w:val="single" w:color="BFBFBF" w:sz="4"/>
+            </w:tcBorders>
+            <w:tcMar>
+              <w:top w:type="dxa" w:w="60"/>
+              <w:left w:type="dxa" w:w="100"/>
+              <w:bottom w:type="dxa" w:w="60"/>
+              <w:right w:type="dxa" w:w="100"/>
+            </w:tcMar>
+          </w:tcPr>
+          <w:p/>
+        </w:tc>
+      </w:tr>
+      <w:tr>
+        <w:trPr>
+          <w:cantSplit/>
+        </w:trPr>
+        <w:tc>
+          <w:tcPr>
+            <w:tcW w:type="dxa" w:w="4535"/>
+            <w:tcBorders>
+              <w:top w:val="single" w:color="BFBFBF" w:sz="4"/>
+              <w:left w:val="single" w:color="BFBFBF" w:sz="4"/>
+              <w:bottom w:val="single" w:color="BFBFBF" w:sz="4"/>
+              <w:right w:val="single" w:color="BFBFBF" w:sz="4"/>
+            </w:tcBorders>
+            <w:tcMar>
+              <w:top w:type="dxa" w:w="60"/>
+              <w:left w:type="dxa" w:w="100"/>
+              <w:bottom w:type="dxa" w:w="60"/>
+              <w:right w:type="dxa" w:w="100"/>
+            </w:tcMar>
+          </w:tcPr>
+          <w:p>
+            <w:r>
+              <w:rPr>
+                <w:sz w:val="20"/>
+                <w:szCs w:val="20"/>
+              </w:rPr>
+              <w:t xml:space="preserve">Leitura automática das folhas digitalizadas (bolinhas e escrita), com conferência do professor e medida da taxa de acerto</w:t>
             </w:r>
           </w:p>
         </w:tc>
@@ -1881,6 +1930,89 @@
                 <w:sz w:val="20"/>
                 <w:szCs w:val="20"/>
               </w:rPr>
+              <w:t xml:space="preserve">Apoio</w:t>
+            </w:r>
+          </w:p>
+        </w:tc>
+        <w:tc>
+          <w:tcPr>
+            <w:tcW w:type="dxa" w:w="4535"/>
+            <w:tcBorders>
+              <w:top w:val="single" w:color="BFBFBF" w:sz="4"/>
+              <w:left w:val="single" w:color="BFBFBF" w:sz="4"/>
+              <w:bottom w:val="single" w:color="BFBFBF" w:sz="4"/>
+              <w:right w:val="single" w:color="BFBFBF" w:sz="4"/>
+            </w:tcBorders>
+            <w:tcMar>
+              <w:top w:type="dxa" w:w="60"/>
+              <w:left w:type="dxa" w:w="100"/>
+              <w:bottom w:type="dxa" w:w="60"/>
+              <w:right w:type="dxa" w:w="100"/>
+            </w:tcMar>
+          </w:tcPr>
+          <w:p>
+            <w:r>
+              <w:rPr>
+                <w:sz w:val="20"/>
+                <w:szCs w:val="20"/>
+              </w:rPr>
+              <w:t xml:space="preserve">Leitura automática das bolinhas e da escrita, com conferência</w:t>
+            </w:r>
+          </w:p>
+        </w:tc>
+        <w:tc>
+          <w:tcPr>
+            <w:tcW w:type="dxa" w:w="3629"/>
+            <w:tcBorders>
+              <w:top w:val="single" w:color="BFBFBF" w:sz="4"/>
+              <w:left w:val="single" w:color="BFBFBF" w:sz="4"/>
+              <w:bottom w:val="single" w:color="BFBFBF" w:sz="4"/>
+              <w:right w:val="single" w:color="BFBFBF" w:sz="4"/>
+            </w:tcBorders>
+            <w:tcMar>
+              <w:top w:type="dxa" w:w="60"/>
+              <w:left w:type="dxa" w:w="100"/>
+              <w:bottom w:type="dxa" w:w="60"/>
+              <w:right w:type="dxa" w:w="100"/>
+            </w:tcMar>
+          </w:tcPr>
+          <w:p>
+            <w:r>
+              <w:rPr>
+                <w:sz w:val="20"/>
+                <w:szCs w:val="20"/>
+              </w:rPr>
+              <w:t xml:space="preserve">Implementado em 31/10/2026; aguardando revisão e folhas reais para medir a taxa de acerto</w:t>
+            </w:r>
+          </w:p>
+        </w:tc>
+      </w:tr>
+      <w:tr>
+        <w:trPr>
+          <w:cantSplit/>
+        </w:trPr>
+        <w:tc>
+          <w:tcPr>
+            <w:tcW w:type="dxa" w:w="907"/>
+            <w:tcBorders>
+              <w:top w:val="single" w:color="BFBFBF" w:sz="4"/>
+              <w:left w:val="single" w:color="BFBFBF" w:sz="4"/>
+              <w:bottom w:val="single" w:color="BFBFBF" w:sz="4"/>
+              <w:right w:val="single" w:color="BFBFBF" w:sz="4"/>
+            </w:tcBorders>
+            <w:tcMar>
+              <w:top w:type="dxa" w:w="60"/>
+              <w:left w:type="dxa" w:w="100"/>
+              <w:bottom w:type="dxa" w:w="60"/>
+              <w:right w:type="dxa" w:w="100"/>
+            </w:tcMar>
+          </w:tcPr>
+          <w:p>
+            <w:r>
+              <w:rPr>
+                <w:sz w:val="20"/>
+                <w:szCs w:val="20"/>
+              </w:rPr>
               <w:t xml:space="preserve">5</w:t>
             </w:r>
           </w:p>
@@ -3707,7 +3839,7 @@
                 <w:sz w:val="20"/>
                 <w:szCs w:val="20"/>
               </w:rPr>
-              <w:t xml:space="preserve">Definição das quinze tabelas do banco</w:t>
+              <w:t xml:space="preserve">Definição das dezesseis tabelas do banco</w:t>
             </w:r>
           </w:p>
         </w:tc>
@@ -4281,6 +4413,154 @@
                 <w:szCs w:val="20"/>
               </w:rPr>
               <w:t xml:space="preserve"> e </w:t>
+            </w:r>
+            <w:r>
+              <w:rPr>
+                <w:rFonts w:ascii="Consolas" w:cs="Consolas" w:eastAsia="Consolas" w:hAnsi="Consolas"/>
+                <w:sz w:val="20"/>
+                <w:szCs w:val="20"/>
+              </w:rPr>
+              <w:t xml:space="preserve">router.py</w:t>
+            </w:r>
+            <w:r>
+              <w:rPr>
+                <w:sz w:val="20"/>
+                <w:szCs w:val="20"/>
+              </w:rPr>
+              <w:t xml:space="preserve">)</w:t>
+            </w:r>
+          </w:p>
+        </w:tc>
+      </w:tr>
+      <w:tr>
+        <w:trPr>
+          <w:cantSplit/>
+        </w:trPr>
+        <w:tc>
+          <w:tcPr>
+            <w:tcW w:type="dxa" w:w="2721"/>
+            <w:tcBorders>
+              <w:top w:val="single" w:color="BFBFBF" w:sz="4"/>
+              <w:left w:val="single" w:color="BFBFBF" w:sz="4"/>
+              <w:bottom w:val="single" w:color="BFBFBF" w:sz="4"/>
+              <w:right w:val="single" w:color="BFBFBF" w:sz="4"/>
+            </w:tcBorders>
+            <w:tcMar>
+              <w:top w:type="dxa" w:w="60"/>
+              <w:left w:type="dxa" w:w="100"/>
+              <w:bottom w:type="dxa" w:w="60"/>
+              <w:right w:type="dxa" w:w="100"/>
+            </w:tcMar>
+          </w:tcPr>
+          <w:p>
+            <w:r>
+              <w:rPr>
+                <w:rFonts w:ascii="Consolas" w:cs="Consolas" w:eastAsia="Consolas" w:hAnsi="Consolas"/>
+                <w:sz w:val="20"/>
+                <w:szCs w:val="20"/>
+              </w:rPr>
+              <w:t xml:space="preserve">app/leitura/</w:t>
+            </w:r>
+          </w:p>
+        </w:tc>
+        <w:tc>
+          <w:tcPr>
+            <w:tcW w:type="dxa" w:w="6350"/>
+            <w:tcBorders>
+              <w:top w:val="single" w:color="BFBFBF" w:sz="4"/>
+              <w:left w:val="single" w:color="BFBFBF" w:sz="4"/>
+              <w:bottom w:val="single" w:color="BFBFBF" w:sz="4"/>
+              <w:right w:val="single" w:color="BFBFBF" w:sz="4"/>
+            </w:tcBorders>
+            <w:tcMar>
+              <w:top w:type="dxa" w:w="60"/>
+              <w:left w:type="dxa" w:w="100"/>
+              <w:bottom w:type="dxa" w:w="60"/>
+              <w:right w:type="dxa" w:w="100"/>
+            </w:tcMar>
+          </w:tcPr>
+          <w:p>
+            <w:r>
+              <w:rPr>
+                <w:sz w:val="20"/>
+                <w:szCs w:val="20"/>
+              </w:rPr>
+              <w:t xml:space="preserve">Leitura automática: alinhamento pelas marcas (</w:t>
+            </w:r>
+            <w:r>
+              <w:rPr>
+                <w:rFonts w:ascii="Consolas" w:cs="Consolas" w:eastAsia="Consolas" w:hAnsi="Consolas"/>
+                <w:sz w:val="20"/>
+                <w:szCs w:val="20"/>
+              </w:rPr>
+              <w:t xml:space="preserve">alinhamento.py</w:t>
+            </w:r>
+            <w:r>
+              <w:rPr>
+                <w:sz w:val="20"/>
+                <w:szCs w:val="20"/>
+              </w:rPr>
+              <w:t xml:space="preserve">), bolinhas (</w:t>
+            </w:r>
+            <w:r>
+              <w:rPr>
+                <w:rFonts w:ascii="Consolas" w:cs="Consolas" w:eastAsia="Consolas" w:hAnsi="Consolas"/>
+                <w:sz w:val="20"/>
+                <w:szCs w:val="20"/>
+              </w:rPr>
+              <w:t xml:space="preserve">bolhas.py</w:t>
+            </w:r>
+            <w:r>
+              <w:rPr>
+                <w:sz w:val="20"/>
+                <w:szCs w:val="20"/>
+              </w:rPr>
+              <w:t xml:space="preserve">), transcrição com o Google Cloud Vision (</w:t>
+            </w:r>
+            <w:r>
+              <w:rPr>
+                <w:rFonts w:ascii="Consolas" w:cs="Consolas" w:eastAsia="Consolas" w:hAnsi="Consolas"/>
+                <w:sz w:val="20"/>
+                <w:szCs w:val="20"/>
+              </w:rPr>
+              <w:t xml:space="preserve">ocr.py</w:t>
+            </w:r>
+            <w:r>
+              <w:rPr>
+                <w:sz w:val="20"/>
+                <w:szCs w:val="20"/>
+              </w:rPr>
+              <w:t xml:space="preserve">), regras e conferência (</w:t>
+            </w:r>
+            <w:r>
+              <w:rPr>
+                <w:rFonts w:ascii="Consolas" w:cs="Consolas" w:eastAsia="Consolas" w:hAnsi="Consolas"/>
+                <w:sz w:val="20"/>
+                <w:szCs w:val="20"/>
+              </w:rPr>
+              <w:t xml:space="preserve">servico.py</w:t>
+            </w:r>
+            <w:r>
+              <w:rPr>
+                <w:sz w:val="20"/>
+                <w:szCs w:val="20"/>
+              </w:rPr>
+              <w:t xml:space="preserve">), leitura em lote (</w:t>
+            </w:r>
+            <w:r>
+              <w:rPr>
+                <w:rFonts w:ascii="Consolas" w:cs="Consolas" w:eastAsia="Consolas" w:hAnsi="Consolas"/>
+                <w:sz w:val="20"/>
+                <w:szCs w:val="20"/>
+              </w:rPr>
+              <w:t xml:space="preserve">lote.py</w:t>
+            </w:r>
+            <w:r>
+              <w:rPr>
+                <w:sz w:val="20"/>
+                <w:szCs w:val="20"/>
+              </w:rPr>
+              <w:t xml:space="preserve">) e rotas (</w:t>
             </w:r>
             <w:r>
               <w:rPr>
@@ -5296,7 +5576,7 @@
         <w:spacing w:after="120" w:line="300"/>
       </w:pPr>
       <w:r>
-        <w:t xml:space="preserve">O banco tem quinze tabelas. As oito primeiras foram criadas pela migração inicial do Alembic, a tabela </w:t>
+        <w:t xml:space="preserve">O banco tem dezesseis tabelas. As oito primeiras foram criadas pela migração inicial do Alembic, a tabela </w:t>
       </w:r>
       <w:r>
         <w:rPr>
@@ -5362,7 +5642,7 @@
         <w:t xml:space="preserve">folha</w:t>
       </w:r>
       <w:r>
-        <w:t xml:space="preserve"> pela migração das folhas de resposta, e a tabela </w:t>
+        <w:t xml:space="preserve"> pela migração das folhas de resposta, a tabela </w:t>
       </w:r>
       <w:r>
         <w:rPr>
@@ -5373,7 +5653,18 @@
         <w:t xml:space="preserve">pagina_digitalizada</w:t>
       </w:r>
       <w:r>
-        <w:t xml:space="preserve"> pela migração das digitalizações. Duas delas existem por razão metodológica e não devem ser simplificadas: </w:t>
+        <w:t xml:space="preserve"> pela migração das digitalizações, e a tabela </w:t>
+      </w:r>
+      <w:r>
+        <w:rPr>
+          <w:rFonts w:ascii="Consolas" w:cs="Consolas" w:eastAsia="Consolas" w:hAnsi="Consolas"/>
+          <w:sz w:val="20"/>
+          <w:szCs w:val="20"/>
+        </w:rPr>
+        <w:t xml:space="preserve">leitura_pagina</w:t>
+      </w:r>
+      <w:r>
+        <w:t xml:space="preserve"> pela migração da leitura automática. Duas delas existem por razão metodológica e não devem ser simplificadas: </w:t>
       </w:r>
       <w:r>
         <w:rPr>
@@ -12673,6 +12964,1084 @@
                 <w:szCs w:val="20"/>
               </w:rPr>
               <w:t xml:space="preserve">Momento do envio</w:t>
+            </w:r>
+          </w:p>
+        </w:tc>
+      </w:tr>
+    </w:tbl>
+    <w:p>
+      <w:pPr>
+        <w:spacing w:after="120"/>
+      </w:pPr>
+    </w:p>
+    <w:p>
+      <w:pPr>
+        <w:pStyle w:val="Heading3"/>
+      </w:pPr>
+      <w:r>
+        <w:t xml:space="preserve">leitura_pagina</w:t>
+      </w:r>
+    </w:p>
+    <w:tbl>
+      <w:tblPr>
+        <w:tblW w:type="dxa" w:w="9071"/>
+        <w:tblBorders>
+          <w:top w:val="single" w:color="auto" w:sz="4"/>
+          <w:left w:val="single" w:color="auto" w:sz="4"/>
+          <w:bottom w:val="single" w:color="auto" w:sz="4"/>
+          <w:right w:val="single" w:color="auto" w:sz="4"/>
+          <w:insideH w:val="single" w:color="auto" w:sz="4"/>
+          <w:insideV w:val="single" w:color="auto" w:sz="4"/>
+        </w:tblBorders>
+      </w:tblPr>
+      <w:tblGrid>
+        <w:gridCol w:w="2473"/>
+        <w:gridCol w:w="1649"/>
+        <w:gridCol w:w="4949"/>
+      </w:tblGrid>
+      <w:tr>
+        <w:trPr>
+          <w:tblHeader/>
+        </w:trPr>
+        <w:tc>
+          <w:tcPr>
+            <w:tcW w:type="dxa" w:w="2473"/>
+            <w:tcBorders>
+              <w:top w:val="single" w:color="BFBFBF" w:sz="4"/>
+              <w:left w:val="single" w:color="BFBFBF" w:sz="4"/>
+              <w:bottom w:val="single" w:color="BFBFBF" w:sz="4"/>
+              <w:right w:val="single" w:color="BFBFBF" w:sz="4"/>
+            </w:tcBorders>
+            <w:shd w:fill="D9E2F3" w:color="auto" w:val="clear"/>
+            <w:tcMar>
+              <w:top w:type="dxa" w:w="60"/>
+              <w:left w:type="dxa" w:w="100"/>
+              <w:bottom w:type="dxa" w:w="60"/>
+              <w:right w:type="dxa" w:w="100"/>
+            </w:tcMar>
+          </w:tcPr>
+          <w:p>
+            <w:r>
+              <w:rPr>
+                <w:b/>
+                <w:bCs/>
+                <w:sz w:val="20"/>
+                <w:szCs w:val="20"/>
+              </w:rPr>
+              <w:t xml:space="preserve">Campo</w:t>
+            </w:r>
+          </w:p>
+        </w:tc>
+        <w:tc>
+          <w:tcPr>
+            <w:tcW w:type="dxa" w:w="1649"/>
+            <w:tcBorders>
+              <w:top w:val="single" w:color="BFBFBF" w:sz="4"/>
+              <w:left w:val="single" w:color="BFBFBF" w:sz="4"/>
+              <w:bottom w:val="single" w:color="BFBFBF" w:sz="4"/>
+              <w:right w:val="single" w:color="BFBFBF" w:sz="4"/>
+            </w:tcBorders>
+            <w:shd w:fill="D9E2F3" w:color="auto" w:val="clear"/>
+            <w:tcMar>
+              <w:top w:type="dxa" w:w="60"/>
+              <w:left w:type="dxa" w:w="100"/>
+              <w:bottom w:type="dxa" w:w="60"/>
+              <w:right w:type="dxa" w:w="100"/>
+            </w:tcMar>
+          </w:tcPr>
+          <w:p>
+            <w:r>
+              <w:rPr>
+                <w:b/>
+                <w:bCs/>
+                <w:sz w:val="20"/>
+                <w:szCs w:val="20"/>
+              </w:rPr>
+              <w:t xml:space="preserve">Tipo</w:t>
+            </w:r>
+          </w:p>
+        </w:tc>
+        <w:tc>
+          <w:tcPr>
+            <w:tcW w:type="dxa" w:w="4949"/>
+            <w:tcBorders>
+              <w:top w:val="single" w:color="BFBFBF" w:sz="4"/>
+              <w:left w:val="single" w:color="BFBFBF" w:sz="4"/>
+              <w:bottom w:val="single" w:color="BFBFBF" w:sz="4"/>
+              <w:right w:val="single" w:color="BFBFBF" w:sz="4"/>
+            </w:tcBorders>
+            <w:shd w:fill="D9E2F3" w:color="auto" w:val="clear"/>
+            <w:tcMar>
+              <w:top w:type="dxa" w:w="60"/>
+              <w:left w:type="dxa" w:w="100"/>
+              <w:bottom w:type="dxa" w:w="60"/>
+              <w:right w:type="dxa" w:w="100"/>
+            </w:tcMar>
+          </w:tcPr>
+          <w:p>
+            <w:r>
+              <w:rPr>
+                <w:b/>
+                <w:bCs/>
+                <w:sz w:val="20"/>
+                <w:szCs w:val="20"/>
+              </w:rPr>
+              <w:t xml:space="preserve">Descrição</w:t>
+            </w:r>
+          </w:p>
+        </w:tc>
+      </w:tr>
+      <w:tr>
+        <w:trPr>
+          <w:cantSplit/>
+        </w:trPr>
+        <w:tc>
+          <w:tcPr>
+            <w:tcW w:type="dxa" w:w="2473"/>
+            <w:tcBorders>
+              <w:top w:val="single" w:color="BFBFBF" w:sz="4"/>
+              <w:left w:val="single" w:color="BFBFBF" w:sz="4"/>
+              <w:bottom w:val="single" w:color="BFBFBF" w:sz="4"/>
+              <w:right w:val="single" w:color="BFBFBF" w:sz="4"/>
+            </w:tcBorders>
+            <w:tcMar>
+              <w:top w:type="dxa" w:w="60"/>
+              <w:left w:type="dxa" w:w="100"/>
+              <w:bottom w:type="dxa" w:w="60"/>
+              <w:right w:type="dxa" w:w="100"/>
+            </w:tcMar>
+          </w:tcPr>
+          <w:p>
+            <w:r>
+              <w:rPr>
+                <w:rFonts w:ascii="Consolas" w:cs="Consolas" w:eastAsia="Consolas" w:hAnsi="Consolas"/>
+                <w:sz w:val="20"/>
+                <w:szCs w:val="20"/>
+              </w:rPr>
+              <w:t xml:space="preserve">id</w:t>
+            </w:r>
+          </w:p>
+        </w:tc>
+        <w:tc>
+          <w:tcPr>
+            <w:tcW w:type="dxa" w:w="1649"/>
+            <w:tcBorders>
+              <w:top w:val="single" w:color="BFBFBF" w:sz="4"/>
+              <w:left w:val="single" w:color="BFBFBF" w:sz="4"/>
+              <w:bottom w:val="single" w:color="BFBFBF" w:sz="4"/>
+              <w:right w:val="single" w:color="BFBFBF" w:sz="4"/>
+            </w:tcBorders>
+            <w:tcMar>
+              <w:top w:type="dxa" w:w="60"/>
+              <w:left w:type="dxa" w:w="100"/>
+              <w:bottom w:type="dxa" w:w="60"/>
+              <w:right w:type="dxa" w:w="100"/>
+            </w:tcMar>
+          </w:tcPr>
+          <w:p>
+            <w:r>
+              <w:rPr>
+                <w:sz w:val="20"/>
+                <w:szCs w:val="20"/>
+              </w:rPr>
+              <w:t xml:space="preserve">inteiro</w:t>
+            </w:r>
+          </w:p>
+        </w:tc>
+        <w:tc>
+          <w:tcPr>
+            <w:tcW w:type="dxa" w:w="4949"/>
+            <w:tcBorders>
+              <w:top w:val="single" w:color="BFBFBF" w:sz="4"/>
+              <w:left w:val="single" w:color="BFBFBF" w:sz="4"/>
+              <w:bottom w:val="single" w:color="BFBFBF" w:sz="4"/>
+              <w:right w:val="single" w:color="BFBFBF" w:sz="4"/>
+            </w:tcBorders>
+            <w:tcMar>
+              <w:top w:type="dxa" w:w="60"/>
+              <w:left w:type="dxa" w:w="100"/>
+              <w:bottom w:type="dxa" w:w="60"/>
+              <w:right w:type="dxa" w:w="100"/>
+            </w:tcMar>
+          </w:tcPr>
+          <w:p>
+            <w:r>
+              <w:rPr>
+                <w:sz w:val="20"/>
+                <w:szCs w:val="20"/>
+              </w:rPr>
+              <w:t xml:space="preserve">Identificador</w:t>
+            </w:r>
+          </w:p>
+        </w:tc>
+      </w:tr>
+      <w:tr>
+        <w:trPr>
+          <w:cantSplit/>
+        </w:trPr>
+        <w:tc>
+          <w:tcPr>
+            <w:tcW w:type="dxa" w:w="2473"/>
+            <w:tcBorders>
+              <w:top w:val="single" w:color="BFBFBF" w:sz="4"/>
+              <w:left w:val="single" w:color="BFBFBF" w:sz="4"/>
+              <w:bottom w:val="single" w:color="BFBFBF" w:sz="4"/>
+              <w:right w:val="single" w:color="BFBFBF" w:sz="4"/>
+            </w:tcBorders>
+            <w:tcMar>
+              <w:top w:type="dxa" w:w="60"/>
+              <w:left w:type="dxa" w:w="100"/>
+              <w:bottom w:type="dxa" w:w="60"/>
+              <w:right w:type="dxa" w:w="100"/>
+            </w:tcMar>
+          </w:tcPr>
+          <w:p>
+            <w:r>
+              <w:rPr>
+                <w:rFonts w:ascii="Consolas" w:cs="Consolas" w:eastAsia="Consolas" w:hAnsi="Consolas"/>
+                <w:sz w:val="20"/>
+                <w:szCs w:val="20"/>
+              </w:rPr>
+              <w:t xml:space="preserve">pagina_digitalizada_id</w:t>
+            </w:r>
+          </w:p>
+        </w:tc>
+        <w:tc>
+          <w:tcPr>
+            <w:tcW w:type="dxa" w:w="1649"/>
+            <w:tcBorders>
+              <w:top w:val="single" w:color="BFBFBF" w:sz="4"/>
+              <w:left w:val="single" w:color="BFBFBF" w:sz="4"/>
+              <w:bottom w:val="single" w:color="BFBFBF" w:sz="4"/>
+              <w:right w:val="single" w:color="BFBFBF" w:sz="4"/>
+            </w:tcBorders>
+            <w:tcMar>
+              <w:top w:type="dxa" w:w="60"/>
+              <w:left w:type="dxa" w:w="100"/>
+              <w:bottom w:type="dxa" w:w="60"/>
+              <w:right w:type="dxa" w:w="100"/>
+            </w:tcMar>
+          </w:tcPr>
+          <w:p>
+            <w:r>
+              <w:rPr>
+                <w:sz w:val="20"/>
+                <w:szCs w:val="20"/>
+              </w:rPr>
+              <w:t xml:space="preserve">inteiro</w:t>
+            </w:r>
+          </w:p>
+        </w:tc>
+        <w:tc>
+          <w:tcPr>
+            <w:tcW w:type="dxa" w:w="4949"/>
+            <w:tcBorders>
+              <w:top w:val="single" w:color="BFBFBF" w:sz="4"/>
+              <w:left w:val="single" w:color="BFBFBF" w:sz="4"/>
+              <w:bottom w:val="single" w:color="BFBFBF" w:sz="4"/>
+              <w:right w:val="single" w:color="BFBFBF" w:sz="4"/>
+            </w:tcBorders>
+            <w:tcMar>
+              <w:top w:type="dxa" w:w="60"/>
+              <w:left w:type="dxa" w:w="100"/>
+              <w:bottom w:type="dxa" w:w="60"/>
+              <w:right w:type="dxa" w:w="100"/>
+            </w:tcMar>
+          </w:tcPr>
+          <w:p>
+            <w:r>
+              <w:rPr>
+                <w:sz w:val="20"/>
+                <w:szCs w:val="20"/>
+              </w:rPr>
+              <w:t xml:space="preserve">Página lida; uma leitura por página, e uma nova leitura substitui a anterior</w:t>
+            </w:r>
+          </w:p>
+        </w:tc>
+      </w:tr>
+      <w:tr>
+        <w:trPr>
+          <w:cantSplit/>
+        </w:trPr>
+        <w:tc>
+          <w:tcPr>
+            <w:tcW w:type="dxa" w:w="2473"/>
+            <w:tcBorders>
+              <w:top w:val="single" w:color="BFBFBF" w:sz="4"/>
+              <w:left w:val="single" w:color="BFBFBF" w:sz="4"/>
+              <w:bottom w:val="single" w:color="BFBFBF" w:sz="4"/>
+              <w:right w:val="single" w:color="BFBFBF" w:sz="4"/>
+            </w:tcBorders>
+            <w:tcMar>
+              <w:top w:type="dxa" w:w="60"/>
+              <w:left w:type="dxa" w:w="100"/>
+              <w:bottom w:type="dxa" w:w="60"/>
+              <w:right w:type="dxa" w:w="100"/>
+            </w:tcMar>
+          </w:tcPr>
+          <w:p>
+            <w:r>
+              <w:rPr>
+                <w:rFonts w:ascii="Consolas" w:cs="Consolas" w:eastAsia="Consolas" w:hAnsi="Consolas"/>
+                <w:sz w:val="20"/>
+                <w:szCs w:val="20"/>
+              </w:rPr>
+              <w:t xml:space="preserve">situacao</w:t>
+            </w:r>
+          </w:p>
+        </w:tc>
+        <w:tc>
+          <w:tcPr>
+            <w:tcW w:type="dxa" w:w="1649"/>
+            <w:tcBorders>
+              <w:top w:val="single" w:color="BFBFBF" w:sz="4"/>
+              <w:left w:val="single" w:color="BFBFBF" w:sz="4"/>
+              <w:bottom w:val="single" w:color="BFBFBF" w:sz="4"/>
+              <w:right w:val="single" w:color="BFBFBF" w:sz="4"/>
+            </w:tcBorders>
+            <w:tcMar>
+              <w:top w:type="dxa" w:w="60"/>
+              <w:left w:type="dxa" w:w="100"/>
+              <w:bottom w:type="dxa" w:w="60"/>
+              <w:right w:type="dxa" w:w="100"/>
+            </w:tcMar>
+          </w:tcPr>
+          <w:p>
+            <w:r>
+              <w:rPr>
+                <w:sz w:val="20"/>
+                <w:szCs w:val="20"/>
+              </w:rPr>
+              <w:t xml:space="preserve">texto</w:t>
+            </w:r>
+          </w:p>
+        </w:tc>
+        <w:tc>
+          <w:tcPr>
+            <w:tcW w:type="dxa" w:w="4949"/>
+            <w:tcBorders>
+              <w:top w:val="single" w:color="BFBFBF" w:sz="4"/>
+              <w:left w:val="single" w:color="BFBFBF" w:sz="4"/>
+              <w:bottom w:val="single" w:color="BFBFBF" w:sz="4"/>
+              <w:right w:val="single" w:color="BFBFBF" w:sz="4"/>
+            </w:tcBorders>
+            <w:tcMar>
+              <w:top w:type="dxa" w:w="60"/>
+              <w:left w:type="dxa" w:w="100"/>
+              <w:bottom w:type="dxa" w:w="60"/>
+              <w:right w:type="dxa" w:w="100"/>
+            </w:tcMar>
+          </w:tcPr>
+          <w:p>
+            <w:r>
+              <w:rPr>
+                <w:rFonts w:ascii="Consolas" w:cs="Consolas" w:eastAsia="Consolas" w:hAnsi="Consolas"/>
+                <w:sz w:val="20"/>
+                <w:szCs w:val="20"/>
+              </w:rPr>
+              <w:t xml:space="preserve">lida</w:t>
+            </w:r>
+            <w:r>
+              <w:rPr>
+                <w:sz w:val="20"/>
+                <w:szCs w:val="20"/>
+              </w:rPr>
+              <w:t xml:space="preserve"> ou </w:t>
+            </w:r>
+            <w:r>
+              <w:rPr>
+                <w:rFonts w:ascii="Consolas" w:cs="Consolas" w:eastAsia="Consolas" w:hAnsi="Consolas"/>
+                <w:sz w:val="20"/>
+                <w:szCs w:val="20"/>
+              </w:rPr>
+              <w:t xml:space="preserve">falha</w:t>
+            </w:r>
+            <w:r>
+              <w:rPr>
+                <w:sz w:val="20"/>
+                <w:szCs w:val="20"/>
+              </w:rPr>
+              <w:t xml:space="preserve"> (por exemplo, marcas dos cantos não encontradas)</w:t>
+            </w:r>
+          </w:p>
+        </w:tc>
+      </w:tr>
+      <w:tr>
+        <w:trPr>
+          <w:cantSplit/>
+        </w:trPr>
+        <w:tc>
+          <w:tcPr>
+            <w:tcW w:type="dxa" w:w="2473"/>
+            <w:tcBorders>
+              <w:top w:val="single" w:color="BFBFBF" w:sz="4"/>
+              <w:left w:val="single" w:color="BFBFBF" w:sz="4"/>
+              <w:bottom w:val="single" w:color="BFBFBF" w:sz="4"/>
+              <w:right w:val="single" w:color="BFBFBF" w:sz="4"/>
+            </w:tcBorders>
+            <w:tcMar>
+              <w:top w:type="dxa" w:w="60"/>
+              <w:left w:type="dxa" w:w="100"/>
+              <w:bottom w:type="dxa" w:w="60"/>
+              <w:right w:type="dxa" w:w="100"/>
+            </w:tcMar>
+          </w:tcPr>
+          <w:p>
+            <w:r>
+              <w:rPr>
+                <w:rFonts w:ascii="Consolas" w:cs="Consolas" w:eastAsia="Consolas" w:hAnsi="Consolas"/>
+                <w:sz w:val="20"/>
+                <w:szCs w:val="20"/>
+              </w:rPr>
+              <w:t xml:space="preserve">motivo</w:t>
+            </w:r>
+          </w:p>
+        </w:tc>
+        <w:tc>
+          <w:tcPr>
+            <w:tcW w:type="dxa" w:w="1649"/>
+            <w:tcBorders>
+              <w:top w:val="single" w:color="BFBFBF" w:sz="4"/>
+              <w:left w:val="single" w:color="BFBFBF" w:sz="4"/>
+              <w:bottom w:val="single" w:color="BFBFBF" w:sz="4"/>
+              <w:right w:val="single" w:color="BFBFBF" w:sz="4"/>
+            </w:tcBorders>
+            <w:tcMar>
+              <w:top w:type="dxa" w:w="60"/>
+              <w:left w:type="dxa" w:w="100"/>
+              <w:bottom w:type="dxa" w:w="60"/>
+              <w:right w:type="dxa" w:w="100"/>
+            </w:tcMar>
+          </w:tcPr>
+          <w:p>
+            <w:r>
+              <w:rPr>
+                <w:sz w:val="20"/>
+                <w:szCs w:val="20"/>
+              </w:rPr>
+              <w:t xml:space="preserve">texto</w:t>
+            </w:r>
+          </w:p>
+        </w:tc>
+        <w:tc>
+          <w:tcPr>
+            <w:tcW w:type="dxa" w:w="4949"/>
+            <w:tcBorders>
+              <w:top w:val="single" w:color="BFBFBF" w:sz="4"/>
+              <w:left w:val="single" w:color="BFBFBF" w:sz="4"/>
+              <w:bottom w:val="single" w:color="BFBFBF" w:sz="4"/>
+              <w:right w:val="single" w:color="BFBFBF" w:sz="4"/>
+            </w:tcBorders>
+            <w:tcMar>
+              <w:top w:type="dxa" w:w="60"/>
+              <w:left w:type="dxa" w:w="100"/>
+              <w:bottom w:type="dxa" w:w="60"/>
+              <w:right w:type="dxa" w:w="100"/>
+            </w:tcMar>
+          </w:tcPr>
+          <w:p>
+            <w:r>
+              <w:rPr>
+                <w:sz w:val="20"/>
+                <w:szCs w:val="20"/>
+              </w:rPr>
+              <w:t xml:space="preserve">Motivo da falha, ou aviso quando a escrita não pôde ser transcrita</w:t>
+            </w:r>
+          </w:p>
+        </w:tc>
+      </w:tr>
+      <w:tr>
+        <w:trPr>
+          <w:cantSplit/>
+        </w:trPr>
+        <w:tc>
+          <w:tcPr>
+            <w:tcW w:type="dxa" w:w="2473"/>
+            <w:tcBorders>
+              <w:top w:val="single" w:color="BFBFBF" w:sz="4"/>
+              <w:left w:val="single" w:color="BFBFBF" w:sz="4"/>
+              <w:bottom w:val="single" w:color="BFBFBF" w:sz="4"/>
+              <w:right w:val="single" w:color="BFBFBF" w:sz="4"/>
+            </w:tcBorders>
+            <w:tcMar>
+              <w:top w:type="dxa" w:w="60"/>
+              <w:left w:type="dxa" w:w="100"/>
+              <w:bottom w:type="dxa" w:w="60"/>
+              <w:right w:type="dxa" w:w="100"/>
+            </w:tcMar>
+          </w:tcPr>
+          <w:p>
+            <w:r>
+              <w:rPr>
+                <w:rFonts w:ascii="Consolas" w:cs="Consolas" w:eastAsia="Consolas" w:hAnsi="Consolas"/>
+                <w:sz w:val="20"/>
+                <w:szCs w:val="20"/>
+              </w:rPr>
+              <w:t xml:space="preserve">arquivo_alinhado</w:t>
+            </w:r>
+          </w:p>
+        </w:tc>
+        <w:tc>
+          <w:tcPr>
+            <w:tcW w:type="dxa" w:w="1649"/>
+            <w:tcBorders>
+              <w:top w:val="single" w:color="BFBFBF" w:sz="4"/>
+              <w:left w:val="single" w:color="BFBFBF" w:sz="4"/>
+              <w:bottom w:val="single" w:color="BFBFBF" w:sz="4"/>
+              <w:right w:val="single" w:color="BFBFBF" w:sz="4"/>
+            </w:tcBorders>
+            <w:tcMar>
+              <w:top w:type="dxa" w:w="60"/>
+              <w:left w:type="dxa" w:w="100"/>
+              <w:bottom w:type="dxa" w:w="60"/>
+              <w:right w:type="dxa" w:w="100"/>
+            </w:tcMar>
+          </w:tcPr>
+          <w:p>
+            <w:r>
+              <w:rPr>
+                <w:sz w:val="20"/>
+                <w:szCs w:val="20"/>
+              </w:rPr>
+              <w:t xml:space="preserve">texto</w:t>
+            </w:r>
+          </w:p>
+        </w:tc>
+        <w:tc>
+          <w:tcPr>
+            <w:tcW w:type="dxa" w:w="4949"/>
+            <w:tcBorders>
+              <w:top w:val="single" w:color="BFBFBF" w:sz="4"/>
+              <w:left w:val="single" w:color="BFBFBF" w:sz="4"/>
+              <w:bottom w:val="single" w:color="BFBFBF" w:sz="4"/>
+              <w:right w:val="single" w:color="BFBFBF" w:sz="4"/>
+            </w:tcBorders>
+            <w:tcMar>
+              <w:top w:type="dxa" w:w="60"/>
+              <w:left w:type="dxa" w:w="100"/>
+              <w:bottom w:type="dxa" w:w="60"/>
+              <w:right w:type="dxa" w:w="100"/>
+            </w:tcMar>
+          </w:tcPr>
+          <w:p>
+            <w:r>
+              <w:rPr>
+                <w:sz w:val="20"/>
+                <w:szCs w:val="20"/>
+              </w:rPr>
+              <w:t xml:space="preserve">Imagem da página endireitada, de onde saem os recortes das caixas</w:t>
+            </w:r>
+          </w:p>
+        </w:tc>
+      </w:tr>
+      <w:tr>
+        <w:trPr>
+          <w:cantSplit/>
+        </w:trPr>
+        <w:tc>
+          <w:tcPr>
+            <w:tcW w:type="dxa" w:w="2473"/>
+            <w:tcBorders>
+              <w:top w:val="single" w:color="BFBFBF" w:sz="4"/>
+              <w:left w:val="single" w:color="BFBFBF" w:sz="4"/>
+              <w:bottom w:val="single" w:color="BFBFBF" w:sz="4"/>
+              <w:right w:val="single" w:color="BFBFBF" w:sz="4"/>
+            </w:tcBorders>
+            <w:tcMar>
+              <w:top w:type="dxa" w:w="60"/>
+              <w:left w:type="dxa" w:w="100"/>
+              <w:bottom w:type="dxa" w:w="60"/>
+              <w:right w:type="dxa" w:w="100"/>
+            </w:tcMar>
+          </w:tcPr>
+          <w:p>
+            <w:r>
+              <w:rPr>
+                <w:rFonts w:ascii="Consolas" w:cs="Consolas" w:eastAsia="Consolas" w:hAnsi="Consolas"/>
+                <w:sz w:val="20"/>
+                <w:szCs w:val="20"/>
+              </w:rPr>
+              <w:t xml:space="preserve">resultado_json</w:t>
+            </w:r>
+          </w:p>
+        </w:tc>
+        <w:tc>
+          <w:tcPr>
+            <w:tcW w:type="dxa" w:w="1649"/>
+            <w:tcBorders>
+              <w:top w:val="single" w:color="BFBFBF" w:sz="4"/>
+              <w:left w:val="single" w:color="BFBFBF" w:sz="4"/>
+              <w:bottom w:val="single" w:color="BFBFBF" w:sz="4"/>
+              <w:right w:val="single" w:color="BFBFBF" w:sz="4"/>
+            </w:tcBorders>
+            <w:tcMar>
+              <w:top w:type="dxa" w:w="60"/>
+              <w:left w:type="dxa" w:w="100"/>
+              <w:bottom w:type="dxa" w:w="60"/>
+              <w:right w:type="dxa" w:w="100"/>
+            </w:tcMar>
+          </w:tcPr>
+          <w:p>
+            <w:r>
+              <w:rPr>
+                <w:sz w:val="20"/>
+                <w:szCs w:val="20"/>
+              </w:rPr>
+              <w:t xml:space="preserve">texto</w:t>
+            </w:r>
+          </w:p>
+        </w:tc>
+        <w:tc>
+          <w:tcPr>
+            <w:tcW w:type="dxa" w:w="4949"/>
+            <w:tcBorders>
+              <w:top w:val="single" w:color="BFBFBF" w:sz="4"/>
+              <w:left w:val="single" w:color="BFBFBF" w:sz="4"/>
+              <w:bottom w:val="single" w:color="BFBFBF" w:sz="4"/>
+              <w:right w:val="single" w:color="BFBFBF" w:sz="4"/>
+            </w:tcBorders>
+            <w:tcMar>
+              <w:top w:type="dxa" w:w="60"/>
+              <w:left w:type="dxa" w:w="100"/>
+              <w:bottom w:type="dxa" w:w="60"/>
+              <w:right w:type="dxa" w:w="100"/>
+            </w:tcMar>
+          </w:tcPr>
+          <w:p>
+            <w:r>
+              <w:rPr>
+                <w:sz w:val="20"/>
+                <w:szCs w:val="20"/>
+              </w:rPr>
+              <w:t xml:space="preserve">O que foi lido antes da conferência: para cada objetiva, a marcação, se é duvidosa e o preenchimento de cada bolinha; para cada caixa, o texto transcrito</w:t>
+            </w:r>
+          </w:p>
+        </w:tc>
+      </w:tr>
+      <w:tr>
+        <w:trPr>
+          <w:cantSplit/>
+        </w:trPr>
+        <w:tc>
+          <w:tcPr>
+            <w:tcW w:type="dxa" w:w="2473"/>
+            <w:tcBorders>
+              <w:top w:val="single" w:color="BFBFBF" w:sz="4"/>
+              <w:left w:val="single" w:color="BFBFBF" w:sz="4"/>
+              <w:bottom w:val="single" w:color="BFBFBF" w:sz="4"/>
+              <w:right w:val="single" w:color="BFBFBF" w:sz="4"/>
+            </w:tcBorders>
+            <w:tcMar>
+              <w:top w:type="dxa" w:w="60"/>
+              <w:left w:type="dxa" w:w="100"/>
+              <w:bottom w:type="dxa" w:w="60"/>
+              <w:right w:type="dxa" w:w="100"/>
+            </w:tcMar>
+          </w:tcPr>
+          <w:p>
+            <w:r>
+              <w:rPr>
+                <w:rFonts w:ascii="Consolas" w:cs="Consolas" w:eastAsia="Consolas" w:hAnsi="Consolas"/>
+                <w:sz w:val="20"/>
+                <w:szCs w:val="20"/>
+              </w:rPr>
+              <w:t xml:space="preserve">servico_ocr</w:t>
+            </w:r>
+          </w:p>
+        </w:tc>
+        <w:tc>
+          <w:tcPr>
+            <w:tcW w:type="dxa" w:w="1649"/>
+            <w:tcBorders>
+              <w:top w:val="single" w:color="BFBFBF" w:sz="4"/>
+              <w:left w:val="single" w:color="BFBFBF" w:sz="4"/>
+              <w:bottom w:val="single" w:color="BFBFBF" w:sz="4"/>
+              <w:right w:val="single" w:color="BFBFBF" w:sz="4"/>
+            </w:tcBorders>
+            <w:tcMar>
+              <w:top w:type="dxa" w:w="60"/>
+              <w:left w:type="dxa" w:w="100"/>
+              <w:bottom w:type="dxa" w:w="60"/>
+              <w:right w:type="dxa" w:w="100"/>
+            </w:tcMar>
+          </w:tcPr>
+          <w:p>
+            <w:r>
+              <w:rPr>
+                <w:sz w:val="20"/>
+                <w:szCs w:val="20"/>
+              </w:rPr>
+              <w:t xml:space="preserve">texto</w:t>
+            </w:r>
+          </w:p>
+        </w:tc>
+        <w:tc>
+          <w:tcPr>
+            <w:tcW w:type="dxa" w:w="4949"/>
+            <w:tcBorders>
+              <w:top w:val="single" w:color="BFBFBF" w:sz="4"/>
+              <w:left w:val="single" w:color="BFBFBF" w:sz="4"/>
+              <w:bottom w:val="single" w:color="BFBFBF" w:sz="4"/>
+              <w:right w:val="single" w:color="BFBFBF" w:sz="4"/>
+            </w:tcBorders>
+            <w:tcMar>
+              <w:top w:type="dxa" w:w="60"/>
+              <w:left w:type="dxa" w:w="100"/>
+              <w:bottom w:type="dxa" w:w="60"/>
+              <w:right w:type="dxa" w:w="100"/>
+            </w:tcMar>
+          </w:tcPr>
+          <w:p>
+            <w:r>
+              <w:rPr>
+                <w:rFonts w:ascii="Consolas" w:cs="Consolas" w:eastAsia="Consolas" w:hAnsi="Consolas"/>
+                <w:sz w:val="20"/>
+                <w:szCs w:val="20"/>
+              </w:rPr>
+              <w:t xml:space="preserve">google-cloud-vision</w:t>
+            </w:r>
+            <w:r>
+              <w:rPr>
+                <w:sz w:val="20"/>
+                <w:szCs w:val="20"/>
+              </w:rPr>
+              <w:t xml:space="preserve"> quando a escrita foi enviada ao serviço; vazio quando não foi</w:t>
+            </w:r>
+          </w:p>
+        </w:tc>
+      </w:tr>
+      <w:tr>
+        <w:trPr>
+          <w:cantSplit/>
+        </w:trPr>
+        <w:tc>
+          <w:tcPr>
+            <w:tcW w:type="dxa" w:w="2473"/>
+            <w:tcBorders>
+              <w:top w:val="single" w:color="BFBFBF" w:sz="4"/>
+              <w:left w:val="single" w:color="BFBFBF" w:sz="4"/>
+              <w:bottom w:val="single" w:color="BFBFBF" w:sz="4"/>
+              <w:right w:val="single" w:color="BFBFBF" w:sz="4"/>
+            </w:tcBorders>
+            <w:tcMar>
+              <w:top w:type="dxa" w:w="60"/>
+              <w:left w:type="dxa" w:w="100"/>
+              <w:bottom w:type="dxa" w:w="60"/>
+              <w:right w:type="dxa" w:w="100"/>
+            </w:tcMar>
+          </w:tcPr>
+          <w:p>
+            <w:r>
+              <w:rPr>
+                <w:rFonts w:ascii="Consolas" w:cs="Consolas" w:eastAsia="Consolas" w:hAnsi="Consolas"/>
+                <w:sz w:val="20"/>
+                <w:szCs w:val="20"/>
+              </w:rPr>
+              <w:t xml:space="preserve">latencia_ocr_ms</w:t>
+            </w:r>
+          </w:p>
+        </w:tc>
+        <w:tc>
+          <w:tcPr>
+            <w:tcW w:type="dxa" w:w="1649"/>
+            <w:tcBorders>
+              <w:top w:val="single" w:color="BFBFBF" w:sz="4"/>
+              <w:left w:val="single" w:color="BFBFBF" w:sz="4"/>
+              <w:bottom w:val="single" w:color="BFBFBF" w:sz="4"/>
+              <w:right w:val="single" w:color="BFBFBF" w:sz="4"/>
+            </w:tcBorders>
+            <w:tcMar>
+              <w:top w:type="dxa" w:w="60"/>
+              <w:left w:type="dxa" w:w="100"/>
+              <w:bottom w:type="dxa" w:w="60"/>
+              <w:right w:type="dxa" w:w="100"/>
+            </w:tcMar>
+          </w:tcPr>
+          <w:p>
+            <w:r>
+              <w:rPr>
+                <w:sz w:val="20"/>
+                <w:szCs w:val="20"/>
+              </w:rPr>
+              <w:t xml:space="preserve">decimal</w:t>
+            </w:r>
+          </w:p>
+        </w:tc>
+        <w:tc>
+          <w:tcPr>
+            <w:tcW w:type="dxa" w:w="4949"/>
+            <w:tcBorders>
+              <w:top w:val="single" w:color="BFBFBF" w:sz="4"/>
+              <w:left w:val="single" w:color="BFBFBF" w:sz="4"/>
+              <w:bottom w:val="single" w:color="BFBFBF" w:sz="4"/>
+              <w:right w:val="single" w:color="BFBFBF" w:sz="4"/>
+            </w:tcBorders>
+            <w:tcMar>
+              <w:top w:type="dxa" w:w="60"/>
+              <w:left w:type="dxa" w:w="100"/>
+              <w:bottom w:type="dxa" w:w="60"/>
+              <w:right w:type="dxa" w:w="100"/>
+            </w:tcMar>
+          </w:tcPr>
+          <w:p>
+            <w:r>
+              <w:rPr>
+                <w:sz w:val="20"/>
+                <w:szCs w:val="20"/>
+              </w:rPr>
+              <w:t xml:space="preserve">Tempo da chamada ao serviço de transcrição</w:t>
+            </w:r>
+          </w:p>
+        </w:tc>
+      </w:tr>
+      <w:tr>
+        <w:trPr>
+          <w:cantSplit/>
+        </w:trPr>
+        <w:tc>
+          <w:tcPr>
+            <w:tcW w:type="dxa" w:w="2473"/>
+            <w:tcBorders>
+              <w:top w:val="single" w:color="BFBFBF" w:sz="4"/>
+              <w:left w:val="single" w:color="BFBFBF" w:sz="4"/>
+              <w:bottom w:val="single" w:color="BFBFBF" w:sz="4"/>
+              <w:right w:val="single" w:color="BFBFBF" w:sz="4"/>
+            </w:tcBorders>
+            <w:tcMar>
+              <w:top w:type="dxa" w:w="60"/>
+              <w:left w:type="dxa" w:w="100"/>
+              <w:bottom w:type="dxa" w:w="60"/>
+              <w:right w:type="dxa" w:w="100"/>
+            </w:tcMar>
+          </w:tcPr>
+          <w:p>
+            <w:r>
+              <w:rPr>
+                <w:rFonts w:ascii="Consolas" w:cs="Consolas" w:eastAsia="Consolas" w:hAnsi="Consolas"/>
+                <w:sz w:val="20"/>
+                <w:szCs w:val="20"/>
+              </w:rPr>
+              <w:t xml:space="preserve">conferida_em</w:t>
+            </w:r>
+          </w:p>
+        </w:tc>
+        <w:tc>
+          <w:tcPr>
+            <w:tcW w:type="dxa" w:w="1649"/>
+            <w:tcBorders>
+              <w:top w:val="single" w:color="BFBFBF" w:sz="4"/>
+              <w:left w:val="single" w:color="BFBFBF" w:sz="4"/>
+              <w:bottom w:val="single" w:color="BFBFBF" w:sz="4"/>
+              <w:right w:val="single" w:color="BFBFBF" w:sz="4"/>
+            </w:tcBorders>
+            <w:tcMar>
+              <w:top w:type="dxa" w:w="60"/>
+              <w:left w:type="dxa" w:w="100"/>
+              <w:bottom w:type="dxa" w:w="60"/>
+              <w:right w:type="dxa" w:w="100"/>
+            </w:tcMar>
+          </w:tcPr>
+          <w:p>
+            <w:r>
+              <w:rPr>
+                <w:sz w:val="20"/>
+                <w:szCs w:val="20"/>
+              </w:rPr>
+              <w:t xml:space="preserve">data e hora</w:t>
+            </w:r>
+          </w:p>
+        </w:tc>
+        <w:tc>
+          <w:tcPr>
+            <w:tcW w:type="dxa" w:w="4949"/>
+            <w:tcBorders>
+              <w:top w:val="single" w:color="BFBFBF" w:sz="4"/>
+              <w:left w:val="single" w:color="BFBFBF" w:sz="4"/>
+              <w:bottom w:val="single" w:color="BFBFBF" w:sz="4"/>
+              <w:right w:val="single" w:color="BFBFBF" w:sz="4"/>
+            </w:tcBorders>
+            <w:tcMar>
+              <w:top w:type="dxa" w:w="60"/>
+              <w:left w:type="dxa" w:w="100"/>
+              <w:bottom w:type="dxa" w:w="60"/>
+              <w:right w:type="dxa" w:w="100"/>
+            </w:tcMar>
+          </w:tcPr>
+          <w:p>
+            <w:r>
+              <w:rPr>
+                <w:sz w:val="20"/>
+                <w:szCs w:val="20"/>
+              </w:rPr>
+              <w:t xml:space="preserve">Quando o professor salvou o formulário da folha depois da leitura</w:t>
+            </w:r>
+          </w:p>
+        </w:tc>
+      </w:tr>
+      <w:tr>
+        <w:trPr>
+          <w:cantSplit/>
+        </w:trPr>
+        <w:tc>
+          <w:tcPr>
+            <w:tcW w:type="dxa" w:w="2473"/>
+            <w:tcBorders>
+              <w:top w:val="single" w:color="BFBFBF" w:sz="4"/>
+              <w:left w:val="single" w:color="BFBFBF" w:sz="4"/>
+              <w:bottom w:val="single" w:color="BFBFBF" w:sz="4"/>
+              <w:right w:val="single" w:color="BFBFBF" w:sz="4"/>
+            </w:tcBorders>
+            <w:tcMar>
+              <w:top w:type="dxa" w:w="60"/>
+              <w:left w:type="dxa" w:w="100"/>
+              <w:bottom w:type="dxa" w:w="60"/>
+              <w:right w:type="dxa" w:w="100"/>
+            </w:tcMar>
+          </w:tcPr>
+          <w:p>
+            <w:r>
+              <w:rPr>
+                <w:rFonts w:ascii="Consolas" w:cs="Consolas" w:eastAsia="Consolas" w:hAnsi="Consolas"/>
+                <w:sz w:val="20"/>
+                <w:szCs w:val="20"/>
+              </w:rPr>
+              <w:t xml:space="preserve">usuario_id</w:t>
+            </w:r>
+          </w:p>
+        </w:tc>
+        <w:tc>
+          <w:tcPr>
+            <w:tcW w:type="dxa" w:w="1649"/>
+            <w:tcBorders>
+              <w:top w:val="single" w:color="BFBFBF" w:sz="4"/>
+              <w:left w:val="single" w:color="BFBFBF" w:sz="4"/>
+              <w:bottom w:val="single" w:color="BFBFBF" w:sz="4"/>
+              <w:right w:val="single" w:color="BFBFBF" w:sz="4"/>
+            </w:tcBorders>
+            <w:tcMar>
+              <w:top w:type="dxa" w:w="60"/>
+              <w:left w:type="dxa" w:w="100"/>
+              <w:bottom w:type="dxa" w:w="60"/>
+              <w:right w:type="dxa" w:w="100"/>
+            </w:tcMar>
+          </w:tcPr>
+          <w:p>
+            <w:r>
+              <w:rPr>
+                <w:sz w:val="20"/>
+                <w:szCs w:val="20"/>
+              </w:rPr>
+              <w:t xml:space="preserve">inteiro</w:t>
+            </w:r>
+          </w:p>
+        </w:tc>
+        <w:tc>
+          <w:tcPr>
+            <w:tcW w:type="dxa" w:w="4949"/>
+            <w:tcBorders>
+              <w:top w:val="single" w:color="BFBFBF" w:sz="4"/>
+              <w:left w:val="single" w:color="BFBFBF" w:sz="4"/>
+              <w:bottom w:val="single" w:color="BFBFBF" w:sz="4"/>
+              <w:right w:val="single" w:color="BFBFBF" w:sz="4"/>
+            </w:tcBorders>
+            <w:tcMar>
+              <w:top w:type="dxa" w:w="60"/>
+              <w:left w:type="dxa" w:w="100"/>
+              <w:bottom w:type="dxa" w:w="60"/>
+              <w:right w:type="dxa" w:w="100"/>
+            </w:tcMar>
+          </w:tcPr>
+          <w:p>
+            <w:r>
+              <w:rPr>
+                <w:sz w:val="20"/>
+                <w:szCs w:val="20"/>
+              </w:rPr>
+              <w:t xml:space="preserve">Quem pediu a leitura</w:t>
+            </w:r>
+          </w:p>
+        </w:tc>
+      </w:tr>
+      <w:tr>
+        <w:trPr>
+          <w:cantSplit/>
+        </w:trPr>
+        <w:tc>
+          <w:tcPr>
+            <w:tcW w:type="dxa" w:w="2473"/>
+            <w:tcBorders>
+              <w:top w:val="single" w:color="BFBFBF" w:sz="4"/>
+              <w:left w:val="single" w:color="BFBFBF" w:sz="4"/>
+              <w:bottom w:val="single" w:color="BFBFBF" w:sz="4"/>
+              <w:right w:val="single" w:color="BFBFBF" w:sz="4"/>
+            </w:tcBorders>
+            <w:tcMar>
+              <w:top w:type="dxa" w:w="60"/>
+              <w:left w:type="dxa" w:w="100"/>
+              <w:bottom w:type="dxa" w:w="60"/>
+              <w:right w:type="dxa" w:w="100"/>
+            </w:tcMar>
+          </w:tcPr>
+          <w:p>
+            <w:r>
+              <w:rPr>
+                <w:rFonts w:ascii="Consolas" w:cs="Consolas" w:eastAsia="Consolas" w:hAnsi="Consolas"/>
+                <w:sz w:val="20"/>
+                <w:szCs w:val="20"/>
+              </w:rPr>
+              <w:t xml:space="preserve">criado_em</w:t>
+            </w:r>
+          </w:p>
+        </w:tc>
+        <w:tc>
+          <w:tcPr>
+            <w:tcW w:type="dxa" w:w="1649"/>
+            <w:tcBorders>
+              <w:top w:val="single" w:color="BFBFBF" w:sz="4"/>
+              <w:left w:val="single" w:color="BFBFBF" w:sz="4"/>
+              <w:bottom w:val="single" w:color="BFBFBF" w:sz="4"/>
+              <w:right w:val="single" w:color="BFBFBF" w:sz="4"/>
+            </w:tcBorders>
+            <w:tcMar>
+              <w:top w:type="dxa" w:w="60"/>
+              <w:left w:type="dxa" w:w="100"/>
+              <w:bottom w:type="dxa" w:w="60"/>
+              <w:right w:type="dxa" w:w="100"/>
+            </w:tcMar>
+          </w:tcPr>
+          <w:p>
+            <w:r>
+              <w:rPr>
+                <w:sz w:val="20"/>
+                <w:szCs w:val="20"/>
+              </w:rPr>
+              <w:t xml:space="preserve">data e hora</w:t>
+            </w:r>
+          </w:p>
+        </w:tc>
+        <w:tc>
+          <w:tcPr>
+            <w:tcW w:type="dxa" w:w="4949"/>
+            <w:tcBorders>
+              <w:top w:val="single" w:color="BFBFBF" w:sz="4"/>
+              <w:left w:val="single" w:color="BFBFBF" w:sz="4"/>
+              <w:bottom w:val="single" w:color="BFBFBF" w:sz="4"/>
+              <w:right w:val="single" w:color="BFBFBF" w:sz="4"/>
+            </w:tcBorders>
+            <w:tcMar>
+              <w:top w:type="dxa" w:w="60"/>
+              <w:left w:type="dxa" w:w="100"/>
+              <w:bottom w:type="dxa" w:w="60"/>
+              <w:right w:type="dxa" w:w="100"/>
+            </w:tcMar>
+          </w:tcPr>
+          <w:p>
+            <w:r>
+              <w:rPr>
+                <w:sz w:val="20"/>
+                <w:szCs w:val="20"/>
+              </w:rPr>
+              <w:t xml:space="preserve">Momento da leitura</w:t>
             </w:r>
           </w:p>
         </w:tc>
@@ -36030,6 +37399,717 @@
     </w:p>
     <w:p>
       <w:pPr>
+        <w:pStyle w:val="Heading2"/>
+      </w:pPr>
+      <w:r>
+        <w:t xml:space="preserve">4.27 Leitura automática: app/leitura/</w:t>
+      </w:r>
+    </w:p>
+    <w:p>
+      <w:pPr>
+        <w:spacing w:after="120" w:line="300"/>
+      </w:pPr>
+      <w:r>
+        <w:t xml:space="preserve">Última parte do fluxo: o sistema lê as respostas nas imagens das folhas e preenche o formulário de cada folha, para o professor conferir. A leitura nunca grava respostas sozinha: elas só existem depois que o professor confere e salva, o que mantém a decisão humana sobre o que o aluno respondeu, antes mesmo da decisão sobre a nota.</w:t>
+      </w:r>
+    </w:p>
+    <w:p>
+      <w:pPr>
+        <w:pStyle w:val="Heading3"/>
+      </w:pPr>
+      <w:r>
+        <w:t xml:space="preserve">Etapas da leitura de uma página</w:t>
+      </w:r>
+    </w:p>
+    <w:tbl>
+      <w:tblPr>
+        <w:tblW w:type="dxa" w:w="9071"/>
+        <w:tblBorders>
+          <w:top w:val="single" w:color="auto" w:sz="4"/>
+          <w:left w:val="single" w:color="auto" w:sz="4"/>
+          <w:bottom w:val="single" w:color="auto" w:sz="4"/>
+          <w:right w:val="single" w:color="auto" w:sz="4"/>
+          <w:insideH w:val="single" w:color="auto" w:sz="4"/>
+          <w:insideV w:val="single" w:color="auto" w:sz="4"/>
+        </w:tblBorders>
+      </w:tblPr>
+      <w:tblGrid>
+        <w:gridCol w:w="2721"/>
+        <w:gridCol w:w="6350"/>
+      </w:tblGrid>
+      <w:tr>
+        <w:trPr>
+          <w:tblHeader/>
+        </w:trPr>
+        <w:tc>
+          <w:tcPr>
+            <w:tcW w:type="dxa" w:w="2721"/>
+            <w:tcBorders>
+              <w:top w:val="single" w:color="BFBFBF" w:sz="4"/>
+              <w:left w:val="single" w:color="BFBFBF" w:sz="4"/>
+              <w:bottom w:val="single" w:color="BFBFBF" w:sz="4"/>
+              <w:right w:val="single" w:color="BFBFBF" w:sz="4"/>
+            </w:tcBorders>
+            <w:shd w:fill="D9E2F3" w:color="auto" w:val="clear"/>
+            <w:tcMar>
+              <w:top w:type="dxa" w:w="60"/>
+              <w:left w:type="dxa" w:w="100"/>
+              <w:bottom w:type="dxa" w:w="60"/>
+              <w:right w:type="dxa" w:w="100"/>
+            </w:tcMar>
+          </w:tcPr>
+          <w:p>
+            <w:r>
+              <w:rPr>
+                <w:b/>
+                <w:bCs/>
+                <w:sz w:val="20"/>
+                <w:szCs w:val="20"/>
+              </w:rPr>
+              <w:t xml:space="preserve">Etapa</w:t>
+            </w:r>
+          </w:p>
+        </w:tc>
+        <w:tc>
+          <w:tcPr>
+            <w:tcW w:type="dxa" w:w="6350"/>
+            <w:tcBorders>
+              <w:top w:val="single" w:color="BFBFBF" w:sz="4"/>
+              <w:left w:val="single" w:color="BFBFBF" w:sz="4"/>
+              <w:bottom w:val="single" w:color="BFBFBF" w:sz="4"/>
+              <w:right w:val="single" w:color="BFBFBF" w:sz="4"/>
+            </w:tcBorders>
+            <w:shd w:fill="D9E2F3" w:color="auto" w:val="clear"/>
+            <w:tcMar>
+              <w:top w:type="dxa" w:w="60"/>
+              <w:left w:type="dxa" w:w="100"/>
+              <w:bottom w:type="dxa" w:w="60"/>
+              <w:right w:type="dxa" w:w="100"/>
+            </w:tcMar>
+          </w:tcPr>
+          <w:p>
+            <w:r>
+              <w:rPr>
+                <w:b/>
+                <w:bCs/>
+                <w:sz w:val="20"/>
+                <w:szCs w:val="20"/>
+              </w:rPr>
+              <w:t xml:space="preserve">Como é feita</w:t>
+            </w:r>
+          </w:p>
+        </w:tc>
+      </w:tr>
+      <w:tr>
+        <w:trPr>
+          <w:cantSplit/>
+        </w:trPr>
+        <w:tc>
+          <w:tcPr>
+            <w:tcW w:type="dxa" w:w="2721"/>
+            <w:tcBorders>
+              <w:top w:val="single" w:color="BFBFBF" w:sz="4"/>
+              <w:left w:val="single" w:color="BFBFBF" w:sz="4"/>
+              <w:bottom w:val="single" w:color="BFBFBF" w:sz="4"/>
+              <w:right w:val="single" w:color="BFBFBF" w:sz="4"/>
+            </w:tcBorders>
+            <w:tcMar>
+              <w:top w:type="dxa" w:w="60"/>
+              <w:left w:type="dxa" w:w="100"/>
+              <w:bottom w:type="dxa" w:w="60"/>
+              <w:right w:type="dxa" w:w="100"/>
+            </w:tcMar>
+          </w:tcPr>
+          <w:p>
+            <w:r>
+              <w:rPr>
+                <w:sz w:val="20"/>
+                <w:szCs w:val="20"/>
+              </w:rPr>
+              <w:t xml:space="preserve">Orientação</w:t>
+            </w:r>
+          </w:p>
+        </w:tc>
+        <w:tc>
+          <w:tcPr>
+            <w:tcW w:type="dxa" w:w="6350"/>
+            <w:tcBorders>
+              <w:top w:val="single" w:color="BFBFBF" w:sz="4"/>
+              <w:left w:val="single" w:color="BFBFBF" w:sz="4"/>
+              <w:bottom w:val="single" w:color="BFBFBF" w:sz="4"/>
+              <w:right w:val="single" w:color="BFBFBF" w:sz="4"/>
+            </w:tcBorders>
+            <w:tcMar>
+              <w:top w:type="dxa" w:w="60"/>
+              <w:left w:type="dxa" w:w="100"/>
+              <w:bottom w:type="dxa" w:w="60"/>
+              <w:right w:type="dxa" w:w="100"/>
+            </w:tcMar>
+          </w:tcPr>
+          <w:p>
+            <w:r>
+              <w:rPr>
+                <w:sz w:val="20"/>
+                <w:szCs w:val="20"/>
+              </w:rPr>
+              <w:t xml:space="preserve">O QR code fica no alto da página. Se o OpenCV o encontra na metade de baixo, a imagem é girada 180 graus. Se não o encontra, a página é alinhada nas duas posições e fica a que tem mais tinta onde o QR code deveria estar</w:t>
+            </w:r>
+          </w:p>
+        </w:tc>
+      </w:tr>
+      <w:tr>
+        <w:trPr>
+          <w:cantSplit/>
+        </w:trPr>
+        <w:tc>
+          <w:tcPr>
+            <w:tcW w:type="dxa" w:w="2721"/>
+            <w:tcBorders>
+              <w:top w:val="single" w:color="BFBFBF" w:sz="4"/>
+              <w:left w:val="single" w:color="BFBFBF" w:sz="4"/>
+              <w:bottom w:val="single" w:color="BFBFBF" w:sz="4"/>
+              <w:right w:val="single" w:color="BFBFBF" w:sz="4"/>
+            </w:tcBorders>
+            <w:tcMar>
+              <w:top w:type="dxa" w:w="60"/>
+              <w:left w:type="dxa" w:w="100"/>
+              <w:bottom w:type="dxa" w:w="60"/>
+              <w:right w:type="dxa" w:w="100"/>
+            </w:tcMar>
+          </w:tcPr>
+          <w:p>
+            <w:r>
+              <w:rPr>
+                <w:sz w:val="20"/>
+                <w:szCs w:val="20"/>
+              </w:rPr>
+              <w:t xml:space="preserve">Marcas dos cantos</w:t>
+            </w:r>
+          </w:p>
+        </w:tc>
+        <w:tc>
+          <w:tcPr>
+            <w:tcW w:type="dxa" w:w="6350"/>
+            <w:tcBorders>
+              <w:top w:val="single" w:color="BFBFBF" w:sz="4"/>
+              <w:left w:val="single" w:color="BFBFBF" w:sz="4"/>
+              <w:bottom w:val="single" w:color="BFBFBF" w:sz="4"/>
+              <w:right w:val="single" w:color="BFBFBF" w:sz="4"/>
+            </w:tcBorders>
+            <w:tcMar>
+              <w:top w:type="dxa" w:w="60"/>
+              <w:left w:type="dxa" w:w="100"/>
+              <w:bottom w:type="dxa" w:w="60"/>
+              <w:right w:type="dxa" w:w="100"/>
+            </w:tcMar>
+          </w:tcPr>
+          <w:p>
+            <w:r>
+              <w:rPr>
+                <w:sz w:val="20"/>
+                <w:szCs w:val="20"/>
+              </w:rPr>
+              <w:t xml:space="preserve">A imagem é convertida em preto e branco (limiar de Otsu) e são procurados quadrados pretos maciços, de tamanho próximo ao esperado. Os cantos do QR code também são quadrados escuros, mas vazados, e são descartados. Em cada quadrante fica a candidata mais próxima do canto da página</w:t>
+            </w:r>
+          </w:p>
+        </w:tc>
+      </w:tr>
+      <w:tr>
+        <w:trPr>
+          <w:cantSplit/>
+        </w:trPr>
+        <w:tc>
+          <w:tcPr>
+            <w:tcW w:type="dxa" w:w="2721"/>
+            <w:tcBorders>
+              <w:top w:val="single" w:color="BFBFBF" w:sz="4"/>
+              <w:left w:val="single" w:color="BFBFBF" w:sz="4"/>
+              <w:bottom w:val="single" w:color="BFBFBF" w:sz="4"/>
+              <w:right w:val="single" w:color="BFBFBF" w:sz="4"/>
+            </w:tcBorders>
+            <w:tcMar>
+              <w:top w:type="dxa" w:w="60"/>
+              <w:left w:type="dxa" w:w="100"/>
+              <w:bottom w:type="dxa" w:w="60"/>
+              <w:right w:type="dxa" w:w="100"/>
+            </w:tcMar>
+          </w:tcPr>
+          <w:p>
+            <w:r>
+              <w:rPr>
+                <w:sz w:val="20"/>
+                <w:szCs w:val="20"/>
+              </w:rPr>
+              <w:t xml:space="preserve">Alinhamento</w:t>
+            </w:r>
+          </w:p>
+        </w:tc>
+        <w:tc>
+          <w:tcPr>
+            <w:tcW w:type="dxa" w:w="6350"/>
+            <w:tcBorders>
+              <w:top w:val="single" w:color="BFBFBF" w:sz="4"/>
+              <w:left w:val="single" w:color="BFBFBF" w:sz="4"/>
+              <w:bottom w:val="single" w:color="BFBFBF" w:sz="4"/>
+              <w:right w:val="single" w:color="BFBFBF" w:sz="4"/>
+            </w:tcBorders>
+            <w:tcMar>
+              <w:top w:type="dxa" w:w="60"/>
+              <w:left w:type="dxa" w:w="100"/>
+              <w:bottom w:type="dxa" w:w="60"/>
+              <w:right w:type="dxa" w:w="100"/>
+            </w:tcMar>
+          </w:tcPr>
+          <w:p>
+            <w:r>
+              <w:rPr>
+                <w:sz w:val="20"/>
+                <w:szCs w:val="20"/>
+              </w:rPr>
+              <w:t xml:space="preserve">Uma transformação de perspectiva (homografia) leva os centros das quatro marcas às posições calculadas em </w:t>
+            </w:r>
+            <w:r>
+              <w:rPr>
+                <w:rFonts w:ascii="Consolas" w:cs="Consolas" w:eastAsia="Consolas" w:hAnsi="Consolas"/>
+                <w:sz w:val="20"/>
+                <w:szCs w:val="20"/>
+              </w:rPr>
+              <w:t xml:space="preserve">layout.py</w:t>
+            </w:r>
+            <w:r>
+              <w:rPr>
+                <w:sz w:val="20"/>
+                <w:szCs w:val="20"/>
+              </w:rPr>
+              <w:t xml:space="preserve">. A imagem resultante tem 8 pixels por milímetro e cada elemento fica no pixel previsto, qualquer que tenha sido a inclinação, a escala ou a perspectiva da digitalização</w:t>
+            </w:r>
+          </w:p>
+        </w:tc>
+      </w:tr>
+      <w:tr>
+        <w:trPr>
+          <w:cantSplit/>
+        </w:trPr>
+        <w:tc>
+          <w:tcPr>
+            <w:tcW w:type="dxa" w:w="2721"/>
+            <w:tcBorders>
+              <w:top w:val="single" w:color="BFBFBF" w:sz="4"/>
+              <w:left w:val="single" w:color="BFBFBF" w:sz="4"/>
+              <w:bottom w:val="single" w:color="BFBFBF" w:sz="4"/>
+              <w:right w:val="single" w:color="BFBFBF" w:sz="4"/>
+            </w:tcBorders>
+            <w:tcMar>
+              <w:top w:type="dxa" w:w="60"/>
+              <w:left w:type="dxa" w:w="100"/>
+              <w:bottom w:type="dxa" w:w="60"/>
+              <w:right w:type="dxa" w:w="100"/>
+            </w:tcMar>
+          </w:tcPr>
+          <w:p>
+            <w:r>
+              <w:rPr>
+                <w:sz w:val="20"/>
+                <w:szCs w:val="20"/>
+              </w:rPr>
+              <w:t xml:space="preserve">Bolinhas</w:t>
+            </w:r>
+          </w:p>
+        </w:tc>
+        <w:tc>
+          <w:tcPr>
+            <w:tcW w:type="dxa" w:w="6350"/>
+            <w:tcBorders>
+              <w:top w:val="single" w:color="BFBFBF" w:sz="4"/>
+              <w:left w:val="single" w:color="BFBFBF" w:sz="4"/>
+              <w:bottom w:val="single" w:color="BFBFBF" w:sz="4"/>
+              <w:right w:val="single" w:color="BFBFBF" w:sz="4"/>
+            </w:tcBorders>
+            <w:tcMar>
+              <w:top w:type="dxa" w:w="60"/>
+              <w:left w:type="dxa" w:w="100"/>
+              <w:bottom w:type="dxa" w:w="60"/>
+              <w:right w:type="dxa" w:w="100"/>
+            </w:tcMar>
+          </w:tcPr>
+          <w:p>
+            <w:r>
+              <w:rPr>
+                <w:sz w:val="20"/>
+                <w:szCs w:val="20"/>
+              </w:rPr>
+              <w:t xml:space="preserve">Em cada bolinha, mede-se a fração de pixels escuros num disco de 72% do raio, para não contar o contorno impresso. A partir de 40%, a bolinha está marcada; entre 20% e 40% (um X, um preenchimento fraco), a leitura fica marcada como duvidosa. Mais de uma marcada vira "mais de uma"; nenhuma vira "em branco"</w:t>
+            </w:r>
+          </w:p>
+        </w:tc>
+      </w:tr>
+      <w:tr>
+        <w:trPr>
+          <w:cantSplit/>
+        </w:trPr>
+        <w:tc>
+          <w:tcPr>
+            <w:tcW w:type="dxa" w:w="2721"/>
+            <w:tcBorders>
+              <w:top w:val="single" w:color="BFBFBF" w:sz="4"/>
+              <w:left w:val="single" w:color="BFBFBF" w:sz="4"/>
+              <w:bottom w:val="single" w:color="BFBFBF" w:sz="4"/>
+              <w:right w:val="single" w:color="BFBFBF" w:sz="4"/>
+            </w:tcBorders>
+            <w:tcMar>
+              <w:top w:type="dxa" w:w="60"/>
+              <w:left w:type="dxa" w:w="100"/>
+              <w:bottom w:type="dxa" w:w="60"/>
+              <w:right w:type="dxa" w:w="100"/>
+            </w:tcMar>
+          </w:tcPr>
+          <w:p>
+            <w:r>
+              <w:rPr>
+                <w:sz w:val="20"/>
+                <w:szCs w:val="20"/>
+              </w:rPr>
+              <w:t xml:space="preserve">Escrita</w:t>
+            </w:r>
+          </w:p>
+        </w:tc>
+        <w:tc>
+          <w:tcPr>
+            <w:tcW w:type="dxa" w:w="6350"/>
+            <w:tcBorders>
+              <w:top w:val="single" w:color="BFBFBF" w:sz="4"/>
+              <w:left w:val="single" w:color="BFBFBF" w:sz="4"/>
+              <w:bottom w:val="single" w:color="BFBFBF" w:sz="4"/>
+              <w:right w:val="single" w:color="BFBFBF" w:sz="4"/>
+            </w:tcBorders>
+            <w:tcMar>
+              <w:top w:type="dxa" w:w="60"/>
+              <w:left w:type="dxa" w:w="100"/>
+              <w:bottom w:type="dxa" w:w="60"/>
+              <w:right w:type="dxa" w:w="100"/>
+            </w:tcMar>
+          </w:tcPr>
+          <w:p>
+            <w:r>
+              <w:rPr>
+                <w:sz w:val="20"/>
+                <w:szCs w:val="20"/>
+              </w:rPr>
+              <w:t xml:space="preserve">A página alinhada é enviada numa única chamada ao Google Cloud Vision, com o recurso de detecção de texto em documentos e a indicação do português. Cada palavra devolvida vem com a posição; a palavra é atribuída à caixa em que o seu centro está, com 2,5 mm de folga. O texto impresso fora das caixas é descartado. A transcrição é literal: nenhum ajuste é feito</w:t>
+            </w:r>
+          </w:p>
+        </w:tc>
+      </w:tr>
+    </w:tbl>
+    <w:p>
+      <w:pPr>
+        <w:spacing w:after="120"/>
+      </w:pPr>
+    </w:p>
+    <w:p>
+      <w:pPr>
+        <w:pStyle w:val="Heading3"/>
+      </w:pPr>
+      <w:r>
+        <w:t xml:space="preserve">Conferência</w:t>
+      </w:r>
+    </w:p>
+    <w:p>
+      <w:pPr>
+        <w:spacing w:after="120" w:line="300"/>
+      </w:pPr>
+      <w:r>
+        <w:t xml:space="preserve">Na página da folha, as respostas lidas aparecem preenchidas, com um aviso de que ainda não foram gravadas. As objetivas lidas recebem a etiqueta "lida", ou "confira" quando a leitura foi duvidosa, e cada discursiva mostra o recorte da caixa da imagem acima do texto transcrito, para comparar. A leitura só preenche questões que ainda não têm resposta salva. Quando o professor salva, a leitura é marcada como conferida.</w:t>
+      </w:r>
+    </w:p>
+    <w:tbl>
+      <w:tblPr>
+        <w:tblW w:type="dxa" w:w="9071"/>
+        <w:tblBorders>
+          <w:top w:val="single" w:color="auto" w:sz="4"/>
+          <w:left w:val="single" w:color="auto" w:sz="4"/>
+          <w:bottom w:val="single" w:color="auto" w:sz="4"/>
+          <w:right w:val="single" w:color="auto" w:sz="4"/>
+          <w:insideH w:val="single" w:color="auto" w:sz="4"/>
+          <w:insideV w:val="single" w:color="auto" w:sz="4"/>
+        </w:tblBorders>
+      </w:tblPr>
+      <w:tblGrid>
+        <w:gridCol w:w="3628"/>
+        <w:gridCol w:w="5443"/>
+      </w:tblGrid>
+      <w:tr>
+        <w:trPr>
+          <w:tblHeader/>
+        </w:trPr>
+        <w:tc>
+          <w:tcPr>
+            <w:tcW w:type="dxa" w:w="3628"/>
+            <w:tcBorders>
+              <w:top w:val="single" w:color="BFBFBF" w:sz="4"/>
+              <w:left w:val="single" w:color="BFBFBF" w:sz="4"/>
+              <w:bottom w:val="single" w:color="BFBFBF" w:sz="4"/>
+              <w:right w:val="single" w:color="BFBFBF" w:sz="4"/>
+            </w:tcBorders>
+            <w:shd w:fill="D9E2F3" w:color="auto" w:val="clear"/>
+            <w:tcMar>
+              <w:top w:type="dxa" w:w="60"/>
+              <w:left w:type="dxa" w:w="100"/>
+              <w:bottom w:type="dxa" w:w="60"/>
+              <w:right w:type="dxa" w:w="100"/>
+            </w:tcMar>
+          </w:tcPr>
+          <w:p>
+            <w:r>
+              <w:rPr>
+                <w:b/>
+                <w:bCs/>
+                <w:sz w:val="20"/>
+                <w:szCs w:val="20"/>
+              </w:rPr>
+              <w:t xml:space="preserve">Rota</w:t>
+            </w:r>
+          </w:p>
+        </w:tc>
+        <w:tc>
+          <w:tcPr>
+            <w:tcW w:type="dxa" w:w="5443"/>
+            <w:tcBorders>
+              <w:top w:val="single" w:color="BFBFBF" w:sz="4"/>
+              <w:left w:val="single" w:color="BFBFBF" w:sz="4"/>
+              <w:bottom w:val="single" w:color="BFBFBF" w:sz="4"/>
+              <w:right w:val="single" w:color="BFBFBF" w:sz="4"/>
+            </w:tcBorders>
+            <w:shd w:fill="D9E2F3" w:color="auto" w:val="clear"/>
+            <w:tcMar>
+              <w:top w:type="dxa" w:w="60"/>
+              <w:left w:type="dxa" w:w="100"/>
+              <w:bottom w:type="dxa" w:w="60"/>
+              <w:right w:type="dxa" w:w="100"/>
+            </w:tcMar>
+          </w:tcPr>
+          <w:p>
+            <w:r>
+              <w:rPr>
+                <w:b/>
+                <w:bCs/>
+                <w:sz w:val="20"/>
+                <w:szCs w:val="20"/>
+              </w:rPr>
+              <w:t xml:space="preserve">O que faz</w:t>
+            </w:r>
+          </w:p>
+        </w:tc>
+      </w:tr>
+      <w:tr>
+        <w:trPr>
+          <w:cantSplit/>
+        </w:trPr>
+        <w:tc>
+          <w:tcPr>
+            <w:tcW w:type="dxa" w:w="3628"/>
+            <w:tcBorders>
+              <w:top w:val="single" w:color="BFBFBF" w:sz="4"/>
+              <w:left w:val="single" w:color="BFBFBF" w:sz="4"/>
+              <w:bottom w:val="single" w:color="BFBFBF" w:sz="4"/>
+              <w:right w:val="single" w:color="BFBFBF" w:sz="4"/>
+            </w:tcBorders>
+            <w:tcMar>
+              <w:top w:type="dxa" w:w="60"/>
+              <w:left w:type="dxa" w:w="100"/>
+              <w:bottom w:type="dxa" w:w="60"/>
+              <w:right w:type="dxa" w:w="100"/>
+            </w:tcMar>
+          </w:tcPr>
+          <w:p>
+            <w:r>
+              <w:rPr>
+                <w:rFonts w:ascii="Consolas" w:cs="Consolas" w:eastAsia="Consolas" w:hAnsi="Consolas"/>
+                <w:sz w:val="20"/>
+                <w:szCs w:val="20"/>
+              </w:rPr>
+              <w:t xml:space="preserve">POST /atividades/{id}/digitalizacoes/ler</w:t>
+            </w:r>
+          </w:p>
+        </w:tc>
+        <w:tc>
+          <w:tcPr>
+            <w:tcW w:type="dxa" w:w="5443"/>
+            <w:tcBorders>
+              <w:top w:val="single" w:color="BFBFBF" w:sz="4"/>
+              <w:left w:val="single" w:color="BFBFBF" w:sz="4"/>
+              <w:bottom w:val="single" w:color="BFBFBF" w:sz="4"/>
+              <w:right w:val="single" w:color="BFBFBF" w:sz="4"/>
+            </w:tcBorders>
+            <w:tcMar>
+              <w:top w:type="dxa" w:w="60"/>
+              <w:left w:type="dxa" w:w="100"/>
+              <w:bottom w:type="dxa" w:w="60"/>
+              <w:right w:type="dxa" w:w="100"/>
+            </w:tcMar>
+          </w:tcPr>
+          <w:p>
+            <w:r>
+              <w:rPr>
+                <w:sz w:val="20"/>
+                <w:szCs w:val="20"/>
+              </w:rPr>
+              <w:t xml:space="preserve">Lê em lote as páginas identificadas ainda não lidas, fora da requisição, com andamento na página</w:t>
+            </w:r>
+          </w:p>
+        </w:tc>
+      </w:tr>
+      <w:tr>
+        <w:trPr>
+          <w:cantSplit/>
+        </w:trPr>
+        <w:tc>
+          <w:tcPr>
+            <w:tcW w:type="dxa" w:w="3628"/>
+            <w:tcBorders>
+              <w:top w:val="single" w:color="BFBFBF" w:sz="4"/>
+              <w:left w:val="single" w:color="BFBFBF" w:sz="4"/>
+              <w:bottom w:val="single" w:color="BFBFBF" w:sz="4"/>
+              <w:right w:val="single" w:color="BFBFBF" w:sz="4"/>
+            </w:tcBorders>
+            <w:tcMar>
+              <w:top w:type="dxa" w:w="60"/>
+              <w:left w:type="dxa" w:w="100"/>
+              <w:bottom w:type="dxa" w:w="60"/>
+              <w:right w:type="dxa" w:w="100"/>
+            </w:tcMar>
+          </w:tcPr>
+          <w:p>
+            <w:r>
+              <w:rPr>
+                <w:rFonts w:ascii="Consolas" w:cs="Consolas" w:eastAsia="Consolas" w:hAnsi="Consolas"/>
+                <w:sz w:val="20"/>
+                <w:szCs w:val="20"/>
+              </w:rPr>
+              <w:t xml:space="preserve">POST /atividades/{id}/folhas/{folha}/ler</w:t>
+            </w:r>
+          </w:p>
+        </w:tc>
+        <w:tc>
+          <w:tcPr>
+            <w:tcW w:type="dxa" w:w="5443"/>
+            <w:tcBorders>
+              <w:top w:val="single" w:color="BFBFBF" w:sz="4"/>
+              <w:left w:val="single" w:color="BFBFBF" w:sz="4"/>
+              <w:bottom w:val="single" w:color="BFBFBF" w:sz="4"/>
+              <w:right w:val="single" w:color="BFBFBF" w:sz="4"/>
+            </w:tcBorders>
+            <w:tcMar>
+              <w:top w:type="dxa" w:w="60"/>
+              <w:left w:type="dxa" w:w="100"/>
+              <w:bottom w:type="dxa" w:w="60"/>
+              <w:right w:type="dxa" w:w="100"/>
+            </w:tcMar>
+          </w:tcPr>
+          <w:p>
+            <w:r>
+              <w:rPr>
+                <w:sz w:val="20"/>
+                <w:szCs w:val="20"/>
+              </w:rPr>
+              <w:t xml:space="preserve">Lê de novo, na hora, as páginas de uma folha</w:t>
+            </w:r>
+          </w:p>
+        </w:tc>
+      </w:tr>
+      <w:tr>
+        <w:trPr>
+          <w:cantSplit/>
+        </w:trPr>
+        <w:tc>
+          <w:tcPr>
+            <w:tcW w:type="dxa" w:w="3628"/>
+            <w:tcBorders>
+              <w:top w:val="single" w:color="BFBFBF" w:sz="4"/>
+              <w:left w:val="single" w:color="BFBFBF" w:sz="4"/>
+              <w:bottom w:val="single" w:color="BFBFBF" w:sz="4"/>
+              <w:right w:val="single" w:color="BFBFBF" w:sz="4"/>
+            </w:tcBorders>
+            <w:tcMar>
+              <w:top w:type="dxa" w:w="60"/>
+              <w:left w:type="dxa" w:w="100"/>
+              <w:bottom w:type="dxa" w:w="60"/>
+              <w:right w:type="dxa" w:w="100"/>
+            </w:tcMar>
+          </w:tcPr>
+          <w:p>
+            <w:r>
+              <w:rPr>
+                <w:rFonts w:ascii="Consolas" w:cs="Consolas" w:eastAsia="Consolas" w:hAnsi="Consolas"/>
+                <w:sz w:val="20"/>
+                <w:szCs w:val="20"/>
+              </w:rPr>
+              <w:t xml:space="preserve">GET /atividades/{id}/folhas/{folha}/recorte/{campo}</w:t>
+            </w:r>
+          </w:p>
+        </w:tc>
+        <w:tc>
+          <w:tcPr>
+            <w:tcW w:type="dxa" w:w="5443"/>
+            <w:tcBorders>
+              <w:top w:val="single" w:color="BFBFBF" w:sz="4"/>
+              <w:left w:val="single" w:color="BFBFBF" w:sz="4"/>
+              <w:bottom w:val="single" w:color="BFBFBF" w:sz="4"/>
+              <w:right w:val="single" w:color="BFBFBF" w:sz="4"/>
+            </w:tcBorders>
+            <w:tcMar>
+              <w:top w:type="dxa" w:w="60"/>
+              <w:left w:type="dxa" w:w="100"/>
+              <w:bottom w:type="dxa" w:w="60"/>
+              <w:right w:type="dxa" w:w="100"/>
+            </w:tcMar>
+          </w:tcPr>
+          <w:p>
+            <w:r>
+              <w:rPr>
+                <w:sz w:val="20"/>
+                <w:szCs w:val="20"/>
+              </w:rPr>
+              <w:t xml:space="preserve">Recorte da caixa de resposta de um campo, da página alinhada</w:t>
+            </w:r>
+          </w:p>
+        </w:tc>
+      </w:tr>
+    </w:tbl>
+    <w:p>
+      <w:pPr>
+        <w:spacing w:after="120"/>
+      </w:pPr>
+    </w:p>
+    <w:p>
+      <w:pPr>
+        <w:pStyle w:val="Heading3"/>
+      </w:pPr>
+      <w:r>
+        <w:t xml:space="preserve">Medida da taxa de acerto: scripts/medir_leitura.py</w:t>
+      </w:r>
+    </w:p>
+    <w:p>
+      <w:pPr>
+        <w:spacing w:after="120" w:line="300"/>
+      </w:pPr>
+      <w:r>
+        <w:t xml:space="preserve">Compara o que foi lido com o que o professor conferiu, nas leituras já conferidas. Nas objetivas, informa a proporção de marcações lidas corretamente, no total e entre as não duvidosas. Nas discursivas, calcula a taxa de erro de caracteres (CER) e de palavras (WER): a distância de edição de Levenshtein entre o texto lido e o conferido, dividida pelo tamanho do conferido. Com </w:t>
+      </w:r>
+      <w:r>
+        <w:rPr>
+          <w:rFonts w:ascii="Consolas" w:cs="Consolas" w:eastAsia="Consolas" w:hAnsi="Consolas"/>
+          <w:sz w:val="20"/>
+          <w:szCs w:val="20"/>
+        </w:rPr>
+        <w:t xml:space="preserve">--csv</w:t>
+      </w:r>
+      <w:r>
+        <w:t xml:space="preserve">, grava uma linha por campo. Esses números entram no artigo como resultado da leitura, separados dos resultados da correção.</w:t>
+      </w:r>
+    </w:p>
+    <w:p>
+      <w:pPr>
         <w:pStyle w:val="Heading1"/>
       </w:pPr>
       <w:r>
@@ -36813,6 +38893,90 @@
                 <w:szCs w:val="20"/>
               </w:rPr>
               <w:t xml:space="preserve">Nome exibido nas páginas; padrão Devolutiva</w:t>
+            </w:r>
+          </w:p>
+        </w:tc>
+      </w:tr>
+      <w:tr>
+        <w:trPr>
+          <w:cantSplit/>
+        </w:trPr>
+        <w:tc>
+          <w:tcPr>
+            <w:tcW w:type="dxa" w:w="2473"/>
+            <w:tcBorders>
+              <w:top w:val="single" w:color="BFBFBF" w:sz="4"/>
+              <w:left w:val="single" w:color="BFBFBF" w:sz="4"/>
+              <w:bottom w:val="single" w:color="BFBFBF" w:sz="4"/>
+              <w:right w:val="single" w:color="BFBFBF" w:sz="4"/>
+            </w:tcBorders>
+            <w:tcMar>
+              <w:top w:type="dxa" w:w="60"/>
+              <w:left w:type="dxa" w:w="100"/>
+              <w:bottom w:type="dxa" w:w="60"/>
+              <w:right w:type="dxa" w:w="100"/>
+            </w:tcMar>
+          </w:tcPr>
+          <w:p>
+            <w:r>
+              <w:rPr>
+                <w:rFonts w:ascii="Consolas" w:cs="Consolas" w:eastAsia="Consolas" w:hAnsi="Consolas"/>
+                <w:sz w:val="20"/>
+                <w:szCs w:val="20"/>
+              </w:rPr>
+              <w:t xml:space="preserve">GOOGLE_VISION_API_KEY</w:t>
+            </w:r>
+          </w:p>
+        </w:tc>
+        <w:tc>
+          <w:tcPr>
+            <w:tcW w:type="dxa" w:w="1649"/>
+            <w:tcBorders>
+              <w:top w:val="single" w:color="BFBFBF" w:sz="4"/>
+              <w:left w:val="single" w:color="BFBFBF" w:sz="4"/>
+              <w:bottom w:val="single" w:color="BFBFBF" w:sz="4"/>
+              <w:right w:val="single" w:color="BFBFBF" w:sz="4"/>
+            </w:tcBorders>
+            <w:tcMar>
+              <w:top w:type="dxa" w:w="60"/>
+              <w:left w:type="dxa" w:w="100"/>
+              <w:bottom w:type="dxa" w:w="60"/>
+              <w:right w:type="dxa" w:w="100"/>
+            </w:tcMar>
+          </w:tcPr>
+          <w:p>
+            <w:r>
+              <w:rPr>
+                <w:sz w:val="20"/>
+                <w:szCs w:val="20"/>
+              </w:rPr>
+              <w:t xml:space="preserve">Não</w:t>
+            </w:r>
+          </w:p>
+        </w:tc>
+        <w:tc>
+          <w:tcPr>
+            <w:tcW w:type="dxa" w:w="4949"/>
+            <w:tcBorders>
+              <w:top w:val="single" w:color="BFBFBF" w:sz="4"/>
+              <w:left w:val="single" w:color="BFBFBF" w:sz="4"/>
+              <w:bottom w:val="single" w:color="BFBFBF" w:sz="4"/>
+              <w:right w:val="single" w:color="BFBFBF" w:sz="4"/>
+            </w:tcBorders>
+            <w:tcMar>
+              <w:top w:type="dxa" w:w="60"/>
+              <w:left w:type="dxa" w:w="100"/>
+              <w:bottom w:type="dxa" w:w="60"/>
+              <w:right w:type="dxa" w:w="100"/>
+            </w:tcMar>
+          </w:tcPr>
+          <w:p>
+            <w:r>
+              <w:rPr>
+                <w:sz w:val="20"/>
+                <w:szCs w:val="20"/>
+              </w:rPr>
+              <w:t xml:space="preserve">Chave do Google Cloud Vision para transcrever a escrita das discursivas. Sem ela, só as bolinhas são lidas. Deve ser restrita à Cloud Vision API e ao IP do servidor (guia de publicação, seção 6)</w:t>
             </w:r>
           </w:p>
         </w:tc>
@@ -39557,7 +41721,7 @@
         <w:t xml:space="preserve">pytest</w:t>
       </w:r>
       <w:r>
-        <w:t xml:space="preserve"> e não acessam a internet nem gastam crédito: a API da OpenAI e a API do ENEM são substituídas por versões falsas que devolvem respostas controladas. Total nesta versão: 231 testes. Os testes de páginas entram com uma conta de administrador criada no banco de teste, e o custo do scrypt é reduzido só nos testes, para que rodem em poucos segundos.</w:t>
+        <w:t xml:space="preserve"> e não acessam a internet nem gastam crédito: a API da OpenAI e a API do ENEM são substituídas por versões falsas que devolvem respostas controladas. Total nesta versão: 252 testes. Os testes de páginas entram com uma conta de administrador criada no banco de teste, e o custo do scrypt é reduzido só nos testes, para que rodem em poucos segundos.</w:t>
       </w:r>
     </w:p>
     <w:tbl>
@@ -40478,6 +42642,64 @@
                 <w:sz w:val="20"/>
                 <w:szCs w:val="20"/>
               </w:rPr>
+              <w:t xml:space="preserve">tests/test_leitura.py</w:t>
+            </w:r>
+          </w:p>
+        </w:tc>
+        <w:tc>
+          <w:tcPr>
+            <w:tcW w:type="dxa" w:w="6350"/>
+            <w:tcBorders>
+              <w:top w:val="single" w:color="BFBFBF" w:sz="4"/>
+              <w:left w:val="single" w:color="BFBFBF" w:sz="4"/>
+              <w:bottom w:val="single" w:color="BFBFBF" w:sz="4"/>
+              <w:right w:val="single" w:color="BFBFBF" w:sz="4"/>
+            </w:tcBorders>
+            <w:tcMar>
+              <w:top w:type="dxa" w:w="60"/>
+              <w:left w:type="dxa" w:w="100"/>
+              <w:bottom w:type="dxa" w:w="60"/>
+              <w:right w:type="dxa" w:w="100"/>
+            </w:tcMar>
+          </w:tcPr>
+          <w:p>
+            <w:r>
+              <w:rPr>
+                <w:sz w:val="20"/>
+                <w:szCs w:val="20"/>
+              </w:rPr>
+              <w:t xml:space="preserve">Bolinhas lidas em folhas sintéticas com o layout real, retas, inclinadas, com perspectiva e de cabeça para baixo, incluindo mais de uma marcada e X como duvidoso; página sem marcas; palavras atribuídas às caixas, sem o texto impresso; pedido ao Google Cloud Vision com chave, recurso e idioma; erros do serviço; sem chave; leitura, conferência e medida pela tela; só bolinhas sem chave; leitura que não muda respostas salvas; falha de alinhamento exibida; distância de edição, CER e WER</w:t>
+            </w:r>
+          </w:p>
+        </w:tc>
+      </w:tr>
+      <w:tr>
+        <w:trPr>
+          <w:cantSplit/>
+        </w:trPr>
+        <w:tc>
+          <w:tcPr>
+            <w:tcW w:type="dxa" w:w="2721"/>
+            <w:tcBorders>
+              <w:top w:val="single" w:color="BFBFBF" w:sz="4"/>
+              <w:left w:val="single" w:color="BFBFBF" w:sz="4"/>
+              <w:bottom w:val="single" w:color="BFBFBF" w:sz="4"/>
+              <w:right w:val="single" w:color="BFBFBF" w:sz="4"/>
+            </w:tcBorders>
+            <w:tcMar>
+              <w:top w:type="dxa" w:w="60"/>
+              <w:left w:type="dxa" w:w="100"/>
+              <w:bottom w:type="dxa" w:w="60"/>
+              <w:right w:type="dxa" w:w="100"/>
+            </w:tcMar>
+          </w:tcPr>
+          <w:p>
+            <w:r>
+              <w:rPr>
+                <w:rFonts w:ascii="Consolas" w:cs="Consolas" w:eastAsia="Consolas" w:hAnsi="Consolas"/>
+                <w:sz w:val="20"/>
+                <w:szCs w:val="20"/>
+              </w:rPr>
               <w:t xml:space="preserve">tests/test_lista_questoes.py</w:t>
             </w:r>
           </w:p>
@@ -43608,6 +45830,348 @@
                 <w:sz w:val="20"/>
                 <w:szCs w:val="20"/>
               </w:rPr>
+              <w:t xml:space="preserve">Bolinhas lidas no próprio servidor, com OpenCV</w:t>
+            </w:r>
+          </w:p>
+        </w:tc>
+        <w:tc>
+          <w:tcPr>
+            <w:tcW w:type="dxa" w:w="5443"/>
+            <w:tcBorders>
+              <w:top w:val="single" w:color="BFBFBF" w:sz="4"/>
+              <w:left w:val="single" w:color="BFBFBF" w:sz="4"/>
+              <w:bottom w:val="single" w:color="BFBFBF" w:sz="4"/>
+              <w:right w:val="single" w:color="BFBFBF" w:sz="4"/>
+            </w:tcBorders>
+            <w:tcMar>
+              <w:top w:type="dxa" w:w="60"/>
+              <w:left w:type="dxa" w:w="100"/>
+              <w:bottom w:type="dxa" w:w="60"/>
+              <w:right w:type="dxa" w:w="100"/>
+            </w:tcMar>
+          </w:tcPr>
+          <w:p>
+            <w:r>
+              <w:rPr>
+                <w:sz w:val="20"/>
+                <w:szCs w:val="20"/>
+              </w:rPr>
+              <w:t xml:space="preserve">É uma medida simples de tinta em posições conhecidas; dispensa serviço externo e custo</w:t>
+            </w:r>
+          </w:p>
+        </w:tc>
+      </w:tr>
+      <w:tr>
+        <w:trPr>
+          <w:cantSplit/>
+        </w:trPr>
+        <w:tc>
+          <w:tcPr>
+            <w:tcW w:type="dxa" w:w="3628"/>
+            <w:tcBorders>
+              <w:top w:val="single" w:color="BFBFBF" w:sz="4"/>
+              <w:left w:val="single" w:color="BFBFBF" w:sz="4"/>
+              <w:bottom w:val="single" w:color="BFBFBF" w:sz="4"/>
+              <w:right w:val="single" w:color="BFBFBF" w:sz="4"/>
+            </w:tcBorders>
+            <w:tcMar>
+              <w:top w:type="dxa" w:w="60"/>
+              <w:left w:type="dxa" w:w="100"/>
+              <w:bottom w:type="dxa" w:w="60"/>
+              <w:right w:type="dxa" w:w="100"/>
+            </w:tcMar>
+          </w:tcPr>
+          <w:p>
+            <w:r>
+              <w:rPr>
+                <w:sz w:val="20"/>
+                <w:szCs w:val="20"/>
+              </w:rPr>
+              <w:t xml:space="preserve">Escrita lida por um serviço pronto (Google Cloud Vision)</w:t>
+            </w:r>
+          </w:p>
+        </w:tc>
+        <w:tc>
+          <w:tcPr>
+            <w:tcW w:type="dxa" w:w="5443"/>
+            <w:tcBorders>
+              <w:top w:val="single" w:color="BFBFBF" w:sz="4"/>
+              <w:left w:val="single" w:color="BFBFBF" w:sz="4"/>
+              <w:bottom w:val="single" w:color="BFBFBF" w:sz="4"/>
+              <w:right w:val="single" w:color="BFBFBF" w:sz="4"/>
+            </w:tcBorders>
+            <w:tcMar>
+              <w:top w:type="dxa" w:w="60"/>
+              <w:left w:type="dxa" w:w="100"/>
+              <w:bottom w:type="dxa" w:w="60"/>
+              <w:right w:type="dxa" w:w="100"/>
+            </w:tcMar>
+          </w:tcPr>
+          <w:p>
+            <w:r>
+              <w:rPr>
+                <w:sz w:val="20"/>
+                <w:szCs w:val="20"/>
+              </w:rPr>
+              <w:t xml:space="preserve">Reconhecer letra cursiva em português exige um modelo treinado com muitos exemplos, fora do escopo do TCC; o serviço já está no mesmo provedor do servidor</w:t>
+            </w:r>
+          </w:p>
+        </w:tc>
+      </w:tr>
+      <w:tr>
+        <w:trPr>
+          <w:cantSplit/>
+        </w:trPr>
+        <w:tc>
+          <w:tcPr>
+            <w:tcW w:type="dxa" w:w="3628"/>
+            <w:tcBorders>
+              <w:top w:val="single" w:color="BFBFBF" w:sz="4"/>
+              <w:left w:val="single" w:color="BFBFBF" w:sz="4"/>
+              <w:bottom w:val="single" w:color="BFBFBF" w:sz="4"/>
+              <w:right w:val="single" w:color="BFBFBF" w:sz="4"/>
+            </w:tcBorders>
+            <w:tcMar>
+              <w:top w:type="dxa" w:w="60"/>
+              <w:left w:type="dxa" w:w="100"/>
+              <w:bottom w:type="dxa" w:w="60"/>
+              <w:right w:type="dxa" w:w="100"/>
+            </w:tcMar>
+          </w:tcPr>
+          <w:p>
+            <w:r>
+              <w:rPr>
+                <w:sz w:val="20"/>
+                <w:szCs w:val="20"/>
+              </w:rPr>
+              <w:t xml:space="preserve">Uma chamada por página, e não por caixa</w:t>
+            </w:r>
+          </w:p>
+        </w:tc>
+        <w:tc>
+          <w:tcPr>
+            <w:tcW w:type="dxa" w:w="5443"/>
+            <w:tcBorders>
+              <w:top w:val="single" w:color="BFBFBF" w:sz="4"/>
+              <w:left w:val="single" w:color="BFBFBF" w:sz="4"/>
+              <w:bottom w:val="single" w:color="BFBFBF" w:sz="4"/>
+              <w:right w:val="single" w:color="BFBFBF" w:sz="4"/>
+            </w:tcBorders>
+            <w:tcMar>
+              <w:top w:type="dxa" w:w="60"/>
+              <w:left w:type="dxa" w:w="100"/>
+              <w:bottom w:type="dxa" w:w="60"/>
+              <w:right w:type="dxa" w:w="100"/>
+            </w:tcMar>
+          </w:tcPr>
+          <w:p>
+            <w:r>
+              <w:rPr>
+                <w:sz w:val="20"/>
+                <w:szCs w:val="20"/>
+              </w:rPr>
+              <w:t xml:space="preserve">Menos chamadas e menos custo; a posição de cada palavra permite separar as caixas depois</w:t>
+            </w:r>
+          </w:p>
+        </w:tc>
+      </w:tr>
+      <w:tr>
+        <w:trPr>
+          <w:cantSplit/>
+        </w:trPr>
+        <w:tc>
+          <w:tcPr>
+            <w:tcW w:type="dxa" w:w="3628"/>
+            <w:tcBorders>
+              <w:top w:val="single" w:color="BFBFBF" w:sz="4"/>
+              <w:left w:val="single" w:color="BFBFBF" w:sz="4"/>
+              <w:bottom w:val="single" w:color="BFBFBF" w:sz="4"/>
+              <w:right w:val="single" w:color="BFBFBF" w:sz="4"/>
+            </w:tcBorders>
+            <w:tcMar>
+              <w:top w:type="dxa" w:w="60"/>
+              <w:left w:type="dxa" w:w="100"/>
+              <w:bottom w:type="dxa" w:w="60"/>
+              <w:right w:type="dxa" w:w="100"/>
+            </w:tcMar>
+          </w:tcPr>
+          <w:p>
+            <w:r>
+              <w:rPr>
+                <w:sz w:val="20"/>
+                <w:szCs w:val="20"/>
+              </w:rPr>
+              <w:t xml:space="preserve">Transcrição literal, sem correção automática do texto</w:t>
+            </w:r>
+          </w:p>
+        </w:tc>
+        <w:tc>
+          <w:tcPr>
+            <w:tcW w:type="dxa" w:w="5443"/>
+            <w:tcBorders>
+              <w:top w:val="single" w:color="BFBFBF" w:sz="4"/>
+              <w:left w:val="single" w:color="BFBFBF" w:sz="4"/>
+              <w:bottom w:val="single" w:color="BFBFBF" w:sz="4"/>
+              <w:right w:val="single" w:color="BFBFBF" w:sz="4"/>
+            </w:tcBorders>
+            <w:tcMar>
+              <w:top w:type="dxa" w:w="60"/>
+              <w:left w:type="dxa" w:w="100"/>
+              <w:bottom w:type="dxa" w:w="60"/>
+              <w:right w:type="dxa" w:w="100"/>
+            </w:tcMar>
+          </w:tcPr>
+          <w:p>
+            <w:r>
+              <w:rPr>
+                <w:sz w:val="20"/>
+                <w:szCs w:val="20"/>
+              </w:rPr>
+              <w:t xml:space="preserve">Corrigir a ortografia ou completar palavras mudaria a resposta do aluno e, portanto, a nota</w:t>
+            </w:r>
+          </w:p>
+        </w:tc>
+      </w:tr>
+      <w:tr>
+        <w:trPr>
+          <w:cantSplit/>
+        </w:trPr>
+        <w:tc>
+          <w:tcPr>
+            <w:tcW w:type="dxa" w:w="3628"/>
+            <w:tcBorders>
+              <w:top w:val="single" w:color="BFBFBF" w:sz="4"/>
+              <w:left w:val="single" w:color="BFBFBF" w:sz="4"/>
+              <w:bottom w:val="single" w:color="BFBFBF" w:sz="4"/>
+              <w:right w:val="single" w:color="BFBFBF" w:sz="4"/>
+            </w:tcBorders>
+            <w:tcMar>
+              <w:top w:type="dxa" w:w="60"/>
+              <w:left w:type="dxa" w:w="100"/>
+              <w:bottom w:type="dxa" w:w="60"/>
+              <w:right w:type="dxa" w:w="100"/>
+            </w:tcMar>
+          </w:tcPr>
+          <w:p>
+            <w:r>
+              <w:rPr>
+                <w:sz w:val="20"/>
+                <w:szCs w:val="20"/>
+              </w:rPr>
+              <w:t xml:space="preserve">Leitura só preenche o formulário; o professor salva</w:t>
+            </w:r>
+          </w:p>
+        </w:tc>
+        <w:tc>
+          <w:tcPr>
+            <w:tcW w:type="dxa" w:w="5443"/>
+            <w:tcBorders>
+              <w:top w:val="single" w:color="BFBFBF" w:sz="4"/>
+              <w:left w:val="single" w:color="BFBFBF" w:sz="4"/>
+              <w:bottom w:val="single" w:color="BFBFBF" w:sz="4"/>
+              <w:right w:val="single" w:color="BFBFBF" w:sz="4"/>
+            </w:tcBorders>
+            <w:tcMar>
+              <w:top w:type="dxa" w:w="60"/>
+              <w:left w:type="dxa" w:w="100"/>
+              <w:bottom w:type="dxa" w:w="60"/>
+              <w:right w:type="dxa" w:w="100"/>
+            </w:tcMar>
+          </w:tcPr>
+          <w:p>
+            <w:r>
+              <w:rPr>
+                <w:sz w:val="20"/>
+                <w:szCs w:val="20"/>
+              </w:rPr>
+              <w:t xml:space="preserve">Um erro de leitura não pode virar resposta do aluno sem que alguém veja</w:t>
+            </w:r>
+          </w:p>
+        </w:tc>
+      </w:tr>
+      <w:tr>
+        <w:trPr>
+          <w:cantSplit/>
+        </w:trPr>
+        <w:tc>
+          <w:tcPr>
+            <w:tcW w:type="dxa" w:w="3628"/>
+            <w:tcBorders>
+              <w:top w:val="single" w:color="BFBFBF" w:sz="4"/>
+              <w:left w:val="single" w:color="BFBFBF" w:sz="4"/>
+              <w:bottom w:val="single" w:color="BFBFBF" w:sz="4"/>
+              <w:right w:val="single" w:color="BFBFBF" w:sz="4"/>
+            </w:tcBorders>
+            <w:tcMar>
+              <w:top w:type="dxa" w:w="60"/>
+              <w:left w:type="dxa" w:w="100"/>
+              <w:bottom w:type="dxa" w:w="60"/>
+              <w:right w:type="dxa" w:w="100"/>
+            </w:tcMar>
+          </w:tcPr>
+          <w:p>
+            <w:r>
+              <w:rPr>
+                <w:sz w:val="20"/>
+                <w:szCs w:val="20"/>
+              </w:rPr>
+              <w:t xml:space="preserve">Leitura bruta guardada separada das respostas</w:t>
+            </w:r>
+          </w:p>
+        </w:tc>
+        <w:tc>
+          <w:tcPr>
+            <w:tcW w:type="dxa" w:w="5443"/>
+            <w:tcBorders>
+              <w:top w:val="single" w:color="BFBFBF" w:sz="4"/>
+              <w:left w:val="single" w:color="BFBFBF" w:sz="4"/>
+              <w:bottom w:val="single" w:color="BFBFBF" w:sz="4"/>
+              <w:right w:val="single" w:color="BFBFBF" w:sz="4"/>
+            </w:tcBorders>
+            <w:tcMar>
+              <w:top w:type="dxa" w:w="60"/>
+              <w:left w:type="dxa" w:w="100"/>
+              <w:bottom w:type="dxa" w:w="60"/>
+              <w:right w:type="dxa" w:w="100"/>
+            </w:tcMar>
+          </w:tcPr>
+          <w:p>
+            <w:r>
+              <w:rPr>
+                <w:sz w:val="20"/>
+                <w:szCs w:val="20"/>
+              </w:rPr>
+              <w:t xml:space="preserve">Permite medir a taxa de acerto da leitura com as respostas conferidas, como resultado da pesquisa</w:t>
+            </w:r>
+          </w:p>
+        </w:tc>
+      </w:tr>
+      <w:tr>
+        <w:trPr>
+          <w:cantSplit/>
+        </w:trPr>
+        <w:tc>
+          <w:tcPr>
+            <w:tcW w:type="dxa" w:w="3628"/>
+            <w:tcBorders>
+              <w:top w:val="single" w:color="BFBFBF" w:sz="4"/>
+              <w:left w:val="single" w:color="BFBFBF" w:sz="4"/>
+              <w:bottom w:val="single" w:color="BFBFBF" w:sz="4"/>
+              <w:right w:val="single" w:color="BFBFBF" w:sz="4"/>
+            </w:tcBorders>
+            <w:tcMar>
+              <w:top w:type="dxa" w:w="60"/>
+              <w:left w:type="dxa" w:w="100"/>
+              <w:bottom w:type="dxa" w:w="60"/>
+              <w:right w:type="dxa" w:w="100"/>
+            </w:tcMar>
+          </w:tcPr>
+          <w:p>
+            <w:r>
+              <w:rPr>
+                <w:sz w:val="20"/>
+                <w:szCs w:val="20"/>
+              </w:rPr>
               <w:t xml:space="preserve">Questões travadas enquanto houver folhas</w:t>
             </w:r>
           </w:p>
@@ -44175,6 +46739,77 @@
       </w:r>
       <w:r>
         <w:t xml:space="preserve"> o QR code costuma ser lido mesmo em fotos tortas, mas a leitura das respostas, na etapa seguinte, precisa das quatro marcas dos cantos visíveis na imagem.</w:t>
+      </w:r>
+    </w:p>
+    <w:p>
+      <w:pPr>
+        <w:pStyle w:val="ListParagraph"/>
+        <w:numPr>
+          <w:ilvl w:val="0"/>
+          <w:numId w:val="5"/>
+        </w:numPr>
+        <w:spacing w:after="80" w:line="290"/>
+      </w:pPr>
+      <w:r>
+        <w:rPr>
+          <w:b/>
+          <w:bCs/>
+        </w:rPr>
+        <w:t xml:space="preserve">Taxa de acerto da leitura ainda não medida com folhas reais:</w:t>
+      </w:r>
+      <w:r>
+        <w:t xml:space="preserve"> os testes usam folhas sintéticas e confirmam o alinhamento e as bolinhas, mas a escrita à mão real, a caneta usada pelos alunos e as condições de digitalização só são avaliadas com folhas reais. A medida deve ser feita com </w:t>
+      </w:r>
+      <w:r>
+        <w:rPr>
+          <w:rFonts w:ascii="Consolas" w:cs="Consolas" w:eastAsia="Consolas" w:hAnsi="Consolas"/>
+          <w:sz w:val="20"/>
+          <w:szCs w:val="20"/>
+        </w:rPr>
+        <w:t xml:space="preserve">scripts/medir_leitura.py</w:t>
+      </w:r>
+      <w:r>
+        <w:t xml:space="preserve"> e relatada no artigo.</w:t>
+      </w:r>
+    </w:p>
+    <w:p>
+      <w:pPr>
+        <w:pStyle w:val="ListParagraph"/>
+        <w:numPr>
+          <w:ilvl w:val="0"/>
+          <w:numId w:val="5"/>
+        </w:numPr>
+        <w:spacing w:after="80" w:line="290"/>
+      </w:pPr>
+      <w:r>
+        <w:rPr>
+          <w:b/>
+          <w:bCs/>
+        </w:rPr>
+        <w:t xml:space="preserve">Imagens enviadas ao Google:</w:t>
+      </w:r>
+      <w:r>
+        <w:t xml:space="preserve"> a página com a escrita do aluno é enviada ao Google Cloud Vision. A folha não tem nome, só o código; ainda assim, o uso deve ser informado no termo de consentimento e no artigo.</w:t>
+      </w:r>
+    </w:p>
+    <w:p>
+      <w:pPr>
+        <w:pStyle w:val="ListParagraph"/>
+        <w:numPr>
+          <w:ilvl w:val="0"/>
+          <w:numId w:val="5"/>
+        </w:numPr>
+        <w:spacing w:after="80" w:line="290"/>
+      </w:pPr>
+      <w:r>
+        <w:rPr>
+          <w:b/>
+          <w:bCs/>
+        </w:rPr>
+        <w:t xml:space="preserve">Limiares das bolinhas definidos em testes sintéticos:</w:t>
+      </w:r>
+      <w:r>
+        <w:t xml:space="preserve"> os valores de 40% e 20% podem precisar de ajuste depois das primeiras folhas reais; as leituras duvidosas e a conferência reduzem o efeito de um ajuste imperfeito.</w:t>
       </w:r>
     </w:p>
     <w:p>
@@ -45348,6 +47983,234 @@
                 <w:szCs w:val="20"/>
               </w:rPr>
               <w:t xml:space="preserve">Reconhecimento de texto manuscrito (do inglês Handwritten Text Recognition)</w:t>
+            </w:r>
+          </w:p>
+        </w:tc>
+      </w:tr>
+      <w:tr>
+        <w:trPr>
+          <w:cantSplit/>
+        </w:trPr>
+        <w:tc>
+          <w:tcPr>
+            <w:tcW w:type="dxa" w:w="2721"/>
+            <w:tcBorders>
+              <w:top w:val="single" w:color="BFBFBF" w:sz="4"/>
+              <w:left w:val="single" w:color="BFBFBF" w:sz="4"/>
+              <w:bottom w:val="single" w:color="BFBFBF" w:sz="4"/>
+              <w:right w:val="single" w:color="BFBFBF" w:sz="4"/>
+            </w:tcBorders>
+            <w:tcMar>
+              <w:top w:type="dxa" w:w="60"/>
+              <w:left w:type="dxa" w:w="100"/>
+              <w:bottom w:type="dxa" w:w="60"/>
+              <w:right w:type="dxa" w:w="100"/>
+            </w:tcMar>
+          </w:tcPr>
+          <w:p>
+            <w:r>
+              <w:rPr>
+                <w:sz w:val="20"/>
+                <w:szCs w:val="20"/>
+              </w:rPr>
+              <w:t xml:space="preserve">Homografia</w:t>
+            </w:r>
+          </w:p>
+        </w:tc>
+        <w:tc>
+          <w:tcPr>
+            <w:tcW w:type="dxa" w:w="6350"/>
+            <w:tcBorders>
+              <w:top w:val="single" w:color="BFBFBF" w:sz="4"/>
+              <w:left w:val="single" w:color="BFBFBF" w:sz="4"/>
+              <w:bottom w:val="single" w:color="BFBFBF" w:sz="4"/>
+              <w:right w:val="single" w:color="BFBFBF" w:sz="4"/>
+            </w:tcBorders>
+            <w:tcMar>
+              <w:top w:type="dxa" w:w="60"/>
+              <w:left w:type="dxa" w:w="100"/>
+              <w:bottom w:type="dxa" w:w="60"/>
+              <w:right w:type="dxa" w:w="100"/>
+            </w:tcMar>
+          </w:tcPr>
+          <w:p>
+            <w:r>
+              <w:rPr>
+                <w:sz w:val="20"/>
+                <w:szCs w:val="20"/>
+              </w:rPr>
+              <w:t xml:space="preserve">Transformação que leva um plano visto em perspectiva a outro plano; aqui, endireita a folha fotografada ou digitalizada torta</w:t>
+            </w:r>
+          </w:p>
+        </w:tc>
+      </w:tr>
+      <w:tr>
+        <w:trPr>
+          <w:cantSplit/>
+        </w:trPr>
+        <w:tc>
+          <w:tcPr>
+            <w:tcW w:type="dxa" w:w="2721"/>
+            <w:tcBorders>
+              <w:top w:val="single" w:color="BFBFBF" w:sz="4"/>
+              <w:left w:val="single" w:color="BFBFBF" w:sz="4"/>
+              <w:bottom w:val="single" w:color="BFBFBF" w:sz="4"/>
+              <w:right w:val="single" w:color="BFBFBF" w:sz="4"/>
+            </w:tcBorders>
+            <w:tcMar>
+              <w:top w:type="dxa" w:w="60"/>
+              <w:left w:type="dxa" w:w="100"/>
+              <w:bottom w:type="dxa" w:w="60"/>
+              <w:right w:type="dxa" w:w="100"/>
+            </w:tcMar>
+          </w:tcPr>
+          <w:p>
+            <w:r>
+              <w:rPr>
+                <w:sz w:val="20"/>
+                <w:szCs w:val="20"/>
+              </w:rPr>
+              <w:t xml:space="preserve">OMR</w:t>
+            </w:r>
+          </w:p>
+        </w:tc>
+        <w:tc>
+          <w:tcPr>
+            <w:tcW w:type="dxa" w:w="6350"/>
+            <w:tcBorders>
+              <w:top w:val="single" w:color="BFBFBF" w:sz="4"/>
+              <w:left w:val="single" w:color="BFBFBF" w:sz="4"/>
+              <w:bottom w:val="single" w:color="BFBFBF" w:sz="4"/>
+              <w:right w:val="single" w:color="BFBFBF" w:sz="4"/>
+            </w:tcBorders>
+            <w:tcMar>
+              <w:top w:type="dxa" w:w="60"/>
+              <w:left w:type="dxa" w:w="100"/>
+              <w:bottom w:type="dxa" w:w="60"/>
+              <w:right w:type="dxa" w:w="100"/>
+            </w:tcMar>
+          </w:tcPr>
+          <w:p>
+            <w:r>
+              <w:rPr>
+                <w:sz w:val="20"/>
+                <w:szCs w:val="20"/>
+              </w:rPr>
+              <w:t xml:space="preserve">Leitura óptica de marcas (do inglês Optical Mark Recognition): reconhecer bolinhas preenchidas numa folha</w:t>
+            </w:r>
+          </w:p>
+        </w:tc>
+      </w:tr>
+      <w:tr>
+        <w:trPr>
+          <w:cantSplit/>
+        </w:trPr>
+        <w:tc>
+          <w:tcPr>
+            <w:tcW w:type="dxa" w:w="2721"/>
+            <w:tcBorders>
+              <w:top w:val="single" w:color="BFBFBF" w:sz="4"/>
+              <w:left w:val="single" w:color="BFBFBF" w:sz="4"/>
+              <w:bottom w:val="single" w:color="BFBFBF" w:sz="4"/>
+              <w:right w:val="single" w:color="BFBFBF" w:sz="4"/>
+            </w:tcBorders>
+            <w:tcMar>
+              <w:top w:type="dxa" w:w="60"/>
+              <w:left w:type="dxa" w:w="100"/>
+              <w:bottom w:type="dxa" w:w="60"/>
+              <w:right w:type="dxa" w:w="100"/>
+            </w:tcMar>
+          </w:tcPr>
+          <w:p>
+            <w:r>
+              <w:rPr>
+                <w:sz w:val="20"/>
+                <w:szCs w:val="20"/>
+              </w:rPr>
+              <w:t xml:space="preserve">CER e WER</w:t>
+            </w:r>
+          </w:p>
+        </w:tc>
+        <w:tc>
+          <w:tcPr>
+            <w:tcW w:type="dxa" w:w="6350"/>
+            <w:tcBorders>
+              <w:top w:val="single" w:color="BFBFBF" w:sz="4"/>
+              <w:left w:val="single" w:color="BFBFBF" w:sz="4"/>
+              <w:bottom w:val="single" w:color="BFBFBF" w:sz="4"/>
+              <w:right w:val="single" w:color="BFBFBF" w:sz="4"/>
+            </w:tcBorders>
+            <w:tcMar>
+              <w:top w:type="dxa" w:w="60"/>
+              <w:left w:type="dxa" w:w="100"/>
+              <w:bottom w:type="dxa" w:w="60"/>
+              <w:right w:type="dxa" w:w="100"/>
+            </w:tcMar>
+          </w:tcPr>
+          <w:p>
+            <w:r>
+              <w:rPr>
+                <w:sz w:val="20"/>
+                <w:szCs w:val="20"/>
+              </w:rPr>
+              <w:t xml:space="preserve">Taxas de erro de caracteres e de palavras: quantas inserções, remoções e trocas separam o texto lido do texto correto, divididas pelo tamanho do correto</w:t>
+            </w:r>
+          </w:p>
+        </w:tc>
+      </w:tr>
+      <w:tr>
+        <w:trPr>
+          <w:cantSplit/>
+        </w:trPr>
+        <w:tc>
+          <w:tcPr>
+            <w:tcW w:type="dxa" w:w="2721"/>
+            <w:tcBorders>
+              <w:top w:val="single" w:color="BFBFBF" w:sz="4"/>
+              <w:left w:val="single" w:color="BFBFBF" w:sz="4"/>
+              <w:bottom w:val="single" w:color="BFBFBF" w:sz="4"/>
+              <w:right w:val="single" w:color="BFBFBF" w:sz="4"/>
+            </w:tcBorders>
+            <w:tcMar>
+              <w:top w:type="dxa" w:w="60"/>
+              <w:left w:type="dxa" w:w="100"/>
+              <w:bottom w:type="dxa" w:w="60"/>
+              <w:right w:type="dxa" w:w="100"/>
+            </w:tcMar>
+          </w:tcPr>
+          <w:p>
+            <w:r>
+              <w:rPr>
+                <w:sz w:val="20"/>
+                <w:szCs w:val="20"/>
+              </w:rPr>
+              <w:t xml:space="preserve">Distância de Levenshtein</w:t>
+            </w:r>
+          </w:p>
+        </w:tc>
+        <w:tc>
+          <w:tcPr>
+            <w:tcW w:type="dxa" w:w="6350"/>
+            <w:tcBorders>
+              <w:top w:val="single" w:color="BFBFBF" w:sz="4"/>
+              <w:left w:val="single" w:color="BFBFBF" w:sz="4"/>
+              <w:bottom w:val="single" w:color="BFBFBF" w:sz="4"/>
+              <w:right w:val="single" w:color="BFBFBF" w:sz="4"/>
+            </w:tcBorders>
+            <w:tcMar>
+              <w:top w:type="dxa" w:w="60"/>
+              <w:left w:type="dxa" w:w="100"/>
+              <w:bottom w:type="dxa" w:w="60"/>
+              <w:right w:type="dxa" w:w="100"/>
+            </w:tcMar>
+          </w:tcPr>
+          <w:p>
+            <w:r>
+              <w:rPr>
+                <w:sz w:val="20"/>
+                <w:szCs w:val="20"/>
+              </w:rPr>
+              <w:t xml:space="preserve">Número mínimo de inserções, remoções e trocas de símbolos para transformar um texto em outro</w:t>
             </w:r>
           </w:p>
         </w:tc>
@@ -47396,6 +50259,115 @@
                 <w:sz w:val="20"/>
                 <w:szCs w:val="20"/>
               </w:rPr>
+              <w:t xml:space="preserve">0.18</w:t>
+            </w:r>
+          </w:p>
+        </w:tc>
+        <w:tc>
+          <w:tcPr>
+            <w:tcW w:type="dxa" w:w="2267"/>
+            <w:tcBorders>
+              <w:top w:val="single" w:color="BFBFBF" w:sz="4"/>
+              <w:left w:val="single" w:color="BFBFBF" w:sz="4"/>
+              <w:bottom w:val="single" w:color="BFBFBF" w:sz="4"/>
+              <w:right w:val="single" w:color="BFBFBF" w:sz="4"/>
+            </w:tcBorders>
+            <w:tcMar>
+              <w:top w:type="dxa" w:w="60"/>
+              <w:left w:type="dxa" w:w="100"/>
+              <w:bottom w:type="dxa" w:w="60"/>
+              <w:right w:type="dxa" w:w="100"/>
+            </w:tcMar>
+          </w:tcPr>
+          <w:p>
+            <w:r>
+              <w:rPr>
+                <w:sz w:val="20"/>
+                <w:szCs w:val="20"/>
+              </w:rPr>
+              <w:t xml:space="preserve">pull request da leitura automática</w:t>
+            </w:r>
+          </w:p>
+        </w:tc>
+        <w:tc>
+          <w:tcPr>
+            <w:tcW w:type="dxa" w:w="4084"/>
+            <w:tcBorders>
+              <w:top w:val="single" w:color="BFBFBF" w:sz="4"/>
+              <w:left w:val="single" w:color="BFBFBF" w:sz="4"/>
+              <w:bottom w:val="single" w:color="BFBFBF" w:sz="4"/>
+              <w:right w:val="single" w:color="BFBFBF" w:sz="4"/>
+            </w:tcBorders>
+            <w:tcMar>
+              <w:top w:type="dxa" w:w="60"/>
+              <w:left w:type="dxa" w:w="100"/>
+              <w:bottom w:type="dxa" w:w="60"/>
+              <w:right w:type="dxa" w:w="100"/>
+            </w:tcMar>
+          </w:tcPr>
+          <w:p>
+            <w:r>
+              <w:rPr>
+                <w:sz w:val="20"/>
+                <w:szCs w:val="20"/>
+              </w:rPr>
+              <w:t xml:space="preserve">Alinhamento das páginas pelas marcas dos cantos, leitura das bolinhas com OpenCV, transcrição da escrita com o Google Cloud Vision, conferência na página da folha com recortes das caixas, leitura em lote e script de medida da taxa de acerto</w:t>
+            </w:r>
+          </w:p>
+        </w:tc>
+      </w:tr>
+      <w:tr>
+        <w:trPr>
+          <w:cantSplit/>
+        </w:trPr>
+        <w:tc>
+          <w:tcPr>
+            <w:tcW w:type="dxa" w:w="1511"/>
+            <w:tcBorders>
+              <w:top w:val="single" w:color="BFBFBF" w:sz="4"/>
+              <w:left w:val="single" w:color="BFBFBF" w:sz="4"/>
+              <w:bottom w:val="single" w:color="BFBFBF" w:sz="4"/>
+              <w:right w:val="single" w:color="BFBFBF" w:sz="4"/>
+            </w:tcBorders>
+            <w:tcMar>
+              <w:top w:type="dxa" w:w="60"/>
+              <w:left w:type="dxa" w:w="100"/>
+              <w:bottom w:type="dxa" w:w="60"/>
+              <w:right w:type="dxa" w:w="100"/>
+            </w:tcMar>
+          </w:tcPr>
+          <w:p>
+            <w:r>
+              <w:rPr>
+                <w:sz w:val="20"/>
+                <w:szCs w:val="20"/>
+              </w:rPr>
+              <w:t xml:space="preserve">31/10/2026</w:t>
+            </w:r>
+          </w:p>
+        </w:tc>
+        <w:tc>
+          <w:tcPr>
+            <w:tcW w:type="dxa" w:w="1209"/>
+            <w:tcBorders>
+              <w:top w:val="single" w:color="BFBFBF" w:sz="4"/>
+              <w:left w:val="single" w:color="BFBFBF" w:sz="4"/>
+              <w:bottom w:val="single" w:color="BFBFBF" w:sz="4"/>
+              <w:right w:val="single" w:color="BFBFBF" w:sz="4"/>
+            </w:tcBorders>
+            <w:tcMar>
+              <w:top w:type="dxa" w:w="60"/>
+              <w:left w:type="dxa" w:w="100"/>
+              <w:bottom w:type="dxa" w:w="60"/>
+              <w:right w:type="dxa" w:w="100"/>
+            </w:tcMar>
+          </w:tcPr>
+          <w:p>
+            <w:r>
+              <w:rPr>
+                <w:sz w:val="20"/>
+                <w:szCs w:val="20"/>
+              </w:rPr>
               <w:t xml:space="preserve">0.17</w:t>
             </w:r>
           </w:p>
@@ -49435,6 +52407,45 @@
       </w:pPr>
       <w:r>
         <w:t xml:space="preserve">ARTIFEX. PyMuPDF Documentation. Disponível em: https://pymupdf.readthedocs.io/. Acesso em: 31 out. 2026.</w:t>
+      </w:r>
+    </w:p>
+    <w:p>
+      <w:pPr>
+        <w:pStyle w:val="ListParagraph"/>
+        <w:numPr>
+          <w:ilvl w:val="0"/>
+          <w:numId w:val="5"/>
+        </w:numPr>
+        <w:spacing w:after="80" w:line="290"/>
+      </w:pPr>
+      <w:r>
+        <w:t xml:space="preserve">GOOGLE CLOUD. Detect text in images (Cloud Vision API). Disponível em: https://cloud.google.com/vision/docs/ocr. Acesso em: 31 out. 2026.</w:t>
+      </w:r>
+    </w:p>
+    <w:p>
+      <w:pPr>
+        <w:pStyle w:val="ListParagraph"/>
+        <w:numPr>
+          <w:ilvl w:val="0"/>
+          <w:numId w:val="5"/>
+        </w:numPr>
+        <w:spacing w:after="80" w:line="290"/>
+      </w:pPr>
+      <w:r>
+        <w:t xml:space="preserve">GOOGLE CLOUD. Preços do Cloud Vision. Disponível em: https://cloud.google.com/vision/docs/pricing. Acesso em: 31 out. 2026.</w:t>
+      </w:r>
+    </w:p>
+    <w:p>
+      <w:pPr>
+        <w:pStyle w:val="ListParagraph"/>
+        <w:numPr>
+          <w:ilvl w:val="0"/>
+          <w:numId w:val="5"/>
+        </w:numPr>
+        <w:spacing w:after="80" w:line="290"/>
+      </w:pPr>
+      <w:r>
+        <w:t xml:space="preserve">LEVENSHTEIN, V. I. Binary codes capable of correcting deletions, insertions, and reversals. Soviet Physics Doklady, v. 10, n. 8, p. 707-710, 1966.</w:t>
       </w:r>
     </w:p>
     <w:p>
@@ -49601,7 +52612,7 @@
         <w:sz w:val="18"/>
         <w:szCs w:val="18"/>
       </w:rPr>
-      <w:t xml:space="preserve">Documentação Técnica do Protótipo, versão 0.17</w:t>
+      <w:t xml:space="preserve">Documentação Técnica do Protótipo, versão 0.18</w:t>
     </w:r>
   </w:p>
 </w:hdr>

</xml_diff>